<commit_message>
Vehicle & Search APIs (#387) (Other documentations modified)
</commit_message>
<xml_diff>
--- a/API Design.docx
+++ b/API Design.docx
@@ -93,13 +93,74 @@
     </w:p>
     <w:p>
       <w:pPr>
+        <w:spacing w:line="360" w:lineRule="auto"/>
+        <w:rPr>
+          <w:b/>
+          <w:bCs/>
+        </w:rPr>
+      </w:pPr>
+      <w:r>
+        <w:rPr>
+          <w:b/>
+          <w:bCs/>
+        </w:rPr>
+        <w:lastRenderedPageBreak/>
+        <w:t>Contents</w:t>
+      </w:r>
+    </w:p>
+    <w:p/>
+    <w:p>
+      <w:pPr>
         <w:spacing w:line="278" w:lineRule="auto"/>
       </w:pPr>
       <w:r>
-        <w:lastRenderedPageBreak/>
         <w:br w:type="page"/>
       </w:r>
     </w:p>
+    <w:p>
+      <w:pPr>
+        <w:spacing w:line="360" w:lineRule="auto"/>
+        <w:rPr>
+          <w:b/>
+          <w:bCs/>
+        </w:rPr>
+      </w:pPr>
+      <w:r>
+        <w:rPr>
+          <w:b/>
+          <w:bCs/>
+        </w:rPr>
+        <w:lastRenderedPageBreak/>
+        <w:t>Figures</w:t>
+      </w:r>
+    </w:p>
+    <w:p/>
+    <w:p>
+      <w:pPr>
+        <w:spacing w:line="278" w:lineRule="auto"/>
+      </w:pPr>
+      <w:r>
+        <w:br w:type="page"/>
+      </w:r>
+    </w:p>
+    <w:p>
+      <w:pPr>
+        <w:spacing w:line="360" w:lineRule="auto"/>
+        <w:rPr>
+          <w:b/>
+          <w:bCs/>
+        </w:rPr>
+      </w:pPr>
+      <w:r>
+        <w:rPr>
+          <w:b/>
+          <w:bCs/>
+        </w:rPr>
+        <w:lastRenderedPageBreak/>
+        <w:t>Tables</w:t>
+      </w:r>
+    </w:p>
+    <w:p/>
     <w:p/>
     <w:p>
       <w:pPr>
@@ -122,19 +183,7 @@
     </w:p>
     <w:p>
       <w:r>
-        <w:t>The process of API design begins with an extensive study of the functional requirements established in the business analysis and software architecture stages. The goal of such a study is to determine all necessary API endpoints, define responsibilities of backend services, and ensure that the endpoint belongs to the scope of the Minimum Viable Product (MVP).</w:t>
-      </w:r>
-      <w:r>
-        <w:t xml:space="preserve"> </w:t>
-      </w:r>
-      <w:r>
-        <w:t>As the KriGo platform employs a service-oriented architecture, the API is defined as a layer responsible for communication between client applications, which are web application, mobile application, and administration portal, and backend services. In turn, an endpoint represents a business capability and not the user interface action, thus, creating a clear distinction and ensuring the maintainability and scalability of the system.</w:t>
-      </w:r>
-      <w:r>
-        <w:t xml:space="preserve"> </w:t>
-      </w:r>
-      <w:r>
-        <w:t>The API requirements analysis includes three major components.</w:t>
+        <w:t>The process of API design begins with an extensive study of the functional requirements established in the business analysis and software architecture stages. The goal of such a study is to determine all necessary API endpoints, define responsibilities of backend services, and ensure that the endpoint belongs to the scope of the Minimum Viable Product (MVP). As the KriGo platform employs a service-oriented architecture, the API is defined as a layer responsible for communication between client applications, which are web application, mobile application, and administration portal, and backend services. In turn, an endpoint represents a business capability and not the user interface action, thus, creating a clear distinction and ensuring the maintainability and scalability of the system. The API requirements analysis includes three major components.</w:t>
       </w:r>
     </w:p>
     <w:p>
@@ -161,14 +210,12 @@
         <w:keepNext/>
         <w:rPr>
           <w:color w:val="auto"/>
-          <w:sz w:val="20"/>
           <w:szCs w:val="20"/>
         </w:rPr>
       </w:pPr>
       <w:r>
         <w:rPr>
           <w:color w:val="auto"/>
-          <w:sz w:val="20"/>
           <w:szCs w:val="20"/>
         </w:rPr>
         <w:t xml:space="preserve">Table </w:t>
@@ -176,7 +223,6 @@
       <w:r>
         <w:rPr>
           <w:color w:val="auto"/>
-          <w:sz w:val="20"/>
           <w:szCs w:val="20"/>
         </w:rPr>
         <w:fldChar w:fldCharType="begin"/>
@@ -184,7 +230,6 @@
       <w:r>
         <w:rPr>
           <w:color w:val="auto"/>
-          <w:sz w:val="20"/>
           <w:szCs w:val="20"/>
         </w:rPr>
         <w:instrText xml:space="preserve"> SEQ Table \* ARABIC </w:instrText>
@@ -192,7 +237,6 @@
       <w:r>
         <w:rPr>
           <w:color w:val="auto"/>
-          <w:sz w:val="20"/>
           <w:szCs w:val="20"/>
         </w:rPr>
         <w:fldChar w:fldCharType="separate"/>
@@ -201,7 +245,6 @@
         <w:rPr>
           <w:noProof/>
           <w:color w:val="auto"/>
-          <w:sz w:val="20"/>
           <w:szCs w:val="20"/>
         </w:rPr>
         <w:t>1</w:t>
@@ -209,7 +252,6 @@
       <w:r>
         <w:rPr>
           <w:color w:val="auto"/>
-          <w:sz w:val="20"/>
           <w:szCs w:val="20"/>
         </w:rPr>
         <w:fldChar w:fldCharType="end"/>
@@ -217,7 +259,6 @@
       <w:r>
         <w:rPr>
           <w:color w:val="auto"/>
-          <w:sz w:val="20"/>
           <w:szCs w:val="20"/>
         </w:rPr>
         <w:t xml:space="preserve"> - Identified API Domains</w:t>
@@ -846,14 +887,12 @@
         <w:keepNext/>
         <w:rPr>
           <w:color w:val="auto"/>
-          <w:sz w:val="20"/>
           <w:szCs w:val="20"/>
         </w:rPr>
       </w:pPr>
       <w:r>
         <w:rPr>
           <w:color w:val="auto"/>
-          <w:sz w:val="20"/>
           <w:szCs w:val="20"/>
         </w:rPr>
         <w:t xml:space="preserve">Table </w:t>
@@ -861,7 +900,6 @@
       <w:r>
         <w:rPr>
           <w:color w:val="auto"/>
-          <w:sz w:val="20"/>
           <w:szCs w:val="20"/>
         </w:rPr>
         <w:fldChar w:fldCharType="begin"/>
@@ -869,7 +907,6 @@
       <w:r>
         <w:rPr>
           <w:color w:val="auto"/>
-          <w:sz w:val="20"/>
           <w:szCs w:val="20"/>
         </w:rPr>
         <w:instrText xml:space="preserve"> SEQ Table \* ARABIC </w:instrText>
@@ -877,7 +914,6 @@
       <w:r>
         <w:rPr>
           <w:color w:val="auto"/>
-          <w:sz w:val="20"/>
           <w:szCs w:val="20"/>
         </w:rPr>
         <w:fldChar w:fldCharType="separate"/>
@@ -886,7 +922,6 @@
         <w:rPr>
           <w:noProof/>
           <w:color w:val="auto"/>
-          <w:sz w:val="20"/>
           <w:szCs w:val="20"/>
         </w:rPr>
         <w:t>2</w:t>
@@ -894,7 +929,6 @@
       <w:r>
         <w:rPr>
           <w:color w:val="auto"/>
-          <w:sz w:val="20"/>
           <w:szCs w:val="20"/>
         </w:rPr>
         <w:fldChar w:fldCharType="end"/>
@@ -902,7 +936,6 @@
       <w:r>
         <w:rPr>
           <w:color w:val="auto"/>
-          <w:sz w:val="20"/>
           <w:szCs w:val="20"/>
         </w:rPr>
         <w:t xml:space="preserve"> - Backend Service Responsibility Mapping</w:t>
@@ -1647,14 +1680,12 @@
         <w:keepNext/>
         <w:rPr>
           <w:color w:val="auto"/>
-          <w:sz w:val="20"/>
           <w:szCs w:val="20"/>
         </w:rPr>
       </w:pPr>
       <w:r>
         <w:rPr>
           <w:color w:val="auto"/>
-          <w:sz w:val="20"/>
           <w:szCs w:val="20"/>
         </w:rPr>
         <w:t xml:space="preserve">Table </w:t>
@@ -1662,7 +1693,6 @@
       <w:r>
         <w:rPr>
           <w:color w:val="auto"/>
-          <w:sz w:val="20"/>
           <w:szCs w:val="20"/>
         </w:rPr>
         <w:fldChar w:fldCharType="begin"/>
@@ -1670,7 +1700,6 @@
       <w:r>
         <w:rPr>
           <w:color w:val="auto"/>
-          <w:sz w:val="20"/>
           <w:szCs w:val="20"/>
         </w:rPr>
         <w:instrText xml:space="preserve"> SEQ Table \* ARABIC </w:instrText>
@@ -1678,7 +1707,6 @@
       <w:r>
         <w:rPr>
           <w:color w:val="auto"/>
-          <w:sz w:val="20"/>
           <w:szCs w:val="20"/>
         </w:rPr>
         <w:fldChar w:fldCharType="separate"/>
@@ -1687,7 +1715,6 @@
         <w:rPr>
           <w:noProof/>
           <w:color w:val="auto"/>
-          <w:sz w:val="20"/>
           <w:szCs w:val="20"/>
         </w:rPr>
         <w:t>3</w:t>
@@ -1695,7 +1722,6 @@
       <w:r>
         <w:rPr>
           <w:color w:val="auto"/>
-          <w:sz w:val="20"/>
           <w:szCs w:val="20"/>
         </w:rPr>
         <w:fldChar w:fldCharType="end"/>
@@ -1703,7 +1729,6 @@
       <w:r>
         <w:rPr>
           <w:color w:val="auto"/>
-          <w:sz w:val="20"/>
           <w:szCs w:val="20"/>
         </w:rPr>
         <w:t xml:space="preserve"> - Authentication API Endpoints</w:t>
@@ -2432,14 +2457,12 @@
                               <w:jc w:val="center"/>
                               <w:rPr>
                                 <w:color w:val="auto"/>
-                                <w:sz w:val="20"/>
                                 <w:szCs w:val="20"/>
                               </w:rPr>
                             </w:pPr>
                             <w:r>
                               <w:rPr>
                                 <w:color w:val="auto"/>
-                                <w:sz w:val="20"/>
                                 <w:szCs w:val="20"/>
                               </w:rPr>
                               <w:t xml:space="preserve">Figure </w:t>
@@ -2447,7 +2470,6 @@
                             <w:r>
                               <w:rPr>
                                 <w:color w:val="auto"/>
-                                <w:sz w:val="20"/>
                                 <w:szCs w:val="20"/>
                               </w:rPr>
                               <w:fldChar w:fldCharType="begin"/>
@@ -2455,7 +2477,6 @@
                             <w:r>
                               <w:rPr>
                                 <w:color w:val="auto"/>
-                                <w:sz w:val="20"/>
                                 <w:szCs w:val="20"/>
                               </w:rPr>
                               <w:instrText xml:space="preserve"> SEQ Figure \* ARABIC </w:instrText>
@@ -2463,7 +2484,6 @@
                             <w:r>
                               <w:rPr>
                                 <w:color w:val="auto"/>
-                                <w:sz w:val="20"/>
                                 <w:szCs w:val="20"/>
                               </w:rPr>
                               <w:fldChar w:fldCharType="separate"/>
@@ -2472,7 +2492,6 @@
                               <w:rPr>
                                 <w:noProof/>
                                 <w:color w:val="auto"/>
-                                <w:sz w:val="20"/>
                                 <w:szCs w:val="20"/>
                               </w:rPr>
                               <w:t>1</w:t>
@@ -2480,7 +2499,6 @@
                             <w:r>
                               <w:rPr>
                                 <w:color w:val="auto"/>
-                                <w:sz w:val="20"/>
                                 <w:szCs w:val="20"/>
                               </w:rPr>
                               <w:fldChar w:fldCharType="end"/>
@@ -2488,7 +2506,6 @@
                             <w:r>
                               <w:rPr>
                                 <w:color w:val="auto"/>
-                                <w:sz w:val="20"/>
                                 <w:szCs w:val="20"/>
                               </w:rPr>
                               <w:t xml:space="preserve"> - Authentication API Flow</w:t>
@@ -2523,14 +2540,12 @@
                         <w:jc w:val="center"/>
                         <w:rPr>
                           <w:color w:val="auto"/>
-                          <w:sz w:val="20"/>
                           <w:szCs w:val="20"/>
                         </w:rPr>
                       </w:pPr>
                       <w:r>
                         <w:rPr>
                           <w:color w:val="auto"/>
-                          <w:sz w:val="20"/>
                           <w:szCs w:val="20"/>
                         </w:rPr>
                         <w:t xml:space="preserve">Figure </w:t>
@@ -2538,7 +2553,6 @@
                       <w:r>
                         <w:rPr>
                           <w:color w:val="auto"/>
-                          <w:sz w:val="20"/>
                           <w:szCs w:val="20"/>
                         </w:rPr>
                         <w:fldChar w:fldCharType="begin"/>
@@ -2546,7 +2560,6 @@
                       <w:r>
                         <w:rPr>
                           <w:color w:val="auto"/>
-                          <w:sz w:val="20"/>
                           <w:szCs w:val="20"/>
                         </w:rPr>
                         <w:instrText xml:space="preserve"> SEQ Figure \* ARABIC </w:instrText>
@@ -2554,7 +2567,6 @@
                       <w:r>
                         <w:rPr>
                           <w:color w:val="auto"/>
-                          <w:sz w:val="20"/>
                           <w:szCs w:val="20"/>
                         </w:rPr>
                         <w:fldChar w:fldCharType="separate"/>
@@ -2563,7 +2575,6 @@
                         <w:rPr>
                           <w:noProof/>
                           <w:color w:val="auto"/>
-                          <w:sz w:val="20"/>
                           <w:szCs w:val="20"/>
                         </w:rPr>
                         <w:t>1</w:t>
@@ -2571,7 +2582,6 @@
                       <w:r>
                         <w:rPr>
                           <w:color w:val="auto"/>
-                          <w:sz w:val="20"/>
                           <w:szCs w:val="20"/>
                         </w:rPr>
                         <w:fldChar w:fldCharType="end"/>
@@ -2579,7 +2589,6 @@
                       <w:r>
                         <w:rPr>
                           <w:color w:val="auto"/>
-                          <w:sz w:val="20"/>
                           <w:szCs w:val="20"/>
                         </w:rPr>
                         <w:t xml:space="preserve"> - Authentication API Flow</w:t>
@@ -2594,6 +2603,9 @@
         </mc:AlternateContent>
       </w:r>
       <w:r>
+        <w:rPr>
+          <w:noProof/>
+        </w:rPr>
         <w:drawing>
           <wp:anchor distT="0" distB="0" distL="114300" distR="114300" simplePos="0" relativeHeight="251658240" behindDoc="0" locked="0" layoutInCell="1" allowOverlap="1" wp14:anchorId="3C775D70" wp14:editId="6B667679">
             <wp:simplePos x="0" y="0"/>
@@ -2700,14 +2712,12 @@
         <w:keepNext/>
         <w:rPr>
           <w:color w:val="auto"/>
-          <w:sz w:val="20"/>
           <w:szCs w:val="20"/>
         </w:rPr>
       </w:pPr>
       <w:r>
         <w:rPr>
           <w:color w:val="auto"/>
-          <w:sz w:val="20"/>
           <w:szCs w:val="20"/>
         </w:rPr>
         <w:t xml:space="preserve">Table </w:t>
@@ -2715,7 +2725,6 @@
       <w:r>
         <w:rPr>
           <w:color w:val="auto"/>
-          <w:sz w:val="20"/>
           <w:szCs w:val="20"/>
         </w:rPr>
         <w:fldChar w:fldCharType="begin"/>
@@ -2723,7 +2732,6 @@
       <w:r>
         <w:rPr>
           <w:color w:val="auto"/>
-          <w:sz w:val="20"/>
           <w:szCs w:val="20"/>
         </w:rPr>
         <w:instrText xml:space="preserve"> SEQ Table \* ARABIC </w:instrText>
@@ -2731,7 +2739,6 @@
       <w:r>
         <w:rPr>
           <w:color w:val="auto"/>
-          <w:sz w:val="20"/>
           <w:szCs w:val="20"/>
         </w:rPr>
         <w:fldChar w:fldCharType="separate"/>
@@ -2740,7 +2747,6 @@
         <w:rPr>
           <w:noProof/>
           <w:color w:val="auto"/>
-          <w:sz w:val="20"/>
           <w:szCs w:val="20"/>
         </w:rPr>
         <w:t>4</w:t>
@@ -2748,7 +2754,6 @@
       <w:r>
         <w:rPr>
           <w:color w:val="auto"/>
-          <w:sz w:val="20"/>
           <w:szCs w:val="20"/>
         </w:rPr>
         <w:fldChar w:fldCharType="end"/>
@@ -2756,7 +2761,6 @@
       <w:r>
         <w:rPr>
           <w:color w:val="auto"/>
-          <w:sz w:val="20"/>
           <w:szCs w:val="20"/>
         </w:rPr>
         <w:t xml:space="preserve"> - Customer API Endpoints</w:t>
@@ -3624,14 +3628,12 @@
                               <w:jc w:val="center"/>
                               <w:rPr>
                                 <w:color w:val="auto"/>
-                                <w:sz w:val="20"/>
                                 <w:szCs w:val="20"/>
                               </w:rPr>
                             </w:pPr>
                             <w:r>
                               <w:rPr>
                                 <w:color w:val="auto"/>
-                                <w:sz w:val="20"/>
                                 <w:szCs w:val="20"/>
                               </w:rPr>
                               <w:t xml:space="preserve">Figure </w:t>
@@ -3639,7 +3641,6 @@
                             <w:r>
                               <w:rPr>
                                 <w:color w:val="auto"/>
-                                <w:sz w:val="20"/>
                                 <w:szCs w:val="20"/>
                               </w:rPr>
                               <w:fldChar w:fldCharType="begin"/>
@@ -3647,7 +3648,6 @@
                             <w:r>
                               <w:rPr>
                                 <w:color w:val="auto"/>
-                                <w:sz w:val="20"/>
                                 <w:szCs w:val="20"/>
                               </w:rPr>
                               <w:instrText xml:space="preserve"> SEQ Figure \* ARABIC </w:instrText>
@@ -3655,7 +3655,6 @@
                             <w:r>
                               <w:rPr>
                                 <w:color w:val="auto"/>
-                                <w:sz w:val="20"/>
                                 <w:szCs w:val="20"/>
                               </w:rPr>
                               <w:fldChar w:fldCharType="separate"/>
@@ -3664,7 +3663,6 @@
                               <w:rPr>
                                 <w:noProof/>
                                 <w:color w:val="auto"/>
-                                <w:sz w:val="20"/>
                                 <w:szCs w:val="20"/>
                               </w:rPr>
                               <w:t>2</w:t>
@@ -3672,7 +3670,6 @@
                             <w:r>
                               <w:rPr>
                                 <w:color w:val="auto"/>
-                                <w:sz w:val="20"/>
                                 <w:szCs w:val="20"/>
                               </w:rPr>
                               <w:fldChar w:fldCharType="end"/>
@@ -3680,7 +3677,6 @@
                             <w:r>
                               <w:rPr>
                                 <w:color w:val="auto"/>
-                                <w:sz w:val="20"/>
                                 <w:szCs w:val="20"/>
                               </w:rPr>
                               <w:t xml:space="preserve"> - Customer API Flow</w:t>
@@ -3711,14 +3707,12 @@
                         <w:jc w:val="center"/>
                         <w:rPr>
                           <w:color w:val="auto"/>
-                          <w:sz w:val="20"/>
                           <w:szCs w:val="20"/>
                         </w:rPr>
                       </w:pPr>
                       <w:r>
                         <w:rPr>
                           <w:color w:val="auto"/>
-                          <w:sz w:val="20"/>
                           <w:szCs w:val="20"/>
                         </w:rPr>
                         <w:t xml:space="preserve">Figure </w:t>
@@ -3726,7 +3720,6 @@
                       <w:r>
                         <w:rPr>
                           <w:color w:val="auto"/>
-                          <w:sz w:val="20"/>
                           <w:szCs w:val="20"/>
                         </w:rPr>
                         <w:fldChar w:fldCharType="begin"/>
@@ -3734,7 +3727,6 @@
                       <w:r>
                         <w:rPr>
                           <w:color w:val="auto"/>
-                          <w:sz w:val="20"/>
                           <w:szCs w:val="20"/>
                         </w:rPr>
                         <w:instrText xml:space="preserve"> SEQ Figure \* ARABIC </w:instrText>
@@ -3742,7 +3734,6 @@
                       <w:r>
                         <w:rPr>
                           <w:color w:val="auto"/>
-                          <w:sz w:val="20"/>
                           <w:szCs w:val="20"/>
                         </w:rPr>
                         <w:fldChar w:fldCharType="separate"/>
@@ -3751,7 +3742,6 @@
                         <w:rPr>
                           <w:noProof/>
                           <w:color w:val="auto"/>
-                          <w:sz w:val="20"/>
                           <w:szCs w:val="20"/>
                         </w:rPr>
                         <w:t>2</w:t>
@@ -3759,7 +3749,6 @@
                       <w:r>
                         <w:rPr>
                           <w:color w:val="auto"/>
-                          <w:sz w:val="20"/>
                           <w:szCs w:val="20"/>
                         </w:rPr>
                         <w:fldChar w:fldCharType="end"/>
@@ -3767,7 +3756,6 @@
                       <w:r>
                         <w:rPr>
                           <w:color w:val="auto"/>
-                          <w:sz w:val="20"/>
                           <w:szCs w:val="20"/>
                         </w:rPr>
                         <w:t xml:space="preserve"> - Customer API Flow</w:t>
@@ -3782,6 +3770,9 @@
         </mc:AlternateContent>
       </w:r>
       <w:r>
+        <w:rPr>
+          <w:noProof/>
+        </w:rPr>
         <w:drawing>
           <wp:anchor distT="0" distB="0" distL="114300" distR="114300" simplePos="0" relativeHeight="251661312" behindDoc="0" locked="0" layoutInCell="1" allowOverlap="1" wp14:anchorId="1853054B" wp14:editId="5A66FEED">
             <wp:simplePos x="0" y="0"/>
@@ -3844,10 +3835,1306 @@
         <w:br w:type="page"/>
       </w:r>
     </w:p>
+    <w:p>
+      <w:pPr>
+        <w:pStyle w:val="Heading3"/>
+      </w:pPr>
+      <w:r>
+        <w:lastRenderedPageBreak/>
+        <w:t>Vehicle &amp; Search APIs</w:t>
+      </w:r>
+    </w:p>
+    <w:p>
+      <w:r>
+        <w:t>Vehicle &amp; Search APIs represent the basic business logic of KriGo, which is responsible for searching for the available vehicles to get the required information about them. These APIs represent the interaction layer between client applications and the Fleet Management Service and allows getting the vehicle list filtered and sorted according to different criteria and getting up-to-date data about their availability, pricing, characteristics, and rental agencies.</w:t>
+      </w:r>
+    </w:p>
+    <w:p>
+      <w:r>
+        <w:t>The structure of Vehicle &amp; Search APIs corresponds to REST architectural style, where vehicles are represented as resources and the search for them is performed via query parameters. In contrast to customer management services, these services can be called not only by authenticated but also by unauthenticated users to find the vehicles before registration. However, some features, such as recommendations or saved searches, are available only for the authenticated ones.</w:t>
+      </w:r>
+    </w:p>
+    <w:p>
+      <w:r>
+        <w:t>To increase performance, these APIs include advanced filters, sorting, and paging options to effectively get large datasets with low network load.</w:t>
+      </w:r>
+    </w:p>
+    <w:p>
+      <w:pPr>
+        <w:pStyle w:val="Heading4"/>
+      </w:pPr>
+      <w:r>
+        <w:t>Vehicle &amp; Search API Endpoints</w:t>
+      </w:r>
+    </w:p>
+    <w:p>
+      <w:pPr>
+        <w:pStyle w:val="Caption"/>
+        <w:keepNext/>
+      </w:pPr>
+      <w:r>
+        <w:t xml:space="preserve">Table </w:t>
+      </w:r>
+      <w:r>
+        <w:fldChar w:fldCharType="begin"/>
+      </w:r>
+      <w:r>
+        <w:instrText xml:space="preserve"> SEQ Table \* ARABIC </w:instrText>
+      </w:r>
+      <w:r>
+        <w:fldChar w:fldCharType="separate"/>
+      </w:r>
+      <w:r>
+        <w:rPr>
+          <w:noProof/>
+        </w:rPr>
+        <w:t>5</w:t>
+      </w:r>
+      <w:r>
+        <w:fldChar w:fldCharType="end"/>
+      </w:r>
+      <w:r>
+        <w:t xml:space="preserve"> - </w:t>
+      </w:r>
+      <w:r>
+        <w:t>Vehicle &amp; Search API Endpoints</w:t>
+      </w:r>
+    </w:p>
+    <w:tbl>
+      <w:tblPr>
+        <w:tblStyle w:val="PlainTable1"/>
+        <w:tblW w:w="0" w:type="auto"/>
+        <w:tblLayout w:type="fixed"/>
+        <w:tblCellMar>
+          <w:top w:w="72" w:type="dxa"/>
+          <w:bottom w:w="72" w:type="dxa"/>
+        </w:tblCellMar>
+        <w:tblLook w:val="04A0" w:firstRow="1" w:lastRow="0" w:firstColumn="1" w:lastColumn="0" w:noHBand="0" w:noVBand="1"/>
+      </w:tblPr>
+      <w:tblGrid>
+        <w:gridCol w:w="3325"/>
+        <w:gridCol w:w="1080"/>
+        <w:gridCol w:w="3150"/>
+        <w:gridCol w:w="1792"/>
+      </w:tblGrid>
+      <w:tr>
+        <w:trPr>
+          <w:cnfStyle w:val="100000000000" w:firstRow="1" w:lastRow="0" w:firstColumn="0" w:lastColumn="0" w:oddVBand="0" w:evenVBand="0" w:oddHBand="0" w:evenHBand="0" w:firstRowFirstColumn="0" w:firstRowLastColumn="0" w:lastRowFirstColumn="0" w:lastRowLastColumn="0"/>
+        </w:trPr>
+        <w:tc>
+          <w:tcPr>
+            <w:cnfStyle w:val="001000000000" w:firstRow="0" w:lastRow="0" w:firstColumn="1" w:lastColumn="0" w:oddVBand="0" w:evenVBand="0" w:oddHBand="0" w:evenHBand="0" w:firstRowFirstColumn="0" w:firstRowLastColumn="0" w:lastRowFirstColumn="0" w:lastRowLastColumn="0"/>
+            <w:tcW w:w="3325" w:type="dxa"/>
+            <w:vAlign w:val="center"/>
+            <w:hideMark/>
+          </w:tcPr>
+          <w:p>
+            <w:r>
+              <w:t>Endpoint</w:t>
+            </w:r>
+          </w:p>
+        </w:tc>
+        <w:tc>
+          <w:tcPr>
+            <w:tcW w:w="1080" w:type="dxa"/>
+            <w:vAlign w:val="center"/>
+            <w:hideMark/>
+          </w:tcPr>
+          <w:p>
+            <w:pPr>
+              <w:cnfStyle w:val="100000000000" w:firstRow="1" w:lastRow="0" w:firstColumn="0" w:lastColumn="0" w:oddVBand="0" w:evenVBand="0" w:oddHBand="0" w:evenHBand="0" w:firstRowFirstColumn="0" w:firstRowLastColumn="0" w:lastRowFirstColumn="0" w:lastRowLastColumn="0"/>
+            </w:pPr>
+            <w:r>
+              <w:t>Method</w:t>
+            </w:r>
+          </w:p>
+        </w:tc>
+        <w:tc>
+          <w:tcPr>
+            <w:tcW w:w="3150" w:type="dxa"/>
+            <w:vAlign w:val="center"/>
+            <w:hideMark/>
+          </w:tcPr>
+          <w:p>
+            <w:pPr>
+              <w:cnfStyle w:val="100000000000" w:firstRow="1" w:lastRow="0" w:firstColumn="0" w:lastColumn="0" w:oddVBand="0" w:evenVBand="0" w:oddHBand="0" w:evenHBand="0" w:firstRowFirstColumn="0" w:firstRowLastColumn="0" w:lastRowFirstColumn="0" w:lastRowLastColumn="0"/>
+            </w:pPr>
+            <w:r>
+              <w:t>Description</w:t>
+            </w:r>
+          </w:p>
+        </w:tc>
+        <w:tc>
+          <w:tcPr>
+            <w:tcW w:w="1792" w:type="dxa"/>
+            <w:vAlign w:val="center"/>
+            <w:hideMark/>
+          </w:tcPr>
+          <w:p>
+            <w:pPr>
+              <w:cnfStyle w:val="100000000000" w:firstRow="1" w:lastRow="0" w:firstColumn="0" w:lastColumn="0" w:oddVBand="0" w:evenVBand="0" w:oddHBand="0" w:evenHBand="0" w:firstRowFirstColumn="0" w:firstRowLastColumn="0" w:lastRowFirstColumn="0" w:lastRowLastColumn="0"/>
+            </w:pPr>
+            <w:r>
+              <w:t>Auth</w:t>
+            </w:r>
+            <w:r>
+              <w:t xml:space="preserve"> </w:t>
+            </w:r>
+            <w:r>
+              <w:t>Required</w:t>
+            </w:r>
+          </w:p>
+        </w:tc>
+      </w:tr>
+      <w:tr>
+        <w:trPr>
+          <w:cnfStyle w:val="000000100000" w:firstRow="0" w:lastRow="0" w:firstColumn="0" w:lastColumn="0" w:oddVBand="0" w:evenVBand="0" w:oddHBand="1" w:evenHBand="0" w:firstRowFirstColumn="0" w:firstRowLastColumn="0" w:lastRowFirstColumn="0" w:lastRowLastColumn="0"/>
+        </w:trPr>
+        <w:tc>
+          <w:tcPr>
+            <w:cnfStyle w:val="001000000000" w:firstRow="0" w:lastRow="0" w:firstColumn="1" w:lastColumn="0" w:oddVBand="0" w:evenVBand="0" w:oddHBand="0" w:evenHBand="0" w:firstRowFirstColumn="0" w:firstRowLastColumn="0" w:lastRowFirstColumn="0" w:lastRowLastColumn="0"/>
+            <w:tcW w:w="3325" w:type="dxa"/>
+            <w:vAlign w:val="center"/>
+            <w:hideMark/>
+          </w:tcPr>
+          <w:p>
+            <w:pPr>
+              <w:rPr>
+                <w:b w:val="0"/>
+                <w:bCs w:val="0"/>
+              </w:rPr>
+            </w:pPr>
+            <w:r>
+              <w:rPr>
+                <w:b w:val="0"/>
+                <w:bCs w:val="0"/>
+              </w:rPr>
+              <w:t>/api/v1/vehicles</w:t>
+            </w:r>
+          </w:p>
+        </w:tc>
+        <w:tc>
+          <w:tcPr>
+            <w:tcW w:w="1080" w:type="dxa"/>
+            <w:vAlign w:val="center"/>
+            <w:hideMark/>
+          </w:tcPr>
+          <w:p>
+            <w:pPr>
+              <w:jc w:val="center"/>
+              <w:cnfStyle w:val="000000100000" w:firstRow="0" w:lastRow="0" w:firstColumn="0" w:lastColumn="0" w:oddVBand="0" w:evenVBand="0" w:oddHBand="1" w:evenHBand="0" w:firstRowFirstColumn="0" w:firstRowLastColumn="0" w:lastRowFirstColumn="0" w:lastRowLastColumn="0"/>
+            </w:pPr>
+            <w:r>
+              <w:t>GET</w:t>
+            </w:r>
+          </w:p>
+        </w:tc>
+        <w:tc>
+          <w:tcPr>
+            <w:tcW w:w="3150" w:type="dxa"/>
+            <w:vAlign w:val="center"/>
+            <w:hideMark/>
+          </w:tcPr>
+          <w:p>
+            <w:pPr>
+              <w:cnfStyle w:val="000000100000" w:firstRow="0" w:lastRow="0" w:firstColumn="0" w:lastColumn="0" w:oddVBand="0" w:evenVBand="0" w:oddHBand="1" w:evenHBand="0" w:firstRowFirstColumn="0" w:firstRowLastColumn="0" w:lastRowFirstColumn="0" w:lastRowLastColumn="0"/>
+            </w:pPr>
+            <w:r>
+              <w:t>Retrieve all available vehicles</w:t>
+            </w:r>
+          </w:p>
+        </w:tc>
+        <w:tc>
+          <w:tcPr>
+            <w:tcW w:w="1792" w:type="dxa"/>
+            <w:vAlign w:val="center"/>
+            <w:hideMark/>
+          </w:tcPr>
+          <w:p>
+            <w:pPr>
+              <w:jc w:val="center"/>
+              <w:cnfStyle w:val="000000100000" w:firstRow="0" w:lastRow="0" w:firstColumn="0" w:lastColumn="0" w:oddVBand="0" w:evenVBand="0" w:oddHBand="1" w:evenHBand="0" w:firstRowFirstColumn="0" w:firstRowLastColumn="0" w:lastRowFirstColumn="0" w:lastRowLastColumn="0"/>
+            </w:pPr>
+            <w:r>
+              <w:t>No</w:t>
+            </w:r>
+          </w:p>
+        </w:tc>
+      </w:tr>
+      <w:tr>
+        <w:tc>
+          <w:tcPr>
+            <w:cnfStyle w:val="001000000000" w:firstRow="0" w:lastRow="0" w:firstColumn="1" w:lastColumn="0" w:oddVBand="0" w:evenVBand="0" w:oddHBand="0" w:evenHBand="0" w:firstRowFirstColumn="0" w:firstRowLastColumn="0" w:lastRowFirstColumn="0" w:lastRowLastColumn="0"/>
+            <w:tcW w:w="3325" w:type="dxa"/>
+            <w:vAlign w:val="center"/>
+            <w:hideMark/>
+          </w:tcPr>
+          <w:p>
+            <w:pPr>
+              <w:rPr>
+                <w:b w:val="0"/>
+                <w:bCs w:val="0"/>
+              </w:rPr>
+            </w:pPr>
+            <w:r>
+              <w:rPr>
+                <w:b w:val="0"/>
+                <w:bCs w:val="0"/>
+              </w:rPr>
+              <w:t>/api/v1/vehicles/{vehicleId}</w:t>
+            </w:r>
+          </w:p>
+        </w:tc>
+        <w:tc>
+          <w:tcPr>
+            <w:tcW w:w="1080" w:type="dxa"/>
+            <w:vAlign w:val="center"/>
+            <w:hideMark/>
+          </w:tcPr>
+          <w:p>
+            <w:pPr>
+              <w:jc w:val="center"/>
+              <w:cnfStyle w:val="000000000000" w:firstRow="0" w:lastRow="0" w:firstColumn="0" w:lastColumn="0" w:oddVBand="0" w:evenVBand="0" w:oddHBand="0" w:evenHBand="0" w:firstRowFirstColumn="0" w:firstRowLastColumn="0" w:lastRowFirstColumn="0" w:lastRowLastColumn="0"/>
+            </w:pPr>
+            <w:r>
+              <w:t>GET</w:t>
+            </w:r>
+          </w:p>
+        </w:tc>
+        <w:tc>
+          <w:tcPr>
+            <w:tcW w:w="3150" w:type="dxa"/>
+            <w:vAlign w:val="center"/>
+            <w:hideMark/>
+          </w:tcPr>
+          <w:p>
+            <w:pPr>
+              <w:cnfStyle w:val="000000000000" w:firstRow="0" w:lastRow="0" w:firstColumn="0" w:lastColumn="0" w:oddVBand="0" w:evenVBand="0" w:oddHBand="0" w:evenHBand="0" w:firstRowFirstColumn="0" w:firstRowLastColumn="0" w:lastRowFirstColumn="0" w:lastRowLastColumn="0"/>
+            </w:pPr>
+            <w:r>
+              <w:t>Retrieve detailed information about a specific vehicle</w:t>
+            </w:r>
+          </w:p>
+        </w:tc>
+        <w:tc>
+          <w:tcPr>
+            <w:tcW w:w="1792" w:type="dxa"/>
+            <w:vAlign w:val="center"/>
+            <w:hideMark/>
+          </w:tcPr>
+          <w:p>
+            <w:pPr>
+              <w:jc w:val="center"/>
+              <w:cnfStyle w:val="000000000000" w:firstRow="0" w:lastRow="0" w:firstColumn="0" w:lastColumn="0" w:oddVBand="0" w:evenVBand="0" w:oddHBand="0" w:evenHBand="0" w:firstRowFirstColumn="0" w:firstRowLastColumn="0" w:lastRowFirstColumn="0" w:lastRowLastColumn="0"/>
+            </w:pPr>
+            <w:r>
+              <w:t>No</w:t>
+            </w:r>
+          </w:p>
+        </w:tc>
+      </w:tr>
+      <w:tr>
+        <w:trPr>
+          <w:cnfStyle w:val="000000100000" w:firstRow="0" w:lastRow="0" w:firstColumn="0" w:lastColumn="0" w:oddVBand="0" w:evenVBand="0" w:oddHBand="1" w:evenHBand="0" w:firstRowFirstColumn="0" w:firstRowLastColumn="0" w:lastRowFirstColumn="0" w:lastRowLastColumn="0"/>
+        </w:trPr>
+        <w:tc>
+          <w:tcPr>
+            <w:cnfStyle w:val="001000000000" w:firstRow="0" w:lastRow="0" w:firstColumn="1" w:lastColumn="0" w:oddVBand="0" w:evenVBand="0" w:oddHBand="0" w:evenHBand="0" w:firstRowFirstColumn="0" w:firstRowLastColumn="0" w:lastRowFirstColumn="0" w:lastRowLastColumn="0"/>
+            <w:tcW w:w="3325" w:type="dxa"/>
+            <w:vAlign w:val="center"/>
+            <w:hideMark/>
+          </w:tcPr>
+          <w:p>
+            <w:pPr>
+              <w:rPr>
+                <w:b w:val="0"/>
+                <w:bCs w:val="0"/>
+              </w:rPr>
+            </w:pPr>
+            <w:r>
+              <w:rPr>
+                <w:b w:val="0"/>
+                <w:bCs w:val="0"/>
+              </w:rPr>
+              <w:t>/api/v1/vehicles/search</w:t>
+            </w:r>
+          </w:p>
+        </w:tc>
+        <w:tc>
+          <w:tcPr>
+            <w:tcW w:w="1080" w:type="dxa"/>
+            <w:vAlign w:val="center"/>
+            <w:hideMark/>
+          </w:tcPr>
+          <w:p>
+            <w:pPr>
+              <w:jc w:val="center"/>
+              <w:cnfStyle w:val="000000100000" w:firstRow="0" w:lastRow="0" w:firstColumn="0" w:lastColumn="0" w:oddVBand="0" w:evenVBand="0" w:oddHBand="1" w:evenHBand="0" w:firstRowFirstColumn="0" w:firstRowLastColumn="0" w:lastRowFirstColumn="0" w:lastRowLastColumn="0"/>
+            </w:pPr>
+            <w:r>
+              <w:t>GET</w:t>
+            </w:r>
+          </w:p>
+        </w:tc>
+        <w:tc>
+          <w:tcPr>
+            <w:tcW w:w="3150" w:type="dxa"/>
+            <w:vAlign w:val="center"/>
+            <w:hideMark/>
+          </w:tcPr>
+          <w:p>
+            <w:pPr>
+              <w:cnfStyle w:val="000000100000" w:firstRow="0" w:lastRow="0" w:firstColumn="0" w:lastColumn="0" w:oddVBand="0" w:evenVBand="0" w:oddHBand="1" w:evenHBand="0" w:firstRowFirstColumn="0" w:firstRowLastColumn="0" w:lastRowFirstColumn="0" w:lastRowLastColumn="0"/>
+            </w:pPr>
+            <w:r>
+              <w:t>Search vehicles using keywords and search criteria</w:t>
+            </w:r>
+          </w:p>
+        </w:tc>
+        <w:tc>
+          <w:tcPr>
+            <w:tcW w:w="1792" w:type="dxa"/>
+            <w:vAlign w:val="center"/>
+            <w:hideMark/>
+          </w:tcPr>
+          <w:p>
+            <w:pPr>
+              <w:jc w:val="center"/>
+              <w:cnfStyle w:val="000000100000" w:firstRow="0" w:lastRow="0" w:firstColumn="0" w:lastColumn="0" w:oddVBand="0" w:evenVBand="0" w:oddHBand="1" w:evenHBand="0" w:firstRowFirstColumn="0" w:firstRowLastColumn="0" w:lastRowFirstColumn="0" w:lastRowLastColumn="0"/>
+            </w:pPr>
+            <w:r>
+              <w:t>No</w:t>
+            </w:r>
+          </w:p>
+        </w:tc>
+      </w:tr>
+      <w:tr>
+        <w:tc>
+          <w:tcPr>
+            <w:cnfStyle w:val="001000000000" w:firstRow="0" w:lastRow="0" w:firstColumn="1" w:lastColumn="0" w:oddVBand="0" w:evenVBand="0" w:oddHBand="0" w:evenHBand="0" w:firstRowFirstColumn="0" w:firstRowLastColumn="0" w:lastRowFirstColumn="0" w:lastRowLastColumn="0"/>
+            <w:tcW w:w="3325" w:type="dxa"/>
+            <w:vAlign w:val="center"/>
+            <w:hideMark/>
+          </w:tcPr>
+          <w:p>
+            <w:pPr>
+              <w:rPr>
+                <w:b w:val="0"/>
+                <w:bCs w:val="0"/>
+              </w:rPr>
+            </w:pPr>
+            <w:r>
+              <w:rPr>
+                <w:b w:val="0"/>
+                <w:bCs w:val="0"/>
+              </w:rPr>
+              <w:t>/api/v1/vehicles/filter</w:t>
+            </w:r>
+          </w:p>
+        </w:tc>
+        <w:tc>
+          <w:tcPr>
+            <w:tcW w:w="1080" w:type="dxa"/>
+            <w:vAlign w:val="center"/>
+            <w:hideMark/>
+          </w:tcPr>
+          <w:p>
+            <w:pPr>
+              <w:jc w:val="center"/>
+              <w:cnfStyle w:val="000000000000" w:firstRow="0" w:lastRow="0" w:firstColumn="0" w:lastColumn="0" w:oddVBand="0" w:evenVBand="0" w:oddHBand="0" w:evenHBand="0" w:firstRowFirstColumn="0" w:firstRowLastColumn="0" w:lastRowFirstColumn="0" w:lastRowLastColumn="0"/>
+            </w:pPr>
+            <w:r>
+              <w:t>GET</w:t>
+            </w:r>
+          </w:p>
+        </w:tc>
+        <w:tc>
+          <w:tcPr>
+            <w:tcW w:w="3150" w:type="dxa"/>
+            <w:vAlign w:val="center"/>
+            <w:hideMark/>
+          </w:tcPr>
+          <w:p>
+            <w:pPr>
+              <w:cnfStyle w:val="000000000000" w:firstRow="0" w:lastRow="0" w:firstColumn="0" w:lastColumn="0" w:oddVBand="0" w:evenVBand="0" w:oddHBand="0" w:evenHBand="0" w:firstRowFirstColumn="0" w:firstRowLastColumn="0" w:lastRowFirstColumn="0" w:lastRowLastColumn="0"/>
+            </w:pPr>
+            <w:r>
+              <w:t>Filter vehicles by category, price, transmission, fuel type, and availability</w:t>
+            </w:r>
+          </w:p>
+        </w:tc>
+        <w:tc>
+          <w:tcPr>
+            <w:tcW w:w="1792" w:type="dxa"/>
+            <w:vAlign w:val="center"/>
+            <w:hideMark/>
+          </w:tcPr>
+          <w:p>
+            <w:pPr>
+              <w:jc w:val="center"/>
+              <w:cnfStyle w:val="000000000000" w:firstRow="0" w:lastRow="0" w:firstColumn="0" w:lastColumn="0" w:oddVBand="0" w:evenVBand="0" w:oddHBand="0" w:evenHBand="0" w:firstRowFirstColumn="0" w:firstRowLastColumn="0" w:lastRowFirstColumn="0" w:lastRowLastColumn="0"/>
+            </w:pPr>
+            <w:r>
+              <w:t>No</w:t>
+            </w:r>
+          </w:p>
+        </w:tc>
+      </w:tr>
+      <w:tr>
+        <w:trPr>
+          <w:cnfStyle w:val="000000100000" w:firstRow="0" w:lastRow="0" w:firstColumn="0" w:lastColumn="0" w:oddVBand="0" w:evenVBand="0" w:oddHBand="1" w:evenHBand="0" w:firstRowFirstColumn="0" w:firstRowLastColumn="0" w:lastRowFirstColumn="0" w:lastRowLastColumn="0"/>
+        </w:trPr>
+        <w:tc>
+          <w:tcPr>
+            <w:cnfStyle w:val="001000000000" w:firstRow="0" w:lastRow="0" w:firstColumn="1" w:lastColumn="0" w:oddVBand="0" w:evenVBand="0" w:oddHBand="0" w:evenHBand="0" w:firstRowFirstColumn="0" w:firstRowLastColumn="0" w:lastRowFirstColumn="0" w:lastRowLastColumn="0"/>
+            <w:tcW w:w="3325" w:type="dxa"/>
+            <w:vAlign w:val="center"/>
+            <w:hideMark/>
+          </w:tcPr>
+          <w:p>
+            <w:pPr>
+              <w:rPr>
+                <w:b w:val="0"/>
+                <w:bCs w:val="0"/>
+              </w:rPr>
+            </w:pPr>
+            <w:r>
+              <w:rPr>
+                <w:b w:val="0"/>
+                <w:bCs w:val="0"/>
+              </w:rPr>
+              <w:t>/api/v1/vehicles/compare</w:t>
+            </w:r>
+          </w:p>
+        </w:tc>
+        <w:tc>
+          <w:tcPr>
+            <w:tcW w:w="1080" w:type="dxa"/>
+            <w:vAlign w:val="center"/>
+            <w:hideMark/>
+          </w:tcPr>
+          <w:p>
+            <w:pPr>
+              <w:jc w:val="center"/>
+              <w:cnfStyle w:val="000000100000" w:firstRow="0" w:lastRow="0" w:firstColumn="0" w:lastColumn="0" w:oddVBand="0" w:evenVBand="0" w:oddHBand="1" w:evenHBand="0" w:firstRowFirstColumn="0" w:firstRowLastColumn="0" w:lastRowFirstColumn="0" w:lastRowLastColumn="0"/>
+            </w:pPr>
+            <w:r>
+              <w:t>GET</w:t>
+            </w:r>
+          </w:p>
+        </w:tc>
+        <w:tc>
+          <w:tcPr>
+            <w:tcW w:w="3150" w:type="dxa"/>
+            <w:vAlign w:val="center"/>
+            <w:hideMark/>
+          </w:tcPr>
+          <w:p>
+            <w:pPr>
+              <w:cnfStyle w:val="000000100000" w:firstRow="0" w:lastRow="0" w:firstColumn="0" w:lastColumn="0" w:oddVBand="0" w:evenVBand="0" w:oddHBand="1" w:evenHBand="0" w:firstRowFirstColumn="0" w:firstRowLastColumn="0" w:lastRowFirstColumn="0" w:lastRowLastColumn="0"/>
+            </w:pPr>
+            <w:r>
+              <w:t>Compare multiple vehicles</w:t>
+            </w:r>
+          </w:p>
+        </w:tc>
+        <w:tc>
+          <w:tcPr>
+            <w:tcW w:w="1792" w:type="dxa"/>
+            <w:vAlign w:val="center"/>
+            <w:hideMark/>
+          </w:tcPr>
+          <w:p>
+            <w:pPr>
+              <w:jc w:val="center"/>
+              <w:cnfStyle w:val="000000100000" w:firstRow="0" w:lastRow="0" w:firstColumn="0" w:lastColumn="0" w:oddVBand="0" w:evenVBand="0" w:oddHBand="1" w:evenHBand="0" w:firstRowFirstColumn="0" w:firstRowLastColumn="0" w:lastRowFirstColumn="0" w:lastRowLastColumn="0"/>
+            </w:pPr>
+            <w:r>
+              <w:t>No</w:t>
+            </w:r>
+          </w:p>
+        </w:tc>
+      </w:tr>
+      <w:tr>
+        <w:tc>
+          <w:tcPr>
+            <w:cnfStyle w:val="001000000000" w:firstRow="0" w:lastRow="0" w:firstColumn="1" w:lastColumn="0" w:oddVBand="0" w:evenVBand="0" w:oddHBand="0" w:evenHBand="0" w:firstRowFirstColumn="0" w:firstRowLastColumn="0" w:lastRowFirstColumn="0" w:lastRowLastColumn="0"/>
+            <w:tcW w:w="3325" w:type="dxa"/>
+            <w:vAlign w:val="center"/>
+            <w:hideMark/>
+          </w:tcPr>
+          <w:p>
+            <w:pPr>
+              <w:rPr>
+                <w:b w:val="0"/>
+                <w:bCs w:val="0"/>
+              </w:rPr>
+            </w:pPr>
+            <w:r>
+              <w:rPr>
+                <w:b w:val="0"/>
+                <w:bCs w:val="0"/>
+              </w:rPr>
+              <w:t>/api/v1/vehicles/nearby</w:t>
+            </w:r>
+          </w:p>
+        </w:tc>
+        <w:tc>
+          <w:tcPr>
+            <w:tcW w:w="1080" w:type="dxa"/>
+            <w:vAlign w:val="center"/>
+            <w:hideMark/>
+          </w:tcPr>
+          <w:p>
+            <w:pPr>
+              <w:jc w:val="center"/>
+              <w:cnfStyle w:val="000000000000" w:firstRow="0" w:lastRow="0" w:firstColumn="0" w:lastColumn="0" w:oddVBand="0" w:evenVBand="0" w:oddHBand="0" w:evenHBand="0" w:firstRowFirstColumn="0" w:firstRowLastColumn="0" w:lastRowFirstColumn="0" w:lastRowLastColumn="0"/>
+            </w:pPr>
+            <w:r>
+              <w:t>GET</w:t>
+            </w:r>
+          </w:p>
+        </w:tc>
+        <w:tc>
+          <w:tcPr>
+            <w:tcW w:w="3150" w:type="dxa"/>
+            <w:vAlign w:val="center"/>
+            <w:hideMark/>
+          </w:tcPr>
+          <w:p>
+            <w:pPr>
+              <w:cnfStyle w:val="000000000000" w:firstRow="0" w:lastRow="0" w:firstColumn="0" w:lastColumn="0" w:oddVBand="0" w:evenVBand="0" w:oddHBand="0" w:evenHBand="0" w:firstRowFirstColumn="0" w:firstRowLastColumn="0" w:lastRowFirstColumn="0" w:lastRowLastColumn="0"/>
+            </w:pPr>
+            <w:r>
+              <w:t>Retrieve vehicles available near a specified location</w:t>
+            </w:r>
+          </w:p>
+        </w:tc>
+        <w:tc>
+          <w:tcPr>
+            <w:tcW w:w="1792" w:type="dxa"/>
+            <w:vAlign w:val="center"/>
+            <w:hideMark/>
+          </w:tcPr>
+          <w:p>
+            <w:pPr>
+              <w:jc w:val="center"/>
+              <w:cnfStyle w:val="000000000000" w:firstRow="0" w:lastRow="0" w:firstColumn="0" w:lastColumn="0" w:oddVBand="0" w:evenVBand="0" w:oddHBand="0" w:evenHBand="0" w:firstRowFirstColumn="0" w:firstRowLastColumn="0" w:lastRowFirstColumn="0" w:lastRowLastColumn="0"/>
+            </w:pPr>
+            <w:r>
+              <w:t>No</w:t>
+            </w:r>
+          </w:p>
+        </w:tc>
+      </w:tr>
+      <w:tr>
+        <w:trPr>
+          <w:cnfStyle w:val="000000100000" w:firstRow="0" w:lastRow="0" w:firstColumn="0" w:lastColumn="0" w:oddVBand="0" w:evenVBand="0" w:oddHBand="1" w:evenHBand="0" w:firstRowFirstColumn="0" w:firstRowLastColumn="0" w:lastRowFirstColumn="0" w:lastRowLastColumn="0"/>
+        </w:trPr>
+        <w:tc>
+          <w:tcPr>
+            <w:cnfStyle w:val="001000000000" w:firstRow="0" w:lastRow="0" w:firstColumn="1" w:lastColumn="0" w:oddVBand="0" w:evenVBand="0" w:oddHBand="0" w:evenHBand="0" w:firstRowFirstColumn="0" w:firstRowLastColumn="0" w:lastRowFirstColumn="0" w:lastRowLastColumn="0"/>
+            <w:tcW w:w="3325" w:type="dxa"/>
+            <w:vAlign w:val="center"/>
+            <w:hideMark/>
+          </w:tcPr>
+          <w:p>
+            <w:pPr>
+              <w:rPr>
+                <w:b w:val="0"/>
+                <w:bCs w:val="0"/>
+              </w:rPr>
+            </w:pPr>
+            <w:r>
+              <w:rPr>
+                <w:b w:val="0"/>
+                <w:bCs w:val="0"/>
+              </w:rPr>
+              <w:t>/api/v1/vehicles/categories</w:t>
+            </w:r>
+          </w:p>
+        </w:tc>
+        <w:tc>
+          <w:tcPr>
+            <w:tcW w:w="1080" w:type="dxa"/>
+            <w:vAlign w:val="center"/>
+            <w:hideMark/>
+          </w:tcPr>
+          <w:p>
+            <w:pPr>
+              <w:jc w:val="center"/>
+              <w:cnfStyle w:val="000000100000" w:firstRow="0" w:lastRow="0" w:firstColumn="0" w:lastColumn="0" w:oddVBand="0" w:evenVBand="0" w:oddHBand="1" w:evenHBand="0" w:firstRowFirstColumn="0" w:firstRowLastColumn="0" w:lastRowFirstColumn="0" w:lastRowLastColumn="0"/>
+            </w:pPr>
+            <w:r>
+              <w:t>GET</w:t>
+            </w:r>
+          </w:p>
+        </w:tc>
+        <w:tc>
+          <w:tcPr>
+            <w:tcW w:w="3150" w:type="dxa"/>
+            <w:vAlign w:val="center"/>
+            <w:hideMark/>
+          </w:tcPr>
+          <w:p>
+            <w:pPr>
+              <w:cnfStyle w:val="000000100000" w:firstRow="0" w:lastRow="0" w:firstColumn="0" w:lastColumn="0" w:oddVBand="0" w:evenVBand="0" w:oddHBand="1" w:evenHBand="0" w:firstRowFirstColumn="0" w:firstRowLastColumn="0" w:lastRowFirstColumn="0" w:lastRowLastColumn="0"/>
+            </w:pPr>
+            <w:r>
+              <w:t>Retrieve all available vehicle categories</w:t>
+            </w:r>
+          </w:p>
+        </w:tc>
+        <w:tc>
+          <w:tcPr>
+            <w:tcW w:w="1792" w:type="dxa"/>
+            <w:vAlign w:val="center"/>
+            <w:hideMark/>
+          </w:tcPr>
+          <w:p>
+            <w:pPr>
+              <w:jc w:val="center"/>
+              <w:cnfStyle w:val="000000100000" w:firstRow="0" w:lastRow="0" w:firstColumn="0" w:lastColumn="0" w:oddVBand="0" w:evenVBand="0" w:oddHBand="1" w:evenHBand="0" w:firstRowFirstColumn="0" w:firstRowLastColumn="0" w:lastRowFirstColumn="0" w:lastRowLastColumn="0"/>
+            </w:pPr>
+            <w:r>
+              <w:t>No</w:t>
+            </w:r>
+          </w:p>
+        </w:tc>
+      </w:tr>
+      <w:tr>
+        <w:tc>
+          <w:tcPr>
+            <w:cnfStyle w:val="001000000000" w:firstRow="0" w:lastRow="0" w:firstColumn="1" w:lastColumn="0" w:oddVBand="0" w:evenVBand="0" w:oddHBand="0" w:evenHBand="0" w:firstRowFirstColumn="0" w:firstRowLastColumn="0" w:lastRowFirstColumn="0" w:lastRowLastColumn="0"/>
+            <w:tcW w:w="3325" w:type="dxa"/>
+            <w:vAlign w:val="center"/>
+            <w:hideMark/>
+          </w:tcPr>
+          <w:p>
+            <w:pPr>
+              <w:rPr>
+                <w:b w:val="0"/>
+                <w:bCs w:val="0"/>
+              </w:rPr>
+            </w:pPr>
+            <w:r>
+              <w:rPr>
+                <w:b w:val="0"/>
+                <w:bCs w:val="0"/>
+              </w:rPr>
+              <w:t>/api/v1/vehicles/brands</w:t>
+            </w:r>
+          </w:p>
+        </w:tc>
+        <w:tc>
+          <w:tcPr>
+            <w:tcW w:w="1080" w:type="dxa"/>
+            <w:vAlign w:val="center"/>
+            <w:hideMark/>
+          </w:tcPr>
+          <w:p>
+            <w:pPr>
+              <w:jc w:val="center"/>
+              <w:cnfStyle w:val="000000000000" w:firstRow="0" w:lastRow="0" w:firstColumn="0" w:lastColumn="0" w:oddVBand="0" w:evenVBand="0" w:oddHBand="0" w:evenHBand="0" w:firstRowFirstColumn="0" w:firstRowLastColumn="0" w:lastRowFirstColumn="0" w:lastRowLastColumn="0"/>
+            </w:pPr>
+            <w:r>
+              <w:t>GET</w:t>
+            </w:r>
+          </w:p>
+        </w:tc>
+        <w:tc>
+          <w:tcPr>
+            <w:tcW w:w="3150" w:type="dxa"/>
+            <w:vAlign w:val="center"/>
+            <w:hideMark/>
+          </w:tcPr>
+          <w:p>
+            <w:pPr>
+              <w:cnfStyle w:val="000000000000" w:firstRow="0" w:lastRow="0" w:firstColumn="0" w:lastColumn="0" w:oddVBand="0" w:evenVBand="0" w:oddHBand="0" w:evenHBand="0" w:firstRowFirstColumn="0" w:firstRowLastColumn="0" w:lastRowFirstColumn="0" w:lastRowLastColumn="0"/>
+            </w:pPr>
+            <w:r>
+              <w:t>Retrieve supported vehicle brands</w:t>
+            </w:r>
+          </w:p>
+        </w:tc>
+        <w:tc>
+          <w:tcPr>
+            <w:tcW w:w="1792" w:type="dxa"/>
+            <w:vAlign w:val="center"/>
+            <w:hideMark/>
+          </w:tcPr>
+          <w:p>
+            <w:pPr>
+              <w:jc w:val="center"/>
+              <w:cnfStyle w:val="000000000000" w:firstRow="0" w:lastRow="0" w:firstColumn="0" w:lastColumn="0" w:oddVBand="0" w:evenVBand="0" w:oddHBand="0" w:evenHBand="0" w:firstRowFirstColumn="0" w:firstRowLastColumn="0" w:lastRowFirstColumn="0" w:lastRowLastColumn="0"/>
+            </w:pPr>
+            <w:r>
+              <w:t>No</w:t>
+            </w:r>
+          </w:p>
+        </w:tc>
+      </w:tr>
+      <w:tr>
+        <w:trPr>
+          <w:cnfStyle w:val="000000100000" w:firstRow="0" w:lastRow="0" w:firstColumn="0" w:lastColumn="0" w:oddVBand="0" w:evenVBand="0" w:oddHBand="1" w:evenHBand="0" w:firstRowFirstColumn="0" w:firstRowLastColumn="0" w:lastRowFirstColumn="0" w:lastRowLastColumn="0"/>
+        </w:trPr>
+        <w:tc>
+          <w:tcPr>
+            <w:cnfStyle w:val="001000000000" w:firstRow="0" w:lastRow="0" w:firstColumn="1" w:lastColumn="0" w:oddVBand="0" w:evenVBand="0" w:oddHBand="0" w:evenHBand="0" w:firstRowFirstColumn="0" w:firstRowLastColumn="0" w:lastRowFirstColumn="0" w:lastRowLastColumn="0"/>
+            <w:tcW w:w="3325" w:type="dxa"/>
+            <w:vAlign w:val="center"/>
+            <w:hideMark/>
+          </w:tcPr>
+          <w:p>
+            <w:pPr>
+              <w:rPr>
+                <w:b w:val="0"/>
+                <w:bCs w:val="0"/>
+              </w:rPr>
+            </w:pPr>
+            <w:r>
+              <w:rPr>
+                <w:b w:val="0"/>
+                <w:bCs w:val="0"/>
+              </w:rPr>
+              <w:t>/api/v1/vehicles/{vehicleId}/availability</w:t>
+            </w:r>
+          </w:p>
+        </w:tc>
+        <w:tc>
+          <w:tcPr>
+            <w:tcW w:w="1080" w:type="dxa"/>
+            <w:vAlign w:val="center"/>
+            <w:hideMark/>
+          </w:tcPr>
+          <w:p>
+            <w:pPr>
+              <w:jc w:val="center"/>
+              <w:cnfStyle w:val="000000100000" w:firstRow="0" w:lastRow="0" w:firstColumn="0" w:lastColumn="0" w:oddVBand="0" w:evenVBand="0" w:oddHBand="1" w:evenHBand="0" w:firstRowFirstColumn="0" w:firstRowLastColumn="0" w:lastRowFirstColumn="0" w:lastRowLastColumn="0"/>
+            </w:pPr>
+            <w:r>
+              <w:t>GET</w:t>
+            </w:r>
+          </w:p>
+        </w:tc>
+        <w:tc>
+          <w:tcPr>
+            <w:tcW w:w="3150" w:type="dxa"/>
+            <w:vAlign w:val="center"/>
+            <w:hideMark/>
+          </w:tcPr>
+          <w:p>
+            <w:pPr>
+              <w:cnfStyle w:val="000000100000" w:firstRow="0" w:lastRow="0" w:firstColumn="0" w:lastColumn="0" w:oddVBand="0" w:evenVBand="0" w:oddHBand="1" w:evenHBand="0" w:firstRowFirstColumn="0" w:firstRowLastColumn="0" w:lastRowFirstColumn="0" w:lastRowLastColumn="0"/>
+            </w:pPr>
+            <w:r>
+              <w:t>Check vehicle availability for a selected rental period</w:t>
+            </w:r>
+          </w:p>
+        </w:tc>
+        <w:tc>
+          <w:tcPr>
+            <w:tcW w:w="1792" w:type="dxa"/>
+            <w:vAlign w:val="center"/>
+            <w:hideMark/>
+          </w:tcPr>
+          <w:p>
+            <w:pPr>
+              <w:jc w:val="center"/>
+              <w:cnfStyle w:val="000000100000" w:firstRow="0" w:lastRow="0" w:firstColumn="0" w:lastColumn="0" w:oddVBand="0" w:evenVBand="0" w:oddHBand="1" w:evenHBand="0" w:firstRowFirstColumn="0" w:firstRowLastColumn="0" w:lastRowFirstColumn="0" w:lastRowLastColumn="0"/>
+            </w:pPr>
+            <w:r>
+              <w:t>No</w:t>
+            </w:r>
+          </w:p>
+        </w:tc>
+      </w:tr>
+      <w:tr>
+        <w:tc>
+          <w:tcPr>
+            <w:cnfStyle w:val="001000000000" w:firstRow="0" w:lastRow="0" w:firstColumn="1" w:lastColumn="0" w:oddVBand="0" w:evenVBand="0" w:oddHBand="0" w:evenHBand="0" w:firstRowFirstColumn="0" w:firstRowLastColumn="0" w:lastRowFirstColumn="0" w:lastRowLastColumn="0"/>
+            <w:tcW w:w="3325" w:type="dxa"/>
+            <w:vAlign w:val="center"/>
+            <w:hideMark/>
+          </w:tcPr>
+          <w:p>
+            <w:pPr>
+              <w:rPr>
+                <w:b w:val="0"/>
+                <w:bCs w:val="0"/>
+              </w:rPr>
+            </w:pPr>
+            <w:r>
+              <w:rPr>
+                <w:b w:val="0"/>
+                <w:bCs w:val="0"/>
+              </w:rPr>
+              <w:t>/api/v1/vehicles/{vehicleId}/images</w:t>
+            </w:r>
+          </w:p>
+        </w:tc>
+        <w:tc>
+          <w:tcPr>
+            <w:tcW w:w="1080" w:type="dxa"/>
+            <w:vAlign w:val="center"/>
+            <w:hideMark/>
+          </w:tcPr>
+          <w:p>
+            <w:pPr>
+              <w:jc w:val="center"/>
+              <w:cnfStyle w:val="000000000000" w:firstRow="0" w:lastRow="0" w:firstColumn="0" w:lastColumn="0" w:oddVBand="0" w:evenVBand="0" w:oddHBand="0" w:evenHBand="0" w:firstRowFirstColumn="0" w:firstRowLastColumn="0" w:lastRowFirstColumn="0" w:lastRowLastColumn="0"/>
+            </w:pPr>
+            <w:r>
+              <w:t>GET</w:t>
+            </w:r>
+          </w:p>
+        </w:tc>
+        <w:tc>
+          <w:tcPr>
+            <w:tcW w:w="3150" w:type="dxa"/>
+            <w:vAlign w:val="center"/>
+            <w:hideMark/>
+          </w:tcPr>
+          <w:p>
+            <w:pPr>
+              <w:cnfStyle w:val="000000000000" w:firstRow="0" w:lastRow="0" w:firstColumn="0" w:lastColumn="0" w:oddVBand="0" w:evenVBand="0" w:oddHBand="0" w:evenHBand="0" w:firstRowFirstColumn="0" w:firstRowLastColumn="0" w:lastRowFirstColumn="0" w:lastRowLastColumn="0"/>
+            </w:pPr>
+            <w:r>
+              <w:t>Retrieve vehicle image gallery</w:t>
+            </w:r>
+          </w:p>
+        </w:tc>
+        <w:tc>
+          <w:tcPr>
+            <w:tcW w:w="1792" w:type="dxa"/>
+            <w:vAlign w:val="center"/>
+            <w:hideMark/>
+          </w:tcPr>
+          <w:p>
+            <w:pPr>
+              <w:jc w:val="center"/>
+              <w:cnfStyle w:val="000000000000" w:firstRow="0" w:lastRow="0" w:firstColumn="0" w:lastColumn="0" w:oddVBand="0" w:evenVBand="0" w:oddHBand="0" w:evenHBand="0" w:firstRowFirstColumn="0" w:firstRowLastColumn="0" w:lastRowFirstColumn="0" w:lastRowLastColumn="0"/>
+            </w:pPr>
+            <w:r>
+              <w:t>No</w:t>
+            </w:r>
+          </w:p>
+        </w:tc>
+      </w:tr>
+    </w:tbl>
+    <w:p/>
+    <w:p>
+      <w:pPr>
+        <w:spacing w:line="278" w:lineRule="auto"/>
+      </w:pPr>
+      <w:r>
+        <w:br w:type="page"/>
+      </w:r>
+    </w:p>
+    <w:p>
+      <w:pPr>
+        <w:pStyle w:val="Heading4"/>
+      </w:pPr>
+      <w:r>
+        <w:lastRenderedPageBreak/>
+        <w:t>API Design Considerations</w:t>
+      </w:r>
+    </w:p>
+    <w:p>
+      <w:r>
+        <w:t>The Vehicle &amp; Search APIs follow the design principles below:</w:t>
+      </w:r>
+    </w:p>
+    <w:p>
+      <w:pPr>
+        <w:pStyle w:val="ListParagraph"/>
+        <w:numPr>
+          <w:ilvl w:val="0"/>
+          <w:numId w:val="150"/>
+        </w:numPr>
+      </w:pPr>
+      <w:r>
+        <w:t>RESTful Resource Design: Vehicles are modeled as REST resources which are uniquely identifiable through their URIs.</w:t>
+      </w:r>
+    </w:p>
+    <w:p>
+      <w:pPr>
+        <w:pStyle w:val="ListParagraph"/>
+        <w:numPr>
+          <w:ilvl w:val="0"/>
+          <w:numId w:val="150"/>
+        </w:numPr>
+      </w:pPr>
+      <w:r>
+        <w:t>Openness: Discovery of vehicles is available without the need for authentication to enable users' exploration.</w:t>
+      </w:r>
+    </w:p>
+    <w:p>
+      <w:pPr>
+        <w:pStyle w:val="ListParagraph"/>
+        <w:numPr>
+          <w:ilvl w:val="0"/>
+          <w:numId w:val="150"/>
+        </w:numPr>
+      </w:pPr>
+      <w:r>
+        <w:t>Efficient Searching: Search allows for keyword search together with filters.</w:t>
+      </w:r>
+    </w:p>
+    <w:p>
+      <w:pPr>
+        <w:pStyle w:val="ListParagraph"/>
+        <w:numPr>
+          <w:ilvl w:val="0"/>
+          <w:numId w:val="150"/>
+        </w:numPr>
+      </w:pPr>
+      <w:r>
+        <w:t>Pagination: Result sets are paginated for efficiency.</w:t>
+      </w:r>
+    </w:p>
+    <w:p>
+      <w:pPr>
+        <w:pStyle w:val="ListParagraph"/>
+        <w:numPr>
+          <w:ilvl w:val="0"/>
+          <w:numId w:val="150"/>
+        </w:numPr>
+      </w:pPr>
+      <w:r>
+        <w:t>Sorting Capabilities: Results may be sorted on price, popularity, rating, and latest posts.</w:t>
+      </w:r>
+    </w:p>
+    <w:p>
+      <w:pPr>
+        <w:pStyle w:val="ListParagraph"/>
+        <w:numPr>
+          <w:ilvl w:val="0"/>
+          <w:numId w:val="150"/>
+        </w:numPr>
+      </w:pPr>
+      <w:r>
+        <w:t>Availability in Real-Time: Availability of vehicles indicates real-time reservation status.</w:t>
+      </w:r>
+    </w:p>
+    <w:p>
+      <w:pPr>
+        <w:pStyle w:val="ListParagraph"/>
+        <w:numPr>
+          <w:ilvl w:val="0"/>
+          <w:numId w:val="150"/>
+        </w:numPr>
+      </w:pPr>
+      <w:r>
+        <w:t>JSON Response Structure: JSON responses are consistent across all endpoints.</w:t>
+      </w:r>
+    </w:p>
+    <w:p>
+      <w:pPr>
+        <w:pStyle w:val="Heading4"/>
+      </w:pPr>
+      <w:r>
+        <w:t>Vehicle Search Workflow</w:t>
+      </w:r>
+    </w:p>
+    <w:p>
+      <w:r>
+        <w:t>Steps of searching for vehicles include the following:</w:t>
+      </w:r>
+    </w:p>
+    <w:p>
+      <w:pPr>
+        <w:pStyle w:val="ListParagraph"/>
+        <w:numPr>
+          <w:ilvl w:val="0"/>
+          <w:numId w:val="151"/>
+        </w:numPr>
+      </w:pPr>
+      <w:r>
+        <w:t>The client app makes a search request, including search filters (location, dates of the rental, type of vehicle, price range, type of transmission, or fuel type).</w:t>
+      </w:r>
+    </w:p>
+    <w:p>
+      <w:pPr>
+        <w:pStyle w:val="ListParagraph"/>
+        <w:numPr>
+          <w:ilvl w:val="0"/>
+          <w:numId w:val="151"/>
+        </w:numPr>
+      </w:pPr>
+      <w:r>
+        <w:t>The Fleet Management Service checks the validity of the search parameters.</w:t>
+      </w:r>
+    </w:p>
+    <w:p>
+      <w:pPr>
+        <w:pStyle w:val="ListParagraph"/>
+        <w:numPr>
+          <w:ilvl w:val="0"/>
+          <w:numId w:val="151"/>
+        </w:numPr>
+      </w:pPr>
+      <w:r>
+        <w:t>The service searches for vehicles in the vehicle database, excluding unavailable vehicles depending on the requested dates of the rental period.</w:t>
+      </w:r>
+    </w:p>
+    <w:p>
+      <w:pPr>
+        <w:pStyle w:val="ListParagraph"/>
+        <w:numPr>
+          <w:ilvl w:val="0"/>
+          <w:numId w:val="151"/>
+        </w:numPr>
+      </w:pPr>
+      <w:r>
+        <w:t>Search results are filtered by the specified criteria and sorted.</w:t>
+      </w:r>
+    </w:p>
+    <w:p>
+      <w:pPr>
+        <w:pStyle w:val="ListParagraph"/>
+        <w:numPr>
+          <w:ilvl w:val="0"/>
+          <w:numId w:val="151"/>
+        </w:numPr>
+      </w:pPr>
+      <w:r>
+        <w:t>The search result is sent to the client app along with basic information about the vehicles.</w:t>
+      </w:r>
+    </w:p>
+    <w:p>
+      <w:pPr>
+        <w:pStyle w:val="ListParagraph"/>
+        <w:numPr>
+          <w:ilvl w:val="0"/>
+          <w:numId w:val="151"/>
+        </w:numPr>
+      </w:pPr>
+      <w:r>
+        <w:t>When a user selects a particular vehicle, the client app asks for details about the selected vehicle via vehicle details endpoint.</w:t>
+      </w:r>
+    </w:p>
+    <w:p>
+      <w:r>
+        <w:t>This procedure allows customers to find appropriate rental vehicles.</w:t>
+      </w:r>
+    </w:p>
+    <w:p>
+      <w:r>
+        <w:rPr>
+          <w:noProof/>
+        </w:rPr>
+        <mc:AlternateContent>
+          <mc:Choice Requires="wps">
+            <w:drawing>
+              <wp:anchor distT="0" distB="0" distL="114300" distR="114300" simplePos="0" relativeHeight="251666432" behindDoc="0" locked="0" layoutInCell="1" allowOverlap="1" wp14:anchorId="28E55CB1" wp14:editId="507468D1">
+                <wp:simplePos x="0" y="0"/>
+                <wp:positionH relativeFrom="column">
+                  <wp:posOffset>3175</wp:posOffset>
+                </wp:positionH>
+                <wp:positionV relativeFrom="paragraph">
+                  <wp:posOffset>1924050</wp:posOffset>
+                </wp:positionV>
+                <wp:extent cx="5941695" cy="635"/>
+                <wp:effectExtent l="0" t="0" r="0" b="0"/>
+                <wp:wrapSquare wrapText="bothSides"/>
+                <wp:docPr id="999597721" name="Text Box 1"/>
+                <wp:cNvGraphicFramePr/>
+                <a:graphic xmlns:a="http://schemas.openxmlformats.org/drawingml/2006/main">
+                  <a:graphicData uri="http://schemas.microsoft.com/office/word/2010/wordprocessingShape">
+                    <wps:wsp>
+                      <wps:cNvSpPr txBox="1"/>
+                      <wps:spPr>
+                        <a:xfrm>
+                          <a:off x="0" y="0"/>
+                          <a:ext cx="5941695" cy="635"/>
+                        </a:xfrm>
+                        <a:prstGeom prst="rect">
+                          <a:avLst/>
+                        </a:prstGeom>
+                        <a:solidFill>
+                          <a:prstClr val="white"/>
+                        </a:solidFill>
+                        <a:ln>
+                          <a:noFill/>
+                        </a:ln>
+                      </wps:spPr>
+                      <wps:txbx>
+                        <w:txbxContent>
+                          <w:p>
+                            <w:pPr>
+                              <w:pStyle w:val="Caption"/>
+                              <w:jc w:val="center"/>
+                            </w:pPr>
+                            <w:r>
+                              <w:t xml:space="preserve">Figure </w:t>
+                            </w:r>
+                            <w:r>
+                              <w:fldChar w:fldCharType="begin"/>
+                            </w:r>
+                            <w:r>
+                              <w:instrText xml:space="preserve"> SEQ Figure \* ARABIC </w:instrText>
+                            </w:r>
+                            <w:r>
+                              <w:fldChar w:fldCharType="separate"/>
+                            </w:r>
+                            <w:r>
+                              <w:rPr>
+                                <w:noProof/>
+                              </w:rPr>
+                              <w:t>3</w:t>
+                            </w:r>
+                            <w:r>
+                              <w:fldChar w:fldCharType="end"/>
+                            </w:r>
+                            <w:r>
+                              <w:t xml:space="preserve"> - Vehicle &amp; Search Workflow</w:t>
+                            </w:r>
+                          </w:p>
+                        </w:txbxContent>
+                      </wps:txbx>
+                      <wps:bodyPr rot="0" spcFirstLastPara="0" vertOverflow="overflow" horzOverflow="overflow" vert="horz" wrap="square" lIns="0" tIns="0" rIns="0" bIns="0" numCol="1" spcCol="0" rtlCol="0" fromWordArt="0" anchor="t" anchorCtr="0" forceAA="0" compatLnSpc="1">
+                        <a:prstTxWarp prst="textNoShape">
+                          <a:avLst/>
+                        </a:prstTxWarp>
+                        <a:spAutoFit/>
+                      </wps:bodyPr>
+                    </wps:wsp>
+                  </a:graphicData>
+                </a:graphic>
+              </wp:anchor>
+            </w:drawing>
+          </mc:Choice>
+          <mc:Fallback>
+            <w:pict>
+              <v:shape w14:anchorId="28E55CB1" id="_x0000_s1028" type="#_x0000_t202" style="position:absolute;margin-left:.25pt;margin-top:151.5pt;width:467.85pt;height:.05pt;z-index:251666432;visibility:visible;mso-wrap-style:square;mso-wrap-distance-left:9pt;mso-wrap-distance-top:0;mso-wrap-distance-right:9pt;mso-wrap-distance-bottom:0;mso-position-horizontal:absolute;mso-position-horizontal-relative:text;mso-position-vertical:absolute;mso-position-vertical-relative:text;v-text-anchor:top" o:gfxdata="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" stroked="f">
+                <v:textbox style="mso-fit-shape-to-text:t" inset="0,0,0,0">
+                  <w:txbxContent>
+                    <w:p>
+                      <w:pPr>
+                        <w:pStyle w:val="Caption"/>
+                        <w:jc w:val="center"/>
+                      </w:pPr>
+                      <w:r>
+                        <w:t xml:space="preserve">Figure </w:t>
+                      </w:r>
+                      <w:r>
+                        <w:fldChar w:fldCharType="begin"/>
+                      </w:r>
+                      <w:r>
+                        <w:instrText xml:space="preserve"> SEQ Figure \* ARABIC </w:instrText>
+                      </w:r>
+                      <w:r>
+                        <w:fldChar w:fldCharType="separate"/>
+                      </w:r>
+                      <w:r>
+                        <w:rPr>
+                          <w:noProof/>
+                        </w:rPr>
+                        <w:t>3</w:t>
+                      </w:r>
+                      <w:r>
+                        <w:fldChar w:fldCharType="end"/>
+                      </w:r>
+                      <w:r>
+                        <w:t xml:space="preserve"> - Vehicle &amp; Search Workflow</w:t>
+                      </w:r>
+                    </w:p>
+                  </w:txbxContent>
+                </v:textbox>
+                <w10:wrap type="square"/>
+              </v:shape>
+            </w:pict>
+          </mc:Fallback>
+        </mc:AlternateContent>
+      </w:r>
+      <w:r>
+        <w:drawing>
+          <wp:anchor distT="0" distB="0" distL="114300" distR="114300" simplePos="0" relativeHeight="251664384" behindDoc="0" locked="0" layoutInCell="1" allowOverlap="1" wp14:anchorId="1F83AA82" wp14:editId="7CCE1508">
+            <wp:simplePos x="0" y="0"/>
+            <wp:positionH relativeFrom="column">
+              <wp:posOffset>3175</wp:posOffset>
+            </wp:positionH>
+            <wp:positionV relativeFrom="paragraph">
+              <wp:posOffset>199390</wp:posOffset>
+            </wp:positionV>
+            <wp:extent cx="5941695" cy="1667510"/>
+            <wp:effectExtent l="0" t="0" r="1905" b="8890"/>
+            <wp:wrapSquare wrapText="bothSides"/>
+            <wp:docPr id="1379488412" name="Picture 1"/>
+            <wp:cNvGraphicFramePr>
+              <a:graphicFrameLocks xmlns:a="http://schemas.openxmlformats.org/drawingml/2006/main" noChangeAspect="1"/>
+            </wp:cNvGraphicFramePr>
+            <a:graphic xmlns:a="http://schemas.openxmlformats.org/drawingml/2006/main">
+              <a:graphicData uri="http://schemas.openxmlformats.org/drawingml/2006/picture">
+                <pic:pic xmlns:pic="http://schemas.openxmlformats.org/drawingml/2006/picture">
+                  <pic:nvPicPr>
+                    <pic:cNvPr id="1379488412" name=""/>
+                    <pic:cNvPicPr/>
+                  </pic:nvPicPr>
+                  <pic:blipFill>
+                    <a:blip r:embed="rId10">
+                      <a:extLst>
+                        <a:ext uri="{28A0092B-C50C-407E-A947-70E740481C1C}">
+                          <a14:useLocalDpi xmlns:a14="http://schemas.microsoft.com/office/drawing/2010/main" val="0"/>
+                        </a:ext>
+                      </a:extLst>
+                    </a:blip>
+                    <a:stretch>
+                      <a:fillRect/>
+                    </a:stretch>
+                  </pic:blipFill>
+                  <pic:spPr>
+                    <a:xfrm>
+                      <a:off x="0" y="0"/>
+                      <a:ext cx="5941695" cy="1667510"/>
+                    </a:xfrm>
+                    <a:prstGeom prst="rect">
+                      <a:avLst/>
+                    </a:prstGeom>
+                  </pic:spPr>
+                </pic:pic>
+              </a:graphicData>
+            </a:graphic>
+          </wp:anchor>
+        </w:drawing>
+      </w:r>
+    </w:p>
+    <w:p/>
+    <w:p>
+      <w:pPr>
+        <w:tabs>
+          <w:tab w:val="left" w:pos="1776"/>
+        </w:tabs>
+      </w:pPr>
+      <w:r>
+        <w:tab/>
+      </w:r>
+    </w:p>
+    <w:p>
+      <w:pPr>
+        <w:spacing w:line="278" w:lineRule="auto"/>
+      </w:pPr>
+      <w:r>
+        <w:br w:type="page"/>
+      </w:r>
+    </w:p>
+    <w:p>
+      <w:pPr>
+        <w:tabs>
+          <w:tab w:val="left" w:pos="1776"/>
+        </w:tabs>
+      </w:pPr>
+    </w:p>
+    <w:p/>
+    <w:p/>
+    <w:p/>
+    <w:p/>
+    <w:p/>
     <w:p/>
     <w:sectPr>
-      <w:headerReference w:type="default" r:id="rId10"/>
-      <w:footerReference w:type="default" r:id="rId11"/>
+      <w:headerReference w:type="default" r:id="rId11"/>
+      <w:footerReference w:type="default" r:id="rId12"/>
       <w:pgSz w:w="11906" w:h="16838" w:code="9"/>
       <w:pgMar w:top="1411" w:right="850" w:bottom="1411" w:left="1699" w:header="720" w:footer="288" w:gutter="0"/>
       <w:pgNumType w:start="1"/>
@@ -5587,6 +6874,92 @@
     </w:lvl>
   </w:abstractNum>
   <w:abstractNum w:abstractNumId="12" w15:restartNumberingAfterBreak="0">
+    <w:nsid w:val="129D4E29"/>
+    <w:multiLevelType w:val="hybridMultilevel"/>
+    <w:tmpl w:val="87E86058"/>
+    <w:lvl w:ilvl="0" w:tplc="0409000F">
+      <w:start w:val="1"/>
+      <w:numFmt w:val="decimal"/>
+      <w:lvlText w:val="%1."/>
+      <w:lvlJc w:val="left"/>
+      <w:pPr>
+        <w:ind w:left="720" w:hanging="360"/>
+      </w:pPr>
+    </w:lvl>
+    <w:lvl w:ilvl="1" w:tplc="04090019" w:tentative="1">
+      <w:start w:val="1"/>
+      <w:numFmt w:val="lowerLetter"/>
+      <w:lvlText w:val="%2."/>
+      <w:lvlJc w:val="left"/>
+      <w:pPr>
+        <w:ind w:left="1440" w:hanging="360"/>
+      </w:pPr>
+    </w:lvl>
+    <w:lvl w:ilvl="2" w:tplc="0409001B" w:tentative="1">
+      <w:start w:val="1"/>
+      <w:numFmt w:val="lowerRoman"/>
+      <w:lvlText w:val="%3."/>
+      <w:lvlJc w:val="right"/>
+      <w:pPr>
+        <w:ind w:left="2160" w:hanging="180"/>
+      </w:pPr>
+    </w:lvl>
+    <w:lvl w:ilvl="3" w:tplc="0409000F" w:tentative="1">
+      <w:start w:val="1"/>
+      <w:numFmt w:val="decimal"/>
+      <w:lvlText w:val="%4."/>
+      <w:lvlJc w:val="left"/>
+      <w:pPr>
+        <w:ind w:left="2880" w:hanging="360"/>
+      </w:pPr>
+    </w:lvl>
+    <w:lvl w:ilvl="4" w:tplc="04090019" w:tentative="1">
+      <w:start w:val="1"/>
+      <w:numFmt w:val="lowerLetter"/>
+      <w:lvlText w:val="%5."/>
+      <w:lvlJc w:val="left"/>
+      <w:pPr>
+        <w:ind w:left="3600" w:hanging="360"/>
+      </w:pPr>
+    </w:lvl>
+    <w:lvl w:ilvl="5" w:tplc="0409001B" w:tentative="1">
+      <w:start w:val="1"/>
+      <w:numFmt w:val="lowerRoman"/>
+      <w:lvlText w:val="%6."/>
+      <w:lvlJc w:val="right"/>
+      <w:pPr>
+        <w:ind w:left="4320" w:hanging="180"/>
+      </w:pPr>
+    </w:lvl>
+    <w:lvl w:ilvl="6" w:tplc="0409000F" w:tentative="1">
+      <w:start w:val="1"/>
+      <w:numFmt w:val="decimal"/>
+      <w:lvlText w:val="%7."/>
+      <w:lvlJc w:val="left"/>
+      <w:pPr>
+        <w:ind w:left="5040" w:hanging="360"/>
+      </w:pPr>
+    </w:lvl>
+    <w:lvl w:ilvl="7" w:tplc="04090019" w:tentative="1">
+      <w:start w:val="1"/>
+      <w:numFmt w:val="lowerLetter"/>
+      <w:lvlText w:val="%8."/>
+      <w:lvlJc w:val="left"/>
+      <w:pPr>
+        <w:ind w:left="5760" w:hanging="360"/>
+      </w:pPr>
+    </w:lvl>
+    <w:lvl w:ilvl="8" w:tplc="0409001B" w:tentative="1">
+      <w:start w:val="1"/>
+      <w:numFmt w:val="lowerRoman"/>
+      <w:lvlText w:val="%9."/>
+      <w:lvlJc w:val="right"/>
+      <w:pPr>
+        <w:ind w:left="6480" w:hanging="180"/>
+      </w:pPr>
+    </w:lvl>
+  </w:abstractNum>
+  <w:abstractNum w:abstractNumId="13" w15:restartNumberingAfterBreak="0">
     <w:nsid w:val="135C5CF3"/>
     <w:multiLevelType w:val="multilevel"/>
     <w:tmpl w:val="61D20A04"/>
@@ -5735,7 +7108,7 @@
       </w:rPr>
     </w:lvl>
   </w:abstractNum>
-  <w:abstractNum w:abstractNumId="13" w15:restartNumberingAfterBreak="0">
+  <w:abstractNum w:abstractNumId="14" w15:restartNumberingAfterBreak="0">
     <w:nsid w:val="137648CC"/>
     <w:multiLevelType w:val="multilevel"/>
     <w:tmpl w:val="EC983E9E"/>
@@ -5884,7 +7257,7 @@
       </w:rPr>
     </w:lvl>
   </w:abstractNum>
-  <w:abstractNum w:abstractNumId="14" w15:restartNumberingAfterBreak="0">
+  <w:abstractNum w:abstractNumId="15" w15:restartNumberingAfterBreak="0">
     <w:nsid w:val="15354085"/>
     <w:multiLevelType w:val="multilevel"/>
     <w:tmpl w:val="ED488EA0"/>
@@ -6033,7 +7406,7 @@
       </w:rPr>
     </w:lvl>
   </w:abstractNum>
-  <w:abstractNum w:abstractNumId="15" w15:restartNumberingAfterBreak="0">
+  <w:abstractNum w:abstractNumId="16" w15:restartNumberingAfterBreak="0">
     <w:nsid w:val="15923962"/>
     <w:multiLevelType w:val="hybridMultilevel"/>
     <w:tmpl w:val="2A8A437A"/>
@@ -6145,7 +7518,7 @@
       </w:rPr>
     </w:lvl>
   </w:abstractNum>
-  <w:abstractNum w:abstractNumId="16" w15:restartNumberingAfterBreak="0">
+  <w:abstractNum w:abstractNumId="17" w15:restartNumberingAfterBreak="0">
     <w:nsid w:val="15E231DD"/>
     <w:multiLevelType w:val="hybridMultilevel"/>
     <w:tmpl w:val="48B4AB8E"/>
@@ -6258,7 +7631,7 @@
       </w:rPr>
     </w:lvl>
   </w:abstractNum>
-  <w:abstractNum w:abstractNumId="17" w15:restartNumberingAfterBreak="0">
+  <w:abstractNum w:abstractNumId="18" w15:restartNumberingAfterBreak="0">
     <w:nsid w:val="15FB6E59"/>
     <w:multiLevelType w:val="multilevel"/>
     <w:tmpl w:val="63F4E6F0"/>
@@ -6407,7 +7780,7 @@
       </w:rPr>
     </w:lvl>
   </w:abstractNum>
-  <w:abstractNum w:abstractNumId="18" w15:restartNumberingAfterBreak="0">
+  <w:abstractNum w:abstractNumId="19" w15:restartNumberingAfterBreak="0">
     <w:nsid w:val="16057B40"/>
     <w:multiLevelType w:val="hybridMultilevel"/>
     <w:tmpl w:val="C63C7D68"/>
@@ -6519,7 +7892,7 @@
       </w:rPr>
     </w:lvl>
   </w:abstractNum>
-  <w:abstractNum w:abstractNumId="19" w15:restartNumberingAfterBreak="0">
+  <w:abstractNum w:abstractNumId="20" w15:restartNumberingAfterBreak="0">
     <w:nsid w:val="18441B3D"/>
     <w:multiLevelType w:val="hybridMultilevel"/>
     <w:tmpl w:val="F162D252"/>
@@ -6631,7 +8004,7 @@
       </w:rPr>
     </w:lvl>
   </w:abstractNum>
-  <w:abstractNum w:abstractNumId="20" w15:restartNumberingAfterBreak="0">
+  <w:abstractNum w:abstractNumId="21" w15:restartNumberingAfterBreak="0">
     <w:nsid w:val="185230B0"/>
     <w:multiLevelType w:val="hybridMultilevel"/>
     <w:tmpl w:val="FDFE89EE"/>
@@ -6744,7 +8117,7 @@
       </w:rPr>
     </w:lvl>
   </w:abstractNum>
-  <w:abstractNum w:abstractNumId="21" w15:restartNumberingAfterBreak="0">
+  <w:abstractNum w:abstractNumId="22" w15:restartNumberingAfterBreak="0">
     <w:nsid w:val="18A93E35"/>
     <w:multiLevelType w:val="hybridMultilevel"/>
     <w:tmpl w:val="7A6E3062"/>
@@ -6856,7 +8229,7 @@
       </w:rPr>
     </w:lvl>
   </w:abstractNum>
-  <w:abstractNum w:abstractNumId="22" w15:restartNumberingAfterBreak="0">
+  <w:abstractNum w:abstractNumId="23" w15:restartNumberingAfterBreak="0">
     <w:nsid w:val="18EC3D82"/>
     <w:multiLevelType w:val="hybridMultilevel"/>
     <w:tmpl w:val="BC5A743C"/>
@@ -6969,7 +8342,7 @@
       </w:rPr>
     </w:lvl>
   </w:abstractNum>
-  <w:abstractNum w:abstractNumId="23" w15:restartNumberingAfterBreak="0">
+  <w:abstractNum w:abstractNumId="24" w15:restartNumberingAfterBreak="0">
     <w:nsid w:val="18F46E01"/>
     <w:multiLevelType w:val="multilevel"/>
     <w:tmpl w:val="C77EDED0"/>
@@ -7118,7 +8491,7 @@
       </w:rPr>
     </w:lvl>
   </w:abstractNum>
-  <w:abstractNum w:abstractNumId="24" w15:restartNumberingAfterBreak="0">
+  <w:abstractNum w:abstractNumId="25" w15:restartNumberingAfterBreak="0">
     <w:nsid w:val="19C83C12"/>
     <w:multiLevelType w:val="multilevel"/>
     <w:tmpl w:val="7690D588"/>
@@ -7267,7 +8640,7 @@
       </w:rPr>
     </w:lvl>
   </w:abstractNum>
-  <w:abstractNum w:abstractNumId="25" w15:restartNumberingAfterBreak="0">
+  <w:abstractNum w:abstractNumId="26" w15:restartNumberingAfterBreak="0">
     <w:nsid w:val="1A236A44"/>
     <w:multiLevelType w:val="hybridMultilevel"/>
     <w:tmpl w:val="E06C248C"/>
@@ -7380,7 +8753,7 @@
       </w:rPr>
     </w:lvl>
   </w:abstractNum>
-  <w:abstractNum w:abstractNumId="26" w15:restartNumberingAfterBreak="0">
+  <w:abstractNum w:abstractNumId="27" w15:restartNumberingAfterBreak="0">
     <w:nsid w:val="1C511176"/>
     <w:multiLevelType w:val="multilevel"/>
     <w:tmpl w:val="201E7F12"/>
@@ -7529,7 +8902,7 @@
       </w:rPr>
     </w:lvl>
   </w:abstractNum>
-  <w:abstractNum w:abstractNumId="27" w15:restartNumberingAfterBreak="0">
+  <w:abstractNum w:abstractNumId="28" w15:restartNumberingAfterBreak="0">
     <w:nsid w:val="1D4C2E50"/>
     <w:multiLevelType w:val="multilevel"/>
     <w:tmpl w:val="63F4E6F0"/>
@@ -7678,7 +9051,120 @@
       </w:rPr>
     </w:lvl>
   </w:abstractNum>
-  <w:abstractNum w:abstractNumId="28" w15:restartNumberingAfterBreak="0">
+  <w:abstractNum w:abstractNumId="29" w15:restartNumberingAfterBreak="0">
+    <w:nsid w:val="1D592278"/>
+    <w:multiLevelType w:val="hybridMultilevel"/>
+    <w:tmpl w:val="0622B59C"/>
+    <w:lvl w:ilvl="0" w:tplc="04090001">
+      <w:start w:val="1"/>
+      <w:numFmt w:val="bullet"/>
+      <w:lvlText w:val=""/>
+      <w:lvlJc w:val="left"/>
+      <w:pPr>
+        <w:ind w:left="720" w:hanging="360"/>
+      </w:pPr>
+      <w:rPr>
+        <w:rFonts w:ascii="Symbol" w:hAnsi="Symbol" w:hint="default"/>
+      </w:rPr>
+    </w:lvl>
+    <w:lvl w:ilvl="1" w:tplc="04090003" w:tentative="1">
+      <w:start w:val="1"/>
+      <w:numFmt w:val="bullet"/>
+      <w:lvlText w:val="o"/>
+      <w:lvlJc w:val="left"/>
+      <w:pPr>
+        <w:ind w:left="1440" w:hanging="360"/>
+      </w:pPr>
+      <w:rPr>
+        <w:rFonts w:ascii="Courier New" w:hAnsi="Courier New" w:cs="Courier New" w:hint="default"/>
+      </w:rPr>
+    </w:lvl>
+    <w:lvl w:ilvl="2" w:tplc="04090005" w:tentative="1">
+      <w:start w:val="1"/>
+      <w:numFmt w:val="bullet"/>
+      <w:lvlText w:val=""/>
+      <w:lvlJc w:val="left"/>
+      <w:pPr>
+        <w:ind w:left="2160" w:hanging="360"/>
+      </w:pPr>
+      <w:rPr>
+        <w:rFonts w:ascii="Wingdings" w:hAnsi="Wingdings" w:hint="default"/>
+      </w:rPr>
+    </w:lvl>
+    <w:lvl w:ilvl="3" w:tplc="04090001" w:tentative="1">
+      <w:start w:val="1"/>
+      <w:numFmt w:val="bullet"/>
+      <w:lvlText w:val=""/>
+      <w:lvlJc w:val="left"/>
+      <w:pPr>
+        <w:ind w:left="2880" w:hanging="360"/>
+      </w:pPr>
+      <w:rPr>
+        <w:rFonts w:ascii="Symbol" w:hAnsi="Symbol" w:hint="default"/>
+      </w:rPr>
+    </w:lvl>
+    <w:lvl w:ilvl="4" w:tplc="04090003" w:tentative="1">
+      <w:start w:val="1"/>
+      <w:numFmt w:val="bullet"/>
+      <w:lvlText w:val="o"/>
+      <w:lvlJc w:val="left"/>
+      <w:pPr>
+        <w:ind w:left="3600" w:hanging="360"/>
+      </w:pPr>
+      <w:rPr>
+        <w:rFonts w:ascii="Courier New" w:hAnsi="Courier New" w:cs="Courier New" w:hint="default"/>
+      </w:rPr>
+    </w:lvl>
+    <w:lvl w:ilvl="5" w:tplc="04090005" w:tentative="1">
+      <w:start w:val="1"/>
+      <w:numFmt w:val="bullet"/>
+      <w:lvlText w:val=""/>
+      <w:lvlJc w:val="left"/>
+      <w:pPr>
+        <w:ind w:left="4320" w:hanging="360"/>
+      </w:pPr>
+      <w:rPr>
+        <w:rFonts w:ascii="Wingdings" w:hAnsi="Wingdings" w:hint="default"/>
+      </w:rPr>
+    </w:lvl>
+    <w:lvl w:ilvl="6" w:tplc="04090001" w:tentative="1">
+      <w:start w:val="1"/>
+      <w:numFmt w:val="bullet"/>
+      <w:lvlText w:val=""/>
+      <w:lvlJc w:val="left"/>
+      <w:pPr>
+        <w:ind w:left="5040" w:hanging="360"/>
+      </w:pPr>
+      <w:rPr>
+        <w:rFonts w:ascii="Symbol" w:hAnsi="Symbol" w:hint="default"/>
+      </w:rPr>
+    </w:lvl>
+    <w:lvl w:ilvl="7" w:tplc="04090003" w:tentative="1">
+      <w:start w:val="1"/>
+      <w:numFmt w:val="bullet"/>
+      <w:lvlText w:val="o"/>
+      <w:lvlJc w:val="left"/>
+      <w:pPr>
+        <w:ind w:left="5760" w:hanging="360"/>
+      </w:pPr>
+      <w:rPr>
+        <w:rFonts w:ascii="Courier New" w:hAnsi="Courier New" w:cs="Courier New" w:hint="default"/>
+      </w:rPr>
+    </w:lvl>
+    <w:lvl w:ilvl="8" w:tplc="04090005" w:tentative="1">
+      <w:start w:val="1"/>
+      <w:numFmt w:val="bullet"/>
+      <w:lvlText w:val=""/>
+      <w:lvlJc w:val="left"/>
+      <w:pPr>
+        <w:ind w:left="6480" w:hanging="360"/>
+      </w:pPr>
+      <w:rPr>
+        <w:rFonts w:ascii="Wingdings" w:hAnsi="Wingdings" w:hint="default"/>
+      </w:rPr>
+    </w:lvl>
+  </w:abstractNum>
+  <w:abstractNum w:abstractNumId="30" w15:restartNumberingAfterBreak="0">
     <w:nsid w:val="1EC4731F"/>
     <w:multiLevelType w:val="hybridMultilevel"/>
     <w:tmpl w:val="8E26D8F0"/>
@@ -7790,7 +9276,7 @@
       </w:rPr>
     </w:lvl>
   </w:abstractNum>
-  <w:abstractNum w:abstractNumId="29" w15:restartNumberingAfterBreak="0">
+  <w:abstractNum w:abstractNumId="31" w15:restartNumberingAfterBreak="0">
     <w:nsid w:val="20017871"/>
     <w:multiLevelType w:val="hybridMultilevel"/>
     <w:tmpl w:val="EA76608A"/>
@@ -7903,7 +9389,7 @@
       </w:rPr>
     </w:lvl>
   </w:abstractNum>
-  <w:abstractNum w:abstractNumId="30" w15:restartNumberingAfterBreak="0">
+  <w:abstractNum w:abstractNumId="32" w15:restartNumberingAfterBreak="0">
     <w:nsid w:val="206A32F9"/>
     <w:multiLevelType w:val="hybridMultilevel"/>
     <w:tmpl w:val="7A405CA6"/>
@@ -8015,7 +9501,7 @@
       </w:rPr>
     </w:lvl>
   </w:abstractNum>
-  <w:abstractNum w:abstractNumId="31" w15:restartNumberingAfterBreak="0">
+  <w:abstractNum w:abstractNumId="33" w15:restartNumberingAfterBreak="0">
     <w:nsid w:val="20786568"/>
     <w:multiLevelType w:val="hybridMultilevel"/>
     <w:tmpl w:val="200CC0BC"/>
@@ -8127,7 +9613,7 @@
       </w:rPr>
     </w:lvl>
   </w:abstractNum>
-  <w:abstractNum w:abstractNumId="32" w15:restartNumberingAfterBreak="0">
+  <w:abstractNum w:abstractNumId="34" w15:restartNumberingAfterBreak="0">
     <w:nsid w:val="207D21A1"/>
     <w:multiLevelType w:val="hybridMultilevel"/>
     <w:tmpl w:val="AAAE4260"/>
@@ -8239,7 +9725,7 @@
       </w:rPr>
     </w:lvl>
   </w:abstractNum>
-  <w:abstractNum w:abstractNumId="33" w15:restartNumberingAfterBreak="0">
+  <w:abstractNum w:abstractNumId="35" w15:restartNumberingAfterBreak="0">
     <w:nsid w:val="20DC5034"/>
     <w:multiLevelType w:val="hybridMultilevel"/>
     <w:tmpl w:val="4B5425EA"/>
@@ -8351,7 +9837,7 @@
       </w:rPr>
     </w:lvl>
   </w:abstractNum>
-  <w:abstractNum w:abstractNumId="34" w15:restartNumberingAfterBreak="0">
+  <w:abstractNum w:abstractNumId="36" w15:restartNumberingAfterBreak="0">
     <w:nsid w:val="224C7C45"/>
     <w:multiLevelType w:val="multilevel"/>
     <w:tmpl w:val="5C800264"/>
@@ -8500,7 +9986,7 @@
       </w:rPr>
     </w:lvl>
   </w:abstractNum>
-  <w:abstractNum w:abstractNumId="35" w15:restartNumberingAfterBreak="0">
+  <w:abstractNum w:abstractNumId="37" w15:restartNumberingAfterBreak="0">
     <w:nsid w:val="23970AD1"/>
     <w:multiLevelType w:val="hybridMultilevel"/>
     <w:tmpl w:val="6A1E8A04"/>
@@ -8612,7 +10098,7 @@
       </w:rPr>
     </w:lvl>
   </w:abstractNum>
-  <w:abstractNum w:abstractNumId="36" w15:restartNumberingAfterBreak="0">
+  <w:abstractNum w:abstractNumId="38" w15:restartNumberingAfterBreak="0">
     <w:nsid w:val="243D731E"/>
     <w:multiLevelType w:val="multilevel"/>
     <w:tmpl w:val="51303158"/>
@@ -8761,7 +10247,120 @@
       </w:rPr>
     </w:lvl>
   </w:abstractNum>
-  <w:abstractNum w:abstractNumId="37" w15:restartNumberingAfterBreak="0">
+  <w:abstractNum w:abstractNumId="39" w15:restartNumberingAfterBreak="0">
+    <w:nsid w:val="253A4FEB"/>
+    <w:multiLevelType w:val="hybridMultilevel"/>
+    <w:tmpl w:val="5628BED4"/>
+    <w:lvl w:ilvl="0" w:tplc="04090005">
+      <w:start w:val="1"/>
+      <w:numFmt w:val="bullet"/>
+      <w:lvlText w:val=""/>
+      <w:lvlJc w:val="left"/>
+      <w:pPr>
+        <w:ind w:left="720" w:hanging="360"/>
+      </w:pPr>
+      <w:rPr>
+        <w:rFonts w:ascii="Wingdings" w:hAnsi="Wingdings" w:hint="default"/>
+      </w:rPr>
+    </w:lvl>
+    <w:lvl w:ilvl="1" w:tplc="FFFFFFFF" w:tentative="1">
+      <w:start w:val="1"/>
+      <w:numFmt w:val="bullet"/>
+      <w:lvlText w:val="o"/>
+      <w:lvlJc w:val="left"/>
+      <w:pPr>
+        <w:ind w:left="1440" w:hanging="360"/>
+      </w:pPr>
+      <w:rPr>
+        <w:rFonts w:ascii="Courier New" w:hAnsi="Courier New" w:cs="Courier New" w:hint="default"/>
+      </w:rPr>
+    </w:lvl>
+    <w:lvl w:ilvl="2" w:tplc="FFFFFFFF" w:tentative="1">
+      <w:start w:val="1"/>
+      <w:numFmt w:val="bullet"/>
+      <w:lvlText w:val=""/>
+      <w:lvlJc w:val="left"/>
+      <w:pPr>
+        <w:ind w:left="2160" w:hanging="360"/>
+      </w:pPr>
+      <w:rPr>
+        <w:rFonts w:ascii="Wingdings" w:hAnsi="Wingdings" w:hint="default"/>
+      </w:rPr>
+    </w:lvl>
+    <w:lvl w:ilvl="3" w:tplc="FFFFFFFF" w:tentative="1">
+      <w:start w:val="1"/>
+      <w:numFmt w:val="bullet"/>
+      <w:lvlText w:val=""/>
+      <w:lvlJc w:val="left"/>
+      <w:pPr>
+        <w:ind w:left="2880" w:hanging="360"/>
+      </w:pPr>
+      <w:rPr>
+        <w:rFonts w:ascii="Symbol" w:hAnsi="Symbol" w:hint="default"/>
+      </w:rPr>
+    </w:lvl>
+    <w:lvl w:ilvl="4" w:tplc="FFFFFFFF" w:tentative="1">
+      <w:start w:val="1"/>
+      <w:numFmt w:val="bullet"/>
+      <w:lvlText w:val="o"/>
+      <w:lvlJc w:val="left"/>
+      <w:pPr>
+        <w:ind w:left="3600" w:hanging="360"/>
+      </w:pPr>
+      <w:rPr>
+        <w:rFonts w:ascii="Courier New" w:hAnsi="Courier New" w:cs="Courier New" w:hint="default"/>
+      </w:rPr>
+    </w:lvl>
+    <w:lvl w:ilvl="5" w:tplc="FFFFFFFF" w:tentative="1">
+      <w:start w:val="1"/>
+      <w:numFmt w:val="bullet"/>
+      <w:lvlText w:val=""/>
+      <w:lvlJc w:val="left"/>
+      <w:pPr>
+        <w:ind w:left="4320" w:hanging="360"/>
+      </w:pPr>
+      <w:rPr>
+        <w:rFonts w:ascii="Wingdings" w:hAnsi="Wingdings" w:hint="default"/>
+      </w:rPr>
+    </w:lvl>
+    <w:lvl w:ilvl="6" w:tplc="FFFFFFFF" w:tentative="1">
+      <w:start w:val="1"/>
+      <w:numFmt w:val="bullet"/>
+      <w:lvlText w:val=""/>
+      <w:lvlJc w:val="left"/>
+      <w:pPr>
+        <w:ind w:left="5040" w:hanging="360"/>
+      </w:pPr>
+      <w:rPr>
+        <w:rFonts w:ascii="Symbol" w:hAnsi="Symbol" w:hint="default"/>
+      </w:rPr>
+    </w:lvl>
+    <w:lvl w:ilvl="7" w:tplc="FFFFFFFF" w:tentative="1">
+      <w:start w:val="1"/>
+      <w:numFmt w:val="bullet"/>
+      <w:lvlText w:val="o"/>
+      <w:lvlJc w:val="left"/>
+      <w:pPr>
+        <w:ind w:left="5760" w:hanging="360"/>
+      </w:pPr>
+      <w:rPr>
+        <w:rFonts w:ascii="Courier New" w:hAnsi="Courier New" w:cs="Courier New" w:hint="default"/>
+      </w:rPr>
+    </w:lvl>
+    <w:lvl w:ilvl="8" w:tplc="FFFFFFFF" w:tentative="1">
+      <w:start w:val="1"/>
+      <w:numFmt w:val="bullet"/>
+      <w:lvlText w:val=""/>
+      <w:lvlJc w:val="left"/>
+      <w:pPr>
+        <w:ind w:left="6480" w:hanging="360"/>
+      </w:pPr>
+      <w:rPr>
+        <w:rFonts w:ascii="Wingdings" w:hAnsi="Wingdings" w:hint="default"/>
+      </w:rPr>
+    </w:lvl>
+  </w:abstractNum>
+  <w:abstractNum w:abstractNumId="40" w15:restartNumberingAfterBreak="0">
     <w:nsid w:val="26BA6D3C"/>
     <w:multiLevelType w:val="hybridMultilevel"/>
     <w:tmpl w:val="F03CC954"/>
@@ -8873,7 +10472,7 @@
       </w:rPr>
     </w:lvl>
   </w:abstractNum>
-  <w:abstractNum w:abstractNumId="38" w15:restartNumberingAfterBreak="0">
+  <w:abstractNum w:abstractNumId="41" w15:restartNumberingAfterBreak="0">
     <w:nsid w:val="28765EA3"/>
     <w:multiLevelType w:val="hybridMultilevel"/>
     <w:tmpl w:val="1CFAEB30"/>
@@ -8986,7 +10585,7 @@
       </w:rPr>
     </w:lvl>
   </w:abstractNum>
-  <w:abstractNum w:abstractNumId="39" w15:restartNumberingAfterBreak="0">
+  <w:abstractNum w:abstractNumId="42" w15:restartNumberingAfterBreak="0">
     <w:nsid w:val="28940045"/>
     <w:multiLevelType w:val="multilevel"/>
     <w:tmpl w:val="23DE4804"/>
@@ -9135,7 +10734,7 @@
       </w:rPr>
     </w:lvl>
   </w:abstractNum>
-  <w:abstractNum w:abstractNumId="40" w15:restartNumberingAfterBreak="0">
+  <w:abstractNum w:abstractNumId="43" w15:restartNumberingAfterBreak="0">
     <w:nsid w:val="289938CC"/>
     <w:multiLevelType w:val="multilevel"/>
     <w:tmpl w:val="57745EE2"/>
@@ -9284,7 +10883,7 @@
       </w:rPr>
     </w:lvl>
   </w:abstractNum>
-  <w:abstractNum w:abstractNumId="41" w15:restartNumberingAfterBreak="0">
+  <w:abstractNum w:abstractNumId="44" w15:restartNumberingAfterBreak="0">
     <w:nsid w:val="2ADE3401"/>
     <w:multiLevelType w:val="multilevel"/>
     <w:tmpl w:val="63F4E6F0"/>
@@ -9433,7 +11032,7 @@
       </w:rPr>
     </w:lvl>
   </w:abstractNum>
-  <w:abstractNum w:abstractNumId="42" w15:restartNumberingAfterBreak="0">
+  <w:abstractNum w:abstractNumId="45" w15:restartNumberingAfterBreak="0">
     <w:nsid w:val="2B592B9C"/>
     <w:multiLevelType w:val="hybridMultilevel"/>
     <w:tmpl w:val="99D4C34E"/>
@@ -9546,7 +11145,7 @@
       </w:rPr>
     </w:lvl>
   </w:abstractNum>
-  <w:abstractNum w:abstractNumId="43" w15:restartNumberingAfterBreak="0">
+  <w:abstractNum w:abstractNumId="46" w15:restartNumberingAfterBreak="0">
     <w:nsid w:val="2B9413C9"/>
     <w:multiLevelType w:val="hybridMultilevel"/>
     <w:tmpl w:val="4F7A7546"/>
@@ -9658,7 +11257,7 @@
       </w:rPr>
     </w:lvl>
   </w:abstractNum>
-  <w:abstractNum w:abstractNumId="44" w15:restartNumberingAfterBreak="0">
+  <w:abstractNum w:abstractNumId="47" w15:restartNumberingAfterBreak="0">
     <w:nsid w:val="2B9539E3"/>
     <w:multiLevelType w:val="hybridMultilevel"/>
     <w:tmpl w:val="E6B8BBB6"/>
@@ -9770,7 +11369,7 @@
       </w:rPr>
     </w:lvl>
   </w:abstractNum>
-  <w:abstractNum w:abstractNumId="45" w15:restartNumberingAfterBreak="0">
+  <w:abstractNum w:abstractNumId="48" w15:restartNumberingAfterBreak="0">
     <w:nsid w:val="2E164C9A"/>
     <w:multiLevelType w:val="hybridMultilevel"/>
     <w:tmpl w:val="C6BA489A"/>
@@ -9883,7 +11482,7 @@
       </w:rPr>
     </w:lvl>
   </w:abstractNum>
-  <w:abstractNum w:abstractNumId="46" w15:restartNumberingAfterBreak="0">
+  <w:abstractNum w:abstractNumId="49" w15:restartNumberingAfterBreak="0">
     <w:nsid w:val="2E34438D"/>
     <w:multiLevelType w:val="multilevel"/>
     <w:tmpl w:val="63F4E6F0"/>
@@ -10032,7 +11631,7 @@
       </w:rPr>
     </w:lvl>
   </w:abstractNum>
-  <w:abstractNum w:abstractNumId="47" w15:restartNumberingAfterBreak="0">
+  <w:abstractNum w:abstractNumId="50" w15:restartNumberingAfterBreak="0">
     <w:nsid w:val="2E5D6D2A"/>
     <w:multiLevelType w:val="hybridMultilevel"/>
     <w:tmpl w:val="5D5ADC98"/>
@@ -10145,7 +11744,7 @@
       </w:rPr>
     </w:lvl>
   </w:abstractNum>
-  <w:abstractNum w:abstractNumId="48" w15:restartNumberingAfterBreak="0">
+  <w:abstractNum w:abstractNumId="51" w15:restartNumberingAfterBreak="0">
     <w:nsid w:val="2E716C12"/>
     <w:multiLevelType w:val="hybridMultilevel"/>
     <w:tmpl w:val="6D90C552"/>
@@ -10258,7 +11857,7 @@
       </w:rPr>
     </w:lvl>
   </w:abstractNum>
-  <w:abstractNum w:abstractNumId="49" w15:restartNumberingAfterBreak="0">
+  <w:abstractNum w:abstractNumId="52" w15:restartNumberingAfterBreak="0">
     <w:nsid w:val="2F162517"/>
     <w:multiLevelType w:val="hybridMultilevel"/>
     <w:tmpl w:val="4E3CAB7C"/>
@@ -10370,7 +11969,7 @@
       </w:rPr>
     </w:lvl>
   </w:abstractNum>
-  <w:abstractNum w:abstractNumId="50" w15:restartNumberingAfterBreak="0">
+  <w:abstractNum w:abstractNumId="53" w15:restartNumberingAfterBreak="0">
     <w:nsid w:val="2F1F6483"/>
     <w:multiLevelType w:val="multilevel"/>
     <w:tmpl w:val="993E874E"/>
@@ -10519,7 +12118,7 @@
       </w:rPr>
     </w:lvl>
   </w:abstractNum>
-  <w:abstractNum w:abstractNumId="51" w15:restartNumberingAfterBreak="0">
+  <w:abstractNum w:abstractNumId="54" w15:restartNumberingAfterBreak="0">
     <w:nsid w:val="2F2B2F8E"/>
     <w:multiLevelType w:val="multilevel"/>
     <w:tmpl w:val="547EDCFE"/>
@@ -10668,7 +12267,7 @@
       </w:rPr>
     </w:lvl>
   </w:abstractNum>
-  <w:abstractNum w:abstractNumId="52" w15:restartNumberingAfterBreak="0">
+  <w:abstractNum w:abstractNumId="55" w15:restartNumberingAfterBreak="0">
     <w:nsid w:val="2FF161E6"/>
     <w:multiLevelType w:val="hybridMultilevel"/>
     <w:tmpl w:val="ED6AA478"/>
@@ -10780,7 +12379,7 @@
       </w:rPr>
     </w:lvl>
   </w:abstractNum>
-  <w:abstractNum w:abstractNumId="53" w15:restartNumberingAfterBreak="0">
+  <w:abstractNum w:abstractNumId="56" w15:restartNumberingAfterBreak="0">
     <w:nsid w:val="30CD5DF3"/>
     <w:multiLevelType w:val="hybridMultilevel"/>
     <w:tmpl w:val="127EBD02"/>
@@ -10892,7 +12491,7 @@
       </w:rPr>
     </w:lvl>
   </w:abstractNum>
-  <w:abstractNum w:abstractNumId="54" w15:restartNumberingAfterBreak="0">
+  <w:abstractNum w:abstractNumId="57" w15:restartNumberingAfterBreak="0">
     <w:nsid w:val="31A24DDF"/>
     <w:multiLevelType w:val="multilevel"/>
     <w:tmpl w:val="63F4E6F0"/>
@@ -11041,7 +12640,7 @@
       </w:rPr>
     </w:lvl>
   </w:abstractNum>
-  <w:abstractNum w:abstractNumId="55" w15:restartNumberingAfterBreak="0">
+  <w:abstractNum w:abstractNumId="58" w15:restartNumberingAfterBreak="0">
     <w:nsid w:val="321E65E6"/>
     <w:multiLevelType w:val="multilevel"/>
     <w:tmpl w:val="63F4E6F0"/>
@@ -11190,7 +12789,7 @@
       </w:rPr>
     </w:lvl>
   </w:abstractNum>
-  <w:abstractNum w:abstractNumId="56" w15:restartNumberingAfterBreak="0">
+  <w:abstractNum w:abstractNumId="59" w15:restartNumberingAfterBreak="0">
     <w:nsid w:val="332E29E8"/>
     <w:multiLevelType w:val="multilevel"/>
     <w:tmpl w:val="BF082128"/>
@@ -11339,7 +12938,7 @@
       </w:rPr>
     </w:lvl>
   </w:abstractNum>
-  <w:abstractNum w:abstractNumId="57" w15:restartNumberingAfterBreak="0">
+  <w:abstractNum w:abstractNumId="60" w15:restartNumberingAfterBreak="0">
     <w:nsid w:val="34251C5D"/>
     <w:multiLevelType w:val="multilevel"/>
     <w:tmpl w:val="C31CBCE0"/>
@@ -11488,7 +13087,7 @@
       </w:rPr>
     </w:lvl>
   </w:abstractNum>
-  <w:abstractNum w:abstractNumId="58" w15:restartNumberingAfterBreak="0">
+  <w:abstractNum w:abstractNumId="61" w15:restartNumberingAfterBreak="0">
     <w:nsid w:val="342A6150"/>
     <w:multiLevelType w:val="multilevel"/>
     <w:tmpl w:val="29E0BE1C"/>
@@ -11637,7 +13236,7 @@
       </w:rPr>
     </w:lvl>
   </w:abstractNum>
-  <w:abstractNum w:abstractNumId="59" w15:restartNumberingAfterBreak="0">
+  <w:abstractNum w:abstractNumId="62" w15:restartNumberingAfterBreak="0">
     <w:nsid w:val="356F220A"/>
     <w:multiLevelType w:val="multilevel"/>
     <w:tmpl w:val="0FFA5254"/>
@@ -11786,7 +13385,7 @@
       </w:rPr>
     </w:lvl>
   </w:abstractNum>
-  <w:abstractNum w:abstractNumId="60" w15:restartNumberingAfterBreak="0">
+  <w:abstractNum w:abstractNumId="63" w15:restartNumberingAfterBreak="0">
     <w:nsid w:val="357B7363"/>
     <w:multiLevelType w:val="hybridMultilevel"/>
     <w:tmpl w:val="00D411EC"/>
@@ -11898,7 +13497,7 @@
       </w:rPr>
     </w:lvl>
   </w:abstractNum>
-  <w:abstractNum w:abstractNumId="61" w15:restartNumberingAfterBreak="0">
+  <w:abstractNum w:abstractNumId="64" w15:restartNumberingAfterBreak="0">
     <w:nsid w:val="3583100F"/>
     <w:multiLevelType w:val="hybridMultilevel"/>
     <w:tmpl w:val="848ECFAA"/>
@@ -12011,7 +13610,7 @@
       </w:rPr>
     </w:lvl>
   </w:abstractNum>
-  <w:abstractNum w:abstractNumId="62" w15:restartNumberingAfterBreak="0">
+  <w:abstractNum w:abstractNumId="65" w15:restartNumberingAfterBreak="0">
     <w:nsid w:val="3623194A"/>
     <w:multiLevelType w:val="multilevel"/>
     <w:tmpl w:val="63F4E6F0"/>
@@ -12160,7 +13759,7 @@
       </w:rPr>
     </w:lvl>
   </w:abstractNum>
-  <w:abstractNum w:abstractNumId="63" w15:restartNumberingAfterBreak="0">
+  <w:abstractNum w:abstractNumId="66" w15:restartNumberingAfterBreak="0">
     <w:nsid w:val="36AD3FB0"/>
     <w:multiLevelType w:val="multilevel"/>
     <w:tmpl w:val="0644AEEA"/>
@@ -12309,7 +13908,7 @@
       </w:rPr>
     </w:lvl>
   </w:abstractNum>
-  <w:abstractNum w:abstractNumId="64" w15:restartNumberingAfterBreak="0">
+  <w:abstractNum w:abstractNumId="67" w15:restartNumberingAfterBreak="0">
     <w:nsid w:val="371A2CDE"/>
     <w:multiLevelType w:val="hybridMultilevel"/>
     <w:tmpl w:val="EA9C00CC"/>
@@ -12421,7 +14020,7 @@
       </w:rPr>
     </w:lvl>
   </w:abstractNum>
-  <w:abstractNum w:abstractNumId="65" w15:restartNumberingAfterBreak="0">
+  <w:abstractNum w:abstractNumId="68" w15:restartNumberingAfterBreak="0">
     <w:nsid w:val="373D5E48"/>
     <w:multiLevelType w:val="hybridMultilevel"/>
     <w:tmpl w:val="8A6E38C0"/>
@@ -12534,7 +14133,7 @@
       </w:rPr>
     </w:lvl>
   </w:abstractNum>
-  <w:abstractNum w:abstractNumId="66" w15:restartNumberingAfterBreak="0">
+  <w:abstractNum w:abstractNumId="69" w15:restartNumberingAfterBreak="0">
     <w:nsid w:val="3B446B2D"/>
     <w:multiLevelType w:val="hybridMultilevel"/>
     <w:tmpl w:val="B638176E"/>
@@ -12646,7 +14245,7 @@
       </w:rPr>
     </w:lvl>
   </w:abstractNum>
-  <w:abstractNum w:abstractNumId="67" w15:restartNumberingAfterBreak="0">
+  <w:abstractNum w:abstractNumId="70" w15:restartNumberingAfterBreak="0">
     <w:nsid w:val="3B6B41F5"/>
     <w:multiLevelType w:val="hybridMultilevel"/>
     <w:tmpl w:val="10A26168"/>
@@ -12758,7 +14357,7 @@
       </w:rPr>
     </w:lvl>
   </w:abstractNum>
-  <w:abstractNum w:abstractNumId="68" w15:restartNumberingAfterBreak="0">
+  <w:abstractNum w:abstractNumId="71" w15:restartNumberingAfterBreak="0">
     <w:nsid w:val="3C5546BA"/>
     <w:multiLevelType w:val="hybridMultilevel"/>
     <w:tmpl w:val="3434F5E4"/>
@@ -12870,7 +14469,7 @@
       </w:rPr>
     </w:lvl>
   </w:abstractNum>
-  <w:abstractNum w:abstractNumId="69" w15:restartNumberingAfterBreak="0">
+  <w:abstractNum w:abstractNumId="72" w15:restartNumberingAfterBreak="0">
     <w:nsid w:val="3C623C55"/>
     <w:multiLevelType w:val="multilevel"/>
     <w:tmpl w:val="A0B0E8F4"/>
@@ -13019,7 +14618,7 @@
       </w:rPr>
     </w:lvl>
   </w:abstractNum>
-  <w:abstractNum w:abstractNumId="70" w15:restartNumberingAfterBreak="0">
+  <w:abstractNum w:abstractNumId="73" w15:restartNumberingAfterBreak="0">
     <w:nsid w:val="3CD27F78"/>
     <w:multiLevelType w:val="multilevel"/>
     <w:tmpl w:val="FCDE767A"/>
@@ -13168,7 +14767,7 @@
       </w:rPr>
     </w:lvl>
   </w:abstractNum>
-  <w:abstractNum w:abstractNumId="71" w15:restartNumberingAfterBreak="0">
+  <w:abstractNum w:abstractNumId="74" w15:restartNumberingAfterBreak="0">
     <w:nsid w:val="3CD74B18"/>
     <w:multiLevelType w:val="hybridMultilevel"/>
     <w:tmpl w:val="2FF42220"/>
@@ -13281,7 +14880,7 @@
       </w:rPr>
     </w:lvl>
   </w:abstractNum>
-  <w:abstractNum w:abstractNumId="72" w15:restartNumberingAfterBreak="0">
+  <w:abstractNum w:abstractNumId="75" w15:restartNumberingAfterBreak="0">
     <w:nsid w:val="3D2F7E79"/>
     <w:multiLevelType w:val="hybridMultilevel"/>
     <w:tmpl w:val="6ED674BE"/>
@@ -13393,7 +14992,7 @@
       </w:rPr>
     </w:lvl>
   </w:abstractNum>
-  <w:abstractNum w:abstractNumId="73" w15:restartNumberingAfterBreak="0">
+  <w:abstractNum w:abstractNumId="76" w15:restartNumberingAfterBreak="0">
     <w:nsid w:val="3D397287"/>
     <w:multiLevelType w:val="hybridMultilevel"/>
     <w:tmpl w:val="F4503122"/>
@@ -13505,7 +15104,7 @@
       </w:rPr>
     </w:lvl>
   </w:abstractNum>
-  <w:abstractNum w:abstractNumId="74" w15:restartNumberingAfterBreak="0">
+  <w:abstractNum w:abstractNumId="77" w15:restartNumberingAfterBreak="0">
     <w:nsid w:val="3E685FF3"/>
     <w:multiLevelType w:val="multilevel"/>
     <w:tmpl w:val="7D20B538"/>
@@ -13654,7 +15253,7 @@
       </w:rPr>
     </w:lvl>
   </w:abstractNum>
-  <w:abstractNum w:abstractNumId="75" w15:restartNumberingAfterBreak="0">
+  <w:abstractNum w:abstractNumId="78" w15:restartNumberingAfterBreak="0">
     <w:nsid w:val="3F346C2C"/>
     <w:multiLevelType w:val="multilevel"/>
     <w:tmpl w:val="63F4E6F0"/>
@@ -13803,7 +15402,7 @@
       </w:rPr>
     </w:lvl>
   </w:abstractNum>
-  <w:abstractNum w:abstractNumId="76" w15:restartNumberingAfterBreak="0">
+  <w:abstractNum w:abstractNumId="79" w15:restartNumberingAfterBreak="0">
     <w:nsid w:val="3FCB1322"/>
     <w:multiLevelType w:val="hybridMultilevel"/>
     <w:tmpl w:val="55C012B2"/>
@@ -13915,7 +15514,7 @@
       </w:rPr>
     </w:lvl>
   </w:abstractNum>
-  <w:abstractNum w:abstractNumId="77" w15:restartNumberingAfterBreak="0">
+  <w:abstractNum w:abstractNumId="80" w15:restartNumberingAfterBreak="0">
     <w:nsid w:val="41A9344F"/>
     <w:multiLevelType w:val="hybridMultilevel"/>
     <w:tmpl w:val="0FB60038"/>
@@ -14028,7 +15627,7 @@
       </w:rPr>
     </w:lvl>
   </w:abstractNum>
-  <w:abstractNum w:abstractNumId="78" w15:restartNumberingAfterBreak="0">
+  <w:abstractNum w:abstractNumId="81" w15:restartNumberingAfterBreak="0">
     <w:nsid w:val="42004E1F"/>
     <w:multiLevelType w:val="hybridMultilevel"/>
     <w:tmpl w:val="770C8314"/>
@@ -14140,7 +15739,7 @@
       </w:rPr>
     </w:lvl>
   </w:abstractNum>
-  <w:abstractNum w:abstractNumId="79" w15:restartNumberingAfterBreak="0">
+  <w:abstractNum w:abstractNumId="82" w15:restartNumberingAfterBreak="0">
     <w:nsid w:val="439F7169"/>
     <w:multiLevelType w:val="hybridMultilevel"/>
     <w:tmpl w:val="1884EDCA"/>
@@ -14253,7 +15852,7 @@
       </w:rPr>
     </w:lvl>
   </w:abstractNum>
-  <w:abstractNum w:abstractNumId="80" w15:restartNumberingAfterBreak="0">
+  <w:abstractNum w:abstractNumId="83" w15:restartNumberingAfterBreak="0">
     <w:nsid w:val="43EA1D69"/>
     <w:multiLevelType w:val="multilevel"/>
     <w:tmpl w:val="DFEC23EC"/>
@@ -14402,7 +16001,7 @@
       </w:rPr>
     </w:lvl>
   </w:abstractNum>
-  <w:abstractNum w:abstractNumId="81" w15:restartNumberingAfterBreak="0">
+  <w:abstractNum w:abstractNumId="84" w15:restartNumberingAfterBreak="0">
     <w:nsid w:val="44320084"/>
     <w:multiLevelType w:val="hybridMultilevel"/>
     <w:tmpl w:val="CE5076D4"/>
@@ -14514,7 +16113,7 @@
       </w:rPr>
     </w:lvl>
   </w:abstractNum>
-  <w:abstractNum w:abstractNumId="82" w15:restartNumberingAfterBreak="0">
+  <w:abstractNum w:abstractNumId="85" w15:restartNumberingAfterBreak="0">
     <w:nsid w:val="44554567"/>
     <w:multiLevelType w:val="hybridMultilevel"/>
     <w:tmpl w:val="78748252"/>
@@ -14626,7 +16225,7 @@
       </w:rPr>
     </w:lvl>
   </w:abstractNum>
-  <w:abstractNum w:abstractNumId="83" w15:restartNumberingAfterBreak="0">
+  <w:abstractNum w:abstractNumId="86" w15:restartNumberingAfterBreak="0">
     <w:nsid w:val="49005094"/>
     <w:multiLevelType w:val="hybridMultilevel"/>
     <w:tmpl w:val="14848CBE"/>
@@ -14738,7 +16337,7 @@
       </w:rPr>
     </w:lvl>
   </w:abstractNum>
-  <w:abstractNum w:abstractNumId="84" w15:restartNumberingAfterBreak="0">
+  <w:abstractNum w:abstractNumId="87" w15:restartNumberingAfterBreak="0">
     <w:nsid w:val="49243794"/>
     <w:multiLevelType w:val="multilevel"/>
     <w:tmpl w:val="E7681528"/>
@@ -14887,7 +16486,7 @@
       </w:rPr>
     </w:lvl>
   </w:abstractNum>
-  <w:abstractNum w:abstractNumId="85" w15:restartNumberingAfterBreak="0">
+  <w:abstractNum w:abstractNumId="88" w15:restartNumberingAfterBreak="0">
     <w:nsid w:val="4A880990"/>
     <w:multiLevelType w:val="hybridMultilevel"/>
     <w:tmpl w:val="F17E12C2"/>
@@ -14999,7 +16598,7 @@
       </w:rPr>
     </w:lvl>
   </w:abstractNum>
-  <w:abstractNum w:abstractNumId="86" w15:restartNumberingAfterBreak="0">
+  <w:abstractNum w:abstractNumId="89" w15:restartNumberingAfterBreak="0">
     <w:nsid w:val="4B182B12"/>
     <w:multiLevelType w:val="hybridMultilevel"/>
     <w:tmpl w:val="31C486B4"/>
@@ -15111,7 +16710,7 @@
       </w:rPr>
     </w:lvl>
   </w:abstractNum>
-  <w:abstractNum w:abstractNumId="87" w15:restartNumberingAfterBreak="0">
+  <w:abstractNum w:abstractNumId="90" w15:restartNumberingAfterBreak="0">
     <w:nsid w:val="4BA13766"/>
     <w:multiLevelType w:val="multilevel"/>
     <w:tmpl w:val="63F4E6F0"/>
@@ -15260,7 +16859,7 @@
       </w:rPr>
     </w:lvl>
   </w:abstractNum>
-  <w:abstractNum w:abstractNumId="88" w15:restartNumberingAfterBreak="0">
+  <w:abstractNum w:abstractNumId="91" w15:restartNumberingAfterBreak="0">
     <w:nsid w:val="4E65371E"/>
     <w:multiLevelType w:val="hybridMultilevel"/>
     <w:tmpl w:val="53EE4538"/>
@@ -15372,7 +16971,7 @@
       </w:rPr>
     </w:lvl>
   </w:abstractNum>
-  <w:abstractNum w:abstractNumId="89" w15:restartNumberingAfterBreak="0">
+  <w:abstractNum w:abstractNumId="92" w15:restartNumberingAfterBreak="0">
     <w:nsid w:val="4E9A3F16"/>
     <w:multiLevelType w:val="multilevel"/>
     <w:tmpl w:val="63F4E6F0"/>
@@ -15521,7 +17120,7 @@
       </w:rPr>
     </w:lvl>
   </w:abstractNum>
-  <w:abstractNum w:abstractNumId="90" w15:restartNumberingAfterBreak="0">
+  <w:abstractNum w:abstractNumId="93" w15:restartNumberingAfterBreak="0">
     <w:nsid w:val="500B790D"/>
     <w:multiLevelType w:val="multilevel"/>
     <w:tmpl w:val="63F4E6F0"/>
@@ -15670,7 +17269,7 @@
       </w:rPr>
     </w:lvl>
   </w:abstractNum>
-  <w:abstractNum w:abstractNumId="91" w15:restartNumberingAfterBreak="0">
+  <w:abstractNum w:abstractNumId="94" w15:restartNumberingAfterBreak="0">
     <w:nsid w:val="526538B7"/>
     <w:multiLevelType w:val="hybridMultilevel"/>
     <w:tmpl w:val="E6A017F2"/>
@@ -15783,7 +17382,7 @@
       </w:rPr>
     </w:lvl>
   </w:abstractNum>
-  <w:abstractNum w:abstractNumId="92" w15:restartNumberingAfterBreak="0">
+  <w:abstractNum w:abstractNumId="95" w15:restartNumberingAfterBreak="0">
     <w:nsid w:val="537E56D9"/>
     <w:multiLevelType w:val="multilevel"/>
     <w:tmpl w:val="1B6E8B6A"/>
@@ -15932,7 +17531,7 @@
       </w:rPr>
     </w:lvl>
   </w:abstractNum>
-  <w:abstractNum w:abstractNumId="93" w15:restartNumberingAfterBreak="0">
+  <w:abstractNum w:abstractNumId="96" w15:restartNumberingAfterBreak="0">
     <w:nsid w:val="53E6601E"/>
     <w:multiLevelType w:val="hybridMultilevel"/>
     <w:tmpl w:val="66F0666A"/>
@@ -16045,7 +17644,7 @@
       </w:rPr>
     </w:lvl>
   </w:abstractNum>
-  <w:abstractNum w:abstractNumId="94" w15:restartNumberingAfterBreak="0">
+  <w:abstractNum w:abstractNumId="97" w15:restartNumberingAfterBreak="0">
     <w:nsid w:val="551D6F91"/>
     <w:multiLevelType w:val="hybridMultilevel"/>
     <w:tmpl w:val="9522B3C6"/>
@@ -16157,7 +17756,7 @@
       </w:rPr>
     </w:lvl>
   </w:abstractNum>
-  <w:abstractNum w:abstractNumId="95" w15:restartNumberingAfterBreak="0">
+  <w:abstractNum w:abstractNumId="98" w15:restartNumberingAfterBreak="0">
     <w:nsid w:val="555451DA"/>
     <w:multiLevelType w:val="hybridMultilevel"/>
     <w:tmpl w:val="CAB2A550"/>
@@ -16270,7 +17869,7 @@
       </w:rPr>
     </w:lvl>
   </w:abstractNum>
-  <w:abstractNum w:abstractNumId="96" w15:restartNumberingAfterBreak="0">
+  <w:abstractNum w:abstractNumId="99" w15:restartNumberingAfterBreak="0">
     <w:nsid w:val="55655B93"/>
     <w:multiLevelType w:val="multilevel"/>
     <w:tmpl w:val="9C88A4A8"/>
@@ -16419,7 +18018,7 @@
       </w:rPr>
     </w:lvl>
   </w:abstractNum>
-  <w:abstractNum w:abstractNumId="97" w15:restartNumberingAfterBreak="0">
+  <w:abstractNum w:abstractNumId="100" w15:restartNumberingAfterBreak="0">
     <w:nsid w:val="562D4F1F"/>
     <w:multiLevelType w:val="hybridMultilevel"/>
     <w:tmpl w:val="1FF8D31C"/>
@@ -16531,7 +18130,7 @@
       </w:rPr>
     </w:lvl>
   </w:abstractNum>
-  <w:abstractNum w:abstractNumId="98" w15:restartNumberingAfterBreak="0">
+  <w:abstractNum w:abstractNumId="101" w15:restartNumberingAfterBreak="0">
     <w:nsid w:val="565A0C8B"/>
     <w:multiLevelType w:val="multilevel"/>
     <w:tmpl w:val="AB24FF2E"/>
@@ -16680,7 +18279,7 @@
       </w:rPr>
     </w:lvl>
   </w:abstractNum>
-  <w:abstractNum w:abstractNumId="99" w15:restartNumberingAfterBreak="0">
+  <w:abstractNum w:abstractNumId="102" w15:restartNumberingAfterBreak="0">
     <w:nsid w:val="566E7C65"/>
     <w:multiLevelType w:val="multilevel"/>
     <w:tmpl w:val="28803B4C"/>
@@ -16829,7 +18428,7 @@
       </w:rPr>
     </w:lvl>
   </w:abstractNum>
-  <w:abstractNum w:abstractNumId="100" w15:restartNumberingAfterBreak="0">
+  <w:abstractNum w:abstractNumId="103" w15:restartNumberingAfterBreak="0">
     <w:nsid w:val="57407594"/>
     <w:multiLevelType w:val="multilevel"/>
     <w:tmpl w:val="E6E2F8AE"/>
@@ -16978,7 +18577,7 @@
       </w:rPr>
     </w:lvl>
   </w:abstractNum>
-  <w:abstractNum w:abstractNumId="101" w15:restartNumberingAfterBreak="0">
+  <w:abstractNum w:abstractNumId="104" w15:restartNumberingAfterBreak="0">
     <w:nsid w:val="577F771B"/>
     <w:multiLevelType w:val="hybridMultilevel"/>
     <w:tmpl w:val="0F2C5914"/>
@@ -17090,7 +18689,7 @@
       </w:rPr>
     </w:lvl>
   </w:abstractNum>
-  <w:abstractNum w:abstractNumId="102" w15:restartNumberingAfterBreak="0">
+  <w:abstractNum w:abstractNumId="105" w15:restartNumberingAfterBreak="0">
     <w:nsid w:val="57C43CDD"/>
     <w:multiLevelType w:val="hybridMultilevel"/>
     <w:tmpl w:val="6C94FB5E"/>
@@ -17203,7 +18802,7 @@
       </w:rPr>
     </w:lvl>
   </w:abstractNum>
-  <w:abstractNum w:abstractNumId="103" w15:restartNumberingAfterBreak="0">
+  <w:abstractNum w:abstractNumId="106" w15:restartNumberingAfterBreak="0">
     <w:nsid w:val="58393977"/>
     <w:multiLevelType w:val="hybridMultilevel"/>
     <w:tmpl w:val="985A5484"/>
@@ -17316,7 +18915,7 @@
       </w:rPr>
     </w:lvl>
   </w:abstractNum>
-  <w:abstractNum w:abstractNumId="104" w15:restartNumberingAfterBreak="0">
+  <w:abstractNum w:abstractNumId="107" w15:restartNumberingAfterBreak="0">
     <w:nsid w:val="59EB4CE4"/>
     <w:multiLevelType w:val="multilevel"/>
     <w:tmpl w:val="63F4E6F0"/>
@@ -17465,7 +19064,7 @@
       </w:rPr>
     </w:lvl>
   </w:abstractNum>
-  <w:abstractNum w:abstractNumId="105" w15:restartNumberingAfterBreak="0">
+  <w:abstractNum w:abstractNumId="108" w15:restartNumberingAfterBreak="0">
     <w:nsid w:val="5BD11962"/>
     <w:multiLevelType w:val="hybridMultilevel"/>
     <w:tmpl w:val="89A4B834"/>
@@ -17554,7 +19153,7 @@
       </w:pPr>
     </w:lvl>
   </w:abstractNum>
-  <w:abstractNum w:abstractNumId="106" w15:restartNumberingAfterBreak="0">
+  <w:abstractNum w:abstractNumId="109" w15:restartNumberingAfterBreak="0">
     <w:nsid w:val="5C950DBA"/>
     <w:multiLevelType w:val="hybridMultilevel"/>
     <w:tmpl w:val="7D78F950"/>
@@ -17666,7 +19265,7 @@
       </w:rPr>
     </w:lvl>
   </w:abstractNum>
-  <w:abstractNum w:abstractNumId="107" w15:restartNumberingAfterBreak="0">
+  <w:abstractNum w:abstractNumId="110" w15:restartNumberingAfterBreak="0">
     <w:nsid w:val="5D2A5D3B"/>
     <w:multiLevelType w:val="hybridMultilevel"/>
     <w:tmpl w:val="3AF89EA6"/>
@@ -17757,7 +19356,7 @@
       </w:pPr>
     </w:lvl>
   </w:abstractNum>
-  <w:abstractNum w:abstractNumId="108" w15:restartNumberingAfterBreak="0">
+  <w:abstractNum w:abstractNumId="111" w15:restartNumberingAfterBreak="0">
     <w:nsid w:val="5D9E49FD"/>
     <w:multiLevelType w:val="hybridMultilevel"/>
     <w:tmpl w:val="4EE40BB4"/>
@@ -17869,7 +19468,7 @@
       </w:rPr>
     </w:lvl>
   </w:abstractNum>
-  <w:abstractNum w:abstractNumId="109" w15:restartNumberingAfterBreak="0">
+  <w:abstractNum w:abstractNumId="112" w15:restartNumberingAfterBreak="0">
     <w:nsid w:val="5DB7107D"/>
     <w:multiLevelType w:val="multilevel"/>
     <w:tmpl w:val="6520107A"/>
@@ -18018,7 +19617,7 @@
       </w:rPr>
     </w:lvl>
   </w:abstractNum>
-  <w:abstractNum w:abstractNumId="110" w15:restartNumberingAfterBreak="0">
+  <w:abstractNum w:abstractNumId="113" w15:restartNumberingAfterBreak="0">
     <w:nsid w:val="60421322"/>
     <w:multiLevelType w:val="hybridMultilevel"/>
     <w:tmpl w:val="447CDBDC"/>
@@ -18130,7 +19729,7 @@
       </w:rPr>
     </w:lvl>
   </w:abstractNum>
-  <w:abstractNum w:abstractNumId="111" w15:restartNumberingAfterBreak="0">
+  <w:abstractNum w:abstractNumId="114" w15:restartNumberingAfterBreak="0">
     <w:nsid w:val="61926C31"/>
     <w:multiLevelType w:val="hybridMultilevel"/>
     <w:tmpl w:val="AFD27E5C"/>
@@ -18243,7 +19842,7 @@
       </w:rPr>
     </w:lvl>
   </w:abstractNum>
-  <w:abstractNum w:abstractNumId="112" w15:restartNumberingAfterBreak="0">
+  <w:abstractNum w:abstractNumId="115" w15:restartNumberingAfterBreak="0">
     <w:nsid w:val="622F5FC7"/>
     <w:multiLevelType w:val="hybridMultilevel"/>
     <w:tmpl w:val="49A6C2A6"/>
@@ -18356,7 +19955,7 @@
       </w:rPr>
     </w:lvl>
   </w:abstractNum>
-  <w:abstractNum w:abstractNumId="113" w15:restartNumberingAfterBreak="0">
+  <w:abstractNum w:abstractNumId="116" w15:restartNumberingAfterBreak="0">
     <w:nsid w:val="62AC33B4"/>
     <w:multiLevelType w:val="multilevel"/>
     <w:tmpl w:val="A074F3CA"/>
@@ -18505,7 +20104,7 @@
       </w:rPr>
     </w:lvl>
   </w:abstractNum>
-  <w:abstractNum w:abstractNumId="114" w15:restartNumberingAfterBreak="0">
+  <w:abstractNum w:abstractNumId="117" w15:restartNumberingAfterBreak="0">
     <w:nsid w:val="63B44674"/>
     <w:multiLevelType w:val="multilevel"/>
     <w:tmpl w:val="08F4FA9A"/>
@@ -18654,7 +20253,7 @@
       </w:rPr>
     </w:lvl>
   </w:abstractNum>
-  <w:abstractNum w:abstractNumId="115" w15:restartNumberingAfterBreak="0">
+  <w:abstractNum w:abstractNumId="118" w15:restartNumberingAfterBreak="0">
     <w:nsid w:val="63C245D4"/>
     <w:multiLevelType w:val="hybridMultilevel"/>
     <w:tmpl w:val="E1563A56"/>
@@ -18766,7 +20365,7 @@
       </w:rPr>
     </w:lvl>
   </w:abstractNum>
-  <w:abstractNum w:abstractNumId="116" w15:restartNumberingAfterBreak="0">
+  <w:abstractNum w:abstractNumId="119" w15:restartNumberingAfterBreak="0">
     <w:nsid w:val="64F30198"/>
     <w:multiLevelType w:val="multilevel"/>
     <w:tmpl w:val="63F4E6F0"/>
@@ -18915,7 +20514,7 @@
       </w:rPr>
     </w:lvl>
   </w:abstractNum>
-  <w:abstractNum w:abstractNumId="117" w15:restartNumberingAfterBreak="0">
+  <w:abstractNum w:abstractNumId="120" w15:restartNumberingAfterBreak="0">
     <w:nsid w:val="65AF2502"/>
     <w:multiLevelType w:val="hybridMultilevel"/>
     <w:tmpl w:val="FB2A44D8"/>
@@ -19028,7 +20627,7 @@
       </w:rPr>
     </w:lvl>
   </w:abstractNum>
-  <w:abstractNum w:abstractNumId="118" w15:restartNumberingAfterBreak="0">
+  <w:abstractNum w:abstractNumId="121" w15:restartNumberingAfterBreak="0">
     <w:nsid w:val="671614F0"/>
     <w:multiLevelType w:val="multilevel"/>
     <w:tmpl w:val="63F4E6F0"/>
@@ -19177,7 +20776,7 @@
       </w:rPr>
     </w:lvl>
   </w:abstractNum>
-  <w:abstractNum w:abstractNumId="119" w15:restartNumberingAfterBreak="0">
+  <w:abstractNum w:abstractNumId="122" w15:restartNumberingAfterBreak="0">
     <w:nsid w:val="6859691D"/>
     <w:multiLevelType w:val="multilevel"/>
     <w:tmpl w:val="826A9D48"/>
@@ -19326,7 +20925,7 @@
       </w:rPr>
     </w:lvl>
   </w:abstractNum>
-  <w:abstractNum w:abstractNumId="120" w15:restartNumberingAfterBreak="0">
+  <w:abstractNum w:abstractNumId="123" w15:restartNumberingAfterBreak="0">
     <w:nsid w:val="68817757"/>
     <w:multiLevelType w:val="multilevel"/>
     <w:tmpl w:val="34EE1968"/>
@@ -19475,7 +21074,7 @@
       </w:rPr>
     </w:lvl>
   </w:abstractNum>
-  <w:abstractNum w:abstractNumId="121" w15:restartNumberingAfterBreak="0">
+  <w:abstractNum w:abstractNumId="124" w15:restartNumberingAfterBreak="0">
     <w:nsid w:val="68BE10E8"/>
     <w:multiLevelType w:val="hybridMultilevel"/>
     <w:tmpl w:val="326CD592"/>
@@ -19588,7 +21187,7 @@
       </w:rPr>
     </w:lvl>
   </w:abstractNum>
-  <w:abstractNum w:abstractNumId="122" w15:restartNumberingAfterBreak="0">
+  <w:abstractNum w:abstractNumId="125" w15:restartNumberingAfterBreak="0">
     <w:nsid w:val="68E86299"/>
     <w:multiLevelType w:val="hybridMultilevel"/>
     <w:tmpl w:val="9B5CBEE8"/>
@@ -19674,7 +21273,7 @@
       </w:pPr>
     </w:lvl>
   </w:abstractNum>
-  <w:abstractNum w:abstractNumId="123" w15:restartNumberingAfterBreak="0">
+  <w:abstractNum w:abstractNumId="126" w15:restartNumberingAfterBreak="0">
     <w:nsid w:val="69996D9A"/>
     <w:multiLevelType w:val="multilevel"/>
     <w:tmpl w:val="1780FC38"/>
@@ -19823,7 +21422,7 @@
       </w:rPr>
     </w:lvl>
   </w:abstractNum>
-  <w:abstractNum w:abstractNumId="124" w15:restartNumberingAfterBreak="0">
+  <w:abstractNum w:abstractNumId="127" w15:restartNumberingAfterBreak="0">
     <w:nsid w:val="6B3C30B9"/>
     <w:multiLevelType w:val="hybridMultilevel"/>
     <w:tmpl w:val="C938F8DE"/>
@@ -19935,7 +21534,7 @@
       </w:rPr>
     </w:lvl>
   </w:abstractNum>
-  <w:abstractNum w:abstractNumId="125" w15:restartNumberingAfterBreak="0">
+  <w:abstractNum w:abstractNumId="128" w15:restartNumberingAfterBreak="0">
     <w:nsid w:val="6D1511A0"/>
     <w:multiLevelType w:val="hybridMultilevel"/>
     <w:tmpl w:val="AAD8B9B4"/>
@@ -20047,7 +21646,7 @@
       </w:rPr>
     </w:lvl>
   </w:abstractNum>
-  <w:abstractNum w:abstractNumId="126" w15:restartNumberingAfterBreak="0">
+  <w:abstractNum w:abstractNumId="129" w15:restartNumberingAfterBreak="0">
     <w:nsid w:val="6DD255F1"/>
     <w:multiLevelType w:val="hybridMultilevel"/>
     <w:tmpl w:val="ACBC1404"/>
@@ -20160,7 +21759,7 @@
       </w:rPr>
     </w:lvl>
   </w:abstractNum>
-  <w:abstractNum w:abstractNumId="127" w15:restartNumberingAfterBreak="0">
+  <w:abstractNum w:abstractNumId="130" w15:restartNumberingAfterBreak="0">
     <w:nsid w:val="6DDB4404"/>
     <w:multiLevelType w:val="hybridMultilevel"/>
     <w:tmpl w:val="06428E32"/>
@@ -20273,7 +21872,7 @@
       </w:rPr>
     </w:lvl>
   </w:abstractNum>
-  <w:abstractNum w:abstractNumId="128" w15:restartNumberingAfterBreak="0">
+  <w:abstractNum w:abstractNumId="131" w15:restartNumberingAfterBreak="0">
     <w:nsid w:val="6F014B3B"/>
     <w:multiLevelType w:val="hybridMultilevel"/>
     <w:tmpl w:val="C89A39BE"/>
@@ -20385,7 +21984,7 @@
       </w:rPr>
     </w:lvl>
   </w:abstractNum>
-  <w:abstractNum w:abstractNumId="129" w15:restartNumberingAfterBreak="0">
+  <w:abstractNum w:abstractNumId="132" w15:restartNumberingAfterBreak="0">
     <w:nsid w:val="6F171273"/>
     <w:multiLevelType w:val="multilevel"/>
     <w:tmpl w:val="0240C564"/>
@@ -20534,7 +22133,7 @@
       </w:rPr>
     </w:lvl>
   </w:abstractNum>
-  <w:abstractNum w:abstractNumId="130" w15:restartNumberingAfterBreak="0">
+  <w:abstractNum w:abstractNumId="133" w15:restartNumberingAfterBreak="0">
     <w:nsid w:val="6FB82AAA"/>
     <w:multiLevelType w:val="multilevel"/>
     <w:tmpl w:val="FC46C7C0"/>
@@ -20683,7 +22282,7 @@
       </w:rPr>
     </w:lvl>
   </w:abstractNum>
-  <w:abstractNum w:abstractNumId="131" w15:restartNumberingAfterBreak="0">
+  <w:abstractNum w:abstractNumId="134" w15:restartNumberingAfterBreak="0">
     <w:nsid w:val="6FD46DCF"/>
     <w:multiLevelType w:val="hybridMultilevel"/>
     <w:tmpl w:val="EF5E6EC6"/>
@@ -20796,7 +22395,7 @@
       </w:rPr>
     </w:lvl>
   </w:abstractNum>
-  <w:abstractNum w:abstractNumId="132" w15:restartNumberingAfterBreak="0">
+  <w:abstractNum w:abstractNumId="135" w15:restartNumberingAfterBreak="0">
     <w:nsid w:val="70484E38"/>
     <w:multiLevelType w:val="multilevel"/>
     <w:tmpl w:val="22B26DD2"/>
@@ -20945,7 +22544,7 @@
       </w:rPr>
     </w:lvl>
   </w:abstractNum>
-  <w:abstractNum w:abstractNumId="133" w15:restartNumberingAfterBreak="0">
+  <w:abstractNum w:abstractNumId="136" w15:restartNumberingAfterBreak="0">
     <w:nsid w:val="70CB723E"/>
     <w:multiLevelType w:val="multilevel"/>
     <w:tmpl w:val="63F4E6F0"/>
@@ -21094,7 +22693,7 @@
       </w:rPr>
     </w:lvl>
   </w:abstractNum>
-  <w:abstractNum w:abstractNumId="134" w15:restartNumberingAfterBreak="0">
+  <w:abstractNum w:abstractNumId="137" w15:restartNumberingAfterBreak="0">
     <w:nsid w:val="71DB3F58"/>
     <w:multiLevelType w:val="multilevel"/>
     <w:tmpl w:val="63F4E6F0"/>
@@ -21243,7 +22842,7 @@
       </w:rPr>
     </w:lvl>
   </w:abstractNum>
-  <w:abstractNum w:abstractNumId="135" w15:restartNumberingAfterBreak="0">
+  <w:abstractNum w:abstractNumId="138" w15:restartNumberingAfterBreak="0">
     <w:nsid w:val="72F31FF2"/>
     <w:multiLevelType w:val="hybridMultilevel"/>
     <w:tmpl w:val="5C2693A0"/>
@@ -21355,7 +22954,7 @@
       </w:rPr>
     </w:lvl>
   </w:abstractNum>
-  <w:abstractNum w:abstractNumId="136" w15:restartNumberingAfterBreak="0">
+  <w:abstractNum w:abstractNumId="139" w15:restartNumberingAfterBreak="0">
     <w:nsid w:val="75B45140"/>
     <w:multiLevelType w:val="hybridMultilevel"/>
     <w:tmpl w:val="93F8F3C4"/>
@@ -21468,7 +23067,7 @@
       </w:rPr>
     </w:lvl>
   </w:abstractNum>
-  <w:abstractNum w:abstractNumId="137" w15:restartNumberingAfterBreak="0">
+  <w:abstractNum w:abstractNumId="140" w15:restartNumberingAfterBreak="0">
     <w:nsid w:val="76F60FFE"/>
     <w:multiLevelType w:val="multilevel"/>
     <w:tmpl w:val="63F4E6F0"/>
@@ -21617,7 +23216,7 @@
       </w:rPr>
     </w:lvl>
   </w:abstractNum>
-  <w:abstractNum w:abstractNumId="138" w15:restartNumberingAfterBreak="0">
+  <w:abstractNum w:abstractNumId="141" w15:restartNumberingAfterBreak="0">
     <w:nsid w:val="77572323"/>
     <w:multiLevelType w:val="multilevel"/>
     <w:tmpl w:val="63F4E6F0"/>
@@ -21766,7 +23365,7 @@
       </w:rPr>
     </w:lvl>
   </w:abstractNum>
-  <w:abstractNum w:abstractNumId="139" w15:restartNumberingAfterBreak="0">
+  <w:abstractNum w:abstractNumId="142" w15:restartNumberingAfterBreak="0">
     <w:nsid w:val="77B8201F"/>
     <w:multiLevelType w:val="hybridMultilevel"/>
     <w:tmpl w:val="D7160708"/>
@@ -21878,7 +23477,7 @@
       </w:rPr>
     </w:lvl>
   </w:abstractNum>
-  <w:abstractNum w:abstractNumId="140" w15:restartNumberingAfterBreak="0">
+  <w:abstractNum w:abstractNumId="143" w15:restartNumberingAfterBreak="0">
     <w:nsid w:val="79796FF9"/>
     <w:multiLevelType w:val="hybridMultilevel"/>
     <w:tmpl w:val="CFA8EF82"/>
@@ -21990,7 +23589,7 @@
       </w:rPr>
     </w:lvl>
   </w:abstractNum>
-  <w:abstractNum w:abstractNumId="141" w15:restartNumberingAfterBreak="0">
+  <w:abstractNum w:abstractNumId="144" w15:restartNumberingAfterBreak="0">
     <w:nsid w:val="79910410"/>
     <w:multiLevelType w:val="hybridMultilevel"/>
     <w:tmpl w:val="FC923542"/>
@@ -22102,7 +23701,7 @@
       </w:rPr>
     </w:lvl>
   </w:abstractNum>
-  <w:abstractNum w:abstractNumId="142" w15:restartNumberingAfterBreak="0">
+  <w:abstractNum w:abstractNumId="145" w15:restartNumberingAfterBreak="0">
     <w:nsid w:val="7AFF575A"/>
     <w:multiLevelType w:val="hybridMultilevel"/>
     <w:tmpl w:val="A6323D3E"/>
@@ -22214,7 +23813,7 @@
       </w:rPr>
     </w:lvl>
   </w:abstractNum>
-  <w:abstractNum w:abstractNumId="143" w15:restartNumberingAfterBreak="0">
+  <w:abstractNum w:abstractNumId="146" w15:restartNumberingAfterBreak="0">
     <w:nsid w:val="7B4018BF"/>
     <w:multiLevelType w:val="multilevel"/>
     <w:tmpl w:val="63F4E6F0"/>
@@ -22363,7 +23962,7 @@
       </w:rPr>
     </w:lvl>
   </w:abstractNum>
-  <w:abstractNum w:abstractNumId="144" w15:restartNumberingAfterBreak="0">
+  <w:abstractNum w:abstractNumId="147" w15:restartNumberingAfterBreak="0">
     <w:nsid w:val="7B4D1B33"/>
     <w:multiLevelType w:val="hybridMultilevel"/>
     <w:tmpl w:val="5EAC717E"/>
@@ -22475,7 +24074,7 @@
       </w:rPr>
     </w:lvl>
   </w:abstractNum>
-  <w:abstractNum w:abstractNumId="145" w15:restartNumberingAfterBreak="0">
+  <w:abstractNum w:abstractNumId="148" w15:restartNumberingAfterBreak="0">
     <w:nsid w:val="7CAC27CD"/>
     <w:multiLevelType w:val="multilevel"/>
     <w:tmpl w:val="3BC20E58"/>
@@ -22624,7 +24223,7 @@
       </w:rPr>
     </w:lvl>
   </w:abstractNum>
-  <w:abstractNum w:abstractNumId="146" w15:restartNumberingAfterBreak="0">
+  <w:abstractNum w:abstractNumId="149" w15:restartNumberingAfterBreak="0">
     <w:nsid w:val="7E5978EA"/>
     <w:multiLevelType w:val="hybridMultilevel"/>
     <w:tmpl w:val="D74C0DB0"/>
@@ -22736,7 +24335,7 @@
       </w:rPr>
     </w:lvl>
   </w:abstractNum>
-  <w:abstractNum w:abstractNumId="147" w15:restartNumberingAfterBreak="0">
+  <w:abstractNum w:abstractNumId="150" w15:restartNumberingAfterBreak="0">
     <w:nsid w:val="7F106A5D"/>
     <w:multiLevelType w:val="hybridMultilevel"/>
     <w:tmpl w:val="A1CA4816"/>
@@ -22849,82 +24448,82 @@
     </w:lvl>
   </w:abstractNum>
   <w:num w:numId="1" w16cid:durableId="1882476756">
-    <w:abstractNumId w:val="84"/>
+    <w:abstractNumId w:val="87"/>
   </w:num>
   <w:num w:numId="2" w16cid:durableId="871453468">
-    <w:abstractNumId w:val="23"/>
+    <w:abstractNumId w:val="24"/>
   </w:num>
   <w:num w:numId="3" w16cid:durableId="698706805">
-    <w:abstractNumId w:val="36"/>
+    <w:abstractNumId w:val="38"/>
   </w:num>
   <w:num w:numId="4" w16cid:durableId="1105467722">
-    <w:abstractNumId w:val="69"/>
+    <w:abstractNumId w:val="72"/>
   </w:num>
   <w:num w:numId="5" w16cid:durableId="769932622">
+    <w:abstractNumId w:val="102"/>
+  </w:num>
+  <w:num w:numId="6" w16cid:durableId="575944109">
+    <w:abstractNumId w:val="42"/>
+  </w:num>
+  <w:num w:numId="7" w16cid:durableId="877661689">
+    <w:abstractNumId w:val="135"/>
+  </w:num>
+  <w:num w:numId="8" w16cid:durableId="1390107422">
+    <w:abstractNumId w:val="77"/>
+  </w:num>
+  <w:num w:numId="9" w16cid:durableId="881866424">
     <w:abstractNumId w:val="99"/>
   </w:num>
-  <w:num w:numId="6" w16cid:durableId="575944109">
-    <w:abstractNumId w:val="39"/>
-  </w:num>
-  <w:num w:numId="7" w16cid:durableId="877661689">
-    <w:abstractNumId w:val="132"/>
-  </w:num>
-  <w:num w:numId="8" w16cid:durableId="1390107422">
-    <w:abstractNumId w:val="74"/>
-  </w:num>
-  <w:num w:numId="9" w16cid:durableId="881866424">
-    <w:abstractNumId w:val="96"/>
-  </w:num>
   <w:num w:numId="10" w16cid:durableId="1037244995">
-    <w:abstractNumId w:val="123"/>
+    <w:abstractNumId w:val="126"/>
   </w:num>
   <w:num w:numId="11" w16cid:durableId="1575554597">
-    <w:abstractNumId w:val="59"/>
+    <w:abstractNumId w:val="62"/>
   </w:num>
   <w:num w:numId="12" w16cid:durableId="915364478">
-    <w:abstractNumId w:val="80"/>
+    <w:abstractNumId w:val="83"/>
   </w:num>
   <w:num w:numId="13" w16cid:durableId="1386294114">
-    <w:abstractNumId w:val="114"/>
+    <w:abstractNumId w:val="117"/>
   </w:num>
   <w:num w:numId="14" w16cid:durableId="1071851223">
-    <w:abstractNumId w:val="24"/>
+    <w:abstractNumId w:val="25"/>
   </w:num>
   <w:num w:numId="15" w16cid:durableId="1545557520">
-    <w:abstractNumId w:val="70"/>
+    <w:abstractNumId w:val="73"/>
   </w:num>
   <w:num w:numId="16" w16cid:durableId="1102919547">
-    <w:abstractNumId w:val="145"/>
+    <w:abstractNumId w:val="148"/>
   </w:num>
   <w:num w:numId="17" w16cid:durableId="294526838">
-    <w:abstractNumId w:val="50"/>
+    <w:abstractNumId w:val="53"/>
   </w:num>
   <w:num w:numId="18" w16cid:durableId="679889896">
-    <w:abstractNumId w:val="57"/>
+    <w:abstractNumId w:val="60"/>
   </w:num>
   <w:num w:numId="19" w16cid:durableId="2119449470">
-    <w:abstractNumId w:val="92"/>
+    <w:abstractNumId w:val="95"/>
   </w:num>
   <w:num w:numId="20" w16cid:durableId="1365054799">
+    <w:abstractNumId w:val="14"/>
+  </w:num>
+  <w:num w:numId="21" w16cid:durableId="1683512738">
+    <w:abstractNumId w:val="61"/>
+  </w:num>
+  <w:num w:numId="22" w16cid:durableId="1080098953">
+    <w:abstractNumId w:val="122"/>
+  </w:num>
+  <w:num w:numId="23" w16cid:durableId="1635717296">
+    <w:abstractNumId w:val="66"/>
+  </w:num>
+  <w:num w:numId="24" w16cid:durableId="544873123">
+    <w:abstractNumId w:val="116"/>
+  </w:num>
+  <w:num w:numId="25" w16cid:durableId="1128352778">
     <w:abstractNumId w:val="13"/>
   </w:num>
-  <w:num w:numId="21" w16cid:durableId="1683512738">
-    <w:abstractNumId w:val="58"/>
-  </w:num>
-  <w:num w:numId="22" w16cid:durableId="1080098953">
-    <w:abstractNumId w:val="119"/>
-  </w:num>
-  <w:num w:numId="23" w16cid:durableId="1635717296">
-    <w:abstractNumId w:val="63"/>
-  </w:num>
-  <w:num w:numId="24" w16cid:durableId="544873123">
-    <w:abstractNumId w:val="113"/>
-  </w:num>
-  <w:num w:numId="25" w16cid:durableId="1128352778">
-    <w:abstractNumId w:val="12"/>
-  </w:num>
   <w:num w:numId="26" w16cid:durableId="1732537407">
-    <w:abstractNumId w:val="127"/>
+    <w:abstractNumId w:val="130"/>
   </w:num>
   <w:num w:numId="27" w16cid:durableId="945502064">
     <w:abstractNumId w:val="6"/>
@@ -22933,292 +24532,292 @@
     <w:abstractNumId w:val="3"/>
   </w:num>
   <w:num w:numId="29" w16cid:durableId="815955639">
-    <w:abstractNumId w:val="56"/>
+    <w:abstractNumId w:val="59"/>
   </w:num>
   <w:num w:numId="30" w16cid:durableId="1500659483">
-    <w:abstractNumId w:val="77"/>
+    <w:abstractNumId w:val="80"/>
   </w:num>
   <w:num w:numId="31" w16cid:durableId="118301211">
-    <w:abstractNumId w:val="14"/>
+    <w:abstractNumId w:val="15"/>
   </w:num>
   <w:num w:numId="32" w16cid:durableId="732387979">
-    <w:abstractNumId w:val="40"/>
+    <w:abstractNumId w:val="43"/>
   </w:num>
   <w:num w:numId="33" w16cid:durableId="2129276417">
-    <w:abstractNumId w:val="16"/>
+    <w:abstractNumId w:val="17"/>
   </w:num>
   <w:num w:numId="34" w16cid:durableId="1470708820">
-    <w:abstractNumId w:val="45"/>
+    <w:abstractNumId w:val="48"/>
   </w:num>
   <w:num w:numId="35" w16cid:durableId="356852923">
-    <w:abstractNumId w:val="91"/>
+    <w:abstractNumId w:val="94"/>
   </w:num>
   <w:num w:numId="36" w16cid:durableId="430662559">
-    <w:abstractNumId w:val="19"/>
+    <w:abstractNumId w:val="20"/>
   </w:num>
   <w:num w:numId="37" w16cid:durableId="247080868">
-    <w:abstractNumId w:val="136"/>
+    <w:abstractNumId w:val="139"/>
   </w:num>
   <w:num w:numId="38" w16cid:durableId="158887408">
-    <w:abstractNumId w:val="111"/>
+    <w:abstractNumId w:val="114"/>
   </w:num>
   <w:num w:numId="39" w16cid:durableId="1681347932">
-    <w:abstractNumId w:val="131"/>
+    <w:abstractNumId w:val="134"/>
   </w:num>
   <w:num w:numId="40" w16cid:durableId="2101440158">
-    <w:abstractNumId w:val="73"/>
+    <w:abstractNumId w:val="76"/>
   </w:num>
   <w:num w:numId="41" w16cid:durableId="1250391122">
-    <w:abstractNumId w:val="107"/>
+    <w:abstractNumId w:val="110"/>
   </w:num>
   <w:num w:numId="42" w16cid:durableId="479083359">
-    <w:abstractNumId w:val="135"/>
+    <w:abstractNumId w:val="138"/>
   </w:num>
   <w:num w:numId="43" w16cid:durableId="1557860317">
-    <w:abstractNumId w:val="93"/>
+    <w:abstractNumId w:val="96"/>
   </w:num>
   <w:num w:numId="44" w16cid:durableId="2142183763">
     <w:abstractNumId w:val="8"/>
   </w:num>
   <w:num w:numId="45" w16cid:durableId="1357736349">
-    <w:abstractNumId w:val="141"/>
+    <w:abstractNumId w:val="144"/>
   </w:num>
   <w:num w:numId="46" w16cid:durableId="1519656040">
-    <w:abstractNumId w:val="140"/>
+    <w:abstractNumId w:val="143"/>
   </w:num>
   <w:num w:numId="47" w16cid:durableId="1078596852">
+    <w:abstractNumId w:val="150"/>
+  </w:num>
+  <w:num w:numId="48" w16cid:durableId="1027950100">
+    <w:abstractNumId w:val="35"/>
+  </w:num>
+  <w:num w:numId="49" w16cid:durableId="878516382">
+    <w:abstractNumId w:val="19"/>
+  </w:num>
+  <w:num w:numId="50" w16cid:durableId="363404927">
+    <w:abstractNumId w:val="67"/>
+  </w:num>
+  <w:num w:numId="51" w16cid:durableId="1128354320">
+    <w:abstractNumId w:val="128"/>
+  </w:num>
+  <w:num w:numId="52" w16cid:durableId="248543928">
+    <w:abstractNumId w:val="75"/>
+  </w:num>
+  <w:num w:numId="53" w16cid:durableId="965889214">
+    <w:abstractNumId w:val="100"/>
+  </w:num>
+  <w:num w:numId="54" w16cid:durableId="1827503240">
+    <w:abstractNumId w:val="108"/>
+  </w:num>
+  <w:num w:numId="55" w16cid:durableId="505748256">
+    <w:abstractNumId w:val="91"/>
+  </w:num>
+  <w:num w:numId="56" w16cid:durableId="2120370925">
+    <w:abstractNumId w:val="32"/>
+  </w:num>
+  <w:num w:numId="57" w16cid:durableId="369182267">
+    <w:abstractNumId w:val="16"/>
+  </w:num>
+  <w:num w:numId="58" w16cid:durableId="1000235123">
+    <w:abstractNumId w:val="97"/>
+  </w:num>
+  <w:num w:numId="59" w16cid:durableId="628516409">
+    <w:abstractNumId w:val="127"/>
+  </w:num>
+  <w:num w:numId="60" w16cid:durableId="2028865444">
+    <w:abstractNumId w:val="89"/>
+  </w:num>
+  <w:num w:numId="61" w16cid:durableId="943926811">
     <w:abstractNumId w:val="147"/>
   </w:num>
-  <w:num w:numId="48" w16cid:durableId="1027950100">
-    <w:abstractNumId w:val="33"/>
+  <w:num w:numId="62" w16cid:durableId="1841193257">
+    <w:abstractNumId w:val="69"/>
   </w:num>
-  <w:num w:numId="49" w16cid:durableId="878516382">
-    <w:abstractNumId w:val="18"/>
+  <w:num w:numId="63" w16cid:durableId="682322850">
+    <w:abstractNumId w:val="131"/>
   </w:num>
-  <w:num w:numId="50" w16cid:durableId="363404927">
-    <w:abstractNumId w:val="64"/>
+  <w:num w:numId="64" w16cid:durableId="2043705333">
+    <w:abstractNumId w:val="70"/>
   </w:num>
-  <w:num w:numId="51" w16cid:durableId="1128354320">
-    <w:abstractNumId w:val="125"/>
+  <w:num w:numId="65" w16cid:durableId="1164854761">
+    <w:abstractNumId w:val="52"/>
   </w:num>
-  <w:num w:numId="52" w16cid:durableId="248543928">
-    <w:abstractNumId w:val="72"/>
+  <w:num w:numId="66" w16cid:durableId="1919972541">
+    <w:abstractNumId w:val="85"/>
   </w:num>
-  <w:num w:numId="53" w16cid:durableId="965889214">
-    <w:abstractNumId w:val="97"/>
+  <w:num w:numId="67" w16cid:durableId="463617329">
+    <w:abstractNumId w:val="56"/>
   </w:num>
-  <w:num w:numId="54" w16cid:durableId="1827503240">
-    <w:abstractNumId w:val="105"/>
+  <w:num w:numId="68" w16cid:durableId="2064014330">
+    <w:abstractNumId w:val="104"/>
   </w:num>
-  <w:num w:numId="55" w16cid:durableId="505748256">
-    <w:abstractNumId w:val="88"/>
+  <w:num w:numId="69" w16cid:durableId="452797354">
+    <w:abstractNumId w:val="109"/>
   </w:num>
-  <w:num w:numId="56" w16cid:durableId="2120370925">
+  <w:num w:numId="70" w16cid:durableId="1196650037">
+    <w:abstractNumId w:val="47"/>
+  </w:num>
+  <w:num w:numId="71" w16cid:durableId="940071828">
+    <w:abstractNumId w:val="142"/>
+  </w:num>
+  <w:num w:numId="72" w16cid:durableId="1608273926">
+    <w:abstractNumId w:val="71"/>
+  </w:num>
+  <w:num w:numId="73" w16cid:durableId="2009864772">
+    <w:abstractNumId w:val="86"/>
+  </w:num>
+  <w:num w:numId="74" w16cid:durableId="712267004">
+    <w:abstractNumId w:val="34"/>
+  </w:num>
+  <w:num w:numId="75" w16cid:durableId="506480902">
     <w:abstractNumId w:val="30"/>
   </w:num>
-  <w:num w:numId="57" w16cid:durableId="369182267">
-    <w:abstractNumId w:val="15"/>
-  </w:num>
-  <w:num w:numId="58" w16cid:durableId="1000235123">
-    <w:abstractNumId w:val="94"/>
-  </w:num>
-  <w:num w:numId="59" w16cid:durableId="628516409">
-    <w:abstractNumId w:val="124"/>
-  </w:num>
-  <w:num w:numId="60" w16cid:durableId="2028865444">
-    <w:abstractNumId w:val="86"/>
-  </w:num>
-  <w:num w:numId="61" w16cid:durableId="943926811">
-    <w:abstractNumId w:val="144"/>
-  </w:num>
-  <w:num w:numId="62" w16cid:durableId="1841193257">
-    <w:abstractNumId w:val="66"/>
-  </w:num>
-  <w:num w:numId="63" w16cid:durableId="682322850">
-    <w:abstractNumId w:val="128"/>
-  </w:num>
-  <w:num w:numId="64" w16cid:durableId="2043705333">
-    <w:abstractNumId w:val="67"/>
-  </w:num>
-  <w:num w:numId="65" w16cid:durableId="1164854761">
-    <w:abstractNumId w:val="49"/>
-  </w:num>
-  <w:num w:numId="66" w16cid:durableId="1919972541">
-    <w:abstractNumId w:val="82"/>
-  </w:num>
-  <w:num w:numId="67" w16cid:durableId="463617329">
-    <w:abstractNumId w:val="53"/>
-  </w:num>
-  <w:num w:numId="68" w16cid:durableId="2064014330">
-    <w:abstractNumId w:val="101"/>
-  </w:num>
-  <w:num w:numId="69" w16cid:durableId="452797354">
-    <w:abstractNumId w:val="106"/>
-  </w:num>
-  <w:num w:numId="70" w16cid:durableId="1196650037">
-    <w:abstractNumId w:val="44"/>
-  </w:num>
-  <w:num w:numId="71" w16cid:durableId="940071828">
-    <w:abstractNumId w:val="139"/>
-  </w:num>
-  <w:num w:numId="72" w16cid:durableId="1608273926">
-    <w:abstractNumId w:val="68"/>
-  </w:num>
-  <w:num w:numId="73" w16cid:durableId="2009864772">
-    <w:abstractNumId w:val="83"/>
-  </w:num>
-  <w:num w:numId="74" w16cid:durableId="712267004">
-    <w:abstractNumId w:val="32"/>
-  </w:num>
-  <w:num w:numId="75" w16cid:durableId="506480902">
-    <w:abstractNumId w:val="28"/>
-  </w:num>
   <w:num w:numId="76" w16cid:durableId="286202349">
-    <w:abstractNumId w:val="110"/>
+    <w:abstractNumId w:val="113"/>
   </w:num>
   <w:num w:numId="77" w16cid:durableId="156460757">
-    <w:abstractNumId w:val="60"/>
+    <w:abstractNumId w:val="63"/>
   </w:num>
   <w:num w:numId="78" w16cid:durableId="1230077056">
     <w:abstractNumId w:val="5"/>
   </w:num>
   <w:num w:numId="79" w16cid:durableId="1837106927">
-    <w:abstractNumId w:val="43"/>
+    <w:abstractNumId w:val="46"/>
   </w:num>
   <w:num w:numId="80" w16cid:durableId="287929152">
-    <w:abstractNumId w:val="31"/>
+    <w:abstractNumId w:val="33"/>
   </w:num>
   <w:num w:numId="81" w16cid:durableId="1672175260">
-    <w:abstractNumId w:val="78"/>
+    <w:abstractNumId w:val="81"/>
   </w:num>
   <w:num w:numId="82" w16cid:durableId="1954820163">
-    <w:abstractNumId w:val="52"/>
+    <w:abstractNumId w:val="55"/>
   </w:num>
   <w:num w:numId="83" w16cid:durableId="1990016594">
-    <w:abstractNumId w:val="21"/>
+    <w:abstractNumId w:val="22"/>
   </w:num>
   <w:num w:numId="84" w16cid:durableId="366876741">
-    <w:abstractNumId w:val="85"/>
+    <w:abstractNumId w:val="88"/>
   </w:num>
   <w:num w:numId="85" w16cid:durableId="15274915">
-    <w:abstractNumId w:val="34"/>
+    <w:abstractNumId w:val="36"/>
   </w:num>
   <w:num w:numId="86" w16cid:durableId="288124443">
     <w:abstractNumId w:val="9"/>
   </w:num>
   <w:num w:numId="87" w16cid:durableId="591351385">
-    <w:abstractNumId w:val="98"/>
+    <w:abstractNumId w:val="101"/>
   </w:num>
   <w:num w:numId="88" w16cid:durableId="1361005725">
-    <w:abstractNumId w:val="142"/>
+    <w:abstractNumId w:val="145"/>
   </w:num>
   <w:num w:numId="89" w16cid:durableId="219681743">
     <w:abstractNumId w:val="10"/>
   </w:num>
   <w:num w:numId="90" w16cid:durableId="194386594">
-    <w:abstractNumId w:val="108"/>
+    <w:abstractNumId w:val="111"/>
   </w:num>
   <w:num w:numId="91" w16cid:durableId="777793346">
-    <w:abstractNumId w:val="76"/>
+    <w:abstractNumId w:val="79"/>
   </w:num>
   <w:num w:numId="92" w16cid:durableId="173346871">
-    <w:abstractNumId w:val="81"/>
+    <w:abstractNumId w:val="84"/>
   </w:num>
   <w:num w:numId="93" w16cid:durableId="948700467">
-    <w:abstractNumId w:val="35"/>
+    <w:abstractNumId w:val="37"/>
   </w:num>
   <w:num w:numId="94" w16cid:durableId="1328363750">
-    <w:abstractNumId w:val="20"/>
+    <w:abstractNumId w:val="21"/>
   </w:num>
   <w:num w:numId="95" w16cid:durableId="541676570">
-    <w:abstractNumId w:val="61"/>
+    <w:abstractNumId w:val="64"/>
   </w:num>
   <w:num w:numId="96" w16cid:durableId="694119229">
-    <w:abstractNumId w:val="79"/>
+    <w:abstractNumId w:val="82"/>
   </w:num>
   <w:num w:numId="97" w16cid:durableId="704327987">
-    <w:abstractNumId w:val="47"/>
+    <w:abstractNumId w:val="50"/>
   </w:num>
   <w:num w:numId="98" w16cid:durableId="1157303613">
-    <w:abstractNumId w:val="22"/>
+    <w:abstractNumId w:val="23"/>
   </w:num>
   <w:num w:numId="99" w16cid:durableId="1706099794">
-    <w:abstractNumId w:val="130"/>
+    <w:abstractNumId w:val="133"/>
   </w:num>
   <w:num w:numId="100" w16cid:durableId="256404901">
-    <w:abstractNumId w:val="129"/>
+    <w:abstractNumId w:val="132"/>
   </w:num>
   <w:num w:numId="101" w16cid:durableId="924923012">
-    <w:abstractNumId w:val="26"/>
+    <w:abstractNumId w:val="27"/>
   </w:num>
   <w:num w:numId="102" w16cid:durableId="536550966">
-    <w:abstractNumId w:val="143"/>
+    <w:abstractNumId w:val="146"/>
   </w:num>
   <w:num w:numId="103" w16cid:durableId="425157302">
-    <w:abstractNumId w:val="62"/>
+    <w:abstractNumId w:val="65"/>
   </w:num>
   <w:num w:numId="104" w16cid:durableId="967664612">
-    <w:abstractNumId w:val="116"/>
+    <w:abstractNumId w:val="119"/>
   </w:num>
   <w:num w:numId="105" w16cid:durableId="361631616">
-    <w:abstractNumId w:val="87"/>
+    <w:abstractNumId w:val="90"/>
   </w:num>
   <w:num w:numId="106" w16cid:durableId="443623616">
-    <w:abstractNumId w:val="120"/>
+    <w:abstractNumId w:val="123"/>
   </w:num>
   <w:num w:numId="107" w16cid:durableId="150101619">
     <w:abstractNumId w:val="11"/>
   </w:num>
   <w:num w:numId="108" w16cid:durableId="1431658174">
-    <w:abstractNumId w:val="51"/>
+    <w:abstractNumId w:val="54"/>
   </w:num>
   <w:num w:numId="109" w16cid:durableId="1050495440">
     <w:abstractNumId w:val="0"/>
   </w:num>
   <w:num w:numId="110" w16cid:durableId="712924661">
-    <w:abstractNumId w:val="104"/>
+    <w:abstractNumId w:val="107"/>
   </w:num>
   <w:num w:numId="111" w16cid:durableId="1917784113">
-    <w:abstractNumId w:val="100"/>
+    <w:abstractNumId w:val="103"/>
   </w:num>
   <w:num w:numId="112" w16cid:durableId="896237065">
-    <w:abstractNumId w:val="109"/>
+    <w:abstractNumId w:val="112"/>
   </w:num>
   <w:num w:numId="113" w16cid:durableId="1171681430">
-    <w:abstractNumId w:val="133"/>
+    <w:abstractNumId w:val="136"/>
   </w:num>
   <w:num w:numId="114" w16cid:durableId="1552573199">
-    <w:abstractNumId w:val="134"/>
+    <w:abstractNumId w:val="137"/>
   </w:num>
   <w:num w:numId="115" w16cid:durableId="1920869674">
-    <w:abstractNumId w:val="118"/>
+    <w:abstractNumId w:val="121"/>
   </w:num>
   <w:num w:numId="116" w16cid:durableId="476724716">
-    <w:abstractNumId w:val="90"/>
+    <w:abstractNumId w:val="93"/>
   </w:num>
   <w:num w:numId="117" w16cid:durableId="658919541">
-    <w:abstractNumId w:val="89"/>
+    <w:abstractNumId w:val="92"/>
   </w:num>
   <w:num w:numId="118" w16cid:durableId="1622418131">
-    <w:abstractNumId w:val="41"/>
+    <w:abstractNumId w:val="44"/>
   </w:num>
   <w:num w:numId="119" w16cid:durableId="1693994672">
     <w:abstractNumId w:val="2"/>
   </w:num>
   <w:num w:numId="120" w16cid:durableId="396828229">
-    <w:abstractNumId w:val="138"/>
+    <w:abstractNumId w:val="141"/>
   </w:num>
   <w:num w:numId="121" w16cid:durableId="986058889">
-    <w:abstractNumId w:val="17"/>
+    <w:abstractNumId w:val="18"/>
   </w:num>
   <w:num w:numId="122" w16cid:durableId="1224410703">
-    <w:abstractNumId w:val="55"/>
+    <w:abstractNumId w:val="58"/>
   </w:num>
   <w:num w:numId="123" w16cid:durableId="1804040304">
-    <w:abstractNumId w:val="75"/>
+    <w:abstractNumId w:val="78"/>
   </w:num>
   <w:num w:numId="124" w16cid:durableId="114181197">
-    <w:abstractNumId w:val="137"/>
+    <w:abstractNumId w:val="140"/>
   </w:num>
   <w:num w:numId="125" w16cid:durableId="772671624">
     <w:abstractNumId w:val="4"/>
@@ -23227,70 +24826,79 @@
     <w:abstractNumId w:val="7"/>
   </w:num>
   <w:num w:numId="127" w16cid:durableId="1818105337">
-    <w:abstractNumId w:val="46"/>
+    <w:abstractNumId w:val="49"/>
   </w:num>
   <w:num w:numId="128" w16cid:durableId="384987847">
-    <w:abstractNumId w:val="27"/>
+    <w:abstractNumId w:val="28"/>
   </w:num>
   <w:num w:numId="129" w16cid:durableId="659895420">
-    <w:abstractNumId w:val="54"/>
+    <w:abstractNumId w:val="57"/>
   </w:num>
   <w:num w:numId="130" w16cid:durableId="1168907903">
-    <w:abstractNumId w:val="121"/>
+    <w:abstractNumId w:val="124"/>
   </w:num>
   <w:num w:numId="131" w16cid:durableId="430206235">
-    <w:abstractNumId w:val="112"/>
+    <w:abstractNumId w:val="115"/>
   </w:num>
   <w:num w:numId="132" w16cid:durableId="1207327089">
-    <w:abstractNumId w:val="25"/>
+    <w:abstractNumId w:val="26"/>
   </w:num>
   <w:num w:numId="133" w16cid:durableId="596404292">
-    <w:abstractNumId w:val="102"/>
+    <w:abstractNumId w:val="105"/>
   </w:num>
   <w:num w:numId="134" w16cid:durableId="2070372549">
-    <w:abstractNumId w:val="38"/>
+    <w:abstractNumId w:val="41"/>
   </w:num>
   <w:num w:numId="135" w16cid:durableId="1841265039">
-    <w:abstractNumId w:val="42"/>
+    <w:abstractNumId w:val="45"/>
   </w:num>
   <w:num w:numId="136" w16cid:durableId="1988632595">
-    <w:abstractNumId w:val="37"/>
+    <w:abstractNumId w:val="40"/>
   </w:num>
   <w:num w:numId="137" w16cid:durableId="1218275126">
-    <w:abstractNumId w:val="65"/>
+    <w:abstractNumId w:val="68"/>
   </w:num>
   <w:num w:numId="138" w16cid:durableId="568660900">
-    <w:abstractNumId w:val="71"/>
+    <w:abstractNumId w:val="74"/>
   </w:num>
   <w:num w:numId="139" w16cid:durableId="967976864">
-    <w:abstractNumId w:val="103"/>
+    <w:abstractNumId w:val="106"/>
   </w:num>
   <w:num w:numId="140" w16cid:durableId="650643288">
-    <w:abstractNumId w:val="117"/>
+    <w:abstractNumId w:val="120"/>
   </w:num>
   <w:num w:numId="141" w16cid:durableId="219370247">
-    <w:abstractNumId w:val="115"/>
+    <w:abstractNumId w:val="118"/>
   </w:num>
   <w:num w:numId="142" w16cid:durableId="323239876">
-    <w:abstractNumId w:val="146"/>
+    <w:abstractNumId w:val="149"/>
   </w:num>
   <w:num w:numId="143" w16cid:durableId="1619793156">
-    <w:abstractNumId w:val="29"/>
+    <w:abstractNumId w:val="31"/>
   </w:num>
   <w:num w:numId="144" w16cid:durableId="1186332867">
-    <w:abstractNumId w:val="126"/>
+    <w:abstractNumId w:val="129"/>
   </w:num>
   <w:num w:numId="145" w16cid:durableId="89937035">
-    <w:abstractNumId w:val="48"/>
+    <w:abstractNumId w:val="51"/>
   </w:num>
   <w:num w:numId="146" w16cid:durableId="1975022609">
     <w:abstractNumId w:val="1"/>
   </w:num>
   <w:num w:numId="147" w16cid:durableId="1760910030">
-    <w:abstractNumId w:val="95"/>
+    <w:abstractNumId w:val="98"/>
   </w:num>
   <w:num w:numId="148" w16cid:durableId="349307706">
-    <w:abstractNumId w:val="122"/>
+    <w:abstractNumId w:val="125"/>
+  </w:num>
+  <w:num w:numId="149" w16cid:durableId="1600336622">
+    <w:abstractNumId w:val="29"/>
+  </w:num>
+  <w:num w:numId="150" w16cid:durableId="789783474">
+    <w:abstractNumId w:val="39"/>
+  </w:num>
+  <w:num w:numId="151" w16cid:durableId="1236017784">
+    <w:abstractNumId w:val="12"/>
   </w:num>
 </w:numbering>
 </file>
@@ -24531,15 +26139,15 @@
     <w:uiPriority w:val="35"/>
     <w:unhideWhenUsed/>
     <w:qFormat/>
-    <w:rsid w:val="00926ED4"/>
+    <w:rsid w:val="005F385D"/>
     <w:pPr>
       <w:spacing w:after="200"/>
     </w:pPr>
     <w:rPr>
       <w:i/>
       <w:iCs/>
-      <w:color w:val="44546A" w:themeColor="text2"/>
-      <w:sz w:val="18"/>
+      <w:color w:val="000000" w:themeColor="text1"/>
+      <w:sz w:val="20"/>
       <w:szCs w:val="18"/>
     </w:rPr>
   </w:style>

</xml_diff>

<commit_message>
Core API Specification (#384)
</commit_message>
<xml_diff>
--- a/API Design.docx
+++ b/API Design.docx
@@ -6080,9 +6080,26 @@
     </w:p>
     <w:p>
       <w:r>
-        <w:t>The above mentioned workflow makes sure of the consistency of processing and synchronization of vehicle availability, payment, and customer notifications.</w:t>
+        <w:t xml:space="preserve">The </w:t>
+      </w:r>
+      <w:proofErr w:type="gramStart"/>
+      <w:r>
+        <w:t>above mentioned</w:t>
+      </w:r>
+      <w:proofErr w:type="gramEnd"/>
+      <w:r>
+        <w:t xml:space="preserve"> workflow makes sure of the consistency of processing and synchronization of vehicle availability, payment, and customer notifications.</w:t>
       </w:r>
     </w:p>
+    <w:p>
+      <w:pPr>
+        <w:spacing w:line="278" w:lineRule="auto"/>
+      </w:pPr>
+      <w:r>
+        <w:br w:type="page"/>
+      </w:r>
+    </w:p>
+    <w:p/>
     <w:p/>
     <w:p/>
     <w:p/>

</xml_diff>

<commit_message>
Fleet Management APIs (#390)
</commit_message>
<xml_diff>
--- a/API Design.docx
+++ b/API Design.docx
@@ -6099,9 +6099,1120 @@
         <w:br w:type="page"/>
       </w:r>
     </w:p>
-    <w:p/>
-    <w:p/>
-    <w:p/>
+    <w:p>
+      <w:pPr>
+        <w:pStyle w:val="Heading2"/>
+      </w:pPr>
+      <w:r>
+        <w:lastRenderedPageBreak/>
+        <w:t>Agency Management API Design</w:t>
+      </w:r>
+    </w:p>
+    <w:p>
+      <w:r>
+        <w:t>The Agency Management APIs represent the set of interfaces for agencies managing their operations inside the KriGo system. In contrast to the Customer APIs, whose aim is to discover vehicles and make reservations, the Agency Management APIs are solely aimed at administering agency resources, such as fleet management, reservation management, employee management, and performance tracking. This set of interfaces allows agencies to conduct their operations effectively and, at the same time, keep customer information current and correct.</w:t>
+      </w:r>
+    </w:p>
+    <w:p>
+      <w:pPr>
+        <w:pStyle w:val="Heading3"/>
+      </w:pPr>
+      <w:r>
+        <w:t>Fleet Management APIs</w:t>
+      </w:r>
+    </w:p>
+    <w:p>
+      <w:r>
+        <w:t>The Fleet Management APIs offer all the necessary features for managing the vehicles available through the KriGo platform. The API allows registering new vehicles, managing vehicle details, handling pricing and availability, uploading vehicle pictures, and deleting unavailable for renting vehicles. Being an important part of the platform, the Fleet Management Service makes sure that vehicle information is always correct, relevant, and coordinated with the reservation operations.</w:t>
+      </w:r>
+    </w:p>
+    <w:p>
+      <w:r>
+        <w:t>As part of the RESTful architecture of KriGo, each vehicle is considered as a resource identified with its own unique identifier. All fleet management operations require authentication via JSON Web Tokens (JWT), whereas authorization occurs via the Role-Based Access Control (RBAC) system. Thus, only the employees of the agency can handle the vehicles of their agency, while admins have more permissions for moderation.</w:t>
+      </w:r>
+    </w:p>
+    <w:p>
+      <w:r>
+        <w:t>In order to make sure that there are no conflicts in the system, the Fleet Management Service works together with the Reservation Service in order not to alter the reservation operations. Additionally, it works with the Notification and Analytics services in order to keep the inventory up-to-date and update the reports respectively.</w:t>
+      </w:r>
+    </w:p>
+    <w:p>
+      <w:pPr>
+        <w:pStyle w:val="Title"/>
+      </w:pPr>
+      <w:r>
+        <w:t>Fleet Management API Endpoints</w:t>
+      </w:r>
+    </w:p>
+    <w:p>
+      <w:pPr>
+        <w:pStyle w:val="Caption"/>
+        <w:keepNext/>
+      </w:pPr>
+      <w:r>
+        <w:t xml:space="preserve">Table </w:t>
+      </w:r>
+      <w:r>
+        <w:fldChar w:fldCharType="begin"/>
+      </w:r>
+      <w:r>
+        <w:instrText xml:space="preserve"> SEQ Table \* ARABIC </w:instrText>
+      </w:r>
+      <w:r>
+        <w:fldChar w:fldCharType="separate"/>
+      </w:r>
+      <w:r>
+        <w:rPr>
+          <w:noProof/>
+        </w:rPr>
+        <w:t>7</w:t>
+      </w:r>
+      <w:r>
+        <w:fldChar w:fldCharType="end"/>
+      </w:r>
+      <w:r>
+        <w:t xml:space="preserve"> - </w:t>
+      </w:r>
+      <w:r>
+        <w:t>Fleet Management API Endpoints</w:t>
+      </w:r>
+    </w:p>
+    <w:tbl>
+      <w:tblPr>
+        <w:tblStyle w:val="PlainTable1"/>
+        <w:tblW w:w="0" w:type="auto"/>
+        <w:tblLayout w:type="fixed"/>
+        <w:tblCellMar>
+          <w:top w:w="72" w:type="dxa"/>
+          <w:bottom w:w="72" w:type="dxa"/>
+        </w:tblCellMar>
+        <w:tblLook w:val="04A0" w:firstRow="1" w:lastRow="0" w:firstColumn="1" w:lastColumn="0" w:noHBand="0" w:noVBand="1"/>
+      </w:tblPr>
+      <w:tblGrid>
+        <w:gridCol w:w="3505"/>
+        <w:gridCol w:w="1168"/>
+        <w:gridCol w:w="3422"/>
+        <w:gridCol w:w="1252"/>
+      </w:tblGrid>
+      <w:tr>
+        <w:trPr>
+          <w:cnfStyle w:val="100000000000" w:firstRow="1" w:lastRow="0" w:firstColumn="0" w:lastColumn="0" w:oddVBand="0" w:evenVBand="0" w:oddHBand="0" w:evenHBand="0" w:firstRowFirstColumn="0" w:firstRowLastColumn="0" w:lastRowFirstColumn="0" w:lastRowLastColumn="0"/>
+          <w:tblHeader/>
+        </w:trPr>
+        <w:tc>
+          <w:tcPr>
+            <w:cnfStyle w:val="001000000000" w:firstRow="0" w:lastRow="0" w:firstColumn="1" w:lastColumn="0" w:oddVBand="0" w:evenVBand="0" w:oddHBand="0" w:evenHBand="0" w:firstRowFirstColumn="0" w:firstRowLastColumn="0" w:lastRowFirstColumn="0" w:lastRowLastColumn="0"/>
+            <w:tcW w:w="3505" w:type="dxa"/>
+            <w:vAlign w:val="center"/>
+            <w:hideMark/>
+          </w:tcPr>
+          <w:p>
+            <w:r>
+              <w:t>Endpoint</w:t>
+            </w:r>
+          </w:p>
+        </w:tc>
+        <w:tc>
+          <w:tcPr>
+            <w:tcW w:w="1168" w:type="dxa"/>
+            <w:vAlign w:val="center"/>
+            <w:hideMark/>
+          </w:tcPr>
+          <w:p>
+            <w:pPr>
+              <w:jc w:val="center"/>
+              <w:cnfStyle w:val="100000000000" w:firstRow="1" w:lastRow="0" w:firstColumn="0" w:lastColumn="0" w:oddVBand="0" w:evenVBand="0" w:oddHBand="0" w:evenHBand="0" w:firstRowFirstColumn="0" w:firstRowLastColumn="0" w:lastRowFirstColumn="0" w:lastRowLastColumn="0"/>
+            </w:pPr>
+            <w:r>
+              <w:t>Method</w:t>
+            </w:r>
+          </w:p>
+        </w:tc>
+        <w:tc>
+          <w:tcPr>
+            <w:tcW w:w="3422" w:type="dxa"/>
+            <w:vAlign w:val="center"/>
+            <w:hideMark/>
+          </w:tcPr>
+          <w:p>
+            <w:pPr>
+              <w:cnfStyle w:val="100000000000" w:firstRow="1" w:lastRow="0" w:firstColumn="0" w:lastColumn="0" w:oddVBand="0" w:evenVBand="0" w:oddHBand="0" w:evenHBand="0" w:firstRowFirstColumn="0" w:firstRowLastColumn="0" w:lastRowFirstColumn="0" w:lastRowLastColumn="0"/>
+            </w:pPr>
+            <w:r>
+              <w:t>Description</w:t>
+            </w:r>
+          </w:p>
+        </w:tc>
+        <w:tc>
+          <w:tcPr>
+            <w:tcW w:w="1252" w:type="dxa"/>
+            <w:vAlign w:val="center"/>
+            <w:hideMark/>
+          </w:tcPr>
+          <w:p>
+            <w:pPr>
+              <w:jc w:val="center"/>
+              <w:cnfStyle w:val="100000000000" w:firstRow="1" w:lastRow="0" w:firstColumn="0" w:lastColumn="0" w:oddVBand="0" w:evenVBand="0" w:oddHBand="0" w:evenHBand="0" w:firstRowFirstColumn="0" w:firstRowLastColumn="0" w:lastRowFirstColumn="0" w:lastRowLastColumn="0"/>
+            </w:pPr>
+            <w:r>
+              <w:t>Auth Required</w:t>
+            </w:r>
+          </w:p>
+        </w:tc>
+      </w:tr>
+      <w:tr>
+        <w:trPr>
+          <w:cnfStyle w:val="000000100000" w:firstRow="0" w:lastRow="0" w:firstColumn="0" w:lastColumn="0" w:oddVBand="0" w:evenVBand="0" w:oddHBand="1" w:evenHBand="0" w:firstRowFirstColumn="0" w:firstRowLastColumn="0" w:lastRowFirstColumn="0" w:lastRowLastColumn="0"/>
+        </w:trPr>
+        <w:tc>
+          <w:tcPr>
+            <w:cnfStyle w:val="001000000000" w:firstRow="0" w:lastRow="0" w:firstColumn="1" w:lastColumn="0" w:oddVBand="0" w:evenVBand="0" w:oddHBand="0" w:evenHBand="0" w:firstRowFirstColumn="0" w:firstRowLastColumn="0" w:lastRowFirstColumn="0" w:lastRowLastColumn="0"/>
+            <w:tcW w:w="3505" w:type="dxa"/>
+            <w:vAlign w:val="center"/>
+            <w:hideMark/>
+          </w:tcPr>
+          <w:p>
+            <w:pPr>
+              <w:rPr>
+                <w:b w:val="0"/>
+                <w:bCs w:val="0"/>
+              </w:rPr>
+            </w:pPr>
+            <w:r>
+              <w:rPr>
+                <w:b w:val="0"/>
+                <w:bCs w:val="0"/>
+              </w:rPr>
+              <w:t>/api/v1/fleet/vehicles</w:t>
+            </w:r>
+          </w:p>
+        </w:tc>
+        <w:tc>
+          <w:tcPr>
+            <w:tcW w:w="1168" w:type="dxa"/>
+            <w:vAlign w:val="center"/>
+            <w:hideMark/>
+          </w:tcPr>
+          <w:p>
+            <w:pPr>
+              <w:jc w:val="center"/>
+              <w:cnfStyle w:val="000000100000" w:firstRow="0" w:lastRow="0" w:firstColumn="0" w:lastColumn="0" w:oddVBand="0" w:evenVBand="0" w:oddHBand="1" w:evenHBand="0" w:firstRowFirstColumn="0" w:firstRowLastColumn="0" w:lastRowFirstColumn="0" w:lastRowLastColumn="0"/>
+            </w:pPr>
+            <w:r>
+              <w:t>POST</w:t>
+            </w:r>
+          </w:p>
+        </w:tc>
+        <w:tc>
+          <w:tcPr>
+            <w:tcW w:w="3422" w:type="dxa"/>
+            <w:vAlign w:val="center"/>
+            <w:hideMark/>
+          </w:tcPr>
+          <w:p>
+            <w:pPr>
+              <w:cnfStyle w:val="000000100000" w:firstRow="0" w:lastRow="0" w:firstColumn="0" w:lastColumn="0" w:oddVBand="0" w:evenVBand="0" w:oddHBand="1" w:evenHBand="0" w:firstRowFirstColumn="0" w:firstRowLastColumn="0" w:lastRowFirstColumn="0" w:lastRowLastColumn="0"/>
+            </w:pPr>
+            <w:r>
+              <w:t>Register a new vehicle</w:t>
+            </w:r>
+          </w:p>
+        </w:tc>
+        <w:tc>
+          <w:tcPr>
+            <w:tcW w:w="1252" w:type="dxa"/>
+            <w:vAlign w:val="center"/>
+            <w:hideMark/>
+          </w:tcPr>
+          <w:p>
+            <w:pPr>
+              <w:jc w:val="center"/>
+              <w:cnfStyle w:val="000000100000" w:firstRow="0" w:lastRow="0" w:firstColumn="0" w:lastColumn="0" w:oddVBand="0" w:evenVBand="0" w:oddHBand="1" w:evenHBand="0" w:firstRowFirstColumn="0" w:firstRowLastColumn="0" w:lastRowFirstColumn="0" w:lastRowLastColumn="0"/>
+            </w:pPr>
+            <w:r>
+              <w:t>Yes</w:t>
+            </w:r>
+          </w:p>
+        </w:tc>
+      </w:tr>
+      <w:tr>
+        <w:tc>
+          <w:tcPr>
+            <w:cnfStyle w:val="001000000000" w:firstRow="0" w:lastRow="0" w:firstColumn="1" w:lastColumn="0" w:oddVBand="0" w:evenVBand="0" w:oddHBand="0" w:evenHBand="0" w:firstRowFirstColumn="0" w:firstRowLastColumn="0" w:lastRowFirstColumn="0" w:lastRowLastColumn="0"/>
+            <w:tcW w:w="3505" w:type="dxa"/>
+            <w:vAlign w:val="center"/>
+            <w:hideMark/>
+          </w:tcPr>
+          <w:p>
+            <w:pPr>
+              <w:rPr>
+                <w:b w:val="0"/>
+                <w:bCs w:val="0"/>
+              </w:rPr>
+            </w:pPr>
+            <w:r>
+              <w:rPr>
+                <w:b w:val="0"/>
+                <w:bCs w:val="0"/>
+              </w:rPr>
+              <w:t>/api/v1/fleet/vehicles</w:t>
+            </w:r>
+          </w:p>
+        </w:tc>
+        <w:tc>
+          <w:tcPr>
+            <w:tcW w:w="1168" w:type="dxa"/>
+            <w:vAlign w:val="center"/>
+            <w:hideMark/>
+          </w:tcPr>
+          <w:p>
+            <w:pPr>
+              <w:jc w:val="center"/>
+              <w:cnfStyle w:val="000000000000" w:firstRow="0" w:lastRow="0" w:firstColumn="0" w:lastColumn="0" w:oddVBand="0" w:evenVBand="0" w:oddHBand="0" w:evenHBand="0" w:firstRowFirstColumn="0" w:firstRowLastColumn="0" w:lastRowFirstColumn="0" w:lastRowLastColumn="0"/>
+            </w:pPr>
+            <w:r>
+              <w:t>GET</w:t>
+            </w:r>
+          </w:p>
+        </w:tc>
+        <w:tc>
+          <w:tcPr>
+            <w:tcW w:w="3422" w:type="dxa"/>
+            <w:vAlign w:val="center"/>
+            <w:hideMark/>
+          </w:tcPr>
+          <w:p>
+            <w:pPr>
+              <w:cnfStyle w:val="000000000000" w:firstRow="0" w:lastRow="0" w:firstColumn="0" w:lastColumn="0" w:oddVBand="0" w:evenVBand="0" w:oddHBand="0" w:evenHBand="0" w:firstRowFirstColumn="0" w:firstRowLastColumn="0" w:lastRowFirstColumn="0" w:lastRowLastColumn="0"/>
+            </w:pPr>
+            <w:r>
+              <w:t>Retrieve all vehicles belonging to the authenticated agency</w:t>
+            </w:r>
+          </w:p>
+        </w:tc>
+        <w:tc>
+          <w:tcPr>
+            <w:tcW w:w="1252" w:type="dxa"/>
+            <w:vAlign w:val="center"/>
+            <w:hideMark/>
+          </w:tcPr>
+          <w:p>
+            <w:pPr>
+              <w:jc w:val="center"/>
+              <w:cnfStyle w:val="000000000000" w:firstRow="0" w:lastRow="0" w:firstColumn="0" w:lastColumn="0" w:oddVBand="0" w:evenVBand="0" w:oddHBand="0" w:evenHBand="0" w:firstRowFirstColumn="0" w:firstRowLastColumn="0" w:lastRowFirstColumn="0" w:lastRowLastColumn="0"/>
+            </w:pPr>
+            <w:r>
+              <w:t>Yes</w:t>
+            </w:r>
+          </w:p>
+        </w:tc>
+      </w:tr>
+      <w:tr>
+        <w:trPr>
+          <w:cnfStyle w:val="000000100000" w:firstRow="0" w:lastRow="0" w:firstColumn="0" w:lastColumn="0" w:oddVBand="0" w:evenVBand="0" w:oddHBand="1" w:evenHBand="0" w:firstRowFirstColumn="0" w:firstRowLastColumn="0" w:lastRowFirstColumn="0" w:lastRowLastColumn="0"/>
+        </w:trPr>
+        <w:tc>
+          <w:tcPr>
+            <w:cnfStyle w:val="001000000000" w:firstRow="0" w:lastRow="0" w:firstColumn="1" w:lastColumn="0" w:oddVBand="0" w:evenVBand="0" w:oddHBand="0" w:evenHBand="0" w:firstRowFirstColumn="0" w:firstRowLastColumn="0" w:lastRowFirstColumn="0" w:lastRowLastColumn="0"/>
+            <w:tcW w:w="3505" w:type="dxa"/>
+            <w:vAlign w:val="center"/>
+            <w:hideMark/>
+          </w:tcPr>
+          <w:p>
+            <w:pPr>
+              <w:rPr>
+                <w:b w:val="0"/>
+                <w:bCs w:val="0"/>
+              </w:rPr>
+            </w:pPr>
+            <w:r>
+              <w:rPr>
+                <w:b w:val="0"/>
+                <w:bCs w:val="0"/>
+              </w:rPr>
+              <w:t>/api/v1/fleet/vehicles/{vehicleId}</w:t>
+            </w:r>
+          </w:p>
+        </w:tc>
+        <w:tc>
+          <w:tcPr>
+            <w:tcW w:w="1168" w:type="dxa"/>
+            <w:vAlign w:val="center"/>
+            <w:hideMark/>
+          </w:tcPr>
+          <w:p>
+            <w:pPr>
+              <w:jc w:val="center"/>
+              <w:cnfStyle w:val="000000100000" w:firstRow="0" w:lastRow="0" w:firstColumn="0" w:lastColumn="0" w:oddVBand="0" w:evenVBand="0" w:oddHBand="1" w:evenHBand="0" w:firstRowFirstColumn="0" w:firstRowLastColumn="0" w:lastRowFirstColumn="0" w:lastRowLastColumn="0"/>
+            </w:pPr>
+            <w:r>
+              <w:t>GET</w:t>
+            </w:r>
+          </w:p>
+        </w:tc>
+        <w:tc>
+          <w:tcPr>
+            <w:tcW w:w="3422" w:type="dxa"/>
+            <w:vAlign w:val="center"/>
+            <w:hideMark/>
+          </w:tcPr>
+          <w:p>
+            <w:pPr>
+              <w:cnfStyle w:val="000000100000" w:firstRow="0" w:lastRow="0" w:firstColumn="0" w:lastColumn="0" w:oddVBand="0" w:evenVBand="0" w:oddHBand="1" w:evenHBand="0" w:firstRowFirstColumn="0" w:firstRowLastColumn="0" w:lastRowFirstColumn="0" w:lastRowLastColumn="0"/>
+            </w:pPr>
+            <w:r>
+              <w:t>Retrieve detailed vehicle information</w:t>
+            </w:r>
+          </w:p>
+        </w:tc>
+        <w:tc>
+          <w:tcPr>
+            <w:tcW w:w="1252" w:type="dxa"/>
+            <w:vAlign w:val="center"/>
+            <w:hideMark/>
+          </w:tcPr>
+          <w:p>
+            <w:pPr>
+              <w:jc w:val="center"/>
+              <w:cnfStyle w:val="000000100000" w:firstRow="0" w:lastRow="0" w:firstColumn="0" w:lastColumn="0" w:oddVBand="0" w:evenVBand="0" w:oddHBand="1" w:evenHBand="0" w:firstRowFirstColumn="0" w:firstRowLastColumn="0" w:lastRowFirstColumn="0" w:lastRowLastColumn="0"/>
+            </w:pPr>
+            <w:r>
+              <w:t>Yes</w:t>
+            </w:r>
+          </w:p>
+        </w:tc>
+      </w:tr>
+      <w:tr>
+        <w:tc>
+          <w:tcPr>
+            <w:cnfStyle w:val="001000000000" w:firstRow="0" w:lastRow="0" w:firstColumn="1" w:lastColumn="0" w:oddVBand="0" w:evenVBand="0" w:oddHBand="0" w:evenHBand="0" w:firstRowFirstColumn="0" w:firstRowLastColumn="0" w:lastRowFirstColumn="0" w:lastRowLastColumn="0"/>
+            <w:tcW w:w="3505" w:type="dxa"/>
+            <w:vAlign w:val="center"/>
+            <w:hideMark/>
+          </w:tcPr>
+          <w:p>
+            <w:pPr>
+              <w:rPr>
+                <w:b w:val="0"/>
+                <w:bCs w:val="0"/>
+              </w:rPr>
+            </w:pPr>
+            <w:r>
+              <w:rPr>
+                <w:b w:val="0"/>
+                <w:bCs w:val="0"/>
+              </w:rPr>
+              <w:t>/api/v1/fleet/vehicles/{vehicleId}</w:t>
+            </w:r>
+          </w:p>
+        </w:tc>
+        <w:tc>
+          <w:tcPr>
+            <w:tcW w:w="1168" w:type="dxa"/>
+            <w:vAlign w:val="center"/>
+            <w:hideMark/>
+          </w:tcPr>
+          <w:p>
+            <w:pPr>
+              <w:jc w:val="center"/>
+              <w:cnfStyle w:val="000000000000" w:firstRow="0" w:lastRow="0" w:firstColumn="0" w:lastColumn="0" w:oddVBand="0" w:evenVBand="0" w:oddHBand="0" w:evenHBand="0" w:firstRowFirstColumn="0" w:firstRowLastColumn="0" w:lastRowFirstColumn="0" w:lastRowLastColumn="0"/>
+            </w:pPr>
+            <w:r>
+              <w:t>PUT</w:t>
+            </w:r>
+          </w:p>
+        </w:tc>
+        <w:tc>
+          <w:tcPr>
+            <w:tcW w:w="3422" w:type="dxa"/>
+            <w:vAlign w:val="center"/>
+            <w:hideMark/>
+          </w:tcPr>
+          <w:p>
+            <w:pPr>
+              <w:cnfStyle w:val="000000000000" w:firstRow="0" w:lastRow="0" w:firstColumn="0" w:lastColumn="0" w:oddVBand="0" w:evenVBand="0" w:oddHBand="0" w:evenHBand="0" w:firstRowFirstColumn="0" w:firstRowLastColumn="0" w:lastRowFirstColumn="0" w:lastRowLastColumn="0"/>
+            </w:pPr>
+            <w:r>
+              <w:t>Update vehicle information</w:t>
+            </w:r>
+          </w:p>
+        </w:tc>
+        <w:tc>
+          <w:tcPr>
+            <w:tcW w:w="1252" w:type="dxa"/>
+            <w:vAlign w:val="center"/>
+            <w:hideMark/>
+          </w:tcPr>
+          <w:p>
+            <w:pPr>
+              <w:jc w:val="center"/>
+              <w:cnfStyle w:val="000000000000" w:firstRow="0" w:lastRow="0" w:firstColumn="0" w:lastColumn="0" w:oddVBand="0" w:evenVBand="0" w:oddHBand="0" w:evenHBand="0" w:firstRowFirstColumn="0" w:firstRowLastColumn="0" w:lastRowFirstColumn="0" w:lastRowLastColumn="0"/>
+            </w:pPr>
+            <w:r>
+              <w:t>Yes</w:t>
+            </w:r>
+          </w:p>
+        </w:tc>
+      </w:tr>
+      <w:tr>
+        <w:trPr>
+          <w:cnfStyle w:val="000000100000" w:firstRow="0" w:lastRow="0" w:firstColumn="0" w:lastColumn="0" w:oddVBand="0" w:evenVBand="0" w:oddHBand="1" w:evenHBand="0" w:firstRowFirstColumn="0" w:firstRowLastColumn="0" w:lastRowFirstColumn="0" w:lastRowLastColumn="0"/>
+        </w:trPr>
+        <w:tc>
+          <w:tcPr>
+            <w:cnfStyle w:val="001000000000" w:firstRow="0" w:lastRow="0" w:firstColumn="1" w:lastColumn="0" w:oddVBand="0" w:evenVBand="0" w:oddHBand="0" w:evenHBand="0" w:firstRowFirstColumn="0" w:firstRowLastColumn="0" w:lastRowFirstColumn="0" w:lastRowLastColumn="0"/>
+            <w:tcW w:w="3505" w:type="dxa"/>
+            <w:vAlign w:val="center"/>
+            <w:hideMark/>
+          </w:tcPr>
+          <w:p>
+            <w:pPr>
+              <w:rPr>
+                <w:b w:val="0"/>
+                <w:bCs w:val="0"/>
+              </w:rPr>
+            </w:pPr>
+            <w:r>
+              <w:rPr>
+                <w:b w:val="0"/>
+                <w:bCs w:val="0"/>
+              </w:rPr>
+              <w:t>/api/v1/fleet/vehicles/{vehicleId}</w:t>
+            </w:r>
+          </w:p>
+        </w:tc>
+        <w:tc>
+          <w:tcPr>
+            <w:tcW w:w="1168" w:type="dxa"/>
+            <w:vAlign w:val="center"/>
+            <w:hideMark/>
+          </w:tcPr>
+          <w:p>
+            <w:pPr>
+              <w:jc w:val="center"/>
+              <w:cnfStyle w:val="000000100000" w:firstRow="0" w:lastRow="0" w:firstColumn="0" w:lastColumn="0" w:oddVBand="0" w:evenVBand="0" w:oddHBand="1" w:evenHBand="0" w:firstRowFirstColumn="0" w:firstRowLastColumn="0" w:lastRowFirstColumn="0" w:lastRowLastColumn="0"/>
+            </w:pPr>
+            <w:r>
+              <w:t>DELETE</w:t>
+            </w:r>
+          </w:p>
+        </w:tc>
+        <w:tc>
+          <w:tcPr>
+            <w:tcW w:w="3422" w:type="dxa"/>
+            <w:vAlign w:val="center"/>
+            <w:hideMark/>
+          </w:tcPr>
+          <w:p>
+            <w:pPr>
+              <w:cnfStyle w:val="000000100000" w:firstRow="0" w:lastRow="0" w:firstColumn="0" w:lastColumn="0" w:oddVBand="0" w:evenVBand="0" w:oddHBand="1" w:evenHBand="0" w:firstRowFirstColumn="0" w:firstRowLastColumn="0" w:lastRowFirstColumn="0" w:lastRowLastColumn="0"/>
+            </w:pPr>
+            <w:r>
+              <w:t>Remove a vehicle from the fleet</w:t>
+            </w:r>
+          </w:p>
+        </w:tc>
+        <w:tc>
+          <w:tcPr>
+            <w:tcW w:w="1252" w:type="dxa"/>
+            <w:vAlign w:val="center"/>
+            <w:hideMark/>
+          </w:tcPr>
+          <w:p>
+            <w:pPr>
+              <w:jc w:val="center"/>
+              <w:cnfStyle w:val="000000100000" w:firstRow="0" w:lastRow="0" w:firstColumn="0" w:lastColumn="0" w:oddVBand="0" w:evenVBand="0" w:oddHBand="1" w:evenHBand="0" w:firstRowFirstColumn="0" w:firstRowLastColumn="0" w:lastRowFirstColumn="0" w:lastRowLastColumn="0"/>
+            </w:pPr>
+            <w:r>
+              <w:t>Yes</w:t>
+            </w:r>
+          </w:p>
+        </w:tc>
+      </w:tr>
+      <w:tr>
+        <w:tc>
+          <w:tcPr>
+            <w:cnfStyle w:val="001000000000" w:firstRow="0" w:lastRow="0" w:firstColumn="1" w:lastColumn="0" w:oddVBand="0" w:evenVBand="0" w:oddHBand="0" w:evenHBand="0" w:firstRowFirstColumn="0" w:firstRowLastColumn="0" w:lastRowFirstColumn="0" w:lastRowLastColumn="0"/>
+            <w:tcW w:w="3505" w:type="dxa"/>
+            <w:vAlign w:val="center"/>
+            <w:hideMark/>
+          </w:tcPr>
+          <w:p>
+            <w:pPr>
+              <w:rPr>
+                <w:b w:val="0"/>
+                <w:bCs w:val="0"/>
+              </w:rPr>
+            </w:pPr>
+            <w:r>
+              <w:rPr>
+                <w:b w:val="0"/>
+                <w:bCs w:val="0"/>
+              </w:rPr>
+              <w:t>/api/v1/fleet/vehicles/{vehicleId}/availability</w:t>
+            </w:r>
+          </w:p>
+        </w:tc>
+        <w:tc>
+          <w:tcPr>
+            <w:tcW w:w="1168" w:type="dxa"/>
+            <w:vAlign w:val="center"/>
+            <w:hideMark/>
+          </w:tcPr>
+          <w:p>
+            <w:pPr>
+              <w:jc w:val="center"/>
+              <w:cnfStyle w:val="000000000000" w:firstRow="0" w:lastRow="0" w:firstColumn="0" w:lastColumn="0" w:oddVBand="0" w:evenVBand="0" w:oddHBand="0" w:evenHBand="0" w:firstRowFirstColumn="0" w:firstRowLastColumn="0" w:lastRowFirstColumn="0" w:lastRowLastColumn="0"/>
+            </w:pPr>
+            <w:r>
+              <w:t>PATCH</w:t>
+            </w:r>
+          </w:p>
+        </w:tc>
+        <w:tc>
+          <w:tcPr>
+            <w:tcW w:w="3422" w:type="dxa"/>
+            <w:vAlign w:val="center"/>
+            <w:hideMark/>
+          </w:tcPr>
+          <w:p>
+            <w:pPr>
+              <w:cnfStyle w:val="000000000000" w:firstRow="0" w:lastRow="0" w:firstColumn="0" w:lastColumn="0" w:oddVBand="0" w:evenVBand="0" w:oddHBand="0" w:evenHBand="0" w:firstRowFirstColumn="0" w:firstRowLastColumn="0" w:lastRowFirstColumn="0" w:lastRowLastColumn="0"/>
+            </w:pPr>
+            <w:r>
+              <w:t>Update vehicle availability status</w:t>
+            </w:r>
+          </w:p>
+        </w:tc>
+        <w:tc>
+          <w:tcPr>
+            <w:tcW w:w="1252" w:type="dxa"/>
+            <w:vAlign w:val="center"/>
+            <w:hideMark/>
+          </w:tcPr>
+          <w:p>
+            <w:pPr>
+              <w:jc w:val="center"/>
+              <w:cnfStyle w:val="000000000000" w:firstRow="0" w:lastRow="0" w:firstColumn="0" w:lastColumn="0" w:oddVBand="0" w:evenVBand="0" w:oddHBand="0" w:evenHBand="0" w:firstRowFirstColumn="0" w:firstRowLastColumn="0" w:lastRowFirstColumn="0" w:lastRowLastColumn="0"/>
+            </w:pPr>
+            <w:r>
+              <w:t>Yes</w:t>
+            </w:r>
+          </w:p>
+        </w:tc>
+      </w:tr>
+      <w:tr>
+        <w:trPr>
+          <w:cnfStyle w:val="000000100000" w:firstRow="0" w:lastRow="0" w:firstColumn="0" w:lastColumn="0" w:oddVBand="0" w:evenVBand="0" w:oddHBand="1" w:evenHBand="0" w:firstRowFirstColumn="0" w:firstRowLastColumn="0" w:lastRowFirstColumn="0" w:lastRowLastColumn="0"/>
+        </w:trPr>
+        <w:tc>
+          <w:tcPr>
+            <w:cnfStyle w:val="001000000000" w:firstRow="0" w:lastRow="0" w:firstColumn="1" w:lastColumn="0" w:oddVBand="0" w:evenVBand="0" w:oddHBand="0" w:evenHBand="0" w:firstRowFirstColumn="0" w:firstRowLastColumn="0" w:lastRowFirstColumn="0" w:lastRowLastColumn="0"/>
+            <w:tcW w:w="3505" w:type="dxa"/>
+            <w:vAlign w:val="center"/>
+            <w:hideMark/>
+          </w:tcPr>
+          <w:p>
+            <w:pPr>
+              <w:rPr>
+                <w:b w:val="0"/>
+                <w:bCs w:val="0"/>
+              </w:rPr>
+            </w:pPr>
+            <w:r>
+              <w:rPr>
+                <w:b w:val="0"/>
+                <w:bCs w:val="0"/>
+              </w:rPr>
+              <w:t>/api/v1/fleet/vehicles/{vehicleId}/price</w:t>
+            </w:r>
+          </w:p>
+        </w:tc>
+        <w:tc>
+          <w:tcPr>
+            <w:tcW w:w="1168" w:type="dxa"/>
+            <w:vAlign w:val="center"/>
+            <w:hideMark/>
+          </w:tcPr>
+          <w:p>
+            <w:pPr>
+              <w:jc w:val="center"/>
+              <w:cnfStyle w:val="000000100000" w:firstRow="0" w:lastRow="0" w:firstColumn="0" w:lastColumn="0" w:oddVBand="0" w:evenVBand="0" w:oddHBand="1" w:evenHBand="0" w:firstRowFirstColumn="0" w:firstRowLastColumn="0" w:lastRowFirstColumn="0" w:lastRowLastColumn="0"/>
+            </w:pPr>
+            <w:r>
+              <w:t>PATCH</w:t>
+            </w:r>
+          </w:p>
+        </w:tc>
+        <w:tc>
+          <w:tcPr>
+            <w:tcW w:w="3422" w:type="dxa"/>
+            <w:vAlign w:val="center"/>
+            <w:hideMark/>
+          </w:tcPr>
+          <w:p>
+            <w:pPr>
+              <w:cnfStyle w:val="000000100000" w:firstRow="0" w:lastRow="0" w:firstColumn="0" w:lastColumn="0" w:oddVBand="0" w:evenVBand="0" w:oddHBand="1" w:evenHBand="0" w:firstRowFirstColumn="0" w:firstRowLastColumn="0" w:lastRowFirstColumn="0" w:lastRowLastColumn="0"/>
+            </w:pPr>
+            <w:r>
+              <w:t>Update rental pricing</w:t>
+            </w:r>
+          </w:p>
+        </w:tc>
+        <w:tc>
+          <w:tcPr>
+            <w:tcW w:w="1252" w:type="dxa"/>
+            <w:vAlign w:val="center"/>
+            <w:hideMark/>
+          </w:tcPr>
+          <w:p>
+            <w:pPr>
+              <w:jc w:val="center"/>
+              <w:cnfStyle w:val="000000100000" w:firstRow="0" w:lastRow="0" w:firstColumn="0" w:lastColumn="0" w:oddVBand="0" w:evenVBand="0" w:oddHBand="1" w:evenHBand="0" w:firstRowFirstColumn="0" w:firstRowLastColumn="0" w:lastRowFirstColumn="0" w:lastRowLastColumn="0"/>
+            </w:pPr>
+            <w:r>
+              <w:t>Yes</w:t>
+            </w:r>
+          </w:p>
+        </w:tc>
+      </w:tr>
+      <w:tr>
+        <w:tc>
+          <w:tcPr>
+            <w:cnfStyle w:val="001000000000" w:firstRow="0" w:lastRow="0" w:firstColumn="1" w:lastColumn="0" w:oddVBand="0" w:evenVBand="0" w:oddHBand="0" w:evenHBand="0" w:firstRowFirstColumn="0" w:firstRowLastColumn="0" w:lastRowFirstColumn="0" w:lastRowLastColumn="0"/>
+            <w:tcW w:w="3505" w:type="dxa"/>
+            <w:vAlign w:val="center"/>
+            <w:hideMark/>
+          </w:tcPr>
+          <w:p>
+            <w:pPr>
+              <w:rPr>
+                <w:b w:val="0"/>
+                <w:bCs w:val="0"/>
+              </w:rPr>
+            </w:pPr>
+            <w:r>
+              <w:rPr>
+                <w:b w:val="0"/>
+                <w:bCs w:val="0"/>
+              </w:rPr>
+              <w:t>/api/v1/fleet/vehicles/{vehicleId}/images</w:t>
+            </w:r>
+          </w:p>
+        </w:tc>
+        <w:tc>
+          <w:tcPr>
+            <w:tcW w:w="1168" w:type="dxa"/>
+            <w:vAlign w:val="center"/>
+            <w:hideMark/>
+          </w:tcPr>
+          <w:p>
+            <w:pPr>
+              <w:jc w:val="center"/>
+              <w:cnfStyle w:val="000000000000" w:firstRow="0" w:lastRow="0" w:firstColumn="0" w:lastColumn="0" w:oddVBand="0" w:evenVBand="0" w:oddHBand="0" w:evenHBand="0" w:firstRowFirstColumn="0" w:firstRowLastColumn="0" w:lastRowFirstColumn="0" w:lastRowLastColumn="0"/>
+            </w:pPr>
+            <w:r>
+              <w:t>POST</w:t>
+            </w:r>
+          </w:p>
+        </w:tc>
+        <w:tc>
+          <w:tcPr>
+            <w:tcW w:w="3422" w:type="dxa"/>
+            <w:vAlign w:val="center"/>
+            <w:hideMark/>
+          </w:tcPr>
+          <w:p>
+            <w:pPr>
+              <w:cnfStyle w:val="000000000000" w:firstRow="0" w:lastRow="0" w:firstColumn="0" w:lastColumn="0" w:oddVBand="0" w:evenVBand="0" w:oddHBand="0" w:evenHBand="0" w:firstRowFirstColumn="0" w:firstRowLastColumn="0" w:lastRowFirstColumn="0" w:lastRowLastColumn="0"/>
+            </w:pPr>
+            <w:r>
+              <w:t>Upload vehicle images</w:t>
+            </w:r>
+          </w:p>
+        </w:tc>
+        <w:tc>
+          <w:tcPr>
+            <w:tcW w:w="1252" w:type="dxa"/>
+            <w:vAlign w:val="center"/>
+            <w:hideMark/>
+          </w:tcPr>
+          <w:p>
+            <w:pPr>
+              <w:jc w:val="center"/>
+              <w:cnfStyle w:val="000000000000" w:firstRow="0" w:lastRow="0" w:firstColumn="0" w:lastColumn="0" w:oddVBand="0" w:evenVBand="0" w:oddHBand="0" w:evenHBand="0" w:firstRowFirstColumn="0" w:firstRowLastColumn="0" w:lastRowFirstColumn="0" w:lastRowLastColumn="0"/>
+            </w:pPr>
+            <w:r>
+              <w:t>Yes</w:t>
+            </w:r>
+          </w:p>
+        </w:tc>
+      </w:tr>
+      <w:tr>
+        <w:trPr>
+          <w:cnfStyle w:val="000000100000" w:firstRow="0" w:lastRow="0" w:firstColumn="0" w:lastColumn="0" w:oddVBand="0" w:evenVBand="0" w:oddHBand="1" w:evenHBand="0" w:firstRowFirstColumn="0" w:firstRowLastColumn="0" w:lastRowFirstColumn="0" w:lastRowLastColumn="0"/>
+        </w:trPr>
+        <w:tc>
+          <w:tcPr>
+            <w:cnfStyle w:val="001000000000" w:firstRow="0" w:lastRow="0" w:firstColumn="1" w:lastColumn="0" w:oddVBand="0" w:evenVBand="0" w:oddHBand="0" w:evenHBand="0" w:firstRowFirstColumn="0" w:firstRowLastColumn="0" w:lastRowFirstColumn="0" w:lastRowLastColumn="0"/>
+            <w:tcW w:w="3505" w:type="dxa"/>
+            <w:vAlign w:val="center"/>
+            <w:hideMark/>
+          </w:tcPr>
+          <w:p>
+            <w:pPr>
+              <w:rPr>
+                <w:b w:val="0"/>
+                <w:bCs w:val="0"/>
+              </w:rPr>
+            </w:pPr>
+            <w:r>
+              <w:rPr>
+                <w:b w:val="0"/>
+                <w:bCs w:val="0"/>
+              </w:rPr>
+              <w:lastRenderedPageBreak/>
+              <w:t>/api/v1/fleet/vehicles/{vehicleId}/images/{imageId}</w:t>
+            </w:r>
+          </w:p>
+        </w:tc>
+        <w:tc>
+          <w:tcPr>
+            <w:tcW w:w="1168" w:type="dxa"/>
+            <w:vAlign w:val="center"/>
+            <w:hideMark/>
+          </w:tcPr>
+          <w:p>
+            <w:pPr>
+              <w:jc w:val="center"/>
+              <w:cnfStyle w:val="000000100000" w:firstRow="0" w:lastRow="0" w:firstColumn="0" w:lastColumn="0" w:oddVBand="0" w:evenVBand="0" w:oddHBand="1" w:evenHBand="0" w:firstRowFirstColumn="0" w:firstRowLastColumn="0" w:lastRowFirstColumn="0" w:lastRowLastColumn="0"/>
+            </w:pPr>
+            <w:r>
+              <w:t>DELETE</w:t>
+            </w:r>
+          </w:p>
+        </w:tc>
+        <w:tc>
+          <w:tcPr>
+            <w:tcW w:w="3422" w:type="dxa"/>
+            <w:vAlign w:val="center"/>
+            <w:hideMark/>
+          </w:tcPr>
+          <w:p>
+            <w:pPr>
+              <w:cnfStyle w:val="000000100000" w:firstRow="0" w:lastRow="0" w:firstColumn="0" w:lastColumn="0" w:oddVBand="0" w:evenVBand="0" w:oddHBand="1" w:evenHBand="0" w:firstRowFirstColumn="0" w:firstRowLastColumn="0" w:lastRowFirstColumn="0" w:lastRowLastColumn="0"/>
+            </w:pPr>
+            <w:r>
+              <w:t>Delete a vehicle image</w:t>
+            </w:r>
+          </w:p>
+        </w:tc>
+        <w:tc>
+          <w:tcPr>
+            <w:tcW w:w="1252" w:type="dxa"/>
+            <w:vAlign w:val="center"/>
+            <w:hideMark/>
+          </w:tcPr>
+          <w:p>
+            <w:pPr>
+              <w:jc w:val="center"/>
+              <w:cnfStyle w:val="000000100000" w:firstRow="0" w:lastRow="0" w:firstColumn="0" w:lastColumn="0" w:oddVBand="0" w:evenVBand="0" w:oddHBand="1" w:evenHBand="0" w:firstRowFirstColumn="0" w:firstRowLastColumn="0" w:lastRowFirstColumn="0" w:lastRowLastColumn="0"/>
+            </w:pPr>
+            <w:r>
+              <w:t>Yes</w:t>
+            </w:r>
+          </w:p>
+        </w:tc>
+      </w:tr>
+      <w:tr>
+        <w:tc>
+          <w:tcPr>
+            <w:cnfStyle w:val="001000000000" w:firstRow="0" w:lastRow="0" w:firstColumn="1" w:lastColumn="0" w:oddVBand="0" w:evenVBand="0" w:oddHBand="0" w:evenHBand="0" w:firstRowFirstColumn="0" w:firstRowLastColumn="0" w:lastRowFirstColumn="0" w:lastRowLastColumn="0"/>
+            <w:tcW w:w="3505" w:type="dxa"/>
+            <w:vAlign w:val="center"/>
+            <w:hideMark/>
+          </w:tcPr>
+          <w:p>
+            <w:pPr>
+              <w:rPr>
+                <w:b w:val="0"/>
+                <w:bCs w:val="0"/>
+              </w:rPr>
+            </w:pPr>
+            <w:r>
+              <w:rPr>
+                <w:b w:val="0"/>
+                <w:bCs w:val="0"/>
+              </w:rPr>
+              <w:t>/api/v1/fleet/statistics</w:t>
+            </w:r>
+          </w:p>
+        </w:tc>
+        <w:tc>
+          <w:tcPr>
+            <w:tcW w:w="1168" w:type="dxa"/>
+            <w:vAlign w:val="center"/>
+            <w:hideMark/>
+          </w:tcPr>
+          <w:p>
+            <w:pPr>
+              <w:jc w:val="center"/>
+              <w:cnfStyle w:val="000000000000" w:firstRow="0" w:lastRow="0" w:firstColumn="0" w:lastColumn="0" w:oddVBand="0" w:evenVBand="0" w:oddHBand="0" w:evenHBand="0" w:firstRowFirstColumn="0" w:firstRowLastColumn="0" w:lastRowFirstColumn="0" w:lastRowLastColumn="0"/>
+            </w:pPr>
+            <w:r>
+              <w:t>GET</w:t>
+            </w:r>
+          </w:p>
+        </w:tc>
+        <w:tc>
+          <w:tcPr>
+            <w:tcW w:w="3422" w:type="dxa"/>
+            <w:vAlign w:val="center"/>
+            <w:hideMark/>
+          </w:tcPr>
+          <w:p>
+            <w:pPr>
+              <w:cnfStyle w:val="000000000000" w:firstRow="0" w:lastRow="0" w:firstColumn="0" w:lastColumn="0" w:oddVBand="0" w:evenVBand="0" w:oddHBand="0" w:evenHBand="0" w:firstRowFirstColumn="0" w:firstRowLastColumn="0" w:lastRowFirstColumn="0" w:lastRowLastColumn="0"/>
+            </w:pPr>
+            <w:r>
+              <w:t>Retrieve fleet statistics and inventory summary</w:t>
+            </w:r>
+          </w:p>
+        </w:tc>
+        <w:tc>
+          <w:tcPr>
+            <w:tcW w:w="1252" w:type="dxa"/>
+            <w:vAlign w:val="center"/>
+            <w:hideMark/>
+          </w:tcPr>
+          <w:p>
+            <w:pPr>
+              <w:jc w:val="center"/>
+              <w:cnfStyle w:val="000000000000" w:firstRow="0" w:lastRow="0" w:firstColumn="0" w:lastColumn="0" w:oddVBand="0" w:evenVBand="0" w:oddHBand="0" w:evenHBand="0" w:firstRowFirstColumn="0" w:firstRowLastColumn="0" w:lastRowFirstColumn="0" w:lastRowLastColumn="0"/>
+            </w:pPr>
+            <w:r>
+              <w:t>Yes</w:t>
+            </w:r>
+          </w:p>
+        </w:tc>
+      </w:tr>
+    </w:tbl>
+    <w:p>
+      <w:pPr>
+        <w:spacing w:after="0"/>
+      </w:pPr>
+    </w:p>
+    <w:p>
+      <w:pPr>
+        <w:pStyle w:val="Title"/>
+      </w:pPr>
+      <w:r>
+        <w:t>API Design Considerations</w:t>
+      </w:r>
+    </w:p>
+    <w:p>
+      <w:r>
+        <w:t>The Fleet Management APIs are built taking into account the following factors:</w:t>
+      </w:r>
+    </w:p>
+    <w:p>
+      <w:pPr>
+        <w:pStyle w:val="ListParagraph"/>
+        <w:numPr>
+          <w:ilvl w:val="0"/>
+          <w:numId w:val="154"/>
+        </w:numPr>
+      </w:pPr>
+      <w:r>
+        <w:t>Ownership Factor: An agency may control only the vehicles belonging to its own organization.</w:t>
+      </w:r>
+    </w:p>
+    <w:p>
+      <w:pPr>
+        <w:pStyle w:val="ListParagraph"/>
+        <w:numPr>
+          <w:ilvl w:val="0"/>
+          <w:numId w:val="154"/>
+        </w:numPr>
+      </w:pPr>
+      <w:r>
+        <w:t>REST Resources Modeling: The vehicles are presented as REST resources and have unique IDs.</w:t>
+      </w:r>
+    </w:p>
+    <w:p>
+      <w:pPr>
+        <w:pStyle w:val="ListParagraph"/>
+        <w:numPr>
+          <w:ilvl w:val="0"/>
+          <w:numId w:val="154"/>
+        </w:numPr>
+      </w:pPr>
+      <w:r>
+        <w:t>Authorization by JWT: All fleet operations require access tokens.</w:t>
+      </w:r>
+    </w:p>
+    <w:p>
+      <w:pPr>
+        <w:pStyle w:val="ListParagraph"/>
+        <w:numPr>
+          <w:ilvl w:val="0"/>
+          <w:numId w:val="154"/>
+        </w:numPr>
+      </w:pPr>
+      <w:r>
+        <w:t>Authorization by Roles: Fleet management is performed only by agency managers, agency workers with certain permissions, and administrators.</w:t>
+      </w:r>
+    </w:p>
+    <w:p>
+      <w:pPr>
+        <w:pStyle w:val="ListParagraph"/>
+        <w:numPr>
+          <w:ilvl w:val="0"/>
+          <w:numId w:val="154"/>
+        </w:numPr>
+      </w:pPr>
+      <w:r>
+        <w:t>Control of Vehicles' Availability: Updates about availability of vehicles are synchronized with Reservation Service in order to avoid booking the same vehicle twice.</w:t>
+      </w:r>
+    </w:p>
+    <w:p>
+      <w:pPr>
+        <w:pStyle w:val="ListParagraph"/>
+        <w:numPr>
+          <w:ilvl w:val="0"/>
+          <w:numId w:val="154"/>
+        </w:numPr>
+      </w:pPr>
+      <w:r>
+        <w:t>Support of Multiple Images: Several images may be associated with each vehicle in order to make it more visible to customers.</w:t>
+      </w:r>
+    </w:p>
+    <w:p>
+      <w:pPr>
+        <w:pStyle w:val="ListParagraph"/>
+        <w:numPr>
+          <w:ilvl w:val="0"/>
+          <w:numId w:val="154"/>
+        </w:numPr>
+      </w:pPr>
+      <w:r>
+        <w:t>Protection of Vehicle Inventory: It is impossible to delete from the fleet vehicles involved in active reservations until all of them will be closed or cancelled.</w:t>
+      </w:r>
+    </w:p>
+    <w:p>
+      <w:pPr>
+        <w:pStyle w:val="ListParagraph"/>
+        <w:numPr>
+          <w:ilvl w:val="0"/>
+          <w:numId w:val="154"/>
+        </w:numPr>
+      </w:pPr>
+      <w:r>
+        <w:t>Data Validity: All the vehicle specifications, price and policy information are checked before storage.</w:t>
+      </w:r>
+    </w:p>
+    <w:p>
+      <w:pPr>
+        <w:pStyle w:val="Title"/>
+      </w:pPr>
+      <w:r>
+        <w:t>Fleet Management Workflow</w:t>
+      </w:r>
+    </w:p>
+    <w:p>
+      <w:r>
+        <w:t>The process of fleet management includes the following sequence of operations:</w:t>
+      </w:r>
+    </w:p>
+    <w:p>
+      <w:pPr>
+        <w:pStyle w:val="ListParagraph"/>
+        <w:numPr>
+          <w:ilvl w:val="0"/>
+          <w:numId w:val="155"/>
+        </w:numPr>
+      </w:pPr>
+      <w:r>
+        <w:t>An authenticated agency worker launches the Fleet Management module.</w:t>
+      </w:r>
+    </w:p>
+    <w:p>
+      <w:pPr>
+        <w:pStyle w:val="ListParagraph"/>
+        <w:numPr>
+          <w:ilvl w:val="0"/>
+          <w:numId w:val="155"/>
+        </w:numPr>
+      </w:pPr>
+      <w:r>
+        <w:t>The worker creates or updates a vehicle record.</w:t>
+      </w:r>
+    </w:p>
+    <w:p>
+      <w:pPr>
+        <w:pStyle w:val="ListParagraph"/>
+        <w:numPr>
+          <w:ilvl w:val="0"/>
+          <w:numId w:val="155"/>
+        </w:numPr>
+      </w:pPr>
+      <w:r>
+        <w:t>The Fleet Management service validates the vehicle record information.</w:t>
+      </w:r>
+    </w:p>
+    <w:p>
+      <w:pPr>
+        <w:pStyle w:val="ListParagraph"/>
+        <w:numPr>
+          <w:ilvl w:val="0"/>
+          <w:numId w:val="155"/>
+        </w:numPr>
+      </w:pPr>
+      <w:r>
+        <w:t>The images of the vehicle are uploaded.</w:t>
+      </w:r>
+    </w:p>
+    <w:p>
+      <w:pPr>
+        <w:pStyle w:val="ListParagraph"/>
+        <w:numPr>
+          <w:ilvl w:val="0"/>
+          <w:numId w:val="155"/>
+        </w:numPr>
+      </w:pPr>
+      <w:r>
+        <w:t>The vehicle record is saved in the database and becomes visible to customers if its availability state is 'Available'.</w:t>
+      </w:r>
+    </w:p>
+    <w:p>
+      <w:pPr>
+        <w:pStyle w:val="ListParagraph"/>
+        <w:numPr>
+          <w:ilvl w:val="0"/>
+          <w:numId w:val="155"/>
+        </w:numPr>
+      </w:pPr>
+      <w:r>
+        <w:t>In case of any change in price or availability, the Reservation Service is informed about it.</w:t>
+      </w:r>
+    </w:p>
+    <w:p>
+      <w:pPr>
+        <w:pStyle w:val="ListParagraph"/>
+        <w:numPr>
+          <w:ilvl w:val="0"/>
+          <w:numId w:val="155"/>
+        </w:numPr>
+      </w:pPr>
+      <w:r>
+        <w:t>The Analytics information is updated.</w:t>
+      </w:r>
+    </w:p>
+    <w:p>
+      <w:r>
+        <w:t>This process guarantees the accuracy of the information about vehicles and keeps consistency in reservation, searching and analytics services.</w:t>
+      </w:r>
+    </w:p>
     <w:p/>
     <w:p/>
     <w:p/>
@@ -8381,6 +9492,92 @@
     </w:lvl>
   </w:abstractNum>
   <w:abstractNum w:abstractNumId="16" w15:restartNumberingAfterBreak="0">
+    <w:nsid w:val="158836AF"/>
+    <w:multiLevelType w:val="hybridMultilevel"/>
+    <w:tmpl w:val="3FE0C50C"/>
+    <w:lvl w:ilvl="0" w:tplc="0409000F">
+      <w:start w:val="1"/>
+      <w:numFmt w:val="decimal"/>
+      <w:lvlText w:val="%1."/>
+      <w:lvlJc w:val="left"/>
+      <w:pPr>
+        <w:ind w:left="720" w:hanging="360"/>
+      </w:pPr>
+    </w:lvl>
+    <w:lvl w:ilvl="1" w:tplc="04090019" w:tentative="1">
+      <w:start w:val="1"/>
+      <w:numFmt w:val="lowerLetter"/>
+      <w:lvlText w:val="%2."/>
+      <w:lvlJc w:val="left"/>
+      <w:pPr>
+        <w:ind w:left="1440" w:hanging="360"/>
+      </w:pPr>
+    </w:lvl>
+    <w:lvl w:ilvl="2" w:tplc="0409001B" w:tentative="1">
+      <w:start w:val="1"/>
+      <w:numFmt w:val="lowerRoman"/>
+      <w:lvlText w:val="%3."/>
+      <w:lvlJc w:val="right"/>
+      <w:pPr>
+        <w:ind w:left="2160" w:hanging="180"/>
+      </w:pPr>
+    </w:lvl>
+    <w:lvl w:ilvl="3" w:tplc="0409000F" w:tentative="1">
+      <w:start w:val="1"/>
+      <w:numFmt w:val="decimal"/>
+      <w:lvlText w:val="%4."/>
+      <w:lvlJc w:val="left"/>
+      <w:pPr>
+        <w:ind w:left="2880" w:hanging="360"/>
+      </w:pPr>
+    </w:lvl>
+    <w:lvl w:ilvl="4" w:tplc="04090019" w:tentative="1">
+      <w:start w:val="1"/>
+      <w:numFmt w:val="lowerLetter"/>
+      <w:lvlText w:val="%5."/>
+      <w:lvlJc w:val="left"/>
+      <w:pPr>
+        <w:ind w:left="3600" w:hanging="360"/>
+      </w:pPr>
+    </w:lvl>
+    <w:lvl w:ilvl="5" w:tplc="0409001B" w:tentative="1">
+      <w:start w:val="1"/>
+      <w:numFmt w:val="lowerRoman"/>
+      <w:lvlText w:val="%6."/>
+      <w:lvlJc w:val="right"/>
+      <w:pPr>
+        <w:ind w:left="4320" w:hanging="180"/>
+      </w:pPr>
+    </w:lvl>
+    <w:lvl w:ilvl="6" w:tplc="0409000F" w:tentative="1">
+      <w:start w:val="1"/>
+      <w:numFmt w:val="decimal"/>
+      <w:lvlText w:val="%7."/>
+      <w:lvlJc w:val="left"/>
+      <w:pPr>
+        <w:ind w:left="5040" w:hanging="360"/>
+      </w:pPr>
+    </w:lvl>
+    <w:lvl w:ilvl="7" w:tplc="04090019" w:tentative="1">
+      <w:start w:val="1"/>
+      <w:numFmt w:val="lowerLetter"/>
+      <w:lvlText w:val="%8."/>
+      <w:lvlJc w:val="left"/>
+      <w:pPr>
+        <w:ind w:left="5760" w:hanging="360"/>
+      </w:pPr>
+    </w:lvl>
+    <w:lvl w:ilvl="8" w:tplc="0409001B" w:tentative="1">
+      <w:start w:val="1"/>
+      <w:numFmt w:val="lowerRoman"/>
+      <w:lvlText w:val="%9."/>
+      <w:lvlJc w:val="right"/>
+      <w:pPr>
+        <w:ind w:left="6480" w:hanging="180"/>
+      </w:pPr>
+    </w:lvl>
+  </w:abstractNum>
+  <w:abstractNum w:abstractNumId="17" w15:restartNumberingAfterBreak="0">
     <w:nsid w:val="15923962"/>
     <w:multiLevelType w:val="hybridMultilevel"/>
     <w:tmpl w:val="2A8A437A"/>
@@ -8492,7 +9689,7 @@
       </w:rPr>
     </w:lvl>
   </w:abstractNum>
-  <w:abstractNum w:abstractNumId="17" w15:restartNumberingAfterBreak="0">
+  <w:abstractNum w:abstractNumId="18" w15:restartNumberingAfterBreak="0">
     <w:nsid w:val="15E231DD"/>
     <w:multiLevelType w:val="hybridMultilevel"/>
     <w:tmpl w:val="48B4AB8E"/>
@@ -8605,7 +9802,7 @@
       </w:rPr>
     </w:lvl>
   </w:abstractNum>
-  <w:abstractNum w:abstractNumId="18" w15:restartNumberingAfterBreak="0">
+  <w:abstractNum w:abstractNumId="19" w15:restartNumberingAfterBreak="0">
     <w:nsid w:val="15FB6E59"/>
     <w:multiLevelType w:val="multilevel"/>
     <w:tmpl w:val="63F4E6F0"/>
@@ -8754,7 +9951,7 @@
       </w:rPr>
     </w:lvl>
   </w:abstractNum>
-  <w:abstractNum w:abstractNumId="19" w15:restartNumberingAfterBreak="0">
+  <w:abstractNum w:abstractNumId="20" w15:restartNumberingAfterBreak="0">
     <w:nsid w:val="16057B40"/>
     <w:multiLevelType w:val="hybridMultilevel"/>
     <w:tmpl w:val="C63C7D68"/>
@@ -8866,7 +10063,7 @@
       </w:rPr>
     </w:lvl>
   </w:abstractNum>
-  <w:abstractNum w:abstractNumId="20" w15:restartNumberingAfterBreak="0">
+  <w:abstractNum w:abstractNumId="21" w15:restartNumberingAfterBreak="0">
     <w:nsid w:val="18441B3D"/>
     <w:multiLevelType w:val="hybridMultilevel"/>
     <w:tmpl w:val="F162D252"/>
@@ -8978,7 +10175,7 @@
       </w:rPr>
     </w:lvl>
   </w:abstractNum>
-  <w:abstractNum w:abstractNumId="21" w15:restartNumberingAfterBreak="0">
+  <w:abstractNum w:abstractNumId="22" w15:restartNumberingAfterBreak="0">
     <w:nsid w:val="185230B0"/>
     <w:multiLevelType w:val="hybridMultilevel"/>
     <w:tmpl w:val="FDFE89EE"/>
@@ -9091,7 +10288,7 @@
       </w:rPr>
     </w:lvl>
   </w:abstractNum>
-  <w:abstractNum w:abstractNumId="22" w15:restartNumberingAfterBreak="0">
+  <w:abstractNum w:abstractNumId="23" w15:restartNumberingAfterBreak="0">
     <w:nsid w:val="18A93E35"/>
     <w:multiLevelType w:val="hybridMultilevel"/>
     <w:tmpl w:val="7A6E3062"/>
@@ -9203,7 +10400,7 @@
       </w:rPr>
     </w:lvl>
   </w:abstractNum>
-  <w:abstractNum w:abstractNumId="23" w15:restartNumberingAfterBreak="0">
+  <w:abstractNum w:abstractNumId="24" w15:restartNumberingAfterBreak="0">
     <w:nsid w:val="18EC3D82"/>
     <w:multiLevelType w:val="hybridMultilevel"/>
     <w:tmpl w:val="BC5A743C"/>
@@ -9316,7 +10513,7 @@
       </w:rPr>
     </w:lvl>
   </w:abstractNum>
-  <w:abstractNum w:abstractNumId="24" w15:restartNumberingAfterBreak="0">
+  <w:abstractNum w:abstractNumId="25" w15:restartNumberingAfterBreak="0">
     <w:nsid w:val="18F46E01"/>
     <w:multiLevelType w:val="multilevel"/>
     <w:tmpl w:val="C77EDED0"/>
@@ -9465,7 +10662,7 @@
       </w:rPr>
     </w:lvl>
   </w:abstractNum>
-  <w:abstractNum w:abstractNumId="25" w15:restartNumberingAfterBreak="0">
+  <w:abstractNum w:abstractNumId="26" w15:restartNumberingAfterBreak="0">
     <w:nsid w:val="19C83C12"/>
     <w:multiLevelType w:val="multilevel"/>
     <w:tmpl w:val="7690D588"/>
@@ -9614,7 +10811,7 @@
       </w:rPr>
     </w:lvl>
   </w:abstractNum>
-  <w:abstractNum w:abstractNumId="26" w15:restartNumberingAfterBreak="0">
+  <w:abstractNum w:abstractNumId="27" w15:restartNumberingAfterBreak="0">
     <w:nsid w:val="1A236A44"/>
     <w:multiLevelType w:val="hybridMultilevel"/>
     <w:tmpl w:val="E06C248C"/>
@@ -9727,7 +10924,7 @@
       </w:rPr>
     </w:lvl>
   </w:abstractNum>
-  <w:abstractNum w:abstractNumId="27" w15:restartNumberingAfterBreak="0">
+  <w:abstractNum w:abstractNumId="28" w15:restartNumberingAfterBreak="0">
     <w:nsid w:val="1C511176"/>
     <w:multiLevelType w:val="multilevel"/>
     <w:tmpl w:val="201E7F12"/>
@@ -9876,7 +11073,7 @@
       </w:rPr>
     </w:lvl>
   </w:abstractNum>
-  <w:abstractNum w:abstractNumId="28" w15:restartNumberingAfterBreak="0">
+  <w:abstractNum w:abstractNumId="29" w15:restartNumberingAfterBreak="0">
     <w:nsid w:val="1D4C2E50"/>
     <w:multiLevelType w:val="multilevel"/>
     <w:tmpl w:val="63F4E6F0"/>
@@ -10025,7 +11222,7 @@
       </w:rPr>
     </w:lvl>
   </w:abstractNum>
-  <w:abstractNum w:abstractNumId="29" w15:restartNumberingAfterBreak="0">
+  <w:abstractNum w:abstractNumId="30" w15:restartNumberingAfterBreak="0">
     <w:nsid w:val="1D592278"/>
     <w:multiLevelType w:val="hybridMultilevel"/>
     <w:tmpl w:val="0622B59C"/>
@@ -10138,7 +11335,7 @@
       </w:rPr>
     </w:lvl>
   </w:abstractNum>
-  <w:abstractNum w:abstractNumId="30" w15:restartNumberingAfterBreak="0">
+  <w:abstractNum w:abstractNumId="31" w15:restartNumberingAfterBreak="0">
     <w:nsid w:val="1EC4731F"/>
     <w:multiLevelType w:val="hybridMultilevel"/>
     <w:tmpl w:val="8E26D8F0"/>
@@ -10250,7 +11447,7 @@
       </w:rPr>
     </w:lvl>
   </w:abstractNum>
-  <w:abstractNum w:abstractNumId="31" w15:restartNumberingAfterBreak="0">
+  <w:abstractNum w:abstractNumId="32" w15:restartNumberingAfterBreak="0">
     <w:nsid w:val="20017871"/>
     <w:multiLevelType w:val="hybridMultilevel"/>
     <w:tmpl w:val="EA76608A"/>
@@ -10363,7 +11560,7 @@
       </w:rPr>
     </w:lvl>
   </w:abstractNum>
-  <w:abstractNum w:abstractNumId="32" w15:restartNumberingAfterBreak="0">
+  <w:abstractNum w:abstractNumId="33" w15:restartNumberingAfterBreak="0">
     <w:nsid w:val="206A32F9"/>
     <w:multiLevelType w:val="hybridMultilevel"/>
     <w:tmpl w:val="7A405CA6"/>
@@ -10475,7 +11672,7 @@
       </w:rPr>
     </w:lvl>
   </w:abstractNum>
-  <w:abstractNum w:abstractNumId="33" w15:restartNumberingAfterBreak="0">
+  <w:abstractNum w:abstractNumId="34" w15:restartNumberingAfterBreak="0">
     <w:nsid w:val="20786568"/>
     <w:multiLevelType w:val="hybridMultilevel"/>
     <w:tmpl w:val="200CC0BC"/>
@@ -10587,7 +11784,7 @@
       </w:rPr>
     </w:lvl>
   </w:abstractNum>
-  <w:abstractNum w:abstractNumId="34" w15:restartNumberingAfterBreak="0">
+  <w:abstractNum w:abstractNumId="35" w15:restartNumberingAfterBreak="0">
     <w:nsid w:val="207D21A1"/>
     <w:multiLevelType w:val="hybridMultilevel"/>
     <w:tmpl w:val="AAAE4260"/>
@@ -10699,7 +11896,7 @@
       </w:rPr>
     </w:lvl>
   </w:abstractNum>
-  <w:abstractNum w:abstractNumId="35" w15:restartNumberingAfterBreak="0">
+  <w:abstractNum w:abstractNumId="36" w15:restartNumberingAfterBreak="0">
     <w:nsid w:val="20DC5034"/>
     <w:multiLevelType w:val="hybridMultilevel"/>
     <w:tmpl w:val="4B5425EA"/>
@@ -10811,7 +12008,7 @@
       </w:rPr>
     </w:lvl>
   </w:abstractNum>
-  <w:abstractNum w:abstractNumId="36" w15:restartNumberingAfterBreak="0">
+  <w:abstractNum w:abstractNumId="37" w15:restartNumberingAfterBreak="0">
     <w:nsid w:val="224C7C45"/>
     <w:multiLevelType w:val="multilevel"/>
     <w:tmpl w:val="5C800264"/>
@@ -10960,7 +12157,7 @@
       </w:rPr>
     </w:lvl>
   </w:abstractNum>
-  <w:abstractNum w:abstractNumId="37" w15:restartNumberingAfterBreak="0">
+  <w:abstractNum w:abstractNumId="38" w15:restartNumberingAfterBreak="0">
     <w:nsid w:val="23970AD1"/>
     <w:multiLevelType w:val="hybridMultilevel"/>
     <w:tmpl w:val="6A1E8A04"/>
@@ -11072,7 +12269,7 @@
       </w:rPr>
     </w:lvl>
   </w:abstractNum>
-  <w:abstractNum w:abstractNumId="38" w15:restartNumberingAfterBreak="0">
+  <w:abstractNum w:abstractNumId="39" w15:restartNumberingAfterBreak="0">
     <w:nsid w:val="243D731E"/>
     <w:multiLevelType w:val="multilevel"/>
     <w:tmpl w:val="51303158"/>
@@ -11221,7 +12418,7 @@
       </w:rPr>
     </w:lvl>
   </w:abstractNum>
-  <w:abstractNum w:abstractNumId="39" w15:restartNumberingAfterBreak="0">
+  <w:abstractNum w:abstractNumId="40" w15:restartNumberingAfterBreak="0">
     <w:nsid w:val="253A4FEB"/>
     <w:multiLevelType w:val="hybridMultilevel"/>
     <w:tmpl w:val="5628BED4"/>
@@ -11334,7 +12531,7 @@
       </w:rPr>
     </w:lvl>
   </w:abstractNum>
-  <w:abstractNum w:abstractNumId="40" w15:restartNumberingAfterBreak="0">
+  <w:abstractNum w:abstractNumId="41" w15:restartNumberingAfterBreak="0">
     <w:nsid w:val="26BA6D3C"/>
     <w:multiLevelType w:val="hybridMultilevel"/>
     <w:tmpl w:val="F03CC954"/>
@@ -11446,7 +12643,7 @@
       </w:rPr>
     </w:lvl>
   </w:abstractNum>
-  <w:abstractNum w:abstractNumId="41" w15:restartNumberingAfterBreak="0">
+  <w:abstractNum w:abstractNumId="42" w15:restartNumberingAfterBreak="0">
     <w:nsid w:val="28765EA3"/>
     <w:multiLevelType w:val="hybridMultilevel"/>
     <w:tmpl w:val="1CFAEB30"/>
@@ -11559,7 +12756,7 @@
       </w:rPr>
     </w:lvl>
   </w:abstractNum>
-  <w:abstractNum w:abstractNumId="42" w15:restartNumberingAfterBreak="0">
+  <w:abstractNum w:abstractNumId="43" w15:restartNumberingAfterBreak="0">
     <w:nsid w:val="28940045"/>
     <w:multiLevelType w:val="multilevel"/>
     <w:tmpl w:val="23DE4804"/>
@@ -11708,7 +12905,7 @@
       </w:rPr>
     </w:lvl>
   </w:abstractNum>
-  <w:abstractNum w:abstractNumId="43" w15:restartNumberingAfterBreak="0">
+  <w:abstractNum w:abstractNumId="44" w15:restartNumberingAfterBreak="0">
     <w:nsid w:val="289938CC"/>
     <w:multiLevelType w:val="multilevel"/>
     <w:tmpl w:val="57745EE2"/>
@@ -11857,7 +13054,7 @@
       </w:rPr>
     </w:lvl>
   </w:abstractNum>
-  <w:abstractNum w:abstractNumId="44" w15:restartNumberingAfterBreak="0">
+  <w:abstractNum w:abstractNumId="45" w15:restartNumberingAfterBreak="0">
     <w:nsid w:val="2ADE3401"/>
     <w:multiLevelType w:val="multilevel"/>
     <w:tmpl w:val="63F4E6F0"/>
@@ -12006,7 +13203,7 @@
       </w:rPr>
     </w:lvl>
   </w:abstractNum>
-  <w:abstractNum w:abstractNumId="45" w15:restartNumberingAfterBreak="0">
+  <w:abstractNum w:abstractNumId="46" w15:restartNumberingAfterBreak="0">
     <w:nsid w:val="2B592B9C"/>
     <w:multiLevelType w:val="hybridMultilevel"/>
     <w:tmpl w:val="99D4C34E"/>
@@ -12119,7 +13316,7 @@
       </w:rPr>
     </w:lvl>
   </w:abstractNum>
-  <w:abstractNum w:abstractNumId="46" w15:restartNumberingAfterBreak="0">
+  <w:abstractNum w:abstractNumId="47" w15:restartNumberingAfterBreak="0">
     <w:nsid w:val="2B9413C9"/>
     <w:multiLevelType w:val="hybridMultilevel"/>
     <w:tmpl w:val="4F7A7546"/>
@@ -12231,7 +13428,7 @@
       </w:rPr>
     </w:lvl>
   </w:abstractNum>
-  <w:abstractNum w:abstractNumId="47" w15:restartNumberingAfterBreak="0">
+  <w:abstractNum w:abstractNumId="48" w15:restartNumberingAfterBreak="0">
     <w:nsid w:val="2B9539E3"/>
     <w:multiLevelType w:val="hybridMultilevel"/>
     <w:tmpl w:val="E6B8BBB6"/>
@@ -12343,7 +13540,120 @@
       </w:rPr>
     </w:lvl>
   </w:abstractNum>
-  <w:abstractNum w:abstractNumId="48" w15:restartNumberingAfterBreak="0">
+  <w:abstractNum w:abstractNumId="49" w15:restartNumberingAfterBreak="0">
+    <w:nsid w:val="2C0B4D57"/>
+    <w:multiLevelType w:val="hybridMultilevel"/>
+    <w:tmpl w:val="7DDCD954"/>
+    <w:lvl w:ilvl="0" w:tplc="04090005">
+      <w:start w:val="1"/>
+      <w:numFmt w:val="bullet"/>
+      <w:lvlText w:val=""/>
+      <w:lvlJc w:val="left"/>
+      <w:pPr>
+        <w:ind w:left="720" w:hanging="360"/>
+      </w:pPr>
+      <w:rPr>
+        <w:rFonts w:ascii="Wingdings" w:hAnsi="Wingdings" w:hint="default"/>
+      </w:rPr>
+    </w:lvl>
+    <w:lvl w:ilvl="1" w:tplc="04090003" w:tentative="1">
+      <w:start w:val="1"/>
+      <w:numFmt w:val="bullet"/>
+      <w:lvlText w:val="o"/>
+      <w:lvlJc w:val="left"/>
+      <w:pPr>
+        <w:ind w:left="1440" w:hanging="360"/>
+      </w:pPr>
+      <w:rPr>
+        <w:rFonts w:ascii="Courier New" w:hAnsi="Courier New" w:cs="Courier New" w:hint="default"/>
+      </w:rPr>
+    </w:lvl>
+    <w:lvl w:ilvl="2" w:tplc="04090005" w:tentative="1">
+      <w:start w:val="1"/>
+      <w:numFmt w:val="bullet"/>
+      <w:lvlText w:val=""/>
+      <w:lvlJc w:val="left"/>
+      <w:pPr>
+        <w:ind w:left="2160" w:hanging="360"/>
+      </w:pPr>
+      <w:rPr>
+        <w:rFonts w:ascii="Wingdings" w:hAnsi="Wingdings" w:hint="default"/>
+      </w:rPr>
+    </w:lvl>
+    <w:lvl w:ilvl="3" w:tplc="04090001" w:tentative="1">
+      <w:start w:val="1"/>
+      <w:numFmt w:val="bullet"/>
+      <w:lvlText w:val=""/>
+      <w:lvlJc w:val="left"/>
+      <w:pPr>
+        <w:ind w:left="2880" w:hanging="360"/>
+      </w:pPr>
+      <w:rPr>
+        <w:rFonts w:ascii="Symbol" w:hAnsi="Symbol" w:hint="default"/>
+      </w:rPr>
+    </w:lvl>
+    <w:lvl w:ilvl="4" w:tplc="04090003" w:tentative="1">
+      <w:start w:val="1"/>
+      <w:numFmt w:val="bullet"/>
+      <w:lvlText w:val="o"/>
+      <w:lvlJc w:val="left"/>
+      <w:pPr>
+        <w:ind w:left="3600" w:hanging="360"/>
+      </w:pPr>
+      <w:rPr>
+        <w:rFonts w:ascii="Courier New" w:hAnsi="Courier New" w:cs="Courier New" w:hint="default"/>
+      </w:rPr>
+    </w:lvl>
+    <w:lvl w:ilvl="5" w:tplc="04090005" w:tentative="1">
+      <w:start w:val="1"/>
+      <w:numFmt w:val="bullet"/>
+      <w:lvlText w:val=""/>
+      <w:lvlJc w:val="left"/>
+      <w:pPr>
+        <w:ind w:left="4320" w:hanging="360"/>
+      </w:pPr>
+      <w:rPr>
+        <w:rFonts w:ascii="Wingdings" w:hAnsi="Wingdings" w:hint="default"/>
+      </w:rPr>
+    </w:lvl>
+    <w:lvl w:ilvl="6" w:tplc="04090001" w:tentative="1">
+      <w:start w:val="1"/>
+      <w:numFmt w:val="bullet"/>
+      <w:lvlText w:val=""/>
+      <w:lvlJc w:val="left"/>
+      <w:pPr>
+        <w:ind w:left="5040" w:hanging="360"/>
+      </w:pPr>
+      <w:rPr>
+        <w:rFonts w:ascii="Symbol" w:hAnsi="Symbol" w:hint="default"/>
+      </w:rPr>
+    </w:lvl>
+    <w:lvl w:ilvl="7" w:tplc="04090003" w:tentative="1">
+      <w:start w:val="1"/>
+      <w:numFmt w:val="bullet"/>
+      <w:lvlText w:val="o"/>
+      <w:lvlJc w:val="left"/>
+      <w:pPr>
+        <w:ind w:left="5760" w:hanging="360"/>
+      </w:pPr>
+      <w:rPr>
+        <w:rFonts w:ascii="Courier New" w:hAnsi="Courier New" w:cs="Courier New" w:hint="default"/>
+      </w:rPr>
+    </w:lvl>
+    <w:lvl w:ilvl="8" w:tplc="04090005" w:tentative="1">
+      <w:start w:val="1"/>
+      <w:numFmt w:val="bullet"/>
+      <w:lvlText w:val=""/>
+      <w:lvlJc w:val="left"/>
+      <w:pPr>
+        <w:ind w:left="6480" w:hanging="360"/>
+      </w:pPr>
+      <w:rPr>
+        <w:rFonts w:ascii="Wingdings" w:hAnsi="Wingdings" w:hint="default"/>
+      </w:rPr>
+    </w:lvl>
+  </w:abstractNum>
+  <w:abstractNum w:abstractNumId="50" w15:restartNumberingAfterBreak="0">
     <w:nsid w:val="2E164C9A"/>
     <w:multiLevelType w:val="hybridMultilevel"/>
     <w:tmpl w:val="C6BA489A"/>
@@ -12456,7 +13766,7 @@
       </w:rPr>
     </w:lvl>
   </w:abstractNum>
-  <w:abstractNum w:abstractNumId="49" w15:restartNumberingAfterBreak="0">
+  <w:abstractNum w:abstractNumId="51" w15:restartNumberingAfterBreak="0">
     <w:nsid w:val="2E34438D"/>
     <w:multiLevelType w:val="multilevel"/>
     <w:tmpl w:val="63F4E6F0"/>
@@ -12605,7 +13915,7 @@
       </w:rPr>
     </w:lvl>
   </w:abstractNum>
-  <w:abstractNum w:abstractNumId="50" w15:restartNumberingAfterBreak="0">
+  <w:abstractNum w:abstractNumId="52" w15:restartNumberingAfterBreak="0">
     <w:nsid w:val="2E5D6D2A"/>
     <w:multiLevelType w:val="hybridMultilevel"/>
     <w:tmpl w:val="5D5ADC98"/>
@@ -12718,7 +14028,7 @@
       </w:rPr>
     </w:lvl>
   </w:abstractNum>
-  <w:abstractNum w:abstractNumId="51" w15:restartNumberingAfterBreak="0">
+  <w:abstractNum w:abstractNumId="53" w15:restartNumberingAfterBreak="0">
     <w:nsid w:val="2E716C12"/>
     <w:multiLevelType w:val="hybridMultilevel"/>
     <w:tmpl w:val="6D90C552"/>
@@ -12831,7 +14141,7 @@
       </w:rPr>
     </w:lvl>
   </w:abstractNum>
-  <w:abstractNum w:abstractNumId="52" w15:restartNumberingAfterBreak="0">
+  <w:abstractNum w:abstractNumId="54" w15:restartNumberingAfterBreak="0">
     <w:nsid w:val="2F162517"/>
     <w:multiLevelType w:val="hybridMultilevel"/>
     <w:tmpl w:val="4E3CAB7C"/>
@@ -12943,7 +14253,7 @@
       </w:rPr>
     </w:lvl>
   </w:abstractNum>
-  <w:abstractNum w:abstractNumId="53" w15:restartNumberingAfterBreak="0">
+  <w:abstractNum w:abstractNumId="55" w15:restartNumberingAfterBreak="0">
     <w:nsid w:val="2F1F6483"/>
     <w:multiLevelType w:val="multilevel"/>
     <w:tmpl w:val="993E874E"/>
@@ -13092,7 +14402,7 @@
       </w:rPr>
     </w:lvl>
   </w:abstractNum>
-  <w:abstractNum w:abstractNumId="54" w15:restartNumberingAfterBreak="0">
+  <w:abstractNum w:abstractNumId="56" w15:restartNumberingAfterBreak="0">
     <w:nsid w:val="2F2B2F8E"/>
     <w:multiLevelType w:val="multilevel"/>
     <w:tmpl w:val="547EDCFE"/>
@@ -13241,7 +14551,7 @@
       </w:rPr>
     </w:lvl>
   </w:abstractNum>
-  <w:abstractNum w:abstractNumId="55" w15:restartNumberingAfterBreak="0">
+  <w:abstractNum w:abstractNumId="57" w15:restartNumberingAfterBreak="0">
     <w:nsid w:val="2FF161E6"/>
     <w:multiLevelType w:val="hybridMultilevel"/>
     <w:tmpl w:val="ED6AA478"/>
@@ -13353,7 +14663,7 @@
       </w:rPr>
     </w:lvl>
   </w:abstractNum>
-  <w:abstractNum w:abstractNumId="56" w15:restartNumberingAfterBreak="0">
+  <w:abstractNum w:abstractNumId="58" w15:restartNumberingAfterBreak="0">
     <w:nsid w:val="30CD5DF3"/>
     <w:multiLevelType w:val="hybridMultilevel"/>
     <w:tmpl w:val="127EBD02"/>
@@ -13465,7 +14775,7 @@
       </w:rPr>
     </w:lvl>
   </w:abstractNum>
-  <w:abstractNum w:abstractNumId="57" w15:restartNumberingAfterBreak="0">
+  <w:abstractNum w:abstractNumId="59" w15:restartNumberingAfterBreak="0">
     <w:nsid w:val="31A24DDF"/>
     <w:multiLevelType w:val="multilevel"/>
     <w:tmpl w:val="63F4E6F0"/>
@@ -13614,7 +14924,7 @@
       </w:rPr>
     </w:lvl>
   </w:abstractNum>
-  <w:abstractNum w:abstractNumId="58" w15:restartNumberingAfterBreak="0">
+  <w:abstractNum w:abstractNumId="60" w15:restartNumberingAfterBreak="0">
     <w:nsid w:val="321E65E6"/>
     <w:multiLevelType w:val="multilevel"/>
     <w:tmpl w:val="63F4E6F0"/>
@@ -13763,7 +15073,7 @@
       </w:rPr>
     </w:lvl>
   </w:abstractNum>
-  <w:abstractNum w:abstractNumId="59" w15:restartNumberingAfterBreak="0">
+  <w:abstractNum w:abstractNumId="61" w15:restartNumberingAfterBreak="0">
     <w:nsid w:val="332E29E8"/>
     <w:multiLevelType w:val="multilevel"/>
     <w:tmpl w:val="BF082128"/>
@@ -13912,7 +15222,7 @@
       </w:rPr>
     </w:lvl>
   </w:abstractNum>
-  <w:abstractNum w:abstractNumId="60" w15:restartNumberingAfterBreak="0">
+  <w:abstractNum w:abstractNumId="62" w15:restartNumberingAfterBreak="0">
     <w:nsid w:val="34251C5D"/>
     <w:multiLevelType w:val="multilevel"/>
     <w:tmpl w:val="C31CBCE0"/>
@@ -14061,7 +15371,7 @@
       </w:rPr>
     </w:lvl>
   </w:abstractNum>
-  <w:abstractNum w:abstractNumId="61" w15:restartNumberingAfterBreak="0">
+  <w:abstractNum w:abstractNumId="63" w15:restartNumberingAfterBreak="0">
     <w:nsid w:val="342A6150"/>
     <w:multiLevelType w:val="multilevel"/>
     <w:tmpl w:val="29E0BE1C"/>
@@ -14210,7 +15520,7 @@
       </w:rPr>
     </w:lvl>
   </w:abstractNum>
-  <w:abstractNum w:abstractNumId="62" w15:restartNumberingAfterBreak="0">
+  <w:abstractNum w:abstractNumId="64" w15:restartNumberingAfterBreak="0">
     <w:nsid w:val="356F220A"/>
     <w:multiLevelType w:val="multilevel"/>
     <w:tmpl w:val="0FFA5254"/>
@@ -14359,7 +15669,7 @@
       </w:rPr>
     </w:lvl>
   </w:abstractNum>
-  <w:abstractNum w:abstractNumId="63" w15:restartNumberingAfterBreak="0">
+  <w:abstractNum w:abstractNumId="65" w15:restartNumberingAfterBreak="0">
     <w:nsid w:val="357B7363"/>
     <w:multiLevelType w:val="hybridMultilevel"/>
     <w:tmpl w:val="00D411EC"/>
@@ -14471,7 +15781,7 @@
       </w:rPr>
     </w:lvl>
   </w:abstractNum>
-  <w:abstractNum w:abstractNumId="64" w15:restartNumberingAfterBreak="0">
+  <w:abstractNum w:abstractNumId="66" w15:restartNumberingAfterBreak="0">
     <w:nsid w:val="3583100F"/>
     <w:multiLevelType w:val="hybridMultilevel"/>
     <w:tmpl w:val="848ECFAA"/>
@@ -14584,7 +15894,7 @@
       </w:rPr>
     </w:lvl>
   </w:abstractNum>
-  <w:abstractNum w:abstractNumId="65" w15:restartNumberingAfterBreak="0">
+  <w:abstractNum w:abstractNumId="67" w15:restartNumberingAfterBreak="0">
     <w:nsid w:val="3623194A"/>
     <w:multiLevelType w:val="multilevel"/>
     <w:tmpl w:val="63F4E6F0"/>
@@ -14733,7 +16043,7 @@
       </w:rPr>
     </w:lvl>
   </w:abstractNum>
-  <w:abstractNum w:abstractNumId="66" w15:restartNumberingAfterBreak="0">
+  <w:abstractNum w:abstractNumId="68" w15:restartNumberingAfterBreak="0">
     <w:nsid w:val="36AD3FB0"/>
     <w:multiLevelType w:val="multilevel"/>
     <w:tmpl w:val="0644AEEA"/>
@@ -14882,7 +16192,7 @@
       </w:rPr>
     </w:lvl>
   </w:abstractNum>
-  <w:abstractNum w:abstractNumId="67" w15:restartNumberingAfterBreak="0">
+  <w:abstractNum w:abstractNumId="69" w15:restartNumberingAfterBreak="0">
     <w:nsid w:val="371A2CDE"/>
     <w:multiLevelType w:val="hybridMultilevel"/>
     <w:tmpl w:val="EA9C00CC"/>
@@ -14994,7 +16304,7 @@
       </w:rPr>
     </w:lvl>
   </w:abstractNum>
-  <w:abstractNum w:abstractNumId="68" w15:restartNumberingAfterBreak="0">
+  <w:abstractNum w:abstractNumId="70" w15:restartNumberingAfterBreak="0">
     <w:nsid w:val="373D5E48"/>
     <w:multiLevelType w:val="hybridMultilevel"/>
     <w:tmpl w:val="8A6E38C0"/>
@@ -15107,7 +16417,7 @@
       </w:rPr>
     </w:lvl>
   </w:abstractNum>
-  <w:abstractNum w:abstractNumId="69" w15:restartNumberingAfterBreak="0">
+  <w:abstractNum w:abstractNumId="71" w15:restartNumberingAfterBreak="0">
     <w:nsid w:val="3B446B2D"/>
     <w:multiLevelType w:val="hybridMultilevel"/>
     <w:tmpl w:val="B638176E"/>
@@ -15219,7 +16529,7 @@
       </w:rPr>
     </w:lvl>
   </w:abstractNum>
-  <w:abstractNum w:abstractNumId="70" w15:restartNumberingAfterBreak="0">
+  <w:abstractNum w:abstractNumId="72" w15:restartNumberingAfterBreak="0">
     <w:nsid w:val="3B6B41F5"/>
     <w:multiLevelType w:val="hybridMultilevel"/>
     <w:tmpl w:val="10A26168"/>
@@ -15331,7 +16641,7 @@
       </w:rPr>
     </w:lvl>
   </w:abstractNum>
-  <w:abstractNum w:abstractNumId="71" w15:restartNumberingAfterBreak="0">
+  <w:abstractNum w:abstractNumId="73" w15:restartNumberingAfterBreak="0">
     <w:nsid w:val="3C5546BA"/>
     <w:multiLevelType w:val="hybridMultilevel"/>
     <w:tmpl w:val="3434F5E4"/>
@@ -15443,7 +16753,7 @@
       </w:rPr>
     </w:lvl>
   </w:abstractNum>
-  <w:abstractNum w:abstractNumId="72" w15:restartNumberingAfterBreak="0">
+  <w:abstractNum w:abstractNumId="74" w15:restartNumberingAfterBreak="0">
     <w:nsid w:val="3C623C55"/>
     <w:multiLevelType w:val="multilevel"/>
     <w:tmpl w:val="A0B0E8F4"/>
@@ -15592,7 +16902,7 @@
       </w:rPr>
     </w:lvl>
   </w:abstractNum>
-  <w:abstractNum w:abstractNumId="73" w15:restartNumberingAfterBreak="0">
+  <w:abstractNum w:abstractNumId="75" w15:restartNumberingAfterBreak="0">
     <w:nsid w:val="3CD27F78"/>
     <w:multiLevelType w:val="multilevel"/>
     <w:tmpl w:val="FCDE767A"/>
@@ -15741,7 +17051,7 @@
       </w:rPr>
     </w:lvl>
   </w:abstractNum>
-  <w:abstractNum w:abstractNumId="74" w15:restartNumberingAfterBreak="0">
+  <w:abstractNum w:abstractNumId="76" w15:restartNumberingAfterBreak="0">
     <w:nsid w:val="3CD74B18"/>
     <w:multiLevelType w:val="hybridMultilevel"/>
     <w:tmpl w:val="2FF42220"/>
@@ -15854,7 +17164,7 @@
       </w:rPr>
     </w:lvl>
   </w:abstractNum>
-  <w:abstractNum w:abstractNumId="75" w15:restartNumberingAfterBreak="0">
+  <w:abstractNum w:abstractNumId="77" w15:restartNumberingAfterBreak="0">
     <w:nsid w:val="3D2F7E79"/>
     <w:multiLevelType w:val="hybridMultilevel"/>
     <w:tmpl w:val="6ED674BE"/>
@@ -15966,7 +17276,7 @@
       </w:rPr>
     </w:lvl>
   </w:abstractNum>
-  <w:abstractNum w:abstractNumId="76" w15:restartNumberingAfterBreak="0">
+  <w:abstractNum w:abstractNumId="78" w15:restartNumberingAfterBreak="0">
     <w:nsid w:val="3D397287"/>
     <w:multiLevelType w:val="hybridMultilevel"/>
     <w:tmpl w:val="F4503122"/>
@@ -16078,7 +17388,7 @@
       </w:rPr>
     </w:lvl>
   </w:abstractNum>
-  <w:abstractNum w:abstractNumId="77" w15:restartNumberingAfterBreak="0">
+  <w:abstractNum w:abstractNumId="79" w15:restartNumberingAfterBreak="0">
     <w:nsid w:val="3E685FF3"/>
     <w:multiLevelType w:val="multilevel"/>
     <w:tmpl w:val="7D20B538"/>
@@ -16227,7 +17537,7 @@
       </w:rPr>
     </w:lvl>
   </w:abstractNum>
-  <w:abstractNum w:abstractNumId="78" w15:restartNumberingAfterBreak="0">
+  <w:abstractNum w:abstractNumId="80" w15:restartNumberingAfterBreak="0">
     <w:nsid w:val="3F346C2C"/>
     <w:multiLevelType w:val="multilevel"/>
     <w:tmpl w:val="63F4E6F0"/>
@@ -16376,7 +17686,7 @@
       </w:rPr>
     </w:lvl>
   </w:abstractNum>
-  <w:abstractNum w:abstractNumId="79" w15:restartNumberingAfterBreak="0">
+  <w:abstractNum w:abstractNumId="81" w15:restartNumberingAfterBreak="0">
     <w:nsid w:val="3FCB1322"/>
     <w:multiLevelType w:val="hybridMultilevel"/>
     <w:tmpl w:val="55C012B2"/>
@@ -16488,7 +17798,7 @@
       </w:rPr>
     </w:lvl>
   </w:abstractNum>
-  <w:abstractNum w:abstractNumId="80" w15:restartNumberingAfterBreak="0">
+  <w:abstractNum w:abstractNumId="82" w15:restartNumberingAfterBreak="0">
     <w:nsid w:val="41A9344F"/>
     <w:multiLevelType w:val="hybridMultilevel"/>
     <w:tmpl w:val="0FB60038"/>
@@ -16601,7 +17911,7 @@
       </w:rPr>
     </w:lvl>
   </w:abstractNum>
-  <w:abstractNum w:abstractNumId="81" w15:restartNumberingAfterBreak="0">
+  <w:abstractNum w:abstractNumId="83" w15:restartNumberingAfterBreak="0">
     <w:nsid w:val="42004E1F"/>
     <w:multiLevelType w:val="hybridMultilevel"/>
     <w:tmpl w:val="770C8314"/>
@@ -16713,7 +18023,7 @@
       </w:rPr>
     </w:lvl>
   </w:abstractNum>
-  <w:abstractNum w:abstractNumId="82" w15:restartNumberingAfterBreak="0">
+  <w:abstractNum w:abstractNumId="84" w15:restartNumberingAfterBreak="0">
     <w:nsid w:val="439F7169"/>
     <w:multiLevelType w:val="hybridMultilevel"/>
     <w:tmpl w:val="1884EDCA"/>
@@ -16826,7 +18136,7 @@
       </w:rPr>
     </w:lvl>
   </w:abstractNum>
-  <w:abstractNum w:abstractNumId="83" w15:restartNumberingAfterBreak="0">
+  <w:abstractNum w:abstractNumId="85" w15:restartNumberingAfterBreak="0">
     <w:nsid w:val="43EA1D69"/>
     <w:multiLevelType w:val="multilevel"/>
     <w:tmpl w:val="DFEC23EC"/>
@@ -16975,7 +18285,7 @@
       </w:rPr>
     </w:lvl>
   </w:abstractNum>
-  <w:abstractNum w:abstractNumId="84" w15:restartNumberingAfterBreak="0">
+  <w:abstractNum w:abstractNumId="86" w15:restartNumberingAfterBreak="0">
     <w:nsid w:val="44320084"/>
     <w:multiLevelType w:val="hybridMultilevel"/>
     <w:tmpl w:val="CE5076D4"/>
@@ -17087,7 +18397,7 @@
       </w:rPr>
     </w:lvl>
   </w:abstractNum>
-  <w:abstractNum w:abstractNumId="85" w15:restartNumberingAfterBreak="0">
+  <w:abstractNum w:abstractNumId="87" w15:restartNumberingAfterBreak="0">
     <w:nsid w:val="44554567"/>
     <w:multiLevelType w:val="hybridMultilevel"/>
     <w:tmpl w:val="78748252"/>
@@ -17199,7 +18509,7 @@
       </w:rPr>
     </w:lvl>
   </w:abstractNum>
-  <w:abstractNum w:abstractNumId="86" w15:restartNumberingAfterBreak="0">
+  <w:abstractNum w:abstractNumId="88" w15:restartNumberingAfterBreak="0">
     <w:nsid w:val="49005094"/>
     <w:multiLevelType w:val="hybridMultilevel"/>
     <w:tmpl w:val="14848CBE"/>
@@ -17311,7 +18621,7 @@
       </w:rPr>
     </w:lvl>
   </w:abstractNum>
-  <w:abstractNum w:abstractNumId="87" w15:restartNumberingAfterBreak="0">
+  <w:abstractNum w:abstractNumId="89" w15:restartNumberingAfterBreak="0">
     <w:nsid w:val="49243794"/>
     <w:multiLevelType w:val="multilevel"/>
     <w:tmpl w:val="E7681528"/>
@@ -17460,7 +18770,7 @@
       </w:rPr>
     </w:lvl>
   </w:abstractNum>
-  <w:abstractNum w:abstractNumId="88" w15:restartNumberingAfterBreak="0">
+  <w:abstractNum w:abstractNumId="90" w15:restartNumberingAfterBreak="0">
     <w:nsid w:val="4A880990"/>
     <w:multiLevelType w:val="hybridMultilevel"/>
     <w:tmpl w:val="F17E12C2"/>
@@ -17572,7 +18882,7 @@
       </w:rPr>
     </w:lvl>
   </w:abstractNum>
-  <w:abstractNum w:abstractNumId="89" w15:restartNumberingAfterBreak="0">
+  <w:abstractNum w:abstractNumId="91" w15:restartNumberingAfterBreak="0">
     <w:nsid w:val="4B182B12"/>
     <w:multiLevelType w:val="hybridMultilevel"/>
     <w:tmpl w:val="31C486B4"/>
@@ -17684,7 +18994,7 @@
       </w:rPr>
     </w:lvl>
   </w:abstractNum>
-  <w:abstractNum w:abstractNumId="90" w15:restartNumberingAfterBreak="0">
+  <w:abstractNum w:abstractNumId="92" w15:restartNumberingAfterBreak="0">
     <w:nsid w:val="4BA13766"/>
     <w:multiLevelType w:val="multilevel"/>
     <w:tmpl w:val="63F4E6F0"/>
@@ -17833,7 +19143,7 @@
       </w:rPr>
     </w:lvl>
   </w:abstractNum>
-  <w:abstractNum w:abstractNumId="91" w15:restartNumberingAfterBreak="0">
+  <w:abstractNum w:abstractNumId="93" w15:restartNumberingAfterBreak="0">
     <w:nsid w:val="4E65371E"/>
     <w:multiLevelType w:val="hybridMultilevel"/>
     <w:tmpl w:val="53EE4538"/>
@@ -17945,7 +19255,7 @@
       </w:rPr>
     </w:lvl>
   </w:abstractNum>
-  <w:abstractNum w:abstractNumId="92" w15:restartNumberingAfterBreak="0">
+  <w:abstractNum w:abstractNumId="94" w15:restartNumberingAfterBreak="0">
     <w:nsid w:val="4E9A3F16"/>
     <w:multiLevelType w:val="multilevel"/>
     <w:tmpl w:val="63F4E6F0"/>
@@ -18094,7 +19404,7 @@
       </w:rPr>
     </w:lvl>
   </w:abstractNum>
-  <w:abstractNum w:abstractNumId="93" w15:restartNumberingAfterBreak="0">
+  <w:abstractNum w:abstractNumId="95" w15:restartNumberingAfterBreak="0">
     <w:nsid w:val="500B790D"/>
     <w:multiLevelType w:val="multilevel"/>
     <w:tmpl w:val="63F4E6F0"/>
@@ -18243,7 +19553,7 @@
       </w:rPr>
     </w:lvl>
   </w:abstractNum>
-  <w:abstractNum w:abstractNumId="94" w15:restartNumberingAfterBreak="0">
+  <w:abstractNum w:abstractNumId="96" w15:restartNumberingAfterBreak="0">
     <w:nsid w:val="526538B7"/>
     <w:multiLevelType w:val="hybridMultilevel"/>
     <w:tmpl w:val="E6A017F2"/>
@@ -18356,7 +19666,7 @@
       </w:rPr>
     </w:lvl>
   </w:abstractNum>
-  <w:abstractNum w:abstractNumId="95" w15:restartNumberingAfterBreak="0">
+  <w:abstractNum w:abstractNumId="97" w15:restartNumberingAfterBreak="0">
     <w:nsid w:val="537E56D9"/>
     <w:multiLevelType w:val="multilevel"/>
     <w:tmpl w:val="1B6E8B6A"/>
@@ -18505,7 +19815,7 @@
       </w:rPr>
     </w:lvl>
   </w:abstractNum>
-  <w:abstractNum w:abstractNumId="96" w15:restartNumberingAfterBreak="0">
+  <w:abstractNum w:abstractNumId="98" w15:restartNumberingAfterBreak="0">
     <w:nsid w:val="53E6601E"/>
     <w:multiLevelType w:val="hybridMultilevel"/>
     <w:tmpl w:val="66F0666A"/>
@@ -18618,7 +19928,7 @@
       </w:rPr>
     </w:lvl>
   </w:abstractNum>
-  <w:abstractNum w:abstractNumId="97" w15:restartNumberingAfterBreak="0">
+  <w:abstractNum w:abstractNumId="99" w15:restartNumberingAfterBreak="0">
     <w:nsid w:val="551D6F91"/>
     <w:multiLevelType w:val="hybridMultilevel"/>
     <w:tmpl w:val="9522B3C6"/>
@@ -18730,7 +20040,7 @@
       </w:rPr>
     </w:lvl>
   </w:abstractNum>
-  <w:abstractNum w:abstractNumId="98" w15:restartNumberingAfterBreak="0">
+  <w:abstractNum w:abstractNumId="100" w15:restartNumberingAfterBreak="0">
     <w:nsid w:val="555451DA"/>
     <w:multiLevelType w:val="hybridMultilevel"/>
     <w:tmpl w:val="CAB2A550"/>
@@ -18843,7 +20153,7 @@
       </w:rPr>
     </w:lvl>
   </w:abstractNum>
-  <w:abstractNum w:abstractNumId="99" w15:restartNumberingAfterBreak="0">
+  <w:abstractNum w:abstractNumId="101" w15:restartNumberingAfterBreak="0">
     <w:nsid w:val="55655B93"/>
     <w:multiLevelType w:val="multilevel"/>
     <w:tmpl w:val="9C88A4A8"/>
@@ -18992,7 +20302,7 @@
       </w:rPr>
     </w:lvl>
   </w:abstractNum>
-  <w:abstractNum w:abstractNumId="100" w15:restartNumberingAfterBreak="0">
+  <w:abstractNum w:abstractNumId="102" w15:restartNumberingAfterBreak="0">
     <w:nsid w:val="55B95BED"/>
     <w:multiLevelType w:val="hybridMultilevel"/>
     <w:tmpl w:val="A9B866FC"/>
@@ -19105,7 +20415,7 @@
       </w:rPr>
     </w:lvl>
   </w:abstractNum>
-  <w:abstractNum w:abstractNumId="101" w15:restartNumberingAfterBreak="0">
+  <w:abstractNum w:abstractNumId="103" w15:restartNumberingAfterBreak="0">
     <w:nsid w:val="562D4F1F"/>
     <w:multiLevelType w:val="hybridMultilevel"/>
     <w:tmpl w:val="1FF8D31C"/>
@@ -19217,7 +20527,7 @@
       </w:rPr>
     </w:lvl>
   </w:abstractNum>
-  <w:abstractNum w:abstractNumId="102" w15:restartNumberingAfterBreak="0">
+  <w:abstractNum w:abstractNumId="104" w15:restartNumberingAfterBreak="0">
     <w:nsid w:val="565A0C8B"/>
     <w:multiLevelType w:val="multilevel"/>
     <w:tmpl w:val="AB24FF2E"/>
@@ -19366,7 +20676,7 @@
       </w:rPr>
     </w:lvl>
   </w:abstractNum>
-  <w:abstractNum w:abstractNumId="103" w15:restartNumberingAfterBreak="0">
+  <w:abstractNum w:abstractNumId="105" w15:restartNumberingAfterBreak="0">
     <w:nsid w:val="566E7C65"/>
     <w:multiLevelType w:val="multilevel"/>
     <w:tmpl w:val="28803B4C"/>
@@ -19515,7 +20825,7 @@
       </w:rPr>
     </w:lvl>
   </w:abstractNum>
-  <w:abstractNum w:abstractNumId="104" w15:restartNumberingAfterBreak="0">
+  <w:abstractNum w:abstractNumId="106" w15:restartNumberingAfterBreak="0">
     <w:nsid w:val="57407594"/>
     <w:multiLevelType w:val="multilevel"/>
     <w:tmpl w:val="E6E2F8AE"/>
@@ -19664,7 +20974,7 @@
       </w:rPr>
     </w:lvl>
   </w:abstractNum>
-  <w:abstractNum w:abstractNumId="105" w15:restartNumberingAfterBreak="0">
+  <w:abstractNum w:abstractNumId="107" w15:restartNumberingAfterBreak="0">
     <w:nsid w:val="577F771B"/>
     <w:multiLevelType w:val="hybridMultilevel"/>
     <w:tmpl w:val="0F2C5914"/>
@@ -19776,7 +21086,7 @@
       </w:rPr>
     </w:lvl>
   </w:abstractNum>
-  <w:abstractNum w:abstractNumId="106" w15:restartNumberingAfterBreak="0">
+  <w:abstractNum w:abstractNumId="108" w15:restartNumberingAfterBreak="0">
     <w:nsid w:val="57C43CDD"/>
     <w:multiLevelType w:val="hybridMultilevel"/>
     <w:tmpl w:val="6C94FB5E"/>
@@ -19889,7 +21199,7 @@
       </w:rPr>
     </w:lvl>
   </w:abstractNum>
-  <w:abstractNum w:abstractNumId="107" w15:restartNumberingAfterBreak="0">
+  <w:abstractNum w:abstractNumId="109" w15:restartNumberingAfterBreak="0">
     <w:nsid w:val="58393977"/>
     <w:multiLevelType w:val="hybridMultilevel"/>
     <w:tmpl w:val="985A5484"/>
@@ -20002,7 +21312,7 @@
       </w:rPr>
     </w:lvl>
   </w:abstractNum>
-  <w:abstractNum w:abstractNumId="108" w15:restartNumberingAfterBreak="0">
+  <w:abstractNum w:abstractNumId="110" w15:restartNumberingAfterBreak="0">
     <w:nsid w:val="59EB4CE4"/>
     <w:multiLevelType w:val="multilevel"/>
     <w:tmpl w:val="63F4E6F0"/>
@@ -20151,7 +21461,7 @@
       </w:rPr>
     </w:lvl>
   </w:abstractNum>
-  <w:abstractNum w:abstractNumId="109" w15:restartNumberingAfterBreak="0">
+  <w:abstractNum w:abstractNumId="111" w15:restartNumberingAfterBreak="0">
     <w:nsid w:val="5BD11962"/>
     <w:multiLevelType w:val="hybridMultilevel"/>
     <w:tmpl w:val="89A4B834"/>
@@ -20240,7 +21550,7 @@
       </w:pPr>
     </w:lvl>
   </w:abstractNum>
-  <w:abstractNum w:abstractNumId="110" w15:restartNumberingAfterBreak="0">
+  <w:abstractNum w:abstractNumId="112" w15:restartNumberingAfterBreak="0">
     <w:nsid w:val="5C950DBA"/>
     <w:multiLevelType w:val="hybridMultilevel"/>
     <w:tmpl w:val="7D78F950"/>
@@ -20352,7 +21662,7 @@
       </w:rPr>
     </w:lvl>
   </w:abstractNum>
-  <w:abstractNum w:abstractNumId="111" w15:restartNumberingAfterBreak="0">
+  <w:abstractNum w:abstractNumId="113" w15:restartNumberingAfterBreak="0">
     <w:nsid w:val="5D2A5D3B"/>
     <w:multiLevelType w:val="hybridMultilevel"/>
     <w:tmpl w:val="3AF89EA6"/>
@@ -20443,7 +21753,7 @@
       </w:pPr>
     </w:lvl>
   </w:abstractNum>
-  <w:abstractNum w:abstractNumId="112" w15:restartNumberingAfterBreak="0">
+  <w:abstractNum w:abstractNumId="114" w15:restartNumberingAfterBreak="0">
     <w:nsid w:val="5D9E49FD"/>
     <w:multiLevelType w:val="hybridMultilevel"/>
     <w:tmpl w:val="4EE40BB4"/>
@@ -20555,7 +21865,7 @@
       </w:rPr>
     </w:lvl>
   </w:abstractNum>
-  <w:abstractNum w:abstractNumId="113" w15:restartNumberingAfterBreak="0">
+  <w:abstractNum w:abstractNumId="115" w15:restartNumberingAfterBreak="0">
     <w:nsid w:val="5DB7107D"/>
     <w:multiLevelType w:val="multilevel"/>
     <w:tmpl w:val="6520107A"/>
@@ -20704,7 +22014,7 @@
       </w:rPr>
     </w:lvl>
   </w:abstractNum>
-  <w:abstractNum w:abstractNumId="114" w15:restartNumberingAfterBreak="0">
+  <w:abstractNum w:abstractNumId="116" w15:restartNumberingAfterBreak="0">
     <w:nsid w:val="5E9370A7"/>
     <w:multiLevelType w:val="hybridMultilevel"/>
     <w:tmpl w:val="13480456"/>
@@ -20790,7 +22100,7 @@
       </w:pPr>
     </w:lvl>
   </w:abstractNum>
-  <w:abstractNum w:abstractNumId="115" w15:restartNumberingAfterBreak="0">
+  <w:abstractNum w:abstractNumId="117" w15:restartNumberingAfterBreak="0">
     <w:nsid w:val="60421322"/>
     <w:multiLevelType w:val="hybridMultilevel"/>
     <w:tmpl w:val="447CDBDC"/>
@@ -20902,7 +22212,7 @@
       </w:rPr>
     </w:lvl>
   </w:abstractNum>
-  <w:abstractNum w:abstractNumId="116" w15:restartNumberingAfterBreak="0">
+  <w:abstractNum w:abstractNumId="118" w15:restartNumberingAfterBreak="0">
     <w:nsid w:val="61926C31"/>
     <w:multiLevelType w:val="hybridMultilevel"/>
     <w:tmpl w:val="AFD27E5C"/>
@@ -21015,7 +22325,7 @@
       </w:rPr>
     </w:lvl>
   </w:abstractNum>
-  <w:abstractNum w:abstractNumId="117" w15:restartNumberingAfterBreak="0">
+  <w:abstractNum w:abstractNumId="119" w15:restartNumberingAfterBreak="0">
     <w:nsid w:val="622F5FC7"/>
     <w:multiLevelType w:val="hybridMultilevel"/>
     <w:tmpl w:val="49A6C2A6"/>
@@ -21128,7 +22438,7 @@
       </w:rPr>
     </w:lvl>
   </w:abstractNum>
-  <w:abstractNum w:abstractNumId="118" w15:restartNumberingAfterBreak="0">
+  <w:abstractNum w:abstractNumId="120" w15:restartNumberingAfterBreak="0">
     <w:nsid w:val="62AC33B4"/>
     <w:multiLevelType w:val="multilevel"/>
     <w:tmpl w:val="A074F3CA"/>
@@ -21277,7 +22587,7 @@
       </w:rPr>
     </w:lvl>
   </w:abstractNum>
-  <w:abstractNum w:abstractNumId="119" w15:restartNumberingAfterBreak="0">
+  <w:abstractNum w:abstractNumId="121" w15:restartNumberingAfterBreak="0">
     <w:nsid w:val="63B44674"/>
     <w:multiLevelType w:val="multilevel"/>
     <w:tmpl w:val="08F4FA9A"/>
@@ -21426,7 +22736,7 @@
       </w:rPr>
     </w:lvl>
   </w:abstractNum>
-  <w:abstractNum w:abstractNumId="120" w15:restartNumberingAfterBreak="0">
+  <w:abstractNum w:abstractNumId="122" w15:restartNumberingAfterBreak="0">
     <w:nsid w:val="63C245D4"/>
     <w:multiLevelType w:val="hybridMultilevel"/>
     <w:tmpl w:val="E1563A56"/>
@@ -21538,7 +22848,7 @@
       </w:rPr>
     </w:lvl>
   </w:abstractNum>
-  <w:abstractNum w:abstractNumId="121" w15:restartNumberingAfterBreak="0">
+  <w:abstractNum w:abstractNumId="123" w15:restartNumberingAfterBreak="0">
     <w:nsid w:val="64F30198"/>
     <w:multiLevelType w:val="multilevel"/>
     <w:tmpl w:val="63F4E6F0"/>
@@ -21687,7 +22997,7 @@
       </w:rPr>
     </w:lvl>
   </w:abstractNum>
-  <w:abstractNum w:abstractNumId="122" w15:restartNumberingAfterBreak="0">
+  <w:abstractNum w:abstractNumId="124" w15:restartNumberingAfterBreak="0">
     <w:nsid w:val="65AF2502"/>
     <w:multiLevelType w:val="hybridMultilevel"/>
     <w:tmpl w:val="FB2A44D8"/>
@@ -21800,7 +23110,7 @@
       </w:rPr>
     </w:lvl>
   </w:abstractNum>
-  <w:abstractNum w:abstractNumId="123" w15:restartNumberingAfterBreak="0">
+  <w:abstractNum w:abstractNumId="125" w15:restartNumberingAfterBreak="0">
     <w:nsid w:val="671614F0"/>
     <w:multiLevelType w:val="multilevel"/>
     <w:tmpl w:val="63F4E6F0"/>
@@ -21949,7 +23259,7 @@
       </w:rPr>
     </w:lvl>
   </w:abstractNum>
-  <w:abstractNum w:abstractNumId="124" w15:restartNumberingAfterBreak="0">
+  <w:abstractNum w:abstractNumId="126" w15:restartNumberingAfterBreak="0">
     <w:nsid w:val="6859691D"/>
     <w:multiLevelType w:val="multilevel"/>
     <w:tmpl w:val="826A9D48"/>
@@ -22098,7 +23408,7 @@
       </w:rPr>
     </w:lvl>
   </w:abstractNum>
-  <w:abstractNum w:abstractNumId="125" w15:restartNumberingAfterBreak="0">
+  <w:abstractNum w:abstractNumId="127" w15:restartNumberingAfterBreak="0">
     <w:nsid w:val="68817757"/>
     <w:multiLevelType w:val="multilevel"/>
     <w:tmpl w:val="34EE1968"/>
@@ -22247,7 +23557,7 @@
       </w:rPr>
     </w:lvl>
   </w:abstractNum>
-  <w:abstractNum w:abstractNumId="126" w15:restartNumberingAfterBreak="0">
+  <w:abstractNum w:abstractNumId="128" w15:restartNumberingAfterBreak="0">
     <w:nsid w:val="68BE10E8"/>
     <w:multiLevelType w:val="hybridMultilevel"/>
     <w:tmpl w:val="326CD592"/>
@@ -22360,7 +23670,7 @@
       </w:rPr>
     </w:lvl>
   </w:abstractNum>
-  <w:abstractNum w:abstractNumId="127" w15:restartNumberingAfterBreak="0">
+  <w:abstractNum w:abstractNumId="129" w15:restartNumberingAfterBreak="0">
     <w:nsid w:val="68E86299"/>
     <w:multiLevelType w:val="hybridMultilevel"/>
     <w:tmpl w:val="9B5CBEE8"/>
@@ -22446,7 +23756,7 @@
       </w:pPr>
     </w:lvl>
   </w:abstractNum>
-  <w:abstractNum w:abstractNumId="128" w15:restartNumberingAfterBreak="0">
+  <w:abstractNum w:abstractNumId="130" w15:restartNumberingAfterBreak="0">
     <w:nsid w:val="69996D9A"/>
     <w:multiLevelType w:val="multilevel"/>
     <w:tmpl w:val="1780FC38"/>
@@ -22595,7 +23905,7 @@
       </w:rPr>
     </w:lvl>
   </w:abstractNum>
-  <w:abstractNum w:abstractNumId="129" w15:restartNumberingAfterBreak="0">
+  <w:abstractNum w:abstractNumId="131" w15:restartNumberingAfterBreak="0">
     <w:nsid w:val="6B3C30B9"/>
     <w:multiLevelType w:val="hybridMultilevel"/>
     <w:tmpl w:val="C938F8DE"/>
@@ -22707,7 +24017,7 @@
       </w:rPr>
     </w:lvl>
   </w:abstractNum>
-  <w:abstractNum w:abstractNumId="130" w15:restartNumberingAfterBreak="0">
+  <w:abstractNum w:abstractNumId="132" w15:restartNumberingAfterBreak="0">
     <w:nsid w:val="6D1511A0"/>
     <w:multiLevelType w:val="hybridMultilevel"/>
     <w:tmpl w:val="AAD8B9B4"/>
@@ -22819,7 +24129,7 @@
       </w:rPr>
     </w:lvl>
   </w:abstractNum>
-  <w:abstractNum w:abstractNumId="131" w15:restartNumberingAfterBreak="0">
+  <w:abstractNum w:abstractNumId="133" w15:restartNumberingAfterBreak="0">
     <w:nsid w:val="6DD255F1"/>
     <w:multiLevelType w:val="hybridMultilevel"/>
     <w:tmpl w:val="ACBC1404"/>
@@ -22932,7 +24242,7 @@
       </w:rPr>
     </w:lvl>
   </w:abstractNum>
-  <w:abstractNum w:abstractNumId="132" w15:restartNumberingAfterBreak="0">
+  <w:abstractNum w:abstractNumId="134" w15:restartNumberingAfterBreak="0">
     <w:nsid w:val="6DDB4404"/>
     <w:multiLevelType w:val="hybridMultilevel"/>
     <w:tmpl w:val="06428E32"/>
@@ -23045,7 +24355,7 @@
       </w:rPr>
     </w:lvl>
   </w:abstractNum>
-  <w:abstractNum w:abstractNumId="133" w15:restartNumberingAfterBreak="0">
+  <w:abstractNum w:abstractNumId="135" w15:restartNumberingAfterBreak="0">
     <w:nsid w:val="6F014B3B"/>
     <w:multiLevelType w:val="hybridMultilevel"/>
     <w:tmpl w:val="C89A39BE"/>
@@ -23157,7 +24467,7 @@
       </w:rPr>
     </w:lvl>
   </w:abstractNum>
-  <w:abstractNum w:abstractNumId="134" w15:restartNumberingAfterBreak="0">
+  <w:abstractNum w:abstractNumId="136" w15:restartNumberingAfterBreak="0">
     <w:nsid w:val="6F171273"/>
     <w:multiLevelType w:val="multilevel"/>
     <w:tmpl w:val="0240C564"/>
@@ -23306,7 +24616,7 @@
       </w:rPr>
     </w:lvl>
   </w:abstractNum>
-  <w:abstractNum w:abstractNumId="135" w15:restartNumberingAfterBreak="0">
+  <w:abstractNum w:abstractNumId="137" w15:restartNumberingAfterBreak="0">
     <w:nsid w:val="6FB82AAA"/>
     <w:multiLevelType w:val="multilevel"/>
     <w:tmpl w:val="FC46C7C0"/>
@@ -23455,7 +24765,7 @@
       </w:rPr>
     </w:lvl>
   </w:abstractNum>
-  <w:abstractNum w:abstractNumId="136" w15:restartNumberingAfterBreak="0">
+  <w:abstractNum w:abstractNumId="138" w15:restartNumberingAfterBreak="0">
     <w:nsid w:val="6FD46DCF"/>
     <w:multiLevelType w:val="hybridMultilevel"/>
     <w:tmpl w:val="EF5E6EC6"/>
@@ -23568,7 +24878,7 @@
       </w:rPr>
     </w:lvl>
   </w:abstractNum>
-  <w:abstractNum w:abstractNumId="137" w15:restartNumberingAfterBreak="0">
+  <w:abstractNum w:abstractNumId="139" w15:restartNumberingAfterBreak="0">
     <w:nsid w:val="70484E38"/>
     <w:multiLevelType w:val="multilevel"/>
     <w:tmpl w:val="22B26DD2"/>
@@ -23717,7 +25027,7 @@
       </w:rPr>
     </w:lvl>
   </w:abstractNum>
-  <w:abstractNum w:abstractNumId="138" w15:restartNumberingAfterBreak="0">
+  <w:abstractNum w:abstractNumId="140" w15:restartNumberingAfterBreak="0">
     <w:nsid w:val="70CB723E"/>
     <w:multiLevelType w:val="multilevel"/>
     <w:tmpl w:val="63F4E6F0"/>
@@ -23866,7 +25176,7 @@
       </w:rPr>
     </w:lvl>
   </w:abstractNum>
-  <w:abstractNum w:abstractNumId="139" w15:restartNumberingAfterBreak="0">
+  <w:abstractNum w:abstractNumId="141" w15:restartNumberingAfterBreak="0">
     <w:nsid w:val="71DB3F58"/>
     <w:multiLevelType w:val="multilevel"/>
     <w:tmpl w:val="63F4E6F0"/>
@@ -24015,7 +25325,7 @@
       </w:rPr>
     </w:lvl>
   </w:abstractNum>
-  <w:abstractNum w:abstractNumId="140" w15:restartNumberingAfterBreak="0">
+  <w:abstractNum w:abstractNumId="142" w15:restartNumberingAfterBreak="0">
     <w:nsid w:val="72F31FF2"/>
     <w:multiLevelType w:val="hybridMultilevel"/>
     <w:tmpl w:val="5C2693A0"/>
@@ -24127,7 +25437,7 @@
       </w:rPr>
     </w:lvl>
   </w:abstractNum>
-  <w:abstractNum w:abstractNumId="141" w15:restartNumberingAfterBreak="0">
+  <w:abstractNum w:abstractNumId="143" w15:restartNumberingAfterBreak="0">
     <w:nsid w:val="75B45140"/>
     <w:multiLevelType w:val="hybridMultilevel"/>
     <w:tmpl w:val="93F8F3C4"/>
@@ -24240,7 +25550,7 @@
       </w:rPr>
     </w:lvl>
   </w:abstractNum>
-  <w:abstractNum w:abstractNumId="142" w15:restartNumberingAfterBreak="0">
+  <w:abstractNum w:abstractNumId="144" w15:restartNumberingAfterBreak="0">
     <w:nsid w:val="76F60FFE"/>
     <w:multiLevelType w:val="multilevel"/>
     <w:tmpl w:val="63F4E6F0"/>
@@ -24389,7 +25699,7 @@
       </w:rPr>
     </w:lvl>
   </w:abstractNum>
-  <w:abstractNum w:abstractNumId="143" w15:restartNumberingAfterBreak="0">
+  <w:abstractNum w:abstractNumId="145" w15:restartNumberingAfterBreak="0">
     <w:nsid w:val="77572323"/>
     <w:multiLevelType w:val="multilevel"/>
     <w:tmpl w:val="63F4E6F0"/>
@@ -24538,7 +25848,7 @@
       </w:rPr>
     </w:lvl>
   </w:abstractNum>
-  <w:abstractNum w:abstractNumId="144" w15:restartNumberingAfterBreak="0">
+  <w:abstractNum w:abstractNumId="146" w15:restartNumberingAfterBreak="0">
     <w:nsid w:val="77B8201F"/>
     <w:multiLevelType w:val="hybridMultilevel"/>
     <w:tmpl w:val="D7160708"/>
@@ -24650,7 +25960,7 @@
       </w:rPr>
     </w:lvl>
   </w:abstractNum>
-  <w:abstractNum w:abstractNumId="145" w15:restartNumberingAfterBreak="0">
+  <w:abstractNum w:abstractNumId="147" w15:restartNumberingAfterBreak="0">
     <w:nsid w:val="79796FF9"/>
     <w:multiLevelType w:val="hybridMultilevel"/>
     <w:tmpl w:val="CFA8EF82"/>
@@ -24762,7 +26072,7 @@
       </w:rPr>
     </w:lvl>
   </w:abstractNum>
-  <w:abstractNum w:abstractNumId="146" w15:restartNumberingAfterBreak="0">
+  <w:abstractNum w:abstractNumId="148" w15:restartNumberingAfterBreak="0">
     <w:nsid w:val="79910410"/>
     <w:multiLevelType w:val="hybridMultilevel"/>
     <w:tmpl w:val="FC923542"/>
@@ -24874,7 +26184,7 @@
       </w:rPr>
     </w:lvl>
   </w:abstractNum>
-  <w:abstractNum w:abstractNumId="147" w15:restartNumberingAfterBreak="0">
+  <w:abstractNum w:abstractNumId="149" w15:restartNumberingAfterBreak="0">
     <w:nsid w:val="7AFF575A"/>
     <w:multiLevelType w:val="hybridMultilevel"/>
     <w:tmpl w:val="A6323D3E"/>
@@ -24986,7 +26296,7 @@
       </w:rPr>
     </w:lvl>
   </w:abstractNum>
-  <w:abstractNum w:abstractNumId="148" w15:restartNumberingAfterBreak="0">
+  <w:abstractNum w:abstractNumId="150" w15:restartNumberingAfterBreak="0">
     <w:nsid w:val="7B4018BF"/>
     <w:multiLevelType w:val="multilevel"/>
     <w:tmpl w:val="63F4E6F0"/>
@@ -25135,7 +26445,7 @@
       </w:rPr>
     </w:lvl>
   </w:abstractNum>
-  <w:abstractNum w:abstractNumId="149" w15:restartNumberingAfterBreak="0">
+  <w:abstractNum w:abstractNumId="151" w15:restartNumberingAfterBreak="0">
     <w:nsid w:val="7B4D1B33"/>
     <w:multiLevelType w:val="hybridMultilevel"/>
     <w:tmpl w:val="5EAC717E"/>
@@ -25247,7 +26557,7 @@
       </w:rPr>
     </w:lvl>
   </w:abstractNum>
-  <w:abstractNum w:abstractNumId="150" w15:restartNumberingAfterBreak="0">
+  <w:abstractNum w:abstractNumId="152" w15:restartNumberingAfterBreak="0">
     <w:nsid w:val="7CAC27CD"/>
     <w:multiLevelType w:val="multilevel"/>
     <w:tmpl w:val="3BC20E58"/>
@@ -25396,7 +26706,7 @@
       </w:rPr>
     </w:lvl>
   </w:abstractNum>
-  <w:abstractNum w:abstractNumId="151" w15:restartNumberingAfterBreak="0">
+  <w:abstractNum w:abstractNumId="153" w15:restartNumberingAfterBreak="0">
     <w:nsid w:val="7E5978EA"/>
     <w:multiLevelType w:val="hybridMultilevel"/>
     <w:tmpl w:val="D74C0DB0"/>
@@ -25508,7 +26818,7 @@
       </w:rPr>
     </w:lvl>
   </w:abstractNum>
-  <w:abstractNum w:abstractNumId="152" w15:restartNumberingAfterBreak="0">
+  <w:abstractNum w:abstractNumId="154" w15:restartNumberingAfterBreak="0">
     <w:nsid w:val="7F106A5D"/>
     <w:multiLevelType w:val="hybridMultilevel"/>
     <w:tmpl w:val="A1CA4816"/>
@@ -25621,82 +26931,82 @@
     </w:lvl>
   </w:abstractNum>
   <w:num w:numId="1" w16cid:durableId="1882476756">
-    <w:abstractNumId w:val="87"/>
+    <w:abstractNumId w:val="89"/>
   </w:num>
   <w:num w:numId="2" w16cid:durableId="871453468">
-    <w:abstractNumId w:val="24"/>
+    <w:abstractNumId w:val="25"/>
   </w:num>
   <w:num w:numId="3" w16cid:durableId="698706805">
-    <w:abstractNumId w:val="38"/>
+    <w:abstractNumId w:val="39"/>
   </w:num>
   <w:num w:numId="4" w16cid:durableId="1105467722">
-    <w:abstractNumId w:val="72"/>
+    <w:abstractNumId w:val="74"/>
   </w:num>
   <w:num w:numId="5" w16cid:durableId="769932622">
-    <w:abstractNumId w:val="103"/>
+    <w:abstractNumId w:val="105"/>
   </w:num>
   <w:num w:numId="6" w16cid:durableId="575944109">
-    <w:abstractNumId w:val="42"/>
+    <w:abstractNumId w:val="43"/>
   </w:num>
   <w:num w:numId="7" w16cid:durableId="877661689">
-    <w:abstractNumId w:val="137"/>
+    <w:abstractNumId w:val="139"/>
   </w:num>
   <w:num w:numId="8" w16cid:durableId="1390107422">
-    <w:abstractNumId w:val="77"/>
+    <w:abstractNumId w:val="79"/>
   </w:num>
   <w:num w:numId="9" w16cid:durableId="881866424">
-    <w:abstractNumId w:val="99"/>
+    <w:abstractNumId w:val="101"/>
   </w:num>
   <w:num w:numId="10" w16cid:durableId="1037244995">
-    <w:abstractNumId w:val="128"/>
+    <w:abstractNumId w:val="130"/>
   </w:num>
   <w:num w:numId="11" w16cid:durableId="1575554597">
+    <w:abstractNumId w:val="64"/>
+  </w:num>
+  <w:num w:numId="12" w16cid:durableId="915364478">
+    <w:abstractNumId w:val="85"/>
+  </w:num>
+  <w:num w:numId="13" w16cid:durableId="1386294114">
+    <w:abstractNumId w:val="121"/>
+  </w:num>
+  <w:num w:numId="14" w16cid:durableId="1071851223">
+    <w:abstractNumId w:val="26"/>
+  </w:num>
+  <w:num w:numId="15" w16cid:durableId="1545557520">
+    <w:abstractNumId w:val="75"/>
+  </w:num>
+  <w:num w:numId="16" w16cid:durableId="1102919547">
+    <w:abstractNumId w:val="152"/>
+  </w:num>
+  <w:num w:numId="17" w16cid:durableId="294526838">
+    <w:abstractNumId w:val="55"/>
+  </w:num>
+  <w:num w:numId="18" w16cid:durableId="679889896">
     <w:abstractNumId w:val="62"/>
   </w:num>
-  <w:num w:numId="12" w16cid:durableId="915364478">
-    <w:abstractNumId w:val="83"/>
-  </w:num>
-  <w:num w:numId="13" w16cid:durableId="1386294114">
-    <w:abstractNumId w:val="119"/>
-  </w:num>
-  <w:num w:numId="14" w16cid:durableId="1071851223">
-    <w:abstractNumId w:val="25"/>
-  </w:num>
-  <w:num w:numId="15" w16cid:durableId="1545557520">
-    <w:abstractNumId w:val="73"/>
-  </w:num>
-  <w:num w:numId="16" w16cid:durableId="1102919547">
-    <w:abstractNumId w:val="150"/>
-  </w:num>
-  <w:num w:numId="17" w16cid:durableId="294526838">
-    <w:abstractNumId w:val="53"/>
-  </w:num>
-  <w:num w:numId="18" w16cid:durableId="679889896">
-    <w:abstractNumId w:val="60"/>
-  </w:num>
   <w:num w:numId="19" w16cid:durableId="2119449470">
-    <w:abstractNumId w:val="95"/>
+    <w:abstractNumId w:val="97"/>
   </w:num>
   <w:num w:numId="20" w16cid:durableId="1365054799">
     <w:abstractNumId w:val="14"/>
   </w:num>
   <w:num w:numId="21" w16cid:durableId="1683512738">
-    <w:abstractNumId w:val="61"/>
+    <w:abstractNumId w:val="63"/>
   </w:num>
   <w:num w:numId="22" w16cid:durableId="1080098953">
-    <w:abstractNumId w:val="124"/>
+    <w:abstractNumId w:val="126"/>
   </w:num>
   <w:num w:numId="23" w16cid:durableId="1635717296">
-    <w:abstractNumId w:val="66"/>
+    <w:abstractNumId w:val="68"/>
   </w:num>
   <w:num w:numId="24" w16cid:durableId="544873123">
-    <w:abstractNumId w:val="118"/>
+    <w:abstractNumId w:val="120"/>
   </w:num>
   <w:num w:numId="25" w16cid:durableId="1128352778">
     <w:abstractNumId w:val="13"/>
   </w:num>
   <w:num w:numId="26" w16cid:durableId="1732537407">
-    <w:abstractNumId w:val="132"/>
+    <w:abstractNumId w:val="134"/>
   </w:num>
   <w:num w:numId="27" w16cid:durableId="945502064">
     <w:abstractNumId w:val="6"/>
@@ -25705,292 +27015,292 @@
     <w:abstractNumId w:val="3"/>
   </w:num>
   <w:num w:numId="29" w16cid:durableId="815955639">
-    <w:abstractNumId w:val="59"/>
+    <w:abstractNumId w:val="61"/>
   </w:num>
   <w:num w:numId="30" w16cid:durableId="1500659483">
-    <w:abstractNumId w:val="80"/>
+    <w:abstractNumId w:val="82"/>
   </w:num>
   <w:num w:numId="31" w16cid:durableId="118301211">
     <w:abstractNumId w:val="15"/>
   </w:num>
   <w:num w:numId="32" w16cid:durableId="732387979">
-    <w:abstractNumId w:val="43"/>
+    <w:abstractNumId w:val="44"/>
   </w:num>
   <w:num w:numId="33" w16cid:durableId="2129276417">
-    <w:abstractNumId w:val="17"/>
+    <w:abstractNumId w:val="18"/>
   </w:num>
   <w:num w:numId="34" w16cid:durableId="1470708820">
-    <w:abstractNumId w:val="48"/>
+    <w:abstractNumId w:val="50"/>
   </w:num>
   <w:num w:numId="35" w16cid:durableId="356852923">
-    <w:abstractNumId w:val="94"/>
+    <w:abstractNumId w:val="96"/>
   </w:num>
   <w:num w:numId="36" w16cid:durableId="430662559">
-    <w:abstractNumId w:val="20"/>
+    <w:abstractNumId w:val="21"/>
   </w:num>
   <w:num w:numId="37" w16cid:durableId="247080868">
-    <w:abstractNumId w:val="141"/>
+    <w:abstractNumId w:val="143"/>
   </w:num>
   <w:num w:numId="38" w16cid:durableId="158887408">
-    <w:abstractNumId w:val="116"/>
+    <w:abstractNumId w:val="118"/>
   </w:num>
   <w:num w:numId="39" w16cid:durableId="1681347932">
-    <w:abstractNumId w:val="136"/>
+    <w:abstractNumId w:val="138"/>
   </w:num>
   <w:num w:numId="40" w16cid:durableId="2101440158">
-    <w:abstractNumId w:val="76"/>
+    <w:abstractNumId w:val="78"/>
   </w:num>
   <w:num w:numId="41" w16cid:durableId="1250391122">
-    <w:abstractNumId w:val="111"/>
+    <w:abstractNumId w:val="113"/>
   </w:num>
   <w:num w:numId="42" w16cid:durableId="479083359">
-    <w:abstractNumId w:val="140"/>
+    <w:abstractNumId w:val="142"/>
   </w:num>
   <w:num w:numId="43" w16cid:durableId="1557860317">
-    <w:abstractNumId w:val="96"/>
+    <w:abstractNumId w:val="98"/>
   </w:num>
   <w:num w:numId="44" w16cid:durableId="2142183763">
     <w:abstractNumId w:val="8"/>
   </w:num>
   <w:num w:numId="45" w16cid:durableId="1357736349">
+    <w:abstractNumId w:val="148"/>
+  </w:num>
+  <w:num w:numId="46" w16cid:durableId="1519656040">
+    <w:abstractNumId w:val="147"/>
+  </w:num>
+  <w:num w:numId="47" w16cid:durableId="1078596852">
+    <w:abstractNumId w:val="154"/>
+  </w:num>
+  <w:num w:numId="48" w16cid:durableId="1027950100">
+    <w:abstractNumId w:val="36"/>
+  </w:num>
+  <w:num w:numId="49" w16cid:durableId="878516382">
+    <w:abstractNumId w:val="20"/>
+  </w:num>
+  <w:num w:numId="50" w16cid:durableId="363404927">
+    <w:abstractNumId w:val="69"/>
+  </w:num>
+  <w:num w:numId="51" w16cid:durableId="1128354320">
+    <w:abstractNumId w:val="132"/>
+  </w:num>
+  <w:num w:numId="52" w16cid:durableId="248543928">
+    <w:abstractNumId w:val="77"/>
+  </w:num>
+  <w:num w:numId="53" w16cid:durableId="965889214">
+    <w:abstractNumId w:val="103"/>
+  </w:num>
+  <w:num w:numId="54" w16cid:durableId="1827503240">
+    <w:abstractNumId w:val="111"/>
+  </w:num>
+  <w:num w:numId="55" w16cid:durableId="505748256">
+    <w:abstractNumId w:val="93"/>
+  </w:num>
+  <w:num w:numId="56" w16cid:durableId="2120370925">
+    <w:abstractNumId w:val="33"/>
+  </w:num>
+  <w:num w:numId="57" w16cid:durableId="369182267">
+    <w:abstractNumId w:val="17"/>
+  </w:num>
+  <w:num w:numId="58" w16cid:durableId="1000235123">
+    <w:abstractNumId w:val="99"/>
+  </w:num>
+  <w:num w:numId="59" w16cid:durableId="628516409">
+    <w:abstractNumId w:val="131"/>
+  </w:num>
+  <w:num w:numId="60" w16cid:durableId="2028865444">
+    <w:abstractNumId w:val="91"/>
+  </w:num>
+  <w:num w:numId="61" w16cid:durableId="943926811">
+    <w:abstractNumId w:val="151"/>
+  </w:num>
+  <w:num w:numId="62" w16cid:durableId="1841193257">
+    <w:abstractNumId w:val="71"/>
+  </w:num>
+  <w:num w:numId="63" w16cid:durableId="682322850">
+    <w:abstractNumId w:val="135"/>
+  </w:num>
+  <w:num w:numId="64" w16cid:durableId="2043705333">
+    <w:abstractNumId w:val="72"/>
+  </w:num>
+  <w:num w:numId="65" w16cid:durableId="1164854761">
+    <w:abstractNumId w:val="54"/>
+  </w:num>
+  <w:num w:numId="66" w16cid:durableId="1919972541">
+    <w:abstractNumId w:val="87"/>
+  </w:num>
+  <w:num w:numId="67" w16cid:durableId="463617329">
+    <w:abstractNumId w:val="58"/>
+  </w:num>
+  <w:num w:numId="68" w16cid:durableId="2064014330">
+    <w:abstractNumId w:val="107"/>
+  </w:num>
+  <w:num w:numId="69" w16cid:durableId="452797354">
+    <w:abstractNumId w:val="112"/>
+  </w:num>
+  <w:num w:numId="70" w16cid:durableId="1196650037">
+    <w:abstractNumId w:val="48"/>
+  </w:num>
+  <w:num w:numId="71" w16cid:durableId="940071828">
     <w:abstractNumId w:val="146"/>
   </w:num>
-  <w:num w:numId="46" w16cid:durableId="1519656040">
-    <w:abstractNumId w:val="145"/>
+  <w:num w:numId="72" w16cid:durableId="1608273926">
+    <w:abstractNumId w:val="73"/>
   </w:num>
-  <w:num w:numId="47" w16cid:durableId="1078596852">
-    <w:abstractNumId w:val="152"/>
+  <w:num w:numId="73" w16cid:durableId="2009864772">
+    <w:abstractNumId w:val="88"/>
   </w:num>
-  <w:num w:numId="48" w16cid:durableId="1027950100">
+  <w:num w:numId="74" w16cid:durableId="712267004">
     <w:abstractNumId w:val="35"/>
   </w:num>
-  <w:num w:numId="49" w16cid:durableId="878516382">
-    <w:abstractNumId w:val="19"/>
-  </w:num>
-  <w:num w:numId="50" w16cid:durableId="363404927">
-    <w:abstractNumId w:val="67"/>
-  </w:num>
-  <w:num w:numId="51" w16cid:durableId="1128354320">
-    <w:abstractNumId w:val="130"/>
-  </w:num>
-  <w:num w:numId="52" w16cid:durableId="248543928">
-    <w:abstractNumId w:val="75"/>
-  </w:num>
-  <w:num w:numId="53" w16cid:durableId="965889214">
-    <w:abstractNumId w:val="101"/>
-  </w:num>
-  <w:num w:numId="54" w16cid:durableId="1827503240">
-    <w:abstractNumId w:val="109"/>
-  </w:num>
-  <w:num w:numId="55" w16cid:durableId="505748256">
-    <w:abstractNumId w:val="91"/>
-  </w:num>
-  <w:num w:numId="56" w16cid:durableId="2120370925">
-    <w:abstractNumId w:val="32"/>
-  </w:num>
-  <w:num w:numId="57" w16cid:durableId="369182267">
-    <w:abstractNumId w:val="16"/>
-  </w:num>
-  <w:num w:numId="58" w16cid:durableId="1000235123">
-    <w:abstractNumId w:val="97"/>
-  </w:num>
-  <w:num w:numId="59" w16cid:durableId="628516409">
-    <w:abstractNumId w:val="129"/>
-  </w:num>
-  <w:num w:numId="60" w16cid:durableId="2028865444">
-    <w:abstractNumId w:val="89"/>
-  </w:num>
-  <w:num w:numId="61" w16cid:durableId="943926811">
-    <w:abstractNumId w:val="149"/>
-  </w:num>
-  <w:num w:numId="62" w16cid:durableId="1841193257">
-    <w:abstractNumId w:val="69"/>
-  </w:num>
-  <w:num w:numId="63" w16cid:durableId="682322850">
-    <w:abstractNumId w:val="133"/>
-  </w:num>
-  <w:num w:numId="64" w16cid:durableId="2043705333">
-    <w:abstractNumId w:val="70"/>
-  </w:num>
-  <w:num w:numId="65" w16cid:durableId="1164854761">
-    <w:abstractNumId w:val="52"/>
-  </w:num>
-  <w:num w:numId="66" w16cid:durableId="1919972541">
-    <w:abstractNumId w:val="85"/>
-  </w:num>
-  <w:num w:numId="67" w16cid:durableId="463617329">
-    <w:abstractNumId w:val="56"/>
-  </w:num>
-  <w:num w:numId="68" w16cid:durableId="2064014330">
-    <w:abstractNumId w:val="105"/>
-  </w:num>
-  <w:num w:numId="69" w16cid:durableId="452797354">
-    <w:abstractNumId w:val="110"/>
-  </w:num>
-  <w:num w:numId="70" w16cid:durableId="1196650037">
-    <w:abstractNumId w:val="47"/>
-  </w:num>
-  <w:num w:numId="71" w16cid:durableId="940071828">
-    <w:abstractNumId w:val="144"/>
-  </w:num>
-  <w:num w:numId="72" w16cid:durableId="1608273926">
-    <w:abstractNumId w:val="71"/>
-  </w:num>
-  <w:num w:numId="73" w16cid:durableId="2009864772">
-    <w:abstractNumId w:val="86"/>
-  </w:num>
-  <w:num w:numId="74" w16cid:durableId="712267004">
-    <w:abstractNumId w:val="34"/>
-  </w:num>
   <w:num w:numId="75" w16cid:durableId="506480902">
-    <w:abstractNumId w:val="30"/>
+    <w:abstractNumId w:val="31"/>
   </w:num>
   <w:num w:numId="76" w16cid:durableId="286202349">
-    <w:abstractNumId w:val="115"/>
+    <w:abstractNumId w:val="117"/>
   </w:num>
   <w:num w:numId="77" w16cid:durableId="156460757">
-    <w:abstractNumId w:val="63"/>
+    <w:abstractNumId w:val="65"/>
   </w:num>
   <w:num w:numId="78" w16cid:durableId="1230077056">
     <w:abstractNumId w:val="5"/>
   </w:num>
   <w:num w:numId="79" w16cid:durableId="1837106927">
-    <w:abstractNumId w:val="46"/>
+    <w:abstractNumId w:val="47"/>
   </w:num>
   <w:num w:numId="80" w16cid:durableId="287929152">
-    <w:abstractNumId w:val="33"/>
+    <w:abstractNumId w:val="34"/>
   </w:num>
   <w:num w:numId="81" w16cid:durableId="1672175260">
-    <w:abstractNumId w:val="81"/>
+    <w:abstractNumId w:val="83"/>
   </w:num>
   <w:num w:numId="82" w16cid:durableId="1954820163">
-    <w:abstractNumId w:val="55"/>
+    <w:abstractNumId w:val="57"/>
   </w:num>
   <w:num w:numId="83" w16cid:durableId="1990016594">
-    <w:abstractNumId w:val="22"/>
+    <w:abstractNumId w:val="23"/>
   </w:num>
   <w:num w:numId="84" w16cid:durableId="366876741">
-    <w:abstractNumId w:val="88"/>
+    <w:abstractNumId w:val="90"/>
   </w:num>
   <w:num w:numId="85" w16cid:durableId="15274915">
-    <w:abstractNumId w:val="36"/>
+    <w:abstractNumId w:val="37"/>
   </w:num>
   <w:num w:numId="86" w16cid:durableId="288124443">
     <w:abstractNumId w:val="9"/>
   </w:num>
   <w:num w:numId="87" w16cid:durableId="591351385">
-    <w:abstractNumId w:val="102"/>
+    <w:abstractNumId w:val="104"/>
   </w:num>
   <w:num w:numId="88" w16cid:durableId="1361005725">
-    <w:abstractNumId w:val="147"/>
+    <w:abstractNumId w:val="149"/>
   </w:num>
   <w:num w:numId="89" w16cid:durableId="219681743">
     <w:abstractNumId w:val="10"/>
   </w:num>
   <w:num w:numId="90" w16cid:durableId="194386594">
-    <w:abstractNumId w:val="112"/>
+    <w:abstractNumId w:val="114"/>
   </w:num>
   <w:num w:numId="91" w16cid:durableId="777793346">
-    <w:abstractNumId w:val="79"/>
+    <w:abstractNumId w:val="81"/>
   </w:num>
   <w:num w:numId="92" w16cid:durableId="173346871">
+    <w:abstractNumId w:val="86"/>
+  </w:num>
+  <w:num w:numId="93" w16cid:durableId="948700467">
+    <w:abstractNumId w:val="38"/>
+  </w:num>
+  <w:num w:numId="94" w16cid:durableId="1328363750">
+    <w:abstractNumId w:val="22"/>
+  </w:num>
+  <w:num w:numId="95" w16cid:durableId="541676570">
+    <w:abstractNumId w:val="66"/>
+  </w:num>
+  <w:num w:numId="96" w16cid:durableId="694119229">
     <w:abstractNumId w:val="84"/>
   </w:num>
-  <w:num w:numId="93" w16cid:durableId="948700467">
-    <w:abstractNumId w:val="37"/>
-  </w:num>
-  <w:num w:numId="94" w16cid:durableId="1328363750">
-    <w:abstractNumId w:val="21"/>
-  </w:num>
-  <w:num w:numId="95" w16cid:durableId="541676570">
-    <w:abstractNumId w:val="64"/>
-  </w:num>
-  <w:num w:numId="96" w16cid:durableId="694119229">
-    <w:abstractNumId w:val="82"/>
-  </w:num>
   <w:num w:numId="97" w16cid:durableId="704327987">
-    <w:abstractNumId w:val="50"/>
+    <w:abstractNumId w:val="52"/>
   </w:num>
   <w:num w:numId="98" w16cid:durableId="1157303613">
-    <w:abstractNumId w:val="23"/>
+    <w:abstractNumId w:val="24"/>
   </w:num>
   <w:num w:numId="99" w16cid:durableId="1706099794">
-    <w:abstractNumId w:val="135"/>
+    <w:abstractNumId w:val="137"/>
   </w:num>
   <w:num w:numId="100" w16cid:durableId="256404901">
-    <w:abstractNumId w:val="134"/>
+    <w:abstractNumId w:val="136"/>
   </w:num>
   <w:num w:numId="101" w16cid:durableId="924923012">
-    <w:abstractNumId w:val="27"/>
+    <w:abstractNumId w:val="28"/>
   </w:num>
   <w:num w:numId="102" w16cid:durableId="536550966">
-    <w:abstractNumId w:val="148"/>
+    <w:abstractNumId w:val="150"/>
   </w:num>
   <w:num w:numId="103" w16cid:durableId="425157302">
-    <w:abstractNumId w:val="65"/>
+    <w:abstractNumId w:val="67"/>
   </w:num>
   <w:num w:numId="104" w16cid:durableId="967664612">
-    <w:abstractNumId w:val="121"/>
+    <w:abstractNumId w:val="123"/>
   </w:num>
   <w:num w:numId="105" w16cid:durableId="361631616">
-    <w:abstractNumId w:val="90"/>
+    <w:abstractNumId w:val="92"/>
   </w:num>
   <w:num w:numId="106" w16cid:durableId="443623616">
-    <w:abstractNumId w:val="125"/>
+    <w:abstractNumId w:val="127"/>
   </w:num>
   <w:num w:numId="107" w16cid:durableId="150101619">
     <w:abstractNumId w:val="11"/>
   </w:num>
   <w:num w:numId="108" w16cid:durableId="1431658174">
-    <w:abstractNumId w:val="54"/>
+    <w:abstractNumId w:val="56"/>
   </w:num>
   <w:num w:numId="109" w16cid:durableId="1050495440">
     <w:abstractNumId w:val="0"/>
   </w:num>
   <w:num w:numId="110" w16cid:durableId="712924661">
-    <w:abstractNumId w:val="108"/>
+    <w:abstractNumId w:val="110"/>
   </w:num>
   <w:num w:numId="111" w16cid:durableId="1917784113">
-    <w:abstractNumId w:val="104"/>
+    <w:abstractNumId w:val="106"/>
   </w:num>
   <w:num w:numId="112" w16cid:durableId="896237065">
-    <w:abstractNumId w:val="113"/>
+    <w:abstractNumId w:val="115"/>
   </w:num>
   <w:num w:numId="113" w16cid:durableId="1171681430">
-    <w:abstractNumId w:val="138"/>
+    <w:abstractNumId w:val="140"/>
   </w:num>
   <w:num w:numId="114" w16cid:durableId="1552573199">
-    <w:abstractNumId w:val="139"/>
+    <w:abstractNumId w:val="141"/>
   </w:num>
   <w:num w:numId="115" w16cid:durableId="1920869674">
-    <w:abstractNumId w:val="123"/>
+    <w:abstractNumId w:val="125"/>
   </w:num>
   <w:num w:numId="116" w16cid:durableId="476724716">
-    <w:abstractNumId w:val="93"/>
+    <w:abstractNumId w:val="95"/>
   </w:num>
   <w:num w:numId="117" w16cid:durableId="658919541">
-    <w:abstractNumId w:val="92"/>
+    <w:abstractNumId w:val="94"/>
   </w:num>
   <w:num w:numId="118" w16cid:durableId="1622418131">
-    <w:abstractNumId w:val="44"/>
+    <w:abstractNumId w:val="45"/>
   </w:num>
   <w:num w:numId="119" w16cid:durableId="1693994672">
     <w:abstractNumId w:val="2"/>
   </w:num>
   <w:num w:numId="120" w16cid:durableId="396828229">
-    <w:abstractNumId w:val="143"/>
+    <w:abstractNumId w:val="145"/>
   </w:num>
   <w:num w:numId="121" w16cid:durableId="986058889">
-    <w:abstractNumId w:val="18"/>
+    <w:abstractNumId w:val="19"/>
   </w:num>
   <w:num w:numId="122" w16cid:durableId="1224410703">
-    <w:abstractNumId w:val="58"/>
+    <w:abstractNumId w:val="60"/>
   </w:num>
   <w:num w:numId="123" w16cid:durableId="1804040304">
-    <w:abstractNumId w:val="78"/>
+    <w:abstractNumId w:val="80"/>
   </w:num>
   <w:num w:numId="124" w16cid:durableId="114181197">
-    <w:abstractNumId w:val="142"/>
+    <w:abstractNumId w:val="144"/>
   </w:num>
   <w:num w:numId="125" w16cid:durableId="772671624">
     <w:abstractNumId w:val="4"/>
@@ -25999,85 +27309,91 @@
     <w:abstractNumId w:val="7"/>
   </w:num>
   <w:num w:numId="127" w16cid:durableId="1818105337">
-    <w:abstractNumId w:val="49"/>
+    <w:abstractNumId w:val="51"/>
   </w:num>
   <w:num w:numId="128" w16cid:durableId="384987847">
-    <w:abstractNumId w:val="28"/>
+    <w:abstractNumId w:val="29"/>
   </w:num>
   <w:num w:numId="129" w16cid:durableId="659895420">
-    <w:abstractNumId w:val="57"/>
+    <w:abstractNumId w:val="59"/>
   </w:num>
   <w:num w:numId="130" w16cid:durableId="1168907903">
-    <w:abstractNumId w:val="126"/>
+    <w:abstractNumId w:val="128"/>
   </w:num>
   <w:num w:numId="131" w16cid:durableId="430206235">
-    <w:abstractNumId w:val="117"/>
+    <w:abstractNumId w:val="119"/>
   </w:num>
   <w:num w:numId="132" w16cid:durableId="1207327089">
-    <w:abstractNumId w:val="26"/>
+    <w:abstractNumId w:val="27"/>
   </w:num>
   <w:num w:numId="133" w16cid:durableId="596404292">
-    <w:abstractNumId w:val="106"/>
+    <w:abstractNumId w:val="108"/>
   </w:num>
   <w:num w:numId="134" w16cid:durableId="2070372549">
+    <w:abstractNumId w:val="42"/>
+  </w:num>
+  <w:num w:numId="135" w16cid:durableId="1841265039">
+    <w:abstractNumId w:val="46"/>
+  </w:num>
+  <w:num w:numId="136" w16cid:durableId="1988632595">
     <w:abstractNumId w:val="41"/>
   </w:num>
-  <w:num w:numId="135" w16cid:durableId="1841265039">
-    <w:abstractNumId w:val="45"/>
-  </w:num>
-  <w:num w:numId="136" w16cid:durableId="1988632595">
-    <w:abstractNumId w:val="40"/>
-  </w:num>
   <w:num w:numId="137" w16cid:durableId="1218275126">
-    <w:abstractNumId w:val="68"/>
+    <w:abstractNumId w:val="70"/>
   </w:num>
   <w:num w:numId="138" w16cid:durableId="568660900">
-    <w:abstractNumId w:val="74"/>
+    <w:abstractNumId w:val="76"/>
   </w:num>
   <w:num w:numId="139" w16cid:durableId="967976864">
-    <w:abstractNumId w:val="107"/>
+    <w:abstractNumId w:val="109"/>
   </w:num>
   <w:num w:numId="140" w16cid:durableId="650643288">
+    <w:abstractNumId w:val="124"/>
+  </w:num>
+  <w:num w:numId="141" w16cid:durableId="219370247">
     <w:abstractNumId w:val="122"/>
   </w:num>
-  <w:num w:numId="141" w16cid:durableId="219370247">
-    <w:abstractNumId w:val="120"/>
-  </w:num>
   <w:num w:numId="142" w16cid:durableId="323239876">
-    <w:abstractNumId w:val="151"/>
+    <w:abstractNumId w:val="153"/>
   </w:num>
   <w:num w:numId="143" w16cid:durableId="1619793156">
-    <w:abstractNumId w:val="31"/>
+    <w:abstractNumId w:val="32"/>
   </w:num>
   <w:num w:numId="144" w16cid:durableId="1186332867">
-    <w:abstractNumId w:val="131"/>
+    <w:abstractNumId w:val="133"/>
   </w:num>
   <w:num w:numId="145" w16cid:durableId="89937035">
-    <w:abstractNumId w:val="51"/>
+    <w:abstractNumId w:val="53"/>
   </w:num>
   <w:num w:numId="146" w16cid:durableId="1975022609">
     <w:abstractNumId w:val="1"/>
   </w:num>
   <w:num w:numId="147" w16cid:durableId="1760910030">
-    <w:abstractNumId w:val="98"/>
+    <w:abstractNumId w:val="100"/>
   </w:num>
   <w:num w:numId="148" w16cid:durableId="349307706">
-    <w:abstractNumId w:val="127"/>
+    <w:abstractNumId w:val="129"/>
   </w:num>
   <w:num w:numId="149" w16cid:durableId="1600336622">
-    <w:abstractNumId w:val="29"/>
+    <w:abstractNumId w:val="30"/>
   </w:num>
   <w:num w:numId="150" w16cid:durableId="789783474">
-    <w:abstractNumId w:val="39"/>
+    <w:abstractNumId w:val="40"/>
   </w:num>
   <w:num w:numId="151" w16cid:durableId="1236017784">
     <w:abstractNumId w:val="12"/>
   </w:num>
   <w:num w:numId="152" w16cid:durableId="1483890789">
-    <w:abstractNumId w:val="100"/>
+    <w:abstractNumId w:val="102"/>
   </w:num>
   <w:num w:numId="153" w16cid:durableId="2104719660">
-    <w:abstractNumId w:val="114"/>
+    <w:abstractNumId w:val="116"/>
+  </w:num>
+  <w:num w:numId="154" w16cid:durableId="2030252929">
+    <w:abstractNumId w:val="49"/>
+  </w:num>
+  <w:num w:numId="155" w16cid:durableId="1356731706">
+    <w:abstractNumId w:val="16"/>
   </w:num>
 </w:numbering>
 </file>

</xml_diff>

<commit_message>
Branch Management APIs (#391)
</commit_message>
<xml_diff>
--- a/API Design.docx
+++ b/API Design.docx
@@ -6225,7 +6225,10 @@
       </w:pPr>
       <w:r>
         <w:lastRenderedPageBreak/>
-        <w:t>Agency Management API Design</w:t>
+        <w:t xml:space="preserve">Agency Management API </w:t>
+      </w:r>
+      <w:r>
+        <w:t>Specification</w:t>
       </w:r>
     </w:p>
     <w:p>
@@ -7341,13 +7344,1246 @@
         <w:br w:type="page"/>
       </w:r>
     </w:p>
+    <w:p>
+      <w:pPr>
+        <w:pStyle w:val="Heading3"/>
+      </w:pPr>
+      <w:r>
+        <w:lastRenderedPageBreak/>
+        <w:t>Branch Management APIs</w:t>
+      </w:r>
+    </w:p>
+    <w:p>
+      <w:r>
+        <w:t>The Branch Management APIs allow agencies to manage their branches within the KriGo platform. Since the agency might be operating from different geographical locations, the APIs offer standard services for creating, modifying, fetching, and managing information about their branches. Every branch is a physical rental office where customers can rent and return the vehicle; hence, efficient branch management will help distribute the fleets efficiently.</w:t>
+      </w:r>
+    </w:p>
+    <w:p>
+      <w:r>
+        <w:t>The Branch Management APIs follow the RESTful architectural style, where every branch will be considered a resource with a unique identifier. All branch management requests will need authentication through JSON Web Tokens (JWT), but authorization is carried out using Role-Based Access Control (RBAC). This means that only those agency managers and employees who have been granted permission to do so will be allowed to manage branches within their agencies, but platform administrators will have full access to everything.</w:t>
+      </w:r>
+    </w:p>
+    <w:p>
+      <w:r>
+        <w:t>There is an association between the Branch Management Service and other services like Fleet Management Service and Reservation Service since vehicles are assigned to particular branches, and the reservations depend on branch information to work.</w:t>
+      </w:r>
+    </w:p>
+    <w:p>
+      <w:pPr>
+        <w:pStyle w:val="Title"/>
+      </w:pPr>
+      <w:r>
+        <w:t>Branch Management API Endpoints</w:t>
+      </w:r>
+    </w:p>
+    <w:p>
+      <w:pPr>
+        <w:pStyle w:val="Caption"/>
+        <w:keepNext/>
+      </w:pPr>
+      <w:r>
+        <w:t xml:space="preserve">Table </w:t>
+      </w:r>
+      <w:r>
+        <w:fldChar w:fldCharType="begin"/>
+      </w:r>
+      <w:r>
+        <w:instrText xml:space="preserve"> SEQ Table \* ARABIC </w:instrText>
+      </w:r>
+      <w:r>
+        <w:fldChar w:fldCharType="separate"/>
+      </w:r>
+      <w:r>
+        <w:rPr>
+          <w:noProof/>
+        </w:rPr>
+        <w:t>8</w:t>
+      </w:r>
+      <w:r>
+        <w:fldChar w:fldCharType="end"/>
+      </w:r>
+      <w:r>
+        <w:t xml:space="preserve"> - </w:t>
+      </w:r>
+      <w:r>
+        <w:t>Branch Management API Endpoints</w:t>
+      </w:r>
+    </w:p>
+    <w:tbl>
+      <w:tblPr>
+        <w:tblStyle w:val="PlainTable1"/>
+        <w:tblW w:w="0" w:type="auto"/>
+        <w:tblCellMar>
+          <w:top w:w="72" w:type="dxa"/>
+          <w:bottom w:w="72" w:type="dxa"/>
+        </w:tblCellMar>
+        <w:tblLook w:val="04A0" w:firstRow="1" w:lastRow="0" w:firstColumn="1" w:lastColumn="0" w:noHBand="0" w:noVBand="1"/>
+      </w:tblPr>
+      <w:tblGrid>
+        <w:gridCol w:w="4581"/>
+        <w:gridCol w:w="1123"/>
+        <w:gridCol w:w="2471"/>
+        <w:gridCol w:w="1172"/>
+      </w:tblGrid>
+      <w:tr>
+        <w:trPr>
+          <w:cnfStyle w:val="100000000000" w:firstRow="1" w:lastRow="0" w:firstColumn="0" w:lastColumn="0" w:oddVBand="0" w:evenVBand="0" w:oddHBand="0" w:evenHBand="0" w:firstRowFirstColumn="0" w:firstRowLastColumn="0" w:lastRowFirstColumn="0" w:lastRowLastColumn="0"/>
+        </w:trPr>
+        <w:tc>
+          <w:tcPr>
+            <w:cnfStyle w:val="001000000000" w:firstRow="0" w:lastRow="0" w:firstColumn="1" w:lastColumn="0" w:oddVBand="0" w:evenVBand="0" w:oddHBand="0" w:evenHBand="0" w:firstRowFirstColumn="0" w:firstRowLastColumn="0" w:lastRowFirstColumn="0" w:lastRowLastColumn="0"/>
+            <w:tcW w:w="4585" w:type="dxa"/>
+            <w:vAlign w:val="center"/>
+            <w:hideMark/>
+          </w:tcPr>
+          <w:p>
+            <w:r>
+              <w:t>Endpoint</w:t>
+            </w:r>
+          </w:p>
+        </w:tc>
+        <w:tc>
+          <w:tcPr>
+            <w:tcW w:w="1123" w:type="dxa"/>
+            <w:vAlign w:val="center"/>
+            <w:hideMark/>
+          </w:tcPr>
+          <w:p>
+            <w:pPr>
+              <w:jc w:val="center"/>
+              <w:cnfStyle w:val="100000000000" w:firstRow="1" w:lastRow="0" w:firstColumn="0" w:lastColumn="0" w:oddVBand="0" w:evenVBand="0" w:oddHBand="0" w:evenHBand="0" w:firstRowFirstColumn="0" w:firstRowLastColumn="0" w:lastRowFirstColumn="0" w:lastRowLastColumn="0"/>
+            </w:pPr>
+            <w:r>
+              <w:t>Method</w:t>
+            </w:r>
+          </w:p>
+        </w:tc>
+        <w:tc>
+          <w:tcPr>
+            <w:tcW w:w="2477" w:type="dxa"/>
+            <w:vAlign w:val="center"/>
+            <w:hideMark/>
+          </w:tcPr>
+          <w:p>
+            <w:pPr>
+              <w:cnfStyle w:val="100000000000" w:firstRow="1" w:lastRow="0" w:firstColumn="0" w:lastColumn="0" w:oddVBand="0" w:evenVBand="0" w:oddHBand="0" w:evenHBand="0" w:firstRowFirstColumn="0" w:firstRowLastColumn="0" w:lastRowFirstColumn="0" w:lastRowLastColumn="0"/>
+            </w:pPr>
+            <w:r>
+              <w:t>Description</w:t>
+            </w:r>
+          </w:p>
+        </w:tc>
+        <w:tc>
+          <w:tcPr>
+            <w:tcW w:w="1162" w:type="dxa"/>
+            <w:vAlign w:val="center"/>
+            <w:hideMark/>
+          </w:tcPr>
+          <w:p>
+            <w:pPr>
+              <w:jc w:val="center"/>
+              <w:cnfStyle w:val="100000000000" w:firstRow="1" w:lastRow="0" w:firstColumn="0" w:lastColumn="0" w:oddVBand="0" w:evenVBand="0" w:oddHBand="0" w:evenHBand="0" w:firstRowFirstColumn="0" w:firstRowLastColumn="0" w:lastRowFirstColumn="0" w:lastRowLastColumn="0"/>
+            </w:pPr>
+            <w:r>
+              <w:t>Auth Required</w:t>
+            </w:r>
+          </w:p>
+        </w:tc>
+      </w:tr>
+      <w:tr>
+        <w:trPr>
+          <w:cnfStyle w:val="000000100000" w:firstRow="0" w:lastRow="0" w:firstColumn="0" w:lastColumn="0" w:oddVBand="0" w:evenVBand="0" w:oddHBand="1" w:evenHBand="0" w:firstRowFirstColumn="0" w:firstRowLastColumn="0" w:lastRowFirstColumn="0" w:lastRowLastColumn="0"/>
+        </w:trPr>
+        <w:tc>
+          <w:tcPr>
+            <w:cnfStyle w:val="001000000000" w:firstRow="0" w:lastRow="0" w:firstColumn="1" w:lastColumn="0" w:oddVBand="0" w:evenVBand="0" w:oddHBand="0" w:evenHBand="0" w:firstRowFirstColumn="0" w:firstRowLastColumn="0" w:lastRowFirstColumn="0" w:lastRowLastColumn="0"/>
+            <w:tcW w:w="4585" w:type="dxa"/>
+            <w:vAlign w:val="center"/>
+            <w:hideMark/>
+          </w:tcPr>
+          <w:p>
+            <w:pPr>
+              <w:rPr>
+                <w:b w:val="0"/>
+                <w:bCs w:val="0"/>
+              </w:rPr>
+            </w:pPr>
+            <w:r>
+              <w:rPr>
+                <w:b w:val="0"/>
+                <w:bCs w:val="0"/>
+              </w:rPr>
+              <w:t>/api/v1/branches</w:t>
+            </w:r>
+          </w:p>
+        </w:tc>
+        <w:tc>
+          <w:tcPr>
+            <w:tcW w:w="1123" w:type="dxa"/>
+            <w:vAlign w:val="center"/>
+            <w:hideMark/>
+          </w:tcPr>
+          <w:p>
+            <w:pPr>
+              <w:jc w:val="center"/>
+              <w:cnfStyle w:val="000000100000" w:firstRow="0" w:lastRow="0" w:firstColumn="0" w:lastColumn="0" w:oddVBand="0" w:evenVBand="0" w:oddHBand="1" w:evenHBand="0" w:firstRowFirstColumn="0" w:firstRowLastColumn="0" w:lastRowFirstColumn="0" w:lastRowLastColumn="0"/>
+            </w:pPr>
+            <w:r>
+              <w:t>POST</w:t>
+            </w:r>
+          </w:p>
+        </w:tc>
+        <w:tc>
+          <w:tcPr>
+            <w:tcW w:w="2477" w:type="dxa"/>
+            <w:vAlign w:val="center"/>
+            <w:hideMark/>
+          </w:tcPr>
+          <w:p>
+            <w:pPr>
+              <w:cnfStyle w:val="000000100000" w:firstRow="0" w:lastRow="0" w:firstColumn="0" w:lastColumn="0" w:oddVBand="0" w:evenVBand="0" w:oddHBand="1" w:evenHBand="0" w:firstRowFirstColumn="0" w:firstRowLastColumn="0" w:lastRowFirstColumn="0" w:lastRowLastColumn="0"/>
+            </w:pPr>
+            <w:r>
+              <w:t>Create a new branch</w:t>
+            </w:r>
+          </w:p>
+        </w:tc>
+        <w:tc>
+          <w:tcPr>
+            <w:tcW w:w="1162" w:type="dxa"/>
+            <w:vAlign w:val="center"/>
+            <w:hideMark/>
+          </w:tcPr>
+          <w:p>
+            <w:pPr>
+              <w:jc w:val="center"/>
+              <w:cnfStyle w:val="000000100000" w:firstRow="0" w:lastRow="0" w:firstColumn="0" w:lastColumn="0" w:oddVBand="0" w:evenVBand="0" w:oddHBand="1" w:evenHBand="0" w:firstRowFirstColumn="0" w:firstRowLastColumn="0" w:lastRowFirstColumn="0" w:lastRowLastColumn="0"/>
+            </w:pPr>
+            <w:r>
+              <w:t>Yes</w:t>
+            </w:r>
+          </w:p>
+        </w:tc>
+      </w:tr>
+      <w:tr>
+        <w:tc>
+          <w:tcPr>
+            <w:cnfStyle w:val="001000000000" w:firstRow="0" w:lastRow="0" w:firstColumn="1" w:lastColumn="0" w:oddVBand="0" w:evenVBand="0" w:oddHBand="0" w:evenHBand="0" w:firstRowFirstColumn="0" w:firstRowLastColumn="0" w:lastRowFirstColumn="0" w:lastRowLastColumn="0"/>
+            <w:tcW w:w="4585" w:type="dxa"/>
+            <w:vAlign w:val="center"/>
+            <w:hideMark/>
+          </w:tcPr>
+          <w:p>
+            <w:pPr>
+              <w:rPr>
+                <w:b w:val="0"/>
+                <w:bCs w:val="0"/>
+              </w:rPr>
+            </w:pPr>
+            <w:r>
+              <w:rPr>
+                <w:b w:val="0"/>
+                <w:bCs w:val="0"/>
+              </w:rPr>
+              <w:t>/api/v1/branches</w:t>
+            </w:r>
+          </w:p>
+        </w:tc>
+        <w:tc>
+          <w:tcPr>
+            <w:tcW w:w="1123" w:type="dxa"/>
+            <w:vAlign w:val="center"/>
+            <w:hideMark/>
+          </w:tcPr>
+          <w:p>
+            <w:pPr>
+              <w:jc w:val="center"/>
+              <w:cnfStyle w:val="000000000000" w:firstRow="0" w:lastRow="0" w:firstColumn="0" w:lastColumn="0" w:oddVBand="0" w:evenVBand="0" w:oddHBand="0" w:evenHBand="0" w:firstRowFirstColumn="0" w:firstRowLastColumn="0" w:lastRowFirstColumn="0" w:lastRowLastColumn="0"/>
+            </w:pPr>
+            <w:r>
+              <w:t>GET</w:t>
+            </w:r>
+          </w:p>
+        </w:tc>
+        <w:tc>
+          <w:tcPr>
+            <w:tcW w:w="2477" w:type="dxa"/>
+            <w:vAlign w:val="center"/>
+            <w:hideMark/>
+          </w:tcPr>
+          <w:p>
+            <w:pPr>
+              <w:cnfStyle w:val="000000000000" w:firstRow="0" w:lastRow="0" w:firstColumn="0" w:lastColumn="0" w:oddVBand="0" w:evenVBand="0" w:oddHBand="0" w:evenHBand="0" w:firstRowFirstColumn="0" w:firstRowLastColumn="0" w:lastRowFirstColumn="0" w:lastRowLastColumn="0"/>
+            </w:pPr>
+            <w:r>
+              <w:t>Retrieve all branches of the authenticated agency</w:t>
+            </w:r>
+          </w:p>
+        </w:tc>
+        <w:tc>
+          <w:tcPr>
+            <w:tcW w:w="1162" w:type="dxa"/>
+            <w:vAlign w:val="center"/>
+            <w:hideMark/>
+          </w:tcPr>
+          <w:p>
+            <w:pPr>
+              <w:jc w:val="center"/>
+              <w:cnfStyle w:val="000000000000" w:firstRow="0" w:lastRow="0" w:firstColumn="0" w:lastColumn="0" w:oddVBand="0" w:evenVBand="0" w:oddHBand="0" w:evenHBand="0" w:firstRowFirstColumn="0" w:firstRowLastColumn="0" w:lastRowFirstColumn="0" w:lastRowLastColumn="0"/>
+            </w:pPr>
+            <w:r>
+              <w:t>Yes</w:t>
+            </w:r>
+          </w:p>
+        </w:tc>
+      </w:tr>
+      <w:tr>
+        <w:trPr>
+          <w:cnfStyle w:val="000000100000" w:firstRow="0" w:lastRow="0" w:firstColumn="0" w:lastColumn="0" w:oddVBand="0" w:evenVBand="0" w:oddHBand="1" w:evenHBand="0" w:firstRowFirstColumn="0" w:firstRowLastColumn="0" w:lastRowFirstColumn="0" w:lastRowLastColumn="0"/>
+        </w:trPr>
+        <w:tc>
+          <w:tcPr>
+            <w:cnfStyle w:val="001000000000" w:firstRow="0" w:lastRow="0" w:firstColumn="1" w:lastColumn="0" w:oddVBand="0" w:evenVBand="0" w:oddHBand="0" w:evenHBand="0" w:firstRowFirstColumn="0" w:firstRowLastColumn="0" w:lastRowFirstColumn="0" w:lastRowLastColumn="0"/>
+            <w:tcW w:w="4585" w:type="dxa"/>
+            <w:vAlign w:val="center"/>
+            <w:hideMark/>
+          </w:tcPr>
+          <w:p>
+            <w:pPr>
+              <w:rPr>
+                <w:b w:val="0"/>
+                <w:bCs w:val="0"/>
+              </w:rPr>
+            </w:pPr>
+            <w:r>
+              <w:rPr>
+                <w:b w:val="0"/>
+                <w:bCs w:val="0"/>
+              </w:rPr>
+              <w:t>/api/v1/branches/{branchId}</w:t>
+            </w:r>
+          </w:p>
+        </w:tc>
+        <w:tc>
+          <w:tcPr>
+            <w:tcW w:w="1123" w:type="dxa"/>
+            <w:vAlign w:val="center"/>
+            <w:hideMark/>
+          </w:tcPr>
+          <w:p>
+            <w:pPr>
+              <w:jc w:val="center"/>
+              <w:cnfStyle w:val="000000100000" w:firstRow="0" w:lastRow="0" w:firstColumn="0" w:lastColumn="0" w:oddVBand="0" w:evenVBand="0" w:oddHBand="1" w:evenHBand="0" w:firstRowFirstColumn="0" w:firstRowLastColumn="0" w:lastRowFirstColumn="0" w:lastRowLastColumn="0"/>
+            </w:pPr>
+            <w:r>
+              <w:t>GET</w:t>
+            </w:r>
+          </w:p>
+        </w:tc>
+        <w:tc>
+          <w:tcPr>
+            <w:tcW w:w="2477" w:type="dxa"/>
+            <w:vAlign w:val="center"/>
+            <w:hideMark/>
+          </w:tcPr>
+          <w:p>
+            <w:pPr>
+              <w:cnfStyle w:val="000000100000" w:firstRow="0" w:lastRow="0" w:firstColumn="0" w:lastColumn="0" w:oddVBand="0" w:evenVBand="0" w:oddHBand="1" w:evenHBand="0" w:firstRowFirstColumn="0" w:firstRowLastColumn="0" w:lastRowFirstColumn="0" w:lastRowLastColumn="0"/>
+            </w:pPr>
+            <w:r>
+              <w:t>Retrieve branch details</w:t>
+            </w:r>
+          </w:p>
+        </w:tc>
+        <w:tc>
+          <w:tcPr>
+            <w:tcW w:w="1162" w:type="dxa"/>
+            <w:vAlign w:val="center"/>
+            <w:hideMark/>
+          </w:tcPr>
+          <w:p>
+            <w:pPr>
+              <w:jc w:val="center"/>
+              <w:cnfStyle w:val="000000100000" w:firstRow="0" w:lastRow="0" w:firstColumn="0" w:lastColumn="0" w:oddVBand="0" w:evenVBand="0" w:oddHBand="1" w:evenHBand="0" w:firstRowFirstColumn="0" w:firstRowLastColumn="0" w:lastRowFirstColumn="0" w:lastRowLastColumn="0"/>
+            </w:pPr>
+            <w:r>
+              <w:t>Yes</w:t>
+            </w:r>
+          </w:p>
+        </w:tc>
+      </w:tr>
+      <w:tr>
+        <w:tc>
+          <w:tcPr>
+            <w:cnfStyle w:val="001000000000" w:firstRow="0" w:lastRow="0" w:firstColumn="1" w:lastColumn="0" w:oddVBand="0" w:evenVBand="0" w:oddHBand="0" w:evenHBand="0" w:firstRowFirstColumn="0" w:firstRowLastColumn="0" w:lastRowFirstColumn="0" w:lastRowLastColumn="0"/>
+            <w:tcW w:w="4585" w:type="dxa"/>
+            <w:vAlign w:val="center"/>
+            <w:hideMark/>
+          </w:tcPr>
+          <w:p>
+            <w:pPr>
+              <w:rPr>
+                <w:b w:val="0"/>
+                <w:bCs w:val="0"/>
+              </w:rPr>
+            </w:pPr>
+            <w:r>
+              <w:rPr>
+                <w:b w:val="0"/>
+                <w:bCs w:val="0"/>
+              </w:rPr>
+              <w:t>/api/v1/branches/{branchId}</w:t>
+            </w:r>
+          </w:p>
+        </w:tc>
+        <w:tc>
+          <w:tcPr>
+            <w:tcW w:w="1123" w:type="dxa"/>
+            <w:vAlign w:val="center"/>
+            <w:hideMark/>
+          </w:tcPr>
+          <w:p>
+            <w:pPr>
+              <w:jc w:val="center"/>
+              <w:cnfStyle w:val="000000000000" w:firstRow="0" w:lastRow="0" w:firstColumn="0" w:lastColumn="0" w:oddVBand="0" w:evenVBand="0" w:oddHBand="0" w:evenHBand="0" w:firstRowFirstColumn="0" w:firstRowLastColumn="0" w:lastRowFirstColumn="0" w:lastRowLastColumn="0"/>
+            </w:pPr>
+            <w:r>
+              <w:t>PUT</w:t>
+            </w:r>
+          </w:p>
+        </w:tc>
+        <w:tc>
+          <w:tcPr>
+            <w:tcW w:w="2477" w:type="dxa"/>
+            <w:vAlign w:val="center"/>
+            <w:hideMark/>
+          </w:tcPr>
+          <w:p>
+            <w:pPr>
+              <w:cnfStyle w:val="000000000000" w:firstRow="0" w:lastRow="0" w:firstColumn="0" w:lastColumn="0" w:oddVBand="0" w:evenVBand="0" w:oddHBand="0" w:evenHBand="0" w:firstRowFirstColumn="0" w:firstRowLastColumn="0" w:lastRowFirstColumn="0" w:lastRowLastColumn="0"/>
+            </w:pPr>
+            <w:r>
+              <w:t>Update branch information</w:t>
+            </w:r>
+          </w:p>
+        </w:tc>
+        <w:tc>
+          <w:tcPr>
+            <w:tcW w:w="1162" w:type="dxa"/>
+            <w:vAlign w:val="center"/>
+            <w:hideMark/>
+          </w:tcPr>
+          <w:p>
+            <w:pPr>
+              <w:jc w:val="center"/>
+              <w:cnfStyle w:val="000000000000" w:firstRow="0" w:lastRow="0" w:firstColumn="0" w:lastColumn="0" w:oddVBand="0" w:evenVBand="0" w:oddHBand="0" w:evenHBand="0" w:firstRowFirstColumn="0" w:firstRowLastColumn="0" w:lastRowFirstColumn="0" w:lastRowLastColumn="0"/>
+            </w:pPr>
+            <w:r>
+              <w:t>Yes</w:t>
+            </w:r>
+          </w:p>
+        </w:tc>
+      </w:tr>
+      <w:tr>
+        <w:trPr>
+          <w:cnfStyle w:val="000000100000" w:firstRow="0" w:lastRow="0" w:firstColumn="0" w:lastColumn="0" w:oddVBand="0" w:evenVBand="0" w:oddHBand="1" w:evenHBand="0" w:firstRowFirstColumn="0" w:firstRowLastColumn="0" w:lastRowFirstColumn="0" w:lastRowLastColumn="0"/>
+        </w:trPr>
+        <w:tc>
+          <w:tcPr>
+            <w:cnfStyle w:val="001000000000" w:firstRow="0" w:lastRow="0" w:firstColumn="1" w:lastColumn="0" w:oddVBand="0" w:evenVBand="0" w:oddHBand="0" w:evenHBand="0" w:firstRowFirstColumn="0" w:firstRowLastColumn="0" w:lastRowFirstColumn="0" w:lastRowLastColumn="0"/>
+            <w:tcW w:w="4585" w:type="dxa"/>
+            <w:vAlign w:val="center"/>
+            <w:hideMark/>
+          </w:tcPr>
+          <w:p>
+            <w:pPr>
+              <w:rPr>
+                <w:b w:val="0"/>
+                <w:bCs w:val="0"/>
+              </w:rPr>
+            </w:pPr>
+            <w:r>
+              <w:rPr>
+                <w:b w:val="0"/>
+                <w:bCs w:val="0"/>
+              </w:rPr>
+              <w:t>/api/v1/branches/{branchId}</w:t>
+            </w:r>
+          </w:p>
+        </w:tc>
+        <w:tc>
+          <w:tcPr>
+            <w:tcW w:w="1123" w:type="dxa"/>
+            <w:vAlign w:val="center"/>
+            <w:hideMark/>
+          </w:tcPr>
+          <w:p>
+            <w:pPr>
+              <w:jc w:val="center"/>
+              <w:cnfStyle w:val="000000100000" w:firstRow="0" w:lastRow="0" w:firstColumn="0" w:lastColumn="0" w:oddVBand="0" w:evenVBand="0" w:oddHBand="1" w:evenHBand="0" w:firstRowFirstColumn="0" w:firstRowLastColumn="0" w:lastRowFirstColumn="0" w:lastRowLastColumn="0"/>
+            </w:pPr>
+            <w:r>
+              <w:t>DELETE</w:t>
+            </w:r>
+          </w:p>
+        </w:tc>
+        <w:tc>
+          <w:tcPr>
+            <w:tcW w:w="2477" w:type="dxa"/>
+            <w:vAlign w:val="center"/>
+            <w:hideMark/>
+          </w:tcPr>
+          <w:p>
+            <w:pPr>
+              <w:cnfStyle w:val="000000100000" w:firstRow="0" w:lastRow="0" w:firstColumn="0" w:lastColumn="0" w:oddVBand="0" w:evenVBand="0" w:oddHBand="1" w:evenHBand="0" w:firstRowFirstColumn="0" w:firstRowLastColumn="0" w:lastRowFirstColumn="0" w:lastRowLastColumn="0"/>
+            </w:pPr>
+            <w:r>
+              <w:t>Remove a branch</w:t>
+            </w:r>
+          </w:p>
+        </w:tc>
+        <w:tc>
+          <w:tcPr>
+            <w:tcW w:w="1162" w:type="dxa"/>
+            <w:vAlign w:val="center"/>
+            <w:hideMark/>
+          </w:tcPr>
+          <w:p>
+            <w:pPr>
+              <w:jc w:val="center"/>
+              <w:cnfStyle w:val="000000100000" w:firstRow="0" w:lastRow="0" w:firstColumn="0" w:lastColumn="0" w:oddVBand="0" w:evenVBand="0" w:oddHBand="1" w:evenHBand="0" w:firstRowFirstColumn="0" w:firstRowLastColumn="0" w:lastRowFirstColumn="0" w:lastRowLastColumn="0"/>
+            </w:pPr>
+            <w:r>
+              <w:t>Yes</w:t>
+            </w:r>
+          </w:p>
+        </w:tc>
+      </w:tr>
+      <w:tr>
+        <w:tc>
+          <w:tcPr>
+            <w:cnfStyle w:val="001000000000" w:firstRow="0" w:lastRow="0" w:firstColumn="1" w:lastColumn="0" w:oddVBand="0" w:evenVBand="0" w:oddHBand="0" w:evenHBand="0" w:firstRowFirstColumn="0" w:firstRowLastColumn="0" w:lastRowFirstColumn="0" w:lastRowLastColumn="0"/>
+            <w:tcW w:w="4585" w:type="dxa"/>
+            <w:vAlign w:val="center"/>
+            <w:hideMark/>
+          </w:tcPr>
+          <w:p>
+            <w:pPr>
+              <w:rPr>
+                <w:b w:val="0"/>
+                <w:bCs w:val="0"/>
+              </w:rPr>
+            </w:pPr>
+            <w:r>
+              <w:rPr>
+                <w:b w:val="0"/>
+                <w:bCs w:val="0"/>
+              </w:rPr>
+              <w:t>/api/v1/branches/{branchId}/status</w:t>
+            </w:r>
+          </w:p>
+        </w:tc>
+        <w:tc>
+          <w:tcPr>
+            <w:tcW w:w="1123" w:type="dxa"/>
+            <w:vAlign w:val="center"/>
+            <w:hideMark/>
+          </w:tcPr>
+          <w:p>
+            <w:pPr>
+              <w:jc w:val="center"/>
+              <w:cnfStyle w:val="000000000000" w:firstRow="0" w:lastRow="0" w:firstColumn="0" w:lastColumn="0" w:oddVBand="0" w:evenVBand="0" w:oddHBand="0" w:evenHBand="0" w:firstRowFirstColumn="0" w:firstRowLastColumn="0" w:lastRowFirstColumn="0" w:lastRowLastColumn="0"/>
+            </w:pPr>
+            <w:r>
+              <w:t>PATCH</w:t>
+            </w:r>
+          </w:p>
+        </w:tc>
+        <w:tc>
+          <w:tcPr>
+            <w:tcW w:w="2477" w:type="dxa"/>
+            <w:vAlign w:val="center"/>
+            <w:hideMark/>
+          </w:tcPr>
+          <w:p>
+            <w:pPr>
+              <w:cnfStyle w:val="000000000000" w:firstRow="0" w:lastRow="0" w:firstColumn="0" w:lastColumn="0" w:oddVBand="0" w:evenVBand="0" w:oddHBand="0" w:evenHBand="0" w:firstRowFirstColumn="0" w:firstRowLastColumn="0" w:lastRowFirstColumn="0" w:lastRowLastColumn="0"/>
+            </w:pPr>
+            <w:r>
+              <w:t>Activate or deactivate a branch</w:t>
+            </w:r>
+          </w:p>
+        </w:tc>
+        <w:tc>
+          <w:tcPr>
+            <w:tcW w:w="1162" w:type="dxa"/>
+            <w:vAlign w:val="center"/>
+            <w:hideMark/>
+          </w:tcPr>
+          <w:p>
+            <w:pPr>
+              <w:jc w:val="center"/>
+              <w:cnfStyle w:val="000000000000" w:firstRow="0" w:lastRow="0" w:firstColumn="0" w:lastColumn="0" w:oddVBand="0" w:evenVBand="0" w:oddHBand="0" w:evenHBand="0" w:firstRowFirstColumn="0" w:firstRowLastColumn="0" w:lastRowFirstColumn="0" w:lastRowLastColumn="0"/>
+            </w:pPr>
+            <w:r>
+              <w:t>Yes</w:t>
+            </w:r>
+          </w:p>
+        </w:tc>
+      </w:tr>
+      <w:tr>
+        <w:trPr>
+          <w:cnfStyle w:val="000000100000" w:firstRow="0" w:lastRow="0" w:firstColumn="0" w:lastColumn="0" w:oddVBand="0" w:evenVBand="0" w:oddHBand="1" w:evenHBand="0" w:firstRowFirstColumn="0" w:firstRowLastColumn="0" w:lastRowFirstColumn="0" w:lastRowLastColumn="0"/>
+        </w:trPr>
+        <w:tc>
+          <w:tcPr>
+            <w:cnfStyle w:val="001000000000" w:firstRow="0" w:lastRow="0" w:firstColumn="1" w:lastColumn="0" w:oddVBand="0" w:evenVBand="0" w:oddHBand="0" w:evenHBand="0" w:firstRowFirstColumn="0" w:firstRowLastColumn="0" w:lastRowFirstColumn="0" w:lastRowLastColumn="0"/>
+            <w:tcW w:w="4585" w:type="dxa"/>
+            <w:vAlign w:val="center"/>
+            <w:hideMark/>
+          </w:tcPr>
+          <w:p>
+            <w:pPr>
+              <w:rPr>
+                <w:b w:val="0"/>
+                <w:bCs w:val="0"/>
+              </w:rPr>
+            </w:pPr>
+            <w:r>
+              <w:rPr>
+                <w:b w:val="0"/>
+                <w:bCs w:val="0"/>
+              </w:rPr>
+              <w:t>/api/v1/branches/{branchId}/vehicles</w:t>
+            </w:r>
+          </w:p>
+        </w:tc>
+        <w:tc>
+          <w:tcPr>
+            <w:tcW w:w="1123" w:type="dxa"/>
+            <w:vAlign w:val="center"/>
+            <w:hideMark/>
+          </w:tcPr>
+          <w:p>
+            <w:pPr>
+              <w:jc w:val="center"/>
+              <w:cnfStyle w:val="000000100000" w:firstRow="0" w:lastRow="0" w:firstColumn="0" w:lastColumn="0" w:oddVBand="0" w:evenVBand="0" w:oddHBand="1" w:evenHBand="0" w:firstRowFirstColumn="0" w:firstRowLastColumn="0" w:lastRowFirstColumn="0" w:lastRowLastColumn="0"/>
+            </w:pPr>
+            <w:r>
+              <w:t>GET</w:t>
+            </w:r>
+          </w:p>
+        </w:tc>
+        <w:tc>
+          <w:tcPr>
+            <w:tcW w:w="2477" w:type="dxa"/>
+            <w:vAlign w:val="center"/>
+            <w:hideMark/>
+          </w:tcPr>
+          <w:p>
+            <w:pPr>
+              <w:cnfStyle w:val="000000100000" w:firstRow="0" w:lastRow="0" w:firstColumn="0" w:lastColumn="0" w:oddVBand="0" w:evenVBand="0" w:oddHBand="1" w:evenHBand="0" w:firstRowFirstColumn="0" w:firstRowLastColumn="0" w:lastRowFirstColumn="0" w:lastRowLastColumn="0"/>
+            </w:pPr>
+            <w:r>
+              <w:t>Retrieve vehicles assigned to a branch</w:t>
+            </w:r>
+          </w:p>
+        </w:tc>
+        <w:tc>
+          <w:tcPr>
+            <w:tcW w:w="1162" w:type="dxa"/>
+            <w:vAlign w:val="center"/>
+            <w:hideMark/>
+          </w:tcPr>
+          <w:p>
+            <w:pPr>
+              <w:jc w:val="center"/>
+              <w:cnfStyle w:val="000000100000" w:firstRow="0" w:lastRow="0" w:firstColumn="0" w:lastColumn="0" w:oddVBand="0" w:evenVBand="0" w:oddHBand="1" w:evenHBand="0" w:firstRowFirstColumn="0" w:firstRowLastColumn="0" w:lastRowFirstColumn="0" w:lastRowLastColumn="0"/>
+            </w:pPr>
+            <w:r>
+              <w:t>Yes</w:t>
+            </w:r>
+          </w:p>
+        </w:tc>
+      </w:tr>
+      <w:tr>
+        <w:tc>
+          <w:tcPr>
+            <w:cnfStyle w:val="001000000000" w:firstRow="0" w:lastRow="0" w:firstColumn="1" w:lastColumn="0" w:oddVBand="0" w:evenVBand="0" w:oddHBand="0" w:evenHBand="0" w:firstRowFirstColumn="0" w:firstRowLastColumn="0" w:lastRowFirstColumn="0" w:lastRowLastColumn="0"/>
+            <w:tcW w:w="4585" w:type="dxa"/>
+            <w:vAlign w:val="center"/>
+            <w:hideMark/>
+          </w:tcPr>
+          <w:p>
+            <w:pPr>
+              <w:rPr>
+                <w:b w:val="0"/>
+                <w:bCs w:val="0"/>
+              </w:rPr>
+            </w:pPr>
+            <w:r>
+              <w:rPr>
+                <w:b w:val="0"/>
+                <w:bCs w:val="0"/>
+              </w:rPr>
+              <w:t>/api/v1/branches/{branchId}/employees</w:t>
+            </w:r>
+          </w:p>
+        </w:tc>
+        <w:tc>
+          <w:tcPr>
+            <w:tcW w:w="1123" w:type="dxa"/>
+            <w:vAlign w:val="center"/>
+            <w:hideMark/>
+          </w:tcPr>
+          <w:p>
+            <w:pPr>
+              <w:jc w:val="center"/>
+              <w:cnfStyle w:val="000000000000" w:firstRow="0" w:lastRow="0" w:firstColumn="0" w:lastColumn="0" w:oddVBand="0" w:evenVBand="0" w:oddHBand="0" w:evenHBand="0" w:firstRowFirstColumn="0" w:firstRowLastColumn="0" w:lastRowFirstColumn="0" w:lastRowLastColumn="0"/>
+            </w:pPr>
+            <w:r>
+              <w:t>GET</w:t>
+            </w:r>
+          </w:p>
+        </w:tc>
+        <w:tc>
+          <w:tcPr>
+            <w:tcW w:w="2477" w:type="dxa"/>
+            <w:vAlign w:val="center"/>
+            <w:hideMark/>
+          </w:tcPr>
+          <w:p>
+            <w:pPr>
+              <w:cnfStyle w:val="000000000000" w:firstRow="0" w:lastRow="0" w:firstColumn="0" w:lastColumn="0" w:oddVBand="0" w:evenVBand="0" w:oddHBand="0" w:evenHBand="0" w:firstRowFirstColumn="0" w:firstRowLastColumn="0" w:lastRowFirstColumn="0" w:lastRowLastColumn="0"/>
+            </w:pPr>
+            <w:r>
+              <w:t>Retrieve employees assigned to a branch</w:t>
+            </w:r>
+          </w:p>
+        </w:tc>
+        <w:tc>
+          <w:tcPr>
+            <w:tcW w:w="1162" w:type="dxa"/>
+            <w:vAlign w:val="center"/>
+            <w:hideMark/>
+          </w:tcPr>
+          <w:p>
+            <w:pPr>
+              <w:jc w:val="center"/>
+              <w:cnfStyle w:val="000000000000" w:firstRow="0" w:lastRow="0" w:firstColumn="0" w:lastColumn="0" w:oddVBand="0" w:evenVBand="0" w:oddHBand="0" w:evenHBand="0" w:firstRowFirstColumn="0" w:firstRowLastColumn="0" w:lastRowFirstColumn="0" w:lastRowLastColumn="0"/>
+            </w:pPr>
+            <w:r>
+              <w:t>Yes</w:t>
+            </w:r>
+          </w:p>
+        </w:tc>
+      </w:tr>
+      <w:tr>
+        <w:trPr>
+          <w:cnfStyle w:val="000000100000" w:firstRow="0" w:lastRow="0" w:firstColumn="0" w:lastColumn="0" w:oddVBand="0" w:evenVBand="0" w:oddHBand="1" w:evenHBand="0" w:firstRowFirstColumn="0" w:firstRowLastColumn="0" w:lastRowFirstColumn="0" w:lastRowLastColumn="0"/>
+        </w:trPr>
+        <w:tc>
+          <w:tcPr>
+            <w:cnfStyle w:val="001000000000" w:firstRow="0" w:lastRow="0" w:firstColumn="1" w:lastColumn="0" w:oddVBand="0" w:evenVBand="0" w:oddHBand="0" w:evenHBand="0" w:firstRowFirstColumn="0" w:firstRowLastColumn="0" w:lastRowFirstColumn="0" w:lastRowLastColumn="0"/>
+            <w:tcW w:w="4585" w:type="dxa"/>
+            <w:vAlign w:val="center"/>
+            <w:hideMark/>
+          </w:tcPr>
+          <w:p>
+            <w:pPr>
+              <w:rPr>
+                <w:b w:val="0"/>
+                <w:bCs w:val="0"/>
+              </w:rPr>
+            </w:pPr>
+            <w:r>
+              <w:rPr>
+                <w:b w:val="0"/>
+                <w:bCs w:val="0"/>
+              </w:rPr>
+              <w:t>/api/v1/branches/{branchId}/operating-hours</w:t>
+            </w:r>
+          </w:p>
+        </w:tc>
+        <w:tc>
+          <w:tcPr>
+            <w:tcW w:w="1123" w:type="dxa"/>
+            <w:vAlign w:val="center"/>
+            <w:hideMark/>
+          </w:tcPr>
+          <w:p>
+            <w:pPr>
+              <w:jc w:val="center"/>
+              <w:cnfStyle w:val="000000100000" w:firstRow="0" w:lastRow="0" w:firstColumn="0" w:lastColumn="0" w:oddVBand="0" w:evenVBand="0" w:oddHBand="1" w:evenHBand="0" w:firstRowFirstColumn="0" w:firstRowLastColumn="0" w:lastRowFirstColumn="0" w:lastRowLastColumn="0"/>
+            </w:pPr>
+            <w:r>
+              <w:t>PATCH</w:t>
+            </w:r>
+          </w:p>
+        </w:tc>
+        <w:tc>
+          <w:tcPr>
+            <w:tcW w:w="2477" w:type="dxa"/>
+            <w:vAlign w:val="center"/>
+            <w:hideMark/>
+          </w:tcPr>
+          <w:p>
+            <w:pPr>
+              <w:cnfStyle w:val="000000100000" w:firstRow="0" w:lastRow="0" w:firstColumn="0" w:lastColumn="0" w:oddVBand="0" w:evenVBand="0" w:oddHBand="1" w:evenHBand="0" w:firstRowFirstColumn="0" w:firstRowLastColumn="0" w:lastRowFirstColumn="0" w:lastRowLastColumn="0"/>
+            </w:pPr>
+            <w:r>
+              <w:t>Update branch operating hours</w:t>
+            </w:r>
+          </w:p>
+        </w:tc>
+        <w:tc>
+          <w:tcPr>
+            <w:tcW w:w="1162" w:type="dxa"/>
+            <w:vAlign w:val="center"/>
+            <w:hideMark/>
+          </w:tcPr>
+          <w:p>
+            <w:pPr>
+              <w:jc w:val="center"/>
+              <w:cnfStyle w:val="000000100000" w:firstRow="0" w:lastRow="0" w:firstColumn="0" w:lastColumn="0" w:oddVBand="0" w:evenVBand="0" w:oddHBand="1" w:evenHBand="0" w:firstRowFirstColumn="0" w:firstRowLastColumn="0" w:lastRowFirstColumn="0" w:lastRowLastColumn="0"/>
+            </w:pPr>
+            <w:r>
+              <w:t>Yes</w:t>
+            </w:r>
+          </w:p>
+        </w:tc>
+      </w:tr>
+    </w:tbl>
+    <w:p/>
+    <w:p>
+      <w:pPr>
+        <w:spacing w:line="278" w:lineRule="auto"/>
+      </w:pPr>
+      <w:r>
+        <w:br w:type="page"/>
+      </w:r>
+    </w:p>
+    <w:p>
+      <w:pPr>
+        <w:pStyle w:val="Title"/>
+      </w:pPr>
+      <w:r>
+        <w:lastRenderedPageBreak/>
+        <w:t>API Design Considerations</w:t>
+      </w:r>
+    </w:p>
+    <w:p>
+      <w:r>
+        <w:t>Branch Management APIs are developed on the following basis:</w:t>
+      </w:r>
+    </w:p>
+    <w:p>
+      <w:pPr>
+        <w:pStyle w:val="ListParagraph"/>
+        <w:numPr>
+          <w:ilvl w:val="0"/>
+          <w:numId w:val="156"/>
+        </w:numPr>
+      </w:pPr>
+      <w:r>
+        <w:t>Agency Ownership: An agency can manage only its own branches.</w:t>
+      </w:r>
+    </w:p>
+    <w:p>
+      <w:pPr>
+        <w:pStyle w:val="ListParagraph"/>
+        <w:numPr>
+          <w:ilvl w:val="0"/>
+          <w:numId w:val="156"/>
+        </w:numPr>
+      </w:pPr>
+      <w:r>
+        <w:t>REST Resource Modeling: Branches will be modeled as REST resources and will have unique IDs.</w:t>
+      </w:r>
+    </w:p>
+    <w:p>
+      <w:pPr>
+        <w:pStyle w:val="ListParagraph"/>
+        <w:numPr>
+          <w:ilvl w:val="0"/>
+          <w:numId w:val="156"/>
+        </w:numPr>
+      </w:pPr>
+      <w:r>
+        <w:t>JWT Authentication: Access token is needed to use all the endpoints of the branch management.</w:t>
+      </w:r>
+    </w:p>
+    <w:p>
+      <w:pPr>
+        <w:pStyle w:val="ListParagraph"/>
+        <w:numPr>
+          <w:ilvl w:val="0"/>
+          <w:numId w:val="156"/>
+        </w:numPr>
+      </w:pPr>
+      <w:r>
+        <w:t>Role-based Authorization: Agency manager, branch manager, and administrator roles are allowed to perform branch management operations.</w:t>
+      </w:r>
+    </w:p>
+    <w:p>
+      <w:pPr>
+        <w:pStyle w:val="ListParagraph"/>
+        <w:numPr>
+          <w:ilvl w:val="0"/>
+          <w:numId w:val="156"/>
+        </w:numPr>
+      </w:pPr>
+      <w:r>
+        <w:t>Location Integrity: Each branch will keep unique location information, which includes address and geographic coordinates.</w:t>
+      </w:r>
+    </w:p>
+    <w:p>
+      <w:pPr>
+        <w:pStyle w:val="ListParagraph"/>
+        <w:numPr>
+          <w:ilvl w:val="0"/>
+          <w:numId w:val="156"/>
+        </w:numPr>
+      </w:pPr>
+      <w:r>
+        <w:t>Consistency: Updates of the information about branches will be kept consistent with fleet and reservation services.</w:t>
+      </w:r>
+    </w:p>
+    <w:p>
+      <w:pPr>
+        <w:pStyle w:val="ListParagraph"/>
+        <w:numPr>
+          <w:ilvl w:val="0"/>
+          <w:numId w:val="156"/>
+        </w:numPr>
+      </w:pPr>
+      <w:r>
+        <w:t>Soft Deletion: The branches linked with the operational vehicles or reservations cannot be deleted until these relationships are sorted out.</w:t>
+      </w:r>
+    </w:p>
+    <w:p>
+      <w:pPr>
+        <w:pStyle w:val="ListParagraph"/>
+        <w:numPr>
+          <w:ilvl w:val="0"/>
+          <w:numId w:val="156"/>
+        </w:numPr>
+      </w:pPr>
+      <w:r>
+        <w:t>Data Validation: Address, contact information, operating hours and other branch data will be validated before persisting.</w:t>
+      </w:r>
+    </w:p>
+    <w:p>
+      <w:pPr>
+        <w:pStyle w:val="Title"/>
+      </w:pPr>
+      <w:r>
+        <w:t>Branch Management Workflow</w:t>
+      </w:r>
+    </w:p>
+    <w:p>
+      <w:r>
+        <w:t>Branch management process includes the following operations:</w:t>
+      </w:r>
+    </w:p>
+    <w:p>
+      <w:pPr>
+        <w:pStyle w:val="ListParagraph"/>
+        <w:numPr>
+          <w:ilvl w:val="0"/>
+          <w:numId w:val="157"/>
+        </w:numPr>
+      </w:pPr>
+      <w:r>
+        <w:t>An agency manager logs into the Branch Management module using the authentication.</w:t>
+      </w:r>
+    </w:p>
+    <w:p>
+      <w:pPr>
+        <w:pStyle w:val="ListParagraph"/>
+        <w:numPr>
+          <w:ilvl w:val="0"/>
+          <w:numId w:val="157"/>
+        </w:numPr>
+      </w:pPr>
+      <w:r>
+        <w:t>The manager creates a new branch or updates the information about the existing branch.</w:t>
+      </w:r>
+    </w:p>
+    <w:p>
+      <w:pPr>
+        <w:pStyle w:val="ListParagraph"/>
+        <w:numPr>
+          <w:ilvl w:val="0"/>
+          <w:numId w:val="157"/>
+        </w:numPr>
+      </w:pPr>
+      <w:r>
+        <w:t>The information is validated by the Branch Management Service, and the validation includes address, contact information and operating hours of the branch.</w:t>
+      </w:r>
+    </w:p>
+    <w:p>
+      <w:pPr>
+        <w:pStyle w:val="ListParagraph"/>
+        <w:numPr>
+          <w:ilvl w:val="0"/>
+          <w:numId w:val="157"/>
+        </w:numPr>
+      </w:pPr>
+      <w:r>
+        <w:t>The information is persisted in the database.</w:t>
+      </w:r>
+    </w:p>
+    <w:p>
+      <w:pPr>
+        <w:pStyle w:val="ListParagraph"/>
+        <w:numPr>
+          <w:ilvl w:val="0"/>
+          <w:numId w:val="157"/>
+        </w:numPr>
+      </w:pPr>
+      <w:r>
+        <w:t>Vehicles and employees can be assigned to the branch.</w:t>
+      </w:r>
+    </w:p>
+    <w:p>
+      <w:pPr>
+        <w:pStyle w:val="ListParagraph"/>
+        <w:numPr>
+          <w:ilvl w:val="0"/>
+          <w:numId w:val="157"/>
+        </w:numPr>
+      </w:pPr>
+      <w:r>
+        <w:t>Fleet Management and Reservation Services synchronize the information about the branch in order to keep pickup and return location data accurate.</w:t>
+      </w:r>
+    </w:p>
+    <w:p>
+      <w:pPr>
+        <w:pStyle w:val="ListParagraph"/>
+        <w:numPr>
+          <w:ilvl w:val="0"/>
+          <w:numId w:val="157"/>
+        </w:numPr>
+      </w:pPr>
+      <w:r>
+        <w:t>The updated information will be available for customers searching for rental vehicles through the Vehicle Search APIs.</w:t>
+      </w:r>
+    </w:p>
+    <w:p>
+      <w:r>
+        <w:rPr>
+          <w:noProof/>
+        </w:rPr>
+        <mc:AlternateContent>
+          <mc:Choice Requires="wps">
+            <w:drawing>
+              <wp:anchor distT="0" distB="0" distL="114300" distR="114300" simplePos="0" relativeHeight="251669504" behindDoc="0" locked="0" layoutInCell="1" allowOverlap="1" wp14:anchorId="318310D1" wp14:editId="5E2C604F">
+                <wp:simplePos x="0" y="0"/>
+                <wp:positionH relativeFrom="column">
+                  <wp:posOffset>262255</wp:posOffset>
+                </wp:positionH>
+                <wp:positionV relativeFrom="paragraph">
+                  <wp:posOffset>1807845</wp:posOffset>
+                </wp:positionV>
+                <wp:extent cx="5029200" cy="635"/>
+                <wp:effectExtent l="0" t="0" r="0" b="0"/>
+                <wp:wrapSquare wrapText="bothSides"/>
+                <wp:docPr id="130269498" name="Text Box 1"/>
+                <wp:cNvGraphicFramePr/>
+                <a:graphic xmlns:a="http://schemas.openxmlformats.org/drawingml/2006/main">
+                  <a:graphicData uri="http://schemas.microsoft.com/office/word/2010/wordprocessingShape">
+                    <wps:wsp>
+                      <wps:cNvSpPr txBox="1"/>
+                      <wps:spPr>
+                        <a:xfrm>
+                          <a:off x="0" y="0"/>
+                          <a:ext cx="5029200" cy="635"/>
+                        </a:xfrm>
+                        <a:prstGeom prst="rect">
+                          <a:avLst/>
+                        </a:prstGeom>
+                        <a:solidFill>
+                          <a:prstClr val="white"/>
+                        </a:solidFill>
+                        <a:ln>
+                          <a:noFill/>
+                        </a:ln>
+                      </wps:spPr>
+                      <wps:txbx>
+                        <w:txbxContent>
+                          <w:p>
+                            <w:pPr>
+                              <w:pStyle w:val="Caption"/>
+                              <w:jc w:val="center"/>
+                            </w:pPr>
+                            <w:r>
+                              <w:t xml:space="preserve">Figure </w:t>
+                            </w:r>
+                            <w:r>
+                              <w:fldChar w:fldCharType="begin"/>
+                            </w:r>
+                            <w:r>
+                              <w:instrText xml:space="preserve"> SEQ Figure \* ARABIC </w:instrText>
+                            </w:r>
+                            <w:r>
+                              <w:fldChar w:fldCharType="separate"/>
+                            </w:r>
+                            <w:r>
+                              <w:rPr>
+                                <w:noProof/>
+                              </w:rPr>
+                              <w:t>4</w:t>
+                            </w:r>
+                            <w:r>
+                              <w:fldChar w:fldCharType="end"/>
+                            </w:r>
+                            <w:r>
+                              <w:t xml:space="preserve"> - Branch Management Workflow</w:t>
+                            </w:r>
+                          </w:p>
+                        </w:txbxContent>
+                      </wps:txbx>
+                      <wps:bodyPr rot="0" spcFirstLastPara="0" vertOverflow="overflow" horzOverflow="overflow" vert="horz" wrap="square" lIns="0" tIns="0" rIns="0" bIns="0" numCol="1" spcCol="0" rtlCol="0" fromWordArt="0" anchor="t" anchorCtr="0" forceAA="0" compatLnSpc="1">
+                        <a:prstTxWarp prst="textNoShape">
+                          <a:avLst/>
+                        </a:prstTxWarp>
+                        <a:spAutoFit/>
+                      </wps:bodyPr>
+                    </wps:wsp>
+                  </a:graphicData>
+                </a:graphic>
+              </wp:anchor>
+            </w:drawing>
+          </mc:Choice>
+          <mc:Fallback>
+            <w:pict>
+              <v:shape w14:anchorId="318310D1" id="_x0000_s1029" type="#_x0000_t202" style="position:absolute;margin-left:20.65pt;margin-top:142.35pt;width:396pt;height:.05pt;z-index:251669504;visibility:visible;mso-wrap-style:square;mso-wrap-distance-left:9pt;mso-wrap-distance-top:0;mso-wrap-distance-right:9pt;mso-wrap-distance-bottom:0;mso-position-horizontal:absolute;mso-position-horizontal-relative:text;mso-position-vertical:absolute;mso-position-vertical-relative:text;v-text-anchor:top" o:gfxdata="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" stroked="f">
+                <v:textbox style="mso-fit-shape-to-text:t" inset="0,0,0,0">
+                  <w:txbxContent>
+                    <w:p>
+                      <w:pPr>
+                        <w:pStyle w:val="Caption"/>
+                        <w:jc w:val="center"/>
+                      </w:pPr>
+                      <w:r>
+                        <w:t xml:space="preserve">Figure </w:t>
+                      </w:r>
+                      <w:r>
+                        <w:fldChar w:fldCharType="begin"/>
+                      </w:r>
+                      <w:r>
+                        <w:instrText xml:space="preserve"> SEQ Figure \* ARABIC </w:instrText>
+                      </w:r>
+                      <w:r>
+                        <w:fldChar w:fldCharType="separate"/>
+                      </w:r>
+                      <w:r>
+                        <w:rPr>
+                          <w:noProof/>
+                        </w:rPr>
+                        <w:t>4</w:t>
+                      </w:r>
+                      <w:r>
+                        <w:fldChar w:fldCharType="end"/>
+                      </w:r>
+                      <w:r>
+                        <w:t xml:space="preserve"> - Branch Management Workflow</w:t>
+                      </w:r>
+                    </w:p>
+                  </w:txbxContent>
+                </v:textbox>
+                <w10:wrap type="square"/>
+              </v:shape>
+            </w:pict>
+          </mc:Fallback>
+        </mc:AlternateContent>
+      </w:r>
+      <w:r>
+        <w:drawing>
+          <wp:anchor distT="0" distB="0" distL="114300" distR="114300" simplePos="0" relativeHeight="251667456" behindDoc="0" locked="0" layoutInCell="1" allowOverlap="1" wp14:anchorId="5FEA4455" wp14:editId="4D2CCD7D">
+            <wp:simplePos x="0" y="0"/>
+            <wp:positionH relativeFrom="column">
+              <wp:posOffset>262255</wp:posOffset>
+            </wp:positionH>
+            <wp:positionV relativeFrom="paragraph">
+              <wp:posOffset>280670</wp:posOffset>
+            </wp:positionV>
+            <wp:extent cx="5029200" cy="1470025"/>
+            <wp:effectExtent l="0" t="0" r="0" b="0"/>
+            <wp:wrapSquare wrapText="bothSides"/>
+            <wp:docPr id="719496258" name="Picture 1"/>
+            <wp:cNvGraphicFramePr>
+              <a:graphicFrameLocks xmlns:a="http://schemas.openxmlformats.org/drawingml/2006/main" noChangeAspect="1"/>
+            </wp:cNvGraphicFramePr>
+            <a:graphic xmlns:a="http://schemas.openxmlformats.org/drawingml/2006/main">
+              <a:graphicData uri="http://schemas.openxmlformats.org/drawingml/2006/picture">
+                <pic:pic xmlns:pic="http://schemas.openxmlformats.org/drawingml/2006/picture">
+                  <pic:nvPicPr>
+                    <pic:cNvPr id="719496258" name=""/>
+                    <pic:cNvPicPr/>
+                  </pic:nvPicPr>
+                  <pic:blipFill rotWithShape="1">
+                    <a:blip r:embed="rId11">
+                      <a:extLst>
+                        <a:ext uri="{28A0092B-C50C-407E-A947-70E740481C1C}">
+                          <a14:useLocalDpi xmlns:a14="http://schemas.microsoft.com/office/drawing/2010/main" val="0"/>
+                        </a:ext>
+                      </a:extLst>
+                    </a:blip>
+                    <a:srcRect t="9817"/>
+                    <a:stretch>
+                      <a:fillRect/>
+                    </a:stretch>
+                  </pic:blipFill>
+                  <pic:spPr bwMode="auto">
+                    <a:xfrm>
+                      <a:off x="0" y="0"/>
+                      <a:ext cx="5029200" cy="1470025"/>
+                    </a:xfrm>
+                    <a:prstGeom prst="rect">
+                      <a:avLst/>
+                    </a:prstGeom>
+                    <a:ln>
+                      <a:noFill/>
+                    </a:ln>
+                    <a:extLst>
+                      <a:ext uri="{53640926-AAD7-44D8-BBD7-CCE9431645EC}">
+                        <a14:shadowObscured xmlns:a14="http://schemas.microsoft.com/office/drawing/2010/main"/>
+                      </a:ext>
+                    </a:extLst>
+                  </pic:spPr>
+                </pic:pic>
+              </a:graphicData>
+            </a:graphic>
+            <wp14:sizeRelH relativeFrom="margin">
+              <wp14:pctWidth>0</wp14:pctWidth>
+            </wp14:sizeRelH>
+            <wp14:sizeRelV relativeFrom="margin">
+              <wp14:pctHeight>0</wp14:pctHeight>
+            </wp14:sizeRelV>
+          </wp:anchor>
+        </w:drawing>
+      </w:r>
+    </w:p>
     <w:p/>
     <w:p/>
     <w:p/>
     <w:p/>
+    <w:p/>
+    <w:p/>
+    <w:p/>
+    <w:p>
+      <w:pPr>
+        <w:spacing w:line="278" w:lineRule="auto"/>
+      </w:pPr>
+      <w:r>
+        <w:br w:type="page"/>
+      </w:r>
+    </w:p>
     <w:sectPr>
-      <w:headerReference w:type="default" r:id="rId11"/>
-      <w:footerReference w:type="default" r:id="rId12"/>
+      <w:headerReference w:type="default" r:id="rId12"/>
+      <w:footerReference w:type="default" r:id="rId13"/>
       <w:pgSz w:w="11906" w:h="16838" w:code="9"/>
       <w:pgMar w:top="1411" w:right="850" w:bottom="1411" w:left="1699" w:header="720" w:footer="288" w:gutter="0"/>
       <w:pgNumType w:start="1"/>
@@ -7780,6 +9016,92 @@
     </w:lvl>
   </w:abstractNum>
   <w:abstractNum w:abstractNumId="2" w15:restartNumberingAfterBreak="0">
+    <w:nsid w:val="040F5FD4"/>
+    <w:multiLevelType w:val="hybridMultilevel"/>
+    <w:tmpl w:val="2932DBF0"/>
+    <w:lvl w:ilvl="0" w:tplc="0409000F">
+      <w:start w:val="1"/>
+      <w:numFmt w:val="decimal"/>
+      <w:lvlText w:val="%1."/>
+      <w:lvlJc w:val="left"/>
+      <w:pPr>
+        <w:ind w:left="720" w:hanging="360"/>
+      </w:pPr>
+    </w:lvl>
+    <w:lvl w:ilvl="1" w:tplc="04090019" w:tentative="1">
+      <w:start w:val="1"/>
+      <w:numFmt w:val="lowerLetter"/>
+      <w:lvlText w:val="%2."/>
+      <w:lvlJc w:val="left"/>
+      <w:pPr>
+        <w:ind w:left="1440" w:hanging="360"/>
+      </w:pPr>
+    </w:lvl>
+    <w:lvl w:ilvl="2" w:tplc="0409001B" w:tentative="1">
+      <w:start w:val="1"/>
+      <w:numFmt w:val="lowerRoman"/>
+      <w:lvlText w:val="%3."/>
+      <w:lvlJc w:val="right"/>
+      <w:pPr>
+        <w:ind w:left="2160" w:hanging="180"/>
+      </w:pPr>
+    </w:lvl>
+    <w:lvl w:ilvl="3" w:tplc="0409000F" w:tentative="1">
+      <w:start w:val="1"/>
+      <w:numFmt w:val="decimal"/>
+      <w:lvlText w:val="%4."/>
+      <w:lvlJc w:val="left"/>
+      <w:pPr>
+        <w:ind w:left="2880" w:hanging="360"/>
+      </w:pPr>
+    </w:lvl>
+    <w:lvl w:ilvl="4" w:tplc="04090019" w:tentative="1">
+      <w:start w:val="1"/>
+      <w:numFmt w:val="lowerLetter"/>
+      <w:lvlText w:val="%5."/>
+      <w:lvlJc w:val="left"/>
+      <w:pPr>
+        <w:ind w:left="3600" w:hanging="360"/>
+      </w:pPr>
+    </w:lvl>
+    <w:lvl w:ilvl="5" w:tplc="0409001B" w:tentative="1">
+      <w:start w:val="1"/>
+      <w:numFmt w:val="lowerRoman"/>
+      <w:lvlText w:val="%6."/>
+      <w:lvlJc w:val="right"/>
+      <w:pPr>
+        <w:ind w:left="4320" w:hanging="180"/>
+      </w:pPr>
+    </w:lvl>
+    <w:lvl w:ilvl="6" w:tplc="0409000F" w:tentative="1">
+      <w:start w:val="1"/>
+      <w:numFmt w:val="decimal"/>
+      <w:lvlText w:val="%7."/>
+      <w:lvlJc w:val="left"/>
+      <w:pPr>
+        <w:ind w:left="5040" w:hanging="360"/>
+      </w:pPr>
+    </w:lvl>
+    <w:lvl w:ilvl="7" w:tplc="04090019" w:tentative="1">
+      <w:start w:val="1"/>
+      <w:numFmt w:val="lowerLetter"/>
+      <w:lvlText w:val="%8."/>
+      <w:lvlJc w:val="left"/>
+      <w:pPr>
+        <w:ind w:left="5760" w:hanging="360"/>
+      </w:pPr>
+    </w:lvl>
+    <w:lvl w:ilvl="8" w:tplc="0409001B" w:tentative="1">
+      <w:start w:val="1"/>
+      <w:numFmt w:val="lowerRoman"/>
+      <w:lvlText w:val="%9."/>
+      <w:lvlJc w:val="right"/>
+      <w:pPr>
+        <w:ind w:left="6480" w:hanging="180"/>
+      </w:pPr>
+    </w:lvl>
+  </w:abstractNum>
+  <w:abstractNum w:abstractNumId="3" w15:restartNumberingAfterBreak="0">
     <w:nsid w:val="05CA53BE"/>
     <w:multiLevelType w:val="multilevel"/>
     <w:tmpl w:val="63F4E6F0"/>
@@ -7928,7 +9250,7 @@
       </w:rPr>
     </w:lvl>
   </w:abstractNum>
-  <w:abstractNum w:abstractNumId="3" w15:restartNumberingAfterBreak="0">
+  <w:abstractNum w:abstractNumId="4" w15:restartNumberingAfterBreak="0">
     <w:nsid w:val="05D01B76"/>
     <w:multiLevelType w:val="hybridMultilevel"/>
     <w:tmpl w:val="5E9E3974"/>
@@ -8041,7 +9363,7 @@
       </w:rPr>
     </w:lvl>
   </w:abstractNum>
-  <w:abstractNum w:abstractNumId="4" w15:restartNumberingAfterBreak="0">
+  <w:abstractNum w:abstractNumId="5" w15:restartNumberingAfterBreak="0">
     <w:nsid w:val="067865BF"/>
     <w:multiLevelType w:val="multilevel"/>
     <w:tmpl w:val="63F4E6F0"/>
@@ -8190,7 +9512,7 @@
       </w:rPr>
     </w:lvl>
   </w:abstractNum>
-  <w:abstractNum w:abstractNumId="5" w15:restartNumberingAfterBreak="0">
+  <w:abstractNum w:abstractNumId="6" w15:restartNumberingAfterBreak="0">
     <w:nsid w:val="068F4D2E"/>
     <w:multiLevelType w:val="hybridMultilevel"/>
     <w:tmpl w:val="49F46C20"/>
@@ -8302,7 +9624,7 @@
       </w:rPr>
     </w:lvl>
   </w:abstractNum>
-  <w:abstractNum w:abstractNumId="6" w15:restartNumberingAfterBreak="0">
+  <w:abstractNum w:abstractNumId="7" w15:restartNumberingAfterBreak="0">
     <w:nsid w:val="0B782C17"/>
     <w:multiLevelType w:val="hybridMultilevel"/>
     <w:tmpl w:val="18A01304"/>
@@ -8415,7 +9737,7 @@
       </w:rPr>
     </w:lvl>
   </w:abstractNum>
-  <w:abstractNum w:abstractNumId="7" w15:restartNumberingAfterBreak="0">
+  <w:abstractNum w:abstractNumId="8" w15:restartNumberingAfterBreak="0">
     <w:nsid w:val="0C1B283C"/>
     <w:multiLevelType w:val="multilevel"/>
     <w:tmpl w:val="63F4E6F0"/>
@@ -8564,7 +9886,7 @@
       </w:rPr>
     </w:lvl>
   </w:abstractNum>
-  <w:abstractNum w:abstractNumId="8" w15:restartNumberingAfterBreak="0">
+  <w:abstractNum w:abstractNumId="9" w15:restartNumberingAfterBreak="0">
     <w:nsid w:val="0C6E0690"/>
     <w:multiLevelType w:val="hybridMultilevel"/>
     <w:tmpl w:val="54D4A188"/>
@@ -8676,7 +9998,7 @@
       </w:rPr>
     </w:lvl>
   </w:abstractNum>
-  <w:abstractNum w:abstractNumId="9" w15:restartNumberingAfterBreak="0">
+  <w:abstractNum w:abstractNumId="10" w15:restartNumberingAfterBreak="0">
     <w:nsid w:val="0F4F06D8"/>
     <w:multiLevelType w:val="multilevel"/>
     <w:tmpl w:val="68E44DE0"/>
@@ -8825,7 +10147,7 @@
       </w:rPr>
     </w:lvl>
   </w:abstractNum>
-  <w:abstractNum w:abstractNumId="10" w15:restartNumberingAfterBreak="0">
+  <w:abstractNum w:abstractNumId="11" w15:restartNumberingAfterBreak="0">
     <w:nsid w:val="0FDE792A"/>
     <w:multiLevelType w:val="hybridMultilevel"/>
     <w:tmpl w:val="43823D74"/>
@@ -8937,7 +10259,7 @@
       </w:rPr>
     </w:lvl>
   </w:abstractNum>
-  <w:abstractNum w:abstractNumId="11" w15:restartNumberingAfterBreak="0">
+  <w:abstractNum w:abstractNumId="12" w15:restartNumberingAfterBreak="0">
     <w:nsid w:val="12201BE9"/>
     <w:multiLevelType w:val="multilevel"/>
     <w:tmpl w:val="CED6A096"/>
@@ -9086,7 +10408,7 @@
       </w:rPr>
     </w:lvl>
   </w:abstractNum>
-  <w:abstractNum w:abstractNumId="12" w15:restartNumberingAfterBreak="0">
+  <w:abstractNum w:abstractNumId="13" w15:restartNumberingAfterBreak="0">
     <w:nsid w:val="129D4E29"/>
     <w:multiLevelType w:val="hybridMultilevel"/>
     <w:tmpl w:val="87E86058"/>
@@ -9172,7 +10494,7 @@
       </w:pPr>
     </w:lvl>
   </w:abstractNum>
-  <w:abstractNum w:abstractNumId="13" w15:restartNumberingAfterBreak="0">
+  <w:abstractNum w:abstractNumId="14" w15:restartNumberingAfterBreak="0">
     <w:nsid w:val="135C5CF3"/>
     <w:multiLevelType w:val="multilevel"/>
     <w:tmpl w:val="61D20A04"/>
@@ -9321,7 +10643,7 @@
       </w:rPr>
     </w:lvl>
   </w:abstractNum>
-  <w:abstractNum w:abstractNumId="14" w15:restartNumberingAfterBreak="0">
+  <w:abstractNum w:abstractNumId="15" w15:restartNumberingAfterBreak="0">
     <w:nsid w:val="137648CC"/>
     <w:multiLevelType w:val="multilevel"/>
     <w:tmpl w:val="EC983E9E"/>
@@ -9470,7 +10792,7 @@
       </w:rPr>
     </w:lvl>
   </w:abstractNum>
-  <w:abstractNum w:abstractNumId="15" w15:restartNumberingAfterBreak="0">
+  <w:abstractNum w:abstractNumId="16" w15:restartNumberingAfterBreak="0">
     <w:nsid w:val="15354085"/>
     <w:multiLevelType w:val="multilevel"/>
     <w:tmpl w:val="ED488EA0"/>
@@ -9619,7 +10941,7 @@
       </w:rPr>
     </w:lvl>
   </w:abstractNum>
-  <w:abstractNum w:abstractNumId="16" w15:restartNumberingAfterBreak="0">
+  <w:abstractNum w:abstractNumId="17" w15:restartNumberingAfterBreak="0">
     <w:nsid w:val="158836AF"/>
     <w:multiLevelType w:val="hybridMultilevel"/>
     <w:tmpl w:val="3FE0C50C"/>
@@ -9705,7 +11027,7 @@
       </w:pPr>
     </w:lvl>
   </w:abstractNum>
-  <w:abstractNum w:abstractNumId="17" w15:restartNumberingAfterBreak="0">
+  <w:abstractNum w:abstractNumId="18" w15:restartNumberingAfterBreak="0">
     <w:nsid w:val="15923962"/>
     <w:multiLevelType w:val="hybridMultilevel"/>
     <w:tmpl w:val="2A8A437A"/>
@@ -9817,7 +11139,7 @@
       </w:rPr>
     </w:lvl>
   </w:abstractNum>
-  <w:abstractNum w:abstractNumId="18" w15:restartNumberingAfterBreak="0">
+  <w:abstractNum w:abstractNumId="19" w15:restartNumberingAfterBreak="0">
     <w:nsid w:val="15E231DD"/>
     <w:multiLevelType w:val="hybridMultilevel"/>
     <w:tmpl w:val="48B4AB8E"/>
@@ -9930,7 +11252,7 @@
       </w:rPr>
     </w:lvl>
   </w:abstractNum>
-  <w:abstractNum w:abstractNumId="19" w15:restartNumberingAfterBreak="0">
+  <w:abstractNum w:abstractNumId="20" w15:restartNumberingAfterBreak="0">
     <w:nsid w:val="15FB6E59"/>
     <w:multiLevelType w:val="multilevel"/>
     <w:tmpl w:val="63F4E6F0"/>
@@ -10079,7 +11401,7 @@
       </w:rPr>
     </w:lvl>
   </w:abstractNum>
-  <w:abstractNum w:abstractNumId="20" w15:restartNumberingAfterBreak="0">
+  <w:abstractNum w:abstractNumId="21" w15:restartNumberingAfterBreak="0">
     <w:nsid w:val="16057B40"/>
     <w:multiLevelType w:val="hybridMultilevel"/>
     <w:tmpl w:val="C63C7D68"/>
@@ -10191,7 +11513,7 @@
       </w:rPr>
     </w:lvl>
   </w:abstractNum>
-  <w:abstractNum w:abstractNumId="21" w15:restartNumberingAfterBreak="0">
+  <w:abstractNum w:abstractNumId="22" w15:restartNumberingAfterBreak="0">
     <w:nsid w:val="18441B3D"/>
     <w:multiLevelType w:val="hybridMultilevel"/>
     <w:tmpl w:val="F162D252"/>
@@ -10303,7 +11625,7 @@
       </w:rPr>
     </w:lvl>
   </w:abstractNum>
-  <w:abstractNum w:abstractNumId="22" w15:restartNumberingAfterBreak="0">
+  <w:abstractNum w:abstractNumId="23" w15:restartNumberingAfterBreak="0">
     <w:nsid w:val="185230B0"/>
     <w:multiLevelType w:val="hybridMultilevel"/>
     <w:tmpl w:val="FDFE89EE"/>
@@ -10416,7 +11738,7 @@
       </w:rPr>
     </w:lvl>
   </w:abstractNum>
-  <w:abstractNum w:abstractNumId="23" w15:restartNumberingAfterBreak="0">
+  <w:abstractNum w:abstractNumId="24" w15:restartNumberingAfterBreak="0">
     <w:nsid w:val="18A93E35"/>
     <w:multiLevelType w:val="hybridMultilevel"/>
     <w:tmpl w:val="7A6E3062"/>
@@ -10528,7 +11850,7 @@
       </w:rPr>
     </w:lvl>
   </w:abstractNum>
-  <w:abstractNum w:abstractNumId="24" w15:restartNumberingAfterBreak="0">
+  <w:abstractNum w:abstractNumId="25" w15:restartNumberingAfterBreak="0">
     <w:nsid w:val="18EC3D82"/>
     <w:multiLevelType w:val="hybridMultilevel"/>
     <w:tmpl w:val="BC5A743C"/>
@@ -10641,7 +11963,7 @@
       </w:rPr>
     </w:lvl>
   </w:abstractNum>
-  <w:abstractNum w:abstractNumId="25" w15:restartNumberingAfterBreak="0">
+  <w:abstractNum w:abstractNumId="26" w15:restartNumberingAfterBreak="0">
     <w:nsid w:val="18F46E01"/>
     <w:multiLevelType w:val="multilevel"/>
     <w:tmpl w:val="C77EDED0"/>
@@ -10790,7 +12112,7 @@
       </w:rPr>
     </w:lvl>
   </w:abstractNum>
-  <w:abstractNum w:abstractNumId="26" w15:restartNumberingAfterBreak="0">
+  <w:abstractNum w:abstractNumId="27" w15:restartNumberingAfterBreak="0">
     <w:nsid w:val="19C83C12"/>
     <w:multiLevelType w:val="multilevel"/>
     <w:tmpl w:val="7690D588"/>
@@ -10939,7 +12261,7 @@
       </w:rPr>
     </w:lvl>
   </w:abstractNum>
-  <w:abstractNum w:abstractNumId="27" w15:restartNumberingAfterBreak="0">
+  <w:abstractNum w:abstractNumId="28" w15:restartNumberingAfterBreak="0">
     <w:nsid w:val="1A236A44"/>
     <w:multiLevelType w:val="hybridMultilevel"/>
     <w:tmpl w:val="E06C248C"/>
@@ -11052,7 +12374,7 @@
       </w:rPr>
     </w:lvl>
   </w:abstractNum>
-  <w:abstractNum w:abstractNumId="28" w15:restartNumberingAfterBreak="0">
+  <w:abstractNum w:abstractNumId="29" w15:restartNumberingAfterBreak="0">
     <w:nsid w:val="1C511176"/>
     <w:multiLevelType w:val="multilevel"/>
     <w:tmpl w:val="201E7F12"/>
@@ -11201,7 +12523,7 @@
       </w:rPr>
     </w:lvl>
   </w:abstractNum>
-  <w:abstractNum w:abstractNumId="29" w15:restartNumberingAfterBreak="0">
+  <w:abstractNum w:abstractNumId="30" w15:restartNumberingAfterBreak="0">
     <w:nsid w:val="1D4C2E50"/>
     <w:multiLevelType w:val="multilevel"/>
     <w:tmpl w:val="63F4E6F0"/>
@@ -11350,7 +12672,7 @@
       </w:rPr>
     </w:lvl>
   </w:abstractNum>
-  <w:abstractNum w:abstractNumId="30" w15:restartNumberingAfterBreak="0">
+  <w:abstractNum w:abstractNumId="31" w15:restartNumberingAfterBreak="0">
     <w:nsid w:val="1D592278"/>
     <w:multiLevelType w:val="hybridMultilevel"/>
     <w:tmpl w:val="0622B59C"/>
@@ -11463,7 +12785,7 @@
       </w:rPr>
     </w:lvl>
   </w:abstractNum>
-  <w:abstractNum w:abstractNumId="31" w15:restartNumberingAfterBreak="0">
+  <w:abstractNum w:abstractNumId="32" w15:restartNumberingAfterBreak="0">
     <w:nsid w:val="1EC4731F"/>
     <w:multiLevelType w:val="hybridMultilevel"/>
     <w:tmpl w:val="8E26D8F0"/>
@@ -11575,7 +12897,7 @@
       </w:rPr>
     </w:lvl>
   </w:abstractNum>
-  <w:abstractNum w:abstractNumId="32" w15:restartNumberingAfterBreak="0">
+  <w:abstractNum w:abstractNumId="33" w15:restartNumberingAfterBreak="0">
     <w:nsid w:val="20017871"/>
     <w:multiLevelType w:val="hybridMultilevel"/>
     <w:tmpl w:val="EA76608A"/>
@@ -11688,7 +13010,7 @@
       </w:rPr>
     </w:lvl>
   </w:abstractNum>
-  <w:abstractNum w:abstractNumId="33" w15:restartNumberingAfterBreak="0">
+  <w:abstractNum w:abstractNumId="34" w15:restartNumberingAfterBreak="0">
     <w:nsid w:val="206A32F9"/>
     <w:multiLevelType w:val="hybridMultilevel"/>
     <w:tmpl w:val="7A405CA6"/>
@@ -11800,7 +13122,7 @@
       </w:rPr>
     </w:lvl>
   </w:abstractNum>
-  <w:abstractNum w:abstractNumId="34" w15:restartNumberingAfterBreak="0">
+  <w:abstractNum w:abstractNumId="35" w15:restartNumberingAfterBreak="0">
     <w:nsid w:val="20786568"/>
     <w:multiLevelType w:val="hybridMultilevel"/>
     <w:tmpl w:val="200CC0BC"/>
@@ -11912,7 +13234,7 @@
       </w:rPr>
     </w:lvl>
   </w:abstractNum>
-  <w:abstractNum w:abstractNumId="35" w15:restartNumberingAfterBreak="0">
+  <w:abstractNum w:abstractNumId="36" w15:restartNumberingAfterBreak="0">
     <w:nsid w:val="207D21A1"/>
     <w:multiLevelType w:val="hybridMultilevel"/>
     <w:tmpl w:val="AAAE4260"/>
@@ -12024,7 +13346,7 @@
       </w:rPr>
     </w:lvl>
   </w:abstractNum>
-  <w:abstractNum w:abstractNumId="36" w15:restartNumberingAfterBreak="0">
+  <w:abstractNum w:abstractNumId="37" w15:restartNumberingAfterBreak="0">
     <w:nsid w:val="20DC5034"/>
     <w:multiLevelType w:val="hybridMultilevel"/>
     <w:tmpl w:val="4B5425EA"/>
@@ -12136,7 +13458,120 @@
       </w:rPr>
     </w:lvl>
   </w:abstractNum>
-  <w:abstractNum w:abstractNumId="37" w15:restartNumberingAfterBreak="0">
+  <w:abstractNum w:abstractNumId="38" w15:restartNumberingAfterBreak="0">
+    <w:nsid w:val="220B2C13"/>
+    <w:multiLevelType w:val="hybridMultilevel"/>
+    <w:tmpl w:val="1854C634"/>
+    <w:lvl w:ilvl="0" w:tplc="04090005">
+      <w:start w:val="1"/>
+      <w:numFmt w:val="bullet"/>
+      <w:lvlText w:val=""/>
+      <w:lvlJc w:val="left"/>
+      <w:pPr>
+        <w:ind w:left="720" w:hanging="360"/>
+      </w:pPr>
+      <w:rPr>
+        <w:rFonts w:ascii="Wingdings" w:hAnsi="Wingdings" w:hint="default"/>
+      </w:rPr>
+    </w:lvl>
+    <w:lvl w:ilvl="1" w:tplc="04090003" w:tentative="1">
+      <w:start w:val="1"/>
+      <w:numFmt w:val="bullet"/>
+      <w:lvlText w:val="o"/>
+      <w:lvlJc w:val="left"/>
+      <w:pPr>
+        <w:ind w:left="1440" w:hanging="360"/>
+      </w:pPr>
+      <w:rPr>
+        <w:rFonts w:ascii="Courier New" w:hAnsi="Courier New" w:cs="Courier New" w:hint="default"/>
+      </w:rPr>
+    </w:lvl>
+    <w:lvl w:ilvl="2" w:tplc="04090005" w:tentative="1">
+      <w:start w:val="1"/>
+      <w:numFmt w:val="bullet"/>
+      <w:lvlText w:val=""/>
+      <w:lvlJc w:val="left"/>
+      <w:pPr>
+        <w:ind w:left="2160" w:hanging="360"/>
+      </w:pPr>
+      <w:rPr>
+        <w:rFonts w:ascii="Wingdings" w:hAnsi="Wingdings" w:hint="default"/>
+      </w:rPr>
+    </w:lvl>
+    <w:lvl w:ilvl="3" w:tplc="04090001" w:tentative="1">
+      <w:start w:val="1"/>
+      <w:numFmt w:val="bullet"/>
+      <w:lvlText w:val=""/>
+      <w:lvlJc w:val="left"/>
+      <w:pPr>
+        <w:ind w:left="2880" w:hanging="360"/>
+      </w:pPr>
+      <w:rPr>
+        <w:rFonts w:ascii="Symbol" w:hAnsi="Symbol" w:hint="default"/>
+      </w:rPr>
+    </w:lvl>
+    <w:lvl w:ilvl="4" w:tplc="04090003" w:tentative="1">
+      <w:start w:val="1"/>
+      <w:numFmt w:val="bullet"/>
+      <w:lvlText w:val="o"/>
+      <w:lvlJc w:val="left"/>
+      <w:pPr>
+        <w:ind w:left="3600" w:hanging="360"/>
+      </w:pPr>
+      <w:rPr>
+        <w:rFonts w:ascii="Courier New" w:hAnsi="Courier New" w:cs="Courier New" w:hint="default"/>
+      </w:rPr>
+    </w:lvl>
+    <w:lvl w:ilvl="5" w:tplc="04090005" w:tentative="1">
+      <w:start w:val="1"/>
+      <w:numFmt w:val="bullet"/>
+      <w:lvlText w:val=""/>
+      <w:lvlJc w:val="left"/>
+      <w:pPr>
+        <w:ind w:left="4320" w:hanging="360"/>
+      </w:pPr>
+      <w:rPr>
+        <w:rFonts w:ascii="Wingdings" w:hAnsi="Wingdings" w:hint="default"/>
+      </w:rPr>
+    </w:lvl>
+    <w:lvl w:ilvl="6" w:tplc="04090001" w:tentative="1">
+      <w:start w:val="1"/>
+      <w:numFmt w:val="bullet"/>
+      <w:lvlText w:val=""/>
+      <w:lvlJc w:val="left"/>
+      <w:pPr>
+        <w:ind w:left="5040" w:hanging="360"/>
+      </w:pPr>
+      <w:rPr>
+        <w:rFonts w:ascii="Symbol" w:hAnsi="Symbol" w:hint="default"/>
+      </w:rPr>
+    </w:lvl>
+    <w:lvl w:ilvl="7" w:tplc="04090003" w:tentative="1">
+      <w:start w:val="1"/>
+      <w:numFmt w:val="bullet"/>
+      <w:lvlText w:val="o"/>
+      <w:lvlJc w:val="left"/>
+      <w:pPr>
+        <w:ind w:left="5760" w:hanging="360"/>
+      </w:pPr>
+      <w:rPr>
+        <w:rFonts w:ascii="Courier New" w:hAnsi="Courier New" w:cs="Courier New" w:hint="default"/>
+      </w:rPr>
+    </w:lvl>
+    <w:lvl w:ilvl="8" w:tplc="04090005" w:tentative="1">
+      <w:start w:val="1"/>
+      <w:numFmt w:val="bullet"/>
+      <w:lvlText w:val=""/>
+      <w:lvlJc w:val="left"/>
+      <w:pPr>
+        <w:ind w:left="6480" w:hanging="360"/>
+      </w:pPr>
+      <w:rPr>
+        <w:rFonts w:ascii="Wingdings" w:hAnsi="Wingdings" w:hint="default"/>
+      </w:rPr>
+    </w:lvl>
+  </w:abstractNum>
+  <w:abstractNum w:abstractNumId="39" w15:restartNumberingAfterBreak="0">
     <w:nsid w:val="224C7C45"/>
     <w:multiLevelType w:val="multilevel"/>
     <w:tmpl w:val="5C800264"/>
@@ -12285,7 +13720,7 @@
       </w:rPr>
     </w:lvl>
   </w:abstractNum>
-  <w:abstractNum w:abstractNumId="38" w15:restartNumberingAfterBreak="0">
+  <w:abstractNum w:abstractNumId="40" w15:restartNumberingAfterBreak="0">
     <w:nsid w:val="23970AD1"/>
     <w:multiLevelType w:val="hybridMultilevel"/>
     <w:tmpl w:val="6A1E8A04"/>
@@ -12397,7 +13832,7 @@
       </w:rPr>
     </w:lvl>
   </w:abstractNum>
-  <w:abstractNum w:abstractNumId="39" w15:restartNumberingAfterBreak="0">
+  <w:abstractNum w:abstractNumId="41" w15:restartNumberingAfterBreak="0">
     <w:nsid w:val="243D731E"/>
     <w:multiLevelType w:val="multilevel"/>
     <w:tmpl w:val="51303158"/>
@@ -12546,7 +13981,7 @@
       </w:rPr>
     </w:lvl>
   </w:abstractNum>
-  <w:abstractNum w:abstractNumId="40" w15:restartNumberingAfterBreak="0">
+  <w:abstractNum w:abstractNumId="42" w15:restartNumberingAfterBreak="0">
     <w:nsid w:val="253A4FEB"/>
     <w:multiLevelType w:val="hybridMultilevel"/>
     <w:tmpl w:val="5628BED4"/>
@@ -12659,7 +14094,7 @@
       </w:rPr>
     </w:lvl>
   </w:abstractNum>
-  <w:abstractNum w:abstractNumId="41" w15:restartNumberingAfterBreak="0">
+  <w:abstractNum w:abstractNumId="43" w15:restartNumberingAfterBreak="0">
     <w:nsid w:val="26BA6D3C"/>
     <w:multiLevelType w:val="hybridMultilevel"/>
     <w:tmpl w:val="F03CC954"/>
@@ -12771,7 +14206,7 @@
       </w:rPr>
     </w:lvl>
   </w:abstractNum>
-  <w:abstractNum w:abstractNumId="42" w15:restartNumberingAfterBreak="0">
+  <w:abstractNum w:abstractNumId="44" w15:restartNumberingAfterBreak="0">
     <w:nsid w:val="28765EA3"/>
     <w:multiLevelType w:val="hybridMultilevel"/>
     <w:tmpl w:val="1CFAEB30"/>
@@ -12884,7 +14319,7 @@
       </w:rPr>
     </w:lvl>
   </w:abstractNum>
-  <w:abstractNum w:abstractNumId="43" w15:restartNumberingAfterBreak="0">
+  <w:abstractNum w:abstractNumId="45" w15:restartNumberingAfterBreak="0">
     <w:nsid w:val="28940045"/>
     <w:multiLevelType w:val="multilevel"/>
     <w:tmpl w:val="23DE4804"/>
@@ -13033,7 +14468,7 @@
       </w:rPr>
     </w:lvl>
   </w:abstractNum>
-  <w:abstractNum w:abstractNumId="44" w15:restartNumberingAfterBreak="0">
+  <w:abstractNum w:abstractNumId="46" w15:restartNumberingAfterBreak="0">
     <w:nsid w:val="289938CC"/>
     <w:multiLevelType w:val="multilevel"/>
     <w:tmpl w:val="57745EE2"/>
@@ -13182,7 +14617,7 @@
       </w:rPr>
     </w:lvl>
   </w:abstractNum>
-  <w:abstractNum w:abstractNumId="45" w15:restartNumberingAfterBreak="0">
+  <w:abstractNum w:abstractNumId="47" w15:restartNumberingAfterBreak="0">
     <w:nsid w:val="2ADE3401"/>
     <w:multiLevelType w:val="multilevel"/>
     <w:tmpl w:val="63F4E6F0"/>
@@ -13331,7 +14766,7 @@
       </w:rPr>
     </w:lvl>
   </w:abstractNum>
-  <w:abstractNum w:abstractNumId="46" w15:restartNumberingAfterBreak="0">
+  <w:abstractNum w:abstractNumId="48" w15:restartNumberingAfterBreak="0">
     <w:nsid w:val="2B592B9C"/>
     <w:multiLevelType w:val="hybridMultilevel"/>
     <w:tmpl w:val="99D4C34E"/>
@@ -13444,7 +14879,7 @@
       </w:rPr>
     </w:lvl>
   </w:abstractNum>
-  <w:abstractNum w:abstractNumId="47" w15:restartNumberingAfterBreak="0">
+  <w:abstractNum w:abstractNumId="49" w15:restartNumberingAfterBreak="0">
     <w:nsid w:val="2B9413C9"/>
     <w:multiLevelType w:val="hybridMultilevel"/>
     <w:tmpl w:val="4F7A7546"/>
@@ -13556,7 +14991,7 @@
       </w:rPr>
     </w:lvl>
   </w:abstractNum>
-  <w:abstractNum w:abstractNumId="48" w15:restartNumberingAfterBreak="0">
+  <w:abstractNum w:abstractNumId="50" w15:restartNumberingAfterBreak="0">
     <w:nsid w:val="2B9539E3"/>
     <w:multiLevelType w:val="hybridMultilevel"/>
     <w:tmpl w:val="E6B8BBB6"/>
@@ -13668,7 +15103,7 @@
       </w:rPr>
     </w:lvl>
   </w:abstractNum>
-  <w:abstractNum w:abstractNumId="49" w15:restartNumberingAfterBreak="0">
+  <w:abstractNum w:abstractNumId="51" w15:restartNumberingAfterBreak="0">
     <w:nsid w:val="2C0B4D57"/>
     <w:multiLevelType w:val="hybridMultilevel"/>
     <w:tmpl w:val="7DDCD954"/>
@@ -13781,7 +15216,7 @@
       </w:rPr>
     </w:lvl>
   </w:abstractNum>
-  <w:abstractNum w:abstractNumId="50" w15:restartNumberingAfterBreak="0">
+  <w:abstractNum w:abstractNumId="52" w15:restartNumberingAfterBreak="0">
     <w:nsid w:val="2E164C9A"/>
     <w:multiLevelType w:val="hybridMultilevel"/>
     <w:tmpl w:val="C6BA489A"/>
@@ -13894,7 +15329,7 @@
       </w:rPr>
     </w:lvl>
   </w:abstractNum>
-  <w:abstractNum w:abstractNumId="51" w15:restartNumberingAfterBreak="0">
+  <w:abstractNum w:abstractNumId="53" w15:restartNumberingAfterBreak="0">
     <w:nsid w:val="2E34438D"/>
     <w:multiLevelType w:val="multilevel"/>
     <w:tmpl w:val="63F4E6F0"/>
@@ -14043,7 +15478,7 @@
       </w:rPr>
     </w:lvl>
   </w:abstractNum>
-  <w:abstractNum w:abstractNumId="52" w15:restartNumberingAfterBreak="0">
+  <w:abstractNum w:abstractNumId="54" w15:restartNumberingAfterBreak="0">
     <w:nsid w:val="2E5D6D2A"/>
     <w:multiLevelType w:val="hybridMultilevel"/>
     <w:tmpl w:val="5D5ADC98"/>
@@ -14156,7 +15591,7 @@
       </w:rPr>
     </w:lvl>
   </w:abstractNum>
-  <w:abstractNum w:abstractNumId="53" w15:restartNumberingAfterBreak="0">
+  <w:abstractNum w:abstractNumId="55" w15:restartNumberingAfterBreak="0">
     <w:nsid w:val="2E716C12"/>
     <w:multiLevelType w:val="hybridMultilevel"/>
     <w:tmpl w:val="6D90C552"/>
@@ -14269,7 +15704,7 @@
       </w:rPr>
     </w:lvl>
   </w:abstractNum>
-  <w:abstractNum w:abstractNumId="54" w15:restartNumberingAfterBreak="0">
+  <w:abstractNum w:abstractNumId="56" w15:restartNumberingAfterBreak="0">
     <w:nsid w:val="2F162517"/>
     <w:multiLevelType w:val="hybridMultilevel"/>
     <w:tmpl w:val="4E3CAB7C"/>
@@ -14381,7 +15816,7 @@
       </w:rPr>
     </w:lvl>
   </w:abstractNum>
-  <w:abstractNum w:abstractNumId="55" w15:restartNumberingAfterBreak="0">
+  <w:abstractNum w:abstractNumId="57" w15:restartNumberingAfterBreak="0">
     <w:nsid w:val="2F1F6483"/>
     <w:multiLevelType w:val="multilevel"/>
     <w:tmpl w:val="993E874E"/>
@@ -14530,7 +15965,7 @@
       </w:rPr>
     </w:lvl>
   </w:abstractNum>
-  <w:abstractNum w:abstractNumId="56" w15:restartNumberingAfterBreak="0">
+  <w:abstractNum w:abstractNumId="58" w15:restartNumberingAfterBreak="0">
     <w:nsid w:val="2F2B2F8E"/>
     <w:multiLevelType w:val="multilevel"/>
     <w:tmpl w:val="547EDCFE"/>
@@ -14679,7 +16114,7 @@
       </w:rPr>
     </w:lvl>
   </w:abstractNum>
-  <w:abstractNum w:abstractNumId="57" w15:restartNumberingAfterBreak="0">
+  <w:abstractNum w:abstractNumId="59" w15:restartNumberingAfterBreak="0">
     <w:nsid w:val="2FF161E6"/>
     <w:multiLevelType w:val="hybridMultilevel"/>
     <w:tmpl w:val="ED6AA478"/>
@@ -14791,7 +16226,7 @@
       </w:rPr>
     </w:lvl>
   </w:abstractNum>
-  <w:abstractNum w:abstractNumId="58" w15:restartNumberingAfterBreak="0">
+  <w:abstractNum w:abstractNumId="60" w15:restartNumberingAfterBreak="0">
     <w:nsid w:val="30CD5DF3"/>
     <w:multiLevelType w:val="hybridMultilevel"/>
     <w:tmpl w:val="127EBD02"/>
@@ -14903,7 +16338,7 @@
       </w:rPr>
     </w:lvl>
   </w:abstractNum>
-  <w:abstractNum w:abstractNumId="59" w15:restartNumberingAfterBreak="0">
+  <w:abstractNum w:abstractNumId="61" w15:restartNumberingAfterBreak="0">
     <w:nsid w:val="31A24DDF"/>
     <w:multiLevelType w:val="multilevel"/>
     <w:tmpl w:val="63F4E6F0"/>
@@ -15052,7 +16487,7 @@
       </w:rPr>
     </w:lvl>
   </w:abstractNum>
-  <w:abstractNum w:abstractNumId="60" w15:restartNumberingAfterBreak="0">
+  <w:abstractNum w:abstractNumId="62" w15:restartNumberingAfterBreak="0">
     <w:nsid w:val="321E65E6"/>
     <w:multiLevelType w:val="multilevel"/>
     <w:tmpl w:val="63F4E6F0"/>
@@ -15201,7 +16636,7 @@
       </w:rPr>
     </w:lvl>
   </w:abstractNum>
-  <w:abstractNum w:abstractNumId="61" w15:restartNumberingAfterBreak="0">
+  <w:abstractNum w:abstractNumId="63" w15:restartNumberingAfterBreak="0">
     <w:nsid w:val="332E29E8"/>
     <w:multiLevelType w:val="multilevel"/>
     <w:tmpl w:val="BF082128"/>
@@ -15350,7 +16785,7 @@
       </w:rPr>
     </w:lvl>
   </w:abstractNum>
-  <w:abstractNum w:abstractNumId="62" w15:restartNumberingAfterBreak="0">
+  <w:abstractNum w:abstractNumId="64" w15:restartNumberingAfterBreak="0">
     <w:nsid w:val="34251C5D"/>
     <w:multiLevelType w:val="multilevel"/>
     <w:tmpl w:val="C31CBCE0"/>
@@ -15499,7 +16934,7 @@
       </w:rPr>
     </w:lvl>
   </w:abstractNum>
-  <w:abstractNum w:abstractNumId="63" w15:restartNumberingAfterBreak="0">
+  <w:abstractNum w:abstractNumId="65" w15:restartNumberingAfterBreak="0">
     <w:nsid w:val="342A6150"/>
     <w:multiLevelType w:val="multilevel"/>
     <w:tmpl w:val="29E0BE1C"/>
@@ -15648,7 +17083,7 @@
       </w:rPr>
     </w:lvl>
   </w:abstractNum>
-  <w:abstractNum w:abstractNumId="64" w15:restartNumberingAfterBreak="0">
+  <w:abstractNum w:abstractNumId="66" w15:restartNumberingAfterBreak="0">
     <w:nsid w:val="356F220A"/>
     <w:multiLevelType w:val="multilevel"/>
     <w:tmpl w:val="0FFA5254"/>
@@ -15797,7 +17232,7 @@
       </w:rPr>
     </w:lvl>
   </w:abstractNum>
-  <w:abstractNum w:abstractNumId="65" w15:restartNumberingAfterBreak="0">
+  <w:abstractNum w:abstractNumId="67" w15:restartNumberingAfterBreak="0">
     <w:nsid w:val="357B7363"/>
     <w:multiLevelType w:val="hybridMultilevel"/>
     <w:tmpl w:val="00D411EC"/>
@@ -15909,7 +17344,7 @@
       </w:rPr>
     </w:lvl>
   </w:abstractNum>
-  <w:abstractNum w:abstractNumId="66" w15:restartNumberingAfterBreak="0">
+  <w:abstractNum w:abstractNumId="68" w15:restartNumberingAfterBreak="0">
     <w:nsid w:val="3583100F"/>
     <w:multiLevelType w:val="hybridMultilevel"/>
     <w:tmpl w:val="848ECFAA"/>
@@ -16022,7 +17457,7 @@
       </w:rPr>
     </w:lvl>
   </w:abstractNum>
-  <w:abstractNum w:abstractNumId="67" w15:restartNumberingAfterBreak="0">
+  <w:abstractNum w:abstractNumId="69" w15:restartNumberingAfterBreak="0">
     <w:nsid w:val="3623194A"/>
     <w:multiLevelType w:val="multilevel"/>
     <w:tmpl w:val="63F4E6F0"/>
@@ -16171,7 +17606,7 @@
       </w:rPr>
     </w:lvl>
   </w:abstractNum>
-  <w:abstractNum w:abstractNumId="68" w15:restartNumberingAfterBreak="0">
+  <w:abstractNum w:abstractNumId="70" w15:restartNumberingAfterBreak="0">
     <w:nsid w:val="36AD3FB0"/>
     <w:multiLevelType w:val="multilevel"/>
     <w:tmpl w:val="0644AEEA"/>
@@ -16320,7 +17755,7 @@
       </w:rPr>
     </w:lvl>
   </w:abstractNum>
-  <w:abstractNum w:abstractNumId="69" w15:restartNumberingAfterBreak="0">
+  <w:abstractNum w:abstractNumId="71" w15:restartNumberingAfterBreak="0">
     <w:nsid w:val="371A2CDE"/>
     <w:multiLevelType w:val="hybridMultilevel"/>
     <w:tmpl w:val="EA9C00CC"/>
@@ -16432,7 +17867,7 @@
       </w:rPr>
     </w:lvl>
   </w:abstractNum>
-  <w:abstractNum w:abstractNumId="70" w15:restartNumberingAfterBreak="0">
+  <w:abstractNum w:abstractNumId="72" w15:restartNumberingAfterBreak="0">
     <w:nsid w:val="373D5E48"/>
     <w:multiLevelType w:val="hybridMultilevel"/>
     <w:tmpl w:val="8A6E38C0"/>
@@ -16545,7 +17980,7 @@
       </w:rPr>
     </w:lvl>
   </w:abstractNum>
-  <w:abstractNum w:abstractNumId="71" w15:restartNumberingAfterBreak="0">
+  <w:abstractNum w:abstractNumId="73" w15:restartNumberingAfterBreak="0">
     <w:nsid w:val="3B446B2D"/>
     <w:multiLevelType w:val="hybridMultilevel"/>
     <w:tmpl w:val="B638176E"/>
@@ -16657,7 +18092,7 @@
       </w:rPr>
     </w:lvl>
   </w:abstractNum>
-  <w:abstractNum w:abstractNumId="72" w15:restartNumberingAfterBreak="0">
+  <w:abstractNum w:abstractNumId="74" w15:restartNumberingAfterBreak="0">
     <w:nsid w:val="3B6B41F5"/>
     <w:multiLevelType w:val="hybridMultilevel"/>
     <w:tmpl w:val="10A26168"/>
@@ -16769,7 +18204,7 @@
       </w:rPr>
     </w:lvl>
   </w:abstractNum>
-  <w:abstractNum w:abstractNumId="73" w15:restartNumberingAfterBreak="0">
+  <w:abstractNum w:abstractNumId="75" w15:restartNumberingAfterBreak="0">
     <w:nsid w:val="3C5546BA"/>
     <w:multiLevelType w:val="hybridMultilevel"/>
     <w:tmpl w:val="3434F5E4"/>
@@ -16881,7 +18316,7 @@
       </w:rPr>
     </w:lvl>
   </w:abstractNum>
-  <w:abstractNum w:abstractNumId="74" w15:restartNumberingAfterBreak="0">
+  <w:abstractNum w:abstractNumId="76" w15:restartNumberingAfterBreak="0">
     <w:nsid w:val="3C623C55"/>
     <w:multiLevelType w:val="multilevel"/>
     <w:tmpl w:val="A0B0E8F4"/>
@@ -17030,7 +18465,7 @@
       </w:rPr>
     </w:lvl>
   </w:abstractNum>
-  <w:abstractNum w:abstractNumId="75" w15:restartNumberingAfterBreak="0">
+  <w:abstractNum w:abstractNumId="77" w15:restartNumberingAfterBreak="0">
     <w:nsid w:val="3CD27F78"/>
     <w:multiLevelType w:val="multilevel"/>
     <w:tmpl w:val="FCDE767A"/>
@@ -17179,7 +18614,7 @@
       </w:rPr>
     </w:lvl>
   </w:abstractNum>
-  <w:abstractNum w:abstractNumId="76" w15:restartNumberingAfterBreak="0">
+  <w:abstractNum w:abstractNumId="78" w15:restartNumberingAfterBreak="0">
     <w:nsid w:val="3CD74B18"/>
     <w:multiLevelType w:val="hybridMultilevel"/>
     <w:tmpl w:val="2FF42220"/>
@@ -17292,7 +18727,7 @@
       </w:rPr>
     </w:lvl>
   </w:abstractNum>
-  <w:abstractNum w:abstractNumId="77" w15:restartNumberingAfterBreak="0">
+  <w:abstractNum w:abstractNumId="79" w15:restartNumberingAfterBreak="0">
     <w:nsid w:val="3D2F7E79"/>
     <w:multiLevelType w:val="hybridMultilevel"/>
     <w:tmpl w:val="6ED674BE"/>
@@ -17404,7 +18839,7 @@
       </w:rPr>
     </w:lvl>
   </w:abstractNum>
-  <w:abstractNum w:abstractNumId="78" w15:restartNumberingAfterBreak="0">
+  <w:abstractNum w:abstractNumId="80" w15:restartNumberingAfterBreak="0">
     <w:nsid w:val="3D397287"/>
     <w:multiLevelType w:val="hybridMultilevel"/>
     <w:tmpl w:val="F4503122"/>
@@ -17516,7 +18951,7 @@
       </w:rPr>
     </w:lvl>
   </w:abstractNum>
-  <w:abstractNum w:abstractNumId="79" w15:restartNumberingAfterBreak="0">
+  <w:abstractNum w:abstractNumId="81" w15:restartNumberingAfterBreak="0">
     <w:nsid w:val="3E685FF3"/>
     <w:multiLevelType w:val="multilevel"/>
     <w:tmpl w:val="7D20B538"/>
@@ -17665,7 +19100,7 @@
       </w:rPr>
     </w:lvl>
   </w:abstractNum>
-  <w:abstractNum w:abstractNumId="80" w15:restartNumberingAfterBreak="0">
+  <w:abstractNum w:abstractNumId="82" w15:restartNumberingAfterBreak="0">
     <w:nsid w:val="3F346C2C"/>
     <w:multiLevelType w:val="multilevel"/>
     <w:tmpl w:val="63F4E6F0"/>
@@ -17814,7 +19249,7 @@
       </w:rPr>
     </w:lvl>
   </w:abstractNum>
-  <w:abstractNum w:abstractNumId="81" w15:restartNumberingAfterBreak="0">
+  <w:abstractNum w:abstractNumId="83" w15:restartNumberingAfterBreak="0">
     <w:nsid w:val="3FCB1322"/>
     <w:multiLevelType w:val="hybridMultilevel"/>
     <w:tmpl w:val="55C012B2"/>
@@ -17926,7 +19361,7 @@
       </w:rPr>
     </w:lvl>
   </w:abstractNum>
-  <w:abstractNum w:abstractNumId="82" w15:restartNumberingAfterBreak="0">
+  <w:abstractNum w:abstractNumId="84" w15:restartNumberingAfterBreak="0">
     <w:nsid w:val="41A9344F"/>
     <w:multiLevelType w:val="hybridMultilevel"/>
     <w:tmpl w:val="0FB60038"/>
@@ -18039,7 +19474,7 @@
       </w:rPr>
     </w:lvl>
   </w:abstractNum>
-  <w:abstractNum w:abstractNumId="83" w15:restartNumberingAfterBreak="0">
+  <w:abstractNum w:abstractNumId="85" w15:restartNumberingAfterBreak="0">
     <w:nsid w:val="42004E1F"/>
     <w:multiLevelType w:val="hybridMultilevel"/>
     <w:tmpl w:val="770C8314"/>
@@ -18151,7 +19586,7 @@
       </w:rPr>
     </w:lvl>
   </w:abstractNum>
-  <w:abstractNum w:abstractNumId="84" w15:restartNumberingAfterBreak="0">
+  <w:abstractNum w:abstractNumId="86" w15:restartNumberingAfterBreak="0">
     <w:nsid w:val="439F7169"/>
     <w:multiLevelType w:val="hybridMultilevel"/>
     <w:tmpl w:val="1884EDCA"/>
@@ -18264,7 +19699,7 @@
       </w:rPr>
     </w:lvl>
   </w:abstractNum>
-  <w:abstractNum w:abstractNumId="85" w15:restartNumberingAfterBreak="0">
+  <w:abstractNum w:abstractNumId="87" w15:restartNumberingAfterBreak="0">
     <w:nsid w:val="43EA1D69"/>
     <w:multiLevelType w:val="multilevel"/>
     <w:tmpl w:val="DFEC23EC"/>
@@ -18413,7 +19848,7 @@
       </w:rPr>
     </w:lvl>
   </w:abstractNum>
-  <w:abstractNum w:abstractNumId="86" w15:restartNumberingAfterBreak="0">
+  <w:abstractNum w:abstractNumId="88" w15:restartNumberingAfterBreak="0">
     <w:nsid w:val="44320084"/>
     <w:multiLevelType w:val="hybridMultilevel"/>
     <w:tmpl w:val="CE5076D4"/>
@@ -18525,7 +19960,7 @@
       </w:rPr>
     </w:lvl>
   </w:abstractNum>
-  <w:abstractNum w:abstractNumId="87" w15:restartNumberingAfterBreak="0">
+  <w:abstractNum w:abstractNumId="89" w15:restartNumberingAfterBreak="0">
     <w:nsid w:val="44554567"/>
     <w:multiLevelType w:val="hybridMultilevel"/>
     <w:tmpl w:val="78748252"/>
@@ -18637,7 +20072,7 @@
       </w:rPr>
     </w:lvl>
   </w:abstractNum>
-  <w:abstractNum w:abstractNumId="88" w15:restartNumberingAfterBreak="0">
+  <w:abstractNum w:abstractNumId="90" w15:restartNumberingAfterBreak="0">
     <w:nsid w:val="49005094"/>
     <w:multiLevelType w:val="hybridMultilevel"/>
     <w:tmpl w:val="14848CBE"/>
@@ -18749,7 +20184,7 @@
       </w:rPr>
     </w:lvl>
   </w:abstractNum>
-  <w:abstractNum w:abstractNumId="89" w15:restartNumberingAfterBreak="0">
+  <w:abstractNum w:abstractNumId="91" w15:restartNumberingAfterBreak="0">
     <w:nsid w:val="49243794"/>
     <w:multiLevelType w:val="multilevel"/>
     <w:tmpl w:val="E7681528"/>
@@ -18898,7 +20333,7 @@
       </w:rPr>
     </w:lvl>
   </w:abstractNum>
-  <w:abstractNum w:abstractNumId="90" w15:restartNumberingAfterBreak="0">
+  <w:abstractNum w:abstractNumId="92" w15:restartNumberingAfterBreak="0">
     <w:nsid w:val="4A880990"/>
     <w:multiLevelType w:val="hybridMultilevel"/>
     <w:tmpl w:val="F17E12C2"/>
@@ -19010,7 +20445,7 @@
       </w:rPr>
     </w:lvl>
   </w:abstractNum>
-  <w:abstractNum w:abstractNumId="91" w15:restartNumberingAfterBreak="0">
+  <w:abstractNum w:abstractNumId="93" w15:restartNumberingAfterBreak="0">
     <w:nsid w:val="4B182B12"/>
     <w:multiLevelType w:val="hybridMultilevel"/>
     <w:tmpl w:val="31C486B4"/>
@@ -19122,7 +20557,7 @@
       </w:rPr>
     </w:lvl>
   </w:abstractNum>
-  <w:abstractNum w:abstractNumId="92" w15:restartNumberingAfterBreak="0">
+  <w:abstractNum w:abstractNumId="94" w15:restartNumberingAfterBreak="0">
     <w:nsid w:val="4BA13766"/>
     <w:multiLevelType w:val="multilevel"/>
     <w:tmpl w:val="63F4E6F0"/>
@@ -19271,7 +20706,7 @@
       </w:rPr>
     </w:lvl>
   </w:abstractNum>
-  <w:abstractNum w:abstractNumId="93" w15:restartNumberingAfterBreak="0">
+  <w:abstractNum w:abstractNumId="95" w15:restartNumberingAfterBreak="0">
     <w:nsid w:val="4E65371E"/>
     <w:multiLevelType w:val="hybridMultilevel"/>
     <w:tmpl w:val="53EE4538"/>
@@ -19383,7 +20818,7 @@
       </w:rPr>
     </w:lvl>
   </w:abstractNum>
-  <w:abstractNum w:abstractNumId="94" w15:restartNumberingAfterBreak="0">
+  <w:abstractNum w:abstractNumId="96" w15:restartNumberingAfterBreak="0">
     <w:nsid w:val="4E9A3F16"/>
     <w:multiLevelType w:val="multilevel"/>
     <w:tmpl w:val="63F4E6F0"/>
@@ -19532,7 +20967,7 @@
       </w:rPr>
     </w:lvl>
   </w:abstractNum>
-  <w:abstractNum w:abstractNumId="95" w15:restartNumberingAfterBreak="0">
+  <w:abstractNum w:abstractNumId="97" w15:restartNumberingAfterBreak="0">
     <w:nsid w:val="500B790D"/>
     <w:multiLevelType w:val="multilevel"/>
     <w:tmpl w:val="63F4E6F0"/>
@@ -19681,7 +21116,7 @@
       </w:rPr>
     </w:lvl>
   </w:abstractNum>
-  <w:abstractNum w:abstractNumId="96" w15:restartNumberingAfterBreak="0">
+  <w:abstractNum w:abstractNumId="98" w15:restartNumberingAfterBreak="0">
     <w:nsid w:val="526538B7"/>
     <w:multiLevelType w:val="hybridMultilevel"/>
     <w:tmpl w:val="E6A017F2"/>
@@ -19794,7 +21229,7 @@
       </w:rPr>
     </w:lvl>
   </w:abstractNum>
-  <w:abstractNum w:abstractNumId="97" w15:restartNumberingAfterBreak="0">
+  <w:abstractNum w:abstractNumId="99" w15:restartNumberingAfterBreak="0">
     <w:nsid w:val="537E56D9"/>
     <w:multiLevelType w:val="multilevel"/>
     <w:tmpl w:val="1B6E8B6A"/>
@@ -19943,7 +21378,7 @@
       </w:rPr>
     </w:lvl>
   </w:abstractNum>
-  <w:abstractNum w:abstractNumId="98" w15:restartNumberingAfterBreak="0">
+  <w:abstractNum w:abstractNumId="100" w15:restartNumberingAfterBreak="0">
     <w:nsid w:val="53E6601E"/>
     <w:multiLevelType w:val="hybridMultilevel"/>
     <w:tmpl w:val="66F0666A"/>
@@ -20056,7 +21491,7 @@
       </w:rPr>
     </w:lvl>
   </w:abstractNum>
-  <w:abstractNum w:abstractNumId="99" w15:restartNumberingAfterBreak="0">
+  <w:abstractNum w:abstractNumId="101" w15:restartNumberingAfterBreak="0">
     <w:nsid w:val="551D6F91"/>
     <w:multiLevelType w:val="hybridMultilevel"/>
     <w:tmpl w:val="9522B3C6"/>
@@ -20168,7 +21603,7 @@
       </w:rPr>
     </w:lvl>
   </w:abstractNum>
-  <w:abstractNum w:abstractNumId="100" w15:restartNumberingAfterBreak="0">
+  <w:abstractNum w:abstractNumId="102" w15:restartNumberingAfterBreak="0">
     <w:nsid w:val="555451DA"/>
     <w:multiLevelType w:val="hybridMultilevel"/>
     <w:tmpl w:val="CAB2A550"/>
@@ -20281,7 +21716,7 @@
       </w:rPr>
     </w:lvl>
   </w:abstractNum>
-  <w:abstractNum w:abstractNumId="101" w15:restartNumberingAfterBreak="0">
+  <w:abstractNum w:abstractNumId="103" w15:restartNumberingAfterBreak="0">
     <w:nsid w:val="55655B93"/>
     <w:multiLevelType w:val="multilevel"/>
     <w:tmpl w:val="9C88A4A8"/>
@@ -20430,7 +21865,7 @@
       </w:rPr>
     </w:lvl>
   </w:abstractNum>
-  <w:abstractNum w:abstractNumId="102" w15:restartNumberingAfterBreak="0">
+  <w:abstractNum w:abstractNumId="104" w15:restartNumberingAfterBreak="0">
     <w:nsid w:val="55B95BED"/>
     <w:multiLevelType w:val="hybridMultilevel"/>
     <w:tmpl w:val="A9B866FC"/>
@@ -20543,7 +21978,7 @@
       </w:rPr>
     </w:lvl>
   </w:abstractNum>
-  <w:abstractNum w:abstractNumId="103" w15:restartNumberingAfterBreak="0">
+  <w:abstractNum w:abstractNumId="105" w15:restartNumberingAfterBreak="0">
     <w:nsid w:val="562D4F1F"/>
     <w:multiLevelType w:val="hybridMultilevel"/>
     <w:tmpl w:val="1FF8D31C"/>
@@ -20655,7 +22090,7 @@
       </w:rPr>
     </w:lvl>
   </w:abstractNum>
-  <w:abstractNum w:abstractNumId="104" w15:restartNumberingAfterBreak="0">
+  <w:abstractNum w:abstractNumId="106" w15:restartNumberingAfterBreak="0">
     <w:nsid w:val="565A0C8B"/>
     <w:multiLevelType w:val="multilevel"/>
     <w:tmpl w:val="AB24FF2E"/>
@@ -20804,7 +22239,7 @@
       </w:rPr>
     </w:lvl>
   </w:abstractNum>
-  <w:abstractNum w:abstractNumId="105" w15:restartNumberingAfterBreak="0">
+  <w:abstractNum w:abstractNumId="107" w15:restartNumberingAfterBreak="0">
     <w:nsid w:val="566E7C65"/>
     <w:multiLevelType w:val="multilevel"/>
     <w:tmpl w:val="28803B4C"/>
@@ -20953,7 +22388,7 @@
       </w:rPr>
     </w:lvl>
   </w:abstractNum>
-  <w:abstractNum w:abstractNumId="106" w15:restartNumberingAfterBreak="0">
+  <w:abstractNum w:abstractNumId="108" w15:restartNumberingAfterBreak="0">
     <w:nsid w:val="57407594"/>
     <w:multiLevelType w:val="multilevel"/>
     <w:tmpl w:val="E6E2F8AE"/>
@@ -21102,7 +22537,7 @@
       </w:rPr>
     </w:lvl>
   </w:abstractNum>
-  <w:abstractNum w:abstractNumId="107" w15:restartNumberingAfterBreak="0">
+  <w:abstractNum w:abstractNumId="109" w15:restartNumberingAfterBreak="0">
     <w:nsid w:val="577F771B"/>
     <w:multiLevelType w:val="hybridMultilevel"/>
     <w:tmpl w:val="0F2C5914"/>
@@ -21214,7 +22649,7 @@
       </w:rPr>
     </w:lvl>
   </w:abstractNum>
-  <w:abstractNum w:abstractNumId="108" w15:restartNumberingAfterBreak="0">
+  <w:abstractNum w:abstractNumId="110" w15:restartNumberingAfterBreak="0">
     <w:nsid w:val="57C43CDD"/>
     <w:multiLevelType w:val="hybridMultilevel"/>
     <w:tmpl w:val="6C94FB5E"/>
@@ -21327,7 +22762,7 @@
       </w:rPr>
     </w:lvl>
   </w:abstractNum>
-  <w:abstractNum w:abstractNumId="109" w15:restartNumberingAfterBreak="0">
+  <w:abstractNum w:abstractNumId="111" w15:restartNumberingAfterBreak="0">
     <w:nsid w:val="58393977"/>
     <w:multiLevelType w:val="hybridMultilevel"/>
     <w:tmpl w:val="985A5484"/>
@@ -21440,7 +22875,7 @@
       </w:rPr>
     </w:lvl>
   </w:abstractNum>
-  <w:abstractNum w:abstractNumId="110" w15:restartNumberingAfterBreak="0">
+  <w:abstractNum w:abstractNumId="112" w15:restartNumberingAfterBreak="0">
     <w:nsid w:val="59EB4CE4"/>
     <w:multiLevelType w:val="multilevel"/>
     <w:tmpl w:val="63F4E6F0"/>
@@ -21589,7 +23024,7 @@
       </w:rPr>
     </w:lvl>
   </w:abstractNum>
-  <w:abstractNum w:abstractNumId="111" w15:restartNumberingAfterBreak="0">
+  <w:abstractNum w:abstractNumId="113" w15:restartNumberingAfterBreak="0">
     <w:nsid w:val="5BD11962"/>
     <w:multiLevelType w:val="hybridMultilevel"/>
     <w:tmpl w:val="89A4B834"/>
@@ -21678,7 +23113,7 @@
       </w:pPr>
     </w:lvl>
   </w:abstractNum>
-  <w:abstractNum w:abstractNumId="112" w15:restartNumberingAfterBreak="0">
+  <w:abstractNum w:abstractNumId="114" w15:restartNumberingAfterBreak="0">
     <w:nsid w:val="5C950DBA"/>
     <w:multiLevelType w:val="hybridMultilevel"/>
     <w:tmpl w:val="7D78F950"/>
@@ -21790,7 +23225,7 @@
       </w:rPr>
     </w:lvl>
   </w:abstractNum>
-  <w:abstractNum w:abstractNumId="113" w15:restartNumberingAfterBreak="0">
+  <w:abstractNum w:abstractNumId="115" w15:restartNumberingAfterBreak="0">
     <w:nsid w:val="5D2A5D3B"/>
     <w:multiLevelType w:val="hybridMultilevel"/>
     <w:tmpl w:val="3AF89EA6"/>
@@ -21881,7 +23316,7 @@
       </w:pPr>
     </w:lvl>
   </w:abstractNum>
-  <w:abstractNum w:abstractNumId="114" w15:restartNumberingAfterBreak="0">
+  <w:abstractNum w:abstractNumId="116" w15:restartNumberingAfterBreak="0">
     <w:nsid w:val="5D9E49FD"/>
     <w:multiLevelType w:val="hybridMultilevel"/>
     <w:tmpl w:val="4EE40BB4"/>
@@ -21993,7 +23428,7 @@
       </w:rPr>
     </w:lvl>
   </w:abstractNum>
-  <w:abstractNum w:abstractNumId="115" w15:restartNumberingAfterBreak="0">
+  <w:abstractNum w:abstractNumId="117" w15:restartNumberingAfterBreak="0">
     <w:nsid w:val="5DB7107D"/>
     <w:multiLevelType w:val="multilevel"/>
     <w:tmpl w:val="6520107A"/>
@@ -22142,7 +23577,7 @@
       </w:rPr>
     </w:lvl>
   </w:abstractNum>
-  <w:abstractNum w:abstractNumId="116" w15:restartNumberingAfterBreak="0">
+  <w:abstractNum w:abstractNumId="118" w15:restartNumberingAfterBreak="0">
     <w:nsid w:val="5E9370A7"/>
     <w:multiLevelType w:val="hybridMultilevel"/>
     <w:tmpl w:val="13480456"/>
@@ -22228,7 +23663,7 @@
       </w:pPr>
     </w:lvl>
   </w:abstractNum>
-  <w:abstractNum w:abstractNumId="117" w15:restartNumberingAfterBreak="0">
+  <w:abstractNum w:abstractNumId="119" w15:restartNumberingAfterBreak="0">
     <w:nsid w:val="60421322"/>
     <w:multiLevelType w:val="hybridMultilevel"/>
     <w:tmpl w:val="447CDBDC"/>
@@ -22340,7 +23775,7 @@
       </w:rPr>
     </w:lvl>
   </w:abstractNum>
-  <w:abstractNum w:abstractNumId="118" w15:restartNumberingAfterBreak="0">
+  <w:abstractNum w:abstractNumId="120" w15:restartNumberingAfterBreak="0">
     <w:nsid w:val="61926C31"/>
     <w:multiLevelType w:val="hybridMultilevel"/>
     <w:tmpl w:val="AFD27E5C"/>
@@ -22453,7 +23888,7 @@
       </w:rPr>
     </w:lvl>
   </w:abstractNum>
-  <w:abstractNum w:abstractNumId="119" w15:restartNumberingAfterBreak="0">
+  <w:abstractNum w:abstractNumId="121" w15:restartNumberingAfterBreak="0">
     <w:nsid w:val="622F5FC7"/>
     <w:multiLevelType w:val="hybridMultilevel"/>
     <w:tmpl w:val="49A6C2A6"/>
@@ -22566,7 +24001,7 @@
       </w:rPr>
     </w:lvl>
   </w:abstractNum>
-  <w:abstractNum w:abstractNumId="120" w15:restartNumberingAfterBreak="0">
+  <w:abstractNum w:abstractNumId="122" w15:restartNumberingAfterBreak="0">
     <w:nsid w:val="62AC33B4"/>
     <w:multiLevelType w:val="multilevel"/>
     <w:tmpl w:val="A074F3CA"/>
@@ -22715,7 +24150,7 @@
       </w:rPr>
     </w:lvl>
   </w:abstractNum>
-  <w:abstractNum w:abstractNumId="121" w15:restartNumberingAfterBreak="0">
+  <w:abstractNum w:abstractNumId="123" w15:restartNumberingAfterBreak="0">
     <w:nsid w:val="63B44674"/>
     <w:multiLevelType w:val="multilevel"/>
     <w:tmpl w:val="08F4FA9A"/>
@@ -22864,7 +24299,7 @@
       </w:rPr>
     </w:lvl>
   </w:abstractNum>
-  <w:abstractNum w:abstractNumId="122" w15:restartNumberingAfterBreak="0">
+  <w:abstractNum w:abstractNumId="124" w15:restartNumberingAfterBreak="0">
     <w:nsid w:val="63C245D4"/>
     <w:multiLevelType w:val="hybridMultilevel"/>
     <w:tmpl w:val="E1563A56"/>
@@ -22976,7 +24411,7 @@
       </w:rPr>
     </w:lvl>
   </w:abstractNum>
-  <w:abstractNum w:abstractNumId="123" w15:restartNumberingAfterBreak="0">
+  <w:abstractNum w:abstractNumId="125" w15:restartNumberingAfterBreak="0">
     <w:nsid w:val="64F30198"/>
     <w:multiLevelType w:val="multilevel"/>
     <w:tmpl w:val="63F4E6F0"/>
@@ -23125,7 +24560,7 @@
       </w:rPr>
     </w:lvl>
   </w:abstractNum>
-  <w:abstractNum w:abstractNumId="124" w15:restartNumberingAfterBreak="0">
+  <w:abstractNum w:abstractNumId="126" w15:restartNumberingAfterBreak="0">
     <w:nsid w:val="65AF2502"/>
     <w:multiLevelType w:val="hybridMultilevel"/>
     <w:tmpl w:val="FB2A44D8"/>
@@ -23238,7 +24673,7 @@
       </w:rPr>
     </w:lvl>
   </w:abstractNum>
-  <w:abstractNum w:abstractNumId="125" w15:restartNumberingAfterBreak="0">
+  <w:abstractNum w:abstractNumId="127" w15:restartNumberingAfterBreak="0">
     <w:nsid w:val="671614F0"/>
     <w:multiLevelType w:val="multilevel"/>
     <w:tmpl w:val="63F4E6F0"/>
@@ -23387,7 +24822,7 @@
       </w:rPr>
     </w:lvl>
   </w:abstractNum>
-  <w:abstractNum w:abstractNumId="126" w15:restartNumberingAfterBreak="0">
+  <w:abstractNum w:abstractNumId="128" w15:restartNumberingAfterBreak="0">
     <w:nsid w:val="6859691D"/>
     <w:multiLevelType w:val="multilevel"/>
     <w:tmpl w:val="826A9D48"/>
@@ -23536,7 +24971,7 @@
       </w:rPr>
     </w:lvl>
   </w:abstractNum>
-  <w:abstractNum w:abstractNumId="127" w15:restartNumberingAfterBreak="0">
+  <w:abstractNum w:abstractNumId="129" w15:restartNumberingAfterBreak="0">
     <w:nsid w:val="68817757"/>
     <w:multiLevelType w:val="multilevel"/>
     <w:tmpl w:val="34EE1968"/>
@@ -23685,7 +25120,7 @@
       </w:rPr>
     </w:lvl>
   </w:abstractNum>
-  <w:abstractNum w:abstractNumId="128" w15:restartNumberingAfterBreak="0">
+  <w:abstractNum w:abstractNumId="130" w15:restartNumberingAfterBreak="0">
     <w:nsid w:val="68BE10E8"/>
     <w:multiLevelType w:val="hybridMultilevel"/>
     <w:tmpl w:val="326CD592"/>
@@ -23798,7 +25233,7 @@
       </w:rPr>
     </w:lvl>
   </w:abstractNum>
-  <w:abstractNum w:abstractNumId="129" w15:restartNumberingAfterBreak="0">
+  <w:abstractNum w:abstractNumId="131" w15:restartNumberingAfterBreak="0">
     <w:nsid w:val="68E86299"/>
     <w:multiLevelType w:val="hybridMultilevel"/>
     <w:tmpl w:val="9B5CBEE8"/>
@@ -23884,7 +25319,7 @@
       </w:pPr>
     </w:lvl>
   </w:abstractNum>
-  <w:abstractNum w:abstractNumId="130" w15:restartNumberingAfterBreak="0">
+  <w:abstractNum w:abstractNumId="132" w15:restartNumberingAfterBreak="0">
     <w:nsid w:val="69996D9A"/>
     <w:multiLevelType w:val="multilevel"/>
     <w:tmpl w:val="1780FC38"/>
@@ -24033,7 +25468,7 @@
       </w:rPr>
     </w:lvl>
   </w:abstractNum>
-  <w:abstractNum w:abstractNumId="131" w15:restartNumberingAfterBreak="0">
+  <w:abstractNum w:abstractNumId="133" w15:restartNumberingAfterBreak="0">
     <w:nsid w:val="6B3C30B9"/>
     <w:multiLevelType w:val="hybridMultilevel"/>
     <w:tmpl w:val="C938F8DE"/>
@@ -24145,7 +25580,7 @@
       </w:rPr>
     </w:lvl>
   </w:abstractNum>
-  <w:abstractNum w:abstractNumId="132" w15:restartNumberingAfterBreak="0">
+  <w:abstractNum w:abstractNumId="134" w15:restartNumberingAfterBreak="0">
     <w:nsid w:val="6D1511A0"/>
     <w:multiLevelType w:val="hybridMultilevel"/>
     <w:tmpl w:val="AAD8B9B4"/>
@@ -24257,7 +25692,7 @@
       </w:rPr>
     </w:lvl>
   </w:abstractNum>
-  <w:abstractNum w:abstractNumId="133" w15:restartNumberingAfterBreak="0">
+  <w:abstractNum w:abstractNumId="135" w15:restartNumberingAfterBreak="0">
     <w:nsid w:val="6DD255F1"/>
     <w:multiLevelType w:val="hybridMultilevel"/>
     <w:tmpl w:val="ACBC1404"/>
@@ -24370,7 +25805,7 @@
       </w:rPr>
     </w:lvl>
   </w:abstractNum>
-  <w:abstractNum w:abstractNumId="134" w15:restartNumberingAfterBreak="0">
+  <w:abstractNum w:abstractNumId="136" w15:restartNumberingAfterBreak="0">
     <w:nsid w:val="6DDB4404"/>
     <w:multiLevelType w:val="hybridMultilevel"/>
     <w:tmpl w:val="06428E32"/>
@@ -24483,7 +25918,7 @@
       </w:rPr>
     </w:lvl>
   </w:abstractNum>
-  <w:abstractNum w:abstractNumId="135" w15:restartNumberingAfterBreak="0">
+  <w:abstractNum w:abstractNumId="137" w15:restartNumberingAfterBreak="0">
     <w:nsid w:val="6F014B3B"/>
     <w:multiLevelType w:val="hybridMultilevel"/>
     <w:tmpl w:val="C89A39BE"/>
@@ -24595,7 +26030,7 @@
       </w:rPr>
     </w:lvl>
   </w:abstractNum>
-  <w:abstractNum w:abstractNumId="136" w15:restartNumberingAfterBreak="0">
+  <w:abstractNum w:abstractNumId="138" w15:restartNumberingAfterBreak="0">
     <w:nsid w:val="6F171273"/>
     <w:multiLevelType w:val="multilevel"/>
     <w:tmpl w:val="0240C564"/>
@@ -24744,7 +26179,7 @@
       </w:rPr>
     </w:lvl>
   </w:abstractNum>
-  <w:abstractNum w:abstractNumId="137" w15:restartNumberingAfterBreak="0">
+  <w:abstractNum w:abstractNumId="139" w15:restartNumberingAfterBreak="0">
     <w:nsid w:val="6FB82AAA"/>
     <w:multiLevelType w:val="multilevel"/>
     <w:tmpl w:val="FC46C7C0"/>
@@ -24893,7 +26328,7 @@
       </w:rPr>
     </w:lvl>
   </w:abstractNum>
-  <w:abstractNum w:abstractNumId="138" w15:restartNumberingAfterBreak="0">
+  <w:abstractNum w:abstractNumId="140" w15:restartNumberingAfterBreak="0">
     <w:nsid w:val="6FD46DCF"/>
     <w:multiLevelType w:val="hybridMultilevel"/>
     <w:tmpl w:val="EF5E6EC6"/>
@@ -25006,7 +26441,7 @@
       </w:rPr>
     </w:lvl>
   </w:abstractNum>
-  <w:abstractNum w:abstractNumId="139" w15:restartNumberingAfterBreak="0">
+  <w:abstractNum w:abstractNumId="141" w15:restartNumberingAfterBreak="0">
     <w:nsid w:val="70484E38"/>
     <w:multiLevelType w:val="multilevel"/>
     <w:tmpl w:val="22B26DD2"/>
@@ -25155,7 +26590,7 @@
       </w:rPr>
     </w:lvl>
   </w:abstractNum>
-  <w:abstractNum w:abstractNumId="140" w15:restartNumberingAfterBreak="0">
+  <w:abstractNum w:abstractNumId="142" w15:restartNumberingAfterBreak="0">
     <w:nsid w:val="70CB723E"/>
     <w:multiLevelType w:val="multilevel"/>
     <w:tmpl w:val="63F4E6F0"/>
@@ -25304,7 +26739,7 @@
       </w:rPr>
     </w:lvl>
   </w:abstractNum>
-  <w:abstractNum w:abstractNumId="141" w15:restartNumberingAfterBreak="0">
+  <w:abstractNum w:abstractNumId="143" w15:restartNumberingAfterBreak="0">
     <w:nsid w:val="71DB3F58"/>
     <w:multiLevelType w:val="multilevel"/>
     <w:tmpl w:val="63F4E6F0"/>
@@ -25453,7 +26888,7 @@
       </w:rPr>
     </w:lvl>
   </w:abstractNum>
-  <w:abstractNum w:abstractNumId="142" w15:restartNumberingAfterBreak="0">
+  <w:abstractNum w:abstractNumId="144" w15:restartNumberingAfterBreak="0">
     <w:nsid w:val="72F31FF2"/>
     <w:multiLevelType w:val="hybridMultilevel"/>
     <w:tmpl w:val="5C2693A0"/>
@@ -25565,7 +27000,7 @@
       </w:rPr>
     </w:lvl>
   </w:abstractNum>
-  <w:abstractNum w:abstractNumId="143" w15:restartNumberingAfterBreak="0">
+  <w:abstractNum w:abstractNumId="145" w15:restartNumberingAfterBreak="0">
     <w:nsid w:val="75B45140"/>
     <w:multiLevelType w:val="hybridMultilevel"/>
     <w:tmpl w:val="93F8F3C4"/>
@@ -25678,7 +27113,7 @@
       </w:rPr>
     </w:lvl>
   </w:abstractNum>
-  <w:abstractNum w:abstractNumId="144" w15:restartNumberingAfterBreak="0">
+  <w:abstractNum w:abstractNumId="146" w15:restartNumberingAfterBreak="0">
     <w:nsid w:val="76F60FFE"/>
     <w:multiLevelType w:val="multilevel"/>
     <w:tmpl w:val="63F4E6F0"/>
@@ -25827,7 +27262,7 @@
       </w:rPr>
     </w:lvl>
   </w:abstractNum>
-  <w:abstractNum w:abstractNumId="145" w15:restartNumberingAfterBreak="0">
+  <w:abstractNum w:abstractNumId="147" w15:restartNumberingAfterBreak="0">
     <w:nsid w:val="77572323"/>
     <w:multiLevelType w:val="multilevel"/>
     <w:tmpl w:val="63F4E6F0"/>
@@ -25976,7 +27411,7 @@
       </w:rPr>
     </w:lvl>
   </w:abstractNum>
-  <w:abstractNum w:abstractNumId="146" w15:restartNumberingAfterBreak="0">
+  <w:abstractNum w:abstractNumId="148" w15:restartNumberingAfterBreak="0">
     <w:nsid w:val="77B8201F"/>
     <w:multiLevelType w:val="hybridMultilevel"/>
     <w:tmpl w:val="D7160708"/>
@@ -26088,7 +27523,7 @@
       </w:rPr>
     </w:lvl>
   </w:abstractNum>
-  <w:abstractNum w:abstractNumId="147" w15:restartNumberingAfterBreak="0">
+  <w:abstractNum w:abstractNumId="149" w15:restartNumberingAfterBreak="0">
     <w:nsid w:val="79796FF9"/>
     <w:multiLevelType w:val="hybridMultilevel"/>
     <w:tmpl w:val="CFA8EF82"/>
@@ -26200,7 +27635,7 @@
       </w:rPr>
     </w:lvl>
   </w:abstractNum>
-  <w:abstractNum w:abstractNumId="148" w15:restartNumberingAfterBreak="0">
+  <w:abstractNum w:abstractNumId="150" w15:restartNumberingAfterBreak="0">
     <w:nsid w:val="79910410"/>
     <w:multiLevelType w:val="hybridMultilevel"/>
     <w:tmpl w:val="FC923542"/>
@@ -26312,7 +27747,7 @@
       </w:rPr>
     </w:lvl>
   </w:abstractNum>
-  <w:abstractNum w:abstractNumId="149" w15:restartNumberingAfterBreak="0">
+  <w:abstractNum w:abstractNumId="151" w15:restartNumberingAfterBreak="0">
     <w:nsid w:val="7AFF575A"/>
     <w:multiLevelType w:val="hybridMultilevel"/>
     <w:tmpl w:val="A6323D3E"/>
@@ -26424,7 +27859,7 @@
       </w:rPr>
     </w:lvl>
   </w:abstractNum>
-  <w:abstractNum w:abstractNumId="150" w15:restartNumberingAfterBreak="0">
+  <w:abstractNum w:abstractNumId="152" w15:restartNumberingAfterBreak="0">
     <w:nsid w:val="7B4018BF"/>
     <w:multiLevelType w:val="multilevel"/>
     <w:tmpl w:val="63F4E6F0"/>
@@ -26573,7 +28008,7 @@
       </w:rPr>
     </w:lvl>
   </w:abstractNum>
-  <w:abstractNum w:abstractNumId="151" w15:restartNumberingAfterBreak="0">
+  <w:abstractNum w:abstractNumId="153" w15:restartNumberingAfterBreak="0">
     <w:nsid w:val="7B4D1B33"/>
     <w:multiLevelType w:val="hybridMultilevel"/>
     <w:tmpl w:val="5EAC717E"/>
@@ -26685,7 +28120,7 @@
       </w:rPr>
     </w:lvl>
   </w:abstractNum>
-  <w:abstractNum w:abstractNumId="152" w15:restartNumberingAfterBreak="0">
+  <w:abstractNum w:abstractNumId="154" w15:restartNumberingAfterBreak="0">
     <w:nsid w:val="7CAC27CD"/>
     <w:multiLevelType w:val="multilevel"/>
     <w:tmpl w:val="3BC20E58"/>
@@ -26834,7 +28269,7 @@
       </w:rPr>
     </w:lvl>
   </w:abstractNum>
-  <w:abstractNum w:abstractNumId="153" w15:restartNumberingAfterBreak="0">
+  <w:abstractNum w:abstractNumId="155" w15:restartNumberingAfterBreak="0">
     <w:nsid w:val="7E5978EA"/>
     <w:multiLevelType w:val="hybridMultilevel"/>
     <w:tmpl w:val="D74C0DB0"/>
@@ -26946,7 +28381,7 @@
       </w:rPr>
     </w:lvl>
   </w:abstractNum>
-  <w:abstractNum w:abstractNumId="154" w15:restartNumberingAfterBreak="0">
+  <w:abstractNum w:abstractNumId="156" w15:restartNumberingAfterBreak="0">
     <w:nsid w:val="7F106A5D"/>
     <w:multiLevelType w:val="hybridMultilevel"/>
     <w:tmpl w:val="A1CA4816"/>
@@ -27059,469 +28494,475 @@
     </w:lvl>
   </w:abstractNum>
   <w:num w:numId="1" w16cid:durableId="1882476756">
+    <w:abstractNumId w:val="91"/>
+  </w:num>
+  <w:num w:numId="2" w16cid:durableId="871453468">
+    <w:abstractNumId w:val="26"/>
+  </w:num>
+  <w:num w:numId="3" w16cid:durableId="698706805">
+    <w:abstractNumId w:val="41"/>
+  </w:num>
+  <w:num w:numId="4" w16cid:durableId="1105467722">
+    <w:abstractNumId w:val="76"/>
+  </w:num>
+  <w:num w:numId="5" w16cid:durableId="769932622">
+    <w:abstractNumId w:val="107"/>
+  </w:num>
+  <w:num w:numId="6" w16cid:durableId="575944109">
+    <w:abstractNumId w:val="45"/>
+  </w:num>
+  <w:num w:numId="7" w16cid:durableId="877661689">
+    <w:abstractNumId w:val="141"/>
+  </w:num>
+  <w:num w:numId="8" w16cid:durableId="1390107422">
+    <w:abstractNumId w:val="81"/>
+  </w:num>
+  <w:num w:numId="9" w16cid:durableId="881866424">
+    <w:abstractNumId w:val="103"/>
+  </w:num>
+  <w:num w:numId="10" w16cid:durableId="1037244995">
+    <w:abstractNumId w:val="132"/>
+  </w:num>
+  <w:num w:numId="11" w16cid:durableId="1575554597">
+    <w:abstractNumId w:val="66"/>
+  </w:num>
+  <w:num w:numId="12" w16cid:durableId="915364478">
+    <w:abstractNumId w:val="87"/>
+  </w:num>
+  <w:num w:numId="13" w16cid:durableId="1386294114">
+    <w:abstractNumId w:val="123"/>
+  </w:num>
+  <w:num w:numId="14" w16cid:durableId="1071851223">
+    <w:abstractNumId w:val="27"/>
+  </w:num>
+  <w:num w:numId="15" w16cid:durableId="1545557520">
+    <w:abstractNumId w:val="77"/>
+  </w:num>
+  <w:num w:numId="16" w16cid:durableId="1102919547">
+    <w:abstractNumId w:val="154"/>
+  </w:num>
+  <w:num w:numId="17" w16cid:durableId="294526838">
+    <w:abstractNumId w:val="57"/>
+  </w:num>
+  <w:num w:numId="18" w16cid:durableId="679889896">
+    <w:abstractNumId w:val="64"/>
+  </w:num>
+  <w:num w:numId="19" w16cid:durableId="2119449470">
+    <w:abstractNumId w:val="99"/>
+  </w:num>
+  <w:num w:numId="20" w16cid:durableId="1365054799">
+    <w:abstractNumId w:val="15"/>
+  </w:num>
+  <w:num w:numId="21" w16cid:durableId="1683512738">
+    <w:abstractNumId w:val="65"/>
+  </w:num>
+  <w:num w:numId="22" w16cid:durableId="1080098953">
+    <w:abstractNumId w:val="128"/>
+  </w:num>
+  <w:num w:numId="23" w16cid:durableId="1635717296">
+    <w:abstractNumId w:val="70"/>
+  </w:num>
+  <w:num w:numId="24" w16cid:durableId="544873123">
+    <w:abstractNumId w:val="122"/>
+  </w:num>
+  <w:num w:numId="25" w16cid:durableId="1128352778">
+    <w:abstractNumId w:val="14"/>
+  </w:num>
+  <w:num w:numId="26" w16cid:durableId="1732537407">
+    <w:abstractNumId w:val="136"/>
+  </w:num>
+  <w:num w:numId="27" w16cid:durableId="945502064">
+    <w:abstractNumId w:val="7"/>
+  </w:num>
+  <w:num w:numId="28" w16cid:durableId="1997681677">
+    <w:abstractNumId w:val="4"/>
+  </w:num>
+  <w:num w:numId="29" w16cid:durableId="815955639">
+    <w:abstractNumId w:val="63"/>
+  </w:num>
+  <w:num w:numId="30" w16cid:durableId="1500659483">
+    <w:abstractNumId w:val="84"/>
+  </w:num>
+  <w:num w:numId="31" w16cid:durableId="118301211">
+    <w:abstractNumId w:val="16"/>
+  </w:num>
+  <w:num w:numId="32" w16cid:durableId="732387979">
+    <w:abstractNumId w:val="46"/>
+  </w:num>
+  <w:num w:numId="33" w16cid:durableId="2129276417">
+    <w:abstractNumId w:val="19"/>
+  </w:num>
+  <w:num w:numId="34" w16cid:durableId="1470708820">
+    <w:abstractNumId w:val="52"/>
+  </w:num>
+  <w:num w:numId="35" w16cid:durableId="356852923">
+    <w:abstractNumId w:val="98"/>
+  </w:num>
+  <w:num w:numId="36" w16cid:durableId="430662559">
+    <w:abstractNumId w:val="22"/>
+  </w:num>
+  <w:num w:numId="37" w16cid:durableId="247080868">
+    <w:abstractNumId w:val="145"/>
+  </w:num>
+  <w:num w:numId="38" w16cid:durableId="158887408">
+    <w:abstractNumId w:val="120"/>
+  </w:num>
+  <w:num w:numId="39" w16cid:durableId="1681347932">
+    <w:abstractNumId w:val="140"/>
+  </w:num>
+  <w:num w:numId="40" w16cid:durableId="2101440158">
+    <w:abstractNumId w:val="80"/>
+  </w:num>
+  <w:num w:numId="41" w16cid:durableId="1250391122">
+    <w:abstractNumId w:val="115"/>
+  </w:num>
+  <w:num w:numId="42" w16cid:durableId="479083359">
+    <w:abstractNumId w:val="144"/>
+  </w:num>
+  <w:num w:numId="43" w16cid:durableId="1557860317">
+    <w:abstractNumId w:val="100"/>
+  </w:num>
+  <w:num w:numId="44" w16cid:durableId="2142183763">
+    <w:abstractNumId w:val="9"/>
+  </w:num>
+  <w:num w:numId="45" w16cid:durableId="1357736349">
+    <w:abstractNumId w:val="150"/>
+  </w:num>
+  <w:num w:numId="46" w16cid:durableId="1519656040">
+    <w:abstractNumId w:val="149"/>
+  </w:num>
+  <w:num w:numId="47" w16cid:durableId="1078596852">
+    <w:abstractNumId w:val="156"/>
+  </w:num>
+  <w:num w:numId="48" w16cid:durableId="1027950100">
+    <w:abstractNumId w:val="37"/>
+  </w:num>
+  <w:num w:numId="49" w16cid:durableId="878516382">
+    <w:abstractNumId w:val="21"/>
+  </w:num>
+  <w:num w:numId="50" w16cid:durableId="363404927">
+    <w:abstractNumId w:val="71"/>
+  </w:num>
+  <w:num w:numId="51" w16cid:durableId="1128354320">
+    <w:abstractNumId w:val="134"/>
+  </w:num>
+  <w:num w:numId="52" w16cid:durableId="248543928">
+    <w:abstractNumId w:val="79"/>
+  </w:num>
+  <w:num w:numId="53" w16cid:durableId="965889214">
+    <w:abstractNumId w:val="105"/>
+  </w:num>
+  <w:num w:numId="54" w16cid:durableId="1827503240">
+    <w:abstractNumId w:val="113"/>
+  </w:num>
+  <w:num w:numId="55" w16cid:durableId="505748256">
+    <w:abstractNumId w:val="95"/>
+  </w:num>
+  <w:num w:numId="56" w16cid:durableId="2120370925">
+    <w:abstractNumId w:val="34"/>
+  </w:num>
+  <w:num w:numId="57" w16cid:durableId="369182267">
+    <w:abstractNumId w:val="18"/>
+  </w:num>
+  <w:num w:numId="58" w16cid:durableId="1000235123">
+    <w:abstractNumId w:val="101"/>
+  </w:num>
+  <w:num w:numId="59" w16cid:durableId="628516409">
+    <w:abstractNumId w:val="133"/>
+  </w:num>
+  <w:num w:numId="60" w16cid:durableId="2028865444">
+    <w:abstractNumId w:val="93"/>
+  </w:num>
+  <w:num w:numId="61" w16cid:durableId="943926811">
+    <w:abstractNumId w:val="153"/>
+  </w:num>
+  <w:num w:numId="62" w16cid:durableId="1841193257">
+    <w:abstractNumId w:val="73"/>
+  </w:num>
+  <w:num w:numId="63" w16cid:durableId="682322850">
+    <w:abstractNumId w:val="137"/>
+  </w:num>
+  <w:num w:numId="64" w16cid:durableId="2043705333">
+    <w:abstractNumId w:val="74"/>
+  </w:num>
+  <w:num w:numId="65" w16cid:durableId="1164854761">
+    <w:abstractNumId w:val="56"/>
+  </w:num>
+  <w:num w:numId="66" w16cid:durableId="1919972541">
     <w:abstractNumId w:val="89"/>
   </w:num>
-  <w:num w:numId="2" w16cid:durableId="871453468">
+  <w:num w:numId="67" w16cid:durableId="463617329">
+    <w:abstractNumId w:val="60"/>
+  </w:num>
+  <w:num w:numId="68" w16cid:durableId="2064014330">
+    <w:abstractNumId w:val="109"/>
+  </w:num>
+  <w:num w:numId="69" w16cid:durableId="452797354">
+    <w:abstractNumId w:val="114"/>
+  </w:num>
+  <w:num w:numId="70" w16cid:durableId="1196650037">
+    <w:abstractNumId w:val="50"/>
+  </w:num>
+  <w:num w:numId="71" w16cid:durableId="940071828">
+    <w:abstractNumId w:val="148"/>
+  </w:num>
+  <w:num w:numId="72" w16cid:durableId="1608273926">
+    <w:abstractNumId w:val="75"/>
+  </w:num>
+  <w:num w:numId="73" w16cid:durableId="2009864772">
+    <w:abstractNumId w:val="90"/>
+  </w:num>
+  <w:num w:numId="74" w16cid:durableId="712267004">
+    <w:abstractNumId w:val="36"/>
+  </w:num>
+  <w:num w:numId="75" w16cid:durableId="506480902">
+    <w:abstractNumId w:val="32"/>
+  </w:num>
+  <w:num w:numId="76" w16cid:durableId="286202349">
+    <w:abstractNumId w:val="119"/>
+  </w:num>
+  <w:num w:numId="77" w16cid:durableId="156460757">
+    <w:abstractNumId w:val="67"/>
+  </w:num>
+  <w:num w:numId="78" w16cid:durableId="1230077056">
+    <w:abstractNumId w:val="6"/>
+  </w:num>
+  <w:num w:numId="79" w16cid:durableId="1837106927">
+    <w:abstractNumId w:val="49"/>
+  </w:num>
+  <w:num w:numId="80" w16cid:durableId="287929152">
+    <w:abstractNumId w:val="35"/>
+  </w:num>
+  <w:num w:numId="81" w16cid:durableId="1672175260">
+    <w:abstractNumId w:val="85"/>
+  </w:num>
+  <w:num w:numId="82" w16cid:durableId="1954820163">
+    <w:abstractNumId w:val="59"/>
+  </w:num>
+  <w:num w:numId="83" w16cid:durableId="1990016594">
+    <w:abstractNumId w:val="24"/>
+  </w:num>
+  <w:num w:numId="84" w16cid:durableId="366876741">
+    <w:abstractNumId w:val="92"/>
+  </w:num>
+  <w:num w:numId="85" w16cid:durableId="15274915">
+    <w:abstractNumId w:val="39"/>
+  </w:num>
+  <w:num w:numId="86" w16cid:durableId="288124443">
+    <w:abstractNumId w:val="10"/>
+  </w:num>
+  <w:num w:numId="87" w16cid:durableId="591351385">
+    <w:abstractNumId w:val="106"/>
+  </w:num>
+  <w:num w:numId="88" w16cid:durableId="1361005725">
+    <w:abstractNumId w:val="151"/>
+  </w:num>
+  <w:num w:numId="89" w16cid:durableId="219681743">
+    <w:abstractNumId w:val="11"/>
+  </w:num>
+  <w:num w:numId="90" w16cid:durableId="194386594">
+    <w:abstractNumId w:val="116"/>
+  </w:num>
+  <w:num w:numId="91" w16cid:durableId="777793346">
+    <w:abstractNumId w:val="83"/>
+  </w:num>
+  <w:num w:numId="92" w16cid:durableId="173346871">
+    <w:abstractNumId w:val="88"/>
+  </w:num>
+  <w:num w:numId="93" w16cid:durableId="948700467">
+    <w:abstractNumId w:val="40"/>
+  </w:num>
+  <w:num w:numId="94" w16cid:durableId="1328363750">
+    <w:abstractNumId w:val="23"/>
+  </w:num>
+  <w:num w:numId="95" w16cid:durableId="541676570">
+    <w:abstractNumId w:val="68"/>
+  </w:num>
+  <w:num w:numId="96" w16cid:durableId="694119229">
+    <w:abstractNumId w:val="86"/>
+  </w:num>
+  <w:num w:numId="97" w16cid:durableId="704327987">
+    <w:abstractNumId w:val="54"/>
+  </w:num>
+  <w:num w:numId="98" w16cid:durableId="1157303613">
     <w:abstractNumId w:val="25"/>
   </w:num>
-  <w:num w:numId="3" w16cid:durableId="698706805">
-    <w:abstractNumId w:val="39"/>
-  </w:num>
-  <w:num w:numId="4" w16cid:durableId="1105467722">
-    <w:abstractNumId w:val="74"/>
-  </w:num>
-  <w:num w:numId="5" w16cid:durableId="769932622">
-    <w:abstractNumId w:val="105"/>
-  </w:num>
-  <w:num w:numId="6" w16cid:durableId="575944109">
-    <w:abstractNumId w:val="43"/>
-  </w:num>
-  <w:num w:numId="7" w16cid:durableId="877661689">
+  <w:num w:numId="99" w16cid:durableId="1706099794">
     <w:abstractNumId w:val="139"/>
   </w:num>
-  <w:num w:numId="8" w16cid:durableId="1390107422">
-    <w:abstractNumId w:val="79"/>
+  <w:num w:numId="100" w16cid:durableId="256404901">
+    <w:abstractNumId w:val="138"/>
   </w:num>
-  <w:num w:numId="9" w16cid:durableId="881866424">
-    <w:abstractNumId w:val="101"/>
+  <w:num w:numId="101" w16cid:durableId="924923012">
+    <w:abstractNumId w:val="29"/>
   </w:num>
-  <w:num w:numId="10" w16cid:durableId="1037244995">
-    <w:abstractNumId w:val="130"/>
-  </w:num>
-  <w:num w:numId="11" w16cid:durableId="1575554597">
-    <w:abstractNumId w:val="64"/>
-  </w:num>
-  <w:num w:numId="12" w16cid:durableId="915364478">
-    <w:abstractNumId w:val="85"/>
-  </w:num>
-  <w:num w:numId="13" w16cid:durableId="1386294114">
-    <w:abstractNumId w:val="121"/>
-  </w:num>
-  <w:num w:numId="14" w16cid:durableId="1071851223">
-    <w:abstractNumId w:val="26"/>
-  </w:num>
-  <w:num w:numId="15" w16cid:durableId="1545557520">
-    <w:abstractNumId w:val="75"/>
-  </w:num>
-  <w:num w:numId="16" w16cid:durableId="1102919547">
+  <w:num w:numId="102" w16cid:durableId="536550966">
     <w:abstractNumId w:val="152"/>
   </w:num>
-  <w:num w:numId="17" w16cid:durableId="294526838">
-    <w:abstractNumId w:val="55"/>
-  </w:num>
-  <w:num w:numId="18" w16cid:durableId="679889896">
-    <w:abstractNumId w:val="62"/>
-  </w:num>
-  <w:num w:numId="19" w16cid:durableId="2119449470">
-    <w:abstractNumId w:val="97"/>
-  </w:num>
-  <w:num w:numId="20" w16cid:durableId="1365054799">
-    <w:abstractNumId w:val="14"/>
-  </w:num>
-  <w:num w:numId="21" w16cid:durableId="1683512738">
-    <w:abstractNumId w:val="63"/>
-  </w:num>
-  <w:num w:numId="22" w16cid:durableId="1080098953">
-    <w:abstractNumId w:val="126"/>
-  </w:num>
-  <w:num w:numId="23" w16cid:durableId="1635717296">
-    <w:abstractNumId w:val="68"/>
-  </w:num>
-  <w:num w:numId="24" w16cid:durableId="544873123">
-    <w:abstractNumId w:val="120"/>
-  </w:num>
-  <w:num w:numId="25" w16cid:durableId="1128352778">
-    <w:abstractNumId w:val="13"/>
-  </w:num>
-  <w:num w:numId="26" w16cid:durableId="1732537407">
-    <w:abstractNumId w:val="134"/>
-  </w:num>
-  <w:num w:numId="27" w16cid:durableId="945502064">
-    <w:abstractNumId w:val="6"/>
-  </w:num>
-  <w:num w:numId="28" w16cid:durableId="1997681677">
-    <w:abstractNumId w:val="3"/>
-  </w:num>
-  <w:num w:numId="29" w16cid:durableId="815955639">
-    <w:abstractNumId w:val="61"/>
-  </w:num>
-  <w:num w:numId="30" w16cid:durableId="1500659483">
-    <w:abstractNumId w:val="82"/>
-  </w:num>
-  <w:num w:numId="31" w16cid:durableId="118301211">
-    <w:abstractNumId w:val="15"/>
-  </w:num>
-  <w:num w:numId="32" w16cid:durableId="732387979">
-    <w:abstractNumId w:val="44"/>
-  </w:num>
-  <w:num w:numId="33" w16cid:durableId="2129276417">
-    <w:abstractNumId w:val="18"/>
-  </w:num>
-  <w:num w:numId="34" w16cid:durableId="1470708820">
-    <w:abstractNumId w:val="50"/>
-  </w:num>
-  <w:num w:numId="35" w16cid:durableId="356852923">
-    <w:abstractNumId w:val="96"/>
-  </w:num>
-  <w:num w:numId="36" w16cid:durableId="430662559">
-    <w:abstractNumId w:val="21"/>
-  </w:num>
-  <w:num w:numId="37" w16cid:durableId="247080868">
-    <w:abstractNumId w:val="143"/>
-  </w:num>
-  <w:num w:numId="38" w16cid:durableId="158887408">
-    <w:abstractNumId w:val="118"/>
-  </w:num>
-  <w:num w:numId="39" w16cid:durableId="1681347932">
-    <w:abstractNumId w:val="138"/>
-  </w:num>
-  <w:num w:numId="40" w16cid:durableId="2101440158">
-    <w:abstractNumId w:val="78"/>
-  </w:num>
-  <w:num w:numId="41" w16cid:durableId="1250391122">
-    <w:abstractNumId w:val="113"/>
-  </w:num>
-  <w:num w:numId="42" w16cid:durableId="479083359">
-    <w:abstractNumId w:val="142"/>
-  </w:num>
-  <w:num w:numId="43" w16cid:durableId="1557860317">
-    <w:abstractNumId w:val="98"/>
-  </w:num>
-  <w:num w:numId="44" w16cid:durableId="2142183763">
-    <w:abstractNumId w:val="8"/>
-  </w:num>
-  <w:num w:numId="45" w16cid:durableId="1357736349">
-    <w:abstractNumId w:val="148"/>
-  </w:num>
-  <w:num w:numId="46" w16cid:durableId="1519656040">
-    <w:abstractNumId w:val="147"/>
-  </w:num>
-  <w:num w:numId="47" w16cid:durableId="1078596852">
-    <w:abstractNumId w:val="154"/>
-  </w:num>
-  <w:num w:numId="48" w16cid:durableId="1027950100">
-    <w:abstractNumId w:val="36"/>
-  </w:num>
-  <w:num w:numId="49" w16cid:durableId="878516382">
-    <w:abstractNumId w:val="20"/>
-  </w:num>
-  <w:num w:numId="50" w16cid:durableId="363404927">
+  <w:num w:numId="103" w16cid:durableId="425157302">
     <w:abstractNumId w:val="69"/>
   </w:num>
-  <w:num w:numId="51" w16cid:durableId="1128354320">
-    <w:abstractNumId w:val="132"/>
-  </w:num>
-  <w:num w:numId="52" w16cid:durableId="248543928">
-    <w:abstractNumId w:val="77"/>
-  </w:num>
-  <w:num w:numId="53" w16cid:durableId="965889214">
-    <w:abstractNumId w:val="103"/>
-  </w:num>
-  <w:num w:numId="54" w16cid:durableId="1827503240">
-    <w:abstractNumId w:val="111"/>
-  </w:num>
-  <w:num w:numId="55" w16cid:durableId="505748256">
-    <w:abstractNumId w:val="93"/>
-  </w:num>
-  <w:num w:numId="56" w16cid:durableId="2120370925">
-    <w:abstractNumId w:val="33"/>
-  </w:num>
-  <w:num w:numId="57" w16cid:durableId="369182267">
-    <w:abstractNumId w:val="17"/>
-  </w:num>
-  <w:num w:numId="58" w16cid:durableId="1000235123">
-    <w:abstractNumId w:val="99"/>
-  </w:num>
-  <w:num w:numId="59" w16cid:durableId="628516409">
-    <w:abstractNumId w:val="131"/>
-  </w:num>
-  <w:num w:numId="60" w16cid:durableId="2028865444">
-    <w:abstractNumId w:val="91"/>
-  </w:num>
-  <w:num w:numId="61" w16cid:durableId="943926811">
-    <w:abstractNumId w:val="151"/>
-  </w:num>
-  <w:num w:numId="62" w16cid:durableId="1841193257">
-    <w:abstractNumId w:val="71"/>
-  </w:num>
-  <w:num w:numId="63" w16cid:durableId="682322850">
-    <w:abstractNumId w:val="135"/>
-  </w:num>
-  <w:num w:numId="64" w16cid:durableId="2043705333">
-    <w:abstractNumId w:val="72"/>
-  </w:num>
-  <w:num w:numId="65" w16cid:durableId="1164854761">
-    <w:abstractNumId w:val="54"/>
-  </w:num>
-  <w:num w:numId="66" w16cid:durableId="1919972541">
-    <w:abstractNumId w:val="87"/>
-  </w:num>
-  <w:num w:numId="67" w16cid:durableId="463617329">
-    <w:abstractNumId w:val="58"/>
-  </w:num>
-  <w:num w:numId="68" w16cid:durableId="2064014330">
-    <w:abstractNumId w:val="107"/>
-  </w:num>
-  <w:num w:numId="69" w16cid:durableId="452797354">
-    <w:abstractNumId w:val="112"/>
-  </w:num>
-  <w:num w:numId="70" w16cid:durableId="1196650037">
-    <w:abstractNumId w:val="48"/>
-  </w:num>
-  <w:num w:numId="71" w16cid:durableId="940071828">
-    <w:abstractNumId w:val="146"/>
-  </w:num>
-  <w:num w:numId="72" w16cid:durableId="1608273926">
-    <w:abstractNumId w:val="73"/>
-  </w:num>
-  <w:num w:numId="73" w16cid:durableId="2009864772">
-    <w:abstractNumId w:val="88"/>
-  </w:num>
-  <w:num w:numId="74" w16cid:durableId="712267004">
-    <w:abstractNumId w:val="35"/>
-  </w:num>
-  <w:num w:numId="75" w16cid:durableId="506480902">
-    <w:abstractNumId w:val="31"/>
-  </w:num>
-  <w:num w:numId="76" w16cid:durableId="286202349">
-    <w:abstractNumId w:val="117"/>
-  </w:num>
-  <w:num w:numId="77" w16cid:durableId="156460757">
-    <w:abstractNumId w:val="65"/>
-  </w:num>
-  <w:num w:numId="78" w16cid:durableId="1230077056">
-    <w:abstractNumId w:val="5"/>
-  </w:num>
-  <w:num w:numId="79" w16cid:durableId="1837106927">
-    <w:abstractNumId w:val="47"/>
-  </w:num>
-  <w:num w:numId="80" w16cid:durableId="287929152">
-    <w:abstractNumId w:val="34"/>
-  </w:num>
-  <w:num w:numId="81" w16cid:durableId="1672175260">
-    <w:abstractNumId w:val="83"/>
-  </w:num>
-  <w:num w:numId="82" w16cid:durableId="1954820163">
-    <w:abstractNumId w:val="57"/>
-  </w:num>
-  <w:num w:numId="83" w16cid:durableId="1990016594">
-    <w:abstractNumId w:val="23"/>
-  </w:num>
-  <w:num w:numId="84" w16cid:durableId="366876741">
-    <w:abstractNumId w:val="90"/>
-  </w:num>
-  <w:num w:numId="85" w16cid:durableId="15274915">
-    <w:abstractNumId w:val="37"/>
-  </w:num>
-  <w:num w:numId="86" w16cid:durableId="288124443">
-    <w:abstractNumId w:val="9"/>
-  </w:num>
-  <w:num w:numId="87" w16cid:durableId="591351385">
-    <w:abstractNumId w:val="104"/>
-  </w:num>
-  <w:num w:numId="88" w16cid:durableId="1361005725">
-    <w:abstractNumId w:val="149"/>
-  </w:num>
-  <w:num w:numId="89" w16cid:durableId="219681743">
-    <w:abstractNumId w:val="10"/>
-  </w:num>
-  <w:num w:numId="90" w16cid:durableId="194386594">
-    <w:abstractNumId w:val="114"/>
-  </w:num>
-  <w:num w:numId="91" w16cid:durableId="777793346">
-    <w:abstractNumId w:val="81"/>
-  </w:num>
-  <w:num w:numId="92" w16cid:durableId="173346871">
-    <w:abstractNumId w:val="86"/>
-  </w:num>
-  <w:num w:numId="93" w16cid:durableId="948700467">
-    <w:abstractNumId w:val="38"/>
-  </w:num>
-  <w:num w:numId="94" w16cid:durableId="1328363750">
-    <w:abstractNumId w:val="22"/>
-  </w:num>
-  <w:num w:numId="95" w16cid:durableId="541676570">
-    <w:abstractNumId w:val="66"/>
-  </w:num>
-  <w:num w:numId="96" w16cid:durableId="694119229">
-    <w:abstractNumId w:val="84"/>
-  </w:num>
-  <w:num w:numId="97" w16cid:durableId="704327987">
-    <w:abstractNumId w:val="52"/>
-  </w:num>
-  <w:num w:numId="98" w16cid:durableId="1157303613">
-    <w:abstractNumId w:val="24"/>
-  </w:num>
-  <w:num w:numId="99" w16cid:durableId="1706099794">
-    <w:abstractNumId w:val="137"/>
-  </w:num>
-  <w:num w:numId="100" w16cid:durableId="256404901">
-    <w:abstractNumId w:val="136"/>
-  </w:num>
-  <w:num w:numId="101" w16cid:durableId="924923012">
-    <w:abstractNumId w:val="28"/>
-  </w:num>
-  <w:num w:numId="102" w16cid:durableId="536550966">
-    <w:abstractNumId w:val="150"/>
-  </w:num>
-  <w:num w:numId="103" w16cid:durableId="425157302">
-    <w:abstractNumId w:val="67"/>
-  </w:num>
   <w:num w:numId="104" w16cid:durableId="967664612">
-    <w:abstractNumId w:val="123"/>
+    <w:abstractNumId w:val="125"/>
   </w:num>
   <w:num w:numId="105" w16cid:durableId="361631616">
-    <w:abstractNumId w:val="92"/>
+    <w:abstractNumId w:val="94"/>
   </w:num>
   <w:num w:numId="106" w16cid:durableId="443623616">
-    <w:abstractNumId w:val="127"/>
+    <w:abstractNumId w:val="129"/>
   </w:num>
   <w:num w:numId="107" w16cid:durableId="150101619">
-    <w:abstractNumId w:val="11"/>
+    <w:abstractNumId w:val="12"/>
   </w:num>
   <w:num w:numId="108" w16cid:durableId="1431658174">
-    <w:abstractNumId w:val="56"/>
+    <w:abstractNumId w:val="58"/>
   </w:num>
   <w:num w:numId="109" w16cid:durableId="1050495440">
     <w:abstractNumId w:val="0"/>
   </w:num>
   <w:num w:numId="110" w16cid:durableId="712924661">
+    <w:abstractNumId w:val="112"/>
+  </w:num>
+  <w:num w:numId="111" w16cid:durableId="1917784113">
+    <w:abstractNumId w:val="108"/>
+  </w:num>
+  <w:num w:numId="112" w16cid:durableId="896237065">
+    <w:abstractNumId w:val="117"/>
+  </w:num>
+  <w:num w:numId="113" w16cid:durableId="1171681430">
+    <w:abstractNumId w:val="142"/>
+  </w:num>
+  <w:num w:numId="114" w16cid:durableId="1552573199">
+    <w:abstractNumId w:val="143"/>
+  </w:num>
+  <w:num w:numId="115" w16cid:durableId="1920869674">
+    <w:abstractNumId w:val="127"/>
+  </w:num>
+  <w:num w:numId="116" w16cid:durableId="476724716">
+    <w:abstractNumId w:val="97"/>
+  </w:num>
+  <w:num w:numId="117" w16cid:durableId="658919541">
+    <w:abstractNumId w:val="96"/>
+  </w:num>
+  <w:num w:numId="118" w16cid:durableId="1622418131">
+    <w:abstractNumId w:val="47"/>
+  </w:num>
+  <w:num w:numId="119" w16cid:durableId="1693994672">
+    <w:abstractNumId w:val="3"/>
+  </w:num>
+  <w:num w:numId="120" w16cid:durableId="396828229">
+    <w:abstractNumId w:val="147"/>
+  </w:num>
+  <w:num w:numId="121" w16cid:durableId="986058889">
+    <w:abstractNumId w:val="20"/>
+  </w:num>
+  <w:num w:numId="122" w16cid:durableId="1224410703">
+    <w:abstractNumId w:val="62"/>
+  </w:num>
+  <w:num w:numId="123" w16cid:durableId="1804040304">
+    <w:abstractNumId w:val="82"/>
+  </w:num>
+  <w:num w:numId="124" w16cid:durableId="114181197">
+    <w:abstractNumId w:val="146"/>
+  </w:num>
+  <w:num w:numId="125" w16cid:durableId="772671624">
+    <w:abstractNumId w:val="5"/>
+  </w:num>
+  <w:num w:numId="126" w16cid:durableId="889919055">
+    <w:abstractNumId w:val="8"/>
+  </w:num>
+  <w:num w:numId="127" w16cid:durableId="1818105337">
+    <w:abstractNumId w:val="53"/>
+  </w:num>
+  <w:num w:numId="128" w16cid:durableId="384987847">
+    <w:abstractNumId w:val="30"/>
+  </w:num>
+  <w:num w:numId="129" w16cid:durableId="659895420">
+    <w:abstractNumId w:val="61"/>
+  </w:num>
+  <w:num w:numId="130" w16cid:durableId="1168907903">
+    <w:abstractNumId w:val="130"/>
+  </w:num>
+  <w:num w:numId="131" w16cid:durableId="430206235">
+    <w:abstractNumId w:val="121"/>
+  </w:num>
+  <w:num w:numId="132" w16cid:durableId="1207327089">
+    <w:abstractNumId w:val="28"/>
+  </w:num>
+  <w:num w:numId="133" w16cid:durableId="596404292">
     <w:abstractNumId w:val="110"/>
   </w:num>
-  <w:num w:numId="111" w16cid:durableId="1917784113">
-    <w:abstractNumId w:val="106"/>
-  </w:num>
-  <w:num w:numId="112" w16cid:durableId="896237065">
-    <w:abstractNumId w:val="115"/>
-  </w:num>
-  <w:num w:numId="113" w16cid:durableId="1171681430">
-    <w:abstractNumId w:val="140"/>
-  </w:num>
-  <w:num w:numId="114" w16cid:durableId="1552573199">
-    <w:abstractNumId w:val="141"/>
-  </w:num>
-  <w:num w:numId="115" w16cid:durableId="1920869674">
-    <w:abstractNumId w:val="125"/>
-  </w:num>
-  <w:num w:numId="116" w16cid:durableId="476724716">
-    <w:abstractNumId w:val="95"/>
-  </w:num>
-  <w:num w:numId="117" w16cid:durableId="658919541">
-    <w:abstractNumId w:val="94"/>
-  </w:num>
-  <w:num w:numId="118" w16cid:durableId="1622418131">
-    <w:abstractNumId w:val="45"/>
-  </w:num>
-  <w:num w:numId="119" w16cid:durableId="1693994672">
-    <w:abstractNumId w:val="2"/>
-  </w:num>
-  <w:num w:numId="120" w16cid:durableId="396828229">
-    <w:abstractNumId w:val="145"/>
-  </w:num>
-  <w:num w:numId="121" w16cid:durableId="986058889">
-    <w:abstractNumId w:val="19"/>
-  </w:num>
-  <w:num w:numId="122" w16cid:durableId="1224410703">
-    <w:abstractNumId w:val="60"/>
-  </w:num>
-  <w:num w:numId="123" w16cid:durableId="1804040304">
-    <w:abstractNumId w:val="80"/>
-  </w:num>
-  <w:num w:numId="124" w16cid:durableId="114181197">
-    <w:abstractNumId w:val="144"/>
-  </w:num>
-  <w:num w:numId="125" w16cid:durableId="772671624">
-    <w:abstractNumId w:val="4"/>
-  </w:num>
-  <w:num w:numId="126" w16cid:durableId="889919055">
-    <w:abstractNumId w:val="7"/>
-  </w:num>
-  <w:num w:numId="127" w16cid:durableId="1818105337">
-    <w:abstractNumId w:val="51"/>
-  </w:num>
-  <w:num w:numId="128" w16cid:durableId="384987847">
-    <w:abstractNumId w:val="29"/>
-  </w:num>
-  <w:num w:numId="129" w16cid:durableId="659895420">
-    <w:abstractNumId w:val="59"/>
-  </w:num>
-  <w:num w:numId="130" w16cid:durableId="1168907903">
-    <w:abstractNumId w:val="128"/>
-  </w:num>
-  <w:num w:numId="131" w16cid:durableId="430206235">
-    <w:abstractNumId w:val="119"/>
-  </w:num>
-  <w:num w:numId="132" w16cid:durableId="1207327089">
-    <w:abstractNumId w:val="27"/>
-  </w:num>
-  <w:num w:numId="133" w16cid:durableId="596404292">
-    <w:abstractNumId w:val="108"/>
-  </w:num>
   <w:num w:numId="134" w16cid:durableId="2070372549">
-    <w:abstractNumId w:val="42"/>
+    <w:abstractNumId w:val="44"/>
   </w:num>
   <w:num w:numId="135" w16cid:durableId="1841265039">
-    <w:abstractNumId w:val="46"/>
+    <w:abstractNumId w:val="48"/>
   </w:num>
   <w:num w:numId="136" w16cid:durableId="1988632595">
-    <w:abstractNumId w:val="41"/>
+    <w:abstractNumId w:val="43"/>
   </w:num>
   <w:num w:numId="137" w16cid:durableId="1218275126">
-    <w:abstractNumId w:val="70"/>
+    <w:abstractNumId w:val="72"/>
   </w:num>
   <w:num w:numId="138" w16cid:durableId="568660900">
-    <w:abstractNumId w:val="76"/>
+    <w:abstractNumId w:val="78"/>
   </w:num>
   <w:num w:numId="139" w16cid:durableId="967976864">
-    <w:abstractNumId w:val="109"/>
+    <w:abstractNumId w:val="111"/>
   </w:num>
   <w:num w:numId="140" w16cid:durableId="650643288">
+    <w:abstractNumId w:val="126"/>
+  </w:num>
+  <w:num w:numId="141" w16cid:durableId="219370247">
     <w:abstractNumId w:val="124"/>
   </w:num>
-  <w:num w:numId="141" w16cid:durableId="219370247">
-    <w:abstractNumId w:val="122"/>
-  </w:num>
   <w:num w:numId="142" w16cid:durableId="323239876">
-    <w:abstractNumId w:val="153"/>
+    <w:abstractNumId w:val="155"/>
   </w:num>
   <w:num w:numId="143" w16cid:durableId="1619793156">
-    <w:abstractNumId w:val="32"/>
+    <w:abstractNumId w:val="33"/>
   </w:num>
   <w:num w:numId="144" w16cid:durableId="1186332867">
-    <w:abstractNumId w:val="133"/>
+    <w:abstractNumId w:val="135"/>
   </w:num>
   <w:num w:numId="145" w16cid:durableId="89937035">
-    <w:abstractNumId w:val="53"/>
+    <w:abstractNumId w:val="55"/>
   </w:num>
   <w:num w:numId="146" w16cid:durableId="1975022609">
     <w:abstractNumId w:val="1"/>
   </w:num>
   <w:num w:numId="147" w16cid:durableId="1760910030">
-    <w:abstractNumId w:val="100"/>
+    <w:abstractNumId w:val="102"/>
   </w:num>
   <w:num w:numId="148" w16cid:durableId="349307706">
-    <w:abstractNumId w:val="129"/>
+    <w:abstractNumId w:val="131"/>
   </w:num>
   <w:num w:numId="149" w16cid:durableId="1600336622">
-    <w:abstractNumId w:val="30"/>
+    <w:abstractNumId w:val="31"/>
   </w:num>
   <w:num w:numId="150" w16cid:durableId="789783474">
-    <w:abstractNumId w:val="40"/>
+    <w:abstractNumId w:val="42"/>
   </w:num>
   <w:num w:numId="151" w16cid:durableId="1236017784">
-    <w:abstractNumId w:val="12"/>
+    <w:abstractNumId w:val="13"/>
   </w:num>
   <w:num w:numId="152" w16cid:durableId="1483890789">
-    <w:abstractNumId w:val="102"/>
+    <w:abstractNumId w:val="104"/>
   </w:num>
   <w:num w:numId="153" w16cid:durableId="2104719660">
-    <w:abstractNumId w:val="116"/>
+    <w:abstractNumId w:val="118"/>
   </w:num>
   <w:num w:numId="154" w16cid:durableId="2030252929">
-    <w:abstractNumId w:val="49"/>
+    <w:abstractNumId w:val="51"/>
   </w:num>
   <w:num w:numId="155" w16cid:durableId="1356731706">
-    <w:abstractNumId w:val="16"/>
+    <w:abstractNumId w:val="17"/>
+  </w:num>
+  <w:num w:numId="156" w16cid:durableId="1954747069">
+    <w:abstractNumId w:val="38"/>
+  </w:num>
+  <w:num w:numId="157" w16cid:durableId="1514421104">
+    <w:abstractNumId w:val="2"/>
   </w:num>
 </w:numbering>
 </file>

</xml_diff>

<commit_message>
Employee Management APIs (#392)
</commit_message>
<xml_diff>
--- a/API Design.docx
+++ b/API Design.docx
@@ -8575,15 +8575,1231 @@
     <w:p/>
     <w:p>
       <w:pPr>
+        <w:pStyle w:val="Heading3"/>
+      </w:pPr>
+      <w:r>
+        <w:br w:type="page"/>
+      </w:r>
+      <w:r>
+        <w:lastRenderedPageBreak/>
+        <w:t>Employee Management APIs</w:t>
+      </w:r>
+    </w:p>
+    <w:p>
+      <w:r>
+        <w:t>Employee Management APIs allow rental agencies to control employee accounts and to limit access to resources required for agency's operation in KriGo platform. This API allows agencies' administrators to create, modify and deactivate employee accounts, set roles and permissions, and control status of employees. Thus, the platform provides means for controlling operations related to personnel management, which allows performing business processes with increased efficiency and security.</w:t>
+      </w:r>
+    </w:p>
+    <w:p>
+      <w:r>
+        <w:t>Employee Management APIs use REST architecture style, according to which employees are treated as resources identified by their unique identifiers. Authentication in all of the operations performed on employee management resource is done using JSON Web Tokens (JWT) and authorization is controlled using RBAC. Therefore, only administrators from respective agencies and managers authorized to perform this operation are able to manage employee accounts and their permissions.</w:t>
+      </w:r>
+    </w:p>
+    <w:p>
+      <w:r>
+        <w:t>Employee Management Service works in close interaction with Authentication Service and Agency Management Service. Employees' accounts belong to a certain agency and are authenticated using centralized authentication process. Assignment of roles and permissions allows limiting the access of employees to agency's resources.</w:t>
+      </w:r>
+    </w:p>
+    <w:p>
+      <w:pPr>
+        <w:pStyle w:val="Title"/>
+      </w:pPr>
+      <w:r>
+        <w:t>Employee Management API Endpoints</w:t>
+      </w:r>
+    </w:p>
+    <w:p>
+      <w:pPr>
+        <w:pStyle w:val="Caption"/>
+        <w:keepNext/>
+      </w:pPr>
+      <w:r>
+        <w:t xml:space="preserve">Table </w:t>
+      </w:r>
+      <w:r>
+        <w:fldChar w:fldCharType="begin"/>
+      </w:r>
+      <w:r>
+        <w:instrText xml:space="preserve"> SEQ Table \* ARABIC </w:instrText>
+      </w:r>
+      <w:r>
+        <w:fldChar w:fldCharType="separate"/>
+      </w:r>
+      <w:r>
+        <w:rPr>
+          <w:noProof/>
+        </w:rPr>
+        <w:t>9</w:t>
+      </w:r>
+      <w:r>
+        <w:fldChar w:fldCharType="end"/>
+      </w:r>
+      <w:r>
+        <w:t xml:space="preserve"> - </w:t>
+      </w:r>
+      <w:r>
+        <w:t>Employee Management API Endpoints</w:t>
+      </w:r>
+    </w:p>
+    <w:tbl>
+      <w:tblPr>
+        <w:tblStyle w:val="PlainTable1"/>
+        <w:tblW w:w="0" w:type="auto"/>
+        <w:tblCellMar>
+          <w:top w:w="72" w:type="dxa"/>
+          <w:bottom w:w="72" w:type="dxa"/>
+        </w:tblCellMar>
+        <w:tblLook w:val="04A0" w:firstRow="1" w:lastRow="0" w:firstColumn="1" w:lastColumn="0" w:noHBand="0" w:noVBand="1"/>
+      </w:tblPr>
+      <w:tblGrid>
+        <w:gridCol w:w="4314"/>
+        <w:gridCol w:w="1123"/>
+        <w:gridCol w:w="2731"/>
+        <w:gridCol w:w="1179"/>
+      </w:tblGrid>
+      <w:tr>
+        <w:trPr>
+          <w:cnfStyle w:val="100000000000" w:firstRow="1" w:lastRow="0" w:firstColumn="0" w:lastColumn="0" w:oddVBand="0" w:evenVBand="0" w:oddHBand="0" w:evenHBand="0" w:firstRowFirstColumn="0" w:firstRowLastColumn="0" w:lastRowFirstColumn="0" w:lastRowLastColumn="0"/>
+        </w:trPr>
+        <w:tc>
+          <w:tcPr>
+            <w:cnfStyle w:val="001000000000" w:firstRow="0" w:lastRow="0" w:firstColumn="1" w:lastColumn="0" w:oddVBand="0" w:evenVBand="0" w:oddHBand="0" w:evenHBand="0" w:firstRowFirstColumn="0" w:firstRowLastColumn="0" w:lastRowFirstColumn="0" w:lastRowLastColumn="0"/>
+            <w:tcW w:w="4315" w:type="dxa"/>
+            <w:vAlign w:val="center"/>
+            <w:hideMark/>
+          </w:tcPr>
+          <w:p>
+            <w:r>
+              <w:t>Endpoint</w:t>
+            </w:r>
+          </w:p>
+        </w:tc>
+        <w:tc>
+          <w:tcPr>
+            <w:tcW w:w="1117" w:type="dxa"/>
+            <w:vAlign w:val="center"/>
+            <w:hideMark/>
+          </w:tcPr>
+          <w:p>
+            <w:pPr>
+              <w:jc w:val="center"/>
+              <w:cnfStyle w:val="100000000000" w:firstRow="1" w:lastRow="0" w:firstColumn="0" w:lastColumn="0" w:oddVBand="0" w:evenVBand="0" w:oddHBand="0" w:evenHBand="0" w:firstRowFirstColumn="0" w:firstRowLastColumn="0" w:lastRowFirstColumn="0" w:lastRowLastColumn="0"/>
+            </w:pPr>
+            <w:r>
+              <w:t>Method</w:t>
+            </w:r>
+          </w:p>
+        </w:tc>
+        <w:tc>
+          <w:tcPr>
+            <w:tcW w:w="2736" w:type="dxa"/>
+            <w:vAlign w:val="center"/>
+            <w:hideMark/>
+          </w:tcPr>
+          <w:p>
+            <w:pPr>
+              <w:cnfStyle w:val="100000000000" w:firstRow="1" w:lastRow="0" w:firstColumn="0" w:lastColumn="0" w:oddVBand="0" w:evenVBand="0" w:oddHBand="0" w:evenHBand="0" w:firstRowFirstColumn="0" w:firstRowLastColumn="0" w:lastRowFirstColumn="0" w:lastRowLastColumn="0"/>
+            </w:pPr>
+            <w:r>
+              <w:t>Description</w:t>
+            </w:r>
+          </w:p>
+        </w:tc>
+        <w:tc>
+          <w:tcPr>
+            <w:tcW w:w="1179" w:type="dxa"/>
+            <w:vAlign w:val="center"/>
+            <w:hideMark/>
+          </w:tcPr>
+          <w:p>
+            <w:pPr>
+              <w:jc w:val="center"/>
+              <w:cnfStyle w:val="100000000000" w:firstRow="1" w:lastRow="0" w:firstColumn="0" w:lastColumn="0" w:oddVBand="0" w:evenVBand="0" w:oddHBand="0" w:evenHBand="0" w:firstRowFirstColumn="0" w:firstRowLastColumn="0" w:lastRowFirstColumn="0" w:lastRowLastColumn="0"/>
+            </w:pPr>
+            <w:r>
+              <w:t>Auth Required</w:t>
+            </w:r>
+          </w:p>
+        </w:tc>
+      </w:tr>
+      <w:tr>
+        <w:trPr>
+          <w:cnfStyle w:val="000000100000" w:firstRow="0" w:lastRow="0" w:firstColumn="0" w:lastColumn="0" w:oddVBand="0" w:evenVBand="0" w:oddHBand="1" w:evenHBand="0" w:firstRowFirstColumn="0" w:firstRowLastColumn="0" w:lastRowFirstColumn="0" w:lastRowLastColumn="0"/>
+        </w:trPr>
+        <w:tc>
+          <w:tcPr>
+            <w:cnfStyle w:val="001000000000" w:firstRow="0" w:lastRow="0" w:firstColumn="1" w:lastColumn="0" w:oddVBand="0" w:evenVBand="0" w:oddHBand="0" w:evenHBand="0" w:firstRowFirstColumn="0" w:firstRowLastColumn="0" w:lastRowFirstColumn="0" w:lastRowLastColumn="0"/>
+            <w:tcW w:w="4315" w:type="dxa"/>
+            <w:vAlign w:val="center"/>
+            <w:hideMark/>
+          </w:tcPr>
+          <w:p>
+            <w:pPr>
+              <w:rPr>
+                <w:b w:val="0"/>
+                <w:bCs w:val="0"/>
+              </w:rPr>
+            </w:pPr>
+            <w:r>
+              <w:rPr>
+                <w:b w:val="0"/>
+                <w:bCs w:val="0"/>
+              </w:rPr>
+              <w:t>/api/v1/employees</w:t>
+            </w:r>
+          </w:p>
+        </w:tc>
+        <w:tc>
+          <w:tcPr>
+            <w:tcW w:w="1117" w:type="dxa"/>
+            <w:vAlign w:val="center"/>
+            <w:hideMark/>
+          </w:tcPr>
+          <w:p>
+            <w:pPr>
+              <w:jc w:val="center"/>
+              <w:cnfStyle w:val="000000100000" w:firstRow="0" w:lastRow="0" w:firstColumn="0" w:lastColumn="0" w:oddVBand="0" w:evenVBand="0" w:oddHBand="1" w:evenHBand="0" w:firstRowFirstColumn="0" w:firstRowLastColumn="0" w:lastRowFirstColumn="0" w:lastRowLastColumn="0"/>
+            </w:pPr>
+            <w:r>
+              <w:t>POST</w:t>
+            </w:r>
+          </w:p>
+        </w:tc>
+        <w:tc>
+          <w:tcPr>
+            <w:tcW w:w="2736" w:type="dxa"/>
+            <w:vAlign w:val="center"/>
+            <w:hideMark/>
+          </w:tcPr>
+          <w:p>
+            <w:pPr>
+              <w:cnfStyle w:val="000000100000" w:firstRow="0" w:lastRow="0" w:firstColumn="0" w:lastColumn="0" w:oddVBand="0" w:evenVBand="0" w:oddHBand="1" w:evenHBand="0" w:firstRowFirstColumn="0" w:firstRowLastColumn="0" w:lastRowFirstColumn="0" w:lastRowLastColumn="0"/>
+            </w:pPr>
+            <w:r>
+              <w:t>Create a new employee account</w:t>
+            </w:r>
+          </w:p>
+        </w:tc>
+        <w:tc>
+          <w:tcPr>
+            <w:tcW w:w="1179" w:type="dxa"/>
+            <w:vAlign w:val="center"/>
+            <w:hideMark/>
+          </w:tcPr>
+          <w:p>
+            <w:pPr>
+              <w:jc w:val="center"/>
+              <w:cnfStyle w:val="000000100000" w:firstRow="0" w:lastRow="0" w:firstColumn="0" w:lastColumn="0" w:oddVBand="0" w:evenVBand="0" w:oddHBand="1" w:evenHBand="0" w:firstRowFirstColumn="0" w:firstRowLastColumn="0" w:lastRowFirstColumn="0" w:lastRowLastColumn="0"/>
+            </w:pPr>
+            <w:r>
+              <w:t>Yes</w:t>
+            </w:r>
+          </w:p>
+        </w:tc>
+      </w:tr>
+      <w:tr>
+        <w:tc>
+          <w:tcPr>
+            <w:cnfStyle w:val="001000000000" w:firstRow="0" w:lastRow="0" w:firstColumn="1" w:lastColumn="0" w:oddVBand="0" w:evenVBand="0" w:oddHBand="0" w:evenHBand="0" w:firstRowFirstColumn="0" w:firstRowLastColumn="0" w:lastRowFirstColumn="0" w:lastRowLastColumn="0"/>
+            <w:tcW w:w="4315" w:type="dxa"/>
+            <w:vAlign w:val="center"/>
+            <w:hideMark/>
+          </w:tcPr>
+          <w:p>
+            <w:pPr>
+              <w:rPr>
+                <w:b w:val="0"/>
+                <w:bCs w:val="0"/>
+              </w:rPr>
+            </w:pPr>
+            <w:r>
+              <w:rPr>
+                <w:b w:val="0"/>
+                <w:bCs w:val="0"/>
+              </w:rPr>
+              <w:t>/api/v1/employees</w:t>
+            </w:r>
+          </w:p>
+        </w:tc>
+        <w:tc>
+          <w:tcPr>
+            <w:tcW w:w="1117" w:type="dxa"/>
+            <w:vAlign w:val="center"/>
+            <w:hideMark/>
+          </w:tcPr>
+          <w:p>
+            <w:pPr>
+              <w:jc w:val="center"/>
+              <w:cnfStyle w:val="000000000000" w:firstRow="0" w:lastRow="0" w:firstColumn="0" w:lastColumn="0" w:oddVBand="0" w:evenVBand="0" w:oddHBand="0" w:evenHBand="0" w:firstRowFirstColumn="0" w:firstRowLastColumn="0" w:lastRowFirstColumn="0" w:lastRowLastColumn="0"/>
+            </w:pPr>
+            <w:r>
+              <w:t>GET</w:t>
+            </w:r>
+          </w:p>
+        </w:tc>
+        <w:tc>
+          <w:tcPr>
+            <w:tcW w:w="2736" w:type="dxa"/>
+            <w:vAlign w:val="center"/>
+            <w:hideMark/>
+          </w:tcPr>
+          <w:p>
+            <w:pPr>
+              <w:cnfStyle w:val="000000000000" w:firstRow="0" w:lastRow="0" w:firstColumn="0" w:lastColumn="0" w:oddVBand="0" w:evenVBand="0" w:oddHBand="0" w:evenHBand="0" w:firstRowFirstColumn="0" w:firstRowLastColumn="0" w:lastRowFirstColumn="0" w:lastRowLastColumn="0"/>
+            </w:pPr>
+            <w:r>
+              <w:t>Retrieve all employees of the authenticated agency</w:t>
+            </w:r>
+          </w:p>
+        </w:tc>
+        <w:tc>
+          <w:tcPr>
+            <w:tcW w:w="1179" w:type="dxa"/>
+            <w:vAlign w:val="center"/>
+            <w:hideMark/>
+          </w:tcPr>
+          <w:p>
+            <w:pPr>
+              <w:jc w:val="center"/>
+              <w:cnfStyle w:val="000000000000" w:firstRow="0" w:lastRow="0" w:firstColumn="0" w:lastColumn="0" w:oddVBand="0" w:evenVBand="0" w:oddHBand="0" w:evenHBand="0" w:firstRowFirstColumn="0" w:firstRowLastColumn="0" w:lastRowFirstColumn="0" w:lastRowLastColumn="0"/>
+            </w:pPr>
+            <w:r>
+              <w:t>Yes</w:t>
+            </w:r>
+          </w:p>
+        </w:tc>
+      </w:tr>
+      <w:tr>
+        <w:trPr>
+          <w:cnfStyle w:val="000000100000" w:firstRow="0" w:lastRow="0" w:firstColumn="0" w:lastColumn="0" w:oddVBand="0" w:evenVBand="0" w:oddHBand="1" w:evenHBand="0" w:firstRowFirstColumn="0" w:firstRowLastColumn="0" w:lastRowFirstColumn="0" w:lastRowLastColumn="0"/>
+        </w:trPr>
+        <w:tc>
+          <w:tcPr>
+            <w:cnfStyle w:val="001000000000" w:firstRow="0" w:lastRow="0" w:firstColumn="1" w:lastColumn="0" w:oddVBand="0" w:evenVBand="0" w:oddHBand="0" w:evenHBand="0" w:firstRowFirstColumn="0" w:firstRowLastColumn="0" w:lastRowFirstColumn="0" w:lastRowLastColumn="0"/>
+            <w:tcW w:w="4315" w:type="dxa"/>
+            <w:vAlign w:val="center"/>
+            <w:hideMark/>
+          </w:tcPr>
+          <w:p>
+            <w:pPr>
+              <w:rPr>
+                <w:b w:val="0"/>
+                <w:bCs w:val="0"/>
+              </w:rPr>
+            </w:pPr>
+            <w:r>
+              <w:rPr>
+                <w:b w:val="0"/>
+                <w:bCs w:val="0"/>
+              </w:rPr>
+              <w:t>/api/v1/employees/{employeeId}</w:t>
+            </w:r>
+          </w:p>
+        </w:tc>
+        <w:tc>
+          <w:tcPr>
+            <w:tcW w:w="1117" w:type="dxa"/>
+            <w:vAlign w:val="center"/>
+            <w:hideMark/>
+          </w:tcPr>
+          <w:p>
+            <w:pPr>
+              <w:jc w:val="center"/>
+              <w:cnfStyle w:val="000000100000" w:firstRow="0" w:lastRow="0" w:firstColumn="0" w:lastColumn="0" w:oddVBand="0" w:evenVBand="0" w:oddHBand="1" w:evenHBand="0" w:firstRowFirstColumn="0" w:firstRowLastColumn="0" w:lastRowFirstColumn="0" w:lastRowLastColumn="0"/>
+            </w:pPr>
+            <w:r>
+              <w:t>GET</w:t>
+            </w:r>
+          </w:p>
+        </w:tc>
+        <w:tc>
+          <w:tcPr>
+            <w:tcW w:w="2736" w:type="dxa"/>
+            <w:vAlign w:val="center"/>
+            <w:hideMark/>
+          </w:tcPr>
+          <w:p>
+            <w:pPr>
+              <w:cnfStyle w:val="000000100000" w:firstRow="0" w:lastRow="0" w:firstColumn="0" w:lastColumn="0" w:oddVBand="0" w:evenVBand="0" w:oddHBand="1" w:evenHBand="0" w:firstRowFirstColumn="0" w:firstRowLastColumn="0" w:lastRowFirstColumn="0" w:lastRowLastColumn="0"/>
+            </w:pPr>
+            <w:r>
+              <w:t>Retrieve employee details</w:t>
+            </w:r>
+          </w:p>
+        </w:tc>
+        <w:tc>
+          <w:tcPr>
+            <w:tcW w:w="1179" w:type="dxa"/>
+            <w:vAlign w:val="center"/>
+            <w:hideMark/>
+          </w:tcPr>
+          <w:p>
+            <w:pPr>
+              <w:jc w:val="center"/>
+              <w:cnfStyle w:val="000000100000" w:firstRow="0" w:lastRow="0" w:firstColumn="0" w:lastColumn="0" w:oddVBand="0" w:evenVBand="0" w:oddHBand="1" w:evenHBand="0" w:firstRowFirstColumn="0" w:firstRowLastColumn="0" w:lastRowFirstColumn="0" w:lastRowLastColumn="0"/>
+            </w:pPr>
+            <w:r>
+              <w:t>Yes</w:t>
+            </w:r>
+          </w:p>
+        </w:tc>
+      </w:tr>
+      <w:tr>
+        <w:tc>
+          <w:tcPr>
+            <w:cnfStyle w:val="001000000000" w:firstRow="0" w:lastRow="0" w:firstColumn="1" w:lastColumn="0" w:oddVBand="0" w:evenVBand="0" w:oddHBand="0" w:evenHBand="0" w:firstRowFirstColumn="0" w:firstRowLastColumn="0" w:lastRowFirstColumn="0" w:lastRowLastColumn="0"/>
+            <w:tcW w:w="4315" w:type="dxa"/>
+            <w:vAlign w:val="center"/>
+            <w:hideMark/>
+          </w:tcPr>
+          <w:p>
+            <w:pPr>
+              <w:rPr>
+                <w:b w:val="0"/>
+                <w:bCs w:val="0"/>
+              </w:rPr>
+            </w:pPr>
+            <w:r>
+              <w:rPr>
+                <w:b w:val="0"/>
+                <w:bCs w:val="0"/>
+              </w:rPr>
+              <w:t>/api/v1/employees/{employeeId}</w:t>
+            </w:r>
+          </w:p>
+        </w:tc>
+        <w:tc>
+          <w:tcPr>
+            <w:tcW w:w="1117" w:type="dxa"/>
+            <w:vAlign w:val="center"/>
+            <w:hideMark/>
+          </w:tcPr>
+          <w:p>
+            <w:pPr>
+              <w:jc w:val="center"/>
+              <w:cnfStyle w:val="000000000000" w:firstRow="0" w:lastRow="0" w:firstColumn="0" w:lastColumn="0" w:oddVBand="0" w:evenVBand="0" w:oddHBand="0" w:evenHBand="0" w:firstRowFirstColumn="0" w:firstRowLastColumn="0" w:lastRowFirstColumn="0" w:lastRowLastColumn="0"/>
+            </w:pPr>
+            <w:r>
+              <w:t>PUT</w:t>
+            </w:r>
+          </w:p>
+        </w:tc>
+        <w:tc>
+          <w:tcPr>
+            <w:tcW w:w="2736" w:type="dxa"/>
+            <w:vAlign w:val="center"/>
+            <w:hideMark/>
+          </w:tcPr>
+          <w:p>
+            <w:pPr>
+              <w:cnfStyle w:val="000000000000" w:firstRow="0" w:lastRow="0" w:firstColumn="0" w:lastColumn="0" w:oddVBand="0" w:evenVBand="0" w:oddHBand="0" w:evenHBand="0" w:firstRowFirstColumn="0" w:firstRowLastColumn="0" w:lastRowFirstColumn="0" w:lastRowLastColumn="0"/>
+            </w:pPr>
+            <w:r>
+              <w:t>Update employee information</w:t>
+            </w:r>
+          </w:p>
+        </w:tc>
+        <w:tc>
+          <w:tcPr>
+            <w:tcW w:w="1179" w:type="dxa"/>
+            <w:vAlign w:val="center"/>
+            <w:hideMark/>
+          </w:tcPr>
+          <w:p>
+            <w:pPr>
+              <w:jc w:val="center"/>
+              <w:cnfStyle w:val="000000000000" w:firstRow="0" w:lastRow="0" w:firstColumn="0" w:lastColumn="0" w:oddVBand="0" w:evenVBand="0" w:oddHBand="0" w:evenHBand="0" w:firstRowFirstColumn="0" w:firstRowLastColumn="0" w:lastRowFirstColumn="0" w:lastRowLastColumn="0"/>
+            </w:pPr>
+            <w:r>
+              <w:t>Yes</w:t>
+            </w:r>
+          </w:p>
+        </w:tc>
+      </w:tr>
+      <w:tr>
+        <w:trPr>
+          <w:cnfStyle w:val="000000100000" w:firstRow="0" w:lastRow="0" w:firstColumn="0" w:lastColumn="0" w:oddVBand="0" w:evenVBand="0" w:oddHBand="1" w:evenHBand="0" w:firstRowFirstColumn="0" w:firstRowLastColumn="0" w:lastRowFirstColumn="0" w:lastRowLastColumn="0"/>
+        </w:trPr>
+        <w:tc>
+          <w:tcPr>
+            <w:cnfStyle w:val="001000000000" w:firstRow="0" w:lastRow="0" w:firstColumn="1" w:lastColumn="0" w:oddVBand="0" w:evenVBand="0" w:oddHBand="0" w:evenHBand="0" w:firstRowFirstColumn="0" w:firstRowLastColumn="0" w:lastRowFirstColumn="0" w:lastRowLastColumn="0"/>
+            <w:tcW w:w="4315" w:type="dxa"/>
+            <w:vAlign w:val="center"/>
+            <w:hideMark/>
+          </w:tcPr>
+          <w:p>
+            <w:pPr>
+              <w:rPr>
+                <w:b w:val="0"/>
+                <w:bCs w:val="0"/>
+              </w:rPr>
+            </w:pPr>
+            <w:r>
+              <w:rPr>
+                <w:b w:val="0"/>
+                <w:bCs w:val="0"/>
+              </w:rPr>
+              <w:t>/api/v1/employees/{employeeId}</w:t>
+            </w:r>
+          </w:p>
+        </w:tc>
+        <w:tc>
+          <w:tcPr>
+            <w:tcW w:w="1117" w:type="dxa"/>
+            <w:vAlign w:val="center"/>
+            <w:hideMark/>
+          </w:tcPr>
+          <w:p>
+            <w:pPr>
+              <w:jc w:val="center"/>
+              <w:cnfStyle w:val="000000100000" w:firstRow="0" w:lastRow="0" w:firstColumn="0" w:lastColumn="0" w:oddVBand="0" w:evenVBand="0" w:oddHBand="1" w:evenHBand="0" w:firstRowFirstColumn="0" w:firstRowLastColumn="0" w:lastRowFirstColumn="0" w:lastRowLastColumn="0"/>
+            </w:pPr>
+            <w:r>
+              <w:t>DELETE</w:t>
+            </w:r>
+          </w:p>
+        </w:tc>
+        <w:tc>
+          <w:tcPr>
+            <w:tcW w:w="2736" w:type="dxa"/>
+            <w:vAlign w:val="center"/>
+            <w:hideMark/>
+          </w:tcPr>
+          <w:p>
+            <w:pPr>
+              <w:cnfStyle w:val="000000100000" w:firstRow="0" w:lastRow="0" w:firstColumn="0" w:lastColumn="0" w:oddVBand="0" w:evenVBand="0" w:oddHBand="1" w:evenHBand="0" w:firstRowFirstColumn="0" w:firstRowLastColumn="0" w:lastRowFirstColumn="0" w:lastRowLastColumn="0"/>
+            </w:pPr>
+            <w:r>
+              <w:t>Remove an employee account</w:t>
+            </w:r>
+          </w:p>
+        </w:tc>
+        <w:tc>
+          <w:tcPr>
+            <w:tcW w:w="1179" w:type="dxa"/>
+            <w:vAlign w:val="center"/>
+            <w:hideMark/>
+          </w:tcPr>
+          <w:p>
+            <w:pPr>
+              <w:jc w:val="center"/>
+              <w:cnfStyle w:val="000000100000" w:firstRow="0" w:lastRow="0" w:firstColumn="0" w:lastColumn="0" w:oddVBand="0" w:evenVBand="0" w:oddHBand="1" w:evenHBand="0" w:firstRowFirstColumn="0" w:firstRowLastColumn="0" w:lastRowFirstColumn="0" w:lastRowLastColumn="0"/>
+            </w:pPr>
+            <w:r>
+              <w:t>Yes</w:t>
+            </w:r>
+          </w:p>
+        </w:tc>
+      </w:tr>
+      <w:tr>
+        <w:tc>
+          <w:tcPr>
+            <w:cnfStyle w:val="001000000000" w:firstRow="0" w:lastRow="0" w:firstColumn="1" w:lastColumn="0" w:oddVBand="0" w:evenVBand="0" w:oddHBand="0" w:evenHBand="0" w:firstRowFirstColumn="0" w:firstRowLastColumn="0" w:lastRowFirstColumn="0" w:lastRowLastColumn="0"/>
+            <w:tcW w:w="4315" w:type="dxa"/>
+            <w:vAlign w:val="center"/>
+            <w:hideMark/>
+          </w:tcPr>
+          <w:p>
+            <w:pPr>
+              <w:rPr>
+                <w:b w:val="0"/>
+                <w:bCs w:val="0"/>
+              </w:rPr>
+            </w:pPr>
+            <w:r>
+              <w:rPr>
+                <w:b w:val="0"/>
+                <w:bCs w:val="0"/>
+              </w:rPr>
+              <w:t>/api/v1/employees/{employeeId}/status</w:t>
+            </w:r>
+          </w:p>
+        </w:tc>
+        <w:tc>
+          <w:tcPr>
+            <w:tcW w:w="1117" w:type="dxa"/>
+            <w:vAlign w:val="center"/>
+            <w:hideMark/>
+          </w:tcPr>
+          <w:p>
+            <w:pPr>
+              <w:jc w:val="center"/>
+              <w:cnfStyle w:val="000000000000" w:firstRow="0" w:lastRow="0" w:firstColumn="0" w:lastColumn="0" w:oddVBand="0" w:evenVBand="0" w:oddHBand="0" w:evenHBand="0" w:firstRowFirstColumn="0" w:firstRowLastColumn="0" w:lastRowFirstColumn="0" w:lastRowLastColumn="0"/>
+            </w:pPr>
+            <w:r>
+              <w:t>PATCH</w:t>
+            </w:r>
+          </w:p>
+        </w:tc>
+        <w:tc>
+          <w:tcPr>
+            <w:tcW w:w="2736" w:type="dxa"/>
+            <w:vAlign w:val="center"/>
+            <w:hideMark/>
+          </w:tcPr>
+          <w:p>
+            <w:pPr>
+              <w:cnfStyle w:val="000000000000" w:firstRow="0" w:lastRow="0" w:firstColumn="0" w:lastColumn="0" w:oddVBand="0" w:evenVBand="0" w:oddHBand="0" w:evenHBand="0" w:firstRowFirstColumn="0" w:firstRowLastColumn="0" w:lastRowFirstColumn="0" w:lastRowLastColumn="0"/>
+            </w:pPr>
+            <w:r>
+              <w:t>Activate or deactivate an employee account</w:t>
+            </w:r>
+          </w:p>
+        </w:tc>
+        <w:tc>
+          <w:tcPr>
+            <w:tcW w:w="1179" w:type="dxa"/>
+            <w:vAlign w:val="center"/>
+            <w:hideMark/>
+          </w:tcPr>
+          <w:p>
+            <w:pPr>
+              <w:jc w:val="center"/>
+              <w:cnfStyle w:val="000000000000" w:firstRow="0" w:lastRow="0" w:firstColumn="0" w:lastColumn="0" w:oddVBand="0" w:evenVBand="0" w:oddHBand="0" w:evenHBand="0" w:firstRowFirstColumn="0" w:firstRowLastColumn="0" w:lastRowFirstColumn="0" w:lastRowLastColumn="0"/>
+            </w:pPr>
+            <w:r>
+              <w:t>Yes</w:t>
+            </w:r>
+          </w:p>
+        </w:tc>
+      </w:tr>
+      <w:tr>
+        <w:trPr>
+          <w:cnfStyle w:val="000000100000" w:firstRow="0" w:lastRow="0" w:firstColumn="0" w:lastColumn="0" w:oddVBand="0" w:evenVBand="0" w:oddHBand="1" w:evenHBand="0" w:firstRowFirstColumn="0" w:firstRowLastColumn="0" w:lastRowFirstColumn="0" w:lastRowLastColumn="0"/>
+        </w:trPr>
+        <w:tc>
+          <w:tcPr>
+            <w:cnfStyle w:val="001000000000" w:firstRow="0" w:lastRow="0" w:firstColumn="1" w:lastColumn="0" w:oddVBand="0" w:evenVBand="0" w:oddHBand="0" w:evenHBand="0" w:firstRowFirstColumn="0" w:firstRowLastColumn="0" w:lastRowFirstColumn="0" w:lastRowLastColumn="0"/>
+            <w:tcW w:w="4315" w:type="dxa"/>
+            <w:vAlign w:val="center"/>
+            <w:hideMark/>
+          </w:tcPr>
+          <w:p>
+            <w:pPr>
+              <w:rPr>
+                <w:b w:val="0"/>
+                <w:bCs w:val="0"/>
+              </w:rPr>
+            </w:pPr>
+            <w:r>
+              <w:rPr>
+                <w:b w:val="0"/>
+                <w:bCs w:val="0"/>
+              </w:rPr>
+              <w:t>/api/v1/employees/{employeeId}/role</w:t>
+            </w:r>
+          </w:p>
+        </w:tc>
+        <w:tc>
+          <w:tcPr>
+            <w:tcW w:w="1117" w:type="dxa"/>
+            <w:vAlign w:val="center"/>
+            <w:hideMark/>
+          </w:tcPr>
+          <w:p>
+            <w:pPr>
+              <w:jc w:val="center"/>
+              <w:cnfStyle w:val="000000100000" w:firstRow="0" w:lastRow="0" w:firstColumn="0" w:lastColumn="0" w:oddVBand="0" w:evenVBand="0" w:oddHBand="1" w:evenHBand="0" w:firstRowFirstColumn="0" w:firstRowLastColumn="0" w:lastRowFirstColumn="0" w:lastRowLastColumn="0"/>
+            </w:pPr>
+            <w:r>
+              <w:t>PATCH</w:t>
+            </w:r>
+          </w:p>
+        </w:tc>
+        <w:tc>
+          <w:tcPr>
+            <w:tcW w:w="2736" w:type="dxa"/>
+            <w:vAlign w:val="center"/>
+            <w:hideMark/>
+          </w:tcPr>
+          <w:p>
+            <w:pPr>
+              <w:cnfStyle w:val="000000100000" w:firstRow="0" w:lastRow="0" w:firstColumn="0" w:lastColumn="0" w:oddVBand="0" w:evenVBand="0" w:oddHBand="1" w:evenHBand="0" w:firstRowFirstColumn="0" w:firstRowLastColumn="0" w:lastRowFirstColumn="0" w:lastRowLastColumn="0"/>
+            </w:pPr>
+            <w:r>
+              <w:t>Update employee role and permissions</w:t>
+            </w:r>
+          </w:p>
+        </w:tc>
+        <w:tc>
+          <w:tcPr>
+            <w:tcW w:w="1179" w:type="dxa"/>
+            <w:vAlign w:val="center"/>
+            <w:hideMark/>
+          </w:tcPr>
+          <w:p>
+            <w:pPr>
+              <w:jc w:val="center"/>
+              <w:cnfStyle w:val="000000100000" w:firstRow="0" w:lastRow="0" w:firstColumn="0" w:lastColumn="0" w:oddVBand="0" w:evenVBand="0" w:oddHBand="1" w:evenHBand="0" w:firstRowFirstColumn="0" w:firstRowLastColumn="0" w:lastRowFirstColumn="0" w:lastRowLastColumn="0"/>
+            </w:pPr>
+            <w:r>
+              <w:t>Yes</w:t>
+            </w:r>
+          </w:p>
+        </w:tc>
+      </w:tr>
+      <w:tr>
+        <w:tc>
+          <w:tcPr>
+            <w:cnfStyle w:val="001000000000" w:firstRow="0" w:lastRow="0" w:firstColumn="1" w:lastColumn="0" w:oddVBand="0" w:evenVBand="0" w:oddHBand="0" w:evenHBand="0" w:firstRowFirstColumn="0" w:firstRowLastColumn="0" w:lastRowFirstColumn="0" w:lastRowLastColumn="0"/>
+            <w:tcW w:w="4315" w:type="dxa"/>
+            <w:vAlign w:val="center"/>
+            <w:hideMark/>
+          </w:tcPr>
+          <w:p>
+            <w:pPr>
+              <w:rPr>
+                <w:b w:val="0"/>
+                <w:bCs w:val="0"/>
+              </w:rPr>
+            </w:pPr>
+            <w:r>
+              <w:rPr>
+                <w:b w:val="0"/>
+                <w:bCs w:val="0"/>
+              </w:rPr>
+              <w:t>/api/v1/employees/{employeeId}/reset-password</w:t>
+            </w:r>
+          </w:p>
+        </w:tc>
+        <w:tc>
+          <w:tcPr>
+            <w:tcW w:w="1117" w:type="dxa"/>
+            <w:vAlign w:val="center"/>
+            <w:hideMark/>
+          </w:tcPr>
+          <w:p>
+            <w:pPr>
+              <w:jc w:val="center"/>
+              <w:cnfStyle w:val="000000000000" w:firstRow="0" w:lastRow="0" w:firstColumn="0" w:lastColumn="0" w:oddVBand="0" w:evenVBand="0" w:oddHBand="0" w:evenHBand="0" w:firstRowFirstColumn="0" w:firstRowLastColumn="0" w:lastRowFirstColumn="0" w:lastRowLastColumn="0"/>
+            </w:pPr>
+            <w:r>
+              <w:t>POST</w:t>
+            </w:r>
+          </w:p>
+        </w:tc>
+        <w:tc>
+          <w:tcPr>
+            <w:tcW w:w="2736" w:type="dxa"/>
+            <w:vAlign w:val="center"/>
+            <w:hideMark/>
+          </w:tcPr>
+          <w:p>
+            <w:pPr>
+              <w:cnfStyle w:val="000000000000" w:firstRow="0" w:lastRow="0" w:firstColumn="0" w:lastColumn="0" w:oddVBand="0" w:evenVBand="0" w:oddHBand="0" w:evenHBand="0" w:firstRowFirstColumn="0" w:firstRowLastColumn="0" w:lastRowFirstColumn="0" w:lastRowLastColumn="0"/>
+            </w:pPr>
+            <w:r>
+              <w:t>Reset employee password</w:t>
+            </w:r>
+          </w:p>
+        </w:tc>
+        <w:tc>
+          <w:tcPr>
+            <w:tcW w:w="1179" w:type="dxa"/>
+            <w:vAlign w:val="center"/>
+            <w:hideMark/>
+          </w:tcPr>
+          <w:p>
+            <w:pPr>
+              <w:jc w:val="center"/>
+              <w:cnfStyle w:val="000000000000" w:firstRow="0" w:lastRow="0" w:firstColumn="0" w:lastColumn="0" w:oddVBand="0" w:evenVBand="0" w:oddHBand="0" w:evenHBand="0" w:firstRowFirstColumn="0" w:firstRowLastColumn="0" w:lastRowFirstColumn="0" w:lastRowLastColumn="0"/>
+            </w:pPr>
+            <w:r>
+              <w:t>Yes</w:t>
+            </w:r>
+          </w:p>
+        </w:tc>
+      </w:tr>
+      <w:tr>
+        <w:trPr>
+          <w:cnfStyle w:val="000000100000" w:firstRow="0" w:lastRow="0" w:firstColumn="0" w:lastColumn="0" w:oddVBand="0" w:evenVBand="0" w:oddHBand="1" w:evenHBand="0" w:firstRowFirstColumn="0" w:firstRowLastColumn="0" w:lastRowFirstColumn="0" w:lastRowLastColumn="0"/>
+        </w:trPr>
+        <w:tc>
+          <w:tcPr>
+            <w:cnfStyle w:val="001000000000" w:firstRow="0" w:lastRow="0" w:firstColumn="1" w:lastColumn="0" w:oddVBand="0" w:evenVBand="0" w:oddHBand="0" w:evenHBand="0" w:firstRowFirstColumn="0" w:firstRowLastColumn="0" w:lastRowFirstColumn="0" w:lastRowLastColumn="0"/>
+            <w:tcW w:w="4315" w:type="dxa"/>
+            <w:vAlign w:val="center"/>
+            <w:hideMark/>
+          </w:tcPr>
+          <w:p>
+            <w:pPr>
+              <w:rPr>
+                <w:b w:val="0"/>
+                <w:bCs w:val="0"/>
+              </w:rPr>
+            </w:pPr>
+            <w:r>
+              <w:rPr>
+                <w:b w:val="0"/>
+                <w:bCs w:val="0"/>
+              </w:rPr>
+              <w:t>/api/v1/employees/roles</w:t>
+            </w:r>
+          </w:p>
+        </w:tc>
+        <w:tc>
+          <w:tcPr>
+            <w:tcW w:w="1117" w:type="dxa"/>
+            <w:vAlign w:val="center"/>
+            <w:hideMark/>
+          </w:tcPr>
+          <w:p>
+            <w:pPr>
+              <w:jc w:val="center"/>
+              <w:cnfStyle w:val="000000100000" w:firstRow="0" w:lastRow="0" w:firstColumn="0" w:lastColumn="0" w:oddVBand="0" w:evenVBand="0" w:oddHBand="1" w:evenHBand="0" w:firstRowFirstColumn="0" w:firstRowLastColumn="0" w:lastRowFirstColumn="0" w:lastRowLastColumn="0"/>
+            </w:pPr>
+            <w:r>
+              <w:t>GET</w:t>
+            </w:r>
+          </w:p>
+        </w:tc>
+        <w:tc>
+          <w:tcPr>
+            <w:tcW w:w="2736" w:type="dxa"/>
+            <w:vAlign w:val="center"/>
+            <w:hideMark/>
+          </w:tcPr>
+          <w:p>
+            <w:pPr>
+              <w:cnfStyle w:val="000000100000" w:firstRow="0" w:lastRow="0" w:firstColumn="0" w:lastColumn="0" w:oddVBand="0" w:evenVBand="0" w:oddHBand="1" w:evenHBand="0" w:firstRowFirstColumn="0" w:firstRowLastColumn="0" w:lastRowFirstColumn="0" w:lastRowLastColumn="0"/>
+            </w:pPr>
+            <w:r>
+              <w:t>Retrieve available employee roles</w:t>
+            </w:r>
+          </w:p>
+        </w:tc>
+        <w:tc>
+          <w:tcPr>
+            <w:tcW w:w="1179" w:type="dxa"/>
+            <w:vAlign w:val="center"/>
+            <w:hideMark/>
+          </w:tcPr>
+          <w:p>
+            <w:pPr>
+              <w:jc w:val="center"/>
+              <w:cnfStyle w:val="000000100000" w:firstRow="0" w:lastRow="0" w:firstColumn="0" w:lastColumn="0" w:oddVBand="0" w:evenVBand="0" w:oddHBand="1" w:evenHBand="0" w:firstRowFirstColumn="0" w:firstRowLastColumn="0" w:lastRowFirstColumn="0" w:lastRowLastColumn="0"/>
+            </w:pPr>
+            <w:r>
+              <w:t>Yes</w:t>
+            </w:r>
+          </w:p>
+        </w:tc>
+      </w:tr>
+    </w:tbl>
+    <w:p/>
+    <w:p>
+      <w:pPr>
         <w:spacing w:line="278" w:lineRule="auto"/>
       </w:pPr>
       <w:r>
         <w:br w:type="page"/>
       </w:r>
     </w:p>
+    <w:p>
+      <w:pPr>
+        <w:pStyle w:val="Title"/>
+      </w:pPr>
+      <w:r>
+        <w:lastRenderedPageBreak/>
+        <w:t>API Design Considerations</w:t>
+      </w:r>
+    </w:p>
+    <w:p>
+      <w:r>
+        <w:t>The Employee Management APIs have been designed on the basis of the following design considerations:</w:t>
+      </w:r>
+    </w:p>
+    <w:p>
+      <w:pPr>
+        <w:pStyle w:val="ListParagraph"/>
+        <w:numPr>
+          <w:ilvl w:val="0"/>
+          <w:numId w:val="158"/>
+        </w:numPr>
+      </w:pPr>
+      <w:r>
+        <w:t>Ownership of Agencies: Agencies may manage only those employees which belong to their organizations.</w:t>
+      </w:r>
+    </w:p>
+    <w:p>
+      <w:pPr>
+        <w:pStyle w:val="ListParagraph"/>
+        <w:numPr>
+          <w:ilvl w:val="0"/>
+          <w:numId w:val="158"/>
+        </w:numPr>
+      </w:pPr>
+      <w:r>
+        <w:t>REST Resources Representation: Employee resources will be modeled in terms of REST resources which will have unique resource identifiers.</w:t>
+      </w:r>
+    </w:p>
+    <w:p>
+      <w:pPr>
+        <w:pStyle w:val="ListParagraph"/>
+        <w:numPr>
+          <w:ilvl w:val="0"/>
+          <w:numId w:val="158"/>
+        </w:numPr>
+      </w:pPr>
+      <w:r>
+        <w:t>JWT Authentication: All operations related to the management of employee resources require valid access token.</w:t>
+      </w:r>
+    </w:p>
+    <w:p>
+      <w:pPr>
+        <w:pStyle w:val="ListParagraph"/>
+        <w:numPr>
+          <w:ilvl w:val="0"/>
+          <w:numId w:val="158"/>
+        </w:numPr>
+      </w:pPr>
+      <w:r>
+        <w:t>Authorization Based on Role: Management of employee accounts may be done only by agency administrators and managers authorized for that.</w:t>
+      </w:r>
+    </w:p>
+    <w:p>
+      <w:pPr>
+        <w:pStyle w:val="ListParagraph"/>
+        <w:numPr>
+          <w:ilvl w:val="0"/>
+          <w:numId w:val="158"/>
+        </w:numPr>
+      </w:pPr>
+      <w:r>
+        <w:t>Permission Management: Permission to access operational resources such as fleet, reservation and branches, etc. will depend upon roles of employee.</w:t>
+      </w:r>
+    </w:p>
+    <w:p>
+      <w:pPr>
+        <w:pStyle w:val="ListParagraph"/>
+        <w:numPr>
+          <w:ilvl w:val="0"/>
+          <w:numId w:val="158"/>
+        </w:numPr>
+      </w:pPr>
+      <w:r>
+        <w:t>Account Management: Password management and account activation is taken care by the Authentication Service.</w:t>
+      </w:r>
+    </w:p>
+    <w:p>
+      <w:pPr>
+        <w:pStyle w:val="ListParagraph"/>
+        <w:numPr>
+          <w:ilvl w:val="0"/>
+          <w:numId w:val="158"/>
+        </w:numPr>
+      </w:pPr>
+      <w:r>
+        <w:t>Data Validation: Information about the employee and his/her assigned roles are validated before persisting the data.</w:t>
+      </w:r>
+    </w:p>
+    <w:p>
+      <w:pPr>
+        <w:pStyle w:val="ListParagraph"/>
+        <w:numPr>
+          <w:ilvl w:val="0"/>
+          <w:numId w:val="158"/>
+        </w:numPr>
+      </w:pPr>
+      <w:r>
+        <w:t>Audit: All changes made to employee accounts are being logged.</w:t>
+      </w:r>
+    </w:p>
+    <w:p>
+      <w:pPr>
+        <w:pStyle w:val="Title"/>
+      </w:pPr>
+      <w:r>
+        <w:t>Employee Management Workflow</w:t>
+      </w:r>
+    </w:p>
+    <w:p>
+      <w:pPr>
+        <w:pStyle w:val="ListParagraph"/>
+        <w:numPr>
+          <w:ilvl w:val="0"/>
+          <w:numId w:val="159"/>
+        </w:numPr>
+      </w:pPr>
+      <w:r>
+        <w:t>The employee management process consists of the following operations:</w:t>
+      </w:r>
+    </w:p>
+    <w:p>
+      <w:pPr>
+        <w:pStyle w:val="ListParagraph"/>
+        <w:numPr>
+          <w:ilvl w:val="0"/>
+          <w:numId w:val="159"/>
+        </w:numPr>
+      </w:pPr>
+      <w:r>
+        <w:t>Authentication service logs in an agency administrator through Employee Management module.</w:t>
+      </w:r>
+    </w:p>
+    <w:p>
+      <w:pPr>
+        <w:pStyle w:val="ListParagraph"/>
+        <w:numPr>
+          <w:ilvl w:val="0"/>
+          <w:numId w:val="159"/>
+        </w:numPr>
+      </w:pPr>
+      <w:r>
+        <w:t>The administrator creates new employee account or updates information of existing employee.</w:t>
+      </w:r>
+    </w:p>
+    <w:p>
+      <w:pPr>
+        <w:pStyle w:val="ListParagraph"/>
+        <w:numPr>
+          <w:ilvl w:val="0"/>
+          <w:numId w:val="159"/>
+        </w:numPr>
+      </w:pPr>
+      <w:r>
+        <w:t>The Employee Management Service validates the data submitted about the employee.</w:t>
+      </w:r>
+    </w:p>
+    <w:p>
+      <w:pPr>
+        <w:pStyle w:val="ListParagraph"/>
+        <w:numPr>
+          <w:ilvl w:val="0"/>
+          <w:numId w:val="159"/>
+        </w:numPr>
+      </w:pPr>
+      <w:r>
+        <w:t>Organizational role and permissions are assigned to the employee.</w:t>
+      </w:r>
+    </w:p>
+    <w:p>
+      <w:pPr>
+        <w:pStyle w:val="ListParagraph"/>
+        <w:numPr>
+          <w:ilvl w:val="0"/>
+          <w:numId w:val="159"/>
+        </w:numPr>
+      </w:pPr>
+      <w:r>
+        <w:t>Authentication Service creates or updates authentication credentials of the employee.</w:t>
+      </w:r>
+    </w:p>
+    <w:p>
+      <w:pPr>
+        <w:pStyle w:val="ListParagraph"/>
+        <w:numPr>
+          <w:ilvl w:val="0"/>
+          <w:numId w:val="159"/>
+        </w:numPr>
+      </w:pPr>
+      <w:r>
+        <w:t>The employee account is activated and assigned agency and branch information.</w:t>
+      </w:r>
+    </w:p>
+    <w:p>
+      <w:pPr>
+        <w:pStyle w:val="ListParagraph"/>
+        <w:numPr>
+          <w:ilvl w:val="0"/>
+          <w:numId w:val="159"/>
+        </w:numPr>
+      </w:pPr>
+      <w:r>
+        <w:rPr>
+          <w:noProof/>
+        </w:rPr>
+        <mc:AlternateContent>
+          <mc:Choice Requires="wps">
+            <w:drawing>
+              <wp:anchor distT="0" distB="0" distL="114300" distR="114300" simplePos="0" relativeHeight="251672576" behindDoc="0" locked="0" layoutInCell="1" allowOverlap="1" wp14:anchorId="257C4F79" wp14:editId="28085DDD">
+                <wp:simplePos x="0" y="0"/>
+                <wp:positionH relativeFrom="column">
+                  <wp:posOffset>86995</wp:posOffset>
+                </wp:positionH>
+                <wp:positionV relativeFrom="paragraph">
+                  <wp:posOffset>2053590</wp:posOffset>
+                </wp:positionV>
+                <wp:extent cx="5706110" cy="635"/>
+                <wp:effectExtent l="0" t="0" r="0" b="0"/>
+                <wp:wrapSquare wrapText="bothSides"/>
+                <wp:docPr id="262208015" name="Text Box 1"/>
+                <wp:cNvGraphicFramePr/>
+                <a:graphic xmlns:a="http://schemas.openxmlformats.org/drawingml/2006/main">
+                  <a:graphicData uri="http://schemas.microsoft.com/office/word/2010/wordprocessingShape">
+                    <wps:wsp>
+                      <wps:cNvSpPr txBox="1"/>
+                      <wps:spPr>
+                        <a:xfrm>
+                          <a:off x="0" y="0"/>
+                          <a:ext cx="5706110" cy="635"/>
+                        </a:xfrm>
+                        <a:prstGeom prst="rect">
+                          <a:avLst/>
+                        </a:prstGeom>
+                        <a:solidFill>
+                          <a:prstClr val="white"/>
+                        </a:solidFill>
+                        <a:ln>
+                          <a:noFill/>
+                        </a:ln>
+                      </wps:spPr>
+                      <wps:txbx>
+                        <w:txbxContent>
+                          <w:p>
+                            <w:pPr>
+                              <w:pStyle w:val="Caption"/>
+                              <w:jc w:val="center"/>
+                            </w:pPr>
+                            <w:r>
+                              <w:t xml:space="preserve">Figure </w:t>
+                            </w:r>
+                            <w:r>
+                              <w:fldChar w:fldCharType="begin"/>
+                            </w:r>
+                            <w:r>
+                              <w:instrText xml:space="preserve"> SEQ Figure \* ARABIC </w:instrText>
+                            </w:r>
+                            <w:r>
+                              <w:fldChar w:fldCharType="separate"/>
+                            </w:r>
+                            <w:r>
+                              <w:rPr>
+                                <w:noProof/>
+                              </w:rPr>
+                              <w:t>5</w:t>
+                            </w:r>
+                            <w:r>
+                              <w:fldChar w:fldCharType="end"/>
+                            </w:r>
+                            <w:r>
+                              <w:t xml:space="preserve"> - Employees Management Workflow</w:t>
+                            </w:r>
+                          </w:p>
+                        </w:txbxContent>
+                      </wps:txbx>
+                      <wps:bodyPr rot="0" spcFirstLastPara="0" vertOverflow="overflow" horzOverflow="overflow" vert="horz" wrap="square" lIns="0" tIns="0" rIns="0" bIns="0" numCol="1" spcCol="0" rtlCol="0" fromWordArt="0" anchor="t" anchorCtr="0" forceAA="0" compatLnSpc="1">
+                        <a:prstTxWarp prst="textNoShape">
+                          <a:avLst/>
+                        </a:prstTxWarp>
+                        <a:spAutoFit/>
+                      </wps:bodyPr>
+                    </wps:wsp>
+                  </a:graphicData>
+                </a:graphic>
+              </wp:anchor>
+            </w:drawing>
+          </mc:Choice>
+          <mc:Fallback>
+            <w:pict>
+              <v:shape w14:anchorId="257C4F79" id="_x0000_s1030" type="#_x0000_t202" style="position:absolute;left:0;text-align:left;margin-left:6.85pt;margin-top:161.7pt;width:449.3pt;height:.05pt;z-index:251672576;visibility:visible;mso-wrap-style:square;mso-wrap-distance-left:9pt;mso-wrap-distance-top:0;mso-wrap-distance-right:9pt;mso-wrap-distance-bottom:0;mso-position-horizontal:absolute;mso-position-horizontal-relative:text;mso-position-vertical:absolute;mso-position-vertical-relative:text;v-text-anchor:top" o:gfxdata="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" stroked="f">
+                <v:textbox style="mso-fit-shape-to-text:t" inset="0,0,0,0">
+                  <w:txbxContent>
+                    <w:p>
+                      <w:pPr>
+                        <w:pStyle w:val="Caption"/>
+                        <w:jc w:val="center"/>
+                      </w:pPr>
+                      <w:r>
+                        <w:t xml:space="preserve">Figure </w:t>
+                      </w:r>
+                      <w:r>
+                        <w:fldChar w:fldCharType="begin"/>
+                      </w:r>
+                      <w:r>
+                        <w:instrText xml:space="preserve"> SEQ Figure \* ARABIC </w:instrText>
+                      </w:r>
+                      <w:r>
+                        <w:fldChar w:fldCharType="separate"/>
+                      </w:r>
+                      <w:r>
+                        <w:rPr>
+                          <w:noProof/>
+                        </w:rPr>
+                        <w:t>5</w:t>
+                      </w:r>
+                      <w:r>
+                        <w:fldChar w:fldCharType="end"/>
+                      </w:r>
+                      <w:r>
+                        <w:t xml:space="preserve"> - Employees Management Workflow</w:t>
+                      </w:r>
+                    </w:p>
+                  </w:txbxContent>
+                </v:textbox>
+                <w10:wrap type="square"/>
+              </v:shape>
+            </w:pict>
+          </mc:Fallback>
+        </mc:AlternateContent>
+      </w:r>
+      <w:r>
+        <w:drawing>
+          <wp:anchor distT="0" distB="0" distL="114300" distR="114300" simplePos="0" relativeHeight="251670528" behindDoc="0" locked="0" layoutInCell="1" allowOverlap="1" wp14:anchorId="01AFFDAA" wp14:editId="2719C845">
+            <wp:simplePos x="0" y="0"/>
+            <wp:positionH relativeFrom="column">
+              <wp:posOffset>86995</wp:posOffset>
+            </wp:positionH>
+            <wp:positionV relativeFrom="paragraph">
+              <wp:posOffset>605790</wp:posOffset>
+            </wp:positionV>
+            <wp:extent cx="5706271" cy="1390844"/>
+            <wp:effectExtent l="0" t="0" r="8890" b="0"/>
+            <wp:wrapSquare wrapText="bothSides"/>
+            <wp:docPr id="126303863" name="Picture 1"/>
+            <wp:cNvGraphicFramePr>
+              <a:graphicFrameLocks xmlns:a="http://schemas.openxmlformats.org/drawingml/2006/main" noChangeAspect="1"/>
+            </wp:cNvGraphicFramePr>
+            <a:graphic xmlns:a="http://schemas.openxmlformats.org/drawingml/2006/main">
+              <a:graphicData uri="http://schemas.openxmlformats.org/drawingml/2006/picture">
+                <pic:pic xmlns:pic="http://schemas.openxmlformats.org/drawingml/2006/picture">
+                  <pic:nvPicPr>
+                    <pic:cNvPr id="126303863" name=""/>
+                    <pic:cNvPicPr/>
+                  </pic:nvPicPr>
+                  <pic:blipFill>
+                    <a:blip r:embed="rId12">
+                      <a:extLst>
+                        <a:ext uri="{28A0092B-C50C-407E-A947-70E740481C1C}">
+                          <a14:useLocalDpi xmlns:a14="http://schemas.microsoft.com/office/drawing/2010/main" val="0"/>
+                        </a:ext>
+                      </a:extLst>
+                    </a:blip>
+                    <a:stretch>
+                      <a:fillRect/>
+                    </a:stretch>
+                  </pic:blipFill>
+                  <pic:spPr>
+                    <a:xfrm>
+                      <a:off x="0" y="0"/>
+                      <a:ext cx="5706271" cy="1390844"/>
+                    </a:xfrm>
+                    <a:prstGeom prst="rect">
+                      <a:avLst/>
+                    </a:prstGeom>
+                  </pic:spPr>
+                </pic:pic>
+              </a:graphicData>
+            </a:graphic>
+          </wp:anchor>
+        </w:drawing>
+      </w:r>
+      <w:r>
+        <w:t>Employee can access only those resources whose permission he/she has got because of their role.</w:t>
+      </w:r>
+    </w:p>
+    <w:p>
+      <w:pPr>
+        <w:spacing w:line="278" w:lineRule="auto"/>
+      </w:pPr>
+      <w:r>
+        <w:br w:type="page"/>
+      </w:r>
+    </w:p>
+    <w:p/>
     <w:sectPr>
-      <w:headerReference w:type="default" r:id="rId12"/>
-      <w:footerReference w:type="default" r:id="rId13"/>
+      <w:headerReference w:type="default" r:id="rId13"/>
+      <w:footerReference w:type="default" r:id="rId14"/>
       <w:pgSz w:w="11906" w:h="16838" w:code="9"/>
       <w:pgMar w:top="1411" w:right="850" w:bottom="1411" w:left="1699" w:header="720" w:footer="288" w:gutter="0"/>
       <w:pgNumType w:start="1"/>
@@ -16227,6 +17443,92 @@
     </w:lvl>
   </w:abstractNum>
   <w:abstractNum w:abstractNumId="60" w15:restartNumberingAfterBreak="0">
+    <w:nsid w:val="303363CB"/>
+    <w:multiLevelType w:val="hybridMultilevel"/>
+    <w:tmpl w:val="61682AE0"/>
+    <w:lvl w:ilvl="0" w:tplc="0409000F">
+      <w:start w:val="1"/>
+      <w:numFmt w:val="decimal"/>
+      <w:lvlText w:val="%1."/>
+      <w:lvlJc w:val="left"/>
+      <w:pPr>
+        <w:ind w:left="720" w:hanging="360"/>
+      </w:pPr>
+    </w:lvl>
+    <w:lvl w:ilvl="1" w:tplc="04090019" w:tentative="1">
+      <w:start w:val="1"/>
+      <w:numFmt w:val="lowerLetter"/>
+      <w:lvlText w:val="%2."/>
+      <w:lvlJc w:val="left"/>
+      <w:pPr>
+        <w:ind w:left="1440" w:hanging="360"/>
+      </w:pPr>
+    </w:lvl>
+    <w:lvl w:ilvl="2" w:tplc="0409001B" w:tentative="1">
+      <w:start w:val="1"/>
+      <w:numFmt w:val="lowerRoman"/>
+      <w:lvlText w:val="%3."/>
+      <w:lvlJc w:val="right"/>
+      <w:pPr>
+        <w:ind w:left="2160" w:hanging="180"/>
+      </w:pPr>
+    </w:lvl>
+    <w:lvl w:ilvl="3" w:tplc="0409000F" w:tentative="1">
+      <w:start w:val="1"/>
+      <w:numFmt w:val="decimal"/>
+      <w:lvlText w:val="%4."/>
+      <w:lvlJc w:val="left"/>
+      <w:pPr>
+        <w:ind w:left="2880" w:hanging="360"/>
+      </w:pPr>
+    </w:lvl>
+    <w:lvl w:ilvl="4" w:tplc="04090019" w:tentative="1">
+      <w:start w:val="1"/>
+      <w:numFmt w:val="lowerLetter"/>
+      <w:lvlText w:val="%5."/>
+      <w:lvlJc w:val="left"/>
+      <w:pPr>
+        <w:ind w:left="3600" w:hanging="360"/>
+      </w:pPr>
+    </w:lvl>
+    <w:lvl w:ilvl="5" w:tplc="0409001B" w:tentative="1">
+      <w:start w:val="1"/>
+      <w:numFmt w:val="lowerRoman"/>
+      <w:lvlText w:val="%6."/>
+      <w:lvlJc w:val="right"/>
+      <w:pPr>
+        <w:ind w:left="4320" w:hanging="180"/>
+      </w:pPr>
+    </w:lvl>
+    <w:lvl w:ilvl="6" w:tplc="0409000F" w:tentative="1">
+      <w:start w:val="1"/>
+      <w:numFmt w:val="decimal"/>
+      <w:lvlText w:val="%7."/>
+      <w:lvlJc w:val="left"/>
+      <w:pPr>
+        <w:ind w:left="5040" w:hanging="360"/>
+      </w:pPr>
+    </w:lvl>
+    <w:lvl w:ilvl="7" w:tplc="04090019" w:tentative="1">
+      <w:start w:val="1"/>
+      <w:numFmt w:val="lowerLetter"/>
+      <w:lvlText w:val="%8."/>
+      <w:lvlJc w:val="left"/>
+      <w:pPr>
+        <w:ind w:left="5760" w:hanging="360"/>
+      </w:pPr>
+    </w:lvl>
+    <w:lvl w:ilvl="8" w:tplc="0409001B" w:tentative="1">
+      <w:start w:val="1"/>
+      <w:numFmt w:val="lowerRoman"/>
+      <w:lvlText w:val="%9."/>
+      <w:lvlJc w:val="right"/>
+      <w:pPr>
+        <w:ind w:left="6480" w:hanging="180"/>
+      </w:pPr>
+    </w:lvl>
+  </w:abstractNum>
+  <w:abstractNum w:abstractNumId="61" w15:restartNumberingAfterBreak="0">
     <w:nsid w:val="30CD5DF3"/>
     <w:multiLevelType w:val="hybridMultilevel"/>
     <w:tmpl w:val="127EBD02"/>
@@ -16338,7 +17640,7 @@
       </w:rPr>
     </w:lvl>
   </w:abstractNum>
-  <w:abstractNum w:abstractNumId="61" w15:restartNumberingAfterBreak="0">
+  <w:abstractNum w:abstractNumId="62" w15:restartNumberingAfterBreak="0">
     <w:nsid w:val="31A24DDF"/>
     <w:multiLevelType w:val="multilevel"/>
     <w:tmpl w:val="63F4E6F0"/>
@@ -16487,7 +17789,7 @@
       </w:rPr>
     </w:lvl>
   </w:abstractNum>
-  <w:abstractNum w:abstractNumId="62" w15:restartNumberingAfterBreak="0">
+  <w:abstractNum w:abstractNumId="63" w15:restartNumberingAfterBreak="0">
     <w:nsid w:val="321E65E6"/>
     <w:multiLevelType w:val="multilevel"/>
     <w:tmpl w:val="63F4E6F0"/>
@@ -16636,7 +17938,7 @@
       </w:rPr>
     </w:lvl>
   </w:abstractNum>
-  <w:abstractNum w:abstractNumId="63" w15:restartNumberingAfterBreak="0">
+  <w:abstractNum w:abstractNumId="64" w15:restartNumberingAfterBreak="0">
     <w:nsid w:val="332E29E8"/>
     <w:multiLevelType w:val="multilevel"/>
     <w:tmpl w:val="BF082128"/>
@@ -16785,7 +18087,7 @@
       </w:rPr>
     </w:lvl>
   </w:abstractNum>
-  <w:abstractNum w:abstractNumId="64" w15:restartNumberingAfterBreak="0">
+  <w:abstractNum w:abstractNumId="65" w15:restartNumberingAfterBreak="0">
     <w:nsid w:val="34251C5D"/>
     <w:multiLevelType w:val="multilevel"/>
     <w:tmpl w:val="C31CBCE0"/>
@@ -16934,7 +18236,7 @@
       </w:rPr>
     </w:lvl>
   </w:abstractNum>
-  <w:abstractNum w:abstractNumId="65" w15:restartNumberingAfterBreak="0">
+  <w:abstractNum w:abstractNumId="66" w15:restartNumberingAfterBreak="0">
     <w:nsid w:val="342A6150"/>
     <w:multiLevelType w:val="multilevel"/>
     <w:tmpl w:val="29E0BE1C"/>
@@ -17083,7 +18385,7 @@
       </w:rPr>
     </w:lvl>
   </w:abstractNum>
-  <w:abstractNum w:abstractNumId="66" w15:restartNumberingAfterBreak="0">
+  <w:abstractNum w:abstractNumId="67" w15:restartNumberingAfterBreak="0">
     <w:nsid w:val="356F220A"/>
     <w:multiLevelType w:val="multilevel"/>
     <w:tmpl w:val="0FFA5254"/>
@@ -17232,7 +18534,7 @@
       </w:rPr>
     </w:lvl>
   </w:abstractNum>
-  <w:abstractNum w:abstractNumId="67" w15:restartNumberingAfterBreak="0">
+  <w:abstractNum w:abstractNumId="68" w15:restartNumberingAfterBreak="0">
     <w:nsid w:val="357B7363"/>
     <w:multiLevelType w:val="hybridMultilevel"/>
     <w:tmpl w:val="00D411EC"/>
@@ -17344,7 +18646,7 @@
       </w:rPr>
     </w:lvl>
   </w:abstractNum>
-  <w:abstractNum w:abstractNumId="68" w15:restartNumberingAfterBreak="0">
+  <w:abstractNum w:abstractNumId="69" w15:restartNumberingAfterBreak="0">
     <w:nsid w:val="3583100F"/>
     <w:multiLevelType w:val="hybridMultilevel"/>
     <w:tmpl w:val="848ECFAA"/>
@@ -17457,7 +18759,7 @@
       </w:rPr>
     </w:lvl>
   </w:abstractNum>
-  <w:abstractNum w:abstractNumId="69" w15:restartNumberingAfterBreak="0">
+  <w:abstractNum w:abstractNumId="70" w15:restartNumberingAfterBreak="0">
     <w:nsid w:val="3623194A"/>
     <w:multiLevelType w:val="multilevel"/>
     <w:tmpl w:val="63F4E6F0"/>
@@ -17606,7 +18908,7 @@
       </w:rPr>
     </w:lvl>
   </w:abstractNum>
-  <w:abstractNum w:abstractNumId="70" w15:restartNumberingAfterBreak="0">
+  <w:abstractNum w:abstractNumId="71" w15:restartNumberingAfterBreak="0">
     <w:nsid w:val="36AD3FB0"/>
     <w:multiLevelType w:val="multilevel"/>
     <w:tmpl w:val="0644AEEA"/>
@@ -17755,7 +19057,7 @@
       </w:rPr>
     </w:lvl>
   </w:abstractNum>
-  <w:abstractNum w:abstractNumId="71" w15:restartNumberingAfterBreak="0">
+  <w:abstractNum w:abstractNumId="72" w15:restartNumberingAfterBreak="0">
     <w:nsid w:val="371A2CDE"/>
     <w:multiLevelType w:val="hybridMultilevel"/>
     <w:tmpl w:val="EA9C00CC"/>
@@ -17867,7 +19169,7 @@
       </w:rPr>
     </w:lvl>
   </w:abstractNum>
-  <w:abstractNum w:abstractNumId="72" w15:restartNumberingAfterBreak="0">
+  <w:abstractNum w:abstractNumId="73" w15:restartNumberingAfterBreak="0">
     <w:nsid w:val="373D5E48"/>
     <w:multiLevelType w:val="hybridMultilevel"/>
     <w:tmpl w:val="8A6E38C0"/>
@@ -17980,7 +19282,7 @@
       </w:rPr>
     </w:lvl>
   </w:abstractNum>
-  <w:abstractNum w:abstractNumId="73" w15:restartNumberingAfterBreak="0">
+  <w:abstractNum w:abstractNumId="74" w15:restartNumberingAfterBreak="0">
     <w:nsid w:val="3B446B2D"/>
     <w:multiLevelType w:val="hybridMultilevel"/>
     <w:tmpl w:val="B638176E"/>
@@ -18092,7 +19394,7 @@
       </w:rPr>
     </w:lvl>
   </w:abstractNum>
-  <w:abstractNum w:abstractNumId="74" w15:restartNumberingAfterBreak="0">
+  <w:abstractNum w:abstractNumId="75" w15:restartNumberingAfterBreak="0">
     <w:nsid w:val="3B6B41F5"/>
     <w:multiLevelType w:val="hybridMultilevel"/>
     <w:tmpl w:val="10A26168"/>
@@ -18204,7 +19506,7 @@
       </w:rPr>
     </w:lvl>
   </w:abstractNum>
-  <w:abstractNum w:abstractNumId="75" w15:restartNumberingAfterBreak="0">
+  <w:abstractNum w:abstractNumId="76" w15:restartNumberingAfterBreak="0">
     <w:nsid w:val="3C5546BA"/>
     <w:multiLevelType w:val="hybridMultilevel"/>
     <w:tmpl w:val="3434F5E4"/>
@@ -18316,7 +19618,7 @@
       </w:rPr>
     </w:lvl>
   </w:abstractNum>
-  <w:abstractNum w:abstractNumId="76" w15:restartNumberingAfterBreak="0">
+  <w:abstractNum w:abstractNumId="77" w15:restartNumberingAfterBreak="0">
     <w:nsid w:val="3C623C55"/>
     <w:multiLevelType w:val="multilevel"/>
     <w:tmpl w:val="A0B0E8F4"/>
@@ -18465,7 +19767,7 @@
       </w:rPr>
     </w:lvl>
   </w:abstractNum>
-  <w:abstractNum w:abstractNumId="77" w15:restartNumberingAfterBreak="0">
+  <w:abstractNum w:abstractNumId="78" w15:restartNumberingAfterBreak="0">
     <w:nsid w:val="3CD27F78"/>
     <w:multiLevelType w:val="multilevel"/>
     <w:tmpl w:val="FCDE767A"/>
@@ -18614,7 +19916,7 @@
       </w:rPr>
     </w:lvl>
   </w:abstractNum>
-  <w:abstractNum w:abstractNumId="78" w15:restartNumberingAfterBreak="0">
+  <w:abstractNum w:abstractNumId="79" w15:restartNumberingAfterBreak="0">
     <w:nsid w:val="3CD74B18"/>
     <w:multiLevelType w:val="hybridMultilevel"/>
     <w:tmpl w:val="2FF42220"/>
@@ -18727,7 +20029,7 @@
       </w:rPr>
     </w:lvl>
   </w:abstractNum>
-  <w:abstractNum w:abstractNumId="79" w15:restartNumberingAfterBreak="0">
+  <w:abstractNum w:abstractNumId="80" w15:restartNumberingAfterBreak="0">
     <w:nsid w:val="3D2F7E79"/>
     <w:multiLevelType w:val="hybridMultilevel"/>
     <w:tmpl w:val="6ED674BE"/>
@@ -18839,7 +20141,7 @@
       </w:rPr>
     </w:lvl>
   </w:abstractNum>
-  <w:abstractNum w:abstractNumId="80" w15:restartNumberingAfterBreak="0">
+  <w:abstractNum w:abstractNumId="81" w15:restartNumberingAfterBreak="0">
     <w:nsid w:val="3D397287"/>
     <w:multiLevelType w:val="hybridMultilevel"/>
     <w:tmpl w:val="F4503122"/>
@@ -18951,7 +20253,7 @@
       </w:rPr>
     </w:lvl>
   </w:abstractNum>
-  <w:abstractNum w:abstractNumId="81" w15:restartNumberingAfterBreak="0">
+  <w:abstractNum w:abstractNumId="82" w15:restartNumberingAfterBreak="0">
     <w:nsid w:val="3E685FF3"/>
     <w:multiLevelType w:val="multilevel"/>
     <w:tmpl w:val="7D20B538"/>
@@ -19100,7 +20402,7 @@
       </w:rPr>
     </w:lvl>
   </w:abstractNum>
-  <w:abstractNum w:abstractNumId="82" w15:restartNumberingAfterBreak="0">
+  <w:abstractNum w:abstractNumId="83" w15:restartNumberingAfterBreak="0">
     <w:nsid w:val="3F346C2C"/>
     <w:multiLevelType w:val="multilevel"/>
     <w:tmpl w:val="63F4E6F0"/>
@@ -19249,7 +20551,7 @@
       </w:rPr>
     </w:lvl>
   </w:abstractNum>
-  <w:abstractNum w:abstractNumId="83" w15:restartNumberingAfterBreak="0">
+  <w:abstractNum w:abstractNumId="84" w15:restartNumberingAfterBreak="0">
     <w:nsid w:val="3FCB1322"/>
     <w:multiLevelType w:val="hybridMultilevel"/>
     <w:tmpl w:val="55C012B2"/>
@@ -19361,7 +20663,7 @@
       </w:rPr>
     </w:lvl>
   </w:abstractNum>
-  <w:abstractNum w:abstractNumId="84" w15:restartNumberingAfterBreak="0">
+  <w:abstractNum w:abstractNumId="85" w15:restartNumberingAfterBreak="0">
     <w:nsid w:val="41A9344F"/>
     <w:multiLevelType w:val="hybridMultilevel"/>
     <w:tmpl w:val="0FB60038"/>
@@ -19474,7 +20776,7 @@
       </w:rPr>
     </w:lvl>
   </w:abstractNum>
-  <w:abstractNum w:abstractNumId="85" w15:restartNumberingAfterBreak="0">
+  <w:abstractNum w:abstractNumId="86" w15:restartNumberingAfterBreak="0">
     <w:nsid w:val="42004E1F"/>
     <w:multiLevelType w:val="hybridMultilevel"/>
     <w:tmpl w:val="770C8314"/>
@@ -19586,7 +20888,7 @@
       </w:rPr>
     </w:lvl>
   </w:abstractNum>
-  <w:abstractNum w:abstractNumId="86" w15:restartNumberingAfterBreak="0">
+  <w:abstractNum w:abstractNumId="87" w15:restartNumberingAfterBreak="0">
     <w:nsid w:val="439F7169"/>
     <w:multiLevelType w:val="hybridMultilevel"/>
     <w:tmpl w:val="1884EDCA"/>
@@ -19699,7 +21001,7 @@
       </w:rPr>
     </w:lvl>
   </w:abstractNum>
-  <w:abstractNum w:abstractNumId="87" w15:restartNumberingAfterBreak="0">
+  <w:abstractNum w:abstractNumId="88" w15:restartNumberingAfterBreak="0">
     <w:nsid w:val="43EA1D69"/>
     <w:multiLevelType w:val="multilevel"/>
     <w:tmpl w:val="DFEC23EC"/>
@@ -19848,7 +21150,7 @@
       </w:rPr>
     </w:lvl>
   </w:abstractNum>
-  <w:abstractNum w:abstractNumId="88" w15:restartNumberingAfterBreak="0">
+  <w:abstractNum w:abstractNumId="89" w15:restartNumberingAfterBreak="0">
     <w:nsid w:val="44320084"/>
     <w:multiLevelType w:val="hybridMultilevel"/>
     <w:tmpl w:val="CE5076D4"/>
@@ -19960,7 +21262,7 @@
       </w:rPr>
     </w:lvl>
   </w:abstractNum>
-  <w:abstractNum w:abstractNumId="89" w15:restartNumberingAfterBreak="0">
+  <w:abstractNum w:abstractNumId="90" w15:restartNumberingAfterBreak="0">
     <w:nsid w:val="44554567"/>
     <w:multiLevelType w:val="hybridMultilevel"/>
     <w:tmpl w:val="78748252"/>
@@ -20072,7 +21374,7 @@
       </w:rPr>
     </w:lvl>
   </w:abstractNum>
-  <w:abstractNum w:abstractNumId="90" w15:restartNumberingAfterBreak="0">
+  <w:abstractNum w:abstractNumId="91" w15:restartNumberingAfterBreak="0">
     <w:nsid w:val="49005094"/>
     <w:multiLevelType w:val="hybridMultilevel"/>
     <w:tmpl w:val="14848CBE"/>
@@ -20184,7 +21486,7 @@
       </w:rPr>
     </w:lvl>
   </w:abstractNum>
-  <w:abstractNum w:abstractNumId="91" w15:restartNumberingAfterBreak="0">
+  <w:abstractNum w:abstractNumId="92" w15:restartNumberingAfterBreak="0">
     <w:nsid w:val="49243794"/>
     <w:multiLevelType w:val="multilevel"/>
     <w:tmpl w:val="E7681528"/>
@@ -20333,7 +21635,7 @@
       </w:rPr>
     </w:lvl>
   </w:abstractNum>
-  <w:abstractNum w:abstractNumId="92" w15:restartNumberingAfterBreak="0">
+  <w:abstractNum w:abstractNumId="93" w15:restartNumberingAfterBreak="0">
     <w:nsid w:val="4A880990"/>
     <w:multiLevelType w:val="hybridMultilevel"/>
     <w:tmpl w:val="F17E12C2"/>
@@ -20445,7 +21747,7 @@
       </w:rPr>
     </w:lvl>
   </w:abstractNum>
-  <w:abstractNum w:abstractNumId="93" w15:restartNumberingAfterBreak="0">
+  <w:abstractNum w:abstractNumId="94" w15:restartNumberingAfterBreak="0">
     <w:nsid w:val="4B182B12"/>
     <w:multiLevelType w:val="hybridMultilevel"/>
     <w:tmpl w:val="31C486B4"/>
@@ -20557,7 +21859,7 @@
       </w:rPr>
     </w:lvl>
   </w:abstractNum>
-  <w:abstractNum w:abstractNumId="94" w15:restartNumberingAfterBreak="0">
+  <w:abstractNum w:abstractNumId="95" w15:restartNumberingAfterBreak="0">
     <w:nsid w:val="4BA13766"/>
     <w:multiLevelType w:val="multilevel"/>
     <w:tmpl w:val="63F4E6F0"/>
@@ -20706,7 +22008,7 @@
       </w:rPr>
     </w:lvl>
   </w:abstractNum>
-  <w:abstractNum w:abstractNumId="95" w15:restartNumberingAfterBreak="0">
+  <w:abstractNum w:abstractNumId="96" w15:restartNumberingAfterBreak="0">
     <w:nsid w:val="4E65371E"/>
     <w:multiLevelType w:val="hybridMultilevel"/>
     <w:tmpl w:val="53EE4538"/>
@@ -20818,7 +22120,7 @@
       </w:rPr>
     </w:lvl>
   </w:abstractNum>
-  <w:abstractNum w:abstractNumId="96" w15:restartNumberingAfterBreak="0">
+  <w:abstractNum w:abstractNumId="97" w15:restartNumberingAfterBreak="0">
     <w:nsid w:val="4E9A3F16"/>
     <w:multiLevelType w:val="multilevel"/>
     <w:tmpl w:val="63F4E6F0"/>
@@ -20967,7 +22269,7 @@
       </w:rPr>
     </w:lvl>
   </w:abstractNum>
-  <w:abstractNum w:abstractNumId="97" w15:restartNumberingAfterBreak="0">
+  <w:abstractNum w:abstractNumId="98" w15:restartNumberingAfterBreak="0">
     <w:nsid w:val="500B790D"/>
     <w:multiLevelType w:val="multilevel"/>
     <w:tmpl w:val="63F4E6F0"/>
@@ -21116,7 +22418,7 @@
       </w:rPr>
     </w:lvl>
   </w:abstractNum>
-  <w:abstractNum w:abstractNumId="98" w15:restartNumberingAfterBreak="0">
+  <w:abstractNum w:abstractNumId="99" w15:restartNumberingAfterBreak="0">
     <w:nsid w:val="526538B7"/>
     <w:multiLevelType w:val="hybridMultilevel"/>
     <w:tmpl w:val="E6A017F2"/>
@@ -21229,7 +22531,7 @@
       </w:rPr>
     </w:lvl>
   </w:abstractNum>
-  <w:abstractNum w:abstractNumId="99" w15:restartNumberingAfterBreak="0">
+  <w:abstractNum w:abstractNumId="100" w15:restartNumberingAfterBreak="0">
     <w:nsid w:val="537E56D9"/>
     <w:multiLevelType w:val="multilevel"/>
     <w:tmpl w:val="1B6E8B6A"/>
@@ -21378,7 +22680,7 @@
       </w:rPr>
     </w:lvl>
   </w:abstractNum>
-  <w:abstractNum w:abstractNumId="100" w15:restartNumberingAfterBreak="0">
+  <w:abstractNum w:abstractNumId="101" w15:restartNumberingAfterBreak="0">
     <w:nsid w:val="53E6601E"/>
     <w:multiLevelType w:val="hybridMultilevel"/>
     <w:tmpl w:val="66F0666A"/>
@@ -21491,7 +22793,7 @@
       </w:rPr>
     </w:lvl>
   </w:abstractNum>
-  <w:abstractNum w:abstractNumId="101" w15:restartNumberingAfterBreak="0">
+  <w:abstractNum w:abstractNumId="102" w15:restartNumberingAfterBreak="0">
     <w:nsid w:val="551D6F91"/>
     <w:multiLevelType w:val="hybridMultilevel"/>
     <w:tmpl w:val="9522B3C6"/>
@@ -21603,7 +22905,7 @@
       </w:rPr>
     </w:lvl>
   </w:abstractNum>
-  <w:abstractNum w:abstractNumId="102" w15:restartNumberingAfterBreak="0">
+  <w:abstractNum w:abstractNumId="103" w15:restartNumberingAfterBreak="0">
     <w:nsid w:val="555451DA"/>
     <w:multiLevelType w:val="hybridMultilevel"/>
     <w:tmpl w:val="CAB2A550"/>
@@ -21716,7 +23018,7 @@
       </w:rPr>
     </w:lvl>
   </w:abstractNum>
-  <w:abstractNum w:abstractNumId="103" w15:restartNumberingAfterBreak="0">
+  <w:abstractNum w:abstractNumId="104" w15:restartNumberingAfterBreak="0">
     <w:nsid w:val="55655B93"/>
     <w:multiLevelType w:val="multilevel"/>
     <w:tmpl w:val="9C88A4A8"/>
@@ -21865,7 +23167,7 @@
       </w:rPr>
     </w:lvl>
   </w:abstractNum>
-  <w:abstractNum w:abstractNumId="104" w15:restartNumberingAfterBreak="0">
+  <w:abstractNum w:abstractNumId="105" w15:restartNumberingAfterBreak="0">
     <w:nsid w:val="55B95BED"/>
     <w:multiLevelType w:val="hybridMultilevel"/>
     <w:tmpl w:val="A9B866FC"/>
@@ -21978,7 +23280,7 @@
       </w:rPr>
     </w:lvl>
   </w:abstractNum>
-  <w:abstractNum w:abstractNumId="105" w15:restartNumberingAfterBreak="0">
+  <w:abstractNum w:abstractNumId="106" w15:restartNumberingAfterBreak="0">
     <w:nsid w:val="562D4F1F"/>
     <w:multiLevelType w:val="hybridMultilevel"/>
     <w:tmpl w:val="1FF8D31C"/>
@@ -22090,7 +23392,7 @@
       </w:rPr>
     </w:lvl>
   </w:abstractNum>
-  <w:abstractNum w:abstractNumId="106" w15:restartNumberingAfterBreak="0">
+  <w:abstractNum w:abstractNumId="107" w15:restartNumberingAfterBreak="0">
     <w:nsid w:val="565A0C8B"/>
     <w:multiLevelType w:val="multilevel"/>
     <w:tmpl w:val="AB24FF2E"/>
@@ -22239,7 +23541,7 @@
       </w:rPr>
     </w:lvl>
   </w:abstractNum>
-  <w:abstractNum w:abstractNumId="107" w15:restartNumberingAfterBreak="0">
+  <w:abstractNum w:abstractNumId="108" w15:restartNumberingAfterBreak="0">
     <w:nsid w:val="566E7C65"/>
     <w:multiLevelType w:val="multilevel"/>
     <w:tmpl w:val="28803B4C"/>
@@ -22388,7 +23690,7 @@
       </w:rPr>
     </w:lvl>
   </w:abstractNum>
-  <w:abstractNum w:abstractNumId="108" w15:restartNumberingAfterBreak="0">
+  <w:abstractNum w:abstractNumId="109" w15:restartNumberingAfterBreak="0">
     <w:nsid w:val="57407594"/>
     <w:multiLevelType w:val="multilevel"/>
     <w:tmpl w:val="E6E2F8AE"/>
@@ -22537,7 +23839,7 @@
       </w:rPr>
     </w:lvl>
   </w:abstractNum>
-  <w:abstractNum w:abstractNumId="109" w15:restartNumberingAfterBreak="0">
+  <w:abstractNum w:abstractNumId="110" w15:restartNumberingAfterBreak="0">
     <w:nsid w:val="577F771B"/>
     <w:multiLevelType w:val="hybridMultilevel"/>
     <w:tmpl w:val="0F2C5914"/>
@@ -22649,7 +23951,7 @@
       </w:rPr>
     </w:lvl>
   </w:abstractNum>
-  <w:abstractNum w:abstractNumId="110" w15:restartNumberingAfterBreak="0">
+  <w:abstractNum w:abstractNumId="111" w15:restartNumberingAfterBreak="0">
     <w:nsid w:val="57C43CDD"/>
     <w:multiLevelType w:val="hybridMultilevel"/>
     <w:tmpl w:val="6C94FB5E"/>
@@ -22762,7 +24064,7 @@
       </w:rPr>
     </w:lvl>
   </w:abstractNum>
-  <w:abstractNum w:abstractNumId="111" w15:restartNumberingAfterBreak="0">
+  <w:abstractNum w:abstractNumId="112" w15:restartNumberingAfterBreak="0">
     <w:nsid w:val="58393977"/>
     <w:multiLevelType w:val="hybridMultilevel"/>
     <w:tmpl w:val="985A5484"/>
@@ -22875,7 +24177,7 @@
       </w:rPr>
     </w:lvl>
   </w:abstractNum>
-  <w:abstractNum w:abstractNumId="112" w15:restartNumberingAfterBreak="0">
+  <w:abstractNum w:abstractNumId="113" w15:restartNumberingAfterBreak="0">
     <w:nsid w:val="59EB4CE4"/>
     <w:multiLevelType w:val="multilevel"/>
     <w:tmpl w:val="63F4E6F0"/>
@@ -23024,7 +24326,7 @@
       </w:rPr>
     </w:lvl>
   </w:abstractNum>
-  <w:abstractNum w:abstractNumId="113" w15:restartNumberingAfterBreak="0">
+  <w:abstractNum w:abstractNumId="114" w15:restartNumberingAfterBreak="0">
     <w:nsid w:val="5BD11962"/>
     <w:multiLevelType w:val="hybridMultilevel"/>
     <w:tmpl w:val="89A4B834"/>
@@ -23113,7 +24415,7 @@
       </w:pPr>
     </w:lvl>
   </w:abstractNum>
-  <w:abstractNum w:abstractNumId="114" w15:restartNumberingAfterBreak="0">
+  <w:abstractNum w:abstractNumId="115" w15:restartNumberingAfterBreak="0">
     <w:nsid w:val="5C950DBA"/>
     <w:multiLevelType w:val="hybridMultilevel"/>
     <w:tmpl w:val="7D78F950"/>
@@ -23225,7 +24527,7 @@
       </w:rPr>
     </w:lvl>
   </w:abstractNum>
-  <w:abstractNum w:abstractNumId="115" w15:restartNumberingAfterBreak="0">
+  <w:abstractNum w:abstractNumId="116" w15:restartNumberingAfterBreak="0">
     <w:nsid w:val="5D2A5D3B"/>
     <w:multiLevelType w:val="hybridMultilevel"/>
     <w:tmpl w:val="3AF89EA6"/>
@@ -23316,7 +24618,7 @@
       </w:pPr>
     </w:lvl>
   </w:abstractNum>
-  <w:abstractNum w:abstractNumId="116" w15:restartNumberingAfterBreak="0">
+  <w:abstractNum w:abstractNumId="117" w15:restartNumberingAfterBreak="0">
     <w:nsid w:val="5D9E49FD"/>
     <w:multiLevelType w:val="hybridMultilevel"/>
     <w:tmpl w:val="4EE40BB4"/>
@@ -23428,7 +24730,7 @@
       </w:rPr>
     </w:lvl>
   </w:abstractNum>
-  <w:abstractNum w:abstractNumId="117" w15:restartNumberingAfterBreak="0">
+  <w:abstractNum w:abstractNumId="118" w15:restartNumberingAfterBreak="0">
     <w:nsid w:val="5DB7107D"/>
     <w:multiLevelType w:val="multilevel"/>
     <w:tmpl w:val="6520107A"/>
@@ -23577,7 +24879,7 @@
       </w:rPr>
     </w:lvl>
   </w:abstractNum>
-  <w:abstractNum w:abstractNumId="118" w15:restartNumberingAfterBreak="0">
+  <w:abstractNum w:abstractNumId="119" w15:restartNumberingAfterBreak="0">
     <w:nsid w:val="5E9370A7"/>
     <w:multiLevelType w:val="hybridMultilevel"/>
     <w:tmpl w:val="13480456"/>
@@ -23663,7 +24965,7 @@
       </w:pPr>
     </w:lvl>
   </w:abstractNum>
-  <w:abstractNum w:abstractNumId="119" w15:restartNumberingAfterBreak="0">
+  <w:abstractNum w:abstractNumId="120" w15:restartNumberingAfterBreak="0">
     <w:nsid w:val="60421322"/>
     <w:multiLevelType w:val="hybridMultilevel"/>
     <w:tmpl w:val="447CDBDC"/>
@@ -23775,7 +25077,7 @@
       </w:rPr>
     </w:lvl>
   </w:abstractNum>
-  <w:abstractNum w:abstractNumId="120" w15:restartNumberingAfterBreak="0">
+  <w:abstractNum w:abstractNumId="121" w15:restartNumberingAfterBreak="0">
     <w:nsid w:val="61926C31"/>
     <w:multiLevelType w:val="hybridMultilevel"/>
     <w:tmpl w:val="AFD27E5C"/>
@@ -23888,7 +25190,7 @@
       </w:rPr>
     </w:lvl>
   </w:abstractNum>
-  <w:abstractNum w:abstractNumId="121" w15:restartNumberingAfterBreak="0">
+  <w:abstractNum w:abstractNumId="122" w15:restartNumberingAfterBreak="0">
     <w:nsid w:val="622F5FC7"/>
     <w:multiLevelType w:val="hybridMultilevel"/>
     <w:tmpl w:val="49A6C2A6"/>
@@ -24001,7 +25303,7 @@
       </w:rPr>
     </w:lvl>
   </w:abstractNum>
-  <w:abstractNum w:abstractNumId="122" w15:restartNumberingAfterBreak="0">
+  <w:abstractNum w:abstractNumId="123" w15:restartNumberingAfterBreak="0">
     <w:nsid w:val="62AC33B4"/>
     <w:multiLevelType w:val="multilevel"/>
     <w:tmpl w:val="A074F3CA"/>
@@ -24150,7 +25452,7 @@
       </w:rPr>
     </w:lvl>
   </w:abstractNum>
-  <w:abstractNum w:abstractNumId="123" w15:restartNumberingAfterBreak="0">
+  <w:abstractNum w:abstractNumId="124" w15:restartNumberingAfterBreak="0">
     <w:nsid w:val="63B44674"/>
     <w:multiLevelType w:val="multilevel"/>
     <w:tmpl w:val="08F4FA9A"/>
@@ -24299,7 +25601,7 @@
       </w:rPr>
     </w:lvl>
   </w:abstractNum>
-  <w:abstractNum w:abstractNumId="124" w15:restartNumberingAfterBreak="0">
+  <w:abstractNum w:abstractNumId="125" w15:restartNumberingAfterBreak="0">
     <w:nsid w:val="63C245D4"/>
     <w:multiLevelType w:val="hybridMultilevel"/>
     <w:tmpl w:val="E1563A56"/>
@@ -24411,7 +25713,7 @@
       </w:rPr>
     </w:lvl>
   </w:abstractNum>
-  <w:abstractNum w:abstractNumId="125" w15:restartNumberingAfterBreak="0">
+  <w:abstractNum w:abstractNumId="126" w15:restartNumberingAfterBreak="0">
     <w:nsid w:val="64F30198"/>
     <w:multiLevelType w:val="multilevel"/>
     <w:tmpl w:val="63F4E6F0"/>
@@ -24560,7 +25862,7 @@
       </w:rPr>
     </w:lvl>
   </w:abstractNum>
-  <w:abstractNum w:abstractNumId="126" w15:restartNumberingAfterBreak="0">
+  <w:abstractNum w:abstractNumId="127" w15:restartNumberingAfterBreak="0">
     <w:nsid w:val="65AF2502"/>
     <w:multiLevelType w:val="hybridMultilevel"/>
     <w:tmpl w:val="FB2A44D8"/>
@@ -24673,7 +25975,7 @@
       </w:rPr>
     </w:lvl>
   </w:abstractNum>
-  <w:abstractNum w:abstractNumId="127" w15:restartNumberingAfterBreak="0">
+  <w:abstractNum w:abstractNumId="128" w15:restartNumberingAfterBreak="0">
     <w:nsid w:val="671614F0"/>
     <w:multiLevelType w:val="multilevel"/>
     <w:tmpl w:val="63F4E6F0"/>
@@ -24822,7 +26124,7 @@
       </w:rPr>
     </w:lvl>
   </w:abstractNum>
-  <w:abstractNum w:abstractNumId="128" w15:restartNumberingAfterBreak="0">
+  <w:abstractNum w:abstractNumId="129" w15:restartNumberingAfterBreak="0">
     <w:nsid w:val="6859691D"/>
     <w:multiLevelType w:val="multilevel"/>
     <w:tmpl w:val="826A9D48"/>
@@ -24971,7 +26273,7 @@
       </w:rPr>
     </w:lvl>
   </w:abstractNum>
-  <w:abstractNum w:abstractNumId="129" w15:restartNumberingAfterBreak="0">
+  <w:abstractNum w:abstractNumId="130" w15:restartNumberingAfterBreak="0">
     <w:nsid w:val="68817757"/>
     <w:multiLevelType w:val="multilevel"/>
     <w:tmpl w:val="34EE1968"/>
@@ -25120,7 +26422,7 @@
       </w:rPr>
     </w:lvl>
   </w:abstractNum>
-  <w:abstractNum w:abstractNumId="130" w15:restartNumberingAfterBreak="0">
+  <w:abstractNum w:abstractNumId="131" w15:restartNumberingAfterBreak="0">
     <w:nsid w:val="68BE10E8"/>
     <w:multiLevelType w:val="hybridMultilevel"/>
     <w:tmpl w:val="326CD592"/>
@@ -25233,7 +26535,7 @@
       </w:rPr>
     </w:lvl>
   </w:abstractNum>
-  <w:abstractNum w:abstractNumId="131" w15:restartNumberingAfterBreak="0">
+  <w:abstractNum w:abstractNumId="132" w15:restartNumberingAfterBreak="0">
     <w:nsid w:val="68E86299"/>
     <w:multiLevelType w:val="hybridMultilevel"/>
     <w:tmpl w:val="9B5CBEE8"/>
@@ -25319,7 +26621,7 @@
       </w:pPr>
     </w:lvl>
   </w:abstractNum>
-  <w:abstractNum w:abstractNumId="132" w15:restartNumberingAfterBreak="0">
+  <w:abstractNum w:abstractNumId="133" w15:restartNumberingAfterBreak="0">
     <w:nsid w:val="69996D9A"/>
     <w:multiLevelType w:val="multilevel"/>
     <w:tmpl w:val="1780FC38"/>
@@ -25468,7 +26770,7 @@
       </w:rPr>
     </w:lvl>
   </w:abstractNum>
-  <w:abstractNum w:abstractNumId="133" w15:restartNumberingAfterBreak="0">
+  <w:abstractNum w:abstractNumId="134" w15:restartNumberingAfterBreak="0">
     <w:nsid w:val="6B3C30B9"/>
     <w:multiLevelType w:val="hybridMultilevel"/>
     <w:tmpl w:val="C938F8DE"/>
@@ -25580,7 +26882,7 @@
       </w:rPr>
     </w:lvl>
   </w:abstractNum>
-  <w:abstractNum w:abstractNumId="134" w15:restartNumberingAfterBreak="0">
+  <w:abstractNum w:abstractNumId="135" w15:restartNumberingAfterBreak="0">
     <w:nsid w:val="6D1511A0"/>
     <w:multiLevelType w:val="hybridMultilevel"/>
     <w:tmpl w:val="AAD8B9B4"/>
@@ -25692,7 +26994,7 @@
       </w:rPr>
     </w:lvl>
   </w:abstractNum>
-  <w:abstractNum w:abstractNumId="135" w15:restartNumberingAfterBreak="0">
+  <w:abstractNum w:abstractNumId="136" w15:restartNumberingAfterBreak="0">
     <w:nsid w:val="6DD255F1"/>
     <w:multiLevelType w:val="hybridMultilevel"/>
     <w:tmpl w:val="ACBC1404"/>
@@ -25805,7 +27107,7 @@
       </w:rPr>
     </w:lvl>
   </w:abstractNum>
-  <w:abstractNum w:abstractNumId="136" w15:restartNumberingAfterBreak="0">
+  <w:abstractNum w:abstractNumId="137" w15:restartNumberingAfterBreak="0">
     <w:nsid w:val="6DDB4404"/>
     <w:multiLevelType w:val="hybridMultilevel"/>
     <w:tmpl w:val="06428E32"/>
@@ -25918,7 +27220,7 @@
       </w:rPr>
     </w:lvl>
   </w:abstractNum>
-  <w:abstractNum w:abstractNumId="137" w15:restartNumberingAfterBreak="0">
+  <w:abstractNum w:abstractNumId="138" w15:restartNumberingAfterBreak="0">
     <w:nsid w:val="6F014B3B"/>
     <w:multiLevelType w:val="hybridMultilevel"/>
     <w:tmpl w:val="C89A39BE"/>
@@ -26030,7 +27332,7 @@
       </w:rPr>
     </w:lvl>
   </w:abstractNum>
-  <w:abstractNum w:abstractNumId="138" w15:restartNumberingAfterBreak="0">
+  <w:abstractNum w:abstractNumId="139" w15:restartNumberingAfterBreak="0">
     <w:nsid w:val="6F171273"/>
     <w:multiLevelType w:val="multilevel"/>
     <w:tmpl w:val="0240C564"/>
@@ -26179,7 +27481,7 @@
       </w:rPr>
     </w:lvl>
   </w:abstractNum>
-  <w:abstractNum w:abstractNumId="139" w15:restartNumberingAfterBreak="0">
+  <w:abstractNum w:abstractNumId="140" w15:restartNumberingAfterBreak="0">
     <w:nsid w:val="6FB82AAA"/>
     <w:multiLevelType w:val="multilevel"/>
     <w:tmpl w:val="FC46C7C0"/>
@@ -26328,7 +27630,7 @@
       </w:rPr>
     </w:lvl>
   </w:abstractNum>
-  <w:abstractNum w:abstractNumId="140" w15:restartNumberingAfterBreak="0">
+  <w:abstractNum w:abstractNumId="141" w15:restartNumberingAfterBreak="0">
     <w:nsid w:val="6FD46DCF"/>
     <w:multiLevelType w:val="hybridMultilevel"/>
     <w:tmpl w:val="EF5E6EC6"/>
@@ -26441,7 +27743,7 @@
       </w:rPr>
     </w:lvl>
   </w:abstractNum>
-  <w:abstractNum w:abstractNumId="141" w15:restartNumberingAfterBreak="0">
+  <w:abstractNum w:abstractNumId="142" w15:restartNumberingAfterBreak="0">
     <w:nsid w:val="70484E38"/>
     <w:multiLevelType w:val="multilevel"/>
     <w:tmpl w:val="22B26DD2"/>
@@ -26590,7 +27892,7 @@
       </w:rPr>
     </w:lvl>
   </w:abstractNum>
-  <w:abstractNum w:abstractNumId="142" w15:restartNumberingAfterBreak="0">
+  <w:abstractNum w:abstractNumId="143" w15:restartNumberingAfterBreak="0">
     <w:nsid w:val="70CB723E"/>
     <w:multiLevelType w:val="multilevel"/>
     <w:tmpl w:val="63F4E6F0"/>
@@ -26739,7 +28041,7 @@
       </w:rPr>
     </w:lvl>
   </w:abstractNum>
-  <w:abstractNum w:abstractNumId="143" w15:restartNumberingAfterBreak="0">
+  <w:abstractNum w:abstractNumId="144" w15:restartNumberingAfterBreak="0">
     <w:nsid w:val="71DB3F58"/>
     <w:multiLevelType w:val="multilevel"/>
     <w:tmpl w:val="63F4E6F0"/>
@@ -26888,7 +28190,7 @@
       </w:rPr>
     </w:lvl>
   </w:abstractNum>
-  <w:abstractNum w:abstractNumId="144" w15:restartNumberingAfterBreak="0">
+  <w:abstractNum w:abstractNumId="145" w15:restartNumberingAfterBreak="0">
     <w:nsid w:val="72F31FF2"/>
     <w:multiLevelType w:val="hybridMultilevel"/>
     <w:tmpl w:val="5C2693A0"/>
@@ -27000,7 +28302,7 @@
       </w:rPr>
     </w:lvl>
   </w:abstractNum>
-  <w:abstractNum w:abstractNumId="145" w15:restartNumberingAfterBreak="0">
+  <w:abstractNum w:abstractNumId="146" w15:restartNumberingAfterBreak="0">
     <w:nsid w:val="75B45140"/>
     <w:multiLevelType w:val="hybridMultilevel"/>
     <w:tmpl w:val="93F8F3C4"/>
@@ -27113,7 +28415,7 @@
       </w:rPr>
     </w:lvl>
   </w:abstractNum>
-  <w:abstractNum w:abstractNumId="146" w15:restartNumberingAfterBreak="0">
+  <w:abstractNum w:abstractNumId="147" w15:restartNumberingAfterBreak="0">
     <w:nsid w:val="76F60FFE"/>
     <w:multiLevelType w:val="multilevel"/>
     <w:tmpl w:val="63F4E6F0"/>
@@ -27262,7 +28564,120 @@
       </w:rPr>
     </w:lvl>
   </w:abstractNum>
-  <w:abstractNum w:abstractNumId="147" w15:restartNumberingAfterBreak="0">
+  <w:abstractNum w:abstractNumId="148" w15:restartNumberingAfterBreak="0">
+    <w:nsid w:val="772A45B4"/>
+    <w:multiLevelType w:val="hybridMultilevel"/>
+    <w:tmpl w:val="833AB77E"/>
+    <w:lvl w:ilvl="0" w:tplc="04090005">
+      <w:start w:val="1"/>
+      <w:numFmt w:val="bullet"/>
+      <w:lvlText w:val=""/>
+      <w:lvlJc w:val="left"/>
+      <w:pPr>
+        <w:ind w:left="720" w:hanging="360"/>
+      </w:pPr>
+      <w:rPr>
+        <w:rFonts w:ascii="Wingdings" w:hAnsi="Wingdings" w:hint="default"/>
+      </w:rPr>
+    </w:lvl>
+    <w:lvl w:ilvl="1" w:tplc="04090003" w:tentative="1">
+      <w:start w:val="1"/>
+      <w:numFmt w:val="bullet"/>
+      <w:lvlText w:val="o"/>
+      <w:lvlJc w:val="left"/>
+      <w:pPr>
+        <w:ind w:left="1440" w:hanging="360"/>
+      </w:pPr>
+      <w:rPr>
+        <w:rFonts w:ascii="Courier New" w:hAnsi="Courier New" w:cs="Courier New" w:hint="default"/>
+      </w:rPr>
+    </w:lvl>
+    <w:lvl w:ilvl="2" w:tplc="04090005" w:tentative="1">
+      <w:start w:val="1"/>
+      <w:numFmt w:val="bullet"/>
+      <w:lvlText w:val=""/>
+      <w:lvlJc w:val="left"/>
+      <w:pPr>
+        <w:ind w:left="2160" w:hanging="360"/>
+      </w:pPr>
+      <w:rPr>
+        <w:rFonts w:ascii="Wingdings" w:hAnsi="Wingdings" w:hint="default"/>
+      </w:rPr>
+    </w:lvl>
+    <w:lvl w:ilvl="3" w:tplc="04090001" w:tentative="1">
+      <w:start w:val="1"/>
+      <w:numFmt w:val="bullet"/>
+      <w:lvlText w:val=""/>
+      <w:lvlJc w:val="left"/>
+      <w:pPr>
+        <w:ind w:left="2880" w:hanging="360"/>
+      </w:pPr>
+      <w:rPr>
+        <w:rFonts w:ascii="Symbol" w:hAnsi="Symbol" w:hint="default"/>
+      </w:rPr>
+    </w:lvl>
+    <w:lvl w:ilvl="4" w:tplc="04090003" w:tentative="1">
+      <w:start w:val="1"/>
+      <w:numFmt w:val="bullet"/>
+      <w:lvlText w:val="o"/>
+      <w:lvlJc w:val="left"/>
+      <w:pPr>
+        <w:ind w:left="3600" w:hanging="360"/>
+      </w:pPr>
+      <w:rPr>
+        <w:rFonts w:ascii="Courier New" w:hAnsi="Courier New" w:cs="Courier New" w:hint="default"/>
+      </w:rPr>
+    </w:lvl>
+    <w:lvl w:ilvl="5" w:tplc="04090005" w:tentative="1">
+      <w:start w:val="1"/>
+      <w:numFmt w:val="bullet"/>
+      <w:lvlText w:val=""/>
+      <w:lvlJc w:val="left"/>
+      <w:pPr>
+        <w:ind w:left="4320" w:hanging="360"/>
+      </w:pPr>
+      <w:rPr>
+        <w:rFonts w:ascii="Wingdings" w:hAnsi="Wingdings" w:hint="default"/>
+      </w:rPr>
+    </w:lvl>
+    <w:lvl w:ilvl="6" w:tplc="04090001" w:tentative="1">
+      <w:start w:val="1"/>
+      <w:numFmt w:val="bullet"/>
+      <w:lvlText w:val=""/>
+      <w:lvlJc w:val="left"/>
+      <w:pPr>
+        <w:ind w:left="5040" w:hanging="360"/>
+      </w:pPr>
+      <w:rPr>
+        <w:rFonts w:ascii="Symbol" w:hAnsi="Symbol" w:hint="default"/>
+      </w:rPr>
+    </w:lvl>
+    <w:lvl w:ilvl="7" w:tplc="04090003" w:tentative="1">
+      <w:start w:val="1"/>
+      <w:numFmt w:val="bullet"/>
+      <w:lvlText w:val="o"/>
+      <w:lvlJc w:val="left"/>
+      <w:pPr>
+        <w:ind w:left="5760" w:hanging="360"/>
+      </w:pPr>
+      <w:rPr>
+        <w:rFonts w:ascii="Courier New" w:hAnsi="Courier New" w:cs="Courier New" w:hint="default"/>
+      </w:rPr>
+    </w:lvl>
+    <w:lvl w:ilvl="8" w:tplc="04090005" w:tentative="1">
+      <w:start w:val="1"/>
+      <w:numFmt w:val="bullet"/>
+      <w:lvlText w:val=""/>
+      <w:lvlJc w:val="left"/>
+      <w:pPr>
+        <w:ind w:left="6480" w:hanging="360"/>
+      </w:pPr>
+      <w:rPr>
+        <w:rFonts w:ascii="Wingdings" w:hAnsi="Wingdings" w:hint="default"/>
+      </w:rPr>
+    </w:lvl>
+  </w:abstractNum>
+  <w:abstractNum w:abstractNumId="149" w15:restartNumberingAfterBreak="0">
     <w:nsid w:val="77572323"/>
     <w:multiLevelType w:val="multilevel"/>
     <w:tmpl w:val="63F4E6F0"/>
@@ -27411,7 +28826,7 @@
       </w:rPr>
     </w:lvl>
   </w:abstractNum>
-  <w:abstractNum w:abstractNumId="148" w15:restartNumberingAfterBreak="0">
+  <w:abstractNum w:abstractNumId="150" w15:restartNumberingAfterBreak="0">
     <w:nsid w:val="77B8201F"/>
     <w:multiLevelType w:val="hybridMultilevel"/>
     <w:tmpl w:val="D7160708"/>
@@ -27523,7 +28938,7 @@
       </w:rPr>
     </w:lvl>
   </w:abstractNum>
-  <w:abstractNum w:abstractNumId="149" w15:restartNumberingAfterBreak="0">
+  <w:abstractNum w:abstractNumId="151" w15:restartNumberingAfterBreak="0">
     <w:nsid w:val="79796FF9"/>
     <w:multiLevelType w:val="hybridMultilevel"/>
     <w:tmpl w:val="CFA8EF82"/>
@@ -27635,7 +29050,7 @@
       </w:rPr>
     </w:lvl>
   </w:abstractNum>
-  <w:abstractNum w:abstractNumId="150" w15:restartNumberingAfterBreak="0">
+  <w:abstractNum w:abstractNumId="152" w15:restartNumberingAfterBreak="0">
     <w:nsid w:val="79910410"/>
     <w:multiLevelType w:val="hybridMultilevel"/>
     <w:tmpl w:val="FC923542"/>
@@ -27747,7 +29162,7 @@
       </w:rPr>
     </w:lvl>
   </w:abstractNum>
-  <w:abstractNum w:abstractNumId="151" w15:restartNumberingAfterBreak="0">
+  <w:abstractNum w:abstractNumId="153" w15:restartNumberingAfterBreak="0">
     <w:nsid w:val="7AFF575A"/>
     <w:multiLevelType w:val="hybridMultilevel"/>
     <w:tmpl w:val="A6323D3E"/>
@@ -27859,7 +29274,7 @@
       </w:rPr>
     </w:lvl>
   </w:abstractNum>
-  <w:abstractNum w:abstractNumId="152" w15:restartNumberingAfterBreak="0">
+  <w:abstractNum w:abstractNumId="154" w15:restartNumberingAfterBreak="0">
     <w:nsid w:val="7B4018BF"/>
     <w:multiLevelType w:val="multilevel"/>
     <w:tmpl w:val="63F4E6F0"/>
@@ -28008,7 +29423,7 @@
       </w:rPr>
     </w:lvl>
   </w:abstractNum>
-  <w:abstractNum w:abstractNumId="153" w15:restartNumberingAfterBreak="0">
+  <w:abstractNum w:abstractNumId="155" w15:restartNumberingAfterBreak="0">
     <w:nsid w:val="7B4D1B33"/>
     <w:multiLevelType w:val="hybridMultilevel"/>
     <w:tmpl w:val="5EAC717E"/>
@@ -28120,7 +29535,7 @@
       </w:rPr>
     </w:lvl>
   </w:abstractNum>
-  <w:abstractNum w:abstractNumId="154" w15:restartNumberingAfterBreak="0">
+  <w:abstractNum w:abstractNumId="156" w15:restartNumberingAfterBreak="0">
     <w:nsid w:val="7CAC27CD"/>
     <w:multiLevelType w:val="multilevel"/>
     <w:tmpl w:val="3BC20E58"/>
@@ -28269,7 +29684,7 @@
       </w:rPr>
     </w:lvl>
   </w:abstractNum>
-  <w:abstractNum w:abstractNumId="155" w15:restartNumberingAfterBreak="0">
+  <w:abstractNum w:abstractNumId="157" w15:restartNumberingAfterBreak="0">
     <w:nsid w:val="7E5978EA"/>
     <w:multiLevelType w:val="hybridMultilevel"/>
     <w:tmpl w:val="D74C0DB0"/>
@@ -28381,7 +29796,7 @@
       </w:rPr>
     </w:lvl>
   </w:abstractNum>
-  <w:abstractNum w:abstractNumId="156" w15:restartNumberingAfterBreak="0">
+  <w:abstractNum w:abstractNumId="158" w15:restartNumberingAfterBreak="0">
     <w:nsid w:val="7F106A5D"/>
     <w:multiLevelType w:val="hybridMultilevel"/>
     <w:tmpl w:val="A1CA4816"/>
@@ -28494,7 +29909,7 @@
     </w:lvl>
   </w:abstractNum>
   <w:num w:numId="1" w16cid:durableId="1882476756">
-    <w:abstractNumId w:val="91"/>
+    <w:abstractNumId w:val="92"/>
   </w:num>
   <w:num w:numId="2" w16cid:durableId="871453468">
     <w:abstractNumId w:val="26"/>
@@ -28503,73 +29918,73 @@
     <w:abstractNumId w:val="41"/>
   </w:num>
   <w:num w:numId="4" w16cid:durableId="1105467722">
-    <w:abstractNumId w:val="76"/>
+    <w:abstractNumId w:val="77"/>
   </w:num>
   <w:num w:numId="5" w16cid:durableId="769932622">
-    <w:abstractNumId w:val="107"/>
+    <w:abstractNumId w:val="108"/>
   </w:num>
   <w:num w:numId="6" w16cid:durableId="575944109">
     <w:abstractNumId w:val="45"/>
   </w:num>
   <w:num w:numId="7" w16cid:durableId="877661689">
-    <w:abstractNumId w:val="141"/>
+    <w:abstractNumId w:val="142"/>
   </w:num>
   <w:num w:numId="8" w16cid:durableId="1390107422">
-    <w:abstractNumId w:val="81"/>
+    <w:abstractNumId w:val="82"/>
   </w:num>
   <w:num w:numId="9" w16cid:durableId="881866424">
-    <w:abstractNumId w:val="103"/>
+    <w:abstractNumId w:val="104"/>
   </w:num>
   <w:num w:numId="10" w16cid:durableId="1037244995">
-    <w:abstractNumId w:val="132"/>
+    <w:abstractNumId w:val="133"/>
   </w:num>
   <w:num w:numId="11" w16cid:durableId="1575554597">
-    <w:abstractNumId w:val="66"/>
+    <w:abstractNumId w:val="67"/>
   </w:num>
   <w:num w:numId="12" w16cid:durableId="915364478">
-    <w:abstractNumId w:val="87"/>
+    <w:abstractNumId w:val="88"/>
   </w:num>
   <w:num w:numId="13" w16cid:durableId="1386294114">
-    <w:abstractNumId w:val="123"/>
+    <w:abstractNumId w:val="124"/>
   </w:num>
   <w:num w:numId="14" w16cid:durableId="1071851223">
     <w:abstractNumId w:val="27"/>
   </w:num>
   <w:num w:numId="15" w16cid:durableId="1545557520">
-    <w:abstractNumId w:val="77"/>
+    <w:abstractNumId w:val="78"/>
   </w:num>
   <w:num w:numId="16" w16cid:durableId="1102919547">
-    <w:abstractNumId w:val="154"/>
+    <w:abstractNumId w:val="156"/>
   </w:num>
   <w:num w:numId="17" w16cid:durableId="294526838">
     <w:abstractNumId w:val="57"/>
   </w:num>
   <w:num w:numId="18" w16cid:durableId="679889896">
-    <w:abstractNumId w:val="64"/>
+    <w:abstractNumId w:val="65"/>
   </w:num>
   <w:num w:numId="19" w16cid:durableId="2119449470">
-    <w:abstractNumId w:val="99"/>
+    <w:abstractNumId w:val="100"/>
   </w:num>
   <w:num w:numId="20" w16cid:durableId="1365054799">
     <w:abstractNumId w:val="15"/>
   </w:num>
   <w:num w:numId="21" w16cid:durableId="1683512738">
-    <w:abstractNumId w:val="65"/>
+    <w:abstractNumId w:val="66"/>
   </w:num>
   <w:num w:numId="22" w16cid:durableId="1080098953">
-    <w:abstractNumId w:val="128"/>
+    <w:abstractNumId w:val="129"/>
   </w:num>
   <w:num w:numId="23" w16cid:durableId="1635717296">
-    <w:abstractNumId w:val="70"/>
+    <w:abstractNumId w:val="71"/>
   </w:num>
   <w:num w:numId="24" w16cid:durableId="544873123">
-    <w:abstractNumId w:val="122"/>
+    <w:abstractNumId w:val="123"/>
   </w:num>
   <w:num w:numId="25" w16cid:durableId="1128352778">
     <w:abstractNumId w:val="14"/>
   </w:num>
   <w:num w:numId="26" w16cid:durableId="1732537407">
-    <w:abstractNumId w:val="136"/>
+    <w:abstractNumId w:val="137"/>
   </w:num>
   <w:num w:numId="27" w16cid:durableId="945502064">
     <w:abstractNumId w:val="7"/>
@@ -28578,10 +29993,10 @@
     <w:abstractNumId w:val="4"/>
   </w:num>
   <w:num w:numId="29" w16cid:durableId="815955639">
-    <w:abstractNumId w:val="63"/>
+    <w:abstractNumId w:val="64"/>
   </w:num>
   <w:num w:numId="30" w16cid:durableId="1500659483">
-    <w:abstractNumId w:val="84"/>
+    <w:abstractNumId w:val="85"/>
   </w:num>
   <w:num w:numId="31" w16cid:durableId="118301211">
     <w:abstractNumId w:val="16"/>
@@ -28596,43 +30011,43 @@
     <w:abstractNumId w:val="52"/>
   </w:num>
   <w:num w:numId="35" w16cid:durableId="356852923">
-    <w:abstractNumId w:val="98"/>
+    <w:abstractNumId w:val="99"/>
   </w:num>
   <w:num w:numId="36" w16cid:durableId="430662559">
     <w:abstractNumId w:val="22"/>
   </w:num>
   <w:num w:numId="37" w16cid:durableId="247080868">
+    <w:abstractNumId w:val="146"/>
+  </w:num>
+  <w:num w:numId="38" w16cid:durableId="158887408">
+    <w:abstractNumId w:val="121"/>
+  </w:num>
+  <w:num w:numId="39" w16cid:durableId="1681347932">
+    <w:abstractNumId w:val="141"/>
+  </w:num>
+  <w:num w:numId="40" w16cid:durableId="2101440158">
+    <w:abstractNumId w:val="81"/>
+  </w:num>
+  <w:num w:numId="41" w16cid:durableId="1250391122">
+    <w:abstractNumId w:val="116"/>
+  </w:num>
+  <w:num w:numId="42" w16cid:durableId="479083359">
     <w:abstractNumId w:val="145"/>
   </w:num>
-  <w:num w:numId="38" w16cid:durableId="158887408">
-    <w:abstractNumId w:val="120"/>
-  </w:num>
-  <w:num w:numId="39" w16cid:durableId="1681347932">
-    <w:abstractNumId w:val="140"/>
-  </w:num>
-  <w:num w:numId="40" w16cid:durableId="2101440158">
-    <w:abstractNumId w:val="80"/>
-  </w:num>
-  <w:num w:numId="41" w16cid:durableId="1250391122">
-    <w:abstractNumId w:val="115"/>
-  </w:num>
-  <w:num w:numId="42" w16cid:durableId="479083359">
-    <w:abstractNumId w:val="144"/>
-  </w:num>
   <w:num w:numId="43" w16cid:durableId="1557860317">
-    <w:abstractNumId w:val="100"/>
+    <w:abstractNumId w:val="101"/>
   </w:num>
   <w:num w:numId="44" w16cid:durableId="2142183763">
     <w:abstractNumId w:val="9"/>
   </w:num>
   <w:num w:numId="45" w16cid:durableId="1357736349">
-    <w:abstractNumId w:val="150"/>
+    <w:abstractNumId w:val="152"/>
   </w:num>
   <w:num w:numId="46" w16cid:durableId="1519656040">
-    <w:abstractNumId w:val="149"/>
+    <w:abstractNumId w:val="151"/>
   </w:num>
   <w:num w:numId="47" w16cid:durableId="1078596852">
-    <w:abstractNumId w:val="156"/>
+    <w:abstractNumId w:val="158"/>
   </w:num>
   <w:num w:numId="48" w16cid:durableId="1027950100">
     <w:abstractNumId w:val="37"/>
@@ -28641,22 +30056,22 @@
     <w:abstractNumId w:val="21"/>
   </w:num>
   <w:num w:numId="50" w16cid:durableId="363404927">
-    <w:abstractNumId w:val="71"/>
+    <w:abstractNumId w:val="72"/>
   </w:num>
   <w:num w:numId="51" w16cid:durableId="1128354320">
-    <w:abstractNumId w:val="134"/>
+    <w:abstractNumId w:val="135"/>
   </w:num>
   <w:num w:numId="52" w16cid:durableId="248543928">
-    <w:abstractNumId w:val="79"/>
+    <w:abstractNumId w:val="80"/>
   </w:num>
   <w:num w:numId="53" w16cid:durableId="965889214">
-    <w:abstractNumId w:val="105"/>
+    <w:abstractNumId w:val="106"/>
   </w:num>
   <w:num w:numId="54" w16cid:durableId="1827503240">
-    <w:abstractNumId w:val="113"/>
+    <w:abstractNumId w:val="114"/>
   </w:num>
   <w:num w:numId="55" w16cid:durableId="505748256">
-    <w:abstractNumId w:val="95"/>
+    <w:abstractNumId w:val="96"/>
   </w:num>
   <w:num w:numId="56" w16cid:durableId="2120370925">
     <w:abstractNumId w:val="34"/>
@@ -28665,52 +30080,52 @@
     <w:abstractNumId w:val="18"/>
   </w:num>
   <w:num w:numId="58" w16cid:durableId="1000235123">
-    <w:abstractNumId w:val="101"/>
+    <w:abstractNumId w:val="102"/>
   </w:num>
   <w:num w:numId="59" w16cid:durableId="628516409">
-    <w:abstractNumId w:val="133"/>
+    <w:abstractNumId w:val="134"/>
   </w:num>
   <w:num w:numId="60" w16cid:durableId="2028865444">
-    <w:abstractNumId w:val="93"/>
+    <w:abstractNumId w:val="94"/>
   </w:num>
   <w:num w:numId="61" w16cid:durableId="943926811">
-    <w:abstractNumId w:val="153"/>
+    <w:abstractNumId w:val="155"/>
   </w:num>
   <w:num w:numId="62" w16cid:durableId="1841193257">
-    <w:abstractNumId w:val="73"/>
+    <w:abstractNumId w:val="74"/>
   </w:num>
   <w:num w:numId="63" w16cid:durableId="682322850">
-    <w:abstractNumId w:val="137"/>
+    <w:abstractNumId w:val="138"/>
   </w:num>
   <w:num w:numId="64" w16cid:durableId="2043705333">
-    <w:abstractNumId w:val="74"/>
+    <w:abstractNumId w:val="75"/>
   </w:num>
   <w:num w:numId="65" w16cid:durableId="1164854761">
     <w:abstractNumId w:val="56"/>
   </w:num>
   <w:num w:numId="66" w16cid:durableId="1919972541">
-    <w:abstractNumId w:val="89"/>
+    <w:abstractNumId w:val="90"/>
   </w:num>
   <w:num w:numId="67" w16cid:durableId="463617329">
-    <w:abstractNumId w:val="60"/>
+    <w:abstractNumId w:val="61"/>
   </w:num>
   <w:num w:numId="68" w16cid:durableId="2064014330">
-    <w:abstractNumId w:val="109"/>
+    <w:abstractNumId w:val="110"/>
   </w:num>
   <w:num w:numId="69" w16cid:durableId="452797354">
-    <w:abstractNumId w:val="114"/>
+    <w:abstractNumId w:val="115"/>
   </w:num>
   <w:num w:numId="70" w16cid:durableId="1196650037">
     <w:abstractNumId w:val="50"/>
   </w:num>
   <w:num w:numId="71" w16cid:durableId="940071828">
-    <w:abstractNumId w:val="148"/>
+    <w:abstractNumId w:val="150"/>
   </w:num>
   <w:num w:numId="72" w16cid:durableId="1608273926">
-    <w:abstractNumId w:val="75"/>
+    <w:abstractNumId w:val="76"/>
   </w:num>
   <w:num w:numId="73" w16cid:durableId="2009864772">
-    <w:abstractNumId w:val="90"/>
+    <w:abstractNumId w:val="91"/>
   </w:num>
   <w:num w:numId="74" w16cid:durableId="712267004">
     <w:abstractNumId w:val="36"/>
@@ -28719,10 +30134,10 @@
     <w:abstractNumId w:val="32"/>
   </w:num>
   <w:num w:numId="76" w16cid:durableId="286202349">
-    <w:abstractNumId w:val="119"/>
+    <w:abstractNumId w:val="120"/>
   </w:num>
   <w:num w:numId="77" w16cid:durableId="156460757">
-    <w:abstractNumId w:val="67"/>
+    <w:abstractNumId w:val="68"/>
   </w:num>
   <w:num w:numId="78" w16cid:durableId="1230077056">
     <w:abstractNumId w:val="6"/>
@@ -28734,7 +30149,7 @@
     <w:abstractNumId w:val="35"/>
   </w:num>
   <w:num w:numId="81" w16cid:durableId="1672175260">
-    <w:abstractNumId w:val="85"/>
+    <w:abstractNumId w:val="86"/>
   </w:num>
   <w:num w:numId="82" w16cid:durableId="1954820163">
     <w:abstractNumId w:val="59"/>
@@ -28743,7 +30158,7 @@
     <w:abstractNumId w:val="24"/>
   </w:num>
   <w:num w:numId="84" w16cid:durableId="366876741">
-    <w:abstractNumId w:val="92"/>
+    <w:abstractNumId w:val="93"/>
   </w:num>
   <w:num w:numId="85" w16cid:durableId="15274915">
     <w:abstractNumId w:val="39"/>
@@ -28752,22 +30167,22 @@
     <w:abstractNumId w:val="10"/>
   </w:num>
   <w:num w:numId="87" w16cid:durableId="591351385">
-    <w:abstractNumId w:val="106"/>
+    <w:abstractNumId w:val="107"/>
   </w:num>
   <w:num w:numId="88" w16cid:durableId="1361005725">
-    <w:abstractNumId w:val="151"/>
+    <w:abstractNumId w:val="153"/>
   </w:num>
   <w:num w:numId="89" w16cid:durableId="219681743">
     <w:abstractNumId w:val="11"/>
   </w:num>
   <w:num w:numId="90" w16cid:durableId="194386594">
-    <w:abstractNumId w:val="116"/>
+    <w:abstractNumId w:val="117"/>
   </w:num>
   <w:num w:numId="91" w16cid:durableId="777793346">
-    <w:abstractNumId w:val="83"/>
+    <w:abstractNumId w:val="84"/>
   </w:num>
   <w:num w:numId="92" w16cid:durableId="173346871">
-    <w:abstractNumId w:val="88"/>
+    <w:abstractNumId w:val="89"/>
   </w:num>
   <w:num w:numId="93" w16cid:durableId="948700467">
     <w:abstractNumId w:val="40"/>
@@ -28776,10 +30191,10 @@
     <w:abstractNumId w:val="23"/>
   </w:num>
   <w:num w:numId="95" w16cid:durableId="541676570">
-    <w:abstractNumId w:val="68"/>
+    <w:abstractNumId w:val="69"/>
   </w:num>
   <w:num w:numId="96" w16cid:durableId="694119229">
-    <w:abstractNumId w:val="86"/>
+    <w:abstractNumId w:val="87"/>
   </w:num>
   <w:num w:numId="97" w16cid:durableId="704327987">
     <w:abstractNumId w:val="54"/>
@@ -28788,28 +30203,28 @@
     <w:abstractNumId w:val="25"/>
   </w:num>
   <w:num w:numId="99" w16cid:durableId="1706099794">
-    <w:abstractNumId w:val="139"/>
+    <w:abstractNumId w:val="140"/>
   </w:num>
   <w:num w:numId="100" w16cid:durableId="256404901">
-    <w:abstractNumId w:val="138"/>
+    <w:abstractNumId w:val="139"/>
   </w:num>
   <w:num w:numId="101" w16cid:durableId="924923012">
     <w:abstractNumId w:val="29"/>
   </w:num>
   <w:num w:numId="102" w16cid:durableId="536550966">
-    <w:abstractNumId w:val="152"/>
+    <w:abstractNumId w:val="154"/>
   </w:num>
   <w:num w:numId="103" w16cid:durableId="425157302">
-    <w:abstractNumId w:val="69"/>
+    <w:abstractNumId w:val="70"/>
   </w:num>
   <w:num w:numId="104" w16cid:durableId="967664612">
-    <w:abstractNumId w:val="125"/>
+    <w:abstractNumId w:val="126"/>
   </w:num>
   <w:num w:numId="105" w16cid:durableId="361631616">
-    <w:abstractNumId w:val="94"/>
+    <w:abstractNumId w:val="95"/>
   </w:num>
   <w:num w:numId="106" w16cid:durableId="443623616">
-    <w:abstractNumId w:val="129"/>
+    <w:abstractNumId w:val="130"/>
   </w:num>
   <w:num w:numId="107" w16cid:durableId="150101619">
     <w:abstractNumId w:val="12"/>
@@ -28821,28 +30236,28 @@
     <w:abstractNumId w:val="0"/>
   </w:num>
   <w:num w:numId="110" w16cid:durableId="712924661">
-    <w:abstractNumId w:val="112"/>
+    <w:abstractNumId w:val="113"/>
   </w:num>
   <w:num w:numId="111" w16cid:durableId="1917784113">
-    <w:abstractNumId w:val="108"/>
+    <w:abstractNumId w:val="109"/>
   </w:num>
   <w:num w:numId="112" w16cid:durableId="896237065">
-    <w:abstractNumId w:val="117"/>
+    <w:abstractNumId w:val="118"/>
   </w:num>
   <w:num w:numId="113" w16cid:durableId="1171681430">
-    <w:abstractNumId w:val="142"/>
+    <w:abstractNumId w:val="143"/>
   </w:num>
   <w:num w:numId="114" w16cid:durableId="1552573199">
-    <w:abstractNumId w:val="143"/>
+    <w:abstractNumId w:val="144"/>
   </w:num>
   <w:num w:numId="115" w16cid:durableId="1920869674">
-    <w:abstractNumId w:val="127"/>
+    <w:abstractNumId w:val="128"/>
   </w:num>
   <w:num w:numId="116" w16cid:durableId="476724716">
-    <w:abstractNumId w:val="97"/>
+    <w:abstractNumId w:val="98"/>
   </w:num>
   <w:num w:numId="117" w16cid:durableId="658919541">
-    <w:abstractNumId w:val="96"/>
+    <w:abstractNumId w:val="97"/>
   </w:num>
   <w:num w:numId="118" w16cid:durableId="1622418131">
     <w:abstractNumId w:val="47"/>
@@ -28851,19 +30266,19 @@
     <w:abstractNumId w:val="3"/>
   </w:num>
   <w:num w:numId="120" w16cid:durableId="396828229">
-    <w:abstractNumId w:val="147"/>
+    <w:abstractNumId w:val="149"/>
   </w:num>
   <w:num w:numId="121" w16cid:durableId="986058889">
     <w:abstractNumId w:val="20"/>
   </w:num>
   <w:num w:numId="122" w16cid:durableId="1224410703">
-    <w:abstractNumId w:val="62"/>
+    <w:abstractNumId w:val="63"/>
   </w:num>
   <w:num w:numId="123" w16cid:durableId="1804040304">
-    <w:abstractNumId w:val="82"/>
+    <w:abstractNumId w:val="83"/>
   </w:num>
   <w:num w:numId="124" w16cid:durableId="114181197">
-    <w:abstractNumId w:val="146"/>
+    <w:abstractNumId w:val="147"/>
   </w:num>
   <w:num w:numId="125" w16cid:durableId="772671624">
     <w:abstractNumId w:val="5"/>
@@ -28878,19 +30293,19 @@
     <w:abstractNumId w:val="30"/>
   </w:num>
   <w:num w:numId="129" w16cid:durableId="659895420">
-    <w:abstractNumId w:val="61"/>
+    <w:abstractNumId w:val="62"/>
   </w:num>
   <w:num w:numId="130" w16cid:durableId="1168907903">
-    <w:abstractNumId w:val="130"/>
+    <w:abstractNumId w:val="131"/>
   </w:num>
   <w:num w:numId="131" w16cid:durableId="430206235">
-    <w:abstractNumId w:val="121"/>
+    <w:abstractNumId w:val="122"/>
   </w:num>
   <w:num w:numId="132" w16cid:durableId="1207327089">
     <w:abstractNumId w:val="28"/>
   </w:num>
   <w:num w:numId="133" w16cid:durableId="596404292">
-    <w:abstractNumId w:val="110"/>
+    <w:abstractNumId w:val="111"/>
   </w:num>
   <w:num w:numId="134" w16cid:durableId="2070372549">
     <w:abstractNumId w:val="44"/>
@@ -28902,28 +30317,28 @@
     <w:abstractNumId w:val="43"/>
   </w:num>
   <w:num w:numId="137" w16cid:durableId="1218275126">
-    <w:abstractNumId w:val="72"/>
+    <w:abstractNumId w:val="73"/>
   </w:num>
   <w:num w:numId="138" w16cid:durableId="568660900">
-    <w:abstractNumId w:val="78"/>
+    <w:abstractNumId w:val="79"/>
   </w:num>
   <w:num w:numId="139" w16cid:durableId="967976864">
-    <w:abstractNumId w:val="111"/>
+    <w:abstractNumId w:val="112"/>
   </w:num>
   <w:num w:numId="140" w16cid:durableId="650643288">
-    <w:abstractNumId w:val="126"/>
+    <w:abstractNumId w:val="127"/>
   </w:num>
   <w:num w:numId="141" w16cid:durableId="219370247">
-    <w:abstractNumId w:val="124"/>
+    <w:abstractNumId w:val="125"/>
   </w:num>
   <w:num w:numId="142" w16cid:durableId="323239876">
-    <w:abstractNumId w:val="155"/>
+    <w:abstractNumId w:val="157"/>
   </w:num>
   <w:num w:numId="143" w16cid:durableId="1619793156">
     <w:abstractNumId w:val="33"/>
   </w:num>
   <w:num w:numId="144" w16cid:durableId="1186332867">
-    <w:abstractNumId w:val="135"/>
+    <w:abstractNumId w:val="136"/>
   </w:num>
   <w:num w:numId="145" w16cid:durableId="89937035">
     <w:abstractNumId w:val="55"/>
@@ -28932,10 +30347,10 @@
     <w:abstractNumId w:val="1"/>
   </w:num>
   <w:num w:numId="147" w16cid:durableId="1760910030">
-    <w:abstractNumId w:val="102"/>
+    <w:abstractNumId w:val="103"/>
   </w:num>
   <w:num w:numId="148" w16cid:durableId="349307706">
-    <w:abstractNumId w:val="131"/>
+    <w:abstractNumId w:val="132"/>
   </w:num>
   <w:num w:numId="149" w16cid:durableId="1600336622">
     <w:abstractNumId w:val="31"/>
@@ -28947,10 +30362,10 @@
     <w:abstractNumId w:val="13"/>
   </w:num>
   <w:num w:numId="152" w16cid:durableId="1483890789">
-    <w:abstractNumId w:val="104"/>
+    <w:abstractNumId w:val="105"/>
   </w:num>
   <w:num w:numId="153" w16cid:durableId="2104719660">
-    <w:abstractNumId w:val="118"/>
+    <w:abstractNumId w:val="119"/>
   </w:num>
   <w:num w:numId="154" w16cid:durableId="2030252929">
     <w:abstractNumId w:val="51"/>
@@ -28963,6 +30378,12 @@
   </w:num>
   <w:num w:numId="157" w16cid:durableId="1514421104">
     <w:abstractNumId w:val="2"/>
+  </w:num>
+  <w:num w:numId="158" w16cid:durableId="1034845685">
+    <w:abstractNumId w:val="148"/>
+  </w:num>
+  <w:num w:numId="159" w16cid:durableId="1262639594">
+    <w:abstractNumId w:val="60"/>
   </w:num>
 </w:numbering>
 </file>

</xml_diff>

<commit_message>
Dispute Management APIs (#398)
</commit_message>
<xml_diff>
--- a/API Design.docx
+++ b/API Design.docx
@@ -14682,13 +14682,1183 @@
       </w:r>
     </w:p>
     <w:p/>
+    <w:p>
+      <w:pPr>
+        <w:spacing w:line="278" w:lineRule="auto"/>
+      </w:pPr>
+      <w:r>
+        <w:br w:type="page"/>
+      </w:r>
+    </w:p>
+    <w:p>
+      <w:pPr>
+        <w:pStyle w:val="Heading3"/>
+      </w:pPr>
+      <w:r>
+        <w:lastRenderedPageBreak/>
+        <w:t>Dispute Management APIs</w:t>
+      </w:r>
+    </w:p>
+    <w:p>
+      <w:r>
+        <w:t>The Dispute Management APIs offer the capabilities necessary for administrators to be able to manage and resolve disputes that have emerged between customers and rental agencies on the KriGo platform. In particular, the dispute management API allows administrators to examine disputes, investigate evidence, interact with the involved parties, and make decision in relation to dispute resolution, in accordance with the guidelines set out in the platform policies.</w:t>
+      </w:r>
+    </w:p>
+    <w:p>
+      <w:r>
+        <w:t>The Dispute Management API follows RESTful architecture, with each dispute being considered a resource, which is uniquely identified using a unique identifier. Each operation concerning dispute management should involve authentication via JSON Web Token (JWT) and authorization using the Role-Based Access Control approach. In addition, access to this API endpoint is allowed to only users who have the Administrator role.</w:t>
+      </w:r>
+    </w:p>
+    <w:p>
+      <w:r>
+        <w:t>Dispute Management API interacts with Reservation Service, Payment Service, Customer Service, Agency Management Service, and Notification Service. It allows administrators to examine details of reservations and payments, receive customer complaints, and investigate agency records. Following the resolution of a dispute, the system automatically updates its status and stores administrative decision in an audit log. In addition, it notifies parties involved about the decision.</w:t>
+      </w:r>
+    </w:p>
+    <w:p>
+      <w:pPr>
+        <w:pStyle w:val="Title"/>
+      </w:pPr>
+      <w:r>
+        <w:t>Dispute Management API Endpoints</w:t>
+      </w:r>
+    </w:p>
+    <w:p>
+      <w:pPr>
+        <w:pStyle w:val="Caption"/>
+        <w:keepNext/>
+      </w:pPr>
+      <w:r>
+        <w:t xml:space="preserve">Table </w:t>
+      </w:r>
+      <w:r>
+        <w:fldChar w:fldCharType="begin"/>
+      </w:r>
+      <w:r>
+        <w:instrText xml:space="preserve"> SEQ Table \* ARABIC </w:instrText>
+      </w:r>
+      <w:r>
+        <w:fldChar w:fldCharType="separate"/>
+      </w:r>
+      <w:r>
+        <w:rPr>
+          <w:noProof/>
+        </w:rPr>
+        <w:t>14</w:t>
+      </w:r>
+      <w:r>
+        <w:fldChar w:fldCharType="end"/>
+      </w:r>
+      <w:r>
+        <w:t xml:space="preserve"> - </w:t>
+      </w:r>
+      <w:r>
+        <w:t>Dispute Management API Endpoints</w:t>
+      </w:r>
+    </w:p>
+    <w:tbl>
+      <w:tblPr>
+        <w:tblStyle w:val="PlainTable1"/>
+        <w:tblW w:w="0" w:type="auto"/>
+        <w:tblCellMar>
+          <w:top w:w="72" w:type="dxa"/>
+          <w:bottom w:w="72" w:type="dxa"/>
+        </w:tblCellMar>
+        <w:tblLook w:val="04A0" w:firstRow="1" w:lastRow="0" w:firstColumn="1" w:lastColumn="0" w:noHBand="0" w:noVBand="1"/>
+      </w:tblPr>
+      <w:tblGrid>
+        <w:gridCol w:w="4553"/>
+        <w:gridCol w:w="1016"/>
+        <w:gridCol w:w="3041"/>
+        <w:gridCol w:w="737"/>
+      </w:tblGrid>
+      <w:tr>
+        <w:trPr>
+          <w:cnfStyle w:val="100000000000" w:firstRow="1" w:lastRow="0" w:firstColumn="0" w:lastColumn="0" w:oddVBand="0" w:evenVBand="0" w:oddHBand="0" w:evenHBand="0" w:firstRowFirstColumn="0" w:firstRowLastColumn="0" w:lastRowFirstColumn="0" w:lastRowLastColumn="0"/>
+          <w:trHeight w:val="432"/>
+        </w:trPr>
+        <w:tc>
+          <w:tcPr>
+            <w:cnfStyle w:val="001000000000" w:firstRow="0" w:lastRow="0" w:firstColumn="1" w:lastColumn="0" w:oddVBand="0" w:evenVBand="0" w:oddHBand="0" w:evenHBand="0" w:firstRowFirstColumn="0" w:firstRowLastColumn="0" w:lastRowFirstColumn="0" w:lastRowLastColumn="0"/>
+            <w:tcW w:w="0" w:type="auto"/>
+            <w:vAlign w:val="center"/>
+            <w:hideMark/>
+          </w:tcPr>
+          <w:p>
+            <w:r>
+              <w:t>Endpoint</w:t>
+            </w:r>
+          </w:p>
+        </w:tc>
+        <w:tc>
+          <w:tcPr>
+            <w:tcW w:w="0" w:type="auto"/>
+            <w:vAlign w:val="center"/>
+            <w:hideMark/>
+          </w:tcPr>
+          <w:p>
+            <w:pPr>
+              <w:jc w:val="center"/>
+              <w:cnfStyle w:val="100000000000" w:firstRow="1" w:lastRow="0" w:firstColumn="0" w:lastColumn="0" w:oddVBand="0" w:evenVBand="0" w:oddHBand="0" w:evenHBand="0" w:firstRowFirstColumn="0" w:firstRowLastColumn="0" w:lastRowFirstColumn="0" w:lastRowLastColumn="0"/>
+            </w:pPr>
+            <w:r>
+              <w:t>Method</w:t>
+            </w:r>
+          </w:p>
+        </w:tc>
+        <w:tc>
+          <w:tcPr>
+            <w:tcW w:w="0" w:type="auto"/>
+            <w:vAlign w:val="center"/>
+            <w:hideMark/>
+          </w:tcPr>
+          <w:p>
+            <w:pPr>
+              <w:cnfStyle w:val="100000000000" w:firstRow="1" w:lastRow="0" w:firstColumn="0" w:lastColumn="0" w:oddVBand="0" w:evenVBand="0" w:oddHBand="0" w:evenHBand="0" w:firstRowFirstColumn="0" w:firstRowLastColumn="0" w:lastRowFirstColumn="0" w:lastRowLastColumn="0"/>
+            </w:pPr>
+            <w:r>
+              <w:t>Description</w:t>
+            </w:r>
+          </w:p>
+        </w:tc>
+        <w:tc>
+          <w:tcPr>
+            <w:tcW w:w="0" w:type="auto"/>
+            <w:vAlign w:val="center"/>
+            <w:hideMark/>
+          </w:tcPr>
+          <w:p>
+            <w:pPr>
+              <w:jc w:val="center"/>
+              <w:cnfStyle w:val="100000000000" w:firstRow="1" w:lastRow="0" w:firstColumn="0" w:lastColumn="0" w:oddVBand="0" w:evenVBand="0" w:oddHBand="0" w:evenHBand="0" w:firstRowFirstColumn="0" w:firstRowLastColumn="0" w:lastRowFirstColumn="0" w:lastRowLastColumn="0"/>
+            </w:pPr>
+            <w:r>
+              <w:t>Auth</w:t>
+            </w:r>
+          </w:p>
+        </w:tc>
+      </w:tr>
+      <w:tr>
+        <w:trPr>
+          <w:cnfStyle w:val="000000100000" w:firstRow="0" w:lastRow="0" w:firstColumn="0" w:lastColumn="0" w:oddVBand="0" w:evenVBand="0" w:oddHBand="1" w:evenHBand="0" w:firstRowFirstColumn="0" w:firstRowLastColumn="0" w:lastRowFirstColumn="0" w:lastRowLastColumn="0"/>
+          <w:trHeight w:val="432"/>
+        </w:trPr>
+        <w:tc>
+          <w:tcPr>
+            <w:cnfStyle w:val="001000000000" w:firstRow="0" w:lastRow="0" w:firstColumn="1" w:lastColumn="0" w:oddVBand="0" w:evenVBand="0" w:oddHBand="0" w:evenHBand="0" w:firstRowFirstColumn="0" w:firstRowLastColumn="0" w:lastRowFirstColumn="0" w:lastRowLastColumn="0"/>
+            <w:tcW w:w="0" w:type="auto"/>
+            <w:vAlign w:val="center"/>
+            <w:hideMark/>
+          </w:tcPr>
+          <w:p>
+            <w:pPr>
+              <w:rPr>
+                <w:b w:val="0"/>
+                <w:bCs w:val="0"/>
+              </w:rPr>
+            </w:pPr>
+            <w:r>
+              <w:rPr>
+                <w:b w:val="0"/>
+                <w:bCs w:val="0"/>
+              </w:rPr>
+              <w:t>/api/v1/admin/disputes</w:t>
+            </w:r>
+          </w:p>
+        </w:tc>
+        <w:tc>
+          <w:tcPr>
+            <w:tcW w:w="0" w:type="auto"/>
+            <w:vAlign w:val="center"/>
+            <w:hideMark/>
+          </w:tcPr>
+          <w:p>
+            <w:pPr>
+              <w:jc w:val="center"/>
+              <w:cnfStyle w:val="000000100000" w:firstRow="0" w:lastRow="0" w:firstColumn="0" w:lastColumn="0" w:oddVBand="0" w:evenVBand="0" w:oddHBand="1" w:evenHBand="0" w:firstRowFirstColumn="0" w:firstRowLastColumn="0" w:lastRowFirstColumn="0" w:lastRowLastColumn="0"/>
+            </w:pPr>
+            <w:r>
+              <w:t>GET</w:t>
+            </w:r>
+          </w:p>
+        </w:tc>
+        <w:tc>
+          <w:tcPr>
+            <w:tcW w:w="0" w:type="auto"/>
+            <w:vAlign w:val="center"/>
+            <w:hideMark/>
+          </w:tcPr>
+          <w:p>
+            <w:pPr>
+              <w:cnfStyle w:val="000000100000" w:firstRow="0" w:lastRow="0" w:firstColumn="0" w:lastColumn="0" w:oddVBand="0" w:evenVBand="0" w:oddHBand="1" w:evenHBand="0" w:firstRowFirstColumn="0" w:firstRowLastColumn="0" w:lastRowFirstColumn="0" w:lastRowLastColumn="0"/>
+            </w:pPr>
+            <w:r>
+              <w:t>Retrieve all disputes</w:t>
+            </w:r>
+          </w:p>
+        </w:tc>
+        <w:tc>
+          <w:tcPr>
+            <w:tcW w:w="0" w:type="auto"/>
+            <w:vAlign w:val="center"/>
+            <w:hideMark/>
+          </w:tcPr>
+          <w:p>
+            <w:pPr>
+              <w:jc w:val="center"/>
+              <w:cnfStyle w:val="000000100000" w:firstRow="0" w:lastRow="0" w:firstColumn="0" w:lastColumn="0" w:oddVBand="0" w:evenVBand="0" w:oddHBand="1" w:evenHBand="0" w:firstRowFirstColumn="0" w:firstRowLastColumn="0" w:lastRowFirstColumn="0" w:lastRowLastColumn="0"/>
+            </w:pPr>
+            <w:r>
+              <w:t>Yes</w:t>
+            </w:r>
+          </w:p>
+        </w:tc>
+      </w:tr>
+      <w:tr>
+        <w:trPr>
+          <w:trHeight w:val="432"/>
+        </w:trPr>
+        <w:tc>
+          <w:tcPr>
+            <w:cnfStyle w:val="001000000000" w:firstRow="0" w:lastRow="0" w:firstColumn="1" w:lastColumn="0" w:oddVBand="0" w:evenVBand="0" w:oddHBand="0" w:evenHBand="0" w:firstRowFirstColumn="0" w:firstRowLastColumn="0" w:lastRowFirstColumn="0" w:lastRowLastColumn="0"/>
+            <w:tcW w:w="0" w:type="auto"/>
+            <w:vAlign w:val="center"/>
+            <w:hideMark/>
+          </w:tcPr>
+          <w:p>
+            <w:pPr>
+              <w:rPr>
+                <w:b w:val="0"/>
+                <w:bCs w:val="0"/>
+              </w:rPr>
+            </w:pPr>
+            <w:r>
+              <w:rPr>
+                <w:b w:val="0"/>
+                <w:bCs w:val="0"/>
+              </w:rPr>
+              <w:t>/api/v1/admin/disputes/{disputeId}</w:t>
+            </w:r>
+          </w:p>
+        </w:tc>
+        <w:tc>
+          <w:tcPr>
+            <w:tcW w:w="0" w:type="auto"/>
+            <w:vAlign w:val="center"/>
+            <w:hideMark/>
+          </w:tcPr>
+          <w:p>
+            <w:pPr>
+              <w:jc w:val="center"/>
+              <w:cnfStyle w:val="000000000000" w:firstRow="0" w:lastRow="0" w:firstColumn="0" w:lastColumn="0" w:oddVBand="0" w:evenVBand="0" w:oddHBand="0" w:evenHBand="0" w:firstRowFirstColumn="0" w:firstRowLastColumn="0" w:lastRowFirstColumn="0" w:lastRowLastColumn="0"/>
+            </w:pPr>
+            <w:r>
+              <w:t>GET</w:t>
+            </w:r>
+          </w:p>
+        </w:tc>
+        <w:tc>
+          <w:tcPr>
+            <w:tcW w:w="0" w:type="auto"/>
+            <w:vAlign w:val="center"/>
+            <w:hideMark/>
+          </w:tcPr>
+          <w:p>
+            <w:pPr>
+              <w:cnfStyle w:val="000000000000" w:firstRow="0" w:lastRow="0" w:firstColumn="0" w:lastColumn="0" w:oddVBand="0" w:evenVBand="0" w:oddHBand="0" w:evenHBand="0" w:firstRowFirstColumn="0" w:firstRowLastColumn="0" w:lastRowFirstColumn="0" w:lastRowLastColumn="0"/>
+            </w:pPr>
+            <w:r>
+              <w:t>Retrieve dispute details</w:t>
+            </w:r>
+          </w:p>
+        </w:tc>
+        <w:tc>
+          <w:tcPr>
+            <w:tcW w:w="0" w:type="auto"/>
+            <w:vAlign w:val="center"/>
+            <w:hideMark/>
+          </w:tcPr>
+          <w:p>
+            <w:pPr>
+              <w:jc w:val="center"/>
+              <w:cnfStyle w:val="000000000000" w:firstRow="0" w:lastRow="0" w:firstColumn="0" w:lastColumn="0" w:oddVBand="0" w:evenVBand="0" w:oddHBand="0" w:evenHBand="0" w:firstRowFirstColumn="0" w:firstRowLastColumn="0" w:lastRowFirstColumn="0" w:lastRowLastColumn="0"/>
+            </w:pPr>
+            <w:r>
+              <w:t>Yes</w:t>
+            </w:r>
+          </w:p>
+        </w:tc>
+      </w:tr>
+      <w:tr>
+        <w:trPr>
+          <w:cnfStyle w:val="000000100000" w:firstRow="0" w:lastRow="0" w:firstColumn="0" w:lastColumn="0" w:oddVBand="0" w:evenVBand="0" w:oddHBand="1" w:evenHBand="0" w:firstRowFirstColumn="0" w:firstRowLastColumn="0" w:lastRowFirstColumn="0" w:lastRowLastColumn="0"/>
+          <w:trHeight w:val="432"/>
+        </w:trPr>
+        <w:tc>
+          <w:tcPr>
+            <w:cnfStyle w:val="001000000000" w:firstRow="0" w:lastRow="0" w:firstColumn="1" w:lastColumn="0" w:oddVBand="0" w:evenVBand="0" w:oddHBand="0" w:evenHBand="0" w:firstRowFirstColumn="0" w:firstRowLastColumn="0" w:lastRowFirstColumn="0" w:lastRowLastColumn="0"/>
+            <w:tcW w:w="0" w:type="auto"/>
+            <w:vAlign w:val="center"/>
+            <w:hideMark/>
+          </w:tcPr>
+          <w:p>
+            <w:pPr>
+              <w:rPr>
+                <w:b w:val="0"/>
+                <w:bCs w:val="0"/>
+              </w:rPr>
+            </w:pPr>
+            <w:r>
+              <w:rPr>
+                <w:b w:val="0"/>
+                <w:bCs w:val="0"/>
+              </w:rPr>
+              <w:t>/api/v1/admin/disputes/{disputeId}/assign</w:t>
+            </w:r>
+          </w:p>
+        </w:tc>
+        <w:tc>
+          <w:tcPr>
+            <w:tcW w:w="0" w:type="auto"/>
+            <w:vAlign w:val="center"/>
+            <w:hideMark/>
+          </w:tcPr>
+          <w:p>
+            <w:pPr>
+              <w:jc w:val="center"/>
+              <w:cnfStyle w:val="000000100000" w:firstRow="0" w:lastRow="0" w:firstColumn="0" w:lastColumn="0" w:oddVBand="0" w:evenVBand="0" w:oddHBand="1" w:evenHBand="0" w:firstRowFirstColumn="0" w:firstRowLastColumn="0" w:lastRowFirstColumn="0" w:lastRowLastColumn="0"/>
+            </w:pPr>
+            <w:r>
+              <w:t>PATCH</w:t>
+            </w:r>
+          </w:p>
+        </w:tc>
+        <w:tc>
+          <w:tcPr>
+            <w:tcW w:w="0" w:type="auto"/>
+            <w:vAlign w:val="center"/>
+            <w:hideMark/>
+          </w:tcPr>
+          <w:p>
+            <w:pPr>
+              <w:cnfStyle w:val="000000100000" w:firstRow="0" w:lastRow="0" w:firstColumn="0" w:lastColumn="0" w:oddVBand="0" w:evenVBand="0" w:oddHBand="1" w:evenHBand="0" w:firstRowFirstColumn="0" w:firstRowLastColumn="0" w:lastRowFirstColumn="0" w:lastRowLastColumn="0"/>
+            </w:pPr>
+            <w:r>
+              <w:t>Assign a dispute to an administrator</w:t>
+            </w:r>
+          </w:p>
+        </w:tc>
+        <w:tc>
+          <w:tcPr>
+            <w:tcW w:w="0" w:type="auto"/>
+            <w:vAlign w:val="center"/>
+            <w:hideMark/>
+          </w:tcPr>
+          <w:p>
+            <w:pPr>
+              <w:jc w:val="center"/>
+              <w:cnfStyle w:val="000000100000" w:firstRow="0" w:lastRow="0" w:firstColumn="0" w:lastColumn="0" w:oddVBand="0" w:evenVBand="0" w:oddHBand="1" w:evenHBand="0" w:firstRowFirstColumn="0" w:firstRowLastColumn="0" w:lastRowFirstColumn="0" w:lastRowLastColumn="0"/>
+            </w:pPr>
+            <w:r>
+              <w:t>Yes</w:t>
+            </w:r>
+          </w:p>
+        </w:tc>
+      </w:tr>
+      <w:tr>
+        <w:trPr>
+          <w:trHeight w:val="432"/>
+        </w:trPr>
+        <w:tc>
+          <w:tcPr>
+            <w:cnfStyle w:val="001000000000" w:firstRow="0" w:lastRow="0" w:firstColumn="1" w:lastColumn="0" w:oddVBand="0" w:evenVBand="0" w:oddHBand="0" w:evenHBand="0" w:firstRowFirstColumn="0" w:firstRowLastColumn="0" w:lastRowFirstColumn="0" w:lastRowLastColumn="0"/>
+            <w:tcW w:w="0" w:type="auto"/>
+            <w:vAlign w:val="center"/>
+            <w:hideMark/>
+          </w:tcPr>
+          <w:p>
+            <w:pPr>
+              <w:rPr>
+                <w:b w:val="0"/>
+                <w:bCs w:val="0"/>
+              </w:rPr>
+            </w:pPr>
+            <w:r>
+              <w:rPr>
+                <w:b w:val="0"/>
+                <w:bCs w:val="0"/>
+              </w:rPr>
+              <w:t>/api/v1/admin/disputes/{disputeId}/resolve</w:t>
+            </w:r>
+          </w:p>
+        </w:tc>
+        <w:tc>
+          <w:tcPr>
+            <w:tcW w:w="0" w:type="auto"/>
+            <w:vAlign w:val="center"/>
+            <w:hideMark/>
+          </w:tcPr>
+          <w:p>
+            <w:pPr>
+              <w:jc w:val="center"/>
+              <w:cnfStyle w:val="000000000000" w:firstRow="0" w:lastRow="0" w:firstColumn="0" w:lastColumn="0" w:oddVBand="0" w:evenVBand="0" w:oddHBand="0" w:evenHBand="0" w:firstRowFirstColumn="0" w:firstRowLastColumn="0" w:lastRowFirstColumn="0" w:lastRowLastColumn="0"/>
+            </w:pPr>
+            <w:r>
+              <w:t>PATCH</w:t>
+            </w:r>
+          </w:p>
+        </w:tc>
+        <w:tc>
+          <w:tcPr>
+            <w:tcW w:w="0" w:type="auto"/>
+            <w:vAlign w:val="center"/>
+            <w:hideMark/>
+          </w:tcPr>
+          <w:p>
+            <w:pPr>
+              <w:cnfStyle w:val="000000000000" w:firstRow="0" w:lastRow="0" w:firstColumn="0" w:lastColumn="0" w:oddVBand="0" w:evenVBand="0" w:oddHBand="0" w:evenHBand="0" w:firstRowFirstColumn="0" w:firstRowLastColumn="0" w:lastRowFirstColumn="0" w:lastRowLastColumn="0"/>
+            </w:pPr>
+            <w:r>
+              <w:t>Resolve a dispute</w:t>
+            </w:r>
+          </w:p>
+        </w:tc>
+        <w:tc>
+          <w:tcPr>
+            <w:tcW w:w="0" w:type="auto"/>
+            <w:vAlign w:val="center"/>
+            <w:hideMark/>
+          </w:tcPr>
+          <w:p>
+            <w:pPr>
+              <w:jc w:val="center"/>
+              <w:cnfStyle w:val="000000000000" w:firstRow="0" w:lastRow="0" w:firstColumn="0" w:lastColumn="0" w:oddVBand="0" w:evenVBand="0" w:oddHBand="0" w:evenHBand="0" w:firstRowFirstColumn="0" w:firstRowLastColumn="0" w:lastRowFirstColumn="0" w:lastRowLastColumn="0"/>
+            </w:pPr>
+            <w:r>
+              <w:t>Yes</w:t>
+            </w:r>
+          </w:p>
+        </w:tc>
+      </w:tr>
+      <w:tr>
+        <w:trPr>
+          <w:cnfStyle w:val="000000100000" w:firstRow="0" w:lastRow="0" w:firstColumn="0" w:lastColumn="0" w:oddVBand="0" w:evenVBand="0" w:oddHBand="1" w:evenHBand="0" w:firstRowFirstColumn="0" w:firstRowLastColumn="0" w:lastRowFirstColumn="0" w:lastRowLastColumn="0"/>
+          <w:trHeight w:val="432"/>
+        </w:trPr>
+        <w:tc>
+          <w:tcPr>
+            <w:cnfStyle w:val="001000000000" w:firstRow="0" w:lastRow="0" w:firstColumn="1" w:lastColumn="0" w:oddVBand="0" w:evenVBand="0" w:oddHBand="0" w:evenHBand="0" w:firstRowFirstColumn="0" w:firstRowLastColumn="0" w:lastRowFirstColumn="0" w:lastRowLastColumn="0"/>
+            <w:tcW w:w="0" w:type="auto"/>
+            <w:vAlign w:val="center"/>
+            <w:hideMark/>
+          </w:tcPr>
+          <w:p>
+            <w:pPr>
+              <w:rPr>
+                <w:b w:val="0"/>
+                <w:bCs w:val="0"/>
+              </w:rPr>
+            </w:pPr>
+            <w:r>
+              <w:rPr>
+                <w:b w:val="0"/>
+                <w:bCs w:val="0"/>
+              </w:rPr>
+              <w:t>/api/v1/admin/disputes/{disputeId}/close</w:t>
+            </w:r>
+          </w:p>
+        </w:tc>
+        <w:tc>
+          <w:tcPr>
+            <w:tcW w:w="0" w:type="auto"/>
+            <w:vAlign w:val="center"/>
+            <w:hideMark/>
+          </w:tcPr>
+          <w:p>
+            <w:pPr>
+              <w:jc w:val="center"/>
+              <w:cnfStyle w:val="000000100000" w:firstRow="0" w:lastRow="0" w:firstColumn="0" w:lastColumn="0" w:oddVBand="0" w:evenVBand="0" w:oddHBand="1" w:evenHBand="0" w:firstRowFirstColumn="0" w:firstRowLastColumn="0" w:lastRowFirstColumn="0" w:lastRowLastColumn="0"/>
+            </w:pPr>
+            <w:r>
+              <w:t>PATCH</w:t>
+            </w:r>
+          </w:p>
+        </w:tc>
+        <w:tc>
+          <w:tcPr>
+            <w:tcW w:w="0" w:type="auto"/>
+            <w:vAlign w:val="center"/>
+            <w:hideMark/>
+          </w:tcPr>
+          <w:p>
+            <w:pPr>
+              <w:cnfStyle w:val="000000100000" w:firstRow="0" w:lastRow="0" w:firstColumn="0" w:lastColumn="0" w:oddVBand="0" w:evenVBand="0" w:oddHBand="1" w:evenHBand="0" w:firstRowFirstColumn="0" w:firstRowLastColumn="0" w:lastRowFirstColumn="0" w:lastRowLastColumn="0"/>
+            </w:pPr>
+            <w:r>
+              <w:t>Close a resolved dispute</w:t>
+            </w:r>
+          </w:p>
+        </w:tc>
+        <w:tc>
+          <w:tcPr>
+            <w:tcW w:w="0" w:type="auto"/>
+            <w:vAlign w:val="center"/>
+            <w:hideMark/>
+          </w:tcPr>
+          <w:p>
+            <w:pPr>
+              <w:jc w:val="center"/>
+              <w:cnfStyle w:val="000000100000" w:firstRow="0" w:lastRow="0" w:firstColumn="0" w:lastColumn="0" w:oddVBand="0" w:evenVBand="0" w:oddHBand="1" w:evenHBand="0" w:firstRowFirstColumn="0" w:firstRowLastColumn="0" w:lastRowFirstColumn="0" w:lastRowLastColumn="0"/>
+            </w:pPr>
+            <w:r>
+              <w:t>Yes</w:t>
+            </w:r>
+          </w:p>
+        </w:tc>
+      </w:tr>
+      <w:tr>
+        <w:trPr>
+          <w:trHeight w:val="432"/>
+        </w:trPr>
+        <w:tc>
+          <w:tcPr>
+            <w:cnfStyle w:val="001000000000" w:firstRow="0" w:lastRow="0" w:firstColumn="1" w:lastColumn="0" w:oddVBand="0" w:evenVBand="0" w:oddHBand="0" w:evenHBand="0" w:firstRowFirstColumn="0" w:firstRowLastColumn="0" w:lastRowFirstColumn="0" w:lastRowLastColumn="0"/>
+            <w:tcW w:w="0" w:type="auto"/>
+            <w:vAlign w:val="center"/>
+            <w:hideMark/>
+          </w:tcPr>
+          <w:p>
+            <w:pPr>
+              <w:rPr>
+                <w:b w:val="0"/>
+                <w:bCs w:val="0"/>
+              </w:rPr>
+            </w:pPr>
+            <w:r>
+              <w:rPr>
+                <w:b w:val="0"/>
+                <w:bCs w:val="0"/>
+              </w:rPr>
+              <w:t>/api/v1/admin/disputes/{disputeId}/comment</w:t>
+            </w:r>
+          </w:p>
+        </w:tc>
+        <w:tc>
+          <w:tcPr>
+            <w:tcW w:w="0" w:type="auto"/>
+            <w:vAlign w:val="center"/>
+            <w:hideMark/>
+          </w:tcPr>
+          <w:p>
+            <w:pPr>
+              <w:jc w:val="center"/>
+              <w:cnfStyle w:val="000000000000" w:firstRow="0" w:lastRow="0" w:firstColumn="0" w:lastColumn="0" w:oddVBand="0" w:evenVBand="0" w:oddHBand="0" w:evenHBand="0" w:firstRowFirstColumn="0" w:firstRowLastColumn="0" w:lastRowFirstColumn="0" w:lastRowLastColumn="0"/>
+            </w:pPr>
+            <w:r>
+              <w:t>POST</w:t>
+            </w:r>
+          </w:p>
+        </w:tc>
+        <w:tc>
+          <w:tcPr>
+            <w:tcW w:w="0" w:type="auto"/>
+            <w:vAlign w:val="center"/>
+            <w:hideMark/>
+          </w:tcPr>
+          <w:p>
+            <w:pPr>
+              <w:cnfStyle w:val="000000000000" w:firstRow="0" w:lastRow="0" w:firstColumn="0" w:lastColumn="0" w:oddVBand="0" w:evenVBand="0" w:oddHBand="0" w:evenHBand="0" w:firstRowFirstColumn="0" w:firstRowLastColumn="0" w:lastRowFirstColumn="0" w:lastRowLastColumn="0"/>
+            </w:pPr>
+            <w:r>
+              <w:t>Add an administrative comment</w:t>
+            </w:r>
+          </w:p>
+        </w:tc>
+        <w:tc>
+          <w:tcPr>
+            <w:tcW w:w="0" w:type="auto"/>
+            <w:vAlign w:val="center"/>
+            <w:hideMark/>
+          </w:tcPr>
+          <w:p>
+            <w:pPr>
+              <w:jc w:val="center"/>
+              <w:cnfStyle w:val="000000000000" w:firstRow="0" w:lastRow="0" w:firstColumn="0" w:lastColumn="0" w:oddVBand="0" w:evenVBand="0" w:oddHBand="0" w:evenHBand="0" w:firstRowFirstColumn="0" w:firstRowLastColumn="0" w:lastRowFirstColumn="0" w:lastRowLastColumn="0"/>
+            </w:pPr>
+            <w:r>
+              <w:t>Yes</w:t>
+            </w:r>
+          </w:p>
+        </w:tc>
+      </w:tr>
+      <w:tr>
+        <w:trPr>
+          <w:cnfStyle w:val="000000100000" w:firstRow="0" w:lastRow="0" w:firstColumn="0" w:lastColumn="0" w:oddVBand="0" w:evenVBand="0" w:oddHBand="1" w:evenHBand="0" w:firstRowFirstColumn="0" w:firstRowLastColumn="0" w:lastRowFirstColumn="0" w:lastRowLastColumn="0"/>
+          <w:trHeight w:val="432"/>
+        </w:trPr>
+        <w:tc>
+          <w:tcPr>
+            <w:cnfStyle w:val="001000000000" w:firstRow="0" w:lastRow="0" w:firstColumn="1" w:lastColumn="0" w:oddVBand="0" w:evenVBand="0" w:oddHBand="0" w:evenHBand="0" w:firstRowFirstColumn="0" w:firstRowLastColumn="0" w:lastRowFirstColumn="0" w:lastRowLastColumn="0"/>
+            <w:tcW w:w="0" w:type="auto"/>
+            <w:vAlign w:val="center"/>
+            <w:hideMark/>
+          </w:tcPr>
+          <w:p>
+            <w:pPr>
+              <w:rPr>
+                <w:b w:val="0"/>
+                <w:bCs w:val="0"/>
+              </w:rPr>
+            </w:pPr>
+            <w:r>
+              <w:rPr>
+                <w:b w:val="0"/>
+                <w:bCs w:val="0"/>
+              </w:rPr>
+              <w:t>/api/v1/admin/disputes/history</w:t>
+            </w:r>
+          </w:p>
+        </w:tc>
+        <w:tc>
+          <w:tcPr>
+            <w:tcW w:w="0" w:type="auto"/>
+            <w:vAlign w:val="center"/>
+            <w:hideMark/>
+          </w:tcPr>
+          <w:p>
+            <w:pPr>
+              <w:jc w:val="center"/>
+              <w:cnfStyle w:val="000000100000" w:firstRow="0" w:lastRow="0" w:firstColumn="0" w:lastColumn="0" w:oddVBand="0" w:evenVBand="0" w:oddHBand="1" w:evenHBand="0" w:firstRowFirstColumn="0" w:firstRowLastColumn="0" w:lastRowFirstColumn="0" w:lastRowLastColumn="0"/>
+            </w:pPr>
+            <w:r>
+              <w:t>GET</w:t>
+            </w:r>
+          </w:p>
+        </w:tc>
+        <w:tc>
+          <w:tcPr>
+            <w:tcW w:w="0" w:type="auto"/>
+            <w:vAlign w:val="center"/>
+            <w:hideMark/>
+          </w:tcPr>
+          <w:p>
+            <w:pPr>
+              <w:cnfStyle w:val="000000100000" w:firstRow="0" w:lastRow="0" w:firstColumn="0" w:lastColumn="0" w:oddVBand="0" w:evenVBand="0" w:oddHBand="1" w:evenHBand="0" w:firstRowFirstColumn="0" w:firstRowLastColumn="0" w:lastRowFirstColumn="0" w:lastRowLastColumn="0"/>
+            </w:pPr>
+            <w:r>
+              <w:t>Retrieve dispute history</w:t>
+            </w:r>
+          </w:p>
+        </w:tc>
+        <w:tc>
+          <w:tcPr>
+            <w:tcW w:w="0" w:type="auto"/>
+            <w:vAlign w:val="center"/>
+            <w:hideMark/>
+          </w:tcPr>
+          <w:p>
+            <w:pPr>
+              <w:jc w:val="center"/>
+              <w:cnfStyle w:val="000000100000" w:firstRow="0" w:lastRow="0" w:firstColumn="0" w:lastColumn="0" w:oddVBand="0" w:evenVBand="0" w:oddHBand="1" w:evenHBand="0" w:firstRowFirstColumn="0" w:firstRowLastColumn="0" w:lastRowFirstColumn="0" w:lastRowLastColumn="0"/>
+            </w:pPr>
+            <w:r>
+              <w:t>Yes</w:t>
+            </w:r>
+          </w:p>
+        </w:tc>
+      </w:tr>
+      <w:tr>
+        <w:trPr>
+          <w:trHeight w:val="432"/>
+        </w:trPr>
+        <w:tc>
+          <w:tcPr>
+            <w:cnfStyle w:val="001000000000" w:firstRow="0" w:lastRow="0" w:firstColumn="1" w:lastColumn="0" w:oddVBand="0" w:evenVBand="0" w:oddHBand="0" w:evenHBand="0" w:firstRowFirstColumn="0" w:firstRowLastColumn="0" w:lastRowFirstColumn="0" w:lastRowLastColumn="0"/>
+            <w:tcW w:w="0" w:type="auto"/>
+            <w:vAlign w:val="center"/>
+            <w:hideMark/>
+          </w:tcPr>
+          <w:p>
+            <w:pPr>
+              <w:rPr>
+                <w:b w:val="0"/>
+                <w:bCs w:val="0"/>
+              </w:rPr>
+            </w:pPr>
+            <w:r>
+              <w:rPr>
+                <w:b w:val="0"/>
+                <w:bCs w:val="0"/>
+              </w:rPr>
+              <w:t>/api/v1/admin/disputes/statistics</w:t>
+            </w:r>
+          </w:p>
+        </w:tc>
+        <w:tc>
+          <w:tcPr>
+            <w:tcW w:w="0" w:type="auto"/>
+            <w:vAlign w:val="center"/>
+            <w:hideMark/>
+          </w:tcPr>
+          <w:p>
+            <w:pPr>
+              <w:jc w:val="center"/>
+              <w:cnfStyle w:val="000000000000" w:firstRow="0" w:lastRow="0" w:firstColumn="0" w:lastColumn="0" w:oddVBand="0" w:evenVBand="0" w:oddHBand="0" w:evenHBand="0" w:firstRowFirstColumn="0" w:firstRowLastColumn="0" w:lastRowFirstColumn="0" w:lastRowLastColumn="0"/>
+            </w:pPr>
+            <w:r>
+              <w:t>GET</w:t>
+            </w:r>
+          </w:p>
+        </w:tc>
+        <w:tc>
+          <w:tcPr>
+            <w:tcW w:w="0" w:type="auto"/>
+            <w:vAlign w:val="center"/>
+            <w:hideMark/>
+          </w:tcPr>
+          <w:p>
+            <w:pPr>
+              <w:cnfStyle w:val="000000000000" w:firstRow="0" w:lastRow="0" w:firstColumn="0" w:lastColumn="0" w:oddVBand="0" w:evenVBand="0" w:oddHBand="0" w:evenHBand="0" w:firstRowFirstColumn="0" w:firstRowLastColumn="0" w:lastRowFirstColumn="0" w:lastRowLastColumn="0"/>
+            </w:pPr>
+            <w:r>
+              <w:t>Retrieve dispute statistics</w:t>
+            </w:r>
+          </w:p>
+        </w:tc>
+        <w:tc>
+          <w:tcPr>
+            <w:tcW w:w="0" w:type="auto"/>
+            <w:vAlign w:val="center"/>
+            <w:hideMark/>
+          </w:tcPr>
+          <w:p>
+            <w:pPr>
+              <w:jc w:val="center"/>
+              <w:cnfStyle w:val="000000000000" w:firstRow="0" w:lastRow="0" w:firstColumn="0" w:lastColumn="0" w:oddVBand="0" w:evenVBand="0" w:oddHBand="0" w:evenHBand="0" w:firstRowFirstColumn="0" w:firstRowLastColumn="0" w:lastRowFirstColumn="0" w:lastRowLastColumn="0"/>
+            </w:pPr>
+            <w:r>
+              <w:t>Yes</w:t>
+            </w:r>
+          </w:p>
+        </w:tc>
+      </w:tr>
+    </w:tbl>
     <w:p/>
+    <w:p>
+      <w:pPr>
+        <w:spacing w:line="278" w:lineRule="auto"/>
+      </w:pPr>
+      <w:r>
+        <w:br w:type="page"/>
+      </w:r>
+    </w:p>
+    <w:p>
+      <w:pPr>
+        <w:pStyle w:val="Title"/>
+      </w:pPr>
+      <w:r>
+        <w:lastRenderedPageBreak/>
+        <w:t>API Design Considerations</w:t>
+      </w:r>
+    </w:p>
+    <w:p>
+      <w:r>
+        <w:t>The Dispute Management APIs have been implemented in accordance with the following design guidelines:</w:t>
+      </w:r>
+    </w:p>
+    <w:p>
+      <w:pPr>
+        <w:pStyle w:val="ListParagraph"/>
+        <w:numPr>
+          <w:ilvl w:val="0"/>
+          <w:numId w:val="170"/>
+        </w:numPr>
+      </w:pPr>
+      <w:r>
+        <w:t>Access Limited to Administrators: Disputes can only be managed by authenticated administrators.</w:t>
+      </w:r>
+    </w:p>
+    <w:p>
+      <w:pPr>
+        <w:pStyle w:val="ListParagraph"/>
+        <w:numPr>
+          <w:ilvl w:val="0"/>
+          <w:numId w:val="170"/>
+        </w:numPr>
+      </w:pPr>
+      <w:r>
+        <w:t>REST Resource Model: Disputes are described as RESTful resources that use unique identifiers.</w:t>
+      </w:r>
+    </w:p>
+    <w:p>
+      <w:pPr>
+        <w:pStyle w:val="ListParagraph"/>
+        <w:numPr>
+          <w:ilvl w:val="0"/>
+          <w:numId w:val="170"/>
+        </w:numPr>
+      </w:pPr>
+      <w:r>
+        <w:t>JWT Authentication: Each request should include a valid JWT access token.</w:t>
+      </w:r>
+    </w:p>
+    <w:p>
+      <w:pPr>
+        <w:pStyle w:val="ListParagraph"/>
+        <w:numPr>
+          <w:ilvl w:val="0"/>
+          <w:numId w:val="170"/>
+        </w:numPr>
+      </w:pPr>
+      <w:r>
+        <w:t>Authorization: Only administrators have the authorization to investigate and solve the disputes.</w:t>
+      </w:r>
+    </w:p>
+    <w:p>
+      <w:pPr>
+        <w:pStyle w:val="ListParagraph"/>
+        <w:numPr>
+          <w:ilvl w:val="0"/>
+          <w:numId w:val="170"/>
+        </w:numPr>
+      </w:pPr>
+      <w:r>
+        <w:t>Evidence: Evidence in the form of documents, images, and other records can be attached during the dispute investigation.</w:t>
+      </w:r>
+    </w:p>
+    <w:p>
+      <w:pPr>
+        <w:pStyle w:val="ListParagraph"/>
+        <w:numPr>
+          <w:ilvl w:val="0"/>
+          <w:numId w:val="170"/>
+        </w:numPr>
+      </w:pPr>
+      <w:r>
+        <w:t>State Life Cycle: Disputes change through predefined states like Open, Under Review, Resolved, and Closed.</w:t>
+      </w:r>
+    </w:p>
+    <w:p>
+      <w:pPr>
+        <w:pStyle w:val="ListParagraph"/>
+        <w:numPr>
+          <w:ilvl w:val="0"/>
+          <w:numId w:val="170"/>
+        </w:numPr>
+      </w:pPr>
+      <w:r>
+        <w:t>Logging: Actions of the administrators while resolving disputes are logged in audit logs.</w:t>
+      </w:r>
+    </w:p>
+    <w:p>
+      <w:pPr>
+        <w:pStyle w:val="ListParagraph"/>
+        <w:numPr>
+          <w:ilvl w:val="0"/>
+          <w:numId w:val="170"/>
+        </w:numPr>
+      </w:pPr>
+      <w:r>
+        <w:t>Notifications: The customers and the agencies receive notifications when the dispute status changes.</w:t>
+      </w:r>
+    </w:p>
+    <w:p>
+      <w:pPr>
+        <w:pStyle w:val="Title"/>
+      </w:pPr>
+      <w:r>
+        <w:t>Dispute Management Workflow</w:t>
+      </w:r>
+    </w:p>
+    <w:p>
+      <w:r>
+        <w:t>Dispute resolution process involves the following steps:</w:t>
+      </w:r>
+    </w:p>
+    <w:p>
+      <w:pPr>
+        <w:pStyle w:val="ListParagraph"/>
+        <w:numPr>
+          <w:ilvl w:val="0"/>
+          <w:numId w:val="171"/>
+        </w:numPr>
+      </w:pPr>
+      <w:r>
+        <w:t>Dispute about the reservation, payment, or other service issue is submitted by either the customer or the rental agency.</w:t>
+      </w:r>
+    </w:p>
+    <w:p>
+      <w:pPr>
+        <w:pStyle w:val="ListParagraph"/>
+        <w:numPr>
+          <w:ilvl w:val="0"/>
+          <w:numId w:val="171"/>
+        </w:numPr>
+      </w:pPr>
+      <w:r>
+        <w:t>Dispute is entered into the Dispute Management Service with the status set to Open.</w:t>
+      </w:r>
+    </w:p>
+    <w:p>
+      <w:pPr>
+        <w:pStyle w:val="ListParagraph"/>
+        <w:numPr>
+          <w:ilvl w:val="0"/>
+          <w:numId w:val="171"/>
+        </w:numPr>
+      </w:pPr>
+      <w:r>
+        <w:t>An authenticated administrator reviews the submitted dispute and attached evidence.</w:t>
+      </w:r>
+    </w:p>
+    <w:p>
+      <w:pPr>
+        <w:pStyle w:val="ListParagraph"/>
+        <w:numPr>
+          <w:ilvl w:val="0"/>
+          <w:numId w:val="171"/>
+        </w:numPr>
+      </w:pPr>
+      <w:r>
+        <w:t>Additional data might be requested if necessary.</w:t>
+      </w:r>
+    </w:p>
+    <w:p>
+      <w:pPr>
+        <w:pStyle w:val="ListParagraph"/>
+        <w:numPr>
+          <w:ilvl w:val="0"/>
+          <w:numId w:val="171"/>
+        </w:numPr>
+      </w:pPr>
+      <w:r>
+        <w:t>Dispute is investigated and the solution is decided.</w:t>
+      </w:r>
+    </w:p>
+    <w:p>
+      <w:pPr>
+        <w:pStyle w:val="ListParagraph"/>
+        <w:numPr>
+          <w:ilvl w:val="0"/>
+          <w:numId w:val="171"/>
+        </w:numPr>
+      </w:pPr>
+      <w:r>
+        <w:t>The status of the dispute is set to Resolved or Closed accordingly.</w:t>
+      </w:r>
+    </w:p>
+    <w:p>
+      <w:pPr>
+        <w:pStyle w:val="ListParagraph"/>
+        <w:numPr>
+          <w:ilvl w:val="0"/>
+          <w:numId w:val="171"/>
+        </w:numPr>
+      </w:pPr>
+      <w:r>
+        <w:t>Notification Service sends the notification about the resolution to the customer and the agency.</w:t>
+      </w:r>
+    </w:p>
+    <w:p>
+      <w:r>
+        <w:rPr>
+          <w:noProof/>
+        </w:rPr>
+        <mc:AlternateContent>
+          <mc:Choice Requires="wps">
+            <w:drawing>
+              <wp:anchor distT="0" distB="0" distL="114300" distR="114300" simplePos="0" relativeHeight="251687936" behindDoc="0" locked="0" layoutInCell="1" allowOverlap="1" wp14:anchorId="5F91ED92" wp14:editId="6BB36638">
+                <wp:simplePos x="0" y="0"/>
+                <wp:positionH relativeFrom="column">
+                  <wp:posOffset>3175</wp:posOffset>
+                </wp:positionH>
+                <wp:positionV relativeFrom="paragraph">
+                  <wp:posOffset>1561465</wp:posOffset>
+                </wp:positionV>
+                <wp:extent cx="5941695" cy="635"/>
+                <wp:effectExtent l="0" t="0" r="0" b="0"/>
+                <wp:wrapSquare wrapText="bothSides"/>
+                <wp:docPr id="95738490" name="Text Box 1"/>
+                <wp:cNvGraphicFramePr/>
+                <a:graphic xmlns:a="http://schemas.openxmlformats.org/drawingml/2006/main">
+                  <a:graphicData uri="http://schemas.microsoft.com/office/word/2010/wordprocessingShape">
+                    <wps:wsp>
+                      <wps:cNvSpPr txBox="1"/>
+                      <wps:spPr>
+                        <a:xfrm>
+                          <a:off x="0" y="0"/>
+                          <a:ext cx="5941695" cy="635"/>
+                        </a:xfrm>
+                        <a:prstGeom prst="rect">
+                          <a:avLst/>
+                        </a:prstGeom>
+                        <a:solidFill>
+                          <a:prstClr val="white"/>
+                        </a:solidFill>
+                        <a:ln>
+                          <a:noFill/>
+                        </a:ln>
+                      </wps:spPr>
+                      <wps:txbx>
+                        <w:txbxContent>
+                          <w:p>
+                            <w:pPr>
+                              <w:pStyle w:val="Caption"/>
+                              <w:jc w:val="center"/>
+                            </w:pPr>
+                            <w:r>
+                              <w:t xml:space="preserve">Figure </w:t>
+                            </w:r>
+                            <w:r>
+                              <w:fldChar w:fldCharType="begin"/>
+                            </w:r>
+                            <w:r>
+                              <w:instrText xml:space="preserve"> SEQ Figure \* ARABIC </w:instrText>
+                            </w:r>
+                            <w:r>
+                              <w:fldChar w:fldCharType="separate"/>
+                            </w:r>
+                            <w:r>
+                              <w:rPr>
+                                <w:noProof/>
+                              </w:rPr>
+                              <w:t>10</w:t>
+                            </w:r>
+                            <w:r>
+                              <w:fldChar w:fldCharType="end"/>
+                            </w:r>
+                            <w:r>
+                              <w:t xml:space="preserve"> - </w:t>
+                            </w:r>
+                            <w:r>
+                              <w:t>Dispute Management Workflow</w:t>
+                            </w:r>
+                          </w:p>
+                        </w:txbxContent>
+                      </wps:txbx>
+                      <wps:bodyPr rot="0" spcFirstLastPara="0" vertOverflow="overflow" horzOverflow="overflow" vert="horz" wrap="square" lIns="0" tIns="0" rIns="0" bIns="0" numCol="1" spcCol="0" rtlCol="0" fromWordArt="0" anchor="t" anchorCtr="0" forceAA="0" compatLnSpc="1">
+                        <a:prstTxWarp prst="textNoShape">
+                          <a:avLst/>
+                        </a:prstTxWarp>
+                        <a:spAutoFit/>
+                      </wps:bodyPr>
+                    </wps:wsp>
+                  </a:graphicData>
+                </a:graphic>
+              </wp:anchor>
+            </w:drawing>
+          </mc:Choice>
+          <mc:Fallback>
+            <w:pict>
+              <v:shape w14:anchorId="5F91ED92" id="_x0000_s1035" type="#_x0000_t202" style="position:absolute;margin-left:.25pt;margin-top:122.95pt;width:467.85pt;height:.05pt;z-index:251687936;visibility:visible;mso-wrap-style:square;mso-wrap-distance-left:9pt;mso-wrap-distance-top:0;mso-wrap-distance-right:9pt;mso-wrap-distance-bottom:0;mso-position-horizontal:absolute;mso-position-horizontal-relative:text;mso-position-vertical:absolute;mso-position-vertical-relative:text;v-text-anchor:top" o:gfxdata="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" stroked="f">
+                <v:textbox style="mso-fit-shape-to-text:t" inset="0,0,0,0">
+                  <w:txbxContent>
+                    <w:p>
+                      <w:pPr>
+                        <w:pStyle w:val="Caption"/>
+                        <w:jc w:val="center"/>
+                      </w:pPr>
+                      <w:r>
+                        <w:t xml:space="preserve">Figure </w:t>
+                      </w:r>
+                      <w:r>
+                        <w:fldChar w:fldCharType="begin"/>
+                      </w:r>
+                      <w:r>
+                        <w:instrText xml:space="preserve"> SEQ Figure \* ARABIC </w:instrText>
+                      </w:r>
+                      <w:r>
+                        <w:fldChar w:fldCharType="separate"/>
+                      </w:r>
+                      <w:r>
+                        <w:rPr>
+                          <w:noProof/>
+                        </w:rPr>
+                        <w:t>10</w:t>
+                      </w:r>
+                      <w:r>
+                        <w:fldChar w:fldCharType="end"/>
+                      </w:r>
+                      <w:r>
+                        <w:t xml:space="preserve"> - </w:t>
+                      </w:r>
+                      <w:r>
+                        <w:t>Dispute Management Workflow</w:t>
+                      </w:r>
+                    </w:p>
+                  </w:txbxContent>
+                </v:textbox>
+                <w10:wrap type="square"/>
+              </v:shape>
+            </w:pict>
+          </mc:Fallback>
+        </mc:AlternateContent>
+      </w:r>
+      <w:r>
+        <w:drawing>
+          <wp:anchor distT="0" distB="0" distL="114300" distR="114300" simplePos="0" relativeHeight="251685888" behindDoc="0" locked="0" layoutInCell="1" allowOverlap="1" wp14:anchorId="663609DB" wp14:editId="39E1A0A0">
+            <wp:simplePos x="0" y="0"/>
+            <wp:positionH relativeFrom="column">
+              <wp:posOffset>3175</wp:posOffset>
+            </wp:positionH>
+            <wp:positionV relativeFrom="paragraph">
+              <wp:posOffset>341630</wp:posOffset>
+            </wp:positionV>
+            <wp:extent cx="5941695" cy="1162685"/>
+            <wp:effectExtent l="0" t="0" r="1905" b="0"/>
+            <wp:wrapSquare wrapText="bothSides"/>
+            <wp:docPr id="889037681" name="Picture 1"/>
+            <wp:cNvGraphicFramePr>
+              <a:graphicFrameLocks xmlns:a="http://schemas.openxmlformats.org/drawingml/2006/main" noChangeAspect="1"/>
+            </wp:cNvGraphicFramePr>
+            <a:graphic xmlns:a="http://schemas.openxmlformats.org/drawingml/2006/main">
+              <a:graphicData uri="http://schemas.openxmlformats.org/drawingml/2006/picture">
+                <pic:pic xmlns:pic="http://schemas.openxmlformats.org/drawingml/2006/picture">
+                  <pic:nvPicPr>
+                    <pic:cNvPr id="889037681" name=""/>
+                    <pic:cNvPicPr/>
+                  </pic:nvPicPr>
+                  <pic:blipFill>
+                    <a:blip r:embed="rId17" cstate="print">
+                      <a:extLst>
+                        <a:ext uri="{28A0092B-C50C-407E-A947-70E740481C1C}">
+                          <a14:useLocalDpi xmlns:a14="http://schemas.microsoft.com/office/drawing/2010/main" val="0"/>
+                        </a:ext>
+                      </a:extLst>
+                    </a:blip>
+                    <a:stretch>
+                      <a:fillRect/>
+                    </a:stretch>
+                  </pic:blipFill>
+                  <pic:spPr>
+                    <a:xfrm>
+                      <a:off x="0" y="0"/>
+                      <a:ext cx="5941695" cy="1162685"/>
+                    </a:xfrm>
+                    <a:prstGeom prst="rect">
+                      <a:avLst/>
+                    </a:prstGeom>
+                  </pic:spPr>
+                </pic:pic>
+              </a:graphicData>
+            </a:graphic>
+          </wp:anchor>
+        </w:drawing>
+      </w:r>
+    </w:p>
     <w:p/>
+    <w:p>
+      <w:pPr>
+        <w:spacing w:line="278" w:lineRule="auto"/>
+      </w:pPr>
+      <w:r>
+        <w:br w:type="page"/>
+      </w:r>
+    </w:p>
     <w:p/>
     <w:p/>
     <w:sectPr>
-      <w:headerReference w:type="default" r:id="rId17"/>
-      <w:footerReference w:type="default" r:id="rId18"/>
+      <w:headerReference w:type="default" r:id="rId18"/>
+      <w:footerReference w:type="default" r:id="rId19"/>
       <w:pgSz w:w="11906" w:h="16838" w:code="9"/>
       <w:pgMar w:top="1411" w:right="850" w:bottom="1411" w:left="1699" w:header="720" w:footer="288" w:gutter="0"/>
       <w:pgNumType w:start="1"/>
@@ -27211,6 +28381,92 @@
     </w:lvl>
   </w:abstractNum>
   <w:abstractNum w:abstractNumId="100" w15:restartNumberingAfterBreak="0">
+    <w:nsid w:val="49DE12C1"/>
+    <w:multiLevelType w:val="hybridMultilevel"/>
+    <w:tmpl w:val="4CF0F30E"/>
+    <w:lvl w:ilvl="0" w:tplc="0409000F">
+      <w:start w:val="1"/>
+      <w:numFmt w:val="decimal"/>
+      <w:lvlText w:val="%1."/>
+      <w:lvlJc w:val="left"/>
+      <w:pPr>
+        <w:ind w:left="720" w:hanging="360"/>
+      </w:pPr>
+    </w:lvl>
+    <w:lvl w:ilvl="1" w:tplc="04090019" w:tentative="1">
+      <w:start w:val="1"/>
+      <w:numFmt w:val="lowerLetter"/>
+      <w:lvlText w:val="%2."/>
+      <w:lvlJc w:val="left"/>
+      <w:pPr>
+        <w:ind w:left="1440" w:hanging="360"/>
+      </w:pPr>
+    </w:lvl>
+    <w:lvl w:ilvl="2" w:tplc="0409001B" w:tentative="1">
+      <w:start w:val="1"/>
+      <w:numFmt w:val="lowerRoman"/>
+      <w:lvlText w:val="%3."/>
+      <w:lvlJc w:val="right"/>
+      <w:pPr>
+        <w:ind w:left="2160" w:hanging="180"/>
+      </w:pPr>
+    </w:lvl>
+    <w:lvl w:ilvl="3" w:tplc="0409000F" w:tentative="1">
+      <w:start w:val="1"/>
+      <w:numFmt w:val="decimal"/>
+      <w:lvlText w:val="%4."/>
+      <w:lvlJc w:val="left"/>
+      <w:pPr>
+        <w:ind w:left="2880" w:hanging="360"/>
+      </w:pPr>
+    </w:lvl>
+    <w:lvl w:ilvl="4" w:tplc="04090019" w:tentative="1">
+      <w:start w:val="1"/>
+      <w:numFmt w:val="lowerLetter"/>
+      <w:lvlText w:val="%5."/>
+      <w:lvlJc w:val="left"/>
+      <w:pPr>
+        <w:ind w:left="3600" w:hanging="360"/>
+      </w:pPr>
+    </w:lvl>
+    <w:lvl w:ilvl="5" w:tplc="0409001B" w:tentative="1">
+      <w:start w:val="1"/>
+      <w:numFmt w:val="lowerRoman"/>
+      <w:lvlText w:val="%6."/>
+      <w:lvlJc w:val="right"/>
+      <w:pPr>
+        <w:ind w:left="4320" w:hanging="180"/>
+      </w:pPr>
+    </w:lvl>
+    <w:lvl w:ilvl="6" w:tplc="0409000F" w:tentative="1">
+      <w:start w:val="1"/>
+      <w:numFmt w:val="decimal"/>
+      <w:lvlText w:val="%7."/>
+      <w:lvlJc w:val="left"/>
+      <w:pPr>
+        <w:ind w:left="5040" w:hanging="360"/>
+      </w:pPr>
+    </w:lvl>
+    <w:lvl w:ilvl="7" w:tplc="04090019" w:tentative="1">
+      <w:start w:val="1"/>
+      <w:numFmt w:val="lowerLetter"/>
+      <w:lvlText w:val="%8."/>
+      <w:lvlJc w:val="left"/>
+      <w:pPr>
+        <w:ind w:left="5760" w:hanging="360"/>
+      </w:pPr>
+    </w:lvl>
+    <w:lvl w:ilvl="8" w:tplc="0409001B" w:tentative="1">
+      <w:start w:val="1"/>
+      <w:numFmt w:val="lowerRoman"/>
+      <w:lvlText w:val="%9."/>
+      <w:lvlJc w:val="right"/>
+      <w:pPr>
+        <w:ind w:left="6480" w:hanging="180"/>
+      </w:pPr>
+    </w:lvl>
+  </w:abstractNum>
+  <w:abstractNum w:abstractNumId="101" w15:restartNumberingAfterBreak="0">
     <w:nsid w:val="4A880990"/>
     <w:multiLevelType w:val="hybridMultilevel"/>
     <w:tmpl w:val="F17E12C2"/>
@@ -27322,7 +28578,7 @@
       </w:rPr>
     </w:lvl>
   </w:abstractNum>
-  <w:abstractNum w:abstractNumId="101" w15:restartNumberingAfterBreak="0">
+  <w:abstractNum w:abstractNumId="102" w15:restartNumberingAfterBreak="0">
     <w:nsid w:val="4B182B12"/>
     <w:multiLevelType w:val="hybridMultilevel"/>
     <w:tmpl w:val="31C486B4"/>
@@ -27434,7 +28690,7 @@
       </w:rPr>
     </w:lvl>
   </w:abstractNum>
-  <w:abstractNum w:abstractNumId="102" w15:restartNumberingAfterBreak="0">
+  <w:abstractNum w:abstractNumId="103" w15:restartNumberingAfterBreak="0">
     <w:nsid w:val="4BA13766"/>
     <w:multiLevelType w:val="multilevel"/>
     <w:tmpl w:val="63F4E6F0"/>
@@ -27583,7 +28839,7 @@
       </w:rPr>
     </w:lvl>
   </w:abstractNum>
-  <w:abstractNum w:abstractNumId="103" w15:restartNumberingAfterBreak="0">
+  <w:abstractNum w:abstractNumId="104" w15:restartNumberingAfterBreak="0">
     <w:nsid w:val="4E65371E"/>
     <w:multiLevelType w:val="hybridMultilevel"/>
     <w:tmpl w:val="53EE4538"/>
@@ -27695,7 +28951,7 @@
       </w:rPr>
     </w:lvl>
   </w:abstractNum>
-  <w:abstractNum w:abstractNumId="104" w15:restartNumberingAfterBreak="0">
+  <w:abstractNum w:abstractNumId="105" w15:restartNumberingAfterBreak="0">
     <w:nsid w:val="4E9A3F16"/>
     <w:multiLevelType w:val="multilevel"/>
     <w:tmpl w:val="63F4E6F0"/>
@@ -27844,7 +29100,7 @@
       </w:rPr>
     </w:lvl>
   </w:abstractNum>
-  <w:abstractNum w:abstractNumId="105" w15:restartNumberingAfterBreak="0">
+  <w:abstractNum w:abstractNumId="106" w15:restartNumberingAfterBreak="0">
     <w:nsid w:val="500B790D"/>
     <w:multiLevelType w:val="multilevel"/>
     <w:tmpl w:val="63F4E6F0"/>
@@ -27993,7 +29249,7 @@
       </w:rPr>
     </w:lvl>
   </w:abstractNum>
-  <w:abstractNum w:abstractNumId="106" w15:restartNumberingAfterBreak="0">
+  <w:abstractNum w:abstractNumId="107" w15:restartNumberingAfterBreak="0">
     <w:nsid w:val="526538B7"/>
     <w:multiLevelType w:val="hybridMultilevel"/>
     <w:tmpl w:val="E6A017F2"/>
@@ -28106,7 +29362,7 @@
       </w:rPr>
     </w:lvl>
   </w:abstractNum>
-  <w:abstractNum w:abstractNumId="107" w15:restartNumberingAfterBreak="0">
+  <w:abstractNum w:abstractNumId="108" w15:restartNumberingAfterBreak="0">
     <w:nsid w:val="537E56D9"/>
     <w:multiLevelType w:val="multilevel"/>
     <w:tmpl w:val="1B6E8B6A"/>
@@ -28255,7 +29511,7 @@
       </w:rPr>
     </w:lvl>
   </w:abstractNum>
-  <w:abstractNum w:abstractNumId="108" w15:restartNumberingAfterBreak="0">
+  <w:abstractNum w:abstractNumId="109" w15:restartNumberingAfterBreak="0">
     <w:nsid w:val="53E6601E"/>
     <w:multiLevelType w:val="hybridMultilevel"/>
     <w:tmpl w:val="66F0666A"/>
@@ -28368,7 +29624,7 @@
       </w:rPr>
     </w:lvl>
   </w:abstractNum>
-  <w:abstractNum w:abstractNumId="109" w15:restartNumberingAfterBreak="0">
+  <w:abstractNum w:abstractNumId="110" w15:restartNumberingAfterBreak="0">
     <w:nsid w:val="551D6F91"/>
     <w:multiLevelType w:val="hybridMultilevel"/>
     <w:tmpl w:val="9522B3C6"/>
@@ -28480,7 +29736,7 @@
       </w:rPr>
     </w:lvl>
   </w:abstractNum>
-  <w:abstractNum w:abstractNumId="110" w15:restartNumberingAfterBreak="0">
+  <w:abstractNum w:abstractNumId="111" w15:restartNumberingAfterBreak="0">
     <w:nsid w:val="555451DA"/>
     <w:multiLevelType w:val="hybridMultilevel"/>
     <w:tmpl w:val="CAB2A550"/>
@@ -28593,7 +29849,7 @@
       </w:rPr>
     </w:lvl>
   </w:abstractNum>
-  <w:abstractNum w:abstractNumId="111" w15:restartNumberingAfterBreak="0">
+  <w:abstractNum w:abstractNumId="112" w15:restartNumberingAfterBreak="0">
     <w:nsid w:val="55655B93"/>
     <w:multiLevelType w:val="multilevel"/>
     <w:tmpl w:val="9C88A4A8"/>
@@ -28742,7 +29998,7 @@
       </w:rPr>
     </w:lvl>
   </w:abstractNum>
-  <w:abstractNum w:abstractNumId="112" w15:restartNumberingAfterBreak="0">
+  <w:abstractNum w:abstractNumId="113" w15:restartNumberingAfterBreak="0">
     <w:nsid w:val="55B95BED"/>
     <w:multiLevelType w:val="hybridMultilevel"/>
     <w:tmpl w:val="A9B866FC"/>
@@ -28855,7 +30111,7 @@
       </w:rPr>
     </w:lvl>
   </w:abstractNum>
-  <w:abstractNum w:abstractNumId="113" w15:restartNumberingAfterBreak="0">
+  <w:abstractNum w:abstractNumId="114" w15:restartNumberingAfterBreak="0">
     <w:nsid w:val="562D4F1F"/>
     <w:multiLevelType w:val="hybridMultilevel"/>
     <w:tmpl w:val="1FF8D31C"/>
@@ -28967,7 +30223,7 @@
       </w:rPr>
     </w:lvl>
   </w:abstractNum>
-  <w:abstractNum w:abstractNumId="114" w15:restartNumberingAfterBreak="0">
+  <w:abstractNum w:abstractNumId="115" w15:restartNumberingAfterBreak="0">
     <w:nsid w:val="565A0C8B"/>
     <w:multiLevelType w:val="multilevel"/>
     <w:tmpl w:val="AB24FF2E"/>
@@ -29116,7 +30372,7 @@
       </w:rPr>
     </w:lvl>
   </w:abstractNum>
-  <w:abstractNum w:abstractNumId="115" w15:restartNumberingAfterBreak="0">
+  <w:abstractNum w:abstractNumId="116" w15:restartNumberingAfterBreak="0">
     <w:nsid w:val="566E7C65"/>
     <w:multiLevelType w:val="multilevel"/>
     <w:tmpl w:val="28803B4C"/>
@@ -29265,7 +30521,7 @@
       </w:rPr>
     </w:lvl>
   </w:abstractNum>
-  <w:abstractNum w:abstractNumId="116" w15:restartNumberingAfterBreak="0">
+  <w:abstractNum w:abstractNumId="117" w15:restartNumberingAfterBreak="0">
     <w:nsid w:val="57407594"/>
     <w:multiLevelType w:val="multilevel"/>
     <w:tmpl w:val="E6E2F8AE"/>
@@ -29414,7 +30670,7 @@
       </w:rPr>
     </w:lvl>
   </w:abstractNum>
-  <w:abstractNum w:abstractNumId="117" w15:restartNumberingAfterBreak="0">
+  <w:abstractNum w:abstractNumId="118" w15:restartNumberingAfterBreak="0">
     <w:nsid w:val="577F771B"/>
     <w:multiLevelType w:val="hybridMultilevel"/>
     <w:tmpl w:val="0F2C5914"/>
@@ -29526,7 +30782,7 @@
       </w:rPr>
     </w:lvl>
   </w:abstractNum>
-  <w:abstractNum w:abstractNumId="118" w15:restartNumberingAfterBreak="0">
+  <w:abstractNum w:abstractNumId="119" w15:restartNumberingAfterBreak="0">
     <w:nsid w:val="57C43CDD"/>
     <w:multiLevelType w:val="hybridMultilevel"/>
     <w:tmpl w:val="6C94FB5E"/>
@@ -29639,7 +30895,7 @@
       </w:rPr>
     </w:lvl>
   </w:abstractNum>
-  <w:abstractNum w:abstractNumId="119" w15:restartNumberingAfterBreak="0">
+  <w:abstractNum w:abstractNumId="120" w15:restartNumberingAfterBreak="0">
     <w:nsid w:val="58393977"/>
     <w:multiLevelType w:val="hybridMultilevel"/>
     <w:tmpl w:val="985A5484"/>
@@ -29752,7 +31008,7 @@
       </w:rPr>
     </w:lvl>
   </w:abstractNum>
-  <w:abstractNum w:abstractNumId="120" w15:restartNumberingAfterBreak="0">
+  <w:abstractNum w:abstractNumId="121" w15:restartNumberingAfterBreak="0">
     <w:nsid w:val="58993A3F"/>
     <w:multiLevelType w:val="hybridMultilevel"/>
     <w:tmpl w:val="5344B292"/>
@@ -29841,7 +31097,7 @@
       </w:pPr>
     </w:lvl>
   </w:abstractNum>
-  <w:abstractNum w:abstractNumId="121" w15:restartNumberingAfterBreak="0">
+  <w:abstractNum w:abstractNumId="122" w15:restartNumberingAfterBreak="0">
     <w:nsid w:val="59EB4CE4"/>
     <w:multiLevelType w:val="multilevel"/>
     <w:tmpl w:val="63F4E6F0"/>
@@ -29990,7 +31246,7 @@
       </w:rPr>
     </w:lvl>
   </w:abstractNum>
-  <w:abstractNum w:abstractNumId="122" w15:restartNumberingAfterBreak="0">
+  <w:abstractNum w:abstractNumId="123" w15:restartNumberingAfterBreak="0">
     <w:nsid w:val="5A067370"/>
     <w:multiLevelType w:val="hybridMultilevel"/>
     <w:tmpl w:val="9CB8C76C"/>
@@ -30103,7 +31359,7 @@
       </w:rPr>
     </w:lvl>
   </w:abstractNum>
-  <w:abstractNum w:abstractNumId="123" w15:restartNumberingAfterBreak="0">
+  <w:abstractNum w:abstractNumId="124" w15:restartNumberingAfterBreak="0">
     <w:nsid w:val="5BD11962"/>
     <w:multiLevelType w:val="hybridMultilevel"/>
     <w:tmpl w:val="89A4B834"/>
@@ -30192,7 +31448,7 @@
       </w:pPr>
     </w:lvl>
   </w:abstractNum>
-  <w:abstractNum w:abstractNumId="124" w15:restartNumberingAfterBreak="0">
+  <w:abstractNum w:abstractNumId="125" w15:restartNumberingAfterBreak="0">
     <w:nsid w:val="5C950DBA"/>
     <w:multiLevelType w:val="hybridMultilevel"/>
     <w:tmpl w:val="7D78F950"/>
@@ -30304,7 +31560,7 @@
       </w:rPr>
     </w:lvl>
   </w:abstractNum>
-  <w:abstractNum w:abstractNumId="125" w15:restartNumberingAfterBreak="0">
+  <w:abstractNum w:abstractNumId="126" w15:restartNumberingAfterBreak="0">
     <w:nsid w:val="5D2A5D3B"/>
     <w:multiLevelType w:val="hybridMultilevel"/>
     <w:tmpl w:val="3AF89EA6"/>
@@ -30395,7 +31651,7 @@
       </w:pPr>
     </w:lvl>
   </w:abstractNum>
-  <w:abstractNum w:abstractNumId="126" w15:restartNumberingAfterBreak="0">
+  <w:abstractNum w:abstractNumId="127" w15:restartNumberingAfterBreak="0">
     <w:nsid w:val="5D9E49FD"/>
     <w:multiLevelType w:val="hybridMultilevel"/>
     <w:tmpl w:val="4EE40BB4"/>
@@ -30507,7 +31763,7 @@
       </w:rPr>
     </w:lvl>
   </w:abstractNum>
-  <w:abstractNum w:abstractNumId="127" w15:restartNumberingAfterBreak="0">
+  <w:abstractNum w:abstractNumId="128" w15:restartNumberingAfterBreak="0">
     <w:nsid w:val="5DB7107D"/>
     <w:multiLevelType w:val="multilevel"/>
     <w:tmpl w:val="6520107A"/>
@@ -30656,7 +31912,7 @@
       </w:rPr>
     </w:lvl>
   </w:abstractNum>
-  <w:abstractNum w:abstractNumId="128" w15:restartNumberingAfterBreak="0">
+  <w:abstractNum w:abstractNumId="129" w15:restartNumberingAfterBreak="0">
     <w:nsid w:val="5E9370A7"/>
     <w:multiLevelType w:val="hybridMultilevel"/>
     <w:tmpl w:val="13480456"/>
@@ -30742,7 +31998,7 @@
       </w:pPr>
     </w:lvl>
   </w:abstractNum>
-  <w:abstractNum w:abstractNumId="129" w15:restartNumberingAfterBreak="0">
+  <w:abstractNum w:abstractNumId="130" w15:restartNumberingAfterBreak="0">
     <w:nsid w:val="60421322"/>
     <w:multiLevelType w:val="hybridMultilevel"/>
     <w:tmpl w:val="447CDBDC"/>
@@ -30854,7 +32110,7 @@
       </w:rPr>
     </w:lvl>
   </w:abstractNum>
-  <w:abstractNum w:abstractNumId="130" w15:restartNumberingAfterBreak="0">
+  <w:abstractNum w:abstractNumId="131" w15:restartNumberingAfterBreak="0">
     <w:nsid w:val="61926C31"/>
     <w:multiLevelType w:val="hybridMultilevel"/>
     <w:tmpl w:val="AFD27E5C"/>
@@ -30967,7 +32223,7 @@
       </w:rPr>
     </w:lvl>
   </w:abstractNum>
-  <w:abstractNum w:abstractNumId="131" w15:restartNumberingAfterBreak="0">
+  <w:abstractNum w:abstractNumId="132" w15:restartNumberingAfterBreak="0">
     <w:nsid w:val="622F5FC7"/>
     <w:multiLevelType w:val="hybridMultilevel"/>
     <w:tmpl w:val="49A6C2A6"/>
@@ -31080,7 +32336,7 @@
       </w:rPr>
     </w:lvl>
   </w:abstractNum>
-  <w:abstractNum w:abstractNumId="132" w15:restartNumberingAfterBreak="0">
+  <w:abstractNum w:abstractNumId="133" w15:restartNumberingAfterBreak="0">
     <w:nsid w:val="62AC33B4"/>
     <w:multiLevelType w:val="multilevel"/>
     <w:tmpl w:val="A074F3CA"/>
@@ -31229,7 +32485,7 @@
       </w:rPr>
     </w:lvl>
   </w:abstractNum>
-  <w:abstractNum w:abstractNumId="133" w15:restartNumberingAfterBreak="0">
+  <w:abstractNum w:abstractNumId="134" w15:restartNumberingAfterBreak="0">
     <w:nsid w:val="63B44674"/>
     <w:multiLevelType w:val="multilevel"/>
     <w:tmpl w:val="08F4FA9A"/>
@@ -31378,7 +32634,7 @@
       </w:rPr>
     </w:lvl>
   </w:abstractNum>
-  <w:abstractNum w:abstractNumId="134" w15:restartNumberingAfterBreak="0">
+  <w:abstractNum w:abstractNumId="135" w15:restartNumberingAfterBreak="0">
     <w:nsid w:val="63C245D4"/>
     <w:multiLevelType w:val="hybridMultilevel"/>
     <w:tmpl w:val="E1563A56"/>
@@ -31490,7 +32746,7 @@
       </w:rPr>
     </w:lvl>
   </w:abstractNum>
-  <w:abstractNum w:abstractNumId="135" w15:restartNumberingAfterBreak="0">
+  <w:abstractNum w:abstractNumId="136" w15:restartNumberingAfterBreak="0">
     <w:nsid w:val="64F30198"/>
     <w:multiLevelType w:val="multilevel"/>
     <w:tmpl w:val="63F4E6F0"/>
@@ -31639,7 +32895,7 @@
       </w:rPr>
     </w:lvl>
   </w:abstractNum>
-  <w:abstractNum w:abstractNumId="136" w15:restartNumberingAfterBreak="0">
+  <w:abstractNum w:abstractNumId="137" w15:restartNumberingAfterBreak="0">
     <w:nsid w:val="65AF2502"/>
     <w:multiLevelType w:val="hybridMultilevel"/>
     <w:tmpl w:val="FB2A44D8"/>
@@ -31752,7 +33008,7 @@
       </w:rPr>
     </w:lvl>
   </w:abstractNum>
-  <w:abstractNum w:abstractNumId="137" w15:restartNumberingAfterBreak="0">
+  <w:abstractNum w:abstractNumId="138" w15:restartNumberingAfterBreak="0">
     <w:nsid w:val="671614F0"/>
     <w:multiLevelType w:val="multilevel"/>
     <w:tmpl w:val="63F4E6F0"/>
@@ -31901,7 +33157,7 @@
       </w:rPr>
     </w:lvl>
   </w:abstractNum>
-  <w:abstractNum w:abstractNumId="138" w15:restartNumberingAfterBreak="0">
+  <w:abstractNum w:abstractNumId="139" w15:restartNumberingAfterBreak="0">
     <w:nsid w:val="6859691D"/>
     <w:multiLevelType w:val="multilevel"/>
     <w:tmpl w:val="826A9D48"/>
@@ -32050,7 +33306,7 @@
       </w:rPr>
     </w:lvl>
   </w:abstractNum>
-  <w:abstractNum w:abstractNumId="139" w15:restartNumberingAfterBreak="0">
+  <w:abstractNum w:abstractNumId="140" w15:restartNumberingAfterBreak="0">
     <w:nsid w:val="68817757"/>
     <w:multiLevelType w:val="multilevel"/>
     <w:tmpl w:val="34EE1968"/>
@@ -32199,7 +33455,120 @@
       </w:rPr>
     </w:lvl>
   </w:abstractNum>
-  <w:abstractNum w:abstractNumId="140" w15:restartNumberingAfterBreak="0">
+  <w:abstractNum w:abstractNumId="141" w15:restartNumberingAfterBreak="0">
+    <w:nsid w:val="68AE31AF"/>
+    <w:multiLevelType w:val="hybridMultilevel"/>
+    <w:tmpl w:val="9EB648FC"/>
+    <w:lvl w:ilvl="0" w:tplc="04090005">
+      <w:start w:val="1"/>
+      <w:numFmt w:val="bullet"/>
+      <w:lvlText w:val=""/>
+      <w:lvlJc w:val="left"/>
+      <w:pPr>
+        <w:ind w:left="720" w:hanging="360"/>
+      </w:pPr>
+      <w:rPr>
+        <w:rFonts w:ascii="Wingdings" w:hAnsi="Wingdings" w:hint="default"/>
+      </w:rPr>
+    </w:lvl>
+    <w:lvl w:ilvl="1" w:tplc="04090003" w:tentative="1">
+      <w:start w:val="1"/>
+      <w:numFmt w:val="bullet"/>
+      <w:lvlText w:val="o"/>
+      <w:lvlJc w:val="left"/>
+      <w:pPr>
+        <w:ind w:left="1440" w:hanging="360"/>
+      </w:pPr>
+      <w:rPr>
+        <w:rFonts w:ascii="Courier New" w:hAnsi="Courier New" w:cs="Courier New" w:hint="default"/>
+      </w:rPr>
+    </w:lvl>
+    <w:lvl w:ilvl="2" w:tplc="04090005" w:tentative="1">
+      <w:start w:val="1"/>
+      <w:numFmt w:val="bullet"/>
+      <w:lvlText w:val=""/>
+      <w:lvlJc w:val="left"/>
+      <w:pPr>
+        <w:ind w:left="2160" w:hanging="360"/>
+      </w:pPr>
+      <w:rPr>
+        <w:rFonts w:ascii="Wingdings" w:hAnsi="Wingdings" w:hint="default"/>
+      </w:rPr>
+    </w:lvl>
+    <w:lvl w:ilvl="3" w:tplc="04090001" w:tentative="1">
+      <w:start w:val="1"/>
+      <w:numFmt w:val="bullet"/>
+      <w:lvlText w:val=""/>
+      <w:lvlJc w:val="left"/>
+      <w:pPr>
+        <w:ind w:left="2880" w:hanging="360"/>
+      </w:pPr>
+      <w:rPr>
+        <w:rFonts w:ascii="Symbol" w:hAnsi="Symbol" w:hint="default"/>
+      </w:rPr>
+    </w:lvl>
+    <w:lvl w:ilvl="4" w:tplc="04090003" w:tentative="1">
+      <w:start w:val="1"/>
+      <w:numFmt w:val="bullet"/>
+      <w:lvlText w:val="o"/>
+      <w:lvlJc w:val="left"/>
+      <w:pPr>
+        <w:ind w:left="3600" w:hanging="360"/>
+      </w:pPr>
+      <w:rPr>
+        <w:rFonts w:ascii="Courier New" w:hAnsi="Courier New" w:cs="Courier New" w:hint="default"/>
+      </w:rPr>
+    </w:lvl>
+    <w:lvl w:ilvl="5" w:tplc="04090005" w:tentative="1">
+      <w:start w:val="1"/>
+      <w:numFmt w:val="bullet"/>
+      <w:lvlText w:val=""/>
+      <w:lvlJc w:val="left"/>
+      <w:pPr>
+        <w:ind w:left="4320" w:hanging="360"/>
+      </w:pPr>
+      <w:rPr>
+        <w:rFonts w:ascii="Wingdings" w:hAnsi="Wingdings" w:hint="default"/>
+      </w:rPr>
+    </w:lvl>
+    <w:lvl w:ilvl="6" w:tplc="04090001" w:tentative="1">
+      <w:start w:val="1"/>
+      <w:numFmt w:val="bullet"/>
+      <w:lvlText w:val=""/>
+      <w:lvlJc w:val="left"/>
+      <w:pPr>
+        <w:ind w:left="5040" w:hanging="360"/>
+      </w:pPr>
+      <w:rPr>
+        <w:rFonts w:ascii="Symbol" w:hAnsi="Symbol" w:hint="default"/>
+      </w:rPr>
+    </w:lvl>
+    <w:lvl w:ilvl="7" w:tplc="04090003" w:tentative="1">
+      <w:start w:val="1"/>
+      <w:numFmt w:val="bullet"/>
+      <w:lvlText w:val="o"/>
+      <w:lvlJc w:val="left"/>
+      <w:pPr>
+        <w:ind w:left="5760" w:hanging="360"/>
+      </w:pPr>
+      <w:rPr>
+        <w:rFonts w:ascii="Courier New" w:hAnsi="Courier New" w:cs="Courier New" w:hint="default"/>
+      </w:rPr>
+    </w:lvl>
+    <w:lvl w:ilvl="8" w:tplc="04090005" w:tentative="1">
+      <w:start w:val="1"/>
+      <w:numFmt w:val="bullet"/>
+      <w:lvlText w:val=""/>
+      <w:lvlJc w:val="left"/>
+      <w:pPr>
+        <w:ind w:left="6480" w:hanging="360"/>
+      </w:pPr>
+      <w:rPr>
+        <w:rFonts w:ascii="Wingdings" w:hAnsi="Wingdings" w:hint="default"/>
+      </w:rPr>
+    </w:lvl>
+  </w:abstractNum>
+  <w:abstractNum w:abstractNumId="142" w15:restartNumberingAfterBreak="0">
     <w:nsid w:val="68BE10E8"/>
     <w:multiLevelType w:val="hybridMultilevel"/>
     <w:tmpl w:val="326CD592"/>
@@ -32312,7 +33681,7 @@
       </w:rPr>
     </w:lvl>
   </w:abstractNum>
-  <w:abstractNum w:abstractNumId="141" w15:restartNumberingAfterBreak="0">
+  <w:abstractNum w:abstractNumId="143" w15:restartNumberingAfterBreak="0">
     <w:nsid w:val="68E86299"/>
     <w:multiLevelType w:val="hybridMultilevel"/>
     <w:tmpl w:val="9B5CBEE8"/>
@@ -32398,7 +33767,7 @@
       </w:pPr>
     </w:lvl>
   </w:abstractNum>
-  <w:abstractNum w:abstractNumId="142" w15:restartNumberingAfterBreak="0">
+  <w:abstractNum w:abstractNumId="144" w15:restartNumberingAfterBreak="0">
     <w:nsid w:val="69996D9A"/>
     <w:multiLevelType w:val="multilevel"/>
     <w:tmpl w:val="1780FC38"/>
@@ -32547,7 +33916,7 @@
       </w:rPr>
     </w:lvl>
   </w:abstractNum>
-  <w:abstractNum w:abstractNumId="143" w15:restartNumberingAfterBreak="0">
+  <w:abstractNum w:abstractNumId="145" w15:restartNumberingAfterBreak="0">
     <w:nsid w:val="6B3C30B9"/>
     <w:multiLevelType w:val="hybridMultilevel"/>
     <w:tmpl w:val="C938F8DE"/>
@@ -32659,7 +34028,7 @@
       </w:rPr>
     </w:lvl>
   </w:abstractNum>
-  <w:abstractNum w:abstractNumId="144" w15:restartNumberingAfterBreak="0">
+  <w:abstractNum w:abstractNumId="146" w15:restartNumberingAfterBreak="0">
     <w:nsid w:val="6D1511A0"/>
     <w:multiLevelType w:val="hybridMultilevel"/>
     <w:tmpl w:val="AAD8B9B4"/>
@@ -32771,7 +34140,7 @@
       </w:rPr>
     </w:lvl>
   </w:abstractNum>
-  <w:abstractNum w:abstractNumId="145" w15:restartNumberingAfterBreak="0">
+  <w:abstractNum w:abstractNumId="147" w15:restartNumberingAfterBreak="0">
     <w:nsid w:val="6DD255F1"/>
     <w:multiLevelType w:val="hybridMultilevel"/>
     <w:tmpl w:val="ACBC1404"/>
@@ -32884,7 +34253,7 @@
       </w:rPr>
     </w:lvl>
   </w:abstractNum>
-  <w:abstractNum w:abstractNumId="146" w15:restartNumberingAfterBreak="0">
+  <w:abstractNum w:abstractNumId="148" w15:restartNumberingAfterBreak="0">
     <w:nsid w:val="6DDB4404"/>
     <w:multiLevelType w:val="hybridMultilevel"/>
     <w:tmpl w:val="06428E32"/>
@@ -32997,7 +34366,7 @@
       </w:rPr>
     </w:lvl>
   </w:abstractNum>
-  <w:abstractNum w:abstractNumId="147" w15:restartNumberingAfterBreak="0">
+  <w:abstractNum w:abstractNumId="149" w15:restartNumberingAfterBreak="0">
     <w:nsid w:val="6F014B3B"/>
     <w:multiLevelType w:val="hybridMultilevel"/>
     <w:tmpl w:val="C89A39BE"/>
@@ -33109,7 +34478,7 @@
       </w:rPr>
     </w:lvl>
   </w:abstractNum>
-  <w:abstractNum w:abstractNumId="148" w15:restartNumberingAfterBreak="0">
+  <w:abstractNum w:abstractNumId="150" w15:restartNumberingAfterBreak="0">
     <w:nsid w:val="6F171273"/>
     <w:multiLevelType w:val="multilevel"/>
     <w:tmpl w:val="0240C564"/>
@@ -33258,7 +34627,7 @@
       </w:rPr>
     </w:lvl>
   </w:abstractNum>
-  <w:abstractNum w:abstractNumId="149" w15:restartNumberingAfterBreak="0">
+  <w:abstractNum w:abstractNumId="151" w15:restartNumberingAfterBreak="0">
     <w:nsid w:val="6FB82AAA"/>
     <w:multiLevelType w:val="multilevel"/>
     <w:tmpl w:val="FC46C7C0"/>
@@ -33407,7 +34776,7 @@
       </w:rPr>
     </w:lvl>
   </w:abstractNum>
-  <w:abstractNum w:abstractNumId="150" w15:restartNumberingAfterBreak="0">
+  <w:abstractNum w:abstractNumId="152" w15:restartNumberingAfterBreak="0">
     <w:nsid w:val="6FD46DCF"/>
     <w:multiLevelType w:val="hybridMultilevel"/>
     <w:tmpl w:val="EF5E6EC6"/>
@@ -33520,7 +34889,7 @@
       </w:rPr>
     </w:lvl>
   </w:abstractNum>
-  <w:abstractNum w:abstractNumId="151" w15:restartNumberingAfterBreak="0">
+  <w:abstractNum w:abstractNumId="153" w15:restartNumberingAfterBreak="0">
     <w:nsid w:val="70484E38"/>
     <w:multiLevelType w:val="multilevel"/>
     <w:tmpl w:val="22B26DD2"/>
@@ -33669,7 +35038,7 @@
       </w:rPr>
     </w:lvl>
   </w:abstractNum>
-  <w:abstractNum w:abstractNumId="152" w15:restartNumberingAfterBreak="0">
+  <w:abstractNum w:abstractNumId="154" w15:restartNumberingAfterBreak="0">
     <w:nsid w:val="70CB723E"/>
     <w:multiLevelType w:val="multilevel"/>
     <w:tmpl w:val="63F4E6F0"/>
@@ -33818,7 +35187,7 @@
       </w:rPr>
     </w:lvl>
   </w:abstractNum>
-  <w:abstractNum w:abstractNumId="153" w15:restartNumberingAfterBreak="0">
+  <w:abstractNum w:abstractNumId="155" w15:restartNumberingAfterBreak="0">
     <w:nsid w:val="71DB3F58"/>
     <w:multiLevelType w:val="multilevel"/>
     <w:tmpl w:val="63F4E6F0"/>
@@ -33967,7 +35336,7 @@
       </w:rPr>
     </w:lvl>
   </w:abstractNum>
-  <w:abstractNum w:abstractNumId="154" w15:restartNumberingAfterBreak="0">
+  <w:abstractNum w:abstractNumId="156" w15:restartNumberingAfterBreak="0">
     <w:nsid w:val="72F31FF2"/>
     <w:multiLevelType w:val="hybridMultilevel"/>
     <w:tmpl w:val="5C2693A0"/>
@@ -34079,7 +35448,7 @@
       </w:rPr>
     </w:lvl>
   </w:abstractNum>
-  <w:abstractNum w:abstractNumId="155" w15:restartNumberingAfterBreak="0">
+  <w:abstractNum w:abstractNumId="157" w15:restartNumberingAfterBreak="0">
     <w:nsid w:val="75B45140"/>
     <w:multiLevelType w:val="hybridMultilevel"/>
     <w:tmpl w:val="93F8F3C4"/>
@@ -34192,7 +35561,7 @@
       </w:rPr>
     </w:lvl>
   </w:abstractNum>
-  <w:abstractNum w:abstractNumId="156" w15:restartNumberingAfterBreak="0">
+  <w:abstractNum w:abstractNumId="158" w15:restartNumberingAfterBreak="0">
     <w:nsid w:val="76F60FFE"/>
     <w:multiLevelType w:val="multilevel"/>
     <w:tmpl w:val="63F4E6F0"/>
@@ -34341,7 +35710,7 @@
       </w:rPr>
     </w:lvl>
   </w:abstractNum>
-  <w:abstractNum w:abstractNumId="157" w15:restartNumberingAfterBreak="0">
+  <w:abstractNum w:abstractNumId="159" w15:restartNumberingAfterBreak="0">
     <w:nsid w:val="772A45B4"/>
     <w:multiLevelType w:val="hybridMultilevel"/>
     <w:tmpl w:val="833AB77E"/>
@@ -34454,7 +35823,7 @@
       </w:rPr>
     </w:lvl>
   </w:abstractNum>
-  <w:abstractNum w:abstractNumId="158" w15:restartNumberingAfterBreak="0">
+  <w:abstractNum w:abstractNumId="160" w15:restartNumberingAfterBreak="0">
     <w:nsid w:val="77572323"/>
     <w:multiLevelType w:val="multilevel"/>
     <w:tmpl w:val="63F4E6F0"/>
@@ -34603,7 +35972,7 @@
       </w:rPr>
     </w:lvl>
   </w:abstractNum>
-  <w:abstractNum w:abstractNumId="159" w15:restartNumberingAfterBreak="0">
+  <w:abstractNum w:abstractNumId="161" w15:restartNumberingAfterBreak="0">
     <w:nsid w:val="77B8201F"/>
     <w:multiLevelType w:val="hybridMultilevel"/>
     <w:tmpl w:val="D7160708"/>
@@ -34715,7 +36084,7 @@
       </w:rPr>
     </w:lvl>
   </w:abstractNum>
-  <w:abstractNum w:abstractNumId="160" w15:restartNumberingAfterBreak="0">
+  <w:abstractNum w:abstractNumId="162" w15:restartNumberingAfterBreak="0">
     <w:nsid w:val="79796FF9"/>
     <w:multiLevelType w:val="hybridMultilevel"/>
     <w:tmpl w:val="CFA8EF82"/>
@@ -34827,7 +36196,7 @@
       </w:rPr>
     </w:lvl>
   </w:abstractNum>
-  <w:abstractNum w:abstractNumId="161" w15:restartNumberingAfterBreak="0">
+  <w:abstractNum w:abstractNumId="163" w15:restartNumberingAfterBreak="0">
     <w:nsid w:val="79910410"/>
     <w:multiLevelType w:val="hybridMultilevel"/>
     <w:tmpl w:val="FC923542"/>
@@ -34939,7 +36308,7 @@
       </w:rPr>
     </w:lvl>
   </w:abstractNum>
-  <w:abstractNum w:abstractNumId="162" w15:restartNumberingAfterBreak="0">
+  <w:abstractNum w:abstractNumId="164" w15:restartNumberingAfterBreak="0">
     <w:nsid w:val="79BF6B53"/>
     <w:multiLevelType w:val="hybridMultilevel"/>
     <w:tmpl w:val="4E2EA1E0"/>
@@ -35025,7 +36394,7 @@
       </w:pPr>
     </w:lvl>
   </w:abstractNum>
-  <w:abstractNum w:abstractNumId="163" w15:restartNumberingAfterBreak="0">
+  <w:abstractNum w:abstractNumId="165" w15:restartNumberingAfterBreak="0">
     <w:nsid w:val="7AFF575A"/>
     <w:multiLevelType w:val="hybridMultilevel"/>
     <w:tmpl w:val="A6323D3E"/>
@@ -35137,7 +36506,7 @@
       </w:rPr>
     </w:lvl>
   </w:abstractNum>
-  <w:abstractNum w:abstractNumId="164" w15:restartNumberingAfterBreak="0">
+  <w:abstractNum w:abstractNumId="166" w15:restartNumberingAfterBreak="0">
     <w:nsid w:val="7B4018BF"/>
     <w:multiLevelType w:val="multilevel"/>
     <w:tmpl w:val="63F4E6F0"/>
@@ -35286,7 +36655,7 @@
       </w:rPr>
     </w:lvl>
   </w:abstractNum>
-  <w:abstractNum w:abstractNumId="165" w15:restartNumberingAfterBreak="0">
+  <w:abstractNum w:abstractNumId="167" w15:restartNumberingAfterBreak="0">
     <w:nsid w:val="7B4D1B33"/>
     <w:multiLevelType w:val="hybridMultilevel"/>
     <w:tmpl w:val="5EAC717E"/>
@@ -35398,7 +36767,7 @@
       </w:rPr>
     </w:lvl>
   </w:abstractNum>
-  <w:abstractNum w:abstractNumId="166" w15:restartNumberingAfterBreak="0">
+  <w:abstractNum w:abstractNumId="168" w15:restartNumberingAfterBreak="0">
     <w:nsid w:val="7CAC27CD"/>
     <w:multiLevelType w:val="multilevel"/>
     <w:tmpl w:val="3BC20E58"/>
@@ -35547,7 +36916,7 @@
       </w:rPr>
     </w:lvl>
   </w:abstractNum>
-  <w:abstractNum w:abstractNumId="167" w15:restartNumberingAfterBreak="0">
+  <w:abstractNum w:abstractNumId="169" w15:restartNumberingAfterBreak="0">
     <w:nsid w:val="7E5978EA"/>
     <w:multiLevelType w:val="hybridMultilevel"/>
     <w:tmpl w:val="D74C0DB0"/>
@@ -35659,7 +37028,7 @@
       </w:rPr>
     </w:lvl>
   </w:abstractNum>
-  <w:abstractNum w:abstractNumId="168" w15:restartNumberingAfterBreak="0">
+  <w:abstractNum w:abstractNumId="170" w15:restartNumberingAfterBreak="0">
     <w:nsid w:val="7F106A5D"/>
     <w:multiLevelType w:val="hybridMultilevel"/>
     <w:tmpl w:val="A1CA4816"/>
@@ -35784,22 +37153,22 @@
     <w:abstractNumId w:val="82"/>
   </w:num>
   <w:num w:numId="5" w16cid:durableId="769932622">
-    <w:abstractNumId w:val="115"/>
+    <w:abstractNumId w:val="116"/>
   </w:num>
   <w:num w:numId="6" w16cid:durableId="575944109">
     <w:abstractNumId w:val="49"/>
   </w:num>
   <w:num w:numId="7" w16cid:durableId="877661689">
-    <w:abstractNumId w:val="151"/>
+    <w:abstractNumId w:val="153"/>
   </w:num>
   <w:num w:numId="8" w16cid:durableId="1390107422">
     <w:abstractNumId w:val="88"/>
   </w:num>
   <w:num w:numId="9" w16cid:durableId="881866424">
-    <w:abstractNumId w:val="111"/>
+    <w:abstractNumId w:val="112"/>
   </w:num>
   <w:num w:numId="10" w16cid:durableId="1037244995">
-    <w:abstractNumId w:val="142"/>
+    <w:abstractNumId w:val="144"/>
   </w:num>
   <w:num w:numId="11" w16cid:durableId="1575554597">
     <w:abstractNumId w:val="72"/>
@@ -35808,7 +37177,7 @@
     <w:abstractNumId w:val="94"/>
   </w:num>
   <w:num w:numId="13" w16cid:durableId="1386294114">
-    <w:abstractNumId w:val="133"/>
+    <w:abstractNumId w:val="134"/>
   </w:num>
   <w:num w:numId="14" w16cid:durableId="1071851223">
     <w:abstractNumId w:val="30"/>
@@ -35817,7 +37186,7 @@
     <w:abstractNumId w:val="84"/>
   </w:num>
   <w:num w:numId="16" w16cid:durableId="1102919547">
-    <w:abstractNumId w:val="166"/>
+    <w:abstractNumId w:val="168"/>
   </w:num>
   <w:num w:numId="17" w16cid:durableId="294526838">
     <w:abstractNumId w:val="61"/>
@@ -35826,7 +37195,7 @@
     <w:abstractNumId w:val="70"/>
   </w:num>
   <w:num w:numId="19" w16cid:durableId="2119449470">
-    <w:abstractNumId w:val="107"/>
+    <w:abstractNumId w:val="108"/>
   </w:num>
   <w:num w:numId="20" w16cid:durableId="1365054799">
     <w:abstractNumId w:val="18"/>
@@ -35835,19 +37204,19 @@
     <w:abstractNumId w:val="71"/>
   </w:num>
   <w:num w:numId="22" w16cid:durableId="1080098953">
-    <w:abstractNumId w:val="138"/>
+    <w:abstractNumId w:val="139"/>
   </w:num>
   <w:num w:numId="23" w16cid:durableId="1635717296">
     <w:abstractNumId w:val="76"/>
   </w:num>
   <w:num w:numId="24" w16cid:durableId="544873123">
-    <w:abstractNumId w:val="132"/>
+    <w:abstractNumId w:val="133"/>
   </w:num>
   <w:num w:numId="25" w16cid:durableId="1128352778">
     <w:abstractNumId w:val="17"/>
   </w:num>
   <w:num w:numId="26" w16cid:durableId="1732537407">
-    <w:abstractNumId w:val="146"/>
+    <w:abstractNumId w:val="148"/>
   </w:num>
   <w:num w:numId="27" w16cid:durableId="945502064">
     <w:abstractNumId w:val="7"/>
@@ -35874,43 +37243,43 @@
     <w:abstractNumId w:val="56"/>
   </w:num>
   <w:num w:numId="35" w16cid:durableId="356852923">
-    <w:abstractNumId w:val="106"/>
+    <w:abstractNumId w:val="107"/>
   </w:num>
   <w:num w:numId="36" w16cid:durableId="430662559">
     <w:abstractNumId w:val="25"/>
   </w:num>
   <w:num w:numId="37" w16cid:durableId="247080868">
-    <w:abstractNumId w:val="155"/>
+    <w:abstractNumId w:val="157"/>
   </w:num>
   <w:num w:numId="38" w16cid:durableId="158887408">
-    <w:abstractNumId w:val="130"/>
+    <w:abstractNumId w:val="131"/>
   </w:num>
   <w:num w:numId="39" w16cid:durableId="1681347932">
-    <w:abstractNumId w:val="150"/>
+    <w:abstractNumId w:val="152"/>
   </w:num>
   <w:num w:numId="40" w16cid:durableId="2101440158">
     <w:abstractNumId w:val="87"/>
   </w:num>
   <w:num w:numId="41" w16cid:durableId="1250391122">
-    <w:abstractNumId w:val="125"/>
+    <w:abstractNumId w:val="126"/>
   </w:num>
   <w:num w:numId="42" w16cid:durableId="479083359">
-    <w:abstractNumId w:val="154"/>
+    <w:abstractNumId w:val="156"/>
   </w:num>
   <w:num w:numId="43" w16cid:durableId="1557860317">
-    <w:abstractNumId w:val="108"/>
+    <w:abstractNumId w:val="109"/>
   </w:num>
   <w:num w:numId="44" w16cid:durableId="2142183763">
     <w:abstractNumId w:val="10"/>
   </w:num>
   <w:num w:numId="45" w16cid:durableId="1357736349">
-    <w:abstractNumId w:val="161"/>
+    <w:abstractNumId w:val="163"/>
   </w:num>
   <w:num w:numId="46" w16cid:durableId="1519656040">
-    <w:abstractNumId w:val="160"/>
+    <w:abstractNumId w:val="162"/>
   </w:num>
   <w:num w:numId="47" w16cid:durableId="1078596852">
-    <w:abstractNumId w:val="168"/>
+    <w:abstractNumId w:val="170"/>
   </w:num>
   <w:num w:numId="48" w16cid:durableId="1027950100">
     <w:abstractNumId w:val="41"/>
@@ -35922,19 +37291,19 @@
     <w:abstractNumId w:val="77"/>
   </w:num>
   <w:num w:numId="51" w16cid:durableId="1128354320">
-    <w:abstractNumId w:val="144"/>
+    <w:abstractNumId w:val="146"/>
   </w:num>
   <w:num w:numId="52" w16cid:durableId="248543928">
     <w:abstractNumId w:val="86"/>
   </w:num>
   <w:num w:numId="53" w16cid:durableId="965889214">
-    <w:abstractNumId w:val="113"/>
+    <w:abstractNumId w:val="114"/>
   </w:num>
   <w:num w:numId="54" w16cid:durableId="1827503240">
-    <w:abstractNumId w:val="123"/>
+    <w:abstractNumId w:val="124"/>
   </w:num>
   <w:num w:numId="55" w16cid:durableId="505748256">
-    <w:abstractNumId w:val="103"/>
+    <w:abstractNumId w:val="104"/>
   </w:num>
   <w:num w:numId="56" w16cid:durableId="2120370925">
     <w:abstractNumId w:val="38"/>
@@ -35943,22 +37312,22 @@
     <w:abstractNumId w:val="21"/>
   </w:num>
   <w:num w:numId="58" w16cid:durableId="1000235123">
-    <w:abstractNumId w:val="109"/>
+    <w:abstractNumId w:val="110"/>
   </w:num>
   <w:num w:numId="59" w16cid:durableId="628516409">
-    <w:abstractNumId w:val="143"/>
+    <w:abstractNumId w:val="145"/>
   </w:num>
   <w:num w:numId="60" w16cid:durableId="2028865444">
-    <w:abstractNumId w:val="101"/>
+    <w:abstractNumId w:val="102"/>
   </w:num>
   <w:num w:numId="61" w16cid:durableId="943926811">
-    <w:abstractNumId w:val="165"/>
+    <w:abstractNumId w:val="167"/>
   </w:num>
   <w:num w:numId="62" w16cid:durableId="1841193257">
     <w:abstractNumId w:val="79"/>
   </w:num>
   <w:num w:numId="63" w16cid:durableId="682322850">
-    <w:abstractNumId w:val="147"/>
+    <w:abstractNumId w:val="149"/>
   </w:num>
   <w:num w:numId="64" w16cid:durableId="2043705333">
     <w:abstractNumId w:val="80"/>
@@ -35973,16 +37342,16 @@
     <w:abstractNumId w:val="66"/>
   </w:num>
   <w:num w:numId="68" w16cid:durableId="2064014330">
-    <w:abstractNumId w:val="117"/>
+    <w:abstractNumId w:val="118"/>
   </w:num>
   <w:num w:numId="69" w16cid:durableId="452797354">
-    <w:abstractNumId w:val="124"/>
+    <w:abstractNumId w:val="125"/>
   </w:num>
   <w:num w:numId="70" w16cid:durableId="1196650037">
     <w:abstractNumId w:val="54"/>
   </w:num>
   <w:num w:numId="71" w16cid:durableId="940071828">
-    <w:abstractNumId w:val="159"/>
+    <w:abstractNumId w:val="161"/>
   </w:num>
   <w:num w:numId="72" w16cid:durableId="1608273926">
     <w:abstractNumId w:val="81"/>
@@ -35997,7 +37366,7 @@
     <w:abstractNumId w:val="36"/>
   </w:num>
   <w:num w:numId="76" w16cid:durableId="286202349">
-    <w:abstractNumId w:val="129"/>
+    <w:abstractNumId w:val="130"/>
   </w:num>
   <w:num w:numId="77" w16cid:durableId="156460757">
     <w:abstractNumId w:val="73"/>
@@ -36021,7 +37390,7 @@
     <w:abstractNumId w:val="27"/>
   </w:num>
   <w:num w:numId="84" w16cid:durableId="366876741">
-    <w:abstractNumId w:val="100"/>
+    <w:abstractNumId w:val="101"/>
   </w:num>
   <w:num w:numId="85" w16cid:durableId="15274915">
     <w:abstractNumId w:val="43"/>
@@ -36030,16 +37399,16 @@
     <w:abstractNumId w:val="12"/>
   </w:num>
   <w:num w:numId="87" w16cid:durableId="591351385">
-    <w:abstractNumId w:val="114"/>
+    <w:abstractNumId w:val="115"/>
   </w:num>
   <w:num w:numId="88" w16cid:durableId="1361005725">
-    <w:abstractNumId w:val="163"/>
+    <w:abstractNumId w:val="165"/>
   </w:num>
   <w:num w:numId="89" w16cid:durableId="219681743">
     <w:abstractNumId w:val="13"/>
   </w:num>
   <w:num w:numId="90" w16cid:durableId="194386594">
-    <w:abstractNumId w:val="126"/>
+    <w:abstractNumId w:val="127"/>
   </w:num>
   <w:num w:numId="91" w16cid:durableId="777793346">
     <w:abstractNumId w:val="90"/>
@@ -36066,28 +37435,28 @@
     <w:abstractNumId w:val="28"/>
   </w:num>
   <w:num w:numId="99" w16cid:durableId="1706099794">
-    <w:abstractNumId w:val="149"/>
+    <w:abstractNumId w:val="151"/>
   </w:num>
   <w:num w:numId="100" w16cid:durableId="256404901">
-    <w:abstractNumId w:val="148"/>
+    <w:abstractNumId w:val="150"/>
   </w:num>
   <w:num w:numId="101" w16cid:durableId="924923012">
     <w:abstractNumId w:val="33"/>
   </w:num>
   <w:num w:numId="102" w16cid:durableId="536550966">
-    <w:abstractNumId w:val="164"/>
+    <w:abstractNumId w:val="166"/>
   </w:num>
   <w:num w:numId="103" w16cid:durableId="425157302">
     <w:abstractNumId w:val="75"/>
   </w:num>
   <w:num w:numId="104" w16cid:durableId="967664612">
-    <w:abstractNumId w:val="135"/>
+    <w:abstractNumId w:val="136"/>
   </w:num>
   <w:num w:numId="105" w16cid:durableId="361631616">
-    <w:abstractNumId w:val="102"/>
+    <w:abstractNumId w:val="103"/>
   </w:num>
   <w:num w:numId="106" w16cid:durableId="443623616">
-    <w:abstractNumId w:val="139"/>
+    <w:abstractNumId w:val="140"/>
   </w:num>
   <w:num w:numId="107" w16cid:durableId="150101619">
     <w:abstractNumId w:val="15"/>
@@ -36099,28 +37468,28 @@
     <w:abstractNumId w:val="0"/>
   </w:num>
   <w:num w:numId="110" w16cid:durableId="712924661">
-    <w:abstractNumId w:val="121"/>
+    <w:abstractNumId w:val="122"/>
   </w:num>
   <w:num w:numId="111" w16cid:durableId="1917784113">
-    <w:abstractNumId w:val="116"/>
+    <w:abstractNumId w:val="117"/>
   </w:num>
   <w:num w:numId="112" w16cid:durableId="896237065">
-    <w:abstractNumId w:val="127"/>
+    <w:abstractNumId w:val="128"/>
   </w:num>
   <w:num w:numId="113" w16cid:durableId="1171681430">
-    <w:abstractNumId w:val="152"/>
+    <w:abstractNumId w:val="154"/>
   </w:num>
   <w:num w:numId="114" w16cid:durableId="1552573199">
-    <w:abstractNumId w:val="153"/>
+    <w:abstractNumId w:val="155"/>
   </w:num>
   <w:num w:numId="115" w16cid:durableId="1920869674">
-    <w:abstractNumId w:val="137"/>
+    <w:abstractNumId w:val="138"/>
   </w:num>
   <w:num w:numId="116" w16cid:durableId="476724716">
-    <w:abstractNumId w:val="105"/>
+    <w:abstractNumId w:val="106"/>
   </w:num>
   <w:num w:numId="117" w16cid:durableId="658919541">
-    <w:abstractNumId w:val="104"/>
+    <w:abstractNumId w:val="105"/>
   </w:num>
   <w:num w:numId="118" w16cid:durableId="1622418131">
     <w:abstractNumId w:val="51"/>
@@ -36129,7 +37498,7 @@
     <w:abstractNumId w:val="3"/>
   </w:num>
   <w:num w:numId="120" w16cid:durableId="396828229">
-    <w:abstractNumId w:val="158"/>
+    <w:abstractNumId w:val="160"/>
   </w:num>
   <w:num w:numId="121" w16cid:durableId="986058889">
     <w:abstractNumId w:val="23"/>
@@ -36141,7 +37510,7 @@
     <w:abstractNumId w:val="89"/>
   </w:num>
   <w:num w:numId="124" w16cid:durableId="114181197">
-    <w:abstractNumId w:val="156"/>
+    <w:abstractNumId w:val="158"/>
   </w:num>
   <w:num w:numId="125" w16cid:durableId="772671624">
     <w:abstractNumId w:val="5"/>
@@ -36159,16 +37528,16 @@
     <w:abstractNumId w:val="67"/>
   </w:num>
   <w:num w:numId="130" w16cid:durableId="1168907903">
-    <w:abstractNumId w:val="140"/>
+    <w:abstractNumId w:val="142"/>
   </w:num>
   <w:num w:numId="131" w16cid:durableId="430206235">
-    <w:abstractNumId w:val="131"/>
+    <w:abstractNumId w:val="132"/>
   </w:num>
   <w:num w:numId="132" w16cid:durableId="1207327089">
     <w:abstractNumId w:val="32"/>
   </w:num>
   <w:num w:numId="133" w16cid:durableId="596404292">
-    <w:abstractNumId w:val="118"/>
+    <w:abstractNumId w:val="119"/>
   </w:num>
   <w:num w:numId="134" w16cid:durableId="2070372549">
     <w:abstractNumId w:val="48"/>
@@ -36186,22 +37555,22 @@
     <w:abstractNumId w:val="85"/>
   </w:num>
   <w:num w:numId="139" w16cid:durableId="967976864">
-    <w:abstractNumId w:val="119"/>
+    <w:abstractNumId w:val="120"/>
   </w:num>
   <w:num w:numId="140" w16cid:durableId="650643288">
-    <w:abstractNumId w:val="136"/>
+    <w:abstractNumId w:val="137"/>
   </w:num>
   <w:num w:numId="141" w16cid:durableId="219370247">
-    <w:abstractNumId w:val="134"/>
+    <w:abstractNumId w:val="135"/>
   </w:num>
   <w:num w:numId="142" w16cid:durableId="323239876">
-    <w:abstractNumId w:val="167"/>
+    <w:abstractNumId w:val="169"/>
   </w:num>
   <w:num w:numId="143" w16cid:durableId="1619793156">
     <w:abstractNumId w:val="37"/>
   </w:num>
   <w:num w:numId="144" w16cid:durableId="1186332867">
-    <w:abstractNumId w:val="145"/>
+    <w:abstractNumId w:val="147"/>
   </w:num>
   <w:num w:numId="145" w16cid:durableId="89937035">
     <w:abstractNumId w:val="59"/>
@@ -36210,10 +37579,10 @@
     <w:abstractNumId w:val="1"/>
   </w:num>
   <w:num w:numId="147" w16cid:durableId="1760910030">
-    <w:abstractNumId w:val="110"/>
+    <w:abstractNumId w:val="111"/>
   </w:num>
   <w:num w:numId="148" w16cid:durableId="349307706">
-    <w:abstractNumId w:val="141"/>
+    <w:abstractNumId w:val="143"/>
   </w:num>
   <w:num w:numId="149" w16cid:durableId="1600336622">
     <w:abstractNumId w:val="35"/>
@@ -36225,10 +37594,10 @@
     <w:abstractNumId w:val="16"/>
   </w:num>
   <w:num w:numId="152" w16cid:durableId="1483890789">
-    <w:abstractNumId w:val="112"/>
+    <w:abstractNumId w:val="113"/>
   </w:num>
   <w:num w:numId="153" w16cid:durableId="2104719660">
-    <w:abstractNumId w:val="128"/>
+    <w:abstractNumId w:val="129"/>
   </w:num>
   <w:num w:numId="154" w16cid:durableId="2030252929">
     <w:abstractNumId w:val="55"/>
@@ -36243,13 +37612,13 @@
     <w:abstractNumId w:val="2"/>
   </w:num>
   <w:num w:numId="158" w16cid:durableId="1034845685">
-    <w:abstractNumId w:val="157"/>
+    <w:abstractNumId w:val="159"/>
   </w:num>
   <w:num w:numId="159" w16cid:durableId="1262639594">
     <w:abstractNumId w:val="65"/>
   </w:num>
   <w:num w:numId="160" w16cid:durableId="1640988115">
-    <w:abstractNumId w:val="122"/>
+    <w:abstractNumId w:val="123"/>
   </w:num>
   <w:num w:numId="161" w16cid:durableId="1536966176">
     <w:abstractNumId w:val="31"/>
@@ -36258,7 +37627,7 @@
     <w:abstractNumId w:val="63"/>
   </w:num>
   <w:num w:numId="163" w16cid:durableId="1025402036">
-    <w:abstractNumId w:val="120"/>
+    <w:abstractNumId w:val="121"/>
   </w:num>
   <w:num w:numId="164" w16cid:durableId="703671323">
     <w:abstractNumId w:val="83"/>
@@ -36276,7 +37645,13 @@
     <w:abstractNumId w:val="97"/>
   </w:num>
   <w:num w:numId="169" w16cid:durableId="1382096019">
-    <w:abstractNumId w:val="162"/>
+    <w:abstractNumId w:val="164"/>
+  </w:num>
+  <w:num w:numId="170" w16cid:durableId="2092239844">
+    <w:abstractNumId w:val="141"/>
+  </w:num>
+  <w:num w:numId="171" w16cid:durableId="2061635092">
+    <w:abstractNumId w:val="100"/>
   </w:num>
 </w:numbering>
 </file>

</xml_diff>

<commit_message>
Administration API Design (#394)
</commit_message>
<xml_diff>
--- a/API Design.docx
+++ b/API Design.docx
@@ -47,7 +47,15 @@
     </w:p>
     <w:p>
       <w:r>
-        <w:t>Before detailing the endpoints of the API it is critical to perform an analysis of API requirements in order to make sure that the provided services accurately correspond to the platform's business needs. Such analysis transforms the functional requirements specified in the Product Requirements Document (PRD) and use-case model into the set of well-designed service interfaces. Moreover, this step identifies clearly the owner of the business functionality assigning an appropriate backend service to each API as a result of implementation of the separation of concern principle in the proposed architecture.</w:t>
+        <w:t xml:space="preserve">Before detailing the endpoints of the </w:t>
+      </w:r>
+      <w:proofErr w:type="gramStart"/>
+      <w:r>
+        <w:t>API</w:t>
+      </w:r>
+      <w:proofErr w:type="gramEnd"/>
+      <w:r>
+        <w:t xml:space="preserve"> it is critical to perform an analysis of API requirements in order to make sure that the provided services accurately correspond to the platform's business needs. Such analysis transforms the functional requirements specified in the Product Requirements Document (PRD) and use-case model into the set of well-designed service interfaces. Moreover, this step identifies clearly the owner of the business functionality assigning an appropriate backend service to each API as a result of implementation of the separation of concern principle in the proposed architecture.</w:t>
       </w:r>
     </w:p>
     <w:p>
@@ -6186,7 +6194,15 @@
     </w:p>
     <w:p>
       <w:r>
-        <w:t>The above mentioned workflow makes sure of the consistency of processing and synchronization of vehicle availability, payment, and customer notifications.</w:t>
+        <w:t xml:space="preserve">The </w:t>
+      </w:r>
+      <w:proofErr w:type="gramStart"/>
+      <w:r>
+        <w:t>above mentioned</w:t>
+      </w:r>
+      <w:proofErr w:type="gramEnd"/>
+      <w:r>
+        <w:t xml:space="preserve"> workflow makes sure of the consistency of processing and synchronization of vehicle availability, payment, and customer notifications.</w:t>
       </w:r>
     </w:p>
     <w:p>
@@ -15854,6 +15870,7 @@
         <w:br w:type="page"/>
       </w:r>
     </w:p>
+    <w:p/>
     <w:p/>
     <w:p/>
     <w:sectPr>

</xml_diff>

<commit_message>
Payment Integration APIs (#400)
</commit_message>
<xml_diff>
--- a/API Design.docx
+++ b/API Design.docx
@@ -47,15 +47,7 @@
     </w:p>
     <w:p>
       <w:r>
-        <w:t xml:space="preserve">Before detailing the endpoints of the </w:t>
-      </w:r>
-      <w:proofErr w:type="gramStart"/>
-      <w:r>
-        <w:t>API</w:t>
-      </w:r>
-      <w:proofErr w:type="gramEnd"/>
-      <w:r>
-        <w:t xml:space="preserve"> it is critical to perform an analysis of API requirements in order to make sure that the provided services accurately correspond to the platform's business needs. Such analysis transforms the functional requirements specified in the Product Requirements Document (PRD) and use-case model into the set of well-designed service interfaces. Moreover, this step identifies clearly the owner of the business functionality assigning an appropriate backend service to each API as a result of implementation of the separation of concern principle in the proposed architecture.</w:t>
+        <w:t>Before detailing the endpoints of the API it is critical to perform an analysis of API requirements in order to make sure that the provided services accurately correspond to the platform's business needs. Such analysis transforms the functional requirements specified in the Product Requirements Document (PRD) and use-case model into the set of well-designed service interfaces. Moreover, this step identifies clearly the owner of the business functionality assigning an appropriate backend service to each API as a result of implementation of the separation of concern principle in the proposed architecture.</w:t>
       </w:r>
     </w:p>
     <w:p>
@@ -6194,15 +6186,7 @@
     </w:p>
     <w:p>
       <w:r>
-        <w:t xml:space="preserve">The </w:t>
-      </w:r>
-      <w:proofErr w:type="gramStart"/>
-      <w:r>
-        <w:t>above mentioned</w:t>
-      </w:r>
-      <w:proofErr w:type="gramEnd"/>
-      <w:r>
-        <w:t xml:space="preserve"> workflow makes sure of the consistency of processing and synchronization of vehicle availability, payment, and customer notifications.</w:t>
+        <w:t>The above mentioned workflow makes sure of the consistency of processing and synchronization of vehicle availability, payment, and customer notifications.</w:t>
       </w:r>
     </w:p>
     <w:p>
@@ -15870,12 +15854,1213 @@
         <w:br w:type="page"/>
       </w:r>
     </w:p>
+    <w:p>
+      <w:pPr>
+        <w:pStyle w:val="Heading2"/>
+      </w:pPr>
+      <w:r>
+        <w:lastRenderedPageBreak/>
+        <w:t>Integration API Specification</w:t>
+      </w:r>
+    </w:p>
+    <w:p>
+      <w:r>
+        <w:t>The Integration APIs act as a tool for communicating between the KriGo platform and external systems. Unlike the Customer APIs, the Agency Management APIs and the Administration APIs, the purpose of the Integration APIs is to perform secure data exchange with third-party providers to improve the functionality of the platform and the user experience. The provided integrations will allow the platform to use specialized services without affecting its modular structure.</w:t>
+      </w:r>
+    </w:p>
+    <w:p>
+      <w:r>
+        <w:t>Integration APIs are designed according to the RESTful architecture principles with the implementation of standardized protocols to ensure interconnectivity, scalability and maintainability. Third-party services connect to the KriGo platform using the available API endpoints with the data exchange using JSON over HTTPS. Depending on the requirements of each particular service, authentication via API key, OAuth 2.0 protocol or JSON Web Token (JWT) is used, while all the communications are secured with TLS.</w:t>
+      </w:r>
+    </w:p>
+    <w:p>
+      <w:r>
+        <w:t>From the architectural perspective, the Integration APIs represent the independent services designed to separate the external dependencies from the business logic. As a result, the level of the coupling between the internal components and third-party providers is minimized, thus making it possible to replace or extend the external services without affecting the whole platform. Besides that, the integration services include error handling, request retries, validation and logging for the reliable communication and monitoring.</w:t>
+      </w:r>
+    </w:p>
+    <w:p>
+      <w:r>
+        <w:t>In the KriGo platform, there are several important external services integrated through the use of Integration APIs such as payment, email, SMS, cloud, mapping and identity verification services when needed. This enables performing payment operations securely, sending customer notifications, searching for vehicles by location and other useful features.</w:t>
+      </w:r>
+    </w:p>
+    <w:p>
+      <w:pPr>
+        <w:spacing w:line="278" w:lineRule="auto"/>
+      </w:pPr>
+      <w:r>
+        <w:br w:type="page"/>
+      </w:r>
+    </w:p>
+    <w:p>
+      <w:pPr>
+        <w:pStyle w:val="Heading3"/>
+      </w:pPr>
+      <w:r>
+        <w:lastRenderedPageBreak/>
+        <w:t>Payment Integration APIs</w:t>
+      </w:r>
+    </w:p>
+    <w:p>
+      <w:r>
+        <w:t>The Payment Integration APIs contain all the functionalities necessary to process secure payments via the KriGo platform. They establish connections between the platform and third party payment gateways. With their help, clients can pay for the reservation, get a refund, and check the transaction status.</w:t>
+      </w:r>
+    </w:p>
+    <w:p>
+      <w:r>
+        <w:t>The Payment Integration APIs are implemented according to REST principles and payment processing workflow. Instead of processing payments on its own and handling payment information, KriGo platform uses certified third-party payment service providers, which allows simplifying payment processing, minimizing security risks and reducing the number of actions associated with this process.</w:t>
+      </w:r>
+    </w:p>
+    <w:p>
+      <w:r>
+        <w:t>The communication related to the payments is protected by means of HTTPS and TLS. The external payment providers can use either API keys, or OAuth 2.0 access tokens, or digital signatures for authentication. To ensure the safety of financial operations, the payments are validated and checked against modifications after that the payment requests are sent.</w:t>
+      </w:r>
+    </w:p>
+    <w:p>
+      <w:r>
+        <w:t>The Payment Integration Service interacts with Reservation Service, Customer Service, Notification Service, and Reporting Service. When a customer makes a reservation, the Reservation Service generates a payment request and sends it to the external payment gateway. After receiving a confirmation from the external payment gateway, the reservation status is changed, the customer receives a payment confirmation message, and the transaction is reported and logged. Similarly, the refund operations synchronize the status of the payments with the status of the reservation records.</w:t>
+      </w:r>
+    </w:p>
+    <w:p>
+      <w:pPr>
+        <w:pStyle w:val="Title"/>
+      </w:pPr>
+      <w:r>
+        <w:t>Payment Integration API Endpoints</w:t>
+      </w:r>
+    </w:p>
+    <w:p>
+      <w:pPr>
+        <w:pStyle w:val="Caption"/>
+        <w:keepNext/>
+      </w:pPr>
+      <w:r>
+        <w:t xml:space="preserve">Table </w:t>
+      </w:r>
+      <w:r>
+        <w:fldChar w:fldCharType="begin"/>
+      </w:r>
+      <w:r>
+        <w:instrText xml:space="preserve"> SEQ Table \* ARABIC </w:instrText>
+      </w:r>
+      <w:r>
+        <w:fldChar w:fldCharType="separate"/>
+      </w:r>
+      <w:r>
+        <w:rPr>
+          <w:noProof/>
+        </w:rPr>
+        <w:t>15</w:t>
+      </w:r>
+      <w:r>
+        <w:fldChar w:fldCharType="end"/>
+      </w:r>
+      <w:r>
+        <w:t xml:space="preserve"> - </w:t>
+      </w:r>
+      <w:r>
+        <w:t>Payment Integration API Endpoints</w:t>
+      </w:r>
+    </w:p>
+    <w:tbl>
+      <w:tblPr>
+        <w:tblStyle w:val="PlainTable1"/>
+        <w:tblW w:w="0" w:type="auto"/>
+        <w:tblCellMar>
+          <w:top w:w="72" w:type="dxa"/>
+          <w:bottom w:w="72" w:type="dxa"/>
+        </w:tblCellMar>
+        <w:tblLook w:val="04A0" w:firstRow="1" w:lastRow="0" w:firstColumn="1" w:lastColumn="0" w:noHBand="0" w:noVBand="1"/>
+      </w:tblPr>
+      <w:tblGrid>
+        <w:gridCol w:w="5219"/>
+        <w:gridCol w:w="1016"/>
+        <w:gridCol w:w="1896"/>
+        <w:gridCol w:w="1216"/>
+      </w:tblGrid>
+      <w:tr>
+        <w:trPr>
+          <w:cnfStyle w:val="100000000000" w:firstRow="1" w:lastRow="0" w:firstColumn="0" w:lastColumn="0" w:oddVBand="0" w:evenVBand="0" w:oddHBand="0" w:evenHBand="0" w:firstRowFirstColumn="0" w:firstRowLastColumn="0" w:lastRowFirstColumn="0" w:lastRowLastColumn="0"/>
+          <w:trHeight w:val="432"/>
+          <w:tblHeader/>
+        </w:trPr>
+        <w:tc>
+          <w:tcPr>
+            <w:cnfStyle w:val="001000000000" w:firstRow="0" w:lastRow="0" w:firstColumn="1" w:lastColumn="0" w:oddVBand="0" w:evenVBand="0" w:oddHBand="0" w:evenHBand="0" w:firstRowFirstColumn="0" w:firstRowLastColumn="0" w:lastRowFirstColumn="0" w:lastRowLastColumn="0"/>
+            <w:tcW w:w="0" w:type="auto"/>
+            <w:vAlign w:val="center"/>
+            <w:hideMark/>
+          </w:tcPr>
+          <w:p>
+            <w:r>
+              <w:t>Endpoint</w:t>
+            </w:r>
+          </w:p>
+        </w:tc>
+        <w:tc>
+          <w:tcPr>
+            <w:tcW w:w="0" w:type="auto"/>
+            <w:vAlign w:val="center"/>
+            <w:hideMark/>
+          </w:tcPr>
+          <w:p>
+            <w:pPr>
+              <w:jc w:val="center"/>
+              <w:cnfStyle w:val="100000000000" w:firstRow="1" w:lastRow="0" w:firstColumn="0" w:lastColumn="0" w:oddVBand="0" w:evenVBand="0" w:oddHBand="0" w:evenHBand="0" w:firstRowFirstColumn="0" w:firstRowLastColumn="0" w:lastRowFirstColumn="0" w:lastRowLastColumn="0"/>
+            </w:pPr>
+            <w:r>
+              <w:t>Method</w:t>
+            </w:r>
+          </w:p>
+        </w:tc>
+        <w:tc>
+          <w:tcPr>
+            <w:tcW w:w="0" w:type="auto"/>
+            <w:vAlign w:val="center"/>
+            <w:hideMark/>
+          </w:tcPr>
+          <w:p>
+            <w:pPr>
+              <w:cnfStyle w:val="100000000000" w:firstRow="1" w:lastRow="0" w:firstColumn="0" w:lastColumn="0" w:oddVBand="0" w:evenVBand="0" w:oddHBand="0" w:evenHBand="0" w:firstRowFirstColumn="0" w:firstRowLastColumn="0" w:lastRowFirstColumn="0" w:lastRowLastColumn="0"/>
+            </w:pPr>
+            <w:r>
+              <w:t>Description</w:t>
+            </w:r>
+          </w:p>
+        </w:tc>
+        <w:tc>
+          <w:tcPr>
+            <w:tcW w:w="1152" w:type="dxa"/>
+            <w:vAlign w:val="center"/>
+            <w:hideMark/>
+          </w:tcPr>
+          <w:p>
+            <w:pPr>
+              <w:jc w:val="center"/>
+              <w:cnfStyle w:val="100000000000" w:firstRow="1" w:lastRow="0" w:firstColumn="0" w:lastColumn="0" w:oddVBand="0" w:evenVBand="0" w:oddHBand="0" w:evenHBand="0" w:firstRowFirstColumn="0" w:firstRowLastColumn="0" w:lastRowFirstColumn="0" w:lastRowLastColumn="0"/>
+            </w:pPr>
+            <w:r>
+              <w:t>Auth</w:t>
+            </w:r>
+          </w:p>
+        </w:tc>
+      </w:tr>
+      <w:tr>
+        <w:trPr>
+          <w:cnfStyle w:val="000000100000" w:firstRow="0" w:lastRow="0" w:firstColumn="0" w:lastColumn="0" w:oddVBand="0" w:evenVBand="0" w:oddHBand="1" w:evenHBand="0" w:firstRowFirstColumn="0" w:firstRowLastColumn="0" w:lastRowFirstColumn="0" w:lastRowLastColumn="0"/>
+          <w:trHeight w:val="720"/>
+        </w:trPr>
+        <w:tc>
+          <w:tcPr>
+            <w:cnfStyle w:val="001000000000" w:firstRow="0" w:lastRow="0" w:firstColumn="1" w:lastColumn="0" w:oddVBand="0" w:evenVBand="0" w:oddHBand="0" w:evenHBand="0" w:firstRowFirstColumn="0" w:firstRowLastColumn="0" w:lastRowFirstColumn="0" w:lastRowLastColumn="0"/>
+            <w:tcW w:w="0" w:type="auto"/>
+            <w:vAlign w:val="center"/>
+            <w:hideMark/>
+          </w:tcPr>
+          <w:p>
+            <w:pPr>
+              <w:rPr>
+                <w:b w:val="0"/>
+                <w:bCs w:val="0"/>
+              </w:rPr>
+            </w:pPr>
+            <w:r>
+              <w:rPr>
+                <w:b w:val="0"/>
+                <w:bCs w:val="0"/>
+              </w:rPr>
+              <w:t>/api/v1/integrations/payments/</w:t>
+            </w:r>
+          </w:p>
+        </w:tc>
+        <w:tc>
+          <w:tcPr>
+            <w:tcW w:w="0" w:type="auto"/>
+            <w:vAlign w:val="center"/>
+            <w:hideMark/>
+          </w:tcPr>
+          <w:p>
+            <w:pPr>
+              <w:jc w:val="center"/>
+              <w:cnfStyle w:val="000000100000" w:firstRow="0" w:lastRow="0" w:firstColumn="0" w:lastColumn="0" w:oddVBand="0" w:evenVBand="0" w:oddHBand="1" w:evenHBand="0" w:firstRowFirstColumn="0" w:firstRowLastColumn="0" w:lastRowFirstColumn="0" w:lastRowLastColumn="0"/>
+            </w:pPr>
+            <w:r>
+              <w:t>POST</w:t>
+            </w:r>
+          </w:p>
+        </w:tc>
+        <w:tc>
+          <w:tcPr>
+            <w:tcW w:w="0" w:type="auto"/>
+            <w:vAlign w:val="center"/>
+            <w:hideMark/>
+          </w:tcPr>
+          <w:p>
+            <w:pPr>
+              <w:cnfStyle w:val="000000100000" w:firstRow="0" w:lastRow="0" w:firstColumn="0" w:lastColumn="0" w:oddVBand="0" w:evenVBand="0" w:oddHBand="1" w:evenHBand="0" w:firstRowFirstColumn="0" w:firstRowLastColumn="0" w:lastRowFirstColumn="0" w:lastRowLastColumn="0"/>
+            </w:pPr>
+            <w:r>
+              <w:t>Create a payment transaction</w:t>
+            </w:r>
+          </w:p>
+        </w:tc>
+        <w:tc>
+          <w:tcPr>
+            <w:tcW w:w="1152" w:type="dxa"/>
+            <w:vAlign w:val="center"/>
+            <w:hideMark/>
+          </w:tcPr>
+          <w:p>
+            <w:pPr>
+              <w:jc w:val="center"/>
+              <w:cnfStyle w:val="000000100000" w:firstRow="0" w:lastRow="0" w:firstColumn="0" w:lastColumn="0" w:oddVBand="0" w:evenVBand="0" w:oddHBand="1" w:evenHBand="0" w:firstRowFirstColumn="0" w:firstRowLastColumn="0" w:lastRowFirstColumn="0" w:lastRowLastColumn="0"/>
+            </w:pPr>
+            <w:r>
+              <w:t>Yes</w:t>
+            </w:r>
+          </w:p>
+        </w:tc>
+      </w:tr>
+      <w:tr>
+        <w:trPr>
+          <w:trHeight w:val="720"/>
+        </w:trPr>
+        <w:tc>
+          <w:tcPr>
+            <w:cnfStyle w:val="001000000000" w:firstRow="0" w:lastRow="0" w:firstColumn="1" w:lastColumn="0" w:oddVBand="0" w:evenVBand="0" w:oddHBand="0" w:evenHBand="0" w:firstRowFirstColumn="0" w:firstRowLastColumn="0" w:lastRowFirstColumn="0" w:lastRowLastColumn="0"/>
+            <w:tcW w:w="0" w:type="auto"/>
+            <w:vAlign w:val="center"/>
+            <w:hideMark/>
+          </w:tcPr>
+          <w:p>
+            <w:pPr>
+              <w:rPr>
+                <w:b w:val="0"/>
+                <w:bCs w:val="0"/>
+              </w:rPr>
+            </w:pPr>
+            <w:r>
+              <w:rPr>
+                <w:b w:val="0"/>
+                <w:bCs w:val="0"/>
+              </w:rPr>
+              <w:t>/api/v1/integrations/payments/{paymentId}</w:t>
+            </w:r>
+          </w:p>
+        </w:tc>
+        <w:tc>
+          <w:tcPr>
+            <w:tcW w:w="0" w:type="auto"/>
+            <w:vAlign w:val="center"/>
+            <w:hideMark/>
+          </w:tcPr>
+          <w:p>
+            <w:pPr>
+              <w:jc w:val="center"/>
+              <w:cnfStyle w:val="000000000000" w:firstRow="0" w:lastRow="0" w:firstColumn="0" w:lastColumn="0" w:oddVBand="0" w:evenVBand="0" w:oddHBand="0" w:evenHBand="0" w:firstRowFirstColumn="0" w:firstRowLastColumn="0" w:lastRowFirstColumn="0" w:lastRowLastColumn="0"/>
+            </w:pPr>
+            <w:r>
+              <w:t>GET</w:t>
+            </w:r>
+          </w:p>
+        </w:tc>
+        <w:tc>
+          <w:tcPr>
+            <w:tcW w:w="0" w:type="auto"/>
+            <w:vAlign w:val="center"/>
+            <w:hideMark/>
+          </w:tcPr>
+          <w:p>
+            <w:pPr>
+              <w:cnfStyle w:val="000000000000" w:firstRow="0" w:lastRow="0" w:firstColumn="0" w:lastColumn="0" w:oddVBand="0" w:evenVBand="0" w:oddHBand="0" w:evenHBand="0" w:firstRowFirstColumn="0" w:firstRowLastColumn="0" w:lastRowFirstColumn="0" w:lastRowLastColumn="0"/>
+            </w:pPr>
+            <w:r>
+              <w:t>Retrieve payment details</w:t>
+            </w:r>
+          </w:p>
+        </w:tc>
+        <w:tc>
+          <w:tcPr>
+            <w:tcW w:w="1152" w:type="dxa"/>
+            <w:vAlign w:val="center"/>
+            <w:hideMark/>
+          </w:tcPr>
+          <w:p>
+            <w:pPr>
+              <w:jc w:val="center"/>
+              <w:cnfStyle w:val="000000000000" w:firstRow="0" w:lastRow="0" w:firstColumn="0" w:lastColumn="0" w:oddVBand="0" w:evenVBand="0" w:oddHBand="0" w:evenHBand="0" w:firstRowFirstColumn="0" w:firstRowLastColumn="0" w:lastRowFirstColumn="0" w:lastRowLastColumn="0"/>
+            </w:pPr>
+            <w:r>
+              <w:t>Yes</w:t>
+            </w:r>
+          </w:p>
+        </w:tc>
+      </w:tr>
+      <w:tr>
+        <w:trPr>
+          <w:cnfStyle w:val="000000100000" w:firstRow="0" w:lastRow="0" w:firstColumn="0" w:lastColumn="0" w:oddVBand="0" w:evenVBand="0" w:oddHBand="1" w:evenHBand="0" w:firstRowFirstColumn="0" w:firstRowLastColumn="0" w:lastRowFirstColumn="0" w:lastRowLastColumn="0"/>
+          <w:trHeight w:val="720"/>
+        </w:trPr>
+        <w:tc>
+          <w:tcPr>
+            <w:cnfStyle w:val="001000000000" w:firstRow="0" w:lastRow="0" w:firstColumn="1" w:lastColumn="0" w:oddVBand="0" w:evenVBand="0" w:oddHBand="0" w:evenHBand="0" w:firstRowFirstColumn="0" w:firstRowLastColumn="0" w:lastRowFirstColumn="0" w:lastRowLastColumn="0"/>
+            <w:tcW w:w="0" w:type="auto"/>
+            <w:vAlign w:val="center"/>
+            <w:hideMark/>
+          </w:tcPr>
+          <w:p>
+            <w:pPr>
+              <w:rPr>
+                <w:b w:val="0"/>
+                <w:bCs w:val="0"/>
+              </w:rPr>
+            </w:pPr>
+            <w:r>
+              <w:rPr>
+                <w:b w:val="0"/>
+                <w:bCs w:val="0"/>
+              </w:rPr>
+              <w:t>/api/v1/integrations/payments/{paymentId}/status</w:t>
+            </w:r>
+          </w:p>
+        </w:tc>
+        <w:tc>
+          <w:tcPr>
+            <w:tcW w:w="0" w:type="auto"/>
+            <w:vAlign w:val="center"/>
+            <w:hideMark/>
+          </w:tcPr>
+          <w:p>
+            <w:pPr>
+              <w:jc w:val="center"/>
+              <w:cnfStyle w:val="000000100000" w:firstRow="0" w:lastRow="0" w:firstColumn="0" w:lastColumn="0" w:oddVBand="0" w:evenVBand="0" w:oddHBand="1" w:evenHBand="0" w:firstRowFirstColumn="0" w:firstRowLastColumn="0" w:lastRowFirstColumn="0" w:lastRowLastColumn="0"/>
+            </w:pPr>
+            <w:r>
+              <w:t>GET</w:t>
+            </w:r>
+          </w:p>
+        </w:tc>
+        <w:tc>
+          <w:tcPr>
+            <w:tcW w:w="0" w:type="auto"/>
+            <w:vAlign w:val="center"/>
+            <w:hideMark/>
+          </w:tcPr>
+          <w:p>
+            <w:pPr>
+              <w:cnfStyle w:val="000000100000" w:firstRow="0" w:lastRow="0" w:firstColumn="0" w:lastColumn="0" w:oddVBand="0" w:evenVBand="0" w:oddHBand="1" w:evenHBand="0" w:firstRowFirstColumn="0" w:firstRowLastColumn="0" w:lastRowFirstColumn="0" w:lastRowLastColumn="0"/>
+            </w:pPr>
+            <w:r>
+              <w:t>Retrieve payment status</w:t>
+            </w:r>
+          </w:p>
+        </w:tc>
+        <w:tc>
+          <w:tcPr>
+            <w:tcW w:w="1152" w:type="dxa"/>
+            <w:vAlign w:val="center"/>
+            <w:hideMark/>
+          </w:tcPr>
+          <w:p>
+            <w:pPr>
+              <w:jc w:val="center"/>
+              <w:cnfStyle w:val="000000100000" w:firstRow="0" w:lastRow="0" w:firstColumn="0" w:lastColumn="0" w:oddVBand="0" w:evenVBand="0" w:oddHBand="1" w:evenHBand="0" w:firstRowFirstColumn="0" w:firstRowLastColumn="0" w:lastRowFirstColumn="0" w:lastRowLastColumn="0"/>
+            </w:pPr>
+            <w:r>
+              <w:t>Yes</w:t>
+            </w:r>
+          </w:p>
+        </w:tc>
+      </w:tr>
+      <w:tr>
+        <w:trPr>
+          <w:trHeight w:val="720"/>
+        </w:trPr>
+        <w:tc>
+          <w:tcPr>
+            <w:cnfStyle w:val="001000000000" w:firstRow="0" w:lastRow="0" w:firstColumn="1" w:lastColumn="0" w:oddVBand="0" w:evenVBand="0" w:oddHBand="0" w:evenHBand="0" w:firstRowFirstColumn="0" w:firstRowLastColumn="0" w:lastRowFirstColumn="0" w:lastRowLastColumn="0"/>
+            <w:tcW w:w="0" w:type="auto"/>
+            <w:vAlign w:val="center"/>
+            <w:hideMark/>
+          </w:tcPr>
+          <w:p>
+            <w:pPr>
+              <w:rPr>
+                <w:b w:val="0"/>
+                <w:bCs w:val="0"/>
+              </w:rPr>
+            </w:pPr>
+            <w:r>
+              <w:rPr>
+                <w:b w:val="0"/>
+                <w:bCs w:val="0"/>
+              </w:rPr>
+              <w:t>/api/v1/integrations/payments/{paymentId}/confirm</w:t>
+            </w:r>
+          </w:p>
+        </w:tc>
+        <w:tc>
+          <w:tcPr>
+            <w:tcW w:w="0" w:type="auto"/>
+            <w:vAlign w:val="center"/>
+            <w:hideMark/>
+          </w:tcPr>
+          <w:p>
+            <w:pPr>
+              <w:jc w:val="center"/>
+              <w:cnfStyle w:val="000000000000" w:firstRow="0" w:lastRow="0" w:firstColumn="0" w:lastColumn="0" w:oddVBand="0" w:evenVBand="0" w:oddHBand="0" w:evenHBand="0" w:firstRowFirstColumn="0" w:firstRowLastColumn="0" w:lastRowFirstColumn="0" w:lastRowLastColumn="0"/>
+            </w:pPr>
+            <w:r>
+              <w:t>POST</w:t>
+            </w:r>
+          </w:p>
+        </w:tc>
+        <w:tc>
+          <w:tcPr>
+            <w:tcW w:w="0" w:type="auto"/>
+            <w:vAlign w:val="center"/>
+            <w:hideMark/>
+          </w:tcPr>
+          <w:p>
+            <w:pPr>
+              <w:cnfStyle w:val="000000000000" w:firstRow="0" w:lastRow="0" w:firstColumn="0" w:lastColumn="0" w:oddVBand="0" w:evenVBand="0" w:oddHBand="0" w:evenHBand="0" w:firstRowFirstColumn="0" w:firstRowLastColumn="0" w:lastRowFirstColumn="0" w:lastRowLastColumn="0"/>
+            </w:pPr>
+            <w:r>
+              <w:t>Confirm a successful payment</w:t>
+            </w:r>
+          </w:p>
+        </w:tc>
+        <w:tc>
+          <w:tcPr>
+            <w:tcW w:w="1152" w:type="dxa"/>
+            <w:vAlign w:val="center"/>
+            <w:hideMark/>
+          </w:tcPr>
+          <w:p>
+            <w:pPr>
+              <w:jc w:val="center"/>
+              <w:cnfStyle w:val="000000000000" w:firstRow="0" w:lastRow="0" w:firstColumn="0" w:lastColumn="0" w:oddVBand="0" w:evenVBand="0" w:oddHBand="0" w:evenHBand="0" w:firstRowFirstColumn="0" w:firstRowLastColumn="0" w:lastRowFirstColumn="0" w:lastRowLastColumn="0"/>
+            </w:pPr>
+            <w:r>
+              <w:t>Yes</w:t>
+            </w:r>
+          </w:p>
+        </w:tc>
+      </w:tr>
+      <w:tr>
+        <w:trPr>
+          <w:cnfStyle w:val="000000100000" w:firstRow="0" w:lastRow="0" w:firstColumn="0" w:lastColumn="0" w:oddVBand="0" w:evenVBand="0" w:oddHBand="1" w:evenHBand="0" w:firstRowFirstColumn="0" w:firstRowLastColumn="0" w:lastRowFirstColumn="0" w:lastRowLastColumn="0"/>
+          <w:trHeight w:val="720"/>
+        </w:trPr>
+        <w:tc>
+          <w:tcPr>
+            <w:cnfStyle w:val="001000000000" w:firstRow="0" w:lastRow="0" w:firstColumn="1" w:lastColumn="0" w:oddVBand="0" w:evenVBand="0" w:oddHBand="0" w:evenHBand="0" w:firstRowFirstColumn="0" w:firstRowLastColumn="0" w:lastRowFirstColumn="0" w:lastRowLastColumn="0"/>
+            <w:tcW w:w="0" w:type="auto"/>
+            <w:vAlign w:val="center"/>
+            <w:hideMark/>
+          </w:tcPr>
+          <w:p>
+            <w:pPr>
+              <w:rPr>
+                <w:b w:val="0"/>
+                <w:bCs w:val="0"/>
+              </w:rPr>
+            </w:pPr>
+            <w:r>
+              <w:rPr>
+                <w:b w:val="0"/>
+                <w:bCs w:val="0"/>
+              </w:rPr>
+              <w:t>/api/v1/integrations/payments/{paymentId}/cancel</w:t>
+            </w:r>
+          </w:p>
+        </w:tc>
+        <w:tc>
+          <w:tcPr>
+            <w:tcW w:w="0" w:type="auto"/>
+            <w:vAlign w:val="center"/>
+            <w:hideMark/>
+          </w:tcPr>
+          <w:p>
+            <w:pPr>
+              <w:jc w:val="center"/>
+              <w:cnfStyle w:val="000000100000" w:firstRow="0" w:lastRow="0" w:firstColumn="0" w:lastColumn="0" w:oddVBand="0" w:evenVBand="0" w:oddHBand="1" w:evenHBand="0" w:firstRowFirstColumn="0" w:firstRowLastColumn="0" w:lastRowFirstColumn="0" w:lastRowLastColumn="0"/>
+            </w:pPr>
+            <w:r>
+              <w:t>POST</w:t>
+            </w:r>
+          </w:p>
+        </w:tc>
+        <w:tc>
+          <w:tcPr>
+            <w:tcW w:w="0" w:type="auto"/>
+            <w:vAlign w:val="center"/>
+            <w:hideMark/>
+          </w:tcPr>
+          <w:p>
+            <w:pPr>
+              <w:cnfStyle w:val="000000100000" w:firstRow="0" w:lastRow="0" w:firstColumn="0" w:lastColumn="0" w:oddVBand="0" w:evenVBand="0" w:oddHBand="1" w:evenHBand="0" w:firstRowFirstColumn="0" w:firstRowLastColumn="0" w:lastRowFirstColumn="0" w:lastRowLastColumn="0"/>
+            </w:pPr>
+            <w:r>
+              <w:t>Cancel a payment transaction</w:t>
+            </w:r>
+          </w:p>
+        </w:tc>
+        <w:tc>
+          <w:tcPr>
+            <w:tcW w:w="1152" w:type="dxa"/>
+            <w:vAlign w:val="center"/>
+            <w:hideMark/>
+          </w:tcPr>
+          <w:p>
+            <w:pPr>
+              <w:jc w:val="center"/>
+              <w:cnfStyle w:val="000000100000" w:firstRow="0" w:lastRow="0" w:firstColumn="0" w:lastColumn="0" w:oddVBand="0" w:evenVBand="0" w:oddHBand="1" w:evenHBand="0" w:firstRowFirstColumn="0" w:firstRowLastColumn="0" w:lastRowFirstColumn="0" w:lastRowLastColumn="0"/>
+            </w:pPr>
+            <w:r>
+              <w:t>Yes</w:t>
+            </w:r>
+          </w:p>
+        </w:tc>
+      </w:tr>
+      <w:tr>
+        <w:trPr>
+          <w:trHeight w:val="720"/>
+        </w:trPr>
+        <w:tc>
+          <w:tcPr>
+            <w:cnfStyle w:val="001000000000" w:firstRow="0" w:lastRow="0" w:firstColumn="1" w:lastColumn="0" w:oddVBand="0" w:evenVBand="0" w:oddHBand="0" w:evenHBand="0" w:firstRowFirstColumn="0" w:firstRowLastColumn="0" w:lastRowFirstColumn="0" w:lastRowLastColumn="0"/>
+            <w:tcW w:w="0" w:type="auto"/>
+            <w:vAlign w:val="center"/>
+            <w:hideMark/>
+          </w:tcPr>
+          <w:p>
+            <w:pPr>
+              <w:rPr>
+                <w:b w:val="0"/>
+                <w:bCs w:val="0"/>
+              </w:rPr>
+            </w:pPr>
+            <w:r>
+              <w:rPr>
+                <w:b w:val="0"/>
+                <w:bCs w:val="0"/>
+              </w:rPr>
+              <w:t>/api/v1/integrations/payments/{paymentId}/refund</w:t>
+            </w:r>
+          </w:p>
+        </w:tc>
+        <w:tc>
+          <w:tcPr>
+            <w:tcW w:w="0" w:type="auto"/>
+            <w:vAlign w:val="center"/>
+            <w:hideMark/>
+          </w:tcPr>
+          <w:p>
+            <w:pPr>
+              <w:jc w:val="center"/>
+              <w:cnfStyle w:val="000000000000" w:firstRow="0" w:lastRow="0" w:firstColumn="0" w:lastColumn="0" w:oddVBand="0" w:evenVBand="0" w:oddHBand="0" w:evenHBand="0" w:firstRowFirstColumn="0" w:firstRowLastColumn="0" w:lastRowFirstColumn="0" w:lastRowLastColumn="0"/>
+            </w:pPr>
+            <w:r>
+              <w:t>POST</w:t>
+            </w:r>
+          </w:p>
+        </w:tc>
+        <w:tc>
+          <w:tcPr>
+            <w:tcW w:w="0" w:type="auto"/>
+            <w:vAlign w:val="center"/>
+            <w:hideMark/>
+          </w:tcPr>
+          <w:p>
+            <w:pPr>
+              <w:cnfStyle w:val="000000000000" w:firstRow="0" w:lastRow="0" w:firstColumn="0" w:lastColumn="0" w:oddVBand="0" w:evenVBand="0" w:oddHBand="0" w:evenHBand="0" w:firstRowFirstColumn="0" w:firstRowLastColumn="0" w:lastRowFirstColumn="0" w:lastRowLastColumn="0"/>
+            </w:pPr>
+            <w:r>
+              <w:t>Process a payment refund</w:t>
+            </w:r>
+          </w:p>
+        </w:tc>
+        <w:tc>
+          <w:tcPr>
+            <w:tcW w:w="1152" w:type="dxa"/>
+            <w:vAlign w:val="center"/>
+            <w:hideMark/>
+          </w:tcPr>
+          <w:p>
+            <w:pPr>
+              <w:jc w:val="center"/>
+              <w:cnfStyle w:val="000000000000" w:firstRow="0" w:lastRow="0" w:firstColumn="0" w:lastColumn="0" w:oddVBand="0" w:evenVBand="0" w:oddHBand="0" w:evenHBand="0" w:firstRowFirstColumn="0" w:firstRowLastColumn="0" w:lastRowFirstColumn="0" w:lastRowLastColumn="0"/>
+            </w:pPr>
+            <w:r>
+              <w:t>Yes</w:t>
+            </w:r>
+          </w:p>
+        </w:tc>
+      </w:tr>
+      <w:tr>
+        <w:trPr>
+          <w:cnfStyle w:val="000000100000" w:firstRow="0" w:lastRow="0" w:firstColumn="0" w:lastColumn="0" w:oddVBand="0" w:evenVBand="0" w:oddHBand="1" w:evenHBand="0" w:firstRowFirstColumn="0" w:firstRowLastColumn="0" w:lastRowFirstColumn="0" w:lastRowLastColumn="0"/>
+          <w:trHeight w:val="720"/>
+        </w:trPr>
+        <w:tc>
+          <w:tcPr>
+            <w:cnfStyle w:val="001000000000" w:firstRow="0" w:lastRow="0" w:firstColumn="1" w:lastColumn="0" w:oddVBand="0" w:evenVBand="0" w:oddHBand="0" w:evenHBand="0" w:firstRowFirstColumn="0" w:firstRowLastColumn="0" w:lastRowFirstColumn="0" w:lastRowLastColumn="0"/>
+            <w:tcW w:w="0" w:type="auto"/>
+            <w:vAlign w:val="center"/>
+            <w:hideMark/>
+          </w:tcPr>
+          <w:p>
+            <w:pPr>
+              <w:rPr>
+                <w:b w:val="0"/>
+                <w:bCs w:val="0"/>
+              </w:rPr>
+            </w:pPr>
+            <w:r>
+              <w:rPr>
+                <w:b w:val="0"/>
+                <w:bCs w:val="0"/>
+              </w:rPr>
+              <w:lastRenderedPageBreak/>
+              <w:t>/api/v1/integrations/payments/webhook</w:t>
+            </w:r>
+          </w:p>
+        </w:tc>
+        <w:tc>
+          <w:tcPr>
+            <w:tcW w:w="0" w:type="auto"/>
+            <w:vAlign w:val="center"/>
+            <w:hideMark/>
+          </w:tcPr>
+          <w:p>
+            <w:pPr>
+              <w:jc w:val="center"/>
+              <w:cnfStyle w:val="000000100000" w:firstRow="0" w:lastRow="0" w:firstColumn="0" w:lastColumn="0" w:oddVBand="0" w:evenVBand="0" w:oddHBand="1" w:evenHBand="0" w:firstRowFirstColumn="0" w:firstRowLastColumn="0" w:lastRowFirstColumn="0" w:lastRowLastColumn="0"/>
+            </w:pPr>
+            <w:r>
+              <w:t>POST</w:t>
+            </w:r>
+          </w:p>
+        </w:tc>
+        <w:tc>
+          <w:tcPr>
+            <w:tcW w:w="0" w:type="auto"/>
+            <w:vAlign w:val="center"/>
+            <w:hideMark/>
+          </w:tcPr>
+          <w:p>
+            <w:pPr>
+              <w:cnfStyle w:val="000000100000" w:firstRow="0" w:lastRow="0" w:firstColumn="0" w:lastColumn="0" w:oddVBand="0" w:evenVBand="0" w:oddHBand="1" w:evenHBand="0" w:firstRowFirstColumn="0" w:firstRowLastColumn="0" w:lastRowFirstColumn="0" w:lastRowLastColumn="0"/>
+            </w:pPr>
+            <w:r>
+              <w:t>Receive payment gateway webhook notifications</w:t>
+            </w:r>
+          </w:p>
+        </w:tc>
+        <w:tc>
+          <w:tcPr>
+            <w:tcW w:w="1152" w:type="dxa"/>
+            <w:vAlign w:val="center"/>
+            <w:hideMark/>
+          </w:tcPr>
+          <w:p>
+            <w:pPr>
+              <w:jc w:val="center"/>
+              <w:cnfStyle w:val="000000100000" w:firstRow="0" w:lastRow="0" w:firstColumn="0" w:lastColumn="0" w:oddVBand="0" w:evenVBand="0" w:oddHBand="1" w:evenHBand="0" w:firstRowFirstColumn="0" w:firstRowLastColumn="0" w:lastRowFirstColumn="0" w:lastRowLastColumn="0"/>
+            </w:pPr>
+            <w:r>
+              <w:t>No (Verified by Digital Signature)</w:t>
+            </w:r>
+          </w:p>
+        </w:tc>
+      </w:tr>
+      <w:tr>
+        <w:trPr>
+          <w:trHeight w:val="720"/>
+        </w:trPr>
+        <w:tc>
+          <w:tcPr>
+            <w:cnfStyle w:val="001000000000" w:firstRow="0" w:lastRow="0" w:firstColumn="1" w:lastColumn="0" w:oddVBand="0" w:evenVBand="0" w:oddHBand="0" w:evenHBand="0" w:firstRowFirstColumn="0" w:firstRowLastColumn="0" w:lastRowFirstColumn="0" w:lastRowLastColumn="0"/>
+            <w:tcW w:w="0" w:type="auto"/>
+            <w:vAlign w:val="center"/>
+            <w:hideMark/>
+          </w:tcPr>
+          <w:p>
+            <w:pPr>
+              <w:rPr>
+                <w:b w:val="0"/>
+                <w:bCs w:val="0"/>
+              </w:rPr>
+            </w:pPr>
+            <w:r>
+              <w:rPr>
+                <w:b w:val="0"/>
+                <w:bCs w:val="0"/>
+              </w:rPr>
+              <w:t>/api/v1/integrations/payments/history</w:t>
+            </w:r>
+          </w:p>
+        </w:tc>
+        <w:tc>
+          <w:tcPr>
+            <w:tcW w:w="0" w:type="auto"/>
+            <w:vAlign w:val="center"/>
+            <w:hideMark/>
+          </w:tcPr>
+          <w:p>
+            <w:pPr>
+              <w:jc w:val="center"/>
+              <w:cnfStyle w:val="000000000000" w:firstRow="0" w:lastRow="0" w:firstColumn="0" w:lastColumn="0" w:oddVBand="0" w:evenVBand="0" w:oddHBand="0" w:evenHBand="0" w:firstRowFirstColumn="0" w:firstRowLastColumn="0" w:lastRowFirstColumn="0" w:lastRowLastColumn="0"/>
+            </w:pPr>
+            <w:r>
+              <w:t>GET</w:t>
+            </w:r>
+          </w:p>
+        </w:tc>
+        <w:tc>
+          <w:tcPr>
+            <w:tcW w:w="0" w:type="auto"/>
+            <w:vAlign w:val="center"/>
+            <w:hideMark/>
+          </w:tcPr>
+          <w:p>
+            <w:pPr>
+              <w:cnfStyle w:val="000000000000" w:firstRow="0" w:lastRow="0" w:firstColumn="0" w:lastColumn="0" w:oddVBand="0" w:evenVBand="0" w:oddHBand="0" w:evenHBand="0" w:firstRowFirstColumn="0" w:firstRowLastColumn="0" w:lastRowFirstColumn="0" w:lastRowLastColumn="0"/>
+            </w:pPr>
+            <w:r>
+              <w:t>Retrieve payment transaction history</w:t>
+            </w:r>
+          </w:p>
+        </w:tc>
+        <w:tc>
+          <w:tcPr>
+            <w:tcW w:w="1152" w:type="dxa"/>
+            <w:vAlign w:val="center"/>
+            <w:hideMark/>
+          </w:tcPr>
+          <w:p>
+            <w:pPr>
+              <w:jc w:val="center"/>
+              <w:cnfStyle w:val="000000000000" w:firstRow="0" w:lastRow="0" w:firstColumn="0" w:lastColumn="0" w:oddVBand="0" w:evenVBand="0" w:oddHBand="0" w:evenHBand="0" w:firstRowFirstColumn="0" w:firstRowLastColumn="0" w:lastRowFirstColumn="0" w:lastRowLastColumn="0"/>
+            </w:pPr>
+            <w:r>
+              <w:t>Yes</w:t>
+            </w:r>
+          </w:p>
+        </w:tc>
+      </w:tr>
+    </w:tbl>
+    <w:p/>
+    <w:p>
+      <w:pPr>
+        <w:pStyle w:val="Title"/>
+      </w:pPr>
+      <w:r>
+        <w:t>API Design Considerations</w:t>
+      </w:r>
+    </w:p>
+    <w:p>
+      <w:r>
+        <w:t>The Payment Integration APIs follow the design principles that include:</w:t>
+      </w:r>
+    </w:p>
+    <w:p>
+      <w:pPr>
+        <w:pStyle w:val="ListParagraph"/>
+        <w:numPr>
+          <w:ilvl w:val="0"/>
+          <w:numId w:val="172"/>
+        </w:numPr>
+      </w:pPr>
+      <w:r>
+        <w:t>Secure Communication: The payment requests are delivered via HTTPS using TLS encryption.</w:t>
+      </w:r>
+    </w:p>
+    <w:p>
+      <w:pPr>
+        <w:pStyle w:val="ListParagraph"/>
+        <w:numPr>
+          <w:ilvl w:val="0"/>
+          <w:numId w:val="172"/>
+        </w:numPr>
+      </w:pPr>
+      <w:r>
+        <w:t>Third-Party Payment Processing: Payment details are handled only by certified third-party payment gateways.</w:t>
+      </w:r>
+    </w:p>
+    <w:p>
+      <w:pPr>
+        <w:pStyle w:val="ListParagraph"/>
+        <w:numPr>
+          <w:ilvl w:val="0"/>
+          <w:numId w:val="172"/>
+        </w:numPr>
+      </w:pPr>
+      <w:r>
+        <w:t>RESTful API: Payments are done using the REST principle and JSON protocol.</w:t>
+      </w:r>
+    </w:p>
+    <w:p>
+      <w:pPr>
+        <w:pStyle w:val="ListParagraph"/>
+        <w:numPr>
+          <w:ilvl w:val="0"/>
+          <w:numId w:val="172"/>
+        </w:numPr>
+      </w:pPr>
+      <w:r>
+        <w:t>Authentication and Authorization: Either API keys, OAuth 2.0 or JWT tokens are used as per security requirements of the external provider.</w:t>
+      </w:r>
+    </w:p>
+    <w:p>
+      <w:pPr>
+        <w:pStyle w:val="ListParagraph"/>
+        <w:numPr>
+          <w:ilvl w:val="0"/>
+          <w:numId w:val="172"/>
+        </w:numPr>
+      </w:pPr>
+      <w:r>
+        <w:t>Webhook Validation: The received payments are verified via digital signatures.</w:t>
+      </w:r>
+    </w:p>
+    <w:p>
+      <w:pPr>
+        <w:pStyle w:val="ListParagraph"/>
+        <w:numPr>
+          <w:ilvl w:val="0"/>
+          <w:numId w:val="172"/>
+        </w:numPr>
+      </w:pPr>
+      <w:r>
+        <w:t>Transaction Integrity: Each payment transaction receives unique ID for future audits.</w:t>
+      </w:r>
+    </w:p>
+    <w:p>
+      <w:pPr>
+        <w:pStyle w:val="ListParagraph"/>
+        <w:numPr>
+          <w:ilvl w:val="0"/>
+          <w:numId w:val="172"/>
+        </w:numPr>
+      </w:pPr>
+      <w:r>
+        <w:t>Refunds: The refunding process is coordinated with reservations.</w:t>
+      </w:r>
+    </w:p>
+    <w:p>
+      <w:pPr>
+        <w:pStyle w:val="ListParagraph"/>
+        <w:numPr>
+          <w:ilvl w:val="0"/>
+          <w:numId w:val="172"/>
+        </w:numPr>
+      </w:pPr>
+      <w:r>
+        <w:t>Error Handling: Transactions are retried if failed or duplicated, and network errors are handled in case of failed communication.</w:t>
+      </w:r>
+    </w:p>
+    <w:p>
+      <w:pPr>
+        <w:pStyle w:val="Title"/>
+      </w:pPr>
+      <w:r>
+        <w:t>Payment Processing Workflow</w:t>
+      </w:r>
+    </w:p>
+    <w:p>
+      <w:r>
+        <w:t>The payment process includes the following steps:</w:t>
+      </w:r>
+    </w:p>
+    <w:p>
+      <w:pPr>
+        <w:pStyle w:val="ListParagraph"/>
+        <w:numPr>
+          <w:ilvl w:val="0"/>
+          <w:numId w:val="173"/>
+        </w:numPr>
+      </w:pPr>
+      <w:r>
+        <w:t>The client confirms the car reservation and decides on using online payment methods.</w:t>
+      </w:r>
+    </w:p>
+    <w:p>
+      <w:pPr>
+        <w:pStyle w:val="ListParagraph"/>
+        <w:numPr>
+          <w:ilvl w:val="0"/>
+          <w:numId w:val="173"/>
+        </w:numPr>
+      </w:pPr>
+      <w:r>
+        <w:t>The Reservation Service creates the request and passes it to the Payment Integration Service.</w:t>
+      </w:r>
+    </w:p>
+    <w:p>
+      <w:pPr>
+        <w:pStyle w:val="ListParagraph"/>
+        <w:numPr>
+          <w:ilvl w:val="0"/>
+          <w:numId w:val="173"/>
+        </w:numPr>
+      </w:pPr>
+      <w:r>
+        <w:t>The Payment Integration Service contacts the external payment gateway securely.</w:t>
+      </w:r>
+    </w:p>
+    <w:p>
+      <w:pPr>
+        <w:pStyle w:val="ListParagraph"/>
+        <w:numPr>
+          <w:ilvl w:val="0"/>
+          <w:numId w:val="173"/>
+        </w:numPr>
+      </w:pPr>
+      <w:r>
+        <w:t>The client uses the provider's payment interface to complete the payment.</w:t>
+      </w:r>
+    </w:p>
+    <w:p>
+      <w:pPr>
+        <w:pStyle w:val="ListParagraph"/>
+        <w:numPr>
+          <w:ilvl w:val="0"/>
+          <w:numId w:val="173"/>
+        </w:numPr>
+      </w:pPr>
+      <w:r>
+        <w:t>The payment gateway either returns the results or notifies the platform via webhook.</w:t>
+      </w:r>
+    </w:p>
+    <w:p>
+      <w:pPr>
+        <w:pStyle w:val="ListParagraph"/>
+        <w:numPr>
+          <w:ilvl w:val="0"/>
+          <w:numId w:val="173"/>
+        </w:numPr>
+      </w:pPr>
+      <w:r>
+        <w:t>The Payment Integration Service verifies the results and changes the state of the reservation.</w:t>
+      </w:r>
+    </w:p>
+    <w:p>
+      <w:pPr>
+        <w:pStyle w:val="ListParagraph"/>
+        <w:numPr>
+          <w:ilvl w:val="0"/>
+          <w:numId w:val="173"/>
+        </w:numPr>
+      </w:pPr>
+      <w:r>
+        <w:rPr>
+          <w:noProof/>
+        </w:rPr>
+        <mc:AlternateContent>
+          <mc:Choice Requires="wps">
+            <w:drawing>
+              <wp:anchor distT="0" distB="0" distL="114300" distR="114300" simplePos="0" relativeHeight="251691008" behindDoc="0" locked="0" layoutInCell="1" allowOverlap="1" wp14:anchorId="629D04FB" wp14:editId="2D8CE737">
+                <wp:simplePos x="0" y="0"/>
+                <wp:positionH relativeFrom="column">
+                  <wp:posOffset>111125</wp:posOffset>
+                </wp:positionH>
+                <wp:positionV relativeFrom="paragraph">
+                  <wp:posOffset>1579880</wp:posOffset>
+                </wp:positionV>
+                <wp:extent cx="5147945" cy="635"/>
+                <wp:effectExtent l="0" t="0" r="0" b="0"/>
+                <wp:wrapSquare wrapText="bothSides"/>
+                <wp:docPr id="129635157" name="Text Box 1"/>
+                <wp:cNvGraphicFramePr/>
+                <a:graphic xmlns:a="http://schemas.openxmlformats.org/drawingml/2006/main">
+                  <a:graphicData uri="http://schemas.microsoft.com/office/word/2010/wordprocessingShape">
+                    <wps:wsp>
+                      <wps:cNvSpPr txBox="1"/>
+                      <wps:spPr>
+                        <a:xfrm>
+                          <a:off x="0" y="0"/>
+                          <a:ext cx="5147945" cy="635"/>
+                        </a:xfrm>
+                        <a:prstGeom prst="rect">
+                          <a:avLst/>
+                        </a:prstGeom>
+                        <a:solidFill>
+                          <a:prstClr val="white"/>
+                        </a:solidFill>
+                        <a:ln>
+                          <a:noFill/>
+                        </a:ln>
+                      </wps:spPr>
+                      <wps:txbx>
+                        <w:txbxContent>
+                          <w:p>
+                            <w:pPr>
+                              <w:pStyle w:val="Caption"/>
+                              <w:jc w:val="center"/>
+                            </w:pPr>
+                            <w:r>
+                              <w:t xml:space="preserve">Figure </w:t>
+                            </w:r>
+                            <w:r>
+                              <w:fldChar w:fldCharType="begin"/>
+                            </w:r>
+                            <w:r>
+                              <w:instrText xml:space="preserve"> SEQ Figure \* ARABIC </w:instrText>
+                            </w:r>
+                            <w:r>
+                              <w:fldChar w:fldCharType="separate"/>
+                            </w:r>
+                            <w:r>
+                              <w:rPr>
+                                <w:noProof/>
+                              </w:rPr>
+                              <w:t>11</w:t>
+                            </w:r>
+                            <w:r>
+                              <w:fldChar w:fldCharType="end"/>
+                            </w:r>
+                            <w:r>
+                              <w:t xml:space="preserve"> - </w:t>
+                            </w:r>
+                            <w:r>
+                              <w:t>Payment Processing Workflow</w:t>
+                            </w:r>
+                          </w:p>
+                        </w:txbxContent>
+                      </wps:txbx>
+                      <wps:bodyPr rot="0" spcFirstLastPara="0" vertOverflow="overflow" horzOverflow="overflow" vert="horz" wrap="square" lIns="0" tIns="0" rIns="0" bIns="0" numCol="1" spcCol="0" rtlCol="0" fromWordArt="0" anchor="t" anchorCtr="0" forceAA="0" compatLnSpc="1">
+                        <a:prstTxWarp prst="textNoShape">
+                          <a:avLst/>
+                        </a:prstTxWarp>
+                        <a:spAutoFit/>
+                      </wps:bodyPr>
+                    </wps:wsp>
+                  </a:graphicData>
+                </a:graphic>
+              </wp:anchor>
+            </w:drawing>
+          </mc:Choice>
+          <mc:Fallback>
+            <w:pict>
+              <v:shape w14:anchorId="629D04FB" id="_x0000_s1036" type="#_x0000_t202" style="position:absolute;left:0;text-align:left;margin-left:8.75pt;margin-top:124.4pt;width:405.35pt;height:.05pt;z-index:251691008;visibility:visible;mso-wrap-style:square;mso-wrap-distance-left:9pt;mso-wrap-distance-top:0;mso-wrap-distance-right:9pt;mso-wrap-distance-bottom:0;mso-position-horizontal:absolute;mso-position-horizontal-relative:text;mso-position-vertical:absolute;mso-position-vertical-relative:text;v-text-anchor:top" o:gfxdata="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" stroked="f">
+                <v:textbox style="mso-fit-shape-to-text:t" inset="0,0,0,0">
+                  <w:txbxContent>
+                    <w:p>
+                      <w:pPr>
+                        <w:pStyle w:val="Caption"/>
+                        <w:jc w:val="center"/>
+                      </w:pPr>
+                      <w:r>
+                        <w:t xml:space="preserve">Figure </w:t>
+                      </w:r>
+                      <w:r>
+                        <w:fldChar w:fldCharType="begin"/>
+                      </w:r>
+                      <w:r>
+                        <w:instrText xml:space="preserve"> SEQ Figure \* ARABIC </w:instrText>
+                      </w:r>
+                      <w:r>
+                        <w:fldChar w:fldCharType="separate"/>
+                      </w:r>
+                      <w:r>
+                        <w:rPr>
+                          <w:noProof/>
+                        </w:rPr>
+                        <w:t>11</w:t>
+                      </w:r>
+                      <w:r>
+                        <w:fldChar w:fldCharType="end"/>
+                      </w:r>
+                      <w:r>
+                        <w:t xml:space="preserve"> - </w:t>
+                      </w:r>
+                      <w:r>
+                        <w:t>Payment Processing Workflow</w:t>
+                      </w:r>
+                    </w:p>
+                  </w:txbxContent>
+                </v:textbox>
+                <w10:wrap type="square"/>
+              </v:shape>
+            </w:pict>
+          </mc:Fallback>
+        </mc:AlternateContent>
+      </w:r>
+      <w:r>
+        <w:drawing>
+          <wp:anchor distT="0" distB="0" distL="114300" distR="114300" simplePos="0" relativeHeight="251688960" behindDoc="0" locked="0" layoutInCell="1" allowOverlap="1" wp14:anchorId="5AE99906" wp14:editId="32834560">
+            <wp:simplePos x="0" y="0"/>
+            <wp:positionH relativeFrom="column">
+              <wp:posOffset>111125</wp:posOffset>
+            </wp:positionH>
+            <wp:positionV relativeFrom="paragraph">
+              <wp:posOffset>390525</wp:posOffset>
+            </wp:positionV>
+            <wp:extent cx="5147945" cy="1132205"/>
+            <wp:effectExtent l="0" t="0" r="0" b="0"/>
+            <wp:wrapSquare wrapText="bothSides"/>
+            <wp:docPr id="215260673" name="Picture 1"/>
+            <wp:cNvGraphicFramePr>
+              <a:graphicFrameLocks xmlns:a="http://schemas.openxmlformats.org/drawingml/2006/main" noChangeAspect="1"/>
+            </wp:cNvGraphicFramePr>
+            <a:graphic xmlns:a="http://schemas.openxmlformats.org/drawingml/2006/main">
+              <a:graphicData uri="http://schemas.openxmlformats.org/drawingml/2006/picture">
+                <pic:pic xmlns:pic="http://schemas.openxmlformats.org/drawingml/2006/picture">
+                  <pic:nvPicPr>
+                    <pic:cNvPr id="215260673" name=""/>
+                    <pic:cNvPicPr/>
+                  </pic:nvPicPr>
+                  <pic:blipFill>
+                    <a:blip r:embed="rId18" cstate="print">
+                      <a:extLst>
+                        <a:ext uri="{28A0092B-C50C-407E-A947-70E740481C1C}">
+                          <a14:useLocalDpi xmlns:a14="http://schemas.microsoft.com/office/drawing/2010/main" val="0"/>
+                        </a:ext>
+                      </a:extLst>
+                    </a:blip>
+                    <a:stretch>
+                      <a:fillRect/>
+                    </a:stretch>
+                  </pic:blipFill>
+                  <pic:spPr>
+                    <a:xfrm>
+                      <a:off x="0" y="0"/>
+                      <a:ext cx="5147945" cy="1132205"/>
+                    </a:xfrm>
+                    <a:prstGeom prst="rect">
+                      <a:avLst/>
+                    </a:prstGeom>
+                  </pic:spPr>
+                </pic:pic>
+              </a:graphicData>
+            </a:graphic>
+            <wp14:sizeRelH relativeFrom="margin">
+              <wp14:pctWidth>0</wp14:pctWidth>
+            </wp14:sizeRelH>
+            <wp14:sizeRelV relativeFrom="margin">
+              <wp14:pctHeight>0</wp14:pctHeight>
+            </wp14:sizeRelV>
+          </wp:anchor>
+        </w:drawing>
+      </w:r>
+      <w:r>
+        <w:t>The Notification Service informs the client about the payment, and the Reporting Service registers the completed transaction for the financial audit.</w:t>
+      </w:r>
+    </w:p>
+    <w:p>
+      <w:pPr>
+        <w:ind w:left="360"/>
+      </w:pPr>
+    </w:p>
+    <w:p/>
+    <w:p/>
     <w:p/>
     <w:p/>
     <w:p/>
     <w:sectPr>
-      <w:headerReference w:type="default" r:id="rId18"/>
-      <w:footerReference w:type="default" r:id="rId19"/>
+      <w:headerReference w:type="default" r:id="rId19"/>
+      <w:footerReference w:type="default" r:id="rId20"/>
       <w:pgSz w:w="11906" w:h="16838" w:code="9"/>
       <w:pgMar w:top="1411" w:right="850" w:bottom="1411" w:left="1699" w:header="720" w:footer="288" w:gutter="0"/>
       <w:pgNumType w:start="1"/>
@@ -25819,6 +27004,92 @@
     </w:lvl>
   </w:abstractNum>
   <w:abstractNum w:abstractNumId="79" w15:restartNumberingAfterBreak="0">
+    <w:nsid w:val="37864C4E"/>
+    <w:multiLevelType w:val="hybridMultilevel"/>
+    <w:tmpl w:val="02EEC1AA"/>
+    <w:lvl w:ilvl="0" w:tplc="0409000F">
+      <w:start w:val="1"/>
+      <w:numFmt w:val="decimal"/>
+      <w:lvlText w:val="%1."/>
+      <w:lvlJc w:val="left"/>
+      <w:pPr>
+        <w:ind w:left="720" w:hanging="360"/>
+      </w:pPr>
+    </w:lvl>
+    <w:lvl w:ilvl="1" w:tplc="04090019" w:tentative="1">
+      <w:start w:val="1"/>
+      <w:numFmt w:val="lowerLetter"/>
+      <w:lvlText w:val="%2."/>
+      <w:lvlJc w:val="left"/>
+      <w:pPr>
+        <w:ind w:left="1440" w:hanging="360"/>
+      </w:pPr>
+    </w:lvl>
+    <w:lvl w:ilvl="2" w:tplc="0409001B" w:tentative="1">
+      <w:start w:val="1"/>
+      <w:numFmt w:val="lowerRoman"/>
+      <w:lvlText w:val="%3."/>
+      <w:lvlJc w:val="right"/>
+      <w:pPr>
+        <w:ind w:left="2160" w:hanging="180"/>
+      </w:pPr>
+    </w:lvl>
+    <w:lvl w:ilvl="3" w:tplc="0409000F" w:tentative="1">
+      <w:start w:val="1"/>
+      <w:numFmt w:val="decimal"/>
+      <w:lvlText w:val="%4."/>
+      <w:lvlJc w:val="left"/>
+      <w:pPr>
+        <w:ind w:left="2880" w:hanging="360"/>
+      </w:pPr>
+    </w:lvl>
+    <w:lvl w:ilvl="4" w:tplc="04090019" w:tentative="1">
+      <w:start w:val="1"/>
+      <w:numFmt w:val="lowerLetter"/>
+      <w:lvlText w:val="%5."/>
+      <w:lvlJc w:val="left"/>
+      <w:pPr>
+        <w:ind w:left="3600" w:hanging="360"/>
+      </w:pPr>
+    </w:lvl>
+    <w:lvl w:ilvl="5" w:tplc="0409001B" w:tentative="1">
+      <w:start w:val="1"/>
+      <w:numFmt w:val="lowerRoman"/>
+      <w:lvlText w:val="%6."/>
+      <w:lvlJc w:val="right"/>
+      <w:pPr>
+        <w:ind w:left="4320" w:hanging="180"/>
+      </w:pPr>
+    </w:lvl>
+    <w:lvl w:ilvl="6" w:tplc="0409000F" w:tentative="1">
+      <w:start w:val="1"/>
+      <w:numFmt w:val="decimal"/>
+      <w:lvlText w:val="%7."/>
+      <w:lvlJc w:val="left"/>
+      <w:pPr>
+        <w:ind w:left="5040" w:hanging="360"/>
+      </w:pPr>
+    </w:lvl>
+    <w:lvl w:ilvl="7" w:tplc="04090019" w:tentative="1">
+      <w:start w:val="1"/>
+      <w:numFmt w:val="lowerLetter"/>
+      <w:lvlText w:val="%8."/>
+      <w:lvlJc w:val="left"/>
+      <w:pPr>
+        <w:ind w:left="5760" w:hanging="360"/>
+      </w:pPr>
+    </w:lvl>
+    <w:lvl w:ilvl="8" w:tplc="0409001B" w:tentative="1">
+      <w:start w:val="1"/>
+      <w:numFmt w:val="lowerRoman"/>
+      <w:lvlText w:val="%9."/>
+      <w:lvlJc w:val="right"/>
+      <w:pPr>
+        <w:ind w:left="6480" w:hanging="180"/>
+      </w:pPr>
+    </w:lvl>
+  </w:abstractNum>
+  <w:abstractNum w:abstractNumId="80" w15:restartNumberingAfterBreak="0">
     <w:nsid w:val="3B446B2D"/>
     <w:multiLevelType w:val="hybridMultilevel"/>
     <w:tmpl w:val="B638176E"/>
@@ -25930,7 +27201,7 @@
       </w:rPr>
     </w:lvl>
   </w:abstractNum>
-  <w:abstractNum w:abstractNumId="80" w15:restartNumberingAfterBreak="0">
+  <w:abstractNum w:abstractNumId="81" w15:restartNumberingAfterBreak="0">
     <w:nsid w:val="3B6B41F5"/>
     <w:multiLevelType w:val="hybridMultilevel"/>
     <w:tmpl w:val="10A26168"/>
@@ -26042,7 +27313,7 @@
       </w:rPr>
     </w:lvl>
   </w:abstractNum>
-  <w:abstractNum w:abstractNumId="81" w15:restartNumberingAfterBreak="0">
+  <w:abstractNum w:abstractNumId="82" w15:restartNumberingAfterBreak="0">
     <w:nsid w:val="3C5546BA"/>
     <w:multiLevelType w:val="hybridMultilevel"/>
     <w:tmpl w:val="3434F5E4"/>
@@ -26154,7 +27425,7 @@
       </w:rPr>
     </w:lvl>
   </w:abstractNum>
-  <w:abstractNum w:abstractNumId="82" w15:restartNumberingAfterBreak="0">
+  <w:abstractNum w:abstractNumId="83" w15:restartNumberingAfterBreak="0">
     <w:nsid w:val="3C623C55"/>
     <w:multiLevelType w:val="multilevel"/>
     <w:tmpl w:val="A0B0E8F4"/>
@@ -26303,7 +27574,7 @@
       </w:rPr>
     </w:lvl>
   </w:abstractNum>
-  <w:abstractNum w:abstractNumId="83" w15:restartNumberingAfterBreak="0">
+  <w:abstractNum w:abstractNumId="84" w15:restartNumberingAfterBreak="0">
     <w:nsid w:val="3CB359E6"/>
     <w:multiLevelType w:val="hybridMultilevel"/>
     <w:tmpl w:val="368E6E8E"/>
@@ -26416,7 +27687,7 @@
       </w:rPr>
     </w:lvl>
   </w:abstractNum>
-  <w:abstractNum w:abstractNumId="84" w15:restartNumberingAfterBreak="0">
+  <w:abstractNum w:abstractNumId="85" w15:restartNumberingAfterBreak="0">
     <w:nsid w:val="3CD27F78"/>
     <w:multiLevelType w:val="multilevel"/>
     <w:tmpl w:val="FCDE767A"/>
@@ -26565,7 +27836,7 @@
       </w:rPr>
     </w:lvl>
   </w:abstractNum>
-  <w:abstractNum w:abstractNumId="85" w15:restartNumberingAfterBreak="0">
+  <w:abstractNum w:abstractNumId="86" w15:restartNumberingAfterBreak="0">
     <w:nsid w:val="3CD74B18"/>
     <w:multiLevelType w:val="hybridMultilevel"/>
     <w:tmpl w:val="2FF42220"/>
@@ -26678,7 +27949,7 @@
       </w:rPr>
     </w:lvl>
   </w:abstractNum>
-  <w:abstractNum w:abstractNumId="86" w15:restartNumberingAfterBreak="0">
+  <w:abstractNum w:abstractNumId="87" w15:restartNumberingAfterBreak="0">
     <w:nsid w:val="3D2F7E79"/>
     <w:multiLevelType w:val="hybridMultilevel"/>
     <w:tmpl w:val="6ED674BE"/>
@@ -26790,7 +28061,7 @@
       </w:rPr>
     </w:lvl>
   </w:abstractNum>
-  <w:abstractNum w:abstractNumId="87" w15:restartNumberingAfterBreak="0">
+  <w:abstractNum w:abstractNumId="88" w15:restartNumberingAfterBreak="0">
     <w:nsid w:val="3D397287"/>
     <w:multiLevelType w:val="hybridMultilevel"/>
     <w:tmpl w:val="F4503122"/>
@@ -26902,7 +28173,7 @@
       </w:rPr>
     </w:lvl>
   </w:abstractNum>
-  <w:abstractNum w:abstractNumId="88" w15:restartNumberingAfterBreak="0">
+  <w:abstractNum w:abstractNumId="89" w15:restartNumberingAfterBreak="0">
     <w:nsid w:val="3E685FF3"/>
     <w:multiLevelType w:val="multilevel"/>
     <w:tmpl w:val="7D20B538"/>
@@ -27051,7 +28322,7 @@
       </w:rPr>
     </w:lvl>
   </w:abstractNum>
-  <w:abstractNum w:abstractNumId="89" w15:restartNumberingAfterBreak="0">
+  <w:abstractNum w:abstractNumId="90" w15:restartNumberingAfterBreak="0">
     <w:nsid w:val="3F346C2C"/>
     <w:multiLevelType w:val="multilevel"/>
     <w:tmpl w:val="63F4E6F0"/>
@@ -27200,7 +28471,7 @@
       </w:rPr>
     </w:lvl>
   </w:abstractNum>
-  <w:abstractNum w:abstractNumId="90" w15:restartNumberingAfterBreak="0">
+  <w:abstractNum w:abstractNumId="91" w15:restartNumberingAfterBreak="0">
     <w:nsid w:val="3FCB1322"/>
     <w:multiLevelType w:val="hybridMultilevel"/>
     <w:tmpl w:val="55C012B2"/>
@@ -27312,7 +28583,7 @@
       </w:rPr>
     </w:lvl>
   </w:abstractNum>
-  <w:abstractNum w:abstractNumId="91" w15:restartNumberingAfterBreak="0">
+  <w:abstractNum w:abstractNumId="92" w15:restartNumberingAfterBreak="0">
     <w:nsid w:val="41A9344F"/>
     <w:multiLevelType w:val="hybridMultilevel"/>
     <w:tmpl w:val="0FB60038"/>
@@ -27425,7 +28696,7 @@
       </w:rPr>
     </w:lvl>
   </w:abstractNum>
-  <w:abstractNum w:abstractNumId="92" w15:restartNumberingAfterBreak="0">
+  <w:abstractNum w:abstractNumId="93" w15:restartNumberingAfterBreak="0">
     <w:nsid w:val="42004E1F"/>
     <w:multiLevelType w:val="hybridMultilevel"/>
     <w:tmpl w:val="770C8314"/>
@@ -27537,7 +28808,7 @@
       </w:rPr>
     </w:lvl>
   </w:abstractNum>
-  <w:abstractNum w:abstractNumId="93" w15:restartNumberingAfterBreak="0">
+  <w:abstractNum w:abstractNumId="94" w15:restartNumberingAfterBreak="0">
     <w:nsid w:val="439F7169"/>
     <w:multiLevelType w:val="hybridMultilevel"/>
     <w:tmpl w:val="1884EDCA"/>
@@ -27650,7 +28921,7 @@
       </w:rPr>
     </w:lvl>
   </w:abstractNum>
-  <w:abstractNum w:abstractNumId="94" w15:restartNumberingAfterBreak="0">
+  <w:abstractNum w:abstractNumId="95" w15:restartNumberingAfterBreak="0">
     <w:nsid w:val="43EA1D69"/>
     <w:multiLevelType w:val="multilevel"/>
     <w:tmpl w:val="DFEC23EC"/>
@@ -27799,7 +29070,7 @@
       </w:rPr>
     </w:lvl>
   </w:abstractNum>
-  <w:abstractNum w:abstractNumId="95" w15:restartNumberingAfterBreak="0">
+  <w:abstractNum w:abstractNumId="96" w15:restartNumberingAfterBreak="0">
     <w:nsid w:val="44320084"/>
     <w:multiLevelType w:val="hybridMultilevel"/>
     <w:tmpl w:val="CE5076D4"/>
@@ -27911,7 +29182,7 @@
       </w:rPr>
     </w:lvl>
   </w:abstractNum>
-  <w:abstractNum w:abstractNumId="96" w15:restartNumberingAfterBreak="0">
+  <w:abstractNum w:abstractNumId="97" w15:restartNumberingAfterBreak="0">
     <w:nsid w:val="44554567"/>
     <w:multiLevelType w:val="hybridMultilevel"/>
     <w:tmpl w:val="78748252"/>
@@ -28023,7 +29294,7 @@
       </w:rPr>
     </w:lvl>
   </w:abstractNum>
-  <w:abstractNum w:abstractNumId="97" w15:restartNumberingAfterBreak="0">
+  <w:abstractNum w:abstractNumId="98" w15:restartNumberingAfterBreak="0">
     <w:nsid w:val="45336EC4"/>
     <w:multiLevelType w:val="hybridMultilevel"/>
     <w:tmpl w:val="5D74BC2A"/>
@@ -28136,7 +29407,7 @@
       </w:rPr>
     </w:lvl>
   </w:abstractNum>
-  <w:abstractNum w:abstractNumId="98" w15:restartNumberingAfterBreak="0">
+  <w:abstractNum w:abstractNumId="99" w15:restartNumberingAfterBreak="0">
     <w:nsid w:val="49005094"/>
     <w:multiLevelType w:val="hybridMultilevel"/>
     <w:tmpl w:val="14848CBE"/>
@@ -28248,7 +29519,7 @@
       </w:rPr>
     </w:lvl>
   </w:abstractNum>
-  <w:abstractNum w:abstractNumId="99" w15:restartNumberingAfterBreak="0">
+  <w:abstractNum w:abstractNumId="100" w15:restartNumberingAfterBreak="0">
     <w:nsid w:val="49243794"/>
     <w:multiLevelType w:val="multilevel"/>
     <w:tmpl w:val="E7681528"/>
@@ -28397,7 +29668,7 @@
       </w:rPr>
     </w:lvl>
   </w:abstractNum>
-  <w:abstractNum w:abstractNumId="100" w15:restartNumberingAfterBreak="0">
+  <w:abstractNum w:abstractNumId="101" w15:restartNumberingAfterBreak="0">
     <w:nsid w:val="49DE12C1"/>
     <w:multiLevelType w:val="hybridMultilevel"/>
     <w:tmpl w:val="4CF0F30E"/>
@@ -28483,7 +29754,7 @@
       </w:pPr>
     </w:lvl>
   </w:abstractNum>
-  <w:abstractNum w:abstractNumId="101" w15:restartNumberingAfterBreak="0">
+  <w:abstractNum w:abstractNumId="102" w15:restartNumberingAfterBreak="0">
     <w:nsid w:val="4A880990"/>
     <w:multiLevelType w:val="hybridMultilevel"/>
     <w:tmpl w:val="F17E12C2"/>
@@ -28595,7 +29866,7 @@
       </w:rPr>
     </w:lvl>
   </w:abstractNum>
-  <w:abstractNum w:abstractNumId="102" w15:restartNumberingAfterBreak="0">
+  <w:abstractNum w:abstractNumId="103" w15:restartNumberingAfterBreak="0">
     <w:nsid w:val="4B182B12"/>
     <w:multiLevelType w:val="hybridMultilevel"/>
     <w:tmpl w:val="31C486B4"/>
@@ -28707,7 +29978,7 @@
       </w:rPr>
     </w:lvl>
   </w:abstractNum>
-  <w:abstractNum w:abstractNumId="103" w15:restartNumberingAfterBreak="0">
+  <w:abstractNum w:abstractNumId="104" w15:restartNumberingAfterBreak="0">
     <w:nsid w:val="4BA13766"/>
     <w:multiLevelType w:val="multilevel"/>
     <w:tmpl w:val="63F4E6F0"/>
@@ -28856,7 +30127,7 @@
       </w:rPr>
     </w:lvl>
   </w:abstractNum>
-  <w:abstractNum w:abstractNumId="104" w15:restartNumberingAfterBreak="0">
+  <w:abstractNum w:abstractNumId="105" w15:restartNumberingAfterBreak="0">
     <w:nsid w:val="4E65371E"/>
     <w:multiLevelType w:val="hybridMultilevel"/>
     <w:tmpl w:val="53EE4538"/>
@@ -28968,7 +30239,7 @@
       </w:rPr>
     </w:lvl>
   </w:abstractNum>
-  <w:abstractNum w:abstractNumId="105" w15:restartNumberingAfterBreak="0">
+  <w:abstractNum w:abstractNumId="106" w15:restartNumberingAfterBreak="0">
     <w:nsid w:val="4E9A3F16"/>
     <w:multiLevelType w:val="multilevel"/>
     <w:tmpl w:val="63F4E6F0"/>
@@ -29117,7 +30388,7 @@
       </w:rPr>
     </w:lvl>
   </w:abstractNum>
-  <w:abstractNum w:abstractNumId="106" w15:restartNumberingAfterBreak="0">
+  <w:abstractNum w:abstractNumId="107" w15:restartNumberingAfterBreak="0">
     <w:nsid w:val="500B790D"/>
     <w:multiLevelType w:val="multilevel"/>
     <w:tmpl w:val="63F4E6F0"/>
@@ -29266,7 +30537,7 @@
       </w:rPr>
     </w:lvl>
   </w:abstractNum>
-  <w:abstractNum w:abstractNumId="107" w15:restartNumberingAfterBreak="0">
+  <w:abstractNum w:abstractNumId="108" w15:restartNumberingAfterBreak="0">
     <w:nsid w:val="526538B7"/>
     <w:multiLevelType w:val="hybridMultilevel"/>
     <w:tmpl w:val="E6A017F2"/>
@@ -29379,7 +30650,7 @@
       </w:rPr>
     </w:lvl>
   </w:abstractNum>
-  <w:abstractNum w:abstractNumId="108" w15:restartNumberingAfterBreak="0">
+  <w:abstractNum w:abstractNumId="109" w15:restartNumberingAfterBreak="0">
     <w:nsid w:val="537E56D9"/>
     <w:multiLevelType w:val="multilevel"/>
     <w:tmpl w:val="1B6E8B6A"/>
@@ -29528,7 +30799,7 @@
       </w:rPr>
     </w:lvl>
   </w:abstractNum>
-  <w:abstractNum w:abstractNumId="109" w15:restartNumberingAfterBreak="0">
+  <w:abstractNum w:abstractNumId="110" w15:restartNumberingAfterBreak="0">
     <w:nsid w:val="53E6601E"/>
     <w:multiLevelType w:val="hybridMultilevel"/>
     <w:tmpl w:val="66F0666A"/>
@@ -29641,7 +30912,7 @@
       </w:rPr>
     </w:lvl>
   </w:abstractNum>
-  <w:abstractNum w:abstractNumId="110" w15:restartNumberingAfterBreak="0">
+  <w:abstractNum w:abstractNumId="111" w15:restartNumberingAfterBreak="0">
     <w:nsid w:val="551D6F91"/>
     <w:multiLevelType w:val="hybridMultilevel"/>
     <w:tmpl w:val="9522B3C6"/>
@@ -29753,7 +31024,7 @@
       </w:rPr>
     </w:lvl>
   </w:abstractNum>
-  <w:abstractNum w:abstractNumId="111" w15:restartNumberingAfterBreak="0">
+  <w:abstractNum w:abstractNumId="112" w15:restartNumberingAfterBreak="0">
     <w:nsid w:val="555451DA"/>
     <w:multiLevelType w:val="hybridMultilevel"/>
     <w:tmpl w:val="CAB2A550"/>
@@ -29866,7 +31137,7 @@
       </w:rPr>
     </w:lvl>
   </w:abstractNum>
-  <w:abstractNum w:abstractNumId="112" w15:restartNumberingAfterBreak="0">
+  <w:abstractNum w:abstractNumId="113" w15:restartNumberingAfterBreak="0">
     <w:nsid w:val="55655B93"/>
     <w:multiLevelType w:val="multilevel"/>
     <w:tmpl w:val="9C88A4A8"/>
@@ -30015,7 +31286,7 @@
       </w:rPr>
     </w:lvl>
   </w:abstractNum>
-  <w:abstractNum w:abstractNumId="113" w15:restartNumberingAfterBreak="0">
+  <w:abstractNum w:abstractNumId="114" w15:restartNumberingAfterBreak="0">
     <w:nsid w:val="55B95BED"/>
     <w:multiLevelType w:val="hybridMultilevel"/>
     <w:tmpl w:val="A9B866FC"/>
@@ -30128,7 +31399,7 @@
       </w:rPr>
     </w:lvl>
   </w:abstractNum>
-  <w:abstractNum w:abstractNumId="114" w15:restartNumberingAfterBreak="0">
+  <w:abstractNum w:abstractNumId="115" w15:restartNumberingAfterBreak="0">
     <w:nsid w:val="562D4F1F"/>
     <w:multiLevelType w:val="hybridMultilevel"/>
     <w:tmpl w:val="1FF8D31C"/>
@@ -30240,7 +31511,7 @@
       </w:rPr>
     </w:lvl>
   </w:abstractNum>
-  <w:abstractNum w:abstractNumId="115" w15:restartNumberingAfterBreak="0">
+  <w:abstractNum w:abstractNumId="116" w15:restartNumberingAfterBreak="0">
     <w:nsid w:val="565A0C8B"/>
     <w:multiLevelType w:val="multilevel"/>
     <w:tmpl w:val="AB24FF2E"/>
@@ -30389,7 +31660,7 @@
       </w:rPr>
     </w:lvl>
   </w:abstractNum>
-  <w:abstractNum w:abstractNumId="116" w15:restartNumberingAfterBreak="0">
+  <w:abstractNum w:abstractNumId="117" w15:restartNumberingAfterBreak="0">
     <w:nsid w:val="566E7C65"/>
     <w:multiLevelType w:val="multilevel"/>
     <w:tmpl w:val="28803B4C"/>
@@ -30538,7 +31809,7 @@
       </w:rPr>
     </w:lvl>
   </w:abstractNum>
-  <w:abstractNum w:abstractNumId="117" w15:restartNumberingAfterBreak="0">
+  <w:abstractNum w:abstractNumId="118" w15:restartNumberingAfterBreak="0">
     <w:nsid w:val="57407594"/>
     <w:multiLevelType w:val="multilevel"/>
     <w:tmpl w:val="E6E2F8AE"/>
@@ -30687,7 +31958,7 @@
       </w:rPr>
     </w:lvl>
   </w:abstractNum>
-  <w:abstractNum w:abstractNumId="118" w15:restartNumberingAfterBreak="0">
+  <w:abstractNum w:abstractNumId="119" w15:restartNumberingAfterBreak="0">
     <w:nsid w:val="577F771B"/>
     <w:multiLevelType w:val="hybridMultilevel"/>
     <w:tmpl w:val="0F2C5914"/>
@@ -30799,7 +32070,7 @@
       </w:rPr>
     </w:lvl>
   </w:abstractNum>
-  <w:abstractNum w:abstractNumId="119" w15:restartNumberingAfterBreak="0">
+  <w:abstractNum w:abstractNumId="120" w15:restartNumberingAfterBreak="0">
     <w:nsid w:val="57C43CDD"/>
     <w:multiLevelType w:val="hybridMultilevel"/>
     <w:tmpl w:val="6C94FB5E"/>
@@ -30912,7 +32183,7 @@
       </w:rPr>
     </w:lvl>
   </w:abstractNum>
-  <w:abstractNum w:abstractNumId="120" w15:restartNumberingAfterBreak="0">
+  <w:abstractNum w:abstractNumId="121" w15:restartNumberingAfterBreak="0">
     <w:nsid w:val="58393977"/>
     <w:multiLevelType w:val="hybridMultilevel"/>
     <w:tmpl w:val="985A5484"/>
@@ -31025,7 +32296,7 @@
       </w:rPr>
     </w:lvl>
   </w:abstractNum>
-  <w:abstractNum w:abstractNumId="121" w15:restartNumberingAfterBreak="0">
+  <w:abstractNum w:abstractNumId="122" w15:restartNumberingAfterBreak="0">
     <w:nsid w:val="58993A3F"/>
     <w:multiLevelType w:val="hybridMultilevel"/>
     <w:tmpl w:val="5344B292"/>
@@ -31114,7 +32385,7 @@
       </w:pPr>
     </w:lvl>
   </w:abstractNum>
-  <w:abstractNum w:abstractNumId="122" w15:restartNumberingAfterBreak="0">
+  <w:abstractNum w:abstractNumId="123" w15:restartNumberingAfterBreak="0">
     <w:nsid w:val="59EB4CE4"/>
     <w:multiLevelType w:val="multilevel"/>
     <w:tmpl w:val="63F4E6F0"/>
@@ -31263,7 +32534,7 @@
       </w:rPr>
     </w:lvl>
   </w:abstractNum>
-  <w:abstractNum w:abstractNumId="123" w15:restartNumberingAfterBreak="0">
+  <w:abstractNum w:abstractNumId="124" w15:restartNumberingAfterBreak="0">
     <w:nsid w:val="5A067370"/>
     <w:multiLevelType w:val="hybridMultilevel"/>
     <w:tmpl w:val="9CB8C76C"/>
@@ -31376,7 +32647,7 @@
       </w:rPr>
     </w:lvl>
   </w:abstractNum>
-  <w:abstractNum w:abstractNumId="124" w15:restartNumberingAfterBreak="0">
+  <w:abstractNum w:abstractNumId="125" w15:restartNumberingAfterBreak="0">
     <w:nsid w:val="5BD11962"/>
     <w:multiLevelType w:val="hybridMultilevel"/>
     <w:tmpl w:val="89A4B834"/>
@@ -31465,7 +32736,7 @@
       </w:pPr>
     </w:lvl>
   </w:abstractNum>
-  <w:abstractNum w:abstractNumId="125" w15:restartNumberingAfterBreak="0">
+  <w:abstractNum w:abstractNumId="126" w15:restartNumberingAfterBreak="0">
     <w:nsid w:val="5C950DBA"/>
     <w:multiLevelType w:val="hybridMultilevel"/>
     <w:tmpl w:val="7D78F950"/>
@@ -31577,7 +32848,7 @@
       </w:rPr>
     </w:lvl>
   </w:abstractNum>
-  <w:abstractNum w:abstractNumId="126" w15:restartNumberingAfterBreak="0">
+  <w:abstractNum w:abstractNumId="127" w15:restartNumberingAfterBreak="0">
     <w:nsid w:val="5D2A5D3B"/>
     <w:multiLevelType w:val="hybridMultilevel"/>
     <w:tmpl w:val="3AF89EA6"/>
@@ -31668,7 +32939,7 @@
       </w:pPr>
     </w:lvl>
   </w:abstractNum>
-  <w:abstractNum w:abstractNumId="127" w15:restartNumberingAfterBreak="0">
+  <w:abstractNum w:abstractNumId="128" w15:restartNumberingAfterBreak="0">
     <w:nsid w:val="5D9E49FD"/>
     <w:multiLevelType w:val="hybridMultilevel"/>
     <w:tmpl w:val="4EE40BB4"/>
@@ -31780,7 +33051,7 @@
       </w:rPr>
     </w:lvl>
   </w:abstractNum>
-  <w:abstractNum w:abstractNumId="128" w15:restartNumberingAfterBreak="0">
+  <w:abstractNum w:abstractNumId="129" w15:restartNumberingAfterBreak="0">
     <w:nsid w:val="5DB7107D"/>
     <w:multiLevelType w:val="multilevel"/>
     <w:tmpl w:val="6520107A"/>
@@ -31929,7 +33200,7 @@
       </w:rPr>
     </w:lvl>
   </w:abstractNum>
-  <w:abstractNum w:abstractNumId="129" w15:restartNumberingAfterBreak="0">
+  <w:abstractNum w:abstractNumId="130" w15:restartNumberingAfterBreak="0">
     <w:nsid w:val="5E9370A7"/>
     <w:multiLevelType w:val="hybridMultilevel"/>
     <w:tmpl w:val="13480456"/>
@@ -32015,7 +33286,7 @@
       </w:pPr>
     </w:lvl>
   </w:abstractNum>
-  <w:abstractNum w:abstractNumId="130" w15:restartNumberingAfterBreak="0">
+  <w:abstractNum w:abstractNumId="131" w15:restartNumberingAfterBreak="0">
     <w:nsid w:val="60421322"/>
     <w:multiLevelType w:val="hybridMultilevel"/>
     <w:tmpl w:val="447CDBDC"/>
@@ -32127,7 +33398,7 @@
       </w:rPr>
     </w:lvl>
   </w:abstractNum>
-  <w:abstractNum w:abstractNumId="131" w15:restartNumberingAfterBreak="0">
+  <w:abstractNum w:abstractNumId="132" w15:restartNumberingAfterBreak="0">
     <w:nsid w:val="61926C31"/>
     <w:multiLevelType w:val="hybridMultilevel"/>
     <w:tmpl w:val="AFD27E5C"/>
@@ -32240,7 +33511,7 @@
       </w:rPr>
     </w:lvl>
   </w:abstractNum>
-  <w:abstractNum w:abstractNumId="132" w15:restartNumberingAfterBreak="0">
+  <w:abstractNum w:abstractNumId="133" w15:restartNumberingAfterBreak="0">
     <w:nsid w:val="622F5FC7"/>
     <w:multiLevelType w:val="hybridMultilevel"/>
     <w:tmpl w:val="49A6C2A6"/>
@@ -32353,7 +33624,7 @@
       </w:rPr>
     </w:lvl>
   </w:abstractNum>
-  <w:abstractNum w:abstractNumId="133" w15:restartNumberingAfterBreak="0">
+  <w:abstractNum w:abstractNumId="134" w15:restartNumberingAfterBreak="0">
     <w:nsid w:val="62AC33B4"/>
     <w:multiLevelType w:val="multilevel"/>
     <w:tmpl w:val="A074F3CA"/>
@@ -32502,7 +33773,7 @@
       </w:rPr>
     </w:lvl>
   </w:abstractNum>
-  <w:abstractNum w:abstractNumId="134" w15:restartNumberingAfterBreak="0">
+  <w:abstractNum w:abstractNumId="135" w15:restartNumberingAfterBreak="0">
     <w:nsid w:val="63B44674"/>
     <w:multiLevelType w:val="multilevel"/>
     <w:tmpl w:val="08F4FA9A"/>
@@ -32651,7 +33922,7 @@
       </w:rPr>
     </w:lvl>
   </w:abstractNum>
-  <w:abstractNum w:abstractNumId="135" w15:restartNumberingAfterBreak="0">
+  <w:abstractNum w:abstractNumId="136" w15:restartNumberingAfterBreak="0">
     <w:nsid w:val="63C245D4"/>
     <w:multiLevelType w:val="hybridMultilevel"/>
     <w:tmpl w:val="E1563A56"/>
@@ -32763,7 +34034,7 @@
       </w:rPr>
     </w:lvl>
   </w:abstractNum>
-  <w:abstractNum w:abstractNumId="136" w15:restartNumberingAfterBreak="0">
+  <w:abstractNum w:abstractNumId="137" w15:restartNumberingAfterBreak="0">
     <w:nsid w:val="64F30198"/>
     <w:multiLevelType w:val="multilevel"/>
     <w:tmpl w:val="63F4E6F0"/>
@@ -32912,7 +34183,7 @@
       </w:rPr>
     </w:lvl>
   </w:abstractNum>
-  <w:abstractNum w:abstractNumId="137" w15:restartNumberingAfterBreak="0">
+  <w:abstractNum w:abstractNumId="138" w15:restartNumberingAfterBreak="0">
     <w:nsid w:val="65AF2502"/>
     <w:multiLevelType w:val="hybridMultilevel"/>
     <w:tmpl w:val="FB2A44D8"/>
@@ -33025,7 +34296,7 @@
       </w:rPr>
     </w:lvl>
   </w:abstractNum>
-  <w:abstractNum w:abstractNumId="138" w15:restartNumberingAfterBreak="0">
+  <w:abstractNum w:abstractNumId="139" w15:restartNumberingAfterBreak="0">
     <w:nsid w:val="671614F0"/>
     <w:multiLevelType w:val="multilevel"/>
     <w:tmpl w:val="63F4E6F0"/>
@@ -33174,7 +34445,7 @@
       </w:rPr>
     </w:lvl>
   </w:abstractNum>
-  <w:abstractNum w:abstractNumId="139" w15:restartNumberingAfterBreak="0">
+  <w:abstractNum w:abstractNumId="140" w15:restartNumberingAfterBreak="0">
     <w:nsid w:val="6859691D"/>
     <w:multiLevelType w:val="multilevel"/>
     <w:tmpl w:val="826A9D48"/>
@@ -33323,7 +34594,7 @@
       </w:rPr>
     </w:lvl>
   </w:abstractNum>
-  <w:abstractNum w:abstractNumId="140" w15:restartNumberingAfterBreak="0">
+  <w:abstractNum w:abstractNumId="141" w15:restartNumberingAfterBreak="0">
     <w:nsid w:val="68817757"/>
     <w:multiLevelType w:val="multilevel"/>
     <w:tmpl w:val="34EE1968"/>
@@ -33472,7 +34743,7 @@
       </w:rPr>
     </w:lvl>
   </w:abstractNum>
-  <w:abstractNum w:abstractNumId="141" w15:restartNumberingAfterBreak="0">
+  <w:abstractNum w:abstractNumId="142" w15:restartNumberingAfterBreak="0">
     <w:nsid w:val="68AE31AF"/>
     <w:multiLevelType w:val="hybridMultilevel"/>
     <w:tmpl w:val="9EB648FC"/>
@@ -33585,7 +34856,7 @@
       </w:rPr>
     </w:lvl>
   </w:abstractNum>
-  <w:abstractNum w:abstractNumId="142" w15:restartNumberingAfterBreak="0">
+  <w:abstractNum w:abstractNumId="143" w15:restartNumberingAfterBreak="0">
     <w:nsid w:val="68BE10E8"/>
     <w:multiLevelType w:val="hybridMultilevel"/>
     <w:tmpl w:val="326CD592"/>
@@ -33698,7 +34969,7 @@
       </w:rPr>
     </w:lvl>
   </w:abstractNum>
-  <w:abstractNum w:abstractNumId="143" w15:restartNumberingAfterBreak="0">
+  <w:abstractNum w:abstractNumId="144" w15:restartNumberingAfterBreak="0">
     <w:nsid w:val="68E86299"/>
     <w:multiLevelType w:val="hybridMultilevel"/>
     <w:tmpl w:val="9B5CBEE8"/>
@@ -33784,7 +35055,7 @@
       </w:pPr>
     </w:lvl>
   </w:abstractNum>
-  <w:abstractNum w:abstractNumId="144" w15:restartNumberingAfterBreak="0">
+  <w:abstractNum w:abstractNumId="145" w15:restartNumberingAfterBreak="0">
     <w:nsid w:val="69996D9A"/>
     <w:multiLevelType w:val="multilevel"/>
     <w:tmpl w:val="1780FC38"/>
@@ -33933,7 +35204,7 @@
       </w:rPr>
     </w:lvl>
   </w:abstractNum>
-  <w:abstractNum w:abstractNumId="145" w15:restartNumberingAfterBreak="0">
+  <w:abstractNum w:abstractNumId="146" w15:restartNumberingAfterBreak="0">
     <w:nsid w:val="6B3C30B9"/>
     <w:multiLevelType w:val="hybridMultilevel"/>
     <w:tmpl w:val="C938F8DE"/>
@@ -34045,7 +35316,120 @@
       </w:rPr>
     </w:lvl>
   </w:abstractNum>
-  <w:abstractNum w:abstractNumId="146" w15:restartNumberingAfterBreak="0">
+  <w:abstractNum w:abstractNumId="147" w15:restartNumberingAfterBreak="0">
+    <w:nsid w:val="6C9272BF"/>
+    <w:multiLevelType w:val="hybridMultilevel"/>
+    <w:tmpl w:val="AE021BFA"/>
+    <w:lvl w:ilvl="0" w:tplc="04090005">
+      <w:start w:val="1"/>
+      <w:numFmt w:val="bullet"/>
+      <w:lvlText w:val=""/>
+      <w:lvlJc w:val="left"/>
+      <w:pPr>
+        <w:ind w:left="720" w:hanging="360"/>
+      </w:pPr>
+      <w:rPr>
+        <w:rFonts w:ascii="Wingdings" w:hAnsi="Wingdings" w:hint="default"/>
+      </w:rPr>
+    </w:lvl>
+    <w:lvl w:ilvl="1" w:tplc="04090003" w:tentative="1">
+      <w:start w:val="1"/>
+      <w:numFmt w:val="bullet"/>
+      <w:lvlText w:val="o"/>
+      <w:lvlJc w:val="left"/>
+      <w:pPr>
+        <w:ind w:left="1440" w:hanging="360"/>
+      </w:pPr>
+      <w:rPr>
+        <w:rFonts w:ascii="Courier New" w:hAnsi="Courier New" w:cs="Courier New" w:hint="default"/>
+      </w:rPr>
+    </w:lvl>
+    <w:lvl w:ilvl="2" w:tplc="04090005" w:tentative="1">
+      <w:start w:val="1"/>
+      <w:numFmt w:val="bullet"/>
+      <w:lvlText w:val=""/>
+      <w:lvlJc w:val="left"/>
+      <w:pPr>
+        <w:ind w:left="2160" w:hanging="360"/>
+      </w:pPr>
+      <w:rPr>
+        <w:rFonts w:ascii="Wingdings" w:hAnsi="Wingdings" w:hint="default"/>
+      </w:rPr>
+    </w:lvl>
+    <w:lvl w:ilvl="3" w:tplc="04090001" w:tentative="1">
+      <w:start w:val="1"/>
+      <w:numFmt w:val="bullet"/>
+      <w:lvlText w:val=""/>
+      <w:lvlJc w:val="left"/>
+      <w:pPr>
+        <w:ind w:left="2880" w:hanging="360"/>
+      </w:pPr>
+      <w:rPr>
+        <w:rFonts w:ascii="Symbol" w:hAnsi="Symbol" w:hint="default"/>
+      </w:rPr>
+    </w:lvl>
+    <w:lvl w:ilvl="4" w:tplc="04090003" w:tentative="1">
+      <w:start w:val="1"/>
+      <w:numFmt w:val="bullet"/>
+      <w:lvlText w:val="o"/>
+      <w:lvlJc w:val="left"/>
+      <w:pPr>
+        <w:ind w:left="3600" w:hanging="360"/>
+      </w:pPr>
+      <w:rPr>
+        <w:rFonts w:ascii="Courier New" w:hAnsi="Courier New" w:cs="Courier New" w:hint="default"/>
+      </w:rPr>
+    </w:lvl>
+    <w:lvl w:ilvl="5" w:tplc="04090005" w:tentative="1">
+      <w:start w:val="1"/>
+      <w:numFmt w:val="bullet"/>
+      <w:lvlText w:val=""/>
+      <w:lvlJc w:val="left"/>
+      <w:pPr>
+        <w:ind w:left="4320" w:hanging="360"/>
+      </w:pPr>
+      <w:rPr>
+        <w:rFonts w:ascii="Wingdings" w:hAnsi="Wingdings" w:hint="default"/>
+      </w:rPr>
+    </w:lvl>
+    <w:lvl w:ilvl="6" w:tplc="04090001" w:tentative="1">
+      <w:start w:val="1"/>
+      <w:numFmt w:val="bullet"/>
+      <w:lvlText w:val=""/>
+      <w:lvlJc w:val="left"/>
+      <w:pPr>
+        <w:ind w:left="5040" w:hanging="360"/>
+      </w:pPr>
+      <w:rPr>
+        <w:rFonts w:ascii="Symbol" w:hAnsi="Symbol" w:hint="default"/>
+      </w:rPr>
+    </w:lvl>
+    <w:lvl w:ilvl="7" w:tplc="04090003" w:tentative="1">
+      <w:start w:val="1"/>
+      <w:numFmt w:val="bullet"/>
+      <w:lvlText w:val="o"/>
+      <w:lvlJc w:val="left"/>
+      <w:pPr>
+        <w:ind w:left="5760" w:hanging="360"/>
+      </w:pPr>
+      <w:rPr>
+        <w:rFonts w:ascii="Courier New" w:hAnsi="Courier New" w:cs="Courier New" w:hint="default"/>
+      </w:rPr>
+    </w:lvl>
+    <w:lvl w:ilvl="8" w:tplc="04090005" w:tentative="1">
+      <w:start w:val="1"/>
+      <w:numFmt w:val="bullet"/>
+      <w:lvlText w:val=""/>
+      <w:lvlJc w:val="left"/>
+      <w:pPr>
+        <w:ind w:left="6480" w:hanging="360"/>
+      </w:pPr>
+      <w:rPr>
+        <w:rFonts w:ascii="Wingdings" w:hAnsi="Wingdings" w:hint="default"/>
+      </w:rPr>
+    </w:lvl>
+  </w:abstractNum>
+  <w:abstractNum w:abstractNumId="148" w15:restartNumberingAfterBreak="0">
     <w:nsid w:val="6D1511A0"/>
     <w:multiLevelType w:val="hybridMultilevel"/>
     <w:tmpl w:val="AAD8B9B4"/>
@@ -34157,7 +35541,7 @@
       </w:rPr>
     </w:lvl>
   </w:abstractNum>
-  <w:abstractNum w:abstractNumId="147" w15:restartNumberingAfterBreak="0">
+  <w:abstractNum w:abstractNumId="149" w15:restartNumberingAfterBreak="0">
     <w:nsid w:val="6DD255F1"/>
     <w:multiLevelType w:val="hybridMultilevel"/>
     <w:tmpl w:val="ACBC1404"/>
@@ -34270,7 +35654,7 @@
       </w:rPr>
     </w:lvl>
   </w:abstractNum>
-  <w:abstractNum w:abstractNumId="148" w15:restartNumberingAfterBreak="0">
+  <w:abstractNum w:abstractNumId="150" w15:restartNumberingAfterBreak="0">
     <w:nsid w:val="6DDB4404"/>
     <w:multiLevelType w:val="hybridMultilevel"/>
     <w:tmpl w:val="06428E32"/>
@@ -34383,7 +35767,7 @@
       </w:rPr>
     </w:lvl>
   </w:abstractNum>
-  <w:abstractNum w:abstractNumId="149" w15:restartNumberingAfterBreak="0">
+  <w:abstractNum w:abstractNumId="151" w15:restartNumberingAfterBreak="0">
     <w:nsid w:val="6F014B3B"/>
     <w:multiLevelType w:val="hybridMultilevel"/>
     <w:tmpl w:val="C89A39BE"/>
@@ -34495,7 +35879,7 @@
       </w:rPr>
     </w:lvl>
   </w:abstractNum>
-  <w:abstractNum w:abstractNumId="150" w15:restartNumberingAfterBreak="0">
+  <w:abstractNum w:abstractNumId="152" w15:restartNumberingAfterBreak="0">
     <w:nsid w:val="6F171273"/>
     <w:multiLevelType w:val="multilevel"/>
     <w:tmpl w:val="0240C564"/>
@@ -34644,7 +36028,7 @@
       </w:rPr>
     </w:lvl>
   </w:abstractNum>
-  <w:abstractNum w:abstractNumId="151" w15:restartNumberingAfterBreak="0">
+  <w:abstractNum w:abstractNumId="153" w15:restartNumberingAfterBreak="0">
     <w:nsid w:val="6FB82AAA"/>
     <w:multiLevelType w:val="multilevel"/>
     <w:tmpl w:val="FC46C7C0"/>
@@ -34793,7 +36177,7 @@
       </w:rPr>
     </w:lvl>
   </w:abstractNum>
-  <w:abstractNum w:abstractNumId="152" w15:restartNumberingAfterBreak="0">
+  <w:abstractNum w:abstractNumId="154" w15:restartNumberingAfterBreak="0">
     <w:nsid w:val="6FD46DCF"/>
     <w:multiLevelType w:val="hybridMultilevel"/>
     <w:tmpl w:val="EF5E6EC6"/>
@@ -34906,7 +36290,7 @@
       </w:rPr>
     </w:lvl>
   </w:abstractNum>
-  <w:abstractNum w:abstractNumId="153" w15:restartNumberingAfterBreak="0">
+  <w:abstractNum w:abstractNumId="155" w15:restartNumberingAfterBreak="0">
     <w:nsid w:val="70484E38"/>
     <w:multiLevelType w:val="multilevel"/>
     <w:tmpl w:val="22B26DD2"/>
@@ -35055,7 +36439,7 @@
       </w:rPr>
     </w:lvl>
   </w:abstractNum>
-  <w:abstractNum w:abstractNumId="154" w15:restartNumberingAfterBreak="0">
+  <w:abstractNum w:abstractNumId="156" w15:restartNumberingAfterBreak="0">
     <w:nsid w:val="70CB723E"/>
     <w:multiLevelType w:val="multilevel"/>
     <w:tmpl w:val="63F4E6F0"/>
@@ -35204,7 +36588,7 @@
       </w:rPr>
     </w:lvl>
   </w:abstractNum>
-  <w:abstractNum w:abstractNumId="155" w15:restartNumberingAfterBreak="0">
+  <w:abstractNum w:abstractNumId="157" w15:restartNumberingAfterBreak="0">
     <w:nsid w:val="71DB3F58"/>
     <w:multiLevelType w:val="multilevel"/>
     <w:tmpl w:val="63F4E6F0"/>
@@ -35353,7 +36737,7 @@
       </w:rPr>
     </w:lvl>
   </w:abstractNum>
-  <w:abstractNum w:abstractNumId="156" w15:restartNumberingAfterBreak="0">
+  <w:abstractNum w:abstractNumId="158" w15:restartNumberingAfterBreak="0">
     <w:nsid w:val="72F31FF2"/>
     <w:multiLevelType w:val="hybridMultilevel"/>
     <w:tmpl w:val="5C2693A0"/>
@@ -35465,7 +36849,7 @@
       </w:rPr>
     </w:lvl>
   </w:abstractNum>
-  <w:abstractNum w:abstractNumId="157" w15:restartNumberingAfterBreak="0">
+  <w:abstractNum w:abstractNumId="159" w15:restartNumberingAfterBreak="0">
     <w:nsid w:val="75B45140"/>
     <w:multiLevelType w:val="hybridMultilevel"/>
     <w:tmpl w:val="93F8F3C4"/>
@@ -35578,7 +36962,7 @@
       </w:rPr>
     </w:lvl>
   </w:abstractNum>
-  <w:abstractNum w:abstractNumId="158" w15:restartNumberingAfterBreak="0">
+  <w:abstractNum w:abstractNumId="160" w15:restartNumberingAfterBreak="0">
     <w:nsid w:val="76F60FFE"/>
     <w:multiLevelType w:val="multilevel"/>
     <w:tmpl w:val="63F4E6F0"/>
@@ -35727,7 +37111,7 @@
       </w:rPr>
     </w:lvl>
   </w:abstractNum>
-  <w:abstractNum w:abstractNumId="159" w15:restartNumberingAfterBreak="0">
+  <w:abstractNum w:abstractNumId="161" w15:restartNumberingAfterBreak="0">
     <w:nsid w:val="772A45B4"/>
     <w:multiLevelType w:val="hybridMultilevel"/>
     <w:tmpl w:val="833AB77E"/>
@@ -35840,7 +37224,7 @@
       </w:rPr>
     </w:lvl>
   </w:abstractNum>
-  <w:abstractNum w:abstractNumId="160" w15:restartNumberingAfterBreak="0">
+  <w:abstractNum w:abstractNumId="162" w15:restartNumberingAfterBreak="0">
     <w:nsid w:val="77572323"/>
     <w:multiLevelType w:val="multilevel"/>
     <w:tmpl w:val="63F4E6F0"/>
@@ -35989,7 +37373,7 @@
       </w:rPr>
     </w:lvl>
   </w:abstractNum>
-  <w:abstractNum w:abstractNumId="161" w15:restartNumberingAfterBreak="0">
+  <w:abstractNum w:abstractNumId="163" w15:restartNumberingAfterBreak="0">
     <w:nsid w:val="77B8201F"/>
     <w:multiLevelType w:val="hybridMultilevel"/>
     <w:tmpl w:val="D7160708"/>
@@ -36101,7 +37485,7 @@
       </w:rPr>
     </w:lvl>
   </w:abstractNum>
-  <w:abstractNum w:abstractNumId="162" w15:restartNumberingAfterBreak="0">
+  <w:abstractNum w:abstractNumId="164" w15:restartNumberingAfterBreak="0">
     <w:nsid w:val="79796FF9"/>
     <w:multiLevelType w:val="hybridMultilevel"/>
     <w:tmpl w:val="CFA8EF82"/>
@@ -36213,7 +37597,7 @@
       </w:rPr>
     </w:lvl>
   </w:abstractNum>
-  <w:abstractNum w:abstractNumId="163" w15:restartNumberingAfterBreak="0">
+  <w:abstractNum w:abstractNumId="165" w15:restartNumberingAfterBreak="0">
     <w:nsid w:val="79910410"/>
     <w:multiLevelType w:val="hybridMultilevel"/>
     <w:tmpl w:val="FC923542"/>
@@ -36325,7 +37709,7 @@
       </w:rPr>
     </w:lvl>
   </w:abstractNum>
-  <w:abstractNum w:abstractNumId="164" w15:restartNumberingAfterBreak="0">
+  <w:abstractNum w:abstractNumId="166" w15:restartNumberingAfterBreak="0">
     <w:nsid w:val="79BF6B53"/>
     <w:multiLevelType w:val="hybridMultilevel"/>
     <w:tmpl w:val="4E2EA1E0"/>
@@ -36411,7 +37795,7 @@
       </w:pPr>
     </w:lvl>
   </w:abstractNum>
-  <w:abstractNum w:abstractNumId="165" w15:restartNumberingAfterBreak="0">
+  <w:abstractNum w:abstractNumId="167" w15:restartNumberingAfterBreak="0">
     <w:nsid w:val="7AFF575A"/>
     <w:multiLevelType w:val="hybridMultilevel"/>
     <w:tmpl w:val="A6323D3E"/>
@@ -36523,7 +37907,7 @@
       </w:rPr>
     </w:lvl>
   </w:abstractNum>
-  <w:abstractNum w:abstractNumId="166" w15:restartNumberingAfterBreak="0">
+  <w:abstractNum w:abstractNumId="168" w15:restartNumberingAfterBreak="0">
     <w:nsid w:val="7B4018BF"/>
     <w:multiLevelType w:val="multilevel"/>
     <w:tmpl w:val="63F4E6F0"/>
@@ -36672,7 +38056,7 @@
       </w:rPr>
     </w:lvl>
   </w:abstractNum>
-  <w:abstractNum w:abstractNumId="167" w15:restartNumberingAfterBreak="0">
+  <w:abstractNum w:abstractNumId="169" w15:restartNumberingAfterBreak="0">
     <w:nsid w:val="7B4D1B33"/>
     <w:multiLevelType w:val="hybridMultilevel"/>
     <w:tmpl w:val="5EAC717E"/>
@@ -36784,7 +38168,7 @@
       </w:rPr>
     </w:lvl>
   </w:abstractNum>
-  <w:abstractNum w:abstractNumId="168" w15:restartNumberingAfterBreak="0">
+  <w:abstractNum w:abstractNumId="170" w15:restartNumberingAfterBreak="0">
     <w:nsid w:val="7CAC27CD"/>
     <w:multiLevelType w:val="multilevel"/>
     <w:tmpl w:val="3BC20E58"/>
@@ -36933,7 +38317,7 @@
       </w:rPr>
     </w:lvl>
   </w:abstractNum>
-  <w:abstractNum w:abstractNumId="169" w15:restartNumberingAfterBreak="0">
+  <w:abstractNum w:abstractNumId="171" w15:restartNumberingAfterBreak="0">
     <w:nsid w:val="7E5978EA"/>
     <w:multiLevelType w:val="hybridMultilevel"/>
     <w:tmpl w:val="D74C0DB0"/>
@@ -37045,7 +38429,7 @@
       </w:rPr>
     </w:lvl>
   </w:abstractNum>
-  <w:abstractNum w:abstractNumId="170" w15:restartNumberingAfterBreak="0">
+  <w:abstractNum w:abstractNumId="172" w15:restartNumberingAfterBreak="0">
     <w:nsid w:val="7F106A5D"/>
     <w:multiLevelType w:val="hybridMultilevel"/>
     <w:tmpl w:val="A1CA4816"/>
@@ -37158,7 +38542,7 @@
     </w:lvl>
   </w:abstractNum>
   <w:num w:numId="1" w16cid:durableId="1882476756">
-    <w:abstractNumId w:val="99"/>
+    <w:abstractNumId w:val="100"/>
   </w:num>
   <w:num w:numId="2" w16cid:durableId="871453468">
     <w:abstractNumId w:val="29"/>
@@ -37167,43 +38551,43 @@
     <w:abstractNumId w:val="45"/>
   </w:num>
   <w:num w:numId="4" w16cid:durableId="1105467722">
-    <w:abstractNumId w:val="82"/>
+    <w:abstractNumId w:val="83"/>
   </w:num>
   <w:num w:numId="5" w16cid:durableId="769932622">
-    <w:abstractNumId w:val="116"/>
+    <w:abstractNumId w:val="117"/>
   </w:num>
   <w:num w:numId="6" w16cid:durableId="575944109">
     <w:abstractNumId w:val="49"/>
   </w:num>
   <w:num w:numId="7" w16cid:durableId="877661689">
-    <w:abstractNumId w:val="153"/>
+    <w:abstractNumId w:val="155"/>
   </w:num>
   <w:num w:numId="8" w16cid:durableId="1390107422">
-    <w:abstractNumId w:val="88"/>
+    <w:abstractNumId w:val="89"/>
   </w:num>
   <w:num w:numId="9" w16cid:durableId="881866424">
-    <w:abstractNumId w:val="112"/>
+    <w:abstractNumId w:val="113"/>
   </w:num>
   <w:num w:numId="10" w16cid:durableId="1037244995">
-    <w:abstractNumId w:val="144"/>
+    <w:abstractNumId w:val="145"/>
   </w:num>
   <w:num w:numId="11" w16cid:durableId="1575554597">
     <w:abstractNumId w:val="72"/>
   </w:num>
   <w:num w:numId="12" w16cid:durableId="915364478">
-    <w:abstractNumId w:val="94"/>
+    <w:abstractNumId w:val="95"/>
   </w:num>
   <w:num w:numId="13" w16cid:durableId="1386294114">
-    <w:abstractNumId w:val="134"/>
+    <w:abstractNumId w:val="135"/>
   </w:num>
   <w:num w:numId="14" w16cid:durableId="1071851223">
     <w:abstractNumId w:val="30"/>
   </w:num>
   <w:num w:numId="15" w16cid:durableId="1545557520">
-    <w:abstractNumId w:val="84"/>
+    <w:abstractNumId w:val="85"/>
   </w:num>
   <w:num w:numId="16" w16cid:durableId="1102919547">
-    <w:abstractNumId w:val="168"/>
+    <w:abstractNumId w:val="170"/>
   </w:num>
   <w:num w:numId="17" w16cid:durableId="294526838">
     <w:abstractNumId w:val="61"/>
@@ -37212,7 +38596,7 @@
     <w:abstractNumId w:val="70"/>
   </w:num>
   <w:num w:numId="19" w16cid:durableId="2119449470">
-    <w:abstractNumId w:val="108"/>
+    <w:abstractNumId w:val="109"/>
   </w:num>
   <w:num w:numId="20" w16cid:durableId="1365054799">
     <w:abstractNumId w:val="18"/>
@@ -37221,19 +38605,19 @@
     <w:abstractNumId w:val="71"/>
   </w:num>
   <w:num w:numId="22" w16cid:durableId="1080098953">
-    <w:abstractNumId w:val="139"/>
+    <w:abstractNumId w:val="140"/>
   </w:num>
   <w:num w:numId="23" w16cid:durableId="1635717296">
     <w:abstractNumId w:val="76"/>
   </w:num>
   <w:num w:numId="24" w16cid:durableId="544873123">
-    <w:abstractNumId w:val="133"/>
+    <w:abstractNumId w:val="134"/>
   </w:num>
   <w:num w:numId="25" w16cid:durableId="1128352778">
     <w:abstractNumId w:val="17"/>
   </w:num>
   <w:num w:numId="26" w16cid:durableId="1732537407">
-    <w:abstractNumId w:val="148"/>
+    <w:abstractNumId w:val="150"/>
   </w:num>
   <w:num w:numId="27" w16cid:durableId="945502064">
     <w:abstractNumId w:val="7"/>
@@ -37245,7 +38629,7 @@
     <w:abstractNumId w:val="69"/>
   </w:num>
   <w:num w:numId="30" w16cid:durableId="1500659483">
-    <w:abstractNumId w:val="91"/>
+    <w:abstractNumId w:val="92"/>
   </w:num>
   <w:num w:numId="31" w16cid:durableId="118301211">
     <w:abstractNumId w:val="19"/>
@@ -37260,43 +38644,43 @@
     <w:abstractNumId w:val="56"/>
   </w:num>
   <w:num w:numId="35" w16cid:durableId="356852923">
-    <w:abstractNumId w:val="107"/>
+    <w:abstractNumId w:val="108"/>
   </w:num>
   <w:num w:numId="36" w16cid:durableId="430662559">
     <w:abstractNumId w:val="25"/>
   </w:num>
   <w:num w:numId="37" w16cid:durableId="247080868">
-    <w:abstractNumId w:val="157"/>
+    <w:abstractNumId w:val="159"/>
   </w:num>
   <w:num w:numId="38" w16cid:durableId="158887408">
-    <w:abstractNumId w:val="131"/>
+    <w:abstractNumId w:val="132"/>
   </w:num>
   <w:num w:numId="39" w16cid:durableId="1681347932">
-    <w:abstractNumId w:val="152"/>
+    <w:abstractNumId w:val="154"/>
   </w:num>
   <w:num w:numId="40" w16cid:durableId="2101440158">
-    <w:abstractNumId w:val="87"/>
+    <w:abstractNumId w:val="88"/>
   </w:num>
   <w:num w:numId="41" w16cid:durableId="1250391122">
-    <w:abstractNumId w:val="126"/>
+    <w:abstractNumId w:val="127"/>
   </w:num>
   <w:num w:numId="42" w16cid:durableId="479083359">
-    <w:abstractNumId w:val="156"/>
+    <w:abstractNumId w:val="158"/>
   </w:num>
   <w:num w:numId="43" w16cid:durableId="1557860317">
-    <w:abstractNumId w:val="109"/>
+    <w:abstractNumId w:val="110"/>
   </w:num>
   <w:num w:numId="44" w16cid:durableId="2142183763">
     <w:abstractNumId w:val="10"/>
   </w:num>
   <w:num w:numId="45" w16cid:durableId="1357736349">
-    <w:abstractNumId w:val="163"/>
+    <w:abstractNumId w:val="165"/>
   </w:num>
   <w:num w:numId="46" w16cid:durableId="1519656040">
-    <w:abstractNumId w:val="162"/>
+    <w:abstractNumId w:val="164"/>
   </w:num>
   <w:num w:numId="47" w16cid:durableId="1078596852">
-    <w:abstractNumId w:val="170"/>
+    <w:abstractNumId w:val="172"/>
   </w:num>
   <w:num w:numId="48" w16cid:durableId="1027950100">
     <w:abstractNumId w:val="41"/>
@@ -37308,19 +38692,19 @@
     <w:abstractNumId w:val="77"/>
   </w:num>
   <w:num w:numId="51" w16cid:durableId="1128354320">
-    <w:abstractNumId w:val="146"/>
+    <w:abstractNumId w:val="148"/>
   </w:num>
   <w:num w:numId="52" w16cid:durableId="248543928">
-    <w:abstractNumId w:val="86"/>
+    <w:abstractNumId w:val="87"/>
   </w:num>
   <w:num w:numId="53" w16cid:durableId="965889214">
-    <w:abstractNumId w:val="114"/>
+    <w:abstractNumId w:val="115"/>
   </w:num>
   <w:num w:numId="54" w16cid:durableId="1827503240">
-    <w:abstractNumId w:val="124"/>
+    <w:abstractNumId w:val="125"/>
   </w:num>
   <w:num w:numId="55" w16cid:durableId="505748256">
-    <w:abstractNumId w:val="104"/>
+    <w:abstractNumId w:val="105"/>
   </w:num>
   <w:num w:numId="56" w16cid:durableId="2120370925">
     <w:abstractNumId w:val="38"/>
@@ -37329,52 +38713,52 @@
     <w:abstractNumId w:val="21"/>
   </w:num>
   <w:num w:numId="58" w16cid:durableId="1000235123">
-    <w:abstractNumId w:val="110"/>
+    <w:abstractNumId w:val="111"/>
   </w:num>
   <w:num w:numId="59" w16cid:durableId="628516409">
-    <w:abstractNumId w:val="145"/>
+    <w:abstractNumId w:val="146"/>
   </w:num>
   <w:num w:numId="60" w16cid:durableId="2028865444">
-    <w:abstractNumId w:val="102"/>
+    <w:abstractNumId w:val="103"/>
   </w:num>
   <w:num w:numId="61" w16cid:durableId="943926811">
-    <w:abstractNumId w:val="167"/>
+    <w:abstractNumId w:val="169"/>
   </w:num>
   <w:num w:numId="62" w16cid:durableId="1841193257">
-    <w:abstractNumId w:val="79"/>
+    <w:abstractNumId w:val="80"/>
   </w:num>
   <w:num w:numId="63" w16cid:durableId="682322850">
-    <w:abstractNumId w:val="149"/>
+    <w:abstractNumId w:val="151"/>
   </w:num>
   <w:num w:numId="64" w16cid:durableId="2043705333">
-    <w:abstractNumId w:val="80"/>
+    <w:abstractNumId w:val="81"/>
   </w:num>
   <w:num w:numId="65" w16cid:durableId="1164854761">
     <w:abstractNumId w:val="60"/>
   </w:num>
   <w:num w:numId="66" w16cid:durableId="1919972541">
-    <w:abstractNumId w:val="96"/>
+    <w:abstractNumId w:val="97"/>
   </w:num>
   <w:num w:numId="67" w16cid:durableId="463617329">
     <w:abstractNumId w:val="66"/>
   </w:num>
   <w:num w:numId="68" w16cid:durableId="2064014330">
-    <w:abstractNumId w:val="118"/>
+    <w:abstractNumId w:val="119"/>
   </w:num>
   <w:num w:numId="69" w16cid:durableId="452797354">
-    <w:abstractNumId w:val="125"/>
+    <w:abstractNumId w:val="126"/>
   </w:num>
   <w:num w:numId="70" w16cid:durableId="1196650037">
     <w:abstractNumId w:val="54"/>
   </w:num>
   <w:num w:numId="71" w16cid:durableId="940071828">
-    <w:abstractNumId w:val="161"/>
+    <w:abstractNumId w:val="163"/>
   </w:num>
   <w:num w:numId="72" w16cid:durableId="1608273926">
-    <w:abstractNumId w:val="81"/>
+    <w:abstractNumId w:val="82"/>
   </w:num>
   <w:num w:numId="73" w16cid:durableId="2009864772">
-    <w:abstractNumId w:val="98"/>
+    <w:abstractNumId w:val="99"/>
   </w:num>
   <w:num w:numId="74" w16cid:durableId="712267004">
     <w:abstractNumId w:val="40"/>
@@ -37383,7 +38767,7 @@
     <w:abstractNumId w:val="36"/>
   </w:num>
   <w:num w:numId="76" w16cid:durableId="286202349">
-    <w:abstractNumId w:val="130"/>
+    <w:abstractNumId w:val="131"/>
   </w:num>
   <w:num w:numId="77" w16cid:durableId="156460757">
     <w:abstractNumId w:val="73"/>
@@ -37398,7 +38782,7 @@
     <w:abstractNumId w:val="39"/>
   </w:num>
   <w:num w:numId="81" w16cid:durableId="1672175260">
-    <w:abstractNumId w:val="92"/>
+    <w:abstractNumId w:val="93"/>
   </w:num>
   <w:num w:numId="82" w16cid:durableId="1954820163">
     <w:abstractNumId w:val="64"/>
@@ -37407,7 +38791,7 @@
     <w:abstractNumId w:val="27"/>
   </w:num>
   <w:num w:numId="84" w16cid:durableId="366876741">
-    <w:abstractNumId w:val="101"/>
+    <w:abstractNumId w:val="102"/>
   </w:num>
   <w:num w:numId="85" w16cid:durableId="15274915">
     <w:abstractNumId w:val="43"/>
@@ -37416,22 +38800,22 @@
     <w:abstractNumId w:val="12"/>
   </w:num>
   <w:num w:numId="87" w16cid:durableId="591351385">
-    <w:abstractNumId w:val="115"/>
+    <w:abstractNumId w:val="116"/>
   </w:num>
   <w:num w:numId="88" w16cid:durableId="1361005725">
-    <w:abstractNumId w:val="165"/>
+    <w:abstractNumId w:val="167"/>
   </w:num>
   <w:num w:numId="89" w16cid:durableId="219681743">
     <w:abstractNumId w:val="13"/>
   </w:num>
   <w:num w:numId="90" w16cid:durableId="194386594">
-    <w:abstractNumId w:val="127"/>
+    <w:abstractNumId w:val="128"/>
   </w:num>
   <w:num w:numId="91" w16cid:durableId="777793346">
-    <w:abstractNumId w:val="90"/>
+    <w:abstractNumId w:val="91"/>
   </w:num>
   <w:num w:numId="92" w16cid:durableId="173346871">
-    <w:abstractNumId w:val="95"/>
+    <w:abstractNumId w:val="96"/>
   </w:num>
   <w:num w:numId="93" w16cid:durableId="948700467">
     <w:abstractNumId w:val="44"/>
@@ -37443,7 +38827,7 @@
     <w:abstractNumId w:val="74"/>
   </w:num>
   <w:num w:numId="96" w16cid:durableId="694119229">
-    <w:abstractNumId w:val="93"/>
+    <w:abstractNumId w:val="94"/>
   </w:num>
   <w:num w:numId="97" w16cid:durableId="704327987">
     <w:abstractNumId w:val="58"/>
@@ -37452,28 +38836,28 @@
     <w:abstractNumId w:val="28"/>
   </w:num>
   <w:num w:numId="99" w16cid:durableId="1706099794">
-    <w:abstractNumId w:val="151"/>
+    <w:abstractNumId w:val="153"/>
   </w:num>
   <w:num w:numId="100" w16cid:durableId="256404901">
-    <w:abstractNumId w:val="150"/>
+    <w:abstractNumId w:val="152"/>
   </w:num>
   <w:num w:numId="101" w16cid:durableId="924923012">
     <w:abstractNumId w:val="33"/>
   </w:num>
   <w:num w:numId="102" w16cid:durableId="536550966">
-    <w:abstractNumId w:val="166"/>
+    <w:abstractNumId w:val="168"/>
   </w:num>
   <w:num w:numId="103" w16cid:durableId="425157302">
     <w:abstractNumId w:val="75"/>
   </w:num>
   <w:num w:numId="104" w16cid:durableId="967664612">
-    <w:abstractNumId w:val="136"/>
+    <w:abstractNumId w:val="137"/>
   </w:num>
   <w:num w:numId="105" w16cid:durableId="361631616">
-    <w:abstractNumId w:val="103"/>
+    <w:abstractNumId w:val="104"/>
   </w:num>
   <w:num w:numId="106" w16cid:durableId="443623616">
-    <w:abstractNumId w:val="140"/>
+    <w:abstractNumId w:val="141"/>
   </w:num>
   <w:num w:numId="107" w16cid:durableId="150101619">
     <w:abstractNumId w:val="15"/>
@@ -37485,28 +38869,28 @@
     <w:abstractNumId w:val="0"/>
   </w:num>
   <w:num w:numId="110" w16cid:durableId="712924661">
-    <w:abstractNumId w:val="122"/>
+    <w:abstractNumId w:val="123"/>
   </w:num>
   <w:num w:numId="111" w16cid:durableId="1917784113">
-    <w:abstractNumId w:val="117"/>
+    <w:abstractNumId w:val="118"/>
   </w:num>
   <w:num w:numId="112" w16cid:durableId="896237065">
-    <w:abstractNumId w:val="128"/>
+    <w:abstractNumId w:val="129"/>
   </w:num>
   <w:num w:numId="113" w16cid:durableId="1171681430">
-    <w:abstractNumId w:val="154"/>
+    <w:abstractNumId w:val="156"/>
   </w:num>
   <w:num w:numId="114" w16cid:durableId="1552573199">
-    <w:abstractNumId w:val="155"/>
+    <w:abstractNumId w:val="157"/>
   </w:num>
   <w:num w:numId="115" w16cid:durableId="1920869674">
-    <w:abstractNumId w:val="138"/>
+    <w:abstractNumId w:val="139"/>
   </w:num>
   <w:num w:numId="116" w16cid:durableId="476724716">
-    <w:abstractNumId w:val="106"/>
+    <w:abstractNumId w:val="107"/>
   </w:num>
   <w:num w:numId="117" w16cid:durableId="658919541">
-    <w:abstractNumId w:val="105"/>
+    <w:abstractNumId w:val="106"/>
   </w:num>
   <w:num w:numId="118" w16cid:durableId="1622418131">
     <w:abstractNumId w:val="51"/>
@@ -37515,7 +38899,7 @@
     <w:abstractNumId w:val="3"/>
   </w:num>
   <w:num w:numId="120" w16cid:durableId="396828229">
-    <w:abstractNumId w:val="160"/>
+    <w:abstractNumId w:val="162"/>
   </w:num>
   <w:num w:numId="121" w16cid:durableId="986058889">
     <w:abstractNumId w:val="23"/>
@@ -37524,10 +38908,10 @@
     <w:abstractNumId w:val="68"/>
   </w:num>
   <w:num w:numId="123" w16cid:durableId="1804040304">
-    <w:abstractNumId w:val="89"/>
+    <w:abstractNumId w:val="90"/>
   </w:num>
   <w:num w:numId="124" w16cid:durableId="114181197">
-    <w:abstractNumId w:val="158"/>
+    <w:abstractNumId w:val="160"/>
   </w:num>
   <w:num w:numId="125" w16cid:durableId="772671624">
     <w:abstractNumId w:val="5"/>
@@ -37545,16 +38929,16 @@
     <w:abstractNumId w:val="67"/>
   </w:num>
   <w:num w:numId="130" w16cid:durableId="1168907903">
-    <w:abstractNumId w:val="142"/>
+    <w:abstractNumId w:val="143"/>
   </w:num>
   <w:num w:numId="131" w16cid:durableId="430206235">
-    <w:abstractNumId w:val="132"/>
+    <w:abstractNumId w:val="133"/>
   </w:num>
   <w:num w:numId="132" w16cid:durableId="1207327089">
     <w:abstractNumId w:val="32"/>
   </w:num>
   <w:num w:numId="133" w16cid:durableId="596404292">
-    <w:abstractNumId w:val="119"/>
+    <w:abstractNumId w:val="120"/>
   </w:num>
   <w:num w:numId="134" w16cid:durableId="2070372549">
     <w:abstractNumId w:val="48"/>
@@ -37569,25 +38953,25 @@
     <w:abstractNumId w:val="78"/>
   </w:num>
   <w:num w:numId="138" w16cid:durableId="568660900">
-    <w:abstractNumId w:val="85"/>
+    <w:abstractNumId w:val="86"/>
   </w:num>
   <w:num w:numId="139" w16cid:durableId="967976864">
-    <w:abstractNumId w:val="120"/>
+    <w:abstractNumId w:val="121"/>
   </w:num>
   <w:num w:numId="140" w16cid:durableId="650643288">
-    <w:abstractNumId w:val="137"/>
+    <w:abstractNumId w:val="138"/>
   </w:num>
   <w:num w:numId="141" w16cid:durableId="219370247">
-    <w:abstractNumId w:val="135"/>
+    <w:abstractNumId w:val="136"/>
   </w:num>
   <w:num w:numId="142" w16cid:durableId="323239876">
-    <w:abstractNumId w:val="169"/>
+    <w:abstractNumId w:val="171"/>
   </w:num>
   <w:num w:numId="143" w16cid:durableId="1619793156">
     <w:abstractNumId w:val="37"/>
   </w:num>
   <w:num w:numId="144" w16cid:durableId="1186332867">
-    <w:abstractNumId w:val="147"/>
+    <w:abstractNumId w:val="149"/>
   </w:num>
   <w:num w:numId="145" w16cid:durableId="89937035">
     <w:abstractNumId w:val="59"/>
@@ -37596,10 +38980,10 @@
     <w:abstractNumId w:val="1"/>
   </w:num>
   <w:num w:numId="147" w16cid:durableId="1760910030">
-    <w:abstractNumId w:val="111"/>
+    <w:abstractNumId w:val="112"/>
   </w:num>
   <w:num w:numId="148" w16cid:durableId="349307706">
-    <w:abstractNumId w:val="143"/>
+    <w:abstractNumId w:val="144"/>
   </w:num>
   <w:num w:numId="149" w16cid:durableId="1600336622">
     <w:abstractNumId w:val="35"/>
@@ -37611,10 +38995,10 @@
     <w:abstractNumId w:val="16"/>
   </w:num>
   <w:num w:numId="152" w16cid:durableId="1483890789">
-    <w:abstractNumId w:val="113"/>
+    <w:abstractNumId w:val="114"/>
   </w:num>
   <w:num w:numId="153" w16cid:durableId="2104719660">
-    <w:abstractNumId w:val="129"/>
+    <w:abstractNumId w:val="130"/>
   </w:num>
   <w:num w:numId="154" w16cid:durableId="2030252929">
     <w:abstractNumId w:val="55"/>
@@ -37629,13 +39013,13 @@
     <w:abstractNumId w:val="2"/>
   </w:num>
   <w:num w:numId="158" w16cid:durableId="1034845685">
-    <w:abstractNumId w:val="159"/>
+    <w:abstractNumId w:val="161"/>
   </w:num>
   <w:num w:numId="159" w16cid:durableId="1262639594">
     <w:abstractNumId w:val="65"/>
   </w:num>
   <w:num w:numId="160" w16cid:durableId="1640988115">
-    <w:abstractNumId w:val="123"/>
+    <w:abstractNumId w:val="124"/>
   </w:num>
   <w:num w:numId="161" w16cid:durableId="1536966176">
     <w:abstractNumId w:val="31"/>
@@ -37644,10 +39028,10 @@
     <w:abstractNumId w:val="63"/>
   </w:num>
   <w:num w:numId="163" w16cid:durableId="1025402036">
-    <w:abstractNumId w:val="121"/>
+    <w:abstractNumId w:val="122"/>
   </w:num>
   <w:num w:numId="164" w16cid:durableId="703671323">
-    <w:abstractNumId w:val="83"/>
+    <w:abstractNumId w:val="84"/>
   </w:num>
   <w:num w:numId="165" w16cid:durableId="410156013">
     <w:abstractNumId w:val="9"/>
@@ -37659,16 +39043,22 @@
     <w:abstractNumId w:val="11"/>
   </w:num>
   <w:num w:numId="168" w16cid:durableId="1639455099">
-    <w:abstractNumId w:val="97"/>
+    <w:abstractNumId w:val="98"/>
   </w:num>
   <w:num w:numId="169" w16cid:durableId="1382096019">
-    <w:abstractNumId w:val="164"/>
+    <w:abstractNumId w:val="166"/>
   </w:num>
   <w:num w:numId="170" w16cid:durableId="2092239844">
-    <w:abstractNumId w:val="141"/>
+    <w:abstractNumId w:val="142"/>
   </w:num>
   <w:num w:numId="171" w16cid:durableId="2061635092">
-    <w:abstractNumId w:val="100"/>
+    <w:abstractNumId w:val="101"/>
+  </w:num>
+  <w:num w:numId="172" w16cid:durableId="1761901452">
+    <w:abstractNumId w:val="147"/>
+  </w:num>
+  <w:num w:numId="173" w16cid:durableId="1674142607">
+    <w:abstractNumId w:val="79"/>
   </w:num>
 </w:numbering>
 </file>

</xml_diff>

<commit_message>
AI Service APIs (#401)
</commit_message>
<xml_diff>
--- a/API Design.docx
+++ b/API Design.docx
@@ -47,7 +47,15 @@
     </w:p>
     <w:p>
       <w:r>
-        <w:t>Before detailing the endpoints of the API it is critical to perform an analysis of API requirements in order to make sure that the provided services accurately correspond to the platform's business needs. Such analysis transforms the functional requirements specified in the Product Requirements Document (PRD) and use-case model into the set of well-designed service interfaces. Moreover, this step identifies clearly the owner of the business functionality assigning an appropriate backend service to each API as a result of implementation of the separation of concern principle in the proposed architecture.</w:t>
+        <w:t xml:space="preserve">Before detailing the endpoints of the </w:t>
+      </w:r>
+      <w:proofErr w:type="gramStart"/>
+      <w:r>
+        <w:t>API</w:t>
+      </w:r>
+      <w:proofErr w:type="gramEnd"/>
+      <w:r>
+        <w:t xml:space="preserve"> it is critical to perform an analysis of API requirements in order to make sure that the provided services accurately correspond to the platform's business needs. Such analysis transforms the functional requirements specified in the Product Requirements Document (PRD) and use-case model into the set of well-designed service interfaces. Moreover, this step identifies clearly the owner of the business functionality assigning an appropriate backend service to each API as a result of implementation of the separation of concern principle in the proposed architecture.</w:t>
       </w:r>
     </w:p>
     <w:p>
@@ -6186,7 +6194,15 @@
     </w:p>
     <w:p>
       <w:r>
-        <w:t>The above mentioned workflow makes sure of the consistency of processing and synchronization of vehicle availability, payment, and customer notifications.</w:t>
+        <w:t xml:space="preserve">The </w:t>
+      </w:r>
+      <w:proofErr w:type="gramStart"/>
+      <w:r>
+        <w:t>above mentioned</w:t>
+      </w:r>
+      <w:proofErr w:type="gramEnd"/>
+      <w:r>
+        <w:t xml:space="preserve"> workflow makes sure of the consistency of processing and synchronization of vehicle availability, payment, and customer notifications.</w:t>
       </w:r>
     </w:p>
     <w:p>
@@ -15902,7 +15918,15 @@
     </w:p>
     <w:p>
       <w:r>
-        <w:t>The Payment Integration APIs contain all the functionalities necessary to process secure payments via the KriGo platform. They establish connections between the platform and third party payment gateways. With their help, clients can pay for the reservation, get a refund, and check the transaction status.</w:t>
+        <w:t xml:space="preserve">The Payment Integration APIs contain all the functionalities necessary to process secure payments via the KriGo platform. They establish connections between the platform and </w:t>
+      </w:r>
+      <w:proofErr w:type="gramStart"/>
+      <w:r>
+        <w:t>third party</w:t>
+      </w:r>
+      <w:proofErr w:type="gramEnd"/>
+      <w:r>
+        <w:t xml:space="preserve"> payment gateways. With their help, clients can pay for the reservation, get a refund, and check the transaction status.</w:t>
       </w:r>
     </w:p>
     <w:p>
@@ -17057,10 +17081,1175 @@
     <w:p/>
     <w:p/>
     <w:p/>
+    <w:p>
+      <w:pPr>
+        <w:pStyle w:val="Heading3"/>
+      </w:pPr>
+      <w:r>
+        <w:lastRenderedPageBreak/>
+        <w:t>AI Service APIs</w:t>
+      </w:r>
+    </w:p>
+    <w:p>
+      <w:r>
+        <w:t>The AI Service APIs contain the features required for implementing artificial intelligence within the KriGo platform. Some of the features provided by AI services include personalized vehicle recommendations, semantic vehicle search, natural language processing, predictive analytics, and automated customer support. Using AI services, the platform will improve the user experience, increase efficiency and make data-driven decisions for its customers, rental agencies and administrators.</w:t>
+      </w:r>
+    </w:p>
+    <w:p>
+      <w:r>
+        <w:t>The AI Service APIs are built based on RESTful architecture principles and provide the communication interface between the platform and AI services used either externally or deployed within the platform itself. Communication between application services and AI engine takes place using JSON format over HTTPS protocol to ensure secure and reliable communication. As AI services operate independently from the business logic, they can be changed, upgraded or scaled up/down without interfering other parts of the platform.</w:t>
+      </w:r>
+    </w:p>
+    <w:p>
+      <w:r>
+        <w:t>Authentication for the AI service requests is done by using JSON Web Token (JWT). Authorization is done based on the role of the requesting user. Endpoints used by customers provide personalized recommendations and intelligent vehicle search while endpoints used by rental agencies and administrators are focused on analytics, forecasting and operational insights. To ensure security and privacy of personal information, only the required minimum business data is sent to the AI service and all the communication channels are secured by TLS.</w:t>
+      </w:r>
+    </w:p>
+    <w:p>
+      <w:r>
+        <w:t>AI Service works with several backend services which include Vehicle Search Service, Reservation Service, Customer Service, Reporting Service and Notification Service. Intelligent recommendations and predictions are made based on the analysis of the vehicle information, reservation history, customer preferences and operational statistics. The results generated by the AI service are sent back to the requesting service and shown to the users via web or mobile application.</w:t>
+      </w:r>
+    </w:p>
+    <w:p>
+      <w:pPr>
+        <w:pStyle w:val="Title"/>
+      </w:pPr>
+      <w:r>
+        <w:t>AI Service API Endpoints</w:t>
+      </w:r>
+    </w:p>
+    <w:p>
+      <w:pPr>
+        <w:pStyle w:val="Caption"/>
+        <w:keepNext/>
+      </w:pPr>
+      <w:r>
+        <w:t xml:space="preserve">Table </w:t>
+      </w:r>
+      <w:r>
+        <w:fldChar w:fldCharType="begin"/>
+      </w:r>
+      <w:r>
+        <w:instrText xml:space="preserve"> SEQ Table \* ARABIC </w:instrText>
+      </w:r>
+      <w:r>
+        <w:fldChar w:fldCharType="separate"/>
+      </w:r>
+      <w:r>
+        <w:rPr>
+          <w:noProof/>
+        </w:rPr>
+        <w:t>16</w:t>
+      </w:r>
+      <w:r>
+        <w:fldChar w:fldCharType="end"/>
+      </w:r>
+      <w:r>
+        <w:t xml:space="preserve"> - </w:t>
+      </w:r>
+      <w:r>
+        <w:t>AI Service API Endpoints</w:t>
+      </w:r>
+    </w:p>
+    <w:tbl>
+      <w:tblPr>
+        <w:tblStyle w:val="PlainTable1"/>
+        <w:tblW w:w="0" w:type="auto"/>
+        <w:tblCellMar>
+          <w:top w:w="72" w:type="dxa"/>
+          <w:bottom w:w="72" w:type="dxa"/>
+        </w:tblCellMar>
+        <w:tblLook w:val="04A0" w:firstRow="1" w:lastRow="0" w:firstColumn="1" w:lastColumn="0" w:noHBand="0" w:noVBand="1"/>
+      </w:tblPr>
+      <w:tblGrid>
+        <w:gridCol w:w="4096"/>
+        <w:gridCol w:w="1016"/>
+        <w:gridCol w:w="3498"/>
+        <w:gridCol w:w="737"/>
+      </w:tblGrid>
+      <w:tr>
+        <w:trPr>
+          <w:cnfStyle w:val="100000000000" w:firstRow="1" w:lastRow="0" w:firstColumn="0" w:lastColumn="0" w:oddVBand="0" w:evenVBand="0" w:oddHBand="0" w:evenHBand="0" w:firstRowFirstColumn="0" w:firstRowLastColumn="0" w:lastRowFirstColumn="0" w:lastRowLastColumn="0"/>
+          <w:tblHeader/>
+        </w:trPr>
+        <w:tc>
+          <w:tcPr>
+            <w:cnfStyle w:val="001000000000" w:firstRow="0" w:lastRow="0" w:firstColumn="1" w:lastColumn="0" w:oddVBand="0" w:evenVBand="0" w:oddHBand="0" w:evenHBand="0" w:firstRowFirstColumn="0" w:firstRowLastColumn="0" w:lastRowFirstColumn="0" w:lastRowLastColumn="0"/>
+            <w:tcW w:w="0" w:type="auto"/>
+            <w:vAlign w:val="center"/>
+            <w:hideMark/>
+          </w:tcPr>
+          <w:p>
+            <w:r>
+              <w:t>Endpoint</w:t>
+            </w:r>
+          </w:p>
+        </w:tc>
+        <w:tc>
+          <w:tcPr>
+            <w:tcW w:w="0" w:type="auto"/>
+            <w:vAlign w:val="center"/>
+            <w:hideMark/>
+          </w:tcPr>
+          <w:p>
+            <w:pPr>
+              <w:jc w:val="center"/>
+              <w:cnfStyle w:val="100000000000" w:firstRow="1" w:lastRow="0" w:firstColumn="0" w:lastColumn="0" w:oddVBand="0" w:evenVBand="0" w:oddHBand="0" w:evenHBand="0" w:firstRowFirstColumn="0" w:firstRowLastColumn="0" w:lastRowFirstColumn="0" w:lastRowLastColumn="0"/>
+            </w:pPr>
+            <w:r>
+              <w:t>Method</w:t>
+            </w:r>
+          </w:p>
+        </w:tc>
+        <w:tc>
+          <w:tcPr>
+            <w:tcW w:w="0" w:type="auto"/>
+            <w:vAlign w:val="center"/>
+            <w:hideMark/>
+          </w:tcPr>
+          <w:p>
+            <w:pPr>
+              <w:cnfStyle w:val="100000000000" w:firstRow="1" w:lastRow="0" w:firstColumn="0" w:lastColumn="0" w:oddVBand="0" w:evenVBand="0" w:oddHBand="0" w:evenHBand="0" w:firstRowFirstColumn="0" w:firstRowLastColumn="0" w:lastRowFirstColumn="0" w:lastRowLastColumn="0"/>
+            </w:pPr>
+            <w:r>
+              <w:t>Description</w:t>
+            </w:r>
+          </w:p>
+        </w:tc>
+        <w:tc>
+          <w:tcPr>
+            <w:tcW w:w="0" w:type="auto"/>
+            <w:vAlign w:val="center"/>
+            <w:hideMark/>
+          </w:tcPr>
+          <w:p>
+            <w:pPr>
+              <w:jc w:val="center"/>
+              <w:cnfStyle w:val="100000000000" w:firstRow="1" w:lastRow="0" w:firstColumn="0" w:lastColumn="0" w:oddVBand="0" w:evenVBand="0" w:oddHBand="0" w:evenHBand="0" w:firstRowFirstColumn="0" w:firstRowLastColumn="0" w:lastRowFirstColumn="0" w:lastRowLastColumn="0"/>
+            </w:pPr>
+            <w:r>
+              <w:t>Auth</w:t>
+            </w:r>
+          </w:p>
+        </w:tc>
+      </w:tr>
+      <w:tr>
+        <w:trPr>
+          <w:cnfStyle w:val="000000100000" w:firstRow="0" w:lastRow="0" w:firstColumn="0" w:lastColumn="0" w:oddVBand="0" w:evenVBand="0" w:oddHBand="1" w:evenHBand="0" w:firstRowFirstColumn="0" w:firstRowLastColumn="0" w:lastRowFirstColumn="0" w:lastRowLastColumn="0"/>
+        </w:trPr>
+        <w:tc>
+          <w:tcPr>
+            <w:cnfStyle w:val="001000000000" w:firstRow="0" w:lastRow="0" w:firstColumn="1" w:lastColumn="0" w:oddVBand="0" w:evenVBand="0" w:oddHBand="0" w:evenHBand="0" w:firstRowFirstColumn="0" w:firstRowLastColumn="0" w:lastRowFirstColumn="0" w:lastRowLastColumn="0"/>
+            <w:tcW w:w="0" w:type="auto"/>
+            <w:vAlign w:val="center"/>
+            <w:hideMark/>
+          </w:tcPr>
+          <w:p>
+            <w:pPr>
+              <w:rPr>
+                <w:b w:val="0"/>
+                <w:bCs w:val="0"/>
+              </w:rPr>
+            </w:pPr>
+            <w:r>
+              <w:rPr>
+                <w:b w:val="0"/>
+                <w:bCs w:val="0"/>
+              </w:rPr>
+              <w:t>/api/v1/integrations/ai/recommendations</w:t>
+            </w:r>
+          </w:p>
+        </w:tc>
+        <w:tc>
+          <w:tcPr>
+            <w:tcW w:w="0" w:type="auto"/>
+            <w:vAlign w:val="center"/>
+            <w:hideMark/>
+          </w:tcPr>
+          <w:p>
+            <w:pPr>
+              <w:jc w:val="center"/>
+              <w:cnfStyle w:val="000000100000" w:firstRow="0" w:lastRow="0" w:firstColumn="0" w:lastColumn="0" w:oddVBand="0" w:evenVBand="0" w:oddHBand="1" w:evenHBand="0" w:firstRowFirstColumn="0" w:firstRowLastColumn="0" w:lastRowFirstColumn="0" w:lastRowLastColumn="0"/>
+            </w:pPr>
+            <w:r>
+              <w:t>POST</w:t>
+            </w:r>
+          </w:p>
+        </w:tc>
+        <w:tc>
+          <w:tcPr>
+            <w:tcW w:w="0" w:type="auto"/>
+            <w:vAlign w:val="center"/>
+            <w:hideMark/>
+          </w:tcPr>
+          <w:p>
+            <w:pPr>
+              <w:cnfStyle w:val="000000100000" w:firstRow="0" w:lastRow="0" w:firstColumn="0" w:lastColumn="0" w:oddVBand="0" w:evenVBand="0" w:oddHBand="1" w:evenHBand="0" w:firstRowFirstColumn="0" w:firstRowLastColumn="0" w:lastRowFirstColumn="0" w:lastRowLastColumn="0"/>
+            </w:pPr>
+            <w:r>
+              <w:t>Generate personalized vehicle recommendations</w:t>
+            </w:r>
+          </w:p>
+        </w:tc>
+        <w:tc>
+          <w:tcPr>
+            <w:tcW w:w="0" w:type="auto"/>
+            <w:vAlign w:val="center"/>
+            <w:hideMark/>
+          </w:tcPr>
+          <w:p>
+            <w:pPr>
+              <w:jc w:val="center"/>
+              <w:cnfStyle w:val="000000100000" w:firstRow="0" w:lastRow="0" w:firstColumn="0" w:lastColumn="0" w:oddVBand="0" w:evenVBand="0" w:oddHBand="1" w:evenHBand="0" w:firstRowFirstColumn="0" w:firstRowLastColumn="0" w:lastRowFirstColumn="0" w:lastRowLastColumn="0"/>
+            </w:pPr>
+            <w:r>
+              <w:t>Yes</w:t>
+            </w:r>
+          </w:p>
+        </w:tc>
+      </w:tr>
+      <w:tr>
+        <w:tc>
+          <w:tcPr>
+            <w:cnfStyle w:val="001000000000" w:firstRow="0" w:lastRow="0" w:firstColumn="1" w:lastColumn="0" w:oddVBand="0" w:evenVBand="0" w:oddHBand="0" w:evenHBand="0" w:firstRowFirstColumn="0" w:firstRowLastColumn="0" w:lastRowFirstColumn="0" w:lastRowLastColumn="0"/>
+            <w:tcW w:w="0" w:type="auto"/>
+            <w:vAlign w:val="center"/>
+            <w:hideMark/>
+          </w:tcPr>
+          <w:p>
+            <w:pPr>
+              <w:rPr>
+                <w:b w:val="0"/>
+                <w:bCs w:val="0"/>
+              </w:rPr>
+            </w:pPr>
+            <w:r>
+              <w:rPr>
+                <w:b w:val="0"/>
+                <w:bCs w:val="0"/>
+              </w:rPr>
+              <w:t>/api/v1/integrations/ai/search</w:t>
+            </w:r>
+          </w:p>
+        </w:tc>
+        <w:tc>
+          <w:tcPr>
+            <w:tcW w:w="0" w:type="auto"/>
+            <w:vAlign w:val="center"/>
+            <w:hideMark/>
+          </w:tcPr>
+          <w:p>
+            <w:pPr>
+              <w:jc w:val="center"/>
+              <w:cnfStyle w:val="000000000000" w:firstRow="0" w:lastRow="0" w:firstColumn="0" w:lastColumn="0" w:oddVBand="0" w:evenVBand="0" w:oddHBand="0" w:evenHBand="0" w:firstRowFirstColumn="0" w:firstRowLastColumn="0" w:lastRowFirstColumn="0" w:lastRowLastColumn="0"/>
+            </w:pPr>
+            <w:r>
+              <w:t>POST</w:t>
+            </w:r>
+          </w:p>
+        </w:tc>
+        <w:tc>
+          <w:tcPr>
+            <w:tcW w:w="0" w:type="auto"/>
+            <w:vAlign w:val="center"/>
+            <w:hideMark/>
+          </w:tcPr>
+          <w:p>
+            <w:pPr>
+              <w:cnfStyle w:val="000000000000" w:firstRow="0" w:lastRow="0" w:firstColumn="0" w:lastColumn="0" w:oddVBand="0" w:evenVBand="0" w:oddHBand="0" w:evenHBand="0" w:firstRowFirstColumn="0" w:firstRowLastColumn="0" w:lastRowFirstColumn="0" w:lastRowLastColumn="0"/>
+            </w:pPr>
+            <w:r>
+              <w:t>Perform AI-powered semantic vehicle search</w:t>
+            </w:r>
+          </w:p>
+        </w:tc>
+        <w:tc>
+          <w:tcPr>
+            <w:tcW w:w="0" w:type="auto"/>
+            <w:vAlign w:val="center"/>
+            <w:hideMark/>
+          </w:tcPr>
+          <w:p>
+            <w:pPr>
+              <w:jc w:val="center"/>
+              <w:cnfStyle w:val="000000000000" w:firstRow="0" w:lastRow="0" w:firstColumn="0" w:lastColumn="0" w:oddVBand="0" w:evenVBand="0" w:oddHBand="0" w:evenHBand="0" w:firstRowFirstColumn="0" w:firstRowLastColumn="0" w:lastRowFirstColumn="0" w:lastRowLastColumn="0"/>
+            </w:pPr>
+            <w:r>
+              <w:t>Yes</w:t>
+            </w:r>
+          </w:p>
+        </w:tc>
+      </w:tr>
+      <w:tr>
+        <w:trPr>
+          <w:cnfStyle w:val="000000100000" w:firstRow="0" w:lastRow="0" w:firstColumn="0" w:lastColumn="0" w:oddVBand="0" w:evenVBand="0" w:oddHBand="1" w:evenHBand="0" w:firstRowFirstColumn="0" w:firstRowLastColumn="0" w:lastRowFirstColumn="0" w:lastRowLastColumn="0"/>
+        </w:trPr>
+        <w:tc>
+          <w:tcPr>
+            <w:cnfStyle w:val="001000000000" w:firstRow="0" w:lastRow="0" w:firstColumn="1" w:lastColumn="0" w:oddVBand="0" w:evenVBand="0" w:oddHBand="0" w:evenHBand="0" w:firstRowFirstColumn="0" w:firstRowLastColumn="0" w:lastRowFirstColumn="0" w:lastRowLastColumn="0"/>
+            <w:tcW w:w="0" w:type="auto"/>
+            <w:vAlign w:val="center"/>
+            <w:hideMark/>
+          </w:tcPr>
+          <w:p>
+            <w:pPr>
+              <w:rPr>
+                <w:b w:val="0"/>
+                <w:bCs w:val="0"/>
+              </w:rPr>
+            </w:pPr>
+            <w:r>
+              <w:rPr>
+                <w:b w:val="0"/>
+                <w:bCs w:val="0"/>
+              </w:rPr>
+              <w:t>/api/v1/integrations/ai/chat</w:t>
+            </w:r>
+          </w:p>
+        </w:tc>
+        <w:tc>
+          <w:tcPr>
+            <w:tcW w:w="0" w:type="auto"/>
+            <w:vAlign w:val="center"/>
+            <w:hideMark/>
+          </w:tcPr>
+          <w:p>
+            <w:pPr>
+              <w:jc w:val="center"/>
+              <w:cnfStyle w:val="000000100000" w:firstRow="0" w:lastRow="0" w:firstColumn="0" w:lastColumn="0" w:oddVBand="0" w:evenVBand="0" w:oddHBand="1" w:evenHBand="0" w:firstRowFirstColumn="0" w:firstRowLastColumn="0" w:lastRowFirstColumn="0" w:lastRowLastColumn="0"/>
+            </w:pPr>
+            <w:r>
+              <w:t>POST</w:t>
+            </w:r>
+          </w:p>
+        </w:tc>
+        <w:tc>
+          <w:tcPr>
+            <w:tcW w:w="0" w:type="auto"/>
+            <w:vAlign w:val="center"/>
+            <w:hideMark/>
+          </w:tcPr>
+          <w:p>
+            <w:pPr>
+              <w:cnfStyle w:val="000000100000" w:firstRow="0" w:lastRow="0" w:firstColumn="0" w:lastColumn="0" w:oddVBand="0" w:evenVBand="0" w:oddHBand="1" w:evenHBand="0" w:firstRowFirstColumn="0" w:firstRowLastColumn="0" w:lastRowFirstColumn="0" w:lastRowLastColumn="0"/>
+            </w:pPr>
+            <w:r>
+              <w:t>Process customer chatbot requests</w:t>
+            </w:r>
+          </w:p>
+        </w:tc>
+        <w:tc>
+          <w:tcPr>
+            <w:tcW w:w="0" w:type="auto"/>
+            <w:vAlign w:val="center"/>
+            <w:hideMark/>
+          </w:tcPr>
+          <w:p>
+            <w:pPr>
+              <w:jc w:val="center"/>
+              <w:cnfStyle w:val="000000100000" w:firstRow="0" w:lastRow="0" w:firstColumn="0" w:lastColumn="0" w:oddVBand="0" w:evenVBand="0" w:oddHBand="1" w:evenHBand="0" w:firstRowFirstColumn="0" w:firstRowLastColumn="0" w:lastRowFirstColumn="0" w:lastRowLastColumn="0"/>
+            </w:pPr>
+            <w:r>
+              <w:t>Yes</w:t>
+            </w:r>
+          </w:p>
+        </w:tc>
+      </w:tr>
+      <w:tr>
+        <w:tc>
+          <w:tcPr>
+            <w:cnfStyle w:val="001000000000" w:firstRow="0" w:lastRow="0" w:firstColumn="1" w:lastColumn="0" w:oddVBand="0" w:evenVBand="0" w:oddHBand="0" w:evenHBand="0" w:firstRowFirstColumn="0" w:firstRowLastColumn="0" w:lastRowFirstColumn="0" w:lastRowLastColumn="0"/>
+            <w:tcW w:w="0" w:type="auto"/>
+            <w:vAlign w:val="center"/>
+            <w:hideMark/>
+          </w:tcPr>
+          <w:p>
+            <w:pPr>
+              <w:rPr>
+                <w:b w:val="0"/>
+                <w:bCs w:val="0"/>
+              </w:rPr>
+            </w:pPr>
+            <w:r>
+              <w:rPr>
+                <w:b w:val="0"/>
+                <w:bCs w:val="0"/>
+              </w:rPr>
+              <w:t>/api/v1/integrations/ai/demand-forecast</w:t>
+            </w:r>
+          </w:p>
+        </w:tc>
+        <w:tc>
+          <w:tcPr>
+            <w:tcW w:w="0" w:type="auto"/>
+            <w:vAlign w:val="center"/>
+            <w:hideMark/>
+          </w:tcPr>
+          <w:p>
+            <w:pPr>
+              <w:jc w:val="center"/>
+              <w:cnfStyle w:val="000000000000" w:firstRow="0" w:lastRow="0" w:firstColumn="0" w:lastColumn="0" w:oddVBand="0" w:evenVBand="0" w:oddHBand="0" w:evenHBand="0" w:firstRowFirstColumn="0" w:firstRowLastColumn="0" w:lastRowFirstColumn="0" w:lastRowLastColumn="0"/>
+            </w:pPr>
+            <w:r>
+              <w:t>GET</w:t>
+            </w:r>
+          </w:p>
+        </w:tc>
+        <w:tc>
+          <w:tcPr>
+            <w:tcW w:w="0" w:type="auto"/>
+            <w:vAlign w:val="center"/>
+            <w:hideMark/>
+          </w:tcPr>
+          <w:p>
+            <w:pPr>
+              <w:cnfStyle w:val="000000000000" w:firstRow="0" w:lastRow="0" w:firstColumn="0" w:lastColumn="0" w:oddVBand="0" w:evenVBand="0" w:oddHBand="0" w:evenHBand="0" w:firstRowFirstColumn="0" w:firstRowLastColumn="0" w:lastRowFirstColumn="0" w:lastRowLastColumn="0"/>
+            </w:pPr>
+            <w:r>
+              <w:t>Retrieve vehicle demand predictions</w:t>
+            </w:r>
+          </w:p>
+        </w:tc>
+        <w:tc>
+          <w:tcPr>
+            <w:tcW w:w="0" w:type="auto"/>
+            <w:vAlign w:val="center"/>
+            <w:hideMark/>
+          </w:tcPr>
+          <w:p>
+            <w:pPr>
+              <w:jc w:val="center"/>
+              <w:cnfStyle w:val="000000000000" w:firstRow="0" w:lastRow="0" w:firstColumn="0" w:lastColumn="0" w:oddVBand="0" w:evenVBand="0" w:oddHBand="0" w:evenHBand="0" w:firstRowFirstColumn="0" w:firstRowLastColumn="0" w:lastRowFirstColumn="0" w:lastRowLastColumn="0"/>
+            </w:pPr>
+            <w:r>
+              <w:t>Yes</w:t>
+            </w:r>
+          </w:p>
+        </w:tc>
+      </w:tr>
+      <w:tr>
+        <w:trPr>
+          <w:cnfStyle w:val="000000100000" w:firstRow="0" w:lastRow="0" w:firstColumn="0" w:lastColumn="0" w:oddVBand="0" w:evenVBand="0" w:oddHBand="1" w:evenHBand="0" w:firstRowFirstColumn="0" w:firstRowLastColumn="0" w:lastRowFirstColumn="0" w:lastRowLastColumn="0"/>
+        </w:trPr>
+        <w:tc>
+          <w:tcPr>
+            <w:cnfStyle w:val="001000000000" w:firstRow="0" w:lastRow="0" w:firstColumn="1" w:lastColumn="0" w:oddVBand="0" w:evenVBand="0" w:oddHBand="0" w:evenHBand="0" w:firstRowFirstColumn="0" w:firstRowLastColumn="0" w:lastRowFirstColumn="0" w:lastRowLastColumn="0"/>
+            <w:tcW w:w="0" w:type="auto"/>
+            <w:vAlign w:val="center"/>
+            <w:hideMark/>
+          </w:tcPr>
+          <w:p>
+            <w:pPr>
+              <w:rPr>
+                <w:b w:val="0"/>
+                <w:bCs w:val="0"/>
+              </w:rPr>
+            </w:pPr>
+            <w:r>
+              <w:rPr>
+                <w:b w:val="0"/>
+                <w:bCs w:val="0"/>
+              </w:rPr>
+              <w:t>/api/v1/integrations/ai/pricing</w:t>
+            </w:r>
+          </w:p>
+        </w:tc>
+        <w:tc>
+          <w:tcPr>
+            <w:tcW w:w="0" w:type="auto"/>
+            <w:vAlign w:val="center"/>
+            <w:hideMark/>
+          </w:tcPr>
+          <w:p>
+            <w:pPr>
+              <w:jc w:val="center"/>
+              <w:cnfStyle w:val="000000100000" w:firstRow="0" w:lastRow="0" w:firstColumn="0" w:lastColumn="0" w:oddVBand="0" w:evenVBand="0" w:oddHBand="1" w:evenHBand="0" w:firstRowFirstColumn="0" w:firstRowLastColumn="0" w:lastRowFirstColumn="0" w:lastRowLastColumn="0"/>
+            </w:pPr>
+            <w:r>
+              <w:t>GET</w:t>
+            </w:r>
+          </w:p>
+        </w:tc>
+        <w:tc>
+          <w:tcPr>
+            <w:tcW w:w="0" w:type="auto"/>
+            <w:vAlign w:val="center"/>
+            <w:hideMark/>
+          </w:tcPr>
+          <w:p>
+            <w:pPr>
+              <w:cnfStyle w:val="000000100000" w:firstRow="0" w:lastRow="0" w:firstColumn="0" w:lastColumn="0" w:oddVBand="0" w:evenVBand="0" w:oddHBand="1" w:evenHBand="0" w:firstRowFirstColumn="0" w:firstRowLastColumn="0" w:lastRowFirstColumn="0" w:lastRowLastColumn="0"/>
+            </w:pPr>
+            <w:r>
+              <w:t>Generate intelligent pricing recommendations</w:t>
+            </w:r>
+          </w:p>
+        </w:tc>
+        <w:tc>
+          <w:tcPr>
+            <w:tcW w:w="0" w:type="auto"/>
+            <w:vAlign w:val="center"/>
+            <w:hideMark/>
+          </w:tcPr>
+          <w:p>
+            <w:pPr>
+              <w:jc w:val="center"/>
+              <w:cnfStyle w:val="000000100000" w:firstRow="0" w:lastRow="0" w:firstColumn="0" w:lastColumn="0" w:oddVBand="0" w:evenVBand="0" w:oddHBand="1" w:evenHBand="0" w:firstRowFirstColumn="0" w:firstRowLastColumn="0" w:lastRowFirstColumn="0" w:lastRowLastColumn="0"/>
+            </w:pPr>
+            <w:r>
+              <w:t>Yes</w:t>
+            </w:r>
+          </w:p>
+        </w:tc>
+      </w:tr>
+      <w:tr>
+        <w:tc>
+          <w:tcPr>
+            <w:cnfStyle w:val="001000000000" w:firstRow="0" w:lastRow="0" w:firstColumn="1" w:lastColumn="0" w:oddVBand="0" w:evenVBand="0" w:oddHBand="0" w:evenHBand="0" w:firstRowFirstColumn="0" w:firstRowLastColumn="0" w:lastRowFirstColumn="0" w:lastRowLastColumn="0"/>
+            <w:tcW w:w="0" w:type="auto"/>
+            <w:vAlign w:val="center"/>
+            <w:hideMark/>
+          </w:tcPr>
+          <w:p>
+            <w:pPr>
+              <w:rPr>
+                <w:b w:val="0"/>
+                <w:bCs w:val="0"/>
+              </w:rPr>
+            </w:pPr>
+            <w:r>
+              <w:rPr>
+                <w:b w:val="0"/>
+                <w:bCs w:val="0"/>
+              </w:rPr>
+              <w:t>/api/v1/integrations/ai/sentiment</w:t>
+            </w:r>
+          </w:p>
+        </w:tc>
+        <w:tc>
+          <w:tcPr>
+            <w:tcW w:w="0" w:type="auto"/>
+            <w:vAlign w:val="center"/>
+            <w:hideMark/>
+          </w:tcPr>
+          <w:p>
+            <w:pPr>
+              <w:jc w:val="center"/>
+              <w:cnfStyle w:val="000000000000" w:firstRow="0" w:lastRow="0" w:firstColumn="0" w:lastColumn="0" w:oddVBand="0" w:evenVBand="0" w:oddHBand="0" w:evenHBand="0" w:firstRowFirstColumn="0" w:firstRowLastColumn="0" w:lastRowFirstColumn="0" w:lastRowLastColumn="0"/>
+            </w:pPr>
+            <w:r>
+              <w:t>POST</w:t>
+            </w:r>
+          </w:p>
+        </w:tc>
+        <w:tc>
+          <w:tcPr>
+            <w:tcW w:w="0" w:type="auto"/>
+            <w:vAlign w:val="center"/>
+            <w:hideMark/>
+          </w:tcPr>
+          <w:p>
+            <w:pPr>
+              <w:cnfStyle w:val="000000000000" w:firstRow="0" w:lastRow="0" w:firstColumn="0" w:lastColumn="0" w:oddVBand="0" w:evenVBand="0" w:oddHBand="0" w:evenHBand="0" w:firstRowFirstColumn="0" w:firstRowLastColumn="0" w:lastRowFirstColumn="0" w:lastRowLastColumn="0"/>
+            </w:pPr>
+            <w:r>
+              <w:t>Analyze customer reviews and feedback</w:t>
+            </w:r>
+          </w:p>
+        </w:tc>
+        <w:tc>
+          <w:tcPr>
+            <w:tcW w:w="0" w:type="auto"/>
+            <w:vAlign w:val="center"/>
+            <w:hideMark/>
+          </w:tcPr>
+          <w:p>
+            <w:pPr>
+              <w:jc w:val="center"/>
+              <w:cnfStyle w:val="000000000000" w:firstRow="0" w:lastRow="0" w:firstColumn="0" w:lastColumn="0" w:oddVBand="0" w:evenVBand="0" w:oddHBand="0" w:evenHBand="0" w:firstRowFirstColumn="0" w:firstRowLastColumn="0" w:lastRowFirstColumn="0" w:lastRowLastColumn="0"/>
+            </w:pPr>
+            <w:r>
+              <w:t>Yes</w:t>
+            </w:r>
+          </w:p>
+        </w:tc>
+      </w:tr>
+      <w:tr>
+        <w:trPr>
+          <w:cnfStyle w:val="000000100000" w:firstRow="0" w:lastRow="0" w:firstColumn="0" w:lastColumn="0" w:oddVBand="0" w:evenVBand="0" w:oddHBand="1" w:evenHBand="0" w:firstRowFirstColumn="0" w:firstRowLastColumn="0" w:lastRowFirstColumn="0" w:lastRowLastColumn="0"/>
+        </w:trPr>
+        <w:tc>
+          <w:tcPr>
+            <w:cnfStyle w:val="001000000000" w:firstRow="0" w:lastRow="0" w:firstColumn="1" w:lastColumn="0" w:oddVBand="0" w:evenVBand="0" w:oddHBand="0" w:evenHBand="0" w:firstRowFirstColumn="0" w:firstRowLastColumn="0" w:lastRowFirstColumn="0" w:lastRowLastColumn="0"/>
+            <w:tcW w:w="0" w:type="auto"/>
+            <w:vAlign w:val="center"/>
+            <w:hideMark/>
+          </w:tcPr>
+          <w:p>
+            <w:pPr>
+              <w:rPr>
+                <w:b w:val="0"/>
+                <w:bCs w:val="0"/>
+              </w:rPr>
+            </w:pPr>
+            <w:r>
+              <w:rPr>
+                <w:b w:val="0"/>
+                <w:bCs w:val="0"/>
+              </w:rPr>
+              <w:t>/api/v1/integrations/ai/insights</w:t>
+            </w:r>
+          </w:p>
+        </w:tc>
+        <w:tc>
+          <w:tcPr>
+            <w:tcW w:w="0" w:type="auto"/>
+            <w:vAlign w:val="center"/>
+            <w:hideMark/>
+          </w:tcPr>
+          <w:p>
+            <w:pPr>
+              <w:jc w:val="center"/>
+              <w:cnfStyle w:val="000000100000" w:firstRow="0" w:lastRow="0" w:firstColumn="0" w:lastColumn="0" w:oddVBand="0" w:evenVBand="0" w:oddHBand="1" w:evenHBand="0" w:firstRowFirstColumn="0" w:firstRowLastColumn="0" w:lastRowFirstColumn="0" w:lastRowLastColumn="0"/>
+            </w:pPr>
+            <w:r>
+              <w:t>GET</w:t>
+            </w:r>
+          </w:p>
+        </w:tc>
+        <w:tc>
+          <w:tcPr>
+            <w:tcW w:w="0" w:type="auto"/>
+            <w:vAlign w:val="center"/>
+            <w:hideMark/>
+          </w:tcPr>
+          <w:p>
+            <w:pPr>
+              <w:cnfStyle w:val="000000100000" w:firstRow="0" w:lastRow="0" w:firstColumn="0" w:lastColumn="0" w:oddVBand="0" w:evenVBand="0" w:oddHBand="1" w:evenHBand="0" w:firstRowFirstColumn="0" w:firstRowLastColumn="0" w:lastRowFirstColumn="0" w:lastRowLastColumn="0"/>
+            </w:pPr>
+            <w:r>
+              <w:t>Retrieve operational AI insights</w:t>
+            </w:r>
+          </w:p>
+        </w:tc>
+        <w:tc>
+          <w:tcPr>
+            <w:tcW w:w="0" w:type="auto"/>
+            <w:vAlign w:val="center"/>
+            <w:hideMark/>
+          </w:tcPr>
+          <w:p>
+            <w:pPr>
+              <w:jc w:val="center"/>
+              <w:cnfStyle w:val="000000100000" w:firstRow="0" w:lastRow="0" w:firstColumn="0" w:lastColumn="0" w:oddVBand="0" w:evenVBand="0" w:oddHBand="1" w:evenHBand="0" w:firstRowFirstColumn="0" w:firstRowLastColumn="0" w:lastRowFirstColumn="0" w:lastRowLastColumn="0"/>
+            </w:pPr>
+            <w:r>
+              <w:t>Yes</w:t>
+            </w:r>
+          </w:p>
+        </w:tc>
+      </w:tr>
+      <w:tr>
+        <w:tc>
+          <w:tcPr>
+            <w:cnfStyle w:val="001000000000" w:firstRow="0" w:lastRow="0" w:firstColumn="1" w:lastColumn="0" w:oddVBand="0" w:evenVBand="0" w:oddHBand="0" w:evenHBand="0" w:firstRowFirstColumn="0" w:firstRowLastColumn="0" w:lastRowFirstColumn="0" w:lastRowLastColumn="0"/>
+            <w:tcW w:w="0" w:type="auto"/>
+            <w:vAlign w:val="center"/>
+            <w:hideMark/>
+          </w:tcPr>
+          <w:p>
+            <w:pPr>
+              <w:rPr>
+                <w:b w:val="0"/>
+                <w:bCs w:val="0"/>
+              </w:rPr>
+            </w:pPr>
+            <w:r>
+              <w:rPr>
+                <w:b w:val="0"/>
+                <w:bCs w:val="0"/>
+              </w:rPr>
+              <w:lastRenderedPageBreak/>
+              <w:t>/api/v1/integrations/ai/model-status</w:t>
+            </w:r>
+          </w:p>
+        </w:tc>
+        <w:tc>
+          <w:tcPr>
+            <w:tcW w:w="0" w:type="auto"/>
+            <w:vAlign w:val="center"/>
+            <w:hideMark/>
+          </w:tcPr>
+          <w:p>
+            <w:pPr>
+              <w:jc w:val="center"/>
+              <w:cnfStyle w:val="000000000000" w:firstRow="0" w:lastRow="0" w:firstColumn="0" w:lastColumn="0" w:oddVBand="0" w:evenVBand="0" w:oddHBand="0" w:evenHBand="0" w:firstRowFirstColumn="0" w:firstRowLastColumn="0" w:lastRowFirstColumn="0" w:lastRowLastColumn="0"/>
+            </w:pPr>
+            <w:r>
+              <w:t>GET</w:t>
+            </w:r>
+          </w:p>
+        </w:tc>
+        <w:tc>
+          <w:tcPr>
+            <w:tcW w:w="0" w:type="auto"/>
+            <w:vAlign w:val="center"/>
+            <w:hideMark/>
+          </w:tcPr>
+          <w:p>
+            <w:pPr>
+              <w:cnfStyle w:val="000000000000" w:firstRow="0" w:lastRow="0" w:firstColumn="0" w:lastColumn="0" w:oddVBand="0" w:evenVBand="0" w:oddHBand="0" w:evenHBand="0" w:firstRowFirstColumn="0" w:firstRowLastColumn="0" w:lastRowFirstColumn="0" w:lastRowLastColumn="0"/>
+            </w:pPr>
+            <w:r>
+              <w:t>Retrieve AI service availability and model status</w:t>
+            </w:r>
+          </w:p>
+        </w:tc>
+        <w:tc>
+          <w:tcPr>
+            <w:tcW w:w="0" w:type="auto"/>
+            <w:vAlign w:val="center"/>
+            <w:hideMark/>
+          </w:tcPr>
+          <w:p>
+            <w:pPr>
+              <w:jc w:val="center"/>
+              <w:cnfStyle w:val="000000000000" w:firstRow="0" w:lastRow="0" w:firstColumn="0" w:lastColumn="0" w:oddVBand="0" w:evenVBand="0" w:oddHBand="0" w:evenHBand="0" w:firstRowFirstColumn="0" w:firstRowLastColumn="0" w:lastRowFirstColumn="0" w:lastRowLastColumn="0"/>
+            </w:pPr>
+            <w:r>
+              <w:t>Yes</w:t>
+            </w:r>
+          </w:p>
+        </w:tc>
+      </w:tr>
+    </w:tbl>
     <w:p/>
+    <w:p>
+      <w:pPr>
+        <w:pStyle w:val="Title"/>
+      </w:pPr>
+      <w:r>
+        <w:t>API Design Considerations</w:t>
+      </w:r>
+    </w:p>
+    <w:p>
+      <w:r>
+        <w:t>AI Service APIs are specified based on the following principles:</w:t>
+      </w:r>
+    </w:p>
+    <w:p>
+      <w:pPr>
+        <w:pStyle w:val="ListParagraph"/>
+        <w:numPr>
+          <w:ilvl w:val="1"/>
+          <w:numId w:val="177"/>
+        </w:numPr>
+      </w:pPr>
+      <w:r>
+        <w:t>RESTful API Design: AI Services are exposed using REST endpoints with JSON payload;</w:t>
+      </w:r>
+    </w:p>
+    <w:p>
+      <w:pPr>
+        <w:pStyle w:val="ListParagraph"/>
+        <w:numPr>
+          <w:ilvl w:val="1"/>
+          <w:numId w:val="177"/>
+        </w:numPr>
+      </w:pPr>
+      <w:r>
+        <w:t>JWT Authentication: Requests require a valid JWT access token;</w:t>
+      </w:r>
+    </w:p>
+    <w:p>
+      <w:pPr>
+        <w:pStyle w:val="ListParagraph"/>
+        <w:numPr>
+          <w:ilvl w:val="1"/>
+          <w:numId w:val="177"/>
+        </w:numPr>
+      </w:pPr>
+      <w:r>
+        <w:t>Role-based Authorization: AI capabilities are distributed based on permissions of customers, agencies, or administrator;</w:t>
+      </w:r>
+    </w:p>
+    <w:p>
+      <w:pPr>
+        <w:pStyle w:val="ListParagraph"/>
+        <w:numPr>
+          <w:ilvl w:val="1"/>
+          <w:numId w:val="177"/>
+        </w:numPr>
+      </w:pPr>
+      <w:r>
+        <w:t>Secure Communication: Requests are sent over HTTPS using TLS protocol;</w:t>
+      </w:r>
+    </w:p>
+    <w:p>
+      <w:pPr>
+        <w:pStyle w:val="ListParagraph"/>
+        <w:numPr>
+          <w:ilvl w:val="1"/>
+          <w:numId w:val="177"/>
+        </w:numPr>
+      </w:pPr>
+      <w:r>
+        <w:t>Privacy Protection: Only minimal amount of required information for AI service is shared to preserve privacy of users;</w:t>
+      </w:r>
+    </w:p>
+    <w:p>
+      <w:pPr>
+        <w:pStyle w:val="ListParagraph"/>
+        <w:numPr>
+          <w:ilvl w:val="1"/>
+          <w:numId w:val="177"/>
+        </w:numPr>
+      </w:pPr>
+      <w:r>
+        <w:t>Model Independence: AI models are separated from platform architecture allowing independent deployment and update;</w:t>
+      </w:r>
+    </w:p>
+    <w:p>
+      <w:pPr>
+        <w:pStyle w:val="ListParagraph"/>
+        <w:numPr>
+          <w:ilvl w:val="1"/>
+          <w:numId w:val="177"/>
+        </w:numPr>
+      </w:pPr>
+      <w:r>
+        <w:t>Scalable Processing: Processing of AI request is performed asynchronously in case of computation-heavy operations;</w:t>
+      </w:r>
+    </w:p>
+    <w:p>
+      <w:pPr>
+        <w:pStyle w:val="ListParagraph"/>
+        <w:numPr>
+          <w:ilvl w:val="1"/>
+          <w:numId w:val="177"/>
+        </w:numPr>
+      </w:pPr>
+      <w:r>
+        <w:t>Standardized Error Handling: Failures of AI service are handled with standardized error responses.</w:t>
+      </w:r>
+    </w:p>
+    <w:p>
+      <w:pPr>
+        <w:pStyle w:val="Title"/>
+      </w:pPr>
+      <w:r>
+        <w:t>AI Service Workflow</w:t>
+      </w:r>
+    </w:p>
+    <w:p>
+      <w:r>
+        <w:t>AI processing flow consists of the following steps:</w:t>
+      </w:r>
+    </w:p>
+    <w:p>
+      <w:pPr>
+        <w:pStyle w:val="ListParagraph"/>
+        <w:numPr>
+          <w:ilvl w:val="0"/>
+          <w:numId w:val="175"/>
+        </w:numPr>
+      </w:pPr>
+      <w:r>
+        <w:t>Authenticated user sends a request related to AI capabilities such as recommendations, intelligent search, or chatbot query;</w:t>
+      </w:r>
+    </w:p>
+    <w:p>
+      <w:pPr>
+        <w:pStyle w:val="ListParagraph"/>
+        <w:numPr>
+          <w:ilvl w:val="0"/>
+          <w:numId w:val="175"/>
+        </w:numPr>
+      </w:pPr>
+      <w:r>
+        <w:t>Requesting service verifies user's authentication and authorization;</w:t>
+      </w:r>
+    </w:p>
+    <w:p>
+      <w:pPr>
+        <w:pStyle w:val="ListParagraph"/>
+        <w:numPr>
+          <w:ilvl w:val="0"/>
+          <w:numId w:val="175"/>
+        </w:numPr>
+      </w:pPr>
+      <w:r>
+        <w:t>AI Integration Service gathers all needed contextual data from other platform services;</w:t>
+      </w:r>
+    </w:p>
+    <w:p>
+      <w:pPr>
+        <w:pStyle w:val="ListParagraph"/>
+        <w:numPr>
+          <w:ilvl w:val="0"/>
+          <w:numId w:val="175"/>
+        </w:numPr>
+      </w:pPr>
+      <w:r>
+        <w:t>Request is sent to the AI engine over HTTPS using TLS;</w:t>
+      </w:r>
+    </w:p>
+    <w:p>
+      <w:pPr>
+        <w:pStyle w:val="ListParagraph"/>
+        <w:numPr>
+          <w:ilvl w:val="0"/>
+          <w:numId w:val="175"/>
+        </w:numPr>
+      </w:pPr>
+      <w:r>
+        <w:t>AI model analyses input data and produces the requested prediction, recommendation or response;</w:t>
+      </w:r>
+    </w:p>
+    <w:p>
+      <w:pPr>
+        <w:pStyle w:val="ListParagraph"/>
+        <w:numPr>
+          <w:ilvl w:val="0"/>
+          <w:numId w:val="175"/>
+        </w:numPr>
+      </w:pPr>
+      <w:r>
+        <w:t>Output is returned back to AI Integration Service and undergoes validation process;</w:t>
+      </w:r>
+    </w:p>
+    <w:p>
+      <w:pPr>
+        <w:pStyle w:val="ListParagraph"/>
+        <w:numPr>
+          <w:ilvl w:val="0"/>
+          <w:numId w:val="175"/>
+        </w:numPr>
+      </w:pPr>
+      <w:r>
+        <w:t>Processed response is sent to client application and, if required, is logged to be used for monitoring and further improvement of the model.</w:t>
+      </w:r>
+    </w:p>
+    <w:p>
+      <w:r>
+        <w:rPr>
+          <w:noProof/>
+        </w:rPr>
+        <mc:AlternateContent>
+          <mc:Choice Requires="wps">
+            <w:drawing>
+              <wp:anchor distT="0" distB="0" distL="114300" distR="114300" simplePos="0" relativeHeight="251694080" behindDoc="0" locked="0" layoutInCell="1" allowOverlap="1" wp14:anchorId="3906B737" wp14:editId="144B1494">
+                <wp:simplePos x="0" y="0"/>
+                <wp:positionH relativeFrom="column">
+                  <wp:posOffset>114300</wp:posOffset>
+                </wp:positionH>
+                <wp:positionV relativeFrom="paragraph">
+                  <wp:posOffset>1270000</wp:posOffset>
+                </wp:positionV>
+                <wp:extent cx="5356225" cy="635"/>
+                <wp:effectExtent l="0" t="0" r="0" b="0"/>
+                <wp:wrapSquare wrapText="bothSides"/>
+                <wp:docPr id="2071821034" name="Text Box 1"/>
+                <wp:cNvGraphicFramePr/>
+                <a:graphic xmlns:a="http://schemas.openxmlformats.org/drawingml/2006/main">
+                  <a:graphicData uri="http://schemas.microsoft.com/office/word/2010/wordprocessingShape">
+                    <wps:wsp>
+                      <wps:cNvSpPr txBox="1"/>
+                      <wps:spPr>
+                        <a:xfrm>
+                          <a:off x="0" y="0"/>
+                          <a:ext cx="5356225" cy="635"/>
+                        </a:xfrm>
+                        <a:prstGeom prst="rect">
+                          <a:avLst/>
+                        </a:prstGeom>
+                        <a:solidFill>
+                          <a:prstClr val="white"/>
+                        </a:solidFill>
+                        <a:ln>
+                          <a:noFill/>
+                        </a:ln>
+                      </wps:spPr>
+                      <wps:txbx>
+                        <w:txbxContent>
+                          <w:p>
+                            <w:pPr>
+                              <w:pStyle w:val="Caption"/>
+                              <w:jc w:val="center"/>
+                            </w:pPr>
+                            <w:r>
+                              <w:t xml:space="preserve">Figure </w:t>
+                            </w:r>
+                            <w:r>
+                              <w:fldChar w:fldCharType="begin"/>
+                            </w:r>
+                            <w:r>
+                              <w:instrText xml:space="preserve"> SEQ Figure \* ARABIC </w:instrText>
+                            </w:r>
+                            <w:r>
+                              <w:fldChar w:fldCharType="separate"/>
+                            </w:r>
+                            <w:r>
+                              <w:rPr>
+                                <w:noProof/>
+                              </w:rPr>
+                              <w:t>12</w:t>
+                            </w:r>
+                            <w:r>
+                              <w:fldChar w:fldCharType="end"/>
+                            </w:r>
+                            <w:r>
+                              <w:t xml:space="preserve"> - </w:t>
+                            </w:r>
+                            <w:r>
+                              <w:t>AI Service Workflow</w:t>
+                            </w:r>
+                          </w:p>
+                        </w:txbxContent>
+                      </wps:txbx>
+                      <wps:bodyPr rot="0" spcFirstLastPara="0" vertOverflow="overflow" horzOverflow="overflow" vert="horz" wrap="square" lIns="0" tIns="0" rIns="0" bIns="0" numCol="1" spcCol="0" rtlCol="0" fromWordArt="0" anchor="t" anchorCtr="0" forceAA="0" compatLnSpc="1">
+                        <a:prstTxWarp prst="textNoShape">
+                          <a:avLst/>
+                        </a:prstTxWarp>
+                        <a:spAutoFit/>
+                      </wps:bodyPr>
+                    </wps:wsp>
+                  </a:graphicData>
+                </a:graphic>
+              </wp:anchor>
+            </w:drawing>
+          </mc:Choice>
+          <mc:Fallback>
+            <w:pict>
+              <v:shape w14:anchorId="3906B737" id="_x0000_s1037" type="#_x0000_t202" style="position:absolute;margin-left:9pt;margin-top:100pt;width:421.75pt;height:.05pt;z-index:251694080;visibility:visible;mso-wrap-style:square;mso-wrap-distance-left:9pt;mso-wrap-distance-top:0;mso-wrap-distance-right:9pt;mso-wrap-distance-bottom:0;mso-position-horizontal:absolute;mso-position-horizontal-relative:text;mso-position-vertical:absolute;mso-position-vertical-relative:text;v-text-anchor:top" o:gfxdata="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" stroked="f">
+                <v:textbox style="mso-fit-shape-to-text:t" inset="0,0,0,0">
+                  <w:txbxContent>
+                    <w:p>
+                      <w:pPr>
+                        <w:pStyle w:val="Caption"/>
+                        <w:jc w:val="center"/>
+                      </w:pPr>
+                      <w:r>
+                        <w:t xml:space="preserve">Figure </w:t>
+                      </w:r>
+                      <w:r>
+                        <w:fldChar w:fldCharType="begin"/>
+                      </w:r>
+                      <w:r>
+                        <w:instrText xml:space="preserve"> SEQ Figure \* ARABIC </w:instrText>
+                      </w:r>
+                      <w:r>
+                        <w:fldChar w:fldCharType="separate"/>
+                      </w:r>
+                      <w:r>
+                        <w:rPr>
+                          <w:noProof/>
+                        </w:rPr>
+                        <w:t>12</w:t>
+                      </w:r>
+                      <w:r>
+                        <w:fldChar w:fldCharType="end"/>
+                      </w:r>
+                      <w:r>
+                        <w:t xml:space="preserve"> - </w:t>
+                      </w:r>
+                      <w:r>
+                        <w:t>AI Service Workflow</w:t>
+                      </w:r>
+                    </w:p>
+                  </w:txbxContent>
+                </v:textbox>
+                <w10:wrap type="square"/>
+              </v:shape>
+            </w:pict>
+          </mc:Fallback>
+        </mc:AlternateContent>
+      </w:r>
+      <w:r>
+        <w:drawing>
+          <wp:anchor distT="0" distB="0" distL="114300" distR="114300" simplePos="0" relativeHeight="251692032" behindDoc="0" locked="0" layoutInCell="1" allowOverlap="1" wp14:anchorId="1BFF555C" wp14:editId="480D9F46">
+            <wp:simplePos x="0" y="0"/>
+            <wp:positionH relativeFrom="column">
+              <wp:posOffset>114300</wp:posOffset>
+            </wp:positionH>
+            <wp:positionV relativeFrom="paragraph">
+              <wp:posOffset>149225</wp:posOffset>
+            </wp:positionV>
+            <wp:extent cx="5356480" cy="1063625"/>
+            <wp:effectExtent l="0" t="0" r="0" b="3175"/>
+            <wp:wrapSquare wrapText="bothSides"/>
+            <wp:docPr id="619990423" name="Picture 1"/>
+            <wp:cNvGraphicFramePr>
+              <a:graphicFrameLocks xmlns:a="http://schemas.openxmlformats.org/drawingml/2006/main" noChangeAspect="1"/>
+            </wp:cNvGraphicFramePr>
+            <a:graphic xmlns:a="http://schemas.openxmlformats.org/drawingml/2006/main">
+              <a:graphicData uri="http://schemas.openxmlformats.org/drawingml/2006/picture">
+                <pic:pic xmlns:pic="http://schemas.openxmlformats.org/drawingml/2006/picture">
+                  <pic:nvPicPr>
+                    <pic:cNvPr id="619990423" name=""/>
+                    <pic:cNvPicPr/>
+                  </pic:nvPicPr>
+                  <pic:blipFill>
+                    <a:blip r:embed="rId19" cstate="print">
+                      <a:extLst>
+                        <a:ext uri="{28A0092B-C50C-407E-A947-70E740481C1C}">
+                          <a14:useLocalDpi xmlns:a14="http://schemas.microsoft.com/office/drawing/2010/main" val="0"/>
+                        </a:ext>
+                      </a:extLst>
+                    </a:blip>
+                    <a:stretch>
+                      <a:fillRect/>
+                    </a:stretch>
+                  </pic:blipFill>
+                  <pic:spPr>
+                    <a:xfrm>
+                      <a:off x="0" y="0"/>
+                      <a:ext cx="5356480" cy="1063625"/>
+                    </a:xfrm>
+                    <a:prstGeom prst="rect">
+                      <a:avLst/>
+                    </a:prstGeom>
+                  </pic:spPr>
+                </pic:pic>
+              </a:graphicData>
+            </a:graphic>
+          </wp:anchor>
+        </w:drawing>
+      </w:r>
+    </w:p>
+    <w:p/>
+    <w:p/>
+    <w:p/>
+    <w:p/>
+    <w:p/>
+    <w:p>
+      <w:pPr>
+        <w:tabs>
+          <w:tab w:val="left" w:pos="1944"/>
+        </w:tabs>
+      </w:pPr>
+      <w:r>
+        <w:tab/>
+      </w:r>
+    </w:p>
+    <w:p>
+      <w:pPr>
+        <w:spacing w:line="278" w:lineRule="auto"/>
+      </w:pPr>
+      <w:r>
+        <w:br w:type="page"/>
+      </w:r>
+    </w:p>
+    <w:p>
+      <w:pPr>
+        <w:tabs>
+          <w:tab w:val="left" w:pos="1944"/>
+        </w:tabs>
+      </w:pPr>
+    </w:p>
     <w:sectPr>
-      <w:headerReference w:type="default" r:id="rId19"/>
-      <w:footerReference w:type="default" r:id="rId20"/>
+      <w:headerReference w:type="default" r:id="rId20"/>
+      <w:footerReference w:type="default" r:id="rId21"/>
       <w:pgSz w:w="11906" w:h="16838" w:code="9"/>
       <w:pgMar w:top="1411" w:right="850" w:bottom="1411" w:left="1699" w:header="720" w:footer="288" w:gutter="0"/>
       <w:pgNumType w:start="1"/>
@@ -18102,6 +19291,119 @@
     </w:lvl>
   </w:abstractNum>
   <w:abstractNum w:abstractNumId="7" w15:restartNumberingAfterBreak="0">
+    <w:nsid w:val="0B2E1F0A"/>
+    <w:multiLevelType w:val="hybridMultilevel"/>
+    <w:tmpl w:val="C2F2782C"/>
+    <w:lvl w:ilvl="0" w:tplc="FFFFFFFF">
+      <w:start w:val="1"/>
+      <w:numFmt w:val="bullet"/>
+      <w:lvlText w:val=""/>
+      <w:lvlJc w:val="left"/>
+      <w:pPr>
+        <w:ind w:left="720" w:hanging="360"/>
+      </w:pPr>
+      <w:rPr>
+        <w:rFonts w:ascii="Wingdings" w:hAnsi="Wingdings" w:hint="default"/>
+      </w:rPr>
+    </w:lvl>
+    <w:lvl w:ilvl="1" w:tplc="04090005">
+      <w:start w:val="1"/>
+      <w:numFmt w:val="bullet"/>
+      <w:lvlText w:val=""/>
+      <w:lvlJc w:val="left"/>
+      <w:pPr>
+        <w:ind w:left="720" w:hanging="360"/>
+      </w:pPr>
+      <w:rPr>
+        <w:rFonts w:ascii="Wingdings" w:hAnsi="Wingdings" w:hint="default"/>
+      </w:rPr>
+    </w:lvl>
+    <w:lvl w:ilvl="2" w:tplc="FFFFFFFF" w:tentative="1">
+      <w:start w:val="1"/>
+      <w:numFmt w:val="bullet"/>
+      <w:lvlText w:val=""/>
+      <w:lvlJc w:val="left"/>
+      <w:pPr>
+        <w:ind w:left="2160" w:hanging="360"/>
+      </w:pPr>
+      <w:rPr>
+        <w:rFonts w:ascii="Wingdings" w:hAnsi="Wingdings" w:hint="default"/>
+      </w:rPr>
+    </w:lvl>
+    <w:lvl w:ilvl="3" w:tplc="FFFFFFFF" w:tentative="1">
+      <w:start w:val="1"/>
+      <w:numFmt w:val="bullet"/>
+      <w:lvlText w:val=""/>
+      <w:lvlJc w:val="left"/>
+      <w:pPr>
+        <w:ind w:left="2880" w:hanging="360"/>
+      </w:pPr>
+      <w:rPr>
+        <w:rFonts w:ascii="Symbol" w:hAnsi="Symbol" w:hint="default"/>
+      </w:rPr>
+    </w:lvl>
+    <w:lvl w:ilvl="4" w:tplc="FFFFFFFF" w:tentative="1">
+      <w:start w:val="1"/>
+      <w:numFmt w:val="bullet"/>
+      <w:lvlText w:val="o"/>
+      <w:lvlJc w:val="left"/>
+      <w:pPr>
+        <w:ind w:left="3600" w:hanging="360"/>
+      </w:pPr>
+      <w:rPr>
+        <w:rFonts w:ascii="Courier New" w:hAnsi="Courier New" w:cs="Courier New" w:hint="default"/>
+      </w:rPr>
+    </w:lvl>
+    <w:lvl w:ilvl="5" w:tplc="FFFFFFFF" w:tentative="1">
+      <w:start w:val="1"/>
+      <w:numFmt w:val="bullet"/>
+      <w:lvlText w:val=""/>
+      <w:lvlJc w:val="left"/>
+      <w:pPr>
+        <w:ind w:left="4320" w:hanging="360"/>
+      </w:pPr>
+      <w:rPr>
+        <w:rFonts w:ascii="Wingdings" w:hAnsi="Wingdings" w:hint="default"/>
+      </w:rPr>
+    </w:lvl>
+    <w:lvl w:ilvl="6" w:tplc="FFFFFFFF" w:tentative="1">
+      <w:start w:val="1"/>
+      <w:numFmt w:val="bullet"/>
+      <w:lvlText w:val=""/>
+      <w:lvlJc w:val="left"/>
+      <w:pPr>
+        <w:ind w:left="5040" w:hanging="360"/>
+      </w:pPr>
+      <w:rPr>
+        <w:rFonts w:ascii="Symbol" w:hAnsi="Symbol" w:hint="default"/>
+      </w:rPr>
+    </w:lvl>
+    <w:lvl w:ilvl="7" w:tplc="FFFFFFFF" w:tentative="1">
+      <w:start w:val="1"/>
+      <w:numFmt w:val="bullet"/>
+      <w:lvlText w:val="o"/>
+      <w:lvlJc w:val="left"/>
+      <w:pPr>
+        <w:ind w:left="5760" w:hanging="360"/>
+      </w:pPr>
+      <w:rPr>
+        <w:rFonts w:ascii="Courier New" w:hAnsi="Courier New" w:cs="Courier New" w:hint="default"/>
+      </w:rPr>
+    </w:lvl>
+    <w:lvl w:ilvl="8" w:tplc="FFFFFFFF" w:tentative="1">
+      <w:start w:val="1"/>
+      <w:numFmt w:val="bullet"/>
+      <w:lvlText w:val=""/>
+      <w:lvlJc w:val="left"/>
+      <w:pPr>
+        <w:ind w:left="6480" w:hanging="360"/>
+      </w:pPr>
+      <w:rPr>
+        <w:rFonts w:ascii="Wingdings" w:hAnsi="Wingdings" w:hint="default"/>
+      </w:rPr>
+    </w:lvl>
+  </w:abstractNum>
+  <w:abstractNum w:abstractNumId="8" w15:restartNumberingAfterBreak="0">
     <w:nsid w:val="0B782C17"/>
     <w:multiLevelType w:val="hybridMultilevel"/>
     <w:tmpl w:val="18A01304"/>
@@ -18214,7 +19516,7 @@
       </w:rPr>
     </w:lvl>
   </w:abstractNum>
-  <w:abstractNum w:abstractNumId="8" w15:restartNumberingAfterBreak="0">
+  <w:abstractNum w:abstractNumId="9" w15:restartNumberingAfterBreak="0">
     <w:nsid w:val="0C1B283C"/>
     <w:multiLevelType w:val="multilevel"/>
     <w:tmpl w:val="63F4E6F0"/>
@@ -18363,7 +19665,7 @@
       </w:rPr>
     </w:lvl>
   </w:abstractNum>
-  <w:abstractNum w:abstractNumId="9" w15:restartNumberingAfterBreak="0">
+  <w:abstractNum w:abstractNumId="10" w15:restartNumberingAfterBreak="0">
     <w:nsid w:val="0C5C5E66"/>
     <w:multiLevelType w:val="hybridMultilevel"/>
     <w:tmpl w:val="65F0FED4"/>
@@ -18449,7 +19751,7 @@
       </w:pPr>
     </w:lvl>
   </w:abstractNum>
-  <w:abstractNum w:abstractNumId="10" w15:restartNumberingAfterBreak="0">
+  <w:abstractNum w:abstractNumId="11" w15:restartNumberingAfterBreak="0">
     <w:nsid w:val="0C6E0690"/>
     <w:multiLevelType w:val="hybridMultilevel"/>
     <w:tmpl w:val="54D4A188"/>
@@ -18561,7 +19863,7 @@
       </w:rPr>
     </w:lvl>
   </w:abstractNum>
-  <w:abstractNum w:abstractNumId="11" w15:restartNumberingAfterBreak="0">
+  <w:abstractNum w:abstractNumId="12" w15:restartNumberingAfterBreak="0">
     <w:nsid w:val="0C9B4691"/>
     <w:multiLevelType w:val="hybridMultilevel"/>
     <w:tmpl w:val="F9BC3FFE"/>
@@ -18647,7 +19949,7 @@
       </w:pPr>
     </w:lvl>
   </w:abstractNum>
-  <w:abstractNum w:abstractNumId="12" w15:restartNumberingAfterBreak="0">
+  <w:abstractNum w:abstractNumId="13" w15:restartNumberingAfterBreak="0">
     <w:nsid w:val="0F4F06D8"/>
     <w:multiLevelType w:val="multilevel"/>
     <w:tmpl w:val="68E44DE0"/>
@@ -18796,7 +20098,7 @@
       </w:rPr>
     </w:lvl>
   </w:abstractNum>
-  <w:abstractNum w:abstractNumId="13" w15:restartNumberingAfterBreak="0">
+  <w:abstractNum w:abstractNumId="14" w15:restartNumberingAfterBreak="0">
     <w:nsid w:val="0FDE792A"/>
     <w:multiLevelType w:val="hybridMultilevel"/>
     <w:tmpl w:val="43823D74"/>
@@ -18908,7 +20210,7 @@
       </w:rPr>
     </w:lvl>
   </w:abstractNum>
-  <w:abstractNum w:abstractNumId="14" w15:restartNumberingAfterBreak="0">
+  <w:abstractNum w:abstractNumId="15" w15:restartNumberingAfterBreak="0">
     <w:nsid w:val="10456632"/>
     <w:multiLevelType w:val="hybridMultilevel"/>
     <w:tmpl w:val="A1104F7A"/>
@@ -19021,7 +20323,7 @@
       </w:rPr>
     </w:lvl>
   </w:abstractNum>
-  <w:abstractNum w:abstractNumId="15" w15:restartNumberingAfterBreak="0">
+  <w:abstractNum w:abstractNumId="16" w15:restartNumberingAfterBreak="0">
     <w:nsid w:val="12201BE9"/>
     <w:multiLevelType w:val="multilevel"/>
     <w:tmpl w:val="CED6A096"/>
@@ -19170,7 +20472,7 @@
       </w:rPr>
     </w:lvl>
   </w:abstractNum>
-  <w:abstractNum w:abstractNumId="16" w15:restartNumberingAfterBreak="0">
+  <w:abstractNum w:abstractNumId="17" w15:restartNumberingAfterBreak="0">
     <w:nsid w:val="129D4E29"/>
     <w:multiLevelType w:val="hybridMultilevel"/>
     <w:tmpl w:val="87E86058"/>
@@ -19256,7 +20558,7 @@
       </w:pPr>
     </w:lvl>
   </w:abstractNum>
-  <w:abstractNum w:abstractNumId="17" w15:restartNumberingAfterBreak="0">
+  <w:abstractNum w:abstractNumId="18" w15:restartNumberingAfterBreak="0">
     <w:nsid w:val="135C5CF3"/>
     <w:multiLevelType w:val="multilevel"/>
     <w:tmpl w:val="61D20A04"/>
@@ -19405,7 +20707,7 @@
       </w:rPr>
     </w:lvl>
   </w:abstractNum>
-  <w:abstractNum w:abstractNumId="18" w15:restartNumberingAfterBreak="0">
+  <w:abstractNum w:abstractNumId="19" w15:restartNumberingAfterBreak="0">
     <w:nsid w:val="137648CC"/>
     <w:multiLevelType w:val="multilevel"/>
     <w:tmpl w:val="EC983E9E"/>
@@ -19554,7 +20856,7 @@
       </w:rPr>
     </w:lvl>
   </w:abstractNum>
-  <w:abstractNum w:abstractNumId="19" w15:restartNumberingAfterBreak="0">
+  <w:abstractNum w:abstractNumId="20" w15:restartNumberingAfterBreak="0">
     <w:nsid w:val="15354085"/>
     <w:multiLevelType w:val="multilevel"/>
     <w:tmpl w:val="ED488EA0"/>
@@ -19703,7 +21005,7 @@
       </w:rPr>
     </w:lvl>
   </w:abstractNum>
-  <w:abstractNum w:abstractNumId="20" w15:restartNumberingAfterBreak="0">
+  <w:abstractNum w:abstractNumId="21" w15:restartNumberingAfterBreak="0">
     <w:nsid w:val="158836AF"/>
     <w:multiLevelType w:val="hybridMultilevel"/>
     <w:tmpl w:val="3FE0C50C"/>
@@ -19789,7 +21091,7 @@
       </w:pPr>
     </w:lvl>
   </w:abstractNum>
-  <w:abstractNum w:abstractNumId="21" w15:restartNumberingAfterBreak="0">
+  <w:abstractNum w:abstractNumId="22" w15:restartNumberingAfterBreak="0">
     <w:nsid w:val="15923962"/>
     <w:multiLevelType w:val="hybridMultilevel"/>
     <w:tmpl w:val="2A8A437A"/>
@@ -19901,7 +21203,7 @@
       </w:rPr>
     </w:lvl>
   </w:abstractNum>
-  <w:abstractNum w:abstractNumId="22" w15:restartNumberingAfterBreak="0">
+  <w:abstractNum w:abstractNumId="23" w15:restartNumberingAfterBreak="0">
     <w:nsid w:val="15E231DD"/>
     <w:multiLevelType w:val="hybridMultilevel"/>
     <w:tmpl w:val="48B4AB8E"/>
@@ -20014,7 +21316,7 @@
       </w:rPr>
     </w:lvl>
   </w:abstractNum>
-  <w:abstractNum w:abstractNumId="23" w15:restartNumberingAfterBreak="0">
+  <w:abstractNum w:abstractNumId="24" w15:restartNumberingAfterBreak="0">
     <w:nsid w:val="15FB6E59"/>
     <w:multiLevelType w:val="multilevel"/>
     <w:tmpl w:val="63F4E6F0"/>
@@ -20163,7 +21465,7 @@
       </w:rPr>
     </w:lvl>
   </w:abstractNum>
-  <w:abstractNum w:abstractNumId="24" w15:restartNumberingAfterBreak="0">
+  <w:abstractNum w:abstractNumId="25" w15:restartNumberingAfterBreak="0">
     <w:nsid w:val="16057B40"/>
     <w:multiLevelType w:val="hybridMultilevel"/>
     <w:tmpl w:val="C63C7D68"/>
@@ -20275,7 +21577,7 @@
       </w:rPr>
     </w:lvl>
   </w:abstractNum>
-  <w:abstractNum w:abstractNumId="25" w15:restartNumberingAfterBreak="0">
+  <w:abstractNum w:abstractNumId="26" w15:restartNumberingAfterBreak="0">
     <w:nsid w:val="18441B3D"/>
     <w:multiLevelType w:val="hybridMultilevel"/>
     <w:tmpl w:val="F162D252"/>
@@ -20387,7 +21689,7 @@
       </w:rPr>
     </w:lvl>
   </w:abstractNum>
-  <w:abstractNum w:abstractNumId="26" w15:restartNumberingAfterBreak="0">
+  <w:abstractNum w:abstractNumId="27" w15:restartNumberingAfterBreak="0">
     <w:nsid w:val="185230B0"/>
     <w:multiLevelType w:val="hybridMultilevel"/>
     <w:tmpl w:val="FDFE89EE"/>
@@ -20500,7 +21802,7 @@
       </w:rPr>
     </w:lvl>
   </w:abstractNum>
-  <w:abstractNum w:abstractNumId="27" w15:restartNumberingAfterBreak="0">
+  <w:abstractNum w:abstractNumId="28" w15:restartNumberingAfterBreak="0">
     <w:nsid w:val="18A93E35"/>
     <w:multiLevelType w:val="hybridMultilevel"/>
     <w:tmpl w:val="7A6E3062"/>
@@ -20612,7 +21914,7 @@
       </w:rPr>
     </w:lvl>
   </w:abstractNum>
-  <w:abstractNum w:abstractNumId="28" w15:restartNumberingAfterBreak="0">
+  <w:abstractNum w:abstractNumId="29" w15:restartNumberingAfterBreak="0">
     <w:nsid w:val="18EC3D82"/>
     <w:multiLevelType w:val="hybridMultilevel"/>
     <w:tmpl w:val="BC5A743C"/>
@@ -20725,7 +22027,7 @@
       </w:rPr>
     </w:lvl>
   </w:abstractNum>
-  <w:abstractNum w:abstractNumId="29" w15:restartNumberingAfterBreak="0">
+  <w:abstractNum w:abstractNumId="30" w15:restartNumberingAfterBreak="0">
     <w:nsid w:val="18F46E01"/>
     <w:multiLevelType w:val="multilevel"/>
     <w:tmpl w:val="C77EDED0"/>
@@ -20874,7 +22176,7 @@
       </w:rPr>
     </w:lvl>
   </w:abstractNum>
-  <w:abstractNum w:abstractNumId="30" w15:restartNumberingAfterBreak="0">
+  <w:abstractNum w:abstractNumId="31" w15:restartNumberingAfterBreak="0">
     <w:nsid w:val="19C83C12"/>
     <w:multiLevelType w:val="multilevel"/>
     <w:tmpl w:val="7690D588"/>
@@ -21023,7 +22325,7 @@
       </w:rPr>
     </w:lvl>
   </w:abstractNum>
-  <w:abstractNum w:abstractNumId="31" w15:restartNumberingAfterBreak="0">
+  <w:abstractNum w:abstractNumId="32" w15:restartNumberingAfterBreak="0">
     <w:nsid w:val="1A113403"/>
     <w:multiLevelType w:val="hybridMultilevel"/>
     <w:tmpl w:val="081EE28E"/>
@@ -21109,7 +22411,7 @@
       </w:pPr>
     </w:lvl>
   </w:abstractNum>
-  <w:abstractNum w:abstractNumId="32" w15:restartNumberingAfterBreak="0">
+  <w:abstractNum w:abstractNumId="33" w15:restartNumberingAfterBreak="0">
     <w:nsid w:val="1A236A44"/>
     <w:multiLevelType w:val="hybridMultilevel"/>
     <w:tmpl w:val="E06C248C"/>
@@ -21222,7 +22524,7 @@
       </w:rPr>
     </w:lvl>
   </w:abstractNum>
-  <w:abstractNum w:abstractNumId="33" w15:restartNumberingAfterBreak="0">
+  <w:abstractNum w:abstractNumId="34" w15:restartNumberingAfterBreak="0">
     <w:nsid w:val="1C511176"/>
     <w:multiLevelType w:val="multilevel"/>
     <w:tmpl w:val="201E7F12"/>
@@ -21371,7 +22673,7 @@
       </w:rPr>
     </w:lvl>
   </w:abstractNum>
-  <w:abstractNum w:abstractNumId="34" w15:restartNumberingAfterBreak="0">
+  <w:abstractNum w:abstractNumId="35" w15:restartNumberingAfterBreak="0">
     <w:nsid w:val="1D4C2E50"/>
     <w:multiLevelType w:val="multilevel"/>
     <w:tmpl w:val="63F4E6F0"/>
@@ -21520,7 +22822,7 @@
       </w:rPr>
     </w:lvl>
   </w:abstractNum>
-  <w:abstractNum w:abstractNumId="35" w15:restartNumberingAfterBreak="0">
+  <w:abstractNum w:abstractNumId="36" w15:restartNumberingAfterBreak="0">
     <w:nsid w:val="1D592278"/>
     <w:multiLevelType w:val="hybridMultilevel"/>
     <w:tmpl w:val="0622B59C"/>
@@ -21633,7 +22935,7 @@
       </w:rPr>
     </w:lvl>
   </w:abstractNum>
-  <w:abstractNum w:abstractNumId="36" w15:restartNumberingAfterBreak="0">
+  <w:abstractNum w:abstractNumId="37" w15:restartNumberingAfterBreak="0">
     <w:nsid w:val="1EC4731F"/>
     <w:multiLevelType w:val="hybridMultilevel"/>
     <w:tmpl w:val="8E26D8F0"/>
@@ -21745,7 +23047,7 @@
       </w:rPr>
     </w:lvl>
   </w:abstractNum>
-  <w:abstractNum w:abstractNumId="37" w15:restartNumberingAfterBreak="0">
+  <w:abstractNum w:abstractNumId="38" w15:restartNumberingAfterBreak="0">
     <w:nsid w:val="20017871"/>
     <w:multiLevelType w:val="hybridMultilevel"/>
     <w:tmpl w:val="EA76608A"/>
@@ -21858,7 +23160,7 @@
       </w:rPr>
     </w:lvl>
   </w:abstractNum>
-  <w:abstractNum w:abstractNumId="38" w15:restartNumberingAfterBreak="0">
+  <w:abstractNum w:abstractNumId="39" w15:restartNumberingAfterBreak="0">
     <w:nsid w:val="206A32F9"/>
     <w:multiLevelType w:val="hybridMultilevel"/>
     <w:tmpl w:val="7A405CA6"/>
@@ -21970,7 +23272,7 @@
       </w:rPr>
     </w:lvl>
   </w:abstractNum>
-  <w:abstractNum w:abstractNumId="39" w15:restartNumberingAfterBreak="0">
+  <w:abstractNum w:abstractNumId="40" w15:restartNumberingAfterBreak="0">
     <w:nsid w:val="20786568"/>
     <w:multiLevelType w:val="hybridMultilevel"/>
     <w:tmpl w:val="200CC0BC"/>
@@ -22082,7 +23384,7 @@
       </w:rPr>
     </w:lvl>
   </w:abstractNum>
-  <w:abstractNum w:abstractNumId="40" w15:restartNumberingAfterBreak="0">
+  <w:abstractNum w:abstractNumId="41" w15:restartNumberingAfterBreak="0">
     <w:nsid w:val="207D21A1"/>
     <w:multiLevelType w:val="hybridMultilevel"/>
     <w:tmpl w:val="AAAE4260"/>
@@ -22194,7 +23496,7 @@
       </w:rPr>
     </w:lvl>
   </w:abstractNum>
-  <w:abstractNum w:abstractNumId="41" w15:restartNumberingAfterBreak="0">
+  <w:abstractNum w:abstractNumId="42" w15:restartNumberingAfterBreak="0">
     <w:nsid w:val="20DC5034"/>
     <w:multiLevelType w:val="hybridMultilevel"/>
     <w:tmpl w:val="4B5425EA"/>
@@ -22306,7 +23608,7 @@
       </w:rPr>
     </w:lvl>
   </w:abstractNum>
-  <w:abstractNum w:abstractNumId="42" w15:restartNumberingAfterBreak="0">
+  <w:abstractNum w:abstractNumId="43" w15:restartNumberingAfterBreak="0">
     <w:nsid w:val="220B2C13"/>
     <w:multiLevelType w:val="hybridMultilevel"/>
     <w:tmpl w:val="1854C634"/>
@@ -22419,7 +23721,7 @@
       </w:rPr>
     </w:lvl>
   </w:abstractNum>
-  <w:abstractNum w:abstractNumId="43" w15:restartNumberingAfterBreak="0">
+  <w:abstractNum w:abstractNumId="44" w15:restartNumberingAfterBreak="0">
     <w:nsid w:val="224C7C45"/>
     <w:multiLevelType w:val="multilevel"/>
     <w:tmpl w:val="5C800264"/>
@@ -22568,7 +23870,7 @@
       </w:rPr>
     </w:lvl>
   </w:abstractNum>
-  <w:abstractNum w:abstractNumId="44" w15:restartNumberingAfterBreak="0">
+  <w:abstractNum w:abstractNumId="45" w15:restartNumberingAfterBreak="0">
     <w:nsid w:val="23970AD1"/>
     <w:multiLevelType w:val="hybridMultilevel"/>
     <w:tmpl w:val="6A1E8A04"/>
@@ -22680,7 +23982,7 @@
       </w:rPr>
     </w:lvl>
   </w:abstractNum>
-  <w:abstractNum w:abstractNumId="45" w15:restartNumberingAfterBreak="0">
+  <w:abstractNum w:abstractNumId="46" w15:restartNumberingAfterBreak="0">
     <w:nsid w:val="243D731E"/>
     <w:multiLevelType w:val="multilevel"/>
     <w:tmpl w:val="51303158"/>
@@ -22829,7 +24131,7 @@
       </w:rPr>
     </w:lvl>
   </w:abstractNum>
-  <w:abstractNum w:abstractNumId="46" w15:restartNumberingAfterBreak="0">
+  <w:abstractNum w:abstractNumId="47" w15:restartNumberingAfterBreak="0">
     <w:nsid w:val="253A4FEB"/>
     <w:multiLevelType w:val="hybridMultilevel"/>
     <w:tmpl w:val="5628BED4"/>
@@ -22942,7 +24244,7 @@
       </w:rPr>
     </w:lvl>
   </w:abstractNum>
-  <w:abstractNum w:abstractNumId="47" w15:restartNumberingAfterBreak="0">
+  <w:abstractNum w:abstractNumId="48" w15:restartNumberingAfterBreak="0">
     <w:nsid w:val="26BA6D3C"/>
     <w:multiLevelType w:val="hybridMultilevel"/>
     <w:tmpl w:val="F03CC954"/>
@@ -23054,7 +24356,7 @@
       </w:rPr>
     </w:lvl>
   </w:abstractNum>
-  <w:abstractNum w:abstractNumId="48" w15:restartNumberingAfterBreak="0">
+  <w:abstractNum w:abstractNumId="49" w15:restartNumberingAfterBreak="0">
     <w:nsid w:val="28765EA3"/>
     <w:multiLevelType w:val="hybridMultilevel"/>
     <w:tmpl w:val="1CFAEB30"/>
@@ -23167,7 +24469,7 @@
       </w:rPr>
     </w:lvl>
   </w:abstractNum>
-  <w:abstractNum w:abstractNumId="49" w15:restartNumberingAfterBreak="0">
+  <w:abstractNum w:abstractNumId="50" w15:restartNumberingAfterBreak="0">
     <w:nsid w:val="28940045"/>
     <w:multiLevelType w:val="multilevel"/>
     <w:tmpl w:val="23DE4804"/>
@@ -23316,7 +24618,7 @@
       </w:rPr>
     </w:lvl>
   </w:abstractNum>
-  <w:abstractNum w:abstractNumId="50" w15:restartNumberingAfterBreak="0">
+  <w:abstractNum w:abstractNumId="51" w15:restartNumberingAfterBreak="0">
     <w:nsid w:val="289938CC"/>
     <w:multiLevelType w:val="multilevel"/>
     <w:tmpl w:val="57745EE2"/>
@@ -23465,7 +24767,7 @@
       </w:rPr>
     </w:lvl>
   </w:abstractNum>
-  <w:abstractNum w:abstractNumId="51" w15:restartNumberingAfterBreak="0">
+  <w:abstractNum w:abstractNumId="52" w15:restartNumberingAfterBreak="0">
     <w:nsid w:val="2ADE3401"/>
     <w:multiLevelType w:val="multilevel"/>
     <w:tmpl w:val="63F4E6F0"/>
@@ -23614,7 +24916,7 @@
       </w:rPr>
     </w:lvl>
   </w:abstractNum>
-  <w:abstractNum w:abstractNumId="52" w15:restartNumberingAfterBreak="0">
+  <w:abstractNum w:abstractNumId="53" w15:restartNumberingAfterBreak="0">
     <w:nsid w:val="2B592B9C"/>
     <w:multiLevelType w:val="hybridMultilevel"/>
     <w:tmpl w:val="99D4C34E"/>
@@ -23727,7 +25029,7 @@
       </w:rPr>
     </w:lvl>
   </w:abstractNum>
-  <w:abstractNum w:abstractNumId="53" w15:restartNumberingAfterBreak="0">
+  <w:abstractNum w:abstractNumId="54" w15:restartNumberingAfterBreak="0">
     <w:nsid w:val="2B9413C9"/>
     <w:multiLevelType w:val="hybridMultilevel"/>
     <w:tmpl w:val="4F7A7546"/>
@@ -23839,7 +25141,7 @@
       </w:rPr>
     </w:lvl>
   </w:abstractNum>
-  <w:abstractNum w:abstractNumId="54" w15:restartNumberingAfterBreak="0">
+  <w:abstractNum w:abstractNumId="55" w15:restartNumberingAfterBreak="0">
     <w:nsid w:val="2B9539E3"/>
     <w:multiLevelType w:val="hybridMultilevel"/>
     <w:tmpl w:val="E6B8BBB6"/>
@@ -23951,7 +25253,7 @@
       </w:rPr>
     </w:lvl>
   </w:abstractNum>
-  <w:abstractNum w:abstractNumId="55" w15:restartNumberingAfterBreak="0">
+  <w:abstractNum w:abstractNumId="56" w15:restartNumberingAfterBreak="0">
     <w:nsid w:val="2C0B4D57"/>
     <w:multiLevelType w:val="hybridMultilevel"/>
     <w:tmpl w:val="7DDCD954"/>
@@ -24064,7 +25366,7 @@
       </w:rPr>
     </w:lvl>
   </w:abstractNum>
-  <w:abstractNum w:abstractNumId="56" w15:restartNumberingAfterBreak="0">
+  <w:abstractNum w:abstractNumId="57" w15:restartNumberingAfterBreak="0">
     <w:nsid w:val="2E164C9A"/>
     <w:multiLevelType w:val="hybridMultilevel"/>
     <w:tmpl w:val="C6BA489A"/>
@@ -24177,7 +25479,7 @@
       </w:rPr>
     </w:lvl>
   </w:abstractNum>
-  <w:abstractNum w:abstractNumId="57" w15:restartNumberingAfterBreak="0">
+  <w:abstractNum w:abstractNumId="58" w15:restartNumberingAfterBreak="0">
     <w:nsid w:val="2E34438D"/>
     <w:multiLevelType w:val="multilevel"/>
     <w:tmpl w:val="63F4E6F0"/>
@@ -24326,7 +25628,7 @@
       </w:rPr>
     </w:lvl>
   </w:abstractNum>
-  <w:abstractNum w:abstractNumId="58" w15:restartNumberingAfterBreak="0">
+  <w:abstractNum w:abstractNumId="59" w15:restartNumberingAfterBreak="0">
     <w:nsid w:val="2E5D6D2A"/>
     <w:multiLevelType w:val="hybridMultilevel"/>
     <w:tmpl w:val="5D5ADC98"/>
@@ -24439,7 +25741,7 @@
       </w:rPr>
     </w:lvl>
   </w:abstractNum>
-  <w:abstractNum w:abstractNumId="59" w15:restartNumberingAfterBreak="0">
+  <w:abstractNum w:abstractNumId="60" w15:restartNumberingAfterBreak="0">
     <w:nsid w:val="2E716C12"/>
     <w:multiLevelType w:val="hybridMultilevel"/>
     <w:tmpl w:val="6D90C552"/>
@@ -24552,7 +25854,7 @@
       </w:rPr>
     </w:lvl>
   </w:abstractNum>
-  <w:abstractNum w:abstractNumId="60" w15:restartNumberingAfterBreak="0">
+  <w:abstractNum w:abstractNumId="61" w15:restartNumberingAfterBreak="0">
     <w:nsid w:val="2F162517"/>
     <w:multiLevelType w:val="hybridMultilevel"/>
     <w:tmpl w:val="4E3CAB7C"/>
@@ -24664,7 +25966,7 @@
       </w:rPr>
     </w:lvl>
   </w:abstractNum>
-  <w:abstractNum w:abstractNumId="61" w15:restartNumberingAfterBreak="0">
+  <w:abstractNum w:abstractNumId="62" w15:restartNumberingAfterBreak="0">
     <w:nsid w:val="2F1F6483"/>
     <w:multiLevelType w:val="multilevel"/>
     <w:tmpl w:val="993E874E"/>
@@ -24813,7 +26115,7 @@
       </w:rPr>
     </w:lvl>
   </w:abstractNum>
-  <w:abstractNum w:abstractNumId="62" w15:restartNumberingAfterBreak="0">
+  <w:abstractNum w:abstractNumId="63" w15:restartNumberingAfterBreak="0">
     <w:nsid w:val="2F2B2F8E"/>
     <w:multiLevelType w:val="multilevel"/>
     <w:tmpl w:val="547EDCFE"/>
@@ -24962,7 +26264,7 @@
       </w:rPr>
     </w:lvl>
   </w:abstractNum>
-  <w:abstractNum w:abstractNumId="63" w15:restartNumberingAfterBreak="0">
+  <w:abstractNum w:abstractNumId="64" w15:restartNumberingAfterBreak="0">
     <w:nsid w:val="2FD06CBE"/>
     <w:multiLevelType w:val="hybridMultilevel"/>
     <w:tmpl w:val="95C8AABC"/>
@@ -25051,7 +26353,7 @@
       </w:pPr>
     </w:lvl>
   </w:abstractNum>
-  <w:abstractNum w:abstractNumId="64" w15:restartNumberingAfterBreak="0">
+  <w:abstractNum w:abstractNumId="65" w15:restartNumberingAfterBreak="0">
     <w:nsid w:val="2FF161E6"/>
     <w:multiLevelType w:val="hybridMultilevel"/>
     <w:tmpl w:val="ED6AA478"/>
@@ -25163,7 +26465,7 @@
       </w:rPr>
     </w:lvl>
   </w:abstractNum>
-  <w:abstractNum w:abstractNumId="65" w15:restartNumberingAfterBreak="0">
+  <w:abstractNum w:abstractNumId="66" w15:restartNumberingAfterBreak="0">
     <w:nsid w:val="303363CB"/>
     <w:multiLevelType w:val="hybridMultilevel"/>
     <w:tmpl w:val="61682AE0"/>
@@ -25249,7 +26551,7 @@
       </w:pPr>
     </w:lvl>
   </w:abstractNum>
-  <w:abstractNum w:abstractNumId="66" w15:restartNumberingAfterBreak="0">
+  <w:abstractNum w:abstractNumId="67" w15:restartNumberingAfterBreak="0">
     <w:nsid w:val="30CD5DF3"/>
     <w:multiLevelType w:val="hybridMultilevel"/>
     <w:tmpl w:val="127EBD02"/>
@@ -25361,7 +26663,7 @@
       </w:rPr>
     </w:lvl>
   </w:abstractNum>
-  <w:abstractNum w:abstractNumId="67" w15:restartNumberingAfterBreak="0">
+  <w:abstractNum w:abstractNumId="68" w15:restartNumberingAfterBreak="0">
     <w:nsid w:val="31A24DDF"/>
     <w:multiLevelType w:val="multilevel"/>
     <w:tmpl w:val="63F4E6F0"/>
@@ -25510,7 +26812,7 @@
       </w:rPr>
     </w:lvl>
   </w:abstractNum>
-  <w:abstractNum w:abstractNumId="68" w15:restartNumberingAfterBreak="0">
+  <w:abstractNum w:abstractNumId="69" w15:restartNumberingAfterBreak="0">
     <w:nsid w:val="321E65E6"/>
     <w:multiLevelType w:val="multilevel"/>
     <w:tmpl w:val="63F4E6F0"/>
@@ -25659,7 +26961,7 @@
       </w:rPr>
     </w:lvl>
   </w:abstractNum>
-  <w:abstractNum w:abstractNumId="69" w15:restartNumberingAfterBreak="0">
+  <w:abstractNum w:abstractNumId="70" w15:restartNumberingAfterBreak="0">
     <w:nsid w:val="332E29E8"/>
     <w:multiLevelType w:val="multilevel"/>
     <w:tmpl w:val="BF082128"/>
@@ -25808,7 +27110,7 @@
       </w:rPr>
     </w:lvl>
   </w:abstractNum>
-  <w:abstractNum w:abstractNumId="70" w15:restartNumberingAfterBreak="0">
+  <w:abstractNum w:abstractNumId="71" w15:restartNumberingAfterBreak="0">
     <w:nsid w:val="34251C5D"/>
     <w:multiLevelType w:val="multilevel"/>
     <w:tmpl w:val="C31CBCE0"/>
@@ -25957,7 +27259,7 @@
       </w:rPr>
     </w:lvl>
   </w:abstractNum>
-  <w:abstractNum w:abstractNumId="71" w15:restartNumberingAfterBreak="0">
+  <w:abstractNum w:abstractNumId="72" w15:restartNumberingAfterBreak="0">
     <w:nsid w:val="342A6150"/>
     <w:multiLevelType w:val="multilevel"/>
     <w:tmpl w:val="29E0BE1C"/>
@@ -26106,7 +27408,7 @@
       </w:rPr>
     </w:lvl>
   </w:abstractNum>
-  <w:abstractNum w:abstractNumId="72" w15:restartNumberingAfterBreak="0">
+  <w:abstractNum w:abstractNumId="73" w15:restartNumberingAfterBreak="0">
     <w:nsid w:val="356F220A"/>
     <w:multiLevelType w:val="multilevel"/>
     <w:tmpl w:val="0FFA5254"/>
@@ -26255,7 +27557,7 @@
       </w:rPr>
     </w:lvl>
   </w:abstractNum>
-  <w:abstractNum w:abstractNumId="73" w15:restartNumberingAfterBreak="0">
+  <w:abstractNum w:abstractNumId="74" w15:restartNumberingAfterBreak="0">
     <w:nsid w:val="357B7363"/>
     <w:multiLevelType w:val="hybridMultilevel"/>
     <w:tmpl w:val="00D411EC"/>
@@ -26367,7 +27669,7 @@
       </w:rPr>
     </w:lvl>
   </w:abstractNum>
-  <w:abstractNum w:abstractNumId="74" w15:restartNumberingAfterBreak="0">
+  <w:abstractNum w:abstractNumId="75" w15:restartNumberingAfterBreak="0">
     <w:nsid w:val="3583100F"/>
     <w:multiLevelType w:val="hybridMultilevel"/>
     <w:tmpl w:val="848ECFAA"/>
@@ -26480,7 +27782,7 @@
       </w:rPr>
     </w:lvl>
   </w:abstractNum>
-  <w:abstractNum w:abstractNumId="75" w15:restartNumberingAfterBreak="0">
+  <w:abstractNum w:abstractNumId="76" w15:restartNumberingAfterBreak="0">
     <w:nsid w:val="3623194A"/>
     <w:multiLevelType w:val="multilevel"/>
     <w:tmpl w:val="63F4E6F0"/>
@@ -26629,7 +27931,120 @@
       </w:rPr>
     </w:lvl>
   </w:abstractNum>
-  <w:abstractNum w:abstractNumId="76" w15:restartNumberingAfterBreak="0">
+  <w:abstractNum w:abstractNumId="77" w15:restartNumberingAfterBreak="0">
+    <w:nsid w:val="363D1214"/>
+    <w:multiLevelType w:val="hybridMultilevel"/>
+    <w:tmpl w:val="6032DE12"/>
+    <w:lvl w:ilvl="0" w:tplc="04090005">
+      <w:start w:val="1"/>
+      <w:numFmt w:val="bullet"/>
+      <w:lvlText w:val=""/>
+      <w:lvlJc w:val="left"/>
+      <w:pPr>
+        <w:ind w:left="720" w:hanging="360"/>
+      </w:pPr>
+      <w:rPr>
+        <w:rFonts w:ascii="Wingdings" w:hAnsi="Wingdings" w:hint="default"/>
+      </w:rPr>
+    </w:lvl>
+    <w:lvl w:ilvl="1" w:tplc="04090003" w:tentative="1">
+      <w:start w:val="1"/>
+      <w:numFmt w:val="bullet"/>
+      <w:lvlText w:val="o"/>
+      <w:lvlJc w:val="left"/>
+      <w:pPr>
+        <w:ind w:left="1440" w:hanging="360"/>
+      </w:pPr>
+      <w:rPr>
+        <w:rFonts w:ascii="Courier New" w:hAnsi="Courier New" w:cs="Courier New" w:hint="default"/>
+      </w:rPr>
+    </w:lvl>
+    <w:lvl w:ilvl="2" w:tplc="04090005" w:tentative="1">
+      <w:start w:val="1"/>
+      <w:numFmt w:val="bullet"/>
+      <w:lvlText w:val=""/>
+      <w:lvlJc w:val="left"/>
+      <w:pPr>
+        <w:ind w:left="2160" w:hanging="360"/>
+      </w:pPr>
+      <w:rPr>
+        <w:rFonts w:ascii="Wingdings" w:hAnsi="Wingdings" w:hint="default"/>
+      </w:rPr>
+    </w:lvl>
+    <w:lvl w:ilvl="3" w:tplc="04090001" w:tentative="1">
+      <w:start w:val="1"/>
+      <w:numFmt w:val="bullet"/>
+      <w:lvlText w:val=""/>
+      <w:lvlJc w:val="left"/>
+      <w:pPr>
+        <w:ind w:left="2880" w:hanging="360"/>
+      </w:pPr>
+      <w:rPr>
+        <w:rFonts w:ascii="Symbol" w:hAnsi="Symbol" w:hint="default"/>
+      </w:rPr>
+    </w:lvl>
+    <w:lvl w:ilvl="4" w:tplc="04090003" w:tentative="1">
+      <w:start w:val="1"/>
+      <w:numFmt w:val="bullet"/>
+      <w:lvlText w:val="o"/>
+      <w:lvlJc w:val="left"/>
+      <w:pPr>
+        <w:ind w:left="3600" w:hanging="360"/>
+      </w:pPr>
+      <w:rPr>
+        <w:rFonts w:ascii="Courier New" w:hAnsi="Courier New" w:cs="Courier New" w:hint="default"/>
+      </w:rPr>
+    </w:lvl>
+    <w:lvl w:ilvl="5" w:tplc="04090005" w:tentative="1">
+      <w:start w:val="1"/>
+      <w:numFmt w:val="bullet"/>
+      <w:lvlText w:val=""/>
+      <w:lvlJc w:val="left"/>
+      <w:pPr>
+        <w:ind w:left="4320" w:hanging="360"/>
+      </w:pPr>
+      <w:rPr>
+        <w:rFonts w:ascii="Wingdings" w:hAnsi="Wingdings" w:hint="default"/>
+      </w:rPr>
+    </w:lvl>
+    <w:lvl w:ilvl="6" w:tplc="04090001" w:tentative="1">
+      <w:start w:val="1"/>
+      <w:numFmt w:val="bullet"/>
+      <w:lvlText w:val=""/>
+      <w:lvlJc w:val="left"/>
+      <w:pPr>
+        <w:ind w:left="5040" w:hanging="360"/>
+      </w:pPr>
+      <w:rPr>
+        <w:rFonts w:ascii="Symbol" w:hAnsi="Symbol" w:hint="default"/>
+      </w:rPr>
+    </w:lvl>
+    <w:lvl w:ilvl="7" w:tplc="04090003" w:tentative="1">
+      <w:start w:val="1"/>
+      <w:numFmt w:val="bullet"/>
+      <w:lvlText w:val="o"/>
+      <w:lvlJc w:val="left"/>
+      <w:pPr>
+        <w:ind w:left="5760" w:hanging="360"/>
+      </w:pPr>
+      <w:rPr>
+        <w:rFonts w:ascii="Courier New" w:hAnsi="Courier New" w:cs="Courier New" w:hint="default"/>
+      </w:rPr>
+    </w:lvl>
+    <w:lvl w:ilvl="8" w:tplc="04090005" w:tentative="1">
+      <w:start w:val="1"/>
+      <w:numFmt w:val="bullet"/>
+      <w:lvlText w:val=""/>
+      <w:lvlJc w:val="left"/>
+      <w:pPr>
+        <w:ind w:left="6480" w:hanging="360"/>
+      </w:pPr>
+      <w:rPr>
+        <w:rFonts w:ascii="Wingdings" w:hAnsi="Wingdings" w:hint="default"/>
+      </w:rPr>
+    </w:lvl>
+  </w:abstractNum>
+  <w:abstractNum w:abstractNumId="78" w15:restartNumberingAfterBreak="0">
     <w:nsid w:val="36AD3FB0"/>
     <w:multiLevelType w:val="multilevel"/>
     <w:tmpl w:val="0644AEEA"/>
@@ -26778,7 +28193,7 @@
       </w:rPr>
     </w:lvl>
   </w:abstractNum>
-  <w:abstractNum w:abstractNumId="77" w15:restartNumberingAfterBreak="0">
+  <w:abstractNum w:abstractNumId="79" w15:restartNumberingAfterBreak="0">
     <w:nsid w:val="371A2CDE"/>
     <w:multiLevelType w:val="hybridMultilevel"/>
     <w:tmpl w:val="EA9C00CC"/>
@@ -26890,7 +28305,7 @@
       </w:rPr>
     </w:lvl>
   </w:abstractNum>
-  <w:abstractNum w:abstractNumId="78" w15:restartNumberingAfterBreak="0">
+  <w:abstractNum w:abstractNumId="80" w15:restartNumberingAfterBreak="0">
     <w:nsid w:val="373D5E48"/>
     <w:multiLevelType w:val="hybridMultilevel"/>
     <w:tmpl w:val="8A6E38C0"/>
@@ -27003,7 +28418,7 @@
       </w:rPr>
     </w:lvl>
   </w:abstractNum>
-  <w:abstractNum w:abstractNumId="79" w15:restartNumberingAfterBreak="0">
+  <w:abstractNum w:abstractNumId="81" w15:restartNumberingAfterBreak="0">
     <w:nsid w:val="37864C4E"/>
     <w:multiLevelType w:val="hybridMultilevel"/>
     <w:tmpl w:val="02EEC1AA"/>
@@ -27089,7 +28504,7 @@
       </w:pPr>
     </w:lvl>
   </w:abstractNum>
-  <w:abstractNum w:abstractNumId="80" w15:restartNumberingAfterBreak="0">
+  <w:abstractNum w:abstractNumId="82" w15:restartNumberingAfterBreak="0">
     <w:nsid w:val="3B446B2D"/>
     <w:multiLevelType w:val="hybridMultilevel"/>
     <w:tmpl w:val="B638176E"/>
@@ -27201,7 +28616,7 @@
       </w:rPr>
     </w:lvl>
   </w:abstractNum>
-  <w:abstractNum w:abstractNumId="81" w15:restartNumberingAfterBreak="0">
+  <w:abstractNum w:abstractNumId="83" w15:restartNumberingAfterBreak="0">
     <w:nsid w:val="3B6B41F5"/>
     <w:multiLevelType w:val="hybridMultilevel"/>
     <w:tmpl w:val="10A26168"/>
@@ -27313,7 +28728,7 @@
       </w:rPr>
     </w:lvl>
   </w:abstractNum>
-  <w:abstractNum w:abstractNumId="82" w15:restartNumberingAfterBreak="0">
+  <w:abstractNum w:abstractNumId="84" w15:restartNumberingAfterBreak="0">
     <w:nsid w:val="3C5546BA"/>
     <w:multiLevelType w:val="hybridMultilevel"/>
     <w:tmpl w:val="3434F5E4"/>
@@ -27425,7 +28840,7 @@
       </w:rPr>
     </w:lvl>
   </w:abstractNum>
-  <w:abstractNum w:abstractNumId="83" w15:restartNumberingAfterBreak="0">
+  <w:abstractNum w:abstractNumId="85" w15:restartNumberingAfterBreak="0">
     <w:nsid w:val="3C623C55"/>
     <w:multiLevelType w:val="multilevel"/>
     <w:tmpl w:val="A0B0E8F4"/>
@@ -27574,7 +28989,7 @@
       </w:rPr>
     </w:lvl>
   </w:abstractNum>
-  <w:abstractNum w:abstractNumId="84" w15:restartNumberingAfterBreak="0">
+  <w:abstractNum w:abstractNumId="86" w15:restartNumberingAfterBreak="0">
     <w:nsid w:val="3CB359E6"/>
     <w:multiLevelType w:val="hybridMultilevel"/>
     <w:tmpl w:val="368E6E8E"/>
@@ -27687,7 +29102,7 @@
       </w:rPr>
     </w:lvl>
   </w:abstractNum>
-  <w:abstractNum w:abstractNumId="85" w15:restartNumberingAfterBreak="0">
+  <w:abstractNum w:abstractNumId="87" w15:restartNumberingAfterBreak="0">
     <w:nsid w:val="3CD27F78"/>
     <w:multiLevelType w:val="multilevel"/>
     <w:tmpl w:val="FCDE767A"/>
@@ -27836,7 +29251,7 @@
       </w:rPr>
     </w:lvl>
   </w:abstractNum>
-  <w:abstractNum w:abstractNumId="86" w15:restartNumberingAfterBreak="0">
+  <w:abstractNum w:abstractNumId="88" w15:restartNumberingAfterBreak="0">
     <w:nsid w:val="3CD74B18"/>
     <w:multiLevelType w:val="hybridMultilevel"/>
     <w:tmpl w:val="2FF42220"/>
@@ -27949,7 +29364,7 @@
       </w:rPr>
     </w:lvl>
   </w:abstractNum>
-  <w:abstractNum w:abstractNumId="87" w15:restartNumberingAfterBreak="0">
+  <w:abstractNum w:abstractNumId="89" w15:restartNumberingAfterBreak="0">
     <w:nsid w:val="3D2F7E79"/>
     <w:multiLevelType w:val="hybridMultilevel"/>
     <w:tmpl w:val="6ED674BE"/>
@@ -28061,7 +29476,7 @@
       </w:rPr>
     </w:lvl>
   </w:abstractNum>
-  <w:abstractNum w:abstractNumId="88" w15:restartNumberingAfterBreak="0">
+  <w:abstractNum w:abstractNumId="90" w15:restartNumberingAfterBreak="0">
     <w:nsid w:val="3D397287"/>
     <w:multiLevelType w:val="hybridMultilevel"/>
     <w:tmpl w:val="F4503122"/>
@@ -28173,7 +29588,7 @@
       </w:rPr>
     </w:lvl>
   </w:abstractNum>
-  <w:abstractNum w:abstractNumId="89" w15:restartNumberingAfterBreak="0">
+  <w:abstractNum w:abstractNumId="91" w15:restartNumberingAfterBreak="0">
     <w:nsid w:val="3E685FF3"/>
     <w:multiLevelType w:val="multilevel"/>
     <w:tmpl w:val="7D20B538"/>
@@ -28322,7 +29737,7 @@
       </w:rPr>
     </w:lvl>
   </w:abstractNum>
-  <w:abstractNum w:abstractNumId="90" w15:restartNumberingAfterBreak="0">
+  <w:abstractNum w:abstractNumId="92" w15:restartNumberingAfterBreak="0">
     <w:nsid w:val="3F346C2C"/>
     <w:multiLevelType w:val="multilevel"/>
     <w:tmpl w:val="63F4E6F0"/>
@@ -28471,7 +29886,7 @@
       </w:rPr>
     </w:lvl>
   </w:abstractNum>
-  <w:abstractNum w:abstractNumId="91" w15:restartNumberingAfterBreak="0">
+  <w:abstractNum w:abstractNumId="93" w15:restartNumberingAfterBreak="0">
     <w:nsid w:val="3FCB1322"/>
     <w:multiLevelType w:val="hybridMultilevel"/>
     <w:tmpl w:val="55C012B2"/>
@@ -28583,7 +29998,93 @@
       </w:rPr>
     </w:lvl>
   </w:abstractNum>
-  <w:abstractNum w:abstractNumId="92" w15:restartNumberingAfterBreak="0">
+  <w:abstractNum w:abstractNumId="94" w15:restartNumberingAfterBreak="0">
+    <w:nsid w:val="40F6710A"/>
+    <w:multiLevelType w:val="hybridMultilevel"/>
+    <w:tmpl w:val="C734A186"/>
+    <w:lvl w:ilvl="0" w:tplc="0409000F">
+      <w:start w:val="1"/>
+      <w:numFmt w:val="decimal"/>
+      <w:lvlText w:val="%1."/>
+      <w:lvlJc w:val="left"/>
+      <w:pPr>
+        <w:ind w:left="720" w:hanging="360"/>
+      </w:pPr>
+    </w:lvl>
+    <w:lvl w:ilvl="1" w:tplc="04090019" w:tentative="1">
+      <w:start w:val="1"/>
+      <w:numFmt w:val="lowerLetter"/>
+      <w:lvlText w:val="%2."/>
+      <w:lvlJc w:val="left"/>
+      <w:pPr>
+        <w:ind w:left="1440" w:hanging="360"/>
+      </w:pPr>
+    </w:lvl>
+    <w:lvl w:ilvl="2" w:tplc="0409001B" w:tentative="1">
+      <w:start w:val="1"/>
+      <w:numFmt w:val="lowerRoman"/>
+      <w:lvlText w:val="%3."/>
+      <w:lvlJc w:val="right"/>
+      <w:pPr>
+        <w:ind w:left="2160" w:hanging="180"/>
+      </w:pPr>
+    </w:lvl>
+    <w:lvl w:ilvl="3" w:tplc="0409000F" w:tentative="1">
+      <w:start w:val="1"/>
+      <w:numFmt w:val="decimal"/>
+      <w:lvlText w:val="%4."/>
+      <w:lvlJc w:val="left"/>
+      <w:pPr>
+        <w:ind w:left="2880" w:hanging="360"/>
+      </w:pPr>
+    </w:lvl>
+    <w:lvl w:ilvl="4" w:tplc="04090019" w:tentative="1">
+      <w:start w:val="1"/>
+      <w:numFmt w:val="lowerLetter"/>
+      <w:lvlText w:val="%5."/>
+      <w:lvlJc w:val="left"/>
+      <w:pPr>
+        <w:ind w:left="3600" w:hanging="360"/>
+      </w:pPr>
+    </w:lvl>
+    <w:lvl w:ilvl="5" w:tplc="0409001B" w:tentative="1">
+      <w:start w:val="1"/>
+      <w:numFmt w:val="lowerRoman"/>
+      <w:lvlText w:val="%6."/>
+      <w:lvlJc w:val="right"/>
+      <w:pPr>
+        <w:ind w:left="4320" w:hanging="180"/>
+      </w:pPr>
+    </w:lvl>
+    <w:lvl w:ilvl="6" w:tplc="0409000F" w:tentative="1">
+      <w:start w:val="1"/>
+      <w:numFmt w:val="decimal"/>
+      <w:lvlText w:val="%7."/>
+      <w:lvlJc w:val="left"/>
+      <w:pPr>
+        <w:ind w:left="5040" w:hanging="360"/>
+      </w:pPr>
+    </w:lvl>
+    <w:lvl w:ilvl="7" w:tplc="04090019" w:tentative="1">
+      <w:start w:val="1"/>
+      <w:numFmt w:val="lowerLetter"/>
+      <w:lvlText w:val="%8."/>
+      <w:lvlJc w:val="left"/>
+      <w:pPr>
+        <w:ind w:left="5760" w:hanging="360"/>
+      </w:pPr>
+    </w:lvl>
+    <w:lvl w:ilvl="8" w:tplc="0409001B" w:tentative="1">
+      <w:start w:val="1"/>
+      <w:numFmt w:val="lowerRoman"/>
+      <w:lvlText w:val="%9."/>
+      <w:lvlJc w:val="right"/>
+      <w:pPr>
+        <w:ind w:left="6480" w:hanging="180"/>
+      </w:pPr>
+    </w:lvl>
+  </w:abstractNum>
+  <w:abstractNum w:abstractNumId="95" w15:restartNumberingAfterBreak="0">
     <w:nsid w:val="41A9344F"/>
     <w:multiLevelType w:val="hybridMultilevel"/>
     <w:tmpl w:val="0FB60038"/>
@@ -28696,7 +30197,7 @@
       </w:rPr>
     </w:lvl>
   </w:abstractNum>
-  <w:abstractNum w:abstractNumId="93" w15:restartNumberingAfterBreak="0">
+  <w:abstractNum w:abstractNumId="96" w15:restartNumberingAfterBreak="0">
     <w:nsid w:val="42004E1F"/>
     <w:multiLevelType w:val="hybridMultilevel"/>
     <w:tmpl w:val="770C8314"/>
@@ -28808,7 +30309,7 @@
       </w:rPr>
     </w:lvl>
   </w:abstractNum>
-  <w:abstractNum w:abstractNumId="94" w15:restartNumberingAfterBreak="0">
+  <w:abstractNum w:abstractNumId="97" w15:restartNumberingAfterBreak="0">
     <w:nsid w:val="439F7169"/>
     <w:multiLevelType w:val="hybridMultilevel"/>
     <w:tmpl w:val="1884EDCA"/>
@@ -28921,7 +30422,7 @@
       </w:rPr>
     </w:lvl>
   </w:abstractNum>
-  <w:abstractNum w:abstractNumId="95" w15:restartNumberingAfterBreak="0">
+  <w:abstractNum w:abstractNumId="98" w15:restartNumberingAfterBreak="0">
     <w:nsid w:val="43EA1D69"/>
     <w:multiLevelType w:val="multilevel"/>
     <w:tmpl w:val="DFEC23EC"/>
@@ -29070,7 +30571,7 @@
       </w:rPr>
     </w:lvl>
   </w:abstractNum>
-  <w:abstractNum w:abstractNumId="96" w15:restartNumberingAfterBreak="0">
+  <w:abstractNum w:abstractNumId="99" w15:restartNumberingAfterBreak="0">
     <w:nsid w:val="44320084"/>
     <w:multiLevelType w:val="hybridMultilevel"/>
     <w:tmpl w:val="CE5076D4"/>
@@ -29182,7 +30683,7 @@
       </w:rPr>
     </w:lvl>
   </w:abstractNum>
-  <w:abstractNum w:abstractNumId="97" w15:restartNumberingAfterBreak="0">
+  <w:abstractNum w:abstractNumId="100" w15:restartNumberingAfterBreak="0">
     <w:nsid w:val="44554567"/>
     <w:multiLevelType w:val="hybridMultilevel"/>
     <w:tmpl w:val="78748252"/>
@@ -29294,7 +30795,7 @@
       </w:rPr>
     </w:lvl>
   </w:abstractNum>
-  <w:abstractNum w:abstractNumId="98" w15:restartNumberingAfterBreak="0">
+  <w:abstractNum w:abstractNumId="101" w15:restartNumberingAfterBreak="0">
     <w:nsid w:val="45336EC4"/>
     <w:multiLevelType w:val="hybridMultilevel"/>
     <w:tmpl w:val="5D74BC2A"/>
@@ -29407,7 +30908,7 @@
       </w:rPr>
     </w:lvl>
   </w:abstractNum>
-  <w:abstractNum w:abstractNumId="99" w15:restartNumberingAfterBreak="0">
+  <w:abstractNum w:abstractNumId="102" w15:restartNumberingAfterBreak="0">
     <w:nsid w:val="49005094"/>
     <w:multiLevelType w:val="hybridMultilevel"/>
     <w:tmpl w:val="14848CBE"/>
@@ -29519,7 +31020,7 @@
       </w:rPr>
     </w:lvl>
   </w:abstractNum>
-  <w:abstractNum w:abstractNumId="100" w15:restartNumberingAfterBreak="0">
+  <w:abstractNum w:abstractNumId="103" w15:restartNumberingAfterBreak="0">
     <w:nsid w:val="49243794"/>
     <w:multiLevelType w:val="multilevel"/>
     <w:tmpl w:val="E7681528"/>
@@ -29668,7 +31169,7 @@
       </w:rPr>
     </w:lvl>
   </w:abstractNum>
-  <w:abstractNum w:abstractNumId="101" w15:restartNumberingAfterBreak="0">
+  <w:abstractNum w:abstractNumId="104" w15:restartNumberingAfterBreak="0">
     <w:nsid w:val="49DE12C1"/>
     <w:multiLevelType w:val="hybridMultilevel"/>
     <w:tmpl w:val="4CF0F30E"/>
@@ -29754,7 +31255,7 @@
       </w:pPr>
     </w:lvl>
   </w:abstractNum>
-  <w:abstractNum w:abstractNumId="102" w15:restartNumberingAfterBreak="0">
+  <w:abstractNum w:abstractNumId="105" w15:restartNumberingAfterBreak="0">
     <w:nsid w:val="4A880990"/>
     <w:multiLevelType w:val="hybridMultilevel"/>
     <w:tmpl w:val="F17E12C2"/>
@@ -29866,7 +31367,7 @@
       </w:rPr>
     </w:lvl>
   </w:abstractNum>
-  <w:abstractNum w:abstractNumId="103" w15:restartNumberingAfterBreak="0">
+  <w:abstractNum w:abstractNumId="106" w15:restartNumberingAfterBreak="0">
     <w:nsid w:val="4B182B12"/>
     <w:multiLevelType w:val="hybridMultilevel"/>
     <w:tmpl w:val="31C486B4"/>
@@ -29978,7 +31479,7 @@
       </w:rPr>
     </w:lvl>
   </w:abstractNum>
-  <w:abstractNum w:abstractNumId="104" w15:restartNumberingAfterBreak="0">
+  <w:abstractNum w:abstractNumId="107" w15:restartNumberingAfterBreak="0">
     <w:nsid w:val="4BA13766"/>
     <w:multiLevelType w:val="multilevel"/>
     <w:tmpl w:val="63F4E6F0"/>
@@ -30127,7 +31628,7 @@
       </w:rPr>
     </w:lvl>
   </w:abstractNum>
-  <w:abstractNum w:abstractNumId="105" w15:restartNumberingAfterBreak="0">
+  <w:abstractNum w:abstractNumId="108" w15:restartNumberingAfterBreak="0">
     <w:nsid w:val="4E65371E"/>
     <w:multiLevelType w:val="hybridMultilevel"/>
     <w:tmpl w:val="53EE4538"/>
@@ -30239,7 +31740,7 @@
       </w:rPr>
     </w:lvl>
   </w:abstractNum>
-  <w:abstractNum w:abstractNumId="106" w15:restartNumberingAfterBreak="0">
+  <w:abstractNum w:abstractNumId="109" w15:restartNumberingAfterBreak="0">
     <w:nsid w:val="4E9A3F16"/>
     <w:multiLevelType w:val="multilevel"/>
     <w:tmpl w:val="63F4E6F0"/>
@@ -30388,7 +31889,7 @@
       </w:rPr>
     </w:lvl>
   </w:abstractNum>
-  <w:abstractNum w:abstractNumId="107" w15:restartNumberingAfterBreak="0">
+  <w:abstractNum w:abstractNumId="110" w15:restartNumberingAfterBreak="0">
     <w:nsid w:val="500B790D"/>
     <w:multiLevelType w:val="multilevel"/>
     <w:tmpl w:val="63F4E6F0"/>
@@ -30537,7 +32038,7 @@
       </w:rPr>
     </w:lvl>
   </w:abstractNum>
-  <w:abstractNum w:abstractNumId="108" w15:restartNumberingAfterBreak="0">
+  <w:abstractNum w:abstractNumId="111" w15:restartNumberingAfterBreak="0">
     <w:nsid w:val="526538B7"/>
     <w:multiLevelType w:val="hybridMultilevel"/>
     <w:tmpl w:val="E6A017F2"/>
@@ -30650,7 +32151,7 @@
       </w:rPr>
     </w:lvl>
   </w:abstractNum>
-  <w:abstractNum w:abstractNumId="109" w15:restartNumberingAfterBreak="0">
+  <w:abstractNum w:abstractNumId="112" w15:restartNumberingAfterBreak="0">
     <w:nsid w:val="537E56D9"/>
     <w:multiLevelType w:val="multilevel"/>
     <w:tmpl w:val="1B6E8B6A"/>
@@ -30799,7 +32300,7 @@
       </w:rPr>
     </w:lvl>
   </w:abstractNum>
-  <w:abstractNum w:abstractNumId="110" w15:restartNumberingAfterBreak="0">
+  <w:abstractNum w:abstractNumId="113" w15:restartNumberingAfterBreak="0">
     <w:nsid w:val="53E6601E"/>
     <w:multiLevelType w:val="hybridMultilevel"/>
     <w:tmpl w:val="66F0666A"/>
@@ -30912,7 +32413,7 @@
       </w:rPr>
     </w:lvl>
   </w:abstractNum>
-  <w:abstractNum w:abstractNumId="111" w15:restartNumberingAfterBreak="0">
+  <w:abstractNum w:abstractNumId="114" w15:restartNumberingAfterBreak="0">
     <w:nsid w:val="551D6F91"/>
     <w:multiLevelType w:val="hybridMultilevel"/>
     <w:tmpl w:val="9522B3C6"/>
@@ -31024,7 +32525,7 @@
       </w:rPr>
     </w:lvl>
   </w:abstractNum>
-  <w:abstractNum w:abstractNumId="112" w15:restartNumberingAfterBreak="0">
+  <w:abstractNum w:abstractNumId="115" w15:restartNumberingAfterBreak="0">
     <w:nsid w:val="555451DA"/>
     <w:multiLevelType w:val="hybridMultilevel"/>
     <w:tmpl w:val="CAB2A550"/>
@@ -31137,7 +32638,7 @@
       </w:rPr>
     </w:lvl>
   </w:abstractNum>
-  <w:abstractNum w:abstractNumId="113" w15:restartNumberingAfterBreak="0">
+  <w:abstractNum w:abstractNumId="116" w15:restartNumberingAfterBreak="0">
     <w:nsid w:val="55655B93"/>
     <w:multiLevelType w:val="multilevel"/>
     <w:tmpl w:val="9C88A4A8"/>
@@ -31286,7 +32787,7 @@
       </w:rPr>
     </w:lvl>
   </w:abstractNum>
-  <w:abstractNum w:abstractNumId="114" w15:restartNumberingAfterBreak="0">
+  <w:abstractNum w:abstractNumId="117" w15:restartNumberingAfterBreak="0">
     <w:nsid w:val="55B95BED"/>
     <w:multiLevelType w:val="hybridMultilevel"/>
     <w:tmpl w:val="A9B866FC"/>
@@ -31399,7 +32900,7 @@
       </w:rPr>
     </w:lvl>
   </w:abstractNum>
-  <w:abstractNum w:abstractNumId="115" w15:restartNumberingAfterBreak="0">
+  <w:abstractNum w:abstractNumId="118" w15:restartNumberingAfterBreak="0">
     <w:nsid w:val="562D4F1F"/>
     <w:multiLevelType w:val="hybridMultilevel"/>
     <w:tmpl w:val="1FF8D31C"/>
@@ -31511,7 +33012,7 @@
       </w:rPr>
     </w:lvl>
   </w:abstractNum>
-  <w:abstractNum w:abstractNumId="116" w15:restartNumberingAfterBreak="0">
+  <w:abstractNum w:abstractNumId="119" w15:restartNumberingAfterBreak="0">
     <w:nsid w:val="565A0C8B"/>
     <w:multiLevelType w:val="multilevel"/>
     <w:tmpl w:val="AB24FF2E"/>
@@ -31660,7 +33161,7 @@
       </w:rPr>
     </w:lvl>
   </w:abstractNum>
-  <w:abstractNum w:abstractNumId="117" w15:restartNumberingAfterBreak="0">
+  <w:abstractNum w:abstractNumId="120" w15:restartNumberingAfterBreak="0">
     <w:nsid w:val="566E7C65"/>
     <w:multiLevelType w:val="multilevel"/>
     <w:tmpl w:val="28803B4C"/>
@@ -31809,7 +33310,7 @@
       </w:rPr>
     </w:lvl>
   </w:abstractNum>
-  <w:abstractNum w:abstractNumId="118" w15:restartNumberingAfterBreak="0">
+  <w:abstractNum w:abstractNumId="121" w15:restartNumberingAfterBreak="0">
     <w:nsid w:val="57407594"/>
     <w:multiLevelType w:val="multilevel"/>
     <w:tmpl w:val="E6E2F8AE"/>
@@ -31958,7 +33459,7 @@
       </w:rPr>
     </w:lvl>
   </w:abstractNum>
-  <w:abstractNum w:abstractNumId="119" w15:restartNumberingAfterBreak="0">
+  <w:abstractNum w:abstractNumId="122" w15:restartNumberingAfterBreak="0">
     <w:nsid w:val="577F771B"/>
     <w:multiLevelType w:val="hybridMultilevel"/>
     <w:tmpl w:val="0F2C5914"/>
@@ -32070,7 +33571,7 @@
       </w:rPr>
     </w:lvl>
   </w:abstractNum>
-  <w:abstractNum w:abstractNumId="120" w15:restartNumberingAfterBreak="0">
+  <w:abstractNum w:abstractNumId="123" w15:restartNumberingAfterBreak="0">
     <w:nsid w:val="57C43CDD"/>
     <w:multiLevelType w:val="hybridMultilevel"/>
     <w:tmpl w:val="6C94FB5E"/>
@@ -32183,7 +33684,7 @@
       </w:rPr>
     </w:lvl>
   </w:abstractNum>
-  <w:abstractNum w:abstractNumId="121" w15:restartNumberingAfterBreak="0">
+  <w:abstractNum w:abstractNumId="124" w15:restartNumberingAfterBreak="0">
     <w:nsid w:val="58393977"/>
     <w:multiLevelType w:val="hybridMultilevel"/>
     <w:tmpl w:val="985A5484"/>
@@ -32296,7 +33797,7 @@
       </w:rPr>
     </w:lvl>
   </w:abstractNum>
-  <w:abstractNum w:abstractNumId="122" w15:restartNumberingAfterBreak="0">
+  <w:abstractNum w:abstractNumId="125" w15:restartNumberingAfterBreak="0">
     <w:nsid w:val="58993A3F"/>
     <w:multiLevelType w:val="hybridMultilevel"/>
     <w:tmpl w:val="5344B292"/>
@@ -32385,7 +33886,7 @@
       </w:pPr>
     </w:lvl>
   </w:abstractNum>
-  <w:abstractNum w:abstractNumId="123" w15:restartNumberingAfterBreak="0">
+  <w:abstractNum w:abstractNumId="126" w15:restartNumberingAfterBreak="0">
     <w:nsid w:val="59EB4CE4"/>
     <w:multiLevelType w:val="multilevel"/>
     <w:tmpl w:val="63F4E6F0"/>
@@ -32534,7 +34035,7 @@
       </w:rPr>
     </w:lvl>
   </w:abstractNum>
-  <w:abstractNum w:abstractNumId="124" w15:restartNumberingAfterBreak="0">
+  <w:abstractNum w:abstractNumId="127" w15:restartNumberingAfterBreak="0">
     <w:nsid w:val="5A067370"/>
     <w:multiLevelType w:val="hybridMultilevel"/>
     <w:tmpl w:val="9CB8C76C"/>
@@ -32647,7 +34148,7 @@
       </w:rPr>
     </w:lvl>
   </w:abstractNum>
-  <w:abstractNum w:abstractNumId="125" w15:restartNumberingAfterBreak="0">
+  <w:abstractNum w:abstractNumId="128" w15:restartNumberingAfterBreak="0">
     <w:nsid w:val="5BD11962"/>
     <w:multiLevelType w:val="hybridMultilevel"/>
     <w:tmpl w:val="89A4B834"/>
@@ -32736,7 +34237,7 @@
       </w:pPr>
     </w:lvl>
   </w:abstractNum>
-  <w:abstractNum w:abstractNumId="126" w15:restartNumberingAfterBreak="0">
+  <w:abstractNum w:abstractNumId="129" w15:restartNumberingAfterBreak="0">
     <w:nsid w:val="5C950DBA"/>
     <w:multiLevelType w:val="hybridMultilevel"/>
     <w:tmpl w:val="7D78F950"/>
@@ -32848,7 +34349,7 @@
       </w:rPr>
     </w:lvl>
   </w:abstractNum>
-  <w:abstractNum w:abstractNumId="127" w15:restartNumberingAfterBreak="0">
+  <w:abstractNum w:abstractNumId="130" w15:restartNumberingAfterBreak="0">
     <w:nsid w:val="5D2A5D3B"/>
     <w:multiLevelType w:val="hybridMultilevel"/>
     <w:tmpl w:val="3AF89EA6"/>
@@ -32939,7 +34440,7 @@
       </w:pPr>
     </w:lvl>
   </w:abstractNum>
-  <w:abstractNum w:abstractNumId="128" w15:restartNumberingAfterBreak="0">
+  <w:abstractNum w:abstractNumId="131" w15:restartNumberingAfterBreak="0">
     <w:nsid w:val="5D9E49FD"/>
     <w:multiLevelType w:val="hybridMultilevel"/>
     <w:tmpl w:val="4EE40BB4"/>
@@ -33051,7 +34552,7 @@
       </w:rPr>
     </w:lvl>
   </w:abstractNum>
-  <w:abstractNum w:abstractNumId="129" w15:restartNumberingAfterBreak="0">
+  <w:abstractNum w:abstractNumId="132" w15:restartNumberingAfterBreak="0">
     <w:nsid w:val="5DB7107D"/>
     <w:multiLevelType w:val="multilevel"/>
     <w:tmpl w:val="6520107A"/>
@@ -33200,7 +34701,7 @@
       </w:rPr>
     </w:lvl>
   </w:abstractNum>
-  <w:abstractNum w:abstractNumId="130" w15:restartNumberingAfterBreak="0">
+  <w:abstractNum w:abstractNumId="133" w15:restartNumberingAfterBreak="0">
     <w:nsid w:val="5E9370A7"/>
     <w:multiLevelType w:val="hybridMultilevel"/>
     <w:tmpl w:val="13480456"/>
@@ -33286,7 +34787,7 @@
       </w:pPr>
     </w:lvl>
   </w:abstractNum>
-  <w:abstractNum w:abstractNumId="131" w15:restartNumberingAfterBreak="0">
+  <w:abstractNum w:abstractNumId="134" w15:restartNumberingAfterBreak="0">
     <w:nsid w:val="60421322"/>
     <w:multiLevelType w:val="hybridMultilevel"/>
     <w:tmpl w:val="447CDBDC"/>
@@ -33398,7 +34899,7 @@
       </w:rPr>
     </w:lvl>
   </w:abstractNum>
-  <w:abstractNum w:abstractNumId="132" w15:restartNumberingAfterBreak="0">
+  <w:abstractNum w:abstractNumId="135" w15:restartNumberingAfterBreak="0">
     <w:nsid w:val="61926C31"/>
     <w:multiLevelType w:val="hybridMultilevel"/>
     <w:tmpl w:val="AFD27E5C"/>
@@ -33511,7 +35012,7 @@
       </w:rPr>
     </w:lvl>
   </w:abstractNum>
-  <w:abstractNum w:abstractNumId="133" w15:restartNumberingAfterBreak="0">
+  <w:abstractNum w:abstractNumId="136" w15:restartNumberingAfterBreak="0">
     <w:nsid w:val="622F5FC7"/>
     <w:multiLevelType w:val="hybridMultilevel"/>
     <w:tmpl w:val="49A6C2A6"/>
@@ -33624,7 +35125,7 @@
       </w:rPr>
     </w:lvl>
   </w:abstractNum>
-  <w:abstractNum w:abstractNumId="134" w15:restartNumberingAfterBreak="0">
+  <w:abstractNum w:abstractNumId="137" w15:restartNumberingAfterBreak="0">
     <w:nsid w:val="62AC33B4"/>
     <w:multiLevelType w:val="multilevel"/>
     <w:tmpl w:val="A074F3CA"/>
@@ -33773,7 +35274,7 @@
       </w:rPr>
     </w:lvl>
   </w:abstractNum>
-  <w:abstractNum w:abstractNumId="135" w15:restartNumberingAfterBreak="0">
+  <w:abstractNum w:abstractNumId="138" w15:restartNumberingAfterBreak="0">
     <w:nsid w:val="63B44674"/>
     <w:multiLevelType w:val="multilevel"/>
     <w:tmpl w:val="08F4FA9A"/>
@@ -33922,7 +35423,7 @@
       </w:rPr>
     </w:lvl>
   </w:abstractNum>
-  <w:abstractNum w:abstractNumId="136" w15:restartNumberingAfterBreak="0">
+  <w:abstractNum w:abstractNumId="139" w15:restartNumberingAfterBreak="0">
     <w:nsid w:val="63C245D4"/>
     <w:multiLevelType w:val="hybridMultilevel"/>
     <w:tmpl w:val="E1563A56"/>
@@ -34034,7 +35535,7 @@
       </w:rPr>
     </w:lvl>
   </w:abstractNum>
-  <w:abstractNum w:abstractNumId="137" w15:restartNumberingAfterBreak="0">
+  <w:abstractNum w:abstractNumId="140" w15:restartNumberingAfterBreak="0">
     <w:nsid w:val="64F30198"/>
     <w:multiLevelType w:val="multilevel"/>
     <w:tmpl w:val="63F4E6F0"/>
@@ -34183,7 +35684,7 @@
       </w:rPr>
     </w:lvl>
   </w:abstractNum>
-  <w:abstractNum w:abstractNumId="138" w15:restartNumberingAfterBreak="0">
+  <w:abstractNum w:abstractNumId="141" w15:restartNumberingAfterBreak="0">
     <w:nsid w:val="65AF2502"/>
     <w:multiLevelType w:val="hybridMultilevel"/>
     <w:tmpl w:val="FB2A44D8"/>
@@ -34296,7 +35797,7 @@
       </w:rPr>
     </w:lvl>
   </w:abstractNum>
-  <w:abstractNum w:abstractNumId="139" w15:restartNumberingAfterBreak="0">
+  <w:abstractNum w:abstractNumId="142" w15:restartNumberingAfterBreak="0">
     <w:nsid w:val="671614F0"/>
     <w:multiLevelType w:val="multilevel"/>
     <w:tmpl w:val="63F4E6F0"/>
@@ -34445,7 +35946,7 @@
       </w:rPr>
     </w:lvl>
   </w:abstractNum>
-  <w:abstractNum w:abstractNumId="140" w15:restartNumberingAfterBreak="0">
+  <w:abstractNum w:abstractNumId="143" w15:restartNumberingAfterBreak="0">
     <w:nsid w:val="6859691D"/>
     <w:multiLevelType w:val="multilevel"/>
     <w:tmpl w:val="826A9D48"/>
@@ -34594,7 +36095,7 @@
       </w:rPr>
     </w:lvl>
   </w:abstractNum>
-  <w:abstractNum w:abstractNumId="141" w15:restartNumberingAfterBreak="0">
+  <w:abstractNum w:abstractNumId="144" w15:restartNumberingAfterBreak="0">
     <w:nsid w:val="68817757"/>
     <w:multiLevelType w:val="multilevel"/>
     <w:tmpl w:val="34EE1968"/>
@@ -34743,7 +36244,7 @@
       </w:rPr>
     </w:lvl>
   </w:abstractNum>
-  <w:abstractNum w:abstractNumId="142" w15:restartNumberingAfterBreak="0">
+  <w:abstractNum w:abstractNumId="145" w15:restartNumberingAfterBreak="0">
     <w:nsid w:val="68AE31AF"/>
     <w:multiLevelType w:val="hybridMultilevel"/>
     <w:tmpl w:val="9EB648FC"/>
@@ -34856,7 +36357,7 @@
       </w:rPr>
     </w:lvl>
   </w:abstractNum>
-  <w:abstractNum w:abstractNumId="143" w15:restartNumberingAfterBreak="0">
+  <w:abstractNum w:abstractNumId="146" w15:restartNumberingAfterBreak="0">
     <w:nsid w:val="68BE10E8"/>
     <w:multiLevelType w:val="hybridMultilevel"/>
     <w:tmpl w:val="326CD592"/>
@@ -34969,7 +36470,7 @@
       </w:rPr>
     </w:lvl>
   </w:abstractNum>
-  <w:abstractNum w:abstractNumId="144" w15:restartNumberingAfterBreak="0">
+  <w:abstractNum w:abstractNumId="147" w15:restartNumberingAfterBreak="0">
     <w:nsid w:val="68E86299"/>
     <w:multiLevelType w:val="hybridMultilevel"/>
     <w:tmpl w:val="9B5CBEE8"/>
@@ -35055,7 +36556,7 @@
       </w:pPr>
     </w:lvl>
   </w:abstractNum>
-  <w:abstractNum w:abstractNumId="145" w15:restartNumberingAfterBreak="0">
+  <w:abstractNum w:abstractNumId="148" w15:restartNumberingAfterBreak="0">
     <w:nsid w:val="69996D9A"/>
     <w:multiLevelType w:val="multilevel"/>
     <w:tmpl w:val="1780FC38"/>
@@ -35204,7 +36705,96 @@
       </w:rPr>
     </w:lvl>
   </w:abstractNum>
-  <w:abstractNum w:abstractNumId="146" w15:restartNumberingAfterBreak="0">
+  <w:abstractNum w:abstractNumId="149" w15:restartNumberingAfterBreak="0">
+    <w:nsid w:val="6A6609CC"/>
+    <w:multiLevelType w:val="hybridMultilevel"/>
+    <w:tmpl w:val="BF8CCE7C"/>
+    <w:lvl w:ilvl="0" w:tplc="0409000F">
+      <w:start w:val="1"/>
+      <w:numFmt w:val="decimal"/>
+      <w:lvlText w:val="%1."/>
+      <w:lvlJc w:val="left"/>
+      <w:pPr>
+        <w:ind w:left="720" w:hanging="360"/>
+      </w:pPr>
+      <w:rPr>
+        <w:rFonts w:hint="default"/>
+      </w:rPr>
+    </w:lvl>
+    <w:lvl w:ilvl="1" w:tplc="04090019" w:tentative="1">
+      <w:start w:val="1"/>
+      <w:numFmt w:val="lowerLetter"/>
+      <w:lvlText w:val="%2."/>
+      <w:lvlJc w:val="left"/>
+      <w:pPr>
+        <w:ind w:left="1440" w:hanging="360"/>
+      </w:pPr>
+    </w:lvl>
+    <w:lvl w:ilvl="2" w:tplc="0409001B" w:tentative="1">
+      <w:start w:val="1"/>
+      <w:numFmt w:val="lowerRoman"/>
+      <w:lvlText w:val="%3."/>
+      <w:lvlJc w:val="right"/>
+      <w:pPr>
+        <w:ind w:left="2160" w:hanging="180"/>
+      </w:pPr>
+    </w:lvl>
+    <w:lvl w:ilvl="3" w:tplc="0409000F" w:tentative="1">
+      <w:start w:val="1"/>
+      <w:numFmt w:val="decimal"/>
+      <w:lvlText w:val="%4."/>
+      <w:lvlJc w:val="left"/>
+      <w:pPr>
+        <w:ind w:left="2880" w:hanging="360"/>
+      </w:pPr>
+    </w:lvl>
+    <w:lvl w:ilvl="4" w:tplc="04090019" w:tentative="1">
+      <w:start w:val="1"/>
+      <w:numFmt w:val="lowerLetter"/>
+      <w:lvlText w:val="%5."/>
+      <w:lvlJc w:val="left"/>
+      <w:pPr>
+        <w:ind w:left="3600" w:hanging="360"/>
+      </w:pPr>
+    </w:lvl>
+    <w:lvl w:ilvl="5" w:tplc="0409001B" w:tentative="1">
+      <w:start w:val="1"/>
+      <w:numFmt w:val="lowerRoman"/>
+      <w:lvlText w:val="%6."/>
+      <w:lvlJc w:val="right"/>
+      <w:pPr>
+        <w:ind w:left="4320" w:hanging="180"/>
+      </w:pPr>
+    </w:lvl>
+    <w:lvl w:ilvl="6" w:tplc="0409000F" w:tentative="1">
+      <w:start w:val="1"/>
+      <w:numFmt w:val="decimal"/>
+      <w:lvlText w:val="%7."/>
+      <w:lvlJc w:val="left"/>
+      <w:pPr>
+        <w:ind w:left="5040" w:hanging="360"/>
+      </w:pPr>
+    </w:lvl>
+    <w:lvl w:ilvl="7" w:tplc="04090019" w:tentative="1">
+      <w:start w:val="1"/>
+      <w:numFmt w:val="lowerLetter"/>
+      <w:lvlText w:val="%8."/>
+      <w:lvlJc w:val="left"/>
+      <w:pPr>
+        <w:ind w:left="5760" w:hanging="360"/>
+      </w:pPr>
+    </w:lvl>
+    <w:lvl w:ilvl="8" w:tplc="0409001B" w:tentative="1">
+      <w:start w:val="1"/>
+      <w:numFmt w:val="lowerRoman"/>
+      <w:lvlText w:val="%9."/>
+      <w:lvlJc w:val="right"/>
+      <w:pPr>
+        <w:ind w:left="6480" w:hanging="180"/>
+      </w:pPr>
+    </w:lvl>
+  </w:abstractNum>
+  <w:abstractNum w:abstractNumId="150" w15:restartNumberingAfterBreak="0">
     <w:nsid w:val="6B3C30B9"/>
     <w:multiLevelType w:val="hybridMultilevel"/>
     <w:tmpl w:val="C938F8DE"/>
@@ -35316,7 +36906,7 @@
       </w:rPr>
     </w:lvl>
   </w:abstractNum>
-  <w:abstractNum w:abstractNumId="147" w15:restartNumberingAfterBreak="0">
+  <w:abstractNum w:abstractNumId="151" w15:restartNumberingAfterBreak="0">
     <w:nsid w:val="6C9272BF"/>
     <w:multiLevelType w:val="hybridMultilevel"/>
     <w:tmpl w:val="AE021BFA"/>
@@ -35429,7 +37019,7 @@
       </w:rPr>
     </w:lvl>
   </w:abstractNum>
-  <w:abstractNum w:abstractNumId="148" w15:restartNumberingAfterBreak="0">
+  <w:abstractNum w:abstractNumId="152" w15:restartNumberingAfterBreak="0">
     <w:nsid w:val="6D1511A0"/>
     <w:multiLevelType w:val="hybridMultilevel"/>
     <w:tmpl w:val="AAD8B9B4"/>
@@ -35541,7 +37131,7 @@
       </w:rPr>
     </w:lvl>
   </w:abstractNum>
-  <w:abstractNum w:abstractNumId="149" w15:restartNumberingAfterBreak="0">
+  <w:abstractNum w:abstractNumId="153" w15:restartNumberingAfterBreak="0">
     <w:nsid w:val="6DD255F1"/>
     <w:multiLevelType w:val="hybridMultilevel"/>
     <w:tmpl w:val="ACBC1404"/>
@@ -35654,7 +37244,7 @@
       </w:rPr>
     </w:lvl>
   </w:abstractNum>
-  <w:abstractNum w:abstractNumId="150" w15:restartNumberingAfterBreak="0">
+  <w:abstractNum w:abstractNumId="154" w15:restartNumberingAfterBreak="0">
     <w:nsid w:val="6DDB4404"/>
     <w:multiLevelType w:val="hybridMultilevel"/>
     <w:tmpl w:val="06428E32"/>
@@ -35767,7 +37357,7 @@
       </w:rPr>
     </w:lvl>
   </w:abstractNum>
-  <w:abstractNum w:abstractNumId="151" w15:restartNumberingAfterBreak="0">
+  <w:abstractNum w:abstractNumId="155" w15:restartNumberingAfterBreak="0">
     <w:nsid w:val="6F014B3B"/>
     <w:multiLevelType w:val="hybridMultilevel"/>
     <w:tmpl w:val="C89A39BE"/>
@@ -35879,7 +37469,7 @@
       </w:rPr>
     </w:lvl>
   </w:abstractNum>
-  <w:abstractNum w:abstractNumId="152" w15:restartNumberingAfterBreak="0">
+  <w:abstractNum w:abstractNumId="156" w15:restartNumberingAfterBreak="0">
     <w:nsid w:val="6F171273"/>
     <w:multiLevelType w:val="multilevel"/>
     <w:tmpl w:val="0240C564"/>
@@ -36028,7 +37618,7 @@
       </w:rPr>
     </w:lvl>
   </w:abstractNum>
-  <w:abstractNum w:abstractNumId="153" w15:restartNumberingAfterBreak="0">
+  <w:abstractNum w:abstractNumId="157" w15:restartNumberingAfterBreak="0">
     <w:nsid w:val="6FB82AAA"/>
     <w:multiLevelType w:val="multilevel"/>
     <w:tmpl w:val="FC46C7C0"/>
@@ -36177,7 +37767,7 @@
       </w:rPr>
     </w:lvl>
   </w:abstractNum>
-  <w:abstractNum w:abstractNumId="154" w15:restartNumberingAfterBreak="0">
+  <w:abstractNum w:abstractNumId="158" w15:restartNumberingAfterBreak="0">
     <w:nsid w:val="6FD46DCF"/>
     <w:multiLevelType w:val="hybridMultilevel"/>
     <w:tmpl w:val="EF5E6EC6"/>
@@ -36290,7 +37880,7 @@
       </w:rPr>
     </w:lvl>
   </w:abstractNum>
-  <w:abstractNum w:abstractNumId="155" w15:restartNumberingAfterBreak="0">
+  <w:abstractNum w:abstractNumId="159" w15:restartNumberingAfterBreak="0">
     <w:nsid w:val="70484E38"/>
     <w:multiLevelType w:val="multilevel"/>
     <w:tmpl w:val="22B26DD2"/>
@@ -36439,7 +38029,7 @@
       </w:rPr>
     </w:lvl>
   </w:abstractNum>
-  <w:abstractNum w:abstractNumId="156" w15:restartNumberingAfterBreak="0">
+  <w:abstractNum w:abstractNumId="160" w15:restartNumberingAfterBreak="0">
     <w:nsid w:val="70CB723E"/>
     <w:multiLevelType w:val="multilevel"/>
     <w:tmpl w:val="63F4E6F0"/>
@@ -36588,7 +38178,7 @@
       </w:rPr>
     </w:lvl>
   </w:abstractNum>
-  <w:abstractNum w:abstractNumId="157" w15:restartNumberingAfterBreak="0">
+  <w:abstractNum w:abstractNumId="161" w15:restartNumberingAfterBreak="0">
     <w:nsid w:val="71DB3F58"/>
     <w:multiLevelType w:val="multilevel"/>
     <w:tmpl w:val="63F4E6F0"/>
@@ -36737,7 +38327,7 @@
       </w:rPr>
     </w:lvl>
   </w:abstractNum>
-  <w:abstractNum w:abstractNumId="158" w15:restartNumberingAfterBreak="0">
+  <w:abstractNum w:abstractNumId="162" w15:restartNumberingAfterBreak="0">
     <w:nsid w:val="72F31FF2"/>
     <w:multiLevelType w:val="hybridMultilevel"/>
     <w:tmpl w:val="5C2693A0"/>
@@ -36849,7 +38439,7 @@
       </w:rPr>
     </w:lvl>
   </w:abstractNum>
-  <w:abstractNum w:abstractNumId="159" w15:restartNumberingAfterBreak="0">
+  <w:abstractNum w:abstractNumId="163" w15:restartNumberingAfterBreak="0">
     <w:nsid w:val="75B45140"/>
     <w:multiLevelType w:val="hybridMultilevel"/>
     <w:tmpl w:val="93F8F3C4"/>
@@ -36962,7 +38552,7 @@
       </w:rPr>
     </w:lvl>
   </w:abstractNum>
-  <w:abstractNum w:abstractNumId="160" w15:restartNumberingAfterBreak="0">
+  <w:abstractNum w:abstractNumId="164" w15:restartNumberingAfterBreak="0">
     <w:nsid w:val="76F60FFE"/>
     <w:multiLevelType w:val="multilevel"/>
     <w:tmpl w:val="63F4E6F0"/>
@@ -37111,10 +38701,10 @@
       </w:rPr>
     </w:lvl>
   </w:abstractNum>
-  <w:abstractNum w:abstractNumId="161" w15:restartNumberingAfterBreak="0">
+  <w:abstractNum w:abstractNumId="165" w15:restartNumberingAfterBreak="0">
     <w:nsid w:val="772A45B4"/>
     <w:multiLevelType w:val="hybridMultilevel"/>
-    <w:tmpl w:val="833AB77E"/>
+    <w:tmpl w:val="B00AFD58"/>
     <w:lvl w:ilvl="0" w:tplc="04090005">
       <w:start w:val="1"/>
       <w:numFmt w:val="bullet"/>
@@ -37127,90 +38717,90 @@
         <w:rFonts w:ascii="Wingdings" w:hAnsi="Wingdings" w:hint="default"/>
       </w:rPr>
     </w:lvl>
-    <w:lvl w:ilvl="1" w:tplc="04090003" w:tentative="1">
+    <w:lvl w:ilvl="1" w:tplc="CDE8CF4A">
+      <w:start w:val="7"/>
+      <w:numFmt w:val="bullet"/>
+      <w:lvlText w:val="-"/>
+      <w:lvlJc w:val="left"/>
+      <w:pPr>
+        <w:ind w:left="1440" w:hanging="360"/>
+      </w:pPr>
+      <w:rPr>
+        <w:rFonts w:ascii="Times New Roman" w:eastAsiaTheme="minorHAnsi" w:hAnsi="Times New Roman" w:cs="Times New Roman" w:hint="default"/>
+      </w:rPr>
+    </w:lvl>
+    <w:lvl w:ilvl="2" w:tplc="04090005" w:tentative="1">
+      <w:start w:val="1"/>
+      <w:numFmt w:val="bullet"/>
+      <w:lvlText w:val=""/>
+      <w:lvlJc w:val="left"/>
+      <w:pPr>
+        <w:ind w:left="2160" w:hanging="360"/>
+      </w:pPr>
+      <w:rPr>
+        <w:rFonts w:ascii="Wingdings" w:hAnsi="Wingdings" w:hint="default"/>
+      </w:rPr>
+    </w:lvl>
+    <w:lvl w:ilvl="3" w:tplc="04090001" w:tentative="1">
+      <w:start w:val="1"/>
+      <w:numFmt w:val="bullet"/>
+      <w:lvlText w:val=""/>
+      <w:lvlJc w:val="left"/>
+      <w:pPr>
+        <w:ind w:left="2880" w:hanging="360"/>
+      </w:pPr>
+      <w:rPr>
+        <w:rFonts w:ascii="Symbol" w:hAnsi="Symbol" w:hint="default"/>
+      </w:rPr>
+    </w:lvl>
+    <w:lvl w:ilvl="4" w:tplc="04090003" w:tentative="1">
       <w:start w:val="1"/>
       <w:numFmt w:val="bullet"/>
       <w:lvlText w:val="o"/>
       <w:lvlJc w:val="left"/>
       <w:pPr>
-        <w:ind w:left="1440" w:hanging="360"/>
+        <w:ind w:left="3600" w:hanging="360"/>
       </w:pPr>
       <w:rPr>
         <w:rFonts w:ascii="Courier New" w:hAnsi="Courier New" w:cs="Courier New" w:hint="default"/>
       </w:rPr>
     </w:lvl>
-    <w:lvl w:ilvl="2" w:tplc="04090005" w:tentative="1">
-      <w:start w:val="1"/>
-      <w:numFmt w:val="bullet"/>
-      <w:lvlText w:val=""/>
-      <w:lvlJc w:val="left"/>
-      <w:pPr>
-        <w:ind w:left="2160" w:hanging="360"/>
-      </w:pPr>
-      <w:rPr>
-        <w:rFonts w:ascii="Wingdings" w:hAnsi="Wingdings" w:hint="default"/>
-      </w:rPr>
-    </w:lvl>
-    <w:lvl w:ilvl="3" w:tplc="04090001" w:tentative="1">
+    <w:lvl w:ilvl="5" w:tplc="04090005" w:tentative="1">
+      <w:start w:val="1"/>
+      <w:numFmt w:val="bullet"/>
+      <w:lvlText w:val=""/>
+      <w:lvlJc w:val="left"/>
+      <w:pPr>
+        <w:ind w:left="4320" w:hanging="360"/>
+      </w:pPr>
+      <w:rPr>
+        <w:rFonts w:ascii="Wingdings" w:hAnsi="Wingdings" w:hint="default"/>
+      </w:rPr>
+    </w:lvl>
+    <w:lvl w:ilvl="6" w:tplc="04090001" w:tentative="1">
       <w:start w:val="1"/>
       <w:numFmt w:val="bullet"/>
       <w:lvlText w:val=""/>
       <w:lvlJc w:val="left"/>
       <w:pPr>
-        <w:ind w:left="2880" w:hanging="360"/>
+        <w:ind w:left="5040" w:hanging="360"/>
       </w:pPr>
       <w:rPr>
         <w:rFonts w:ascii="Symbol" w:hAnsi="Symbol" w:hint="default"/>
       </w:rPr>
     </w:lvl>
-    <w:lvl w:ilvl="4" w:tplc="04090003" w:tentative="1">
+    <w:lvl w:ilvl="7" w:tplc="04090003" w:tentative="1">
       <w:start w:val="1"/>
       <w:numFmt w:val="bullet"/>
       <w:lvlText w:val="o"/>
       <w:lvlJc w:val="left"/>
       <w:pPr>
-        <w:ind w:left="3600" w:hanging="360"/>
+        <w:ind w:left="5760" w:hanging="360"/>
       </w:pPr>
       <w:rPr>
         <w:rFonts w:ascii="Courier New" w:hAnsi="Courier New" w:cs="Courier New" w:hint="default"/>
       </w:rPr>
     </w:lvl>
-    <w:lvl w:ilvl="5" w:tplc="04090005" w:tentative="1">
-      <w:start w:val="1"/>
-      <w:numFmt w:val="bullet"/>
-      <w:lvlText w:val=""/>
-      <w:lvlJc w:val="left"/>
-      <w:pPr>
-        <w:ind w:left="4320" w:hanging="360"/>
-      </w:pPr>
-      <w:rPr>
-        <w:rFonts w:ascii="Wingdings" w:hAnsi="Wingdings" w:hint="default"/>
-      </w:rPr>
-    </w:lvl>
-    <w:lvl w:ilvl="6" w:tplc="04090001" w:tentative="1">
-      <w:start w:val="1"/>
-      <w:numFmt w:val="bullet"/>
-      <w:lvlText w:val=""/>
-      <w:lvlJc w:val="left"/>
-      <w:pPr>
-        <w:ind w:left="5040" w:hanging="360"/>
-      </w:pPr>
-      <w:rPr>
-        <w:rFonts w:ascii="Symbol" w:hAnsi="Symbol" w:hint="default"/>
-      </w:rPr>
-    </w:lvl>
-    <w:lvl w:ilvl="7" w:tplc="04090003" w:tentative="1">
-      <w:start w:val="1"/>
-      <w:numFmt w:val="bullet"/>
-      <w:lvlText w:val="o"/>
-      <w:lvlJc w:val="left"/>
-      <w:pPr>
-        <w:ind w:left="5760" w:hanging="360"/>
-      </w:pPr>
-      <w:rPr>
-        <w:rFonts w:ascii="Courier New" w:hAnsi="Courier New" w:cs="Courier New" w:hint="default"/>
-      </w:rPr>
-    </w:lvl>
     <w:lvl w:ilvl="8" w:tplc="04090005" w:tentative="1">
       <w:start w:val="1"/>
       <w:numFmt w:val="bullet"/>
@@ -37224,7 +38814,7 @@
       </w:rPr>
     </w:lvl>
   </w:abstractNum>
-  <w:abstractNum w:abstractNumId="162" w15:restartNumberingAfterBreak="0">
+  <w:abstractNum w:abstractNumId="166" w15:restartNumberingAfterBreak="0">
     <w:nsid w:val="77572323"/>
     <w:multiLevelType w:val="multilevel"/>
     <w:tmpl w:val="63F4E6F0"/>
@@ -37373,7 +38963,7 @@
       </w:rPr>
     </w:lvl>
   </w:abstractNum>
-  <w:abstractNum w:abstractNumId="163" w15:restartNumberingAfterBreak="0">
+  <w:abstractNum w:abstractNumId="167" w15:restartNumberingAfterBreak="0">
     <w:nsid w:val="77B8201F"/>
     <w:multiLevelType w:val="hybridMultilevel"/>
     <w:tmpl w:val="D7160708"/>
@@ -37485,7 +39075,7 @@
       </w:rPr>
     </w:lvl>
   </w:abstractNum>
-  <w:abstractNum w:abstractNumId="164" w15:restartNumberingAfterBreak="0">
+  <w:abstractNum w:abstractNumId="168" w15:restartNumberingAfterBreak="0">
     <w:nsid w:val="79796FF9"/>
     <w:multiLevelType w:val="hybridMultilevel"/>
     <w:tmpl w:val="CFA8EF82"/>
@@ -37597,7 +39187,7 @@
       </w:rPr>
     </w:lvl>
   </w:abstractNum>
-  <w:abstractNum w:abstractNumId="165" w15:restartNumberingAfterBreak="0">
+  <w:abstractNum w:abstractNumId="169" w15:restartNumberingAfterBreak="0">
     <w:nsid w:val="79910410"/>
     <w:multiLevelType w:val="hybridMultilevel"/>
     <w:tmpl w:val="FC923542"/>
@@ -37709,7 +39299,7 @@
       </w:rPr>
     </w:lvl>
   </w:abstractNum>
-  <w:abstractNum w:abstractNumId="166" w15:restartNumberingAfterBreak="0">
+  <w:abstractNum w:abstractNumId="170" w15:restartNumberingAfterBreak="0">
     <w:nsid w:val="79BF6B53"/>
     <w:multiLevelType w:val="hybridMultilevel"/>
     <w:tmpl w:val="4E2EA1E0"/>
@@ -37795,7 +39385,7 @@
       </w:pPr>
     </w:lvl>
   </w:abstractNum>
-  <w:abstractNum w:abstractNumId="167" w15:restartNumberingAfterBreak="0">
+  <w:abstractNum w:abstractNumId="171" w15:restartNumberingAfterBreak="0">
     <w:nsid w:val="7AFF575A"/>
     <w:multiLevelType w:val="hybridMultilevel"/>
     <w:tmpl w:val="A6323D3E"/>
@@ -37907,7 +39497,7 @@
       </w:rPr>
     </w:lvl>
   </w:abstractNum>
-  <w:abstractNum w:abstractNumId="168" w15:restartNumberingAfterBreak="0">
+  <w:abstractNum w:abstractNumId="172" w15:restartNumberingAfterBreak="0">
     <w:nsid w:val="7B4018BF"/>
     <w:multiLevelType w:val="multilevel"/>
     <w:tmpl w:val="63F4E6F0"/>
@@ -38056,7 +39646,7 @@
       </w:rPr>
     </w:lvl>
   </w:abstractNum>
-  <w:abstractNum w:abstractNumId="169" w15:restartNumberingAfterBreak="0">
+  <w:abstractNum w:abstractNumId="173" w15:restartNumberingAfterBreak="0">
     <w:nsid w:val="7B4D1B33"/>
     <w:multiLevelType w:val="hybridMultilevel"/>
     <w:tmpl w:val="5EAC717E"/>
@@ -38168,7 +39758,7 @@
       </w:rPr>
     </w:lvl>
   </w:abstractNum>
-  <w:abstractNum w:abstractNumId="170" w15:restartNumberingAfterBreak="0">
+  <w:abstractNum w:abstractNumId="174" w15:restartNumberingAfterBreak="0">
     <w:nsid w:val="7CAC27CD"/>
     <w:multiLevelType w:val="multilevel"/>
     <w:tmpl w:val="3BC20E58"/>
@@ -38317,7 +39907,7 @@
       </w:rPr>
     </w:lvl>
   </w:abstractNum>
-  <w:abstractNum w:abstractNumId="171" w15:restartNumberingAfterBreak="0">
+  <w:abstractNum w:abstractNumId="175" w15:restartNumberingAfterBreak="0">
     <w:nsid w:val="7E5978EA"/>
     <w:multiLevelType w:val="hybridMultilevel"/>
     <w:tmpl w:val="D74C0DB0"/>
@@ -38429,7 +40019,7 @@
       </w:rPr>
     </w:lvl>
   </w:abstractNum>
-  <w:abstractNum w:abstractNumId="172" w15:restartNumberingAfterBreak="0">
+  <w:abstractNum w:abstractNumId="176" w15:restartNumberingAfterBreak="0">
     <w:nsid w:val="7F106A5D"/>
     <w:multiLevelType w:val="hybridMultilevel"/>
     <w:tmpl w:val="A1CA4816"/>
@@ -38542,523 +40132,535 @@
     </w:lvl>
   </w:abstractNum>
   <w:num w:numId="1" w16cid:durableId="1882476756">
-    <w:abstractNumId w:val="100"/>
+    <w:abstractNumId w:val="103"/>
   </w:num>
   <w:num w:numId="2" w16cid:durableId="871453468">
-    <w:abstractNumId w:val="29"/>
+    <w:abstractNumId w:val="30"/>
   </w:num>
   <w:num w:numId="3" w16cid:durableId="698706805">
-    <w:abstractNumId w:val="45"/>
+    <w:abstractNumId w:val="46"/>
   </w:num>
   <w:num w:numId="4" w16cid:durableId="1105467722">
-    <w:abstractNumId w:val="83"/>
+    <w:abstractNumId w:val="85"/>
   </w:num>
   <w:num w:numId="5" w16cid:durableId="769932622">
-    <w:abstractNumId w:val="117"/>
+    <w:abstractNumId w:val="120"/>
   </w:num>
   <w:num w:numId="6" w16cid:durableId="575944109">
-    <w:abstractNumId w:val="49"/>
+    <w:abstractNumId w:val="50"/>
   </w:num>
   <w:num w:numId="7" w16cid:durableId="877661689">
-    <w:abstractNumId w:val="155"/>
+    <w:abstractNumId w:val="159"/>
   </w:num>
   <w:num w:numId="8" w16cid:durableId="1390107422">
-    <w:abstractNumId w:val="89"/>
+    <w:abstractNumId w:val="91"/>
   </w:num>
   <w:num w:numId="9" w16cid:durableId="881866424">
-    <w:abstractNumId w:val="113"/>
+    <w:abstractNumId w:val="116"/>
   </w:num>
   <w:num w:numId="10" w16cid:durableId="1037244995">
-    <w:abstractNumId w:val="145"/>
+    <w:abstractNumId w:val="148"/>
   </w:num>
   <w:num w:numId="11" w16cid:durableId="1575554597">
+    <w:abstractNumId w:val="73"/>
+  </w:num>
+  <w:num w:numId="12" w16cid:durableId="915364478">
+    <w:abstractNumId w:val="98"/>
+  </w:num>
+  <w:num w:numId="13" w16cid:durableId="1386294114">
+    <w:abstractNumId w:val="138"/>
+  </w:num>
+  <w:num w:numId="14" w16cid:durableId="1071851223">
+    <w:abstractNumId w:val="31"/>
+  </w:num>
+  <w:num w:numId="15" w16cid:durableId="1545557520">
+    <w:abstractNumId w:val="87"/>
+  </w:num>
+  <w:num w:numId="16" w16cid:durableId="1102919547">
+    <w:abstractNumId w:val="174"/>
+  </w:num>
+  <w:num w:numId="17" w16cid:durableId="294526838">
+    <w:abstractNumId w:val="62"/>
+  </w:num>
+  <w:num w:numId="18" w16cid:durableId="679889896">
+    <w:abstractNumId w:val="71"/>
+  </w:num>
+  <w:num w:numId="19" w16cid:durableId="2119449470">
+    <w:abstractNumId w:val="112"/>
+  </w:num>
+  <w:num w:numId="20" w16cid:durableId="1365054799">
+    <w:abstractNumId w:val="19"/>
+  </w:num>
+  <w:num w:numId="21" w16cid:durableId="1683512738">
     <w:abstractNumId w:val="72"/>
   </w:num>
-  <w:num w:numId="12" w16cid:durableId="915364478">
-    <w:abstractNumId w:val="95"/>
+  <w:num w:numId="22" w16cid:durableId="1080098953">
+    <w:abstractNumId w:val="143"/>
   </w:num>
-  <w:num w:numId="13" w16cid:durableId="1386294114">
-    <w:abstractNumId w:val="135"/>
+  <w:num w:numId="23" w16cid:durableId="1635717296">
+    <w:abstractNumId w:val="78"/>
   </w:num>
-  <w:num w:numId="14" w16cid:durableId="1071851223">
-    <w:abstractNumId w:val="30"/>
+  <w:num w:numId="24" w16cid:durableId="544873123">
+    <w:abstractNumId w:val="137"/>
   </w:num>
-  <w:num w:numId="15" w16cid:durableId="1545557520">
-    <w:abstractNumId w:val="85"/>
-  </w:num>
-  <w:num w:numId="16" w16cid:durableId="1102919547">
-    <w:abstractNumId w:val="170"/>
-  </w:num>
-  <w:num w:numId="17" w16cid:durableId="294526838">
-    <w:abstractNumId w:val="61"/>
-  </w:num>
-  <w:num w:numId="18" w16cid:durableId="679889896">
-    <w:abstractNumId w:val="70"/>
-  </w:num>
-  <w:num w:numId="19" w16cid:durableId="2119449470">
-    <w:abstractNumId w:val="109"/>
-  </w:num>
-  <w:num w:numId="20" w16cid:durableId="1365054799">
+  <w:num w:numId="25" w16cid:durableId="1128352778">
     <w:abstractNumId w:val="18"/>
   </w:num>
-  <w:num w:numId="21" w16cid:durableId="1683512738">
-    <w:abstractNumId w:val="71"/>
-  </w:num>
-  <w:num w:numId="22" w16cid:durableId="1080098953">
-    <w:abstractNumId w:val="140"/>
-  </w:num>
-  <w:num w:numId="23" w16cid:durableId="1635717296">
-    <w:abstractNumId w:val="76"/>
-  </w:num>
-  <w:num w:numId="24" w16cid:durableId="544873123">
-    <w:abstractNumId w:val="134"/>
-  </w:num>
-  <w:num w:numId="25" w16cid:durableId="1128352778">
-    <w:abstractNumId w:val="17"/>
-  </w:num>
   <w:num w:numId="26" w16cid:durableId="1732537407">
-    <w:abstractNumId w:val="150"/>
+    <w:abstractNumId w:val="154"/>
   </w:num>
   <w:num w:numId="27" w16cid:durableId="945502064">
-    <w:abstractNumId w:val="7"/>
+    <w:abstractNumId w:val="8"/>
   </w:num>
   <w:num w:numId="28" w16cid:durableId="1997681677">
     <w:abstractNumId w:val="4"/>
   </w:num>
   <w:num w:numId="29" w16cid:durableId="815955639">
-    <w:abstractNumId w:val="69"/>
+    <w:abstractNumId w:val="70"/>
   </w:num>
   <w:num w:numId="30" w16cid:durableId="1500659483">
-    <w:abstractNumId w:val="92"/>
+    <w:abstractNumId w:val="95"/>
   </w:num>
   <w:num w:numId="31" w16cid:durableId="118301211">
-    <w:abstractNumId w:val="19"/>
+    <w:abstractNumId w:val="20"/>
   </w:num>
   <w:num w:numId="32" w16cid:durableId="732387979">
-    <w:abstractNumId w:val="50"/>
+    <w:abstractNumId w:val="51"/>
   </w:num>
   <w:num w:numId="33" w16cid:durableId="2129276417">
+    <w:abstractNumId w:val="23"/>
+  </w:num>
+  <w:num w:numId="34" w16cid:durableId="1470708820">
+    <w:abstractNumId w:val="57"/>
+  </w:num>
+  <w:num w:numId="35" w16cid:durableId="356852923">
+    <w:abstractNumId w:val="111"/>
+  </w:num>
+  <w:num w:numId="36" w16cid:durableId="430662559">
+    <w:abstractNumId w:val="26"/>
+  </w:num>
+  <w:num w:numId="37" w16cid:durableId="247080868">
+    <w:abstractNumId w:val="163"/>
+  </w:num>
+  <w:num w:numId="38" w16cid:durableId="158887408">
+    <w:abstractNumId w:val="135"/>
+  </w:num>
+  <w:num w:numId="39" w16cid:durableId="1681347932">
+    <w:abstractNumId w:val="158"/>
+  </w:num>
+  <w:num w:numId="40" w16cid:durableId="2101440158">
+    <w:abstractNumId w:val="90"/>
+  </w:num>
+  <w:num w:numId="41" w16cid:durableId="1250391122">
+    <w:abstractNumId w:val="130"/>
+  </w:num>
+  <w:num w:numId="42" w16cid:durableId="479083359">
+    <w:abstractNumId w:val="162"/>
+  </w:num>
+  <w:num w:numId="43" w16cid:durableId="1557860317">
+    <w:abstractNumId w:val="113"/>
+  </w:num>
+  <w:num w:numId="44" w16cid:durableId="2142183763">
+    <w:abstractNumId w:val="11"/>
+  </w:num>
+  <w:num w:numId="45" w16cid:durableId="1357736349">
+    <w:abstractNumId w:val="169"/>
+  </w:num>
+  <w:num w:numId="46" w16cid:durableId="1519656040">
+    <w:abstractNumId w:val="168"/>
+  </w:num>
+  <w:num w:numId="47" w16cid:durableId="1078596852">
+    <w:abstractNumId w:val="176"/>
+  </w:num>
+  <w:num w:numId="48" w16cid:durableId="1027950100">
+    <w:abstractNumId w:val="42"/>
+  </w:num>
+  <w:num w:numId="49" w16cid:durableId="878516382">
+    <w:abstractNumId w:val="25"/>
+  </w:num>
+  <w:num w:numId="50" w16cid:durableId="363404927">
+    <w:abstractNumId w:val="79"/>
+  </w:num>
+  <w:num w:numId="51" w16cid:durableId="1128354320">
+    <w:abstractNumId w:val="152"/>
+  </w:num>
+  <w:num w:numId="52" w16cid:durableId="248543928">
+    <w:abstractNumId w:val="89"/>
+  </w:num>
+  <w:num w:numId="53" w16cid:durableId="965889214">
+    <w:abstractNumId w:val="118"/>
+  </w:num>
+  <w:num w:numId="54" w16cid:durableId="1827503240">
+    <w:abstractNumId w:val="128"/>
+  </w:num>
+  <w:num w:numId="55" w16cid:durableId="505748256">
+    <w:abstractNumId w:val="108"/>
+  </w:num>
+  <w:num w:numId="56" w16cid:durableId="2120370925">
+    <w:abstractNumId w:val="39"/>
+  </w:num>
+  <w:num w:numId="57" w16cid:durableId="369182267">
     <w:abstractNumId w:val="22"/>
   </w:num>
-  <w:num w:numId="34" w16cid:durableId="1470708820">
-    <w:abstractNumId w:val="56"/>
+  <w:num w:numId="58" w16cid:durableId="1000235123">
+    <w:abstractNumId w:val="114"/>
   </w:num>
-  <w:num w:numId="35" w16cid:durableId="356852923">
-    <w:abstractNumId w:val="108"/>
+  <w:num w:numId="59" w16cid:durableId="628516409">
+    <w:abstractNumId w:val="150"/>
   </w:num>
-  <w:num w:numId="36" w16cid:durableId="430662559">
-    <w:abstractNumId w:val="25"/>
+  <w:num w:numId="60" w16cid:durableId="2028865444">
+    <w:abstractNumId w:val="106"/>
   </w:num>
-  <w:num w:numId="37" w16cid:durableId="247080868">
-    <w:abstractNumId w:val="159"/>
+  <w:num w:numId="61" w16cid:durableId="943926811">
+    <w:abstractNumId w:val="173"/>
   </w:num>
-  <w:num w:numId="38" w16cid:durableId="158887408">
-    <w:abstractNumId w:val="132"/>
+  <w:num w:numId="62" w16cid:durableId="1841193257">
+    <w:abstractNumId w:val="82"/>
   </w:num>
-  <w:num w:numId="39" w16cid:durableId="1681347932">
-    <w:abstractNumId w:val="154"/>
+  <w:num w:numId="63" w16cid:durableId="682322850">
+    <w:abstractNumId w:val="155"/>
   </w:num>
-  <w:num w:numId="40" w16cid:durableId="2101440158">
-    <w:abstractNumId w:val="88"/>
+  <w:num w:numId="64" w16cid:durableId="2043705333">
+    <w:abstractNumId w:val="83"/>
   </w:num>
-  <w:num w:numId="41" w16cid:durableId="1250391122">
-    <w:abstractNumId w:val="127"/>
+  <w:num w:numId="65" w16cid:durableId="1164854761">
+    <w:abstractNumId w:val="61"/>
   </w:num>
-  <w:num w:numId="42" w16cid:durableId="479083359">
-    <w:abstractNumId w:val="158"/>
+  <w:num w:numId="66" w16cid:durableId="1919972541">
+    <w:abstractNumId w:val="100"/>
   </w:num>
-  <w:num w:numId="43" w16cid:durableId="1557860317">
-    <w:abstractNumId w:val="110"/>
+  <w:num w:numId="67" w16cid:durableId="463617329">
+    <w:abstractNumId w:val="67"/>
   </w:num>
-  <w:num w:numId="44" w16cid:durableId="2142183763">
-    <w:abstractNumId w:val="10"/>
+  <w:num w:numId="68" w16cid:durableId="2064014330">
+    <w:abstractNumId w:val="122"/>
   </w:num>
-  <w:num w:numId="45" w16cid:durableId="1357736349">
-    <w:abstractNumId w:val="165"/>
+  <w:num w:numId="69" w16cid:durableId="452797354">
+    <w:abstractNumId w:val="129"/>
   </w:num>
-  <w:num w:numId="46" w16cid:durableId="1519656040">
-    <w:abstractNumId w:val="164"/>
+  <w:num w:numId="70" w16cid:durableId="1196650037">
+    <w:abstractNumId w:val="55"/>
   </w:num>
-  <w:num w:numId="47" w16cid:durableId="1078596852">
-    <w:abstractNumId w:val="172"/>
+  <w:num w:numId="71" w16cid:durableId="940071828">
+    <w:abstractNumId w:val="167"/>
   </w:num>
-  <w:num w:numId="48" w16cid:durableId="1027950100">
+  <w:num w:numId="72" w16cid:durableId="1608273926">
+    <w:abstractNumId w:val="84"/>
+  </w:num>
+  <w:num w:numId="73" w16cid:durableId="2009864772">
+    <w:abstractNumId w:val="102"/>
+  </w:num>
+  <w:num w:numId="74" w16cid:durableId="712267004">
     <w:abstractNumId w:val="41"/>
   </w:num>
-  <w:num w:numId="49" w16cid:durableId="878516382">
-    <w:abstractNumId w:val="24"/>
-  </w:num>
-  <w:num w:numId="50" w16cid:durableId="363404927">
-    <w:abstractNumId w:val="77"/>
-  </w:num>
-  <w:num w:numId="51" w16cid:durableId="1128354320">
-    <w:abstractNumId w:val="148"/>
-  </w:num>
-  <w:num w:numId="52" w16cid:durableId="248543928">
-    <w:abstractNumId w:val="87"/>
-  </w:num>
-  <w:num w:numId="53" w16cid:durableId="965889214">
-    <w:abstractNumId w:val="115"/>
-  </w:num>
-  <w:num w:numId="54" w16cid:durableId="1827503240">
-    <w:abstractNumId w:val="125"/>
-  </w:num>
-  <w:num w:numId="55" w16cid:durableId="505748256">
-    <w:abstractNumId w:val="105"/>
-  </w:num>
-  <w:num w:numId="56" w16cid:durableId="2120370925">
-    <w:abstractNumId w:val="38"/>
-  </w:num>
-  <w:num w:numId="57" w16cid:durableId="369182267">
-    <w:abstractNumId w:val="21"/>
-  </w:num>
-  <w:num w:numId="58" w16cid:durableId="1000235123">
-    <w:abstractNumId w:val="111"/>
-  </w:num>
-  <w:num w:numId="59" w16cid:durableId="628516409">
-    <w:abstractNumId w:val="146"/>
-  </w:num>
-  <w:num w:numId="60" w16cid:durableId="2028865444">
-    <w:abstractNumId w:val="103"/>
-  </w:num>
-  <w:num w:numId="61" w16cid:durableId="943926811">
-    <w:abstractNumId w:val="169"/>
-  </w:num>
-  <w:num w:numId="62" w16cid:durableId="1841193257">
-    <w:abstractNumId w:val="80"/>
-  </w:num>
-  <w:num w:numId="63" w16cid:durableId="682322850">
-    <w:abstractNumId w:val="151"/>
-  </w:num>
-  <w:num w:numId="64" w16cid:durableId="2043705333">
-    <w:abstractNumId w:val="81"/>
-  </w:num>
-  <w:num w:numId="65" w16cid:durableId="1164854761">
-    <w:abstractNumId w:val="60"/>
-  </w:num>
-  <w:num w:numId="66" w16cid:durableId="1919972541">
-    <w:abstractNumId w:val="97"/>
-  </w:num>
-  <w:num w:numId="67" w16cid:durableId="463617329">
-    <w:abstractNumId w:val="66"/>
-  </w:num>
-  <w:num w:numId="68" w16cid:durableId="2064014330">
-    <w:abstractNumId w:val="119"/>
-  </w:num>
-  <w:num w:numId="69" w16cid:durableId="452797354">
-    <w:abstractNumId w:val="126"/>
-  </w:num>
-  <w:num w:numId="70" w16cid:durableId="1196650037">
-    <w:abstractNumId w:val="54"/>
-  </w:num>
-  <w:num w:numId="71" w16cid:durableId="940071828">
-    <w:abstractNumId w:val="163"/>
-  </w:num>
-  <w:num w:numId="72" w16cid:durableId="1608273926">
-    <w:abstractNumId w:val="82"/>
-  </w:num>
-  <w:num w:numId="73" w16cid:durableId="2009864772">
-    <w:abstractNumId w:val="99"/>
-  </w:num>
-  <w:num w:numId="74" w16cid:durableId="712267004">
-    <w:abstractNumId w:val="40"/>
-  </w:num>
   <w:num w:numId="75" w16cid:durableId="506480902">
-    <w:abstractNumId w:val="36"/>
+    <w:abstractNumId w:val="37"/>
   </w:num>
   <w:num w:numId="76" w16cid:durableId="286202349">
-    <w:abstractNumId w:val="131"/>
+    <w:abstractNumId w:val="134"/>
   </w:num>
   <w:num w:numId="77" w16cid:durableId="156460757">
-    <w:abstractNumId w:val="73"/>
+    <w:abstractNumId w:val="74"/>
   </w:num>
   <w:num w:numId="78" w16cid:durableId="1230077056">
     <w:abstractNumId w:val="6"/>
   </w:num>
   <w:num w:numId="79" w16cid:durableId="1837106927">
-    <w:abstractNumId w:val="53"/>
+    <w:abstractNumId w:val="54"/>
   </w:num>
   <w:num w:numId="80" w16cid:durableId="287929152">
-    <w:abstractNumId w:val="39"/>
+    <w:abstractNumId w:val="40"/>
   </w:num>
   <w:num w:numId="81" w16cid:durableId="1672175260">
+    <w:abstractNumId w:val="96"/>
+  </w:num>
+  <w:num w:numId="82" w16cid:durableId="1954820163">
+    <w:abstractNumId w:val="65"/>
+  </w:num>
+  <w:num w:numId="83" w16cid:durableId="1990016594">
+    <w:abstractNumId w:val="28"/>
+  </w:num>
+  <w:num w:numId="84" w16cid:durableId="366876741">
+    <w:abstractNumId w:val="105"/>
+  </w:num>
+  <w:num w:numId="85" w16cid:durableId="15274915">
+    <w:abstractNumId w:val="44"/>
+  </w:num>
+  <w:num w:numId="86" w16cid:durableId="288124443">
+    <w:abstractNumId w:val="13"/>
+  </w:num>
+  <w:num w:numId="87" w16cid:durableId="591351385">
+    <w:abstractNumId w:val="119"/>
+  </w:num>
+  <w:num w:numId="88" w16cid:durableId="1361005725">
+    <w:abstractNumId w:val="171"/>
+  </w:num>
+  <w:num w:numId="89" w16cid:durableId="219681743">
+    <w:abstractNumId w:val="14"/>
+  </w:num>
+  <w:num w:numId="90" w16cid:durableId="194386594">
+    <w:abstractNumId w:val="131"/>
+  </w:num>
+  <w:num w:numId="91" w16cid:durableId="777793346">
     <w:abstractNumId w:val="93"/>
   </w:num>
-  <w:num w:numId="82" w16cid:durableId="1954820163">
-    <w:abstractNumId w:val="64"/>
+  <w:num w:numId="92" w16cid:durableId="173346871">
+    <w:abstractNumId w:val="99"/>
   </w:num>
-  <w:num w:numId="83" w16cid:durableId="1990016594">
+  <w:num w:numId="93" w16cid:durableId="948700467">
+    <w:abstractNumId w:val="45"/>
+  </w:num>
+  <w:num w:numId="94" w16cid:durableId="1328363750">
     <w:abstractNumId w:val="27"/>
   </w:num>
-  <w:num w:numId="84" w16cid:durableId="366876741">
-    <w:abstractNumId w:val="102"/>
-  </w:num>
-  <w:num w:numId="85" w16cid:durableId="15274915">
-    <w:abstractNumId w:val="43"/>
-  </w:num>
-  <w:num w:numId="86" w16cid:durableId="288124443">
-    <w:abstractNumId w:val="12"/>
-  </w:num>
-  <w:num w:numId="87" w16cid:durableId="591351385">
-    <w:abstractNumId w:val="116"/>
-  </w:num>
-  <w:num w:numId="88" w16cid:durableId="1361005725">
-    <w:abstractNumId w:val="167"/>
-  </w:num>
-  <w:num w:numId="89" w16cid:durableId="219681743">
-    <w:abstractNumId w:val="13"/>
-  </w:num>
-  <w:num w:numId="90" w16cid:durableId="194386594">
-    <w:abstractNumId w:val="128"/>
-  </w:num>
-  <w:num w:numId="91" w16cid:durableId="777793346">
-    <w:abstractNumId w:val="91"/>
-  </w:num>
-  <w:num w:numId="92" w16cid:durableId="173346871">
-    <w:abstractNumId w:val="96"/>
-  </w:num>
-  <w:num w:numId="93" w16cid:durableId="948700467">
-    <w:abstractNumId w:val="44"/>
-  </w:num>
-  <w:num w:numId="94" w16cid:durableId="1328363750">
-    <w:abstractNumId w:val="26"/>
-  </w:num>
   <w:num w:numId="95" w16cid:durableId="541676570">
-    <w:abstractNumId w:val="74"/>
+    <w:abstractNumId w:val="75"/>
   </w:num>
   <w:num w:numId="96" w16cid:durableId="694119229">
-    <w:abstractNumId w:val="94"/>
+    <w:abstractNumId w:val="97"/>
   </w:num>
   <w:num w:numId="97" w16cid:durableId="704327987">
-    <w:abstractNumId w:val="58"/>
+    <w:abstractNumId w:val="59"/>
   </w:num>
   <w:num w:numId="98" w16cid:durableId="1157303613">
-    <w:abstractNumId w:val="28"/>
+    <w:abstractNumId w:val="29"/>
   </w:num>
   <w:num w:numId="99" w16cid:durableId="1706099794">
-    <w:abstractNumId w:val="153"/>
+    <w:abstractNumId w:val="157"/>
   </w:num>
   <w:num w:numId="100" w16cid:durableId="256404901">
-    <w:abstractNumId w:val="152"/>
+    <w:abstractNumId w:val="156"/>
   </w:num>
   <w:num w:numId="101" w16cid:durableId="924923012">
-    <w:abstractNumId w:val="33"/>
+    <w:abstractNumId w:val="34"/>
   </w:num>
   <w:num w:numId="102" w16cid:durableId="536550966">
-    <w:abstractNumId w:val="168"/>
+    <w:abstractNumId w:val="172"/>
   </w:num>
   <w:num w:numId="103" w16cid:durableId="425157302">
-    <w:abstractNumId w:val="75"/>
+    <w:abstractNumId w:val="76"/>
   </w:num>
   <w:num w:numId="104" w16cid:durableId="967664612">
-    <w:abstractNumId w:val="137"/>
+    <w:abstractNumId w:val="140"/>
   </w:num>
   <w:num w:numId="105" w16cid:durableId="361631616">
-    <w:abstractNumId w:val="104"/>
+    <w:abstractNumId w:val="107"/>
   </w:num>
   <w:num w:numId="106" w16cid:durableId="443623616">
-    <w:abstractNumId w:val="141"/>
+    <w:abstractNumId w:val="144"/>
   </w:num>
   <w:num w:numId="107" w16cid:durableId="150101619">
-    <w:abstractNumId w:val="15"/>
+    <w:abstractNumId w:val="16"/>
   </w:num>
   <w:num w:numId="108" w16cid:durableId="1431658174">
-    <w:abstractNumId w:val="62"/>
+    <w:abstractNumId w:val="63"/>
   </w:num>
   <w:num w:numId="109" w16cid:durableId="1050495440">
     <w:abstractNumId w:val="0"/>
   </w:num>
   <w:num w:numId="110" w16cid:durableId="712924661">
-    <w:abstractNumId w:val="123"/>
+    <w:abstractNumId w:val="126"/>
   </w:num>
   <w:num w:numId="111" w16cid:durableId="1917784113">
-    <w:abstractNumId w:val="118"/>
+    <w:abstractNumId w:val="121"/>
   </w:num>
   <w:num w:numId="112" w16cid:durableId="896237065">
-    <w:abstractNumId w:val="129"/>
+    <w:abstractNumId w:val="132"/>
   </w:num>
   <w:num w:numId="113" w16cid:durableId="1171681430">
-    <w:abstractNumId w:val="156"/>
+    <w:abstractNumId w:val="160"/>
   </w:num>
   <w:num w:numId="114" w16cid:durableId="1552573199">
-    <w:abstractNumId w:val="157"/>
+    <w:abstractNumId w:val="161"/>
   </w:num>
   <w:num w:numId="115" w16cid:durableId="1920869674">
-    <w:abstractNumId w:val="139"/>
+    <w:abstractNumId w:val="142"/>
   </w:num>
   <w:num w:numId="116" w16cid:durableId="476724716">
-    <w:abstractNumId w:val="107"/>
+    <w:abstractNumId w:val="110"/>
   </w:num>
   <w:num w:numId="117" w16cid:durableId="658919541">
-    <w:abstractNumId w:val="106"/>
+    <w:abstractNumId w:val="109"/>
   </w:num>
   <w:num w:numId="118" w16cid:durableId="1622418131">
-    <w:abstractNumId w:val="51"/>
+    <w:abstractNumId w:val="52"/>
   </w:num>
   <w:num w:numId="119" w16cid:durableId="1693994672">
     <w:abstractNumId w:val="3"/>
   </w:num>
   <w:num w:numId="120" w16cid:durableId="396828229">
-    <w:abstractNumId w:val="162"/>
+    <w:abstractNumId w:val="166"/>
   </w:num>
   <w:num w:numId="121" w16cid:durableId="986058889">
-    <w:abstractNumId w:val="23"/>
+    <w:abstractNumId w:val="24"/>
   </w:num>
   <w:num w:numId="122" w16cid:durableId="1224410703">
-    <w:abstractNumId w:val="68"/>
+    <w:abstractNumId w:val="69"/>
   </w:num>
   <w:num w:numId="123" w16cid:durableId="1804040304">
-    <w:abstractNumId w:val="90"/>
+    <w:abstractNumId w:val="92"/>
   </w:num>
   <w:num w:numId="124" w16cid:durableId="114181197">
-    <w:abstractNumId w:val="160"/>
+    <w:abstractNumId w:val="164"/>
   </w:num>
   <w:num w:numId="125" w16cid:durableId="772671624">
     <w:abstractNumId w:val="5"/>
   </w:num>
   <w:num w:numId="126" w16cid:durableId="889919055">
-    <w:abstractNumId w:val="8"/>
+    <w:abstractNumId w:val="9"/>
   </w:num>
   <w:num w:numId="127" w16cid:durableId="1818105337">
-    <w:abstractNumId w:val="57"/>
+    <w:abstractNumId w:val="58"/>
   </w:num>
   <w:num w:numId="128" w16cid:durableId="384987847">
-    <w:abstractNumId w:val="34"/>
+    <w:abstractNumId w:val="35"/>
   </w:num>
   <w:num w:numId="129" w16cid:durableId="659895420">
-    <w:abstractNumId w:val="67"/>
+    <w:abstractNumId w:val="68"/>
   </w:num>
   <w:num w:numId="130" w16cid:durableId="1168907903">
-    <w:abstractNumId w:val="143"/>
+    <w:abstractNumId w:val="146"/>
   </w:num>
   <w:num w:numId="131" w16cid:durableId="430206235">
-    <w:abstractNumId w:val="133"/>
+    <w:abstractNumId w:val="136"/>
   </w:num>
   <w:num w:numId="132" w16cid:durableId="1207327089">
-    <w:abstractNumId w:val="32"/>
+    <w:abstractNumId w:val="33"/>
   </w:num>
   <w:num w:numId="133" w16cid:durableId="596404292">
-    <w:abstractNumId w:val="120"/>
+    <w:abstractNumId w:val="123"/>
   </w:num>
   <w:num w:numId="134" w16cid:durableId="2070372549">
+    <w:abstractNumId w:val="49"/>
+  </w:num>
+  <w:num w:numId="135" w16cid:durableId="1841265039">
+    <w:abstractNumId w:val="53"/>
+  </w:num>
+  <w:num w:numId="136" w16cid:durableId="1988632595">
     <w:abstractNumId w:val="48"/>
   </w:num>
-  <w:num w:numId="135" w16cid:durableId="1841265039">
-    <w:abstractNumId w:val="52"/>
-  </w:num>
-  <w:num w:numId="136" w16cid:durableId="1988632595">
-    <w:abstractNumId w:val="47"/>
-  </w:num>
   <w:num w:numId="137" w16cid:durableId="1218275126">
-    <w:abstractNumId w:val="78"/>
+    <w:abstractNumId w:val="80"/>
   </w:num>
   <w:num w:numId="138" w16cid:durableId="568660900">
-    <w:abstractNumId w:val="86"/>
+    <w:abstractNumId w:val="88"/>
   </w:num>
   <w:num w:numId="139" w16cid:durableId="967976864">
-    <w:abstractNumId w:val="121"/>
+    <w:abstractNumId w:val="124"/>
   </w:num>
   <w:num w:numId="140" w16cid:durableId="650643288">
-    <w:abstractNumId w:val="138"/>
+    <w:abstractNumId w:val="141"/>
   </w:num>
   <w:num w:numId="141" w16cid:durableId="219370247">
-    <w:abstractNumId w:val="136"/>
+    <w:abstractNumId w:val="139"/>
   </w:num>
   <w:num w:numId="142" w16cid:durableId="323239876">
-    <w:abstractNumId w:val="171"/>
+    <w:abstractNumId w:val="175"/>
   </w:num>
   <w:num w:numId="143" w16cid:durableId="1619793156">
-    <w:abstractNumId w:val="37"/>
+    <w:abstractNumId w:val="38"/>
   </w:num>
   <w:num w:numId="144" w16cid:durableId="1186332867">
-    <w:abstractNumId w:val="149"/>
+    <w:abstractNumId w:val="153"/>
   </w:num>
   <w:num w:numId="145" w16cid:durableId="89937035">
-    <w:abstractNumId w:val="59"/>
+    <w:abstractNumId w:val="60"/>
   </w:num>
   <w:num w:numId="146" w16cid:durableId="1975022609">
     <w:abstractNumId w:val="1"/>
   </w:num>
   <w:num w:numId="147" w16cid:durableId="1760910030">
-    <w:abstractNumId w:val="112"/>
+    <w:abstractNumId w:val="115"/>
   </w:num>
   <w:num w:numId="148" w16cid:durableId="349307706">
-    <w:abstractNumId w:val="144"/>
+    <w:abstractNumId w:val="147"/>
   </w:num>
   <w:num w:numId="149" w16cid:durableId="1600336622">
-    <w:abstractNumId w:val="35"/>
+    <w:abstractNumId w:val="36"/>
   </w:num>
   <w:num w:numId="150" w16cid:durableId="789783474">
-    <w:abstractNumId w:val="46"/>
+    <w:abstractNumId w:val="47"/>
   </w:num>
   <w:num w:numId="151" w16cid:durableId="1236017784">
-    <w:abstractNumId w:val="16"/>
+    <w:abstractNumId w:val="17"/>
   </w:num>
   <w:num w:numId="152" w16cid:durableId="1483890789">
-    <w:abstractNumId w:val="114"/>
+    <w:abstractNumId w:val="117"/>
   </w:num>
   <w:num w:numId="153" w16cid:durableId="2104719660">
-    <w:abstractNumId w:val="130"/>
+    <w:abstractNumId w:val="133"/>
   </w:num>
   <w:num w:numId="154" w16cid:durableId="2030252929">
-    <w:abstractNumId w:val="55"/>
+    <w:abstractNumId w:val="56"/>
   </w:num>
   <w:num w:numId="155" w16cid:durableId="1356731706">
-    <w:abstractNumId w:val="20"/>
+    <w:abstractNumId w:val="21"/>
   </w:num>
   <w:num w:numId="156" w16cid:durableId="1954747069">
-    <w:abstractNumId w:val="42"/>
+    <w:abstractNumId w:val="43"/>
   </w:num>
   <w:num w:numId="157" w16cid:durableId="1514421104">
     <w:abstractNumId w:val="2"/>
   </w:num>
   <w:num w:numId="158" w16cid:durableId="1034845685">
-    <w:abstractNumId w:val="161"/>
+    <w:abstractNumId w:val="165"/>
   </w:num>
   <w:num w:numId="159" w16cid:durableId="1262639594">
-    <w:abstractNumId w:val="65"/>
+    <w:abstractNumId w:val="66"/>
   </w:num>
   <w:num w:numId="160" w16cid:durableId="1640988115">
-    <w:abstractNumId w:val="124"/>
+    <w:abstractNumId w:val="127"/>
   </w:num>
   <w:num w:numId="161" w16cid:durableId="1536966176">
-    <w:abstractNumId w:val="31"/>
+    <w:abstractNumId w:val="32"/>
   </w:num>
   <w:num w:numId="162" w16cid:durableId="549609606">
-    <w:abstractNumId w:val="63"/>
+    <w:abstractNumId w:val="64"/>
   </w:num>
   <w:num w:numId="163" w16cid:durableId="1025402036">
-    <w:abstractNumId w:val="122"/>
+    <w:abstractNumId w:val="125"/>
   </w:num>
   <w:num w:numId="164" w16cid:durableId="703671323">
-    <w:abstractNumId w:val="84"/>
+    <w:abstractNumId w:val="86"/>
   </w:num>
   <w:num w:numId="165" w16cid:durableId="410156013">
-    <w:abstractNumId w:val="9"/>
+    <w:abstractNumId w:val="10"/>
   </w:num>
   <w:num w:numId="166" w16cid:durableId="1392072139">
-    <w:abstractNumId w:val="14"/>
+    <w:abstractNumId w:val="15"/>
   </w:num>
   <w:num w:numId="167" w16cid:durableId="1440293569">
-    <w:abstractNumId w:val="11"/>
+    <w:abstractNumId w:val="12"/>
   </w:num>
   <w:num w:numId="168" w16cid:durableId="1639455099">
-    <w:abstractNumId w:val="98"/>
+    <w:abstractNumId w:val="101"/>
   </w:num>
   <w:num w:numId="169" w16cid:durableId="1382096019">
-    <w:abstractNumId w:val="166"/>
+    <w:abstractNumId w:val="170"/>
   </w:num>
   <w:num w:numId="170" w16cid:durableId="2092239844">
-    <w:abstractNumId w:val="142"/>
+    <w:abstractNumId w:val="145"/>
   </w:num>
   <w:num w:numId="171" w16cid:durableId="2061635092">
-    <w:abstractNumId w:val="101"/>
+    <w:abstractNumId w:val="104"/>
   </w:num>
   <w:num w:numId="172" w16cid:durableId="1761901452">
-    <w:abstractNumId w:val="147"/>
+    <w:abstractNumId w:val="151"/>
   </w:num>
   <w:num w:numId="173" w16cid:durableId="1674142607">
-    <w:abstractNumId w:val="79"/>
+    <w:abstractNumId w:val="81"/>
+  </w:num>
+  <w:num w:numId="174" w16cid:durableId="1133985193">
+    <w:abstractNumId w:val="94"/>
+  </w:num>
+  <w:num w:numId="175" w16cid:durableId="941303595">
+    <w:abstractNumId w:val="149"/>
+  </w:num>
+  <w:num w:numId="176" w16cid:durableId="484014249">
+    <w:abstractNumId w:val="77"/>
+  </w:num>
+  <w:num w:numId="177" w16cid:durableId="1905486750">
+    <w:abstractNumId w:val="7"/>
   </w:num>
 </w:numbering>
 </file>

</xml_diff>

<commit_message>
Maps Service APIs (#402)
</commit_message>
<xml_diff>
--- a/API Design.docx
+++ b/API Design.docx
@@ -47,15 +47,7 @@
     </w:p>
     <w:p>
       <w:r>
-        <w:t xml:space="preserve">Before detailing the endpoints of the </w:t>
-      </w:r>
-      <w:proofErr w:type="gramStart"/>
-      <w:r>
-        <w:t>API</w:t>
-      </w:r>
-      <w:proofErr w:type="gramEnd"/>
-      <w:r>
-        <w:t xml:space="preserve"> it is critical to perform an analysis of API requirements in order to make sure that the provided services accurately correspond to the platform's business needs. Such analysis transforms the functional requirements specified in the Product Requirements Document (PRD) and use-case model into the set of well-designed service interfaces. Moreover, this step identifies clearly the owner of the business functionality assigning an appropriate backend service to each API as a result of implementation of the separation of concern principle in the proposed architecture.</w:t>
+        <w:t>Before detailing the endpoints of the API it is critical to perform an analysis of API requirements in order to make sure that the provided services accurately correspond to the platform's business needs. Such analysis transforms the functional requirements specified in the Product Requirements Document (PRD) and use-case model into the set of well-designed service interfaces. Moreover, this step identifies clearly the owner of the business functionality assigning an appropriate backend service to each API as a result of implementation of the separation of concern principle in the proposed architecture.</w:t>
       </w:r>
     </w:p>
     <w:p>
@@ -6194,15 +6186,7 @@
     </w:p>
     <w:p>
       <w:r>
-        <w:t xml:space="preserve">The </w:t>
-      </w:r>
-      <w:proofErr w:type="gramStart"/>
-      <w:r>
-        <w:t>above mentioned</w:t>
-      </w:r>
-      <w:proofErr w:type="gramEnd"/>
-      <w:r>
-        <w:t xml:space="preserve"> workflow makes sure of the consistency of processing and synchronization of vehicle availability, payment, and customer notifications.</w:t>
+        <w:t>The above mentioned workflow makes sure of the consistency of processing and synchronization of vehicle availability, payment, and customer notifications.</w:t>
       </w:r>
     </w:p>
     <w:p>
@@ -15918,15 +15902,7 @@
     </w:p>
     <w:p>
       <w:r>
-        <w:t xml:space="preserve">The Payment Integration APIs contain all the functionalities necessary to process secure payments via the KriGo platform. They establish connections between the platform and </w:t>
-      </w:r>
-      <w:proofErr w:type="gramStart"/>
-      <w:r>
-        <w:t>third party</w:t>
-      </w:r>
-      <w:proofErr w:type="gramEnd"/>
-      <w:r>
-        <w:t xml:space="preserve"> payment gateways. With their help, clients can pay for the reservation, get a refund, and check the transaction status.</w:t>
+        <w:t>The Payment Integration APIs contain all the functionalities necessary to process secure payments via the KriGo platform. They establish connections between the platform and third party payment gateways. With their help, clients can pay for the reservation, get a refund, and check the transaction status.</w:t>
       </w:r>
     </w:p>
     <w:p>
@@ -18242,14 +18218,1133 @@
     </w:p>
     <w:p>
       <w:pPr>
-        <w:tabs>
-          <w:tab w:val="left" w:pos="1944"/>
-        </w:tabs>
-      </w:pPr>
-    </w:p>
+        <w:pStyle w:val="Heading3"/>
+      </w:pPr>
+      <w:r>
+        <w:lastRenderedPageBreak/>
+        <w:t>Maps Service APIs</w:t>
+      </w:r>
+    </w:p>
+    <w:p>
+      <w:r>
+        <w:t>The Maps Service APIs offer the required functionality needed to provide the capability to integrate mapping, geolocation and navigation features into the KriGo platform. Using the Maps Service APIs, the customers will be able to find nearby rental agencies, find vehicles based on their geographical location, calculate the distance between pick up and return locations as well as get the navigation information. Using mapping service makes it possible to improve the experience of searching for vehicles and increases operational efficiency of rental agencies.</w:t>
+      </w:r>
+    </w:p>
+    <w:p>
+      <w:r>
+        <w:t>The Maps Service APIs are developed using REST architecture principles and communication protocols providing secure and reliable interaction with third-party mapping services. Requests and responses are sent in JSON format over HTTPS. Using the integration layer allows the platform to work with different third-party mapping providers by abstracting the implementation of the services. The KriGo platform is able to replace or add new mapping providers without affecting the business services provided.</w:t>
+      </w:r>
+    </w:p>
+    <w:p>
+      <w:r>
+        <w:t>All the map requests should be authenticated with the help of JSON Web Token (JWT) for the authenticated user, but some location services might be available without authentication depending on the application requirements. All communications with the third-party mapping services are secured with the help of HTTPS using TLS protocol and API keys that are provided by the mapping provider are used for requests authorization. Minimum geographical data is transferred to the external services required for performing particular request.</w:t>
+      </w:r>
+    </w:p>
+    <w:p>
+      <w:r>
+        <w:t>The Maps Service works together with the following services: Vehicle Search Service, Branch Management Service, Reservation Service, and Customer Service. Branch coordination and vehicle availability are connected with maps data to show nearby rental places, calculate travel distance, validate addresses and allow the customer to use geographical data to find the vehicles. The navigation data can also be provided to the customers for pick-up and return locations.</w:t>
+      </w:r>
+    </w:p>
+    <w:p>
+      <w:pPr>
+        <w:pStyle w:val="Title"/>
+      </w:pPr>
+      <w:r>
+        <w:t>Maps Service API Endpoints</w:t>
+      </w:r>
+    </w:p>
+    <w:p>
+      <w:pPr>
+        <w:pStyle w:val="Caption"/>
+        <w:keepNext/>
+      </w:pPr>
+      <w:r>
+        <w:t xml:space="preserve">Table </w:t>
+      </w:r>
+      <w:r>
+        <w:fldChar w:fldCharType="begin"/>
+      </w:r>
+      <w:r>
+        <w:instrText xml:space="preserve"> SEQ Table \* ARABIC </w:instrText>
+      </w:r>
+      <w:r>
+        <w:fldChar w:fldCharType="separate"/>
+      </w:r>
+      <w:r>
+        <w:rPr>
+          <w:noProof/>
+        </w:rPr>
+        <w:t>17</w:t>
+      </w:r>
+      <w:r>
+        <w:fldChar w:fldCharType="end"/>
+      </w:r>
+      <w:r>
+        <w:t xml:space="preserve"> - </w:t>
+      </w:r>
+      <w:r>
+        <w:t>Maps Service API Endpoints</w:t>
+      </w:r>
+    </w:p>
+    <w:tbl>
+      <w:tblPr>
+        <w:tblStyle w:val="PlainTable1"/>
+        <w:tblW w:w="0" w:type="auto"/>
+        <w:tblCellMar>
+          <w:top w:w="72" w:type="dxa"/>
+          <w:bottom w:w="72" w:type="dxa"/>
+        </w:tblCellMar>
+        <w:tblLook w:val="04A0" w:firstRow="1" w:lastRow="0" w:firstColumn="1" w:lastColumn="0" w:noHBand="0" w:noVBand="1"/>
+      </w:tblPr>
+      <w:tblGrid>
+        <w:gridCol w:w="4156"/>
+        <w:gridCol w:w="1016"/>
+        <w:gridCol w:w="3438"/>
+        <w:gridCol w:w="737"/>
+      </w:tblGrid>
+      <w:tr>
+        <w:trPr>
+          <w:cnfStyle w:val="100000000000" w:firstRow="1" w:lastRow="0" w:firstColumn="0" w:lastColumn="0" w:oddVBand="0" w:evenVBand="0" w:oddHBand="0" w:evenHBand="0" w:firstRowFirstColumn="0" w:firstRowLastColumn="0" w:lastRowFirstColumn="0" w:lastRowLastColumn="0"/>
+          <w:tblHeader/>
+        </w:trPr>
+        <w:tc>
+          <w:tcPr>
+            <w:cnfStyle w:val="001000000000" w:firstRow="0" w:lastRow="0" w:firstColumn="1" w:lastColumn="0" w:oddVBand="0" w:evenVBand="0" w:oddHBand="0" w:evenHBand="0" w:firstRowFirstColumn="0" w:firstRowLastColumn="0" w:lastRowFirstColumn="0" w:lastRowLastColumn="0"/>
+            <w:tcW w:w="0" w:type="auto"/>
+            <w:vAlign w:val="center"/>
+            <w:hideMark/>
+          </w:tcPr>
+          <w:p>
+            <w:r>
+              <w:t>Endpoint</w:t>
+            </w:r>
+          </w:p>
+        </w:tc>
+        <w:tc>
+          <w:tcPr>
+            <w:tcW w:w="0" w:type="auto"/>
+            <w:vAlign w:val="center"/>
+            <w:hideMark/>
+          </w:tcPr>
+          <w:p>
+            <w:pPr>
+              <w:cnfStyle w:val="100000000000" w:firstRow="1" w:lastRow="0" w:firstColumn="0" w:lastColumn="0" w:oddVBand="0" w:evenVBand="0" w:oddHBand="0" w:evenHBand="0" w:firstRowFirstColumn="0" w:firstRowLastColumn="0" w:lastRowFirstColumn="0" w:lastRowLastColumn="0"/>
+            </w:pPr>
+            <w:r>
+              <w:t>Method</w:t>
+            </w:r>
+          </w:p>
+        </w:tc>
+        <w:tc>
+          <w:tcPr>
+            <w:tcW w:w="0" w:type="auto"/>
+            <w:vAlign w:val="center"/>
+            <w:hideMark/>
+          </w:tcPr>
+          <w:p>
+            <w:pPr>
+              <w:cnfStyle w:val="100000000000" w:firstRow="1" w:lastRow="0" w:firstColumn="0" w:lastColumn="0" w:oddVBand="0" w:evenVBand="0" w:oddHBand="0" w:evenHBand="0" w:firstRowFirstColumn="0" w:firstRowLastColumn="0" w:lastRowFirstColumn="0" w:lastRowLastColumn="0"/>
+            </w:pPr>
+            <w:r>
+              <w:t>Description</w:t>
+            </w:r>
+          </w:p>
+        </w:tc>
+        <w:tc>
+          <w:tcPr>
+            <w:tcW w:w="0" w:type="auto"/>
+            <w:vAlign w:val="center"/>
+            <w:hideMark/>
+          </w:tcPr>
+          <w:p>
+            <w:pPr>
+              <w:cnfStyle w:val="100000000000" w:firstRow="1" w:lastRow="0" w:firstColumn="0" w:lastColumn="0" w:oddVBand="0" w:evenVBand="0" w:oddHBand="0" w:evenHBand="0" w:firstRowFirstColumn="0" w:firstRowLastColumn="0" w:lastRowFirstColumn="0" w:lastRowLastColumn="0"/>
+            </w:pPr>
+            <w:r>
+              <w:t>Auth</w:t>
+            </w:r>
+          </w:p>
+        </w:tc>
+      </w:tr>
+      <w:tr>
+        <w:trPr>
+          <w:cnfStyle w:val="000000100000" w:firstRow="0" w:lastRow="0" w:firstColumn="0" w:lastColumn="0" w:oddVBand="0" w:evenVBand="0" w:oddHBand="1" w:evenHBand="0" w:firstRowFirstColumn="0" w:firstRowLastColumn="0" w:lastRowFirstColumn="0" w:lastRowLastColumn="0"/>
+        </w:trPr>
+        <w:tc>
+          <w:tcPr>
+            <w:cnfStyle w:val="001000000000" w:firstRow="0" w:lastRow="0" w:firstColumn="1" w:lastColumn="0" w:oddVBand="0" w:evenVBand="0" w:oddHBand="0" w:evenHBand="0" w:firstRowFirstColumn="0" w:firstRowLastColumn="0" w:lastRowFirstColumn="0" w:lastRowLastColumn="0"/>
+            <w:tcW w:w="0" w:type="auto"/>
+            <w:vAlign w:val="center"/>
+            <w:hideMark/>
+          </w:tcPr>
+          <w:p>
+            <w:pPr>
+              <w:rPr>
+                <w:b w:val="0"/>
+                <w:bCs w:val="0"/>
+              </w:rPr>
+            </w:pPr>
+            <w:r>
+              <w:rPr>
+                <w:b w:val="0"/>
+                <w:bCs w:val="0"/>
+              </w:rPr>
+              <w:t>/api/v1/integrations/maps/geocode</w:t>
+            </w:r>
+          </w:p>
+        </w:tc>
+        <w:tc>
+          <w:tcPr>
+            <w:tcW w:w="0" w:type="auto"/>
+            <w:vAlign w:val="center"/>
+            <w:hideMark/>
+          </w:tcPr>
+          <w:p>
+            <w:pPr>
+              <w:cnfStyle w:val="000000100000" w:firstRow="0" w:lastRow="0" w:firstColumn="0" w:lastColumn="0" w:oddVBand="0" w:evenVBand="0" w:oddHBand="1" w:evenHBand="0" w:firstRowFirstColumn="0" w:firstRowLastColumn="0" w:lastRowFirstColumn="0" w:lastRowLastColumn="0"/>
+            </w:pPr>
+            <w:r>
+              <w:t>POST</w:t>
+            </w:r>
+          </w:p>
+        </w:tc>
+        <w:tc>
+          <w:tcPr>
+            <w:tcW w:w="0" w:type="auto"/>
+            <w:vAlign w:val="center"/>
+            <w:hideMark/>
+          </w:tcPr>
+          <w:p>
+            <w:pPr>
+              <w:cnfStyle w:val="000000100000" w:firstRow="0" w:lastRow="0" w:firstColumn="0" w:lastColumn="0" w:oddVBand="0" w:evenVBand="0" w:oddHBand="1" w:evenHBand="0" w:firstRowFirstColumn="0" w:firstRowLastColumn="0" w:lastRowFirstColumn="0" w:lastRowLastColumn="0"/>
+            </w:pPr>
+            <w:r>
+              <w:t>Convert an address into geographic coordinates</w:t>
+            </w:r>
+          </w:p>
+        </w:tc>
+        <w:tc>
+          <w:tcPr>
+            <w:tcW w:w="0" w:type="auto"/>
+            <w:vAlign w:val="center"/>
+            <w:hideMark/>
+          </w:tcPr>
+          <w:p>
+            <w:pPr>
+              <w:cnfStyle w:val="000000100000" w:firstRow="0" w:lastRow="0" w:firstColumn="0" w:lastColumn="0" w:oddVBand="0" w:evenVBand="0" w:oddHBand="1" w:evenHBand="0" w:firstRowFirstColumn="0" w:firstRowLastColumn="0" w:lastRowFirstColumn="0" w:lastRowLastColumn="0"/>
+            </w:pPr>
+            <w:r>
+              <w:t>Yes</w:t>
+            </w:r>
+          </w:p>
+        </w:tc>
+      </w:tr>
+      <w:tr>
+        <w:tc>
+          <w:tcPr>
+            <w:cnfStyle w:val="001000000000" w:firstRow="0" w:lastRow="0" w:firstColumn="1" w:lastColumn="0" w:oddVBand="0" w:evenVBand="0" w:oddHBand="0" w:evenHBand="0" w:firstRowFirstColumn="0" w:firstRowLastColumn="0" w:lastRowFirstColumn="0" w:lastRowLastColumn="0"/>
+            <w:tcW w:w="0" w:type="auto"/>
+            <w:vAlign w:val="center"/>
+            <w:hideMark/>
+          </w:tcPr>
+          <w:p>
+            <w:pPr>
+              <w:rPr>
+                <w:b w:val="0"/>
+                <w:bCs w:val="0"/>
+              </w:rPr>
+            </w:pPr>
+            <w:r>
+              <w:rPr>
+                <w:b w:val="0"/>
+                <w:bCs w:val="0"/>
+              </w:rPr>
+              <w:t>/api/v1/integrations/maps/reverse-geocode</w:t>
+            </w:r>
+          </w:p>
+        </w:tc>
+        <w:tc>
+          <w:tcPr>
+            <w:tcW w:w="0" w:type="auto"/>
+            <w:vAlign w:val="center"/>
+            <w:hideMark/>
+          </w:tcPr>
+          <w:p>
+            <w:pPr>
+              <w:cnfStyle w:val="000000000000" w:firstRow="0" w:lastRow="0" w:firstColumn="0" w:lastColumn="0" w:oddVBand="0" w:evenVBand="0" w:oddHBand="0" w:evenHBand="0" w:firstRowFirstColumn="0" w:firstRowLastColumn="0" w:lastRowFirstColumn="0" w:lastRowLastColumn="0"/>
+            </w:pPr>
+            <w:r>
+              <w:t>POST</w:t>
+            </w:r>
+          </w:p>
+        </w:tc>
+        <w:tc>
+          <w:tcPr>
+            <w:tcW w:w="0" w:type="auto"/>
+            <w:vAlign w:val="center"/>
+            <w:hideMark/>
+          </w:tcPr>
+          <w:p>
+            <w:pPr>
+              <w:cnfStyle w:val="000000000000" w:firstRow="0" w:lastRow="0" w:firstColumn="0" w:lastColumn="0" w:oddVBand="0" w:evenVBand="0" w:oddHBand="0" w:evenHBand="0" w:firstRowFirstColumn="0" w:firstRowLastColumn="0" w:lastRowFirstColumn="0" w:lastRowLastColumn="0"/>
+            </w:pPr>
+            <w:r>
+              <w:t>Convert geographic coordinates into a readable address</w:t>
+            </w:r>
+          </w:p>
+        </w:tc>
+        <w:tc>
+          <w:tcPr>
+            <w:tcW w:w="0" w:type="auto"/>
+            <w:vAlign w:val="center"/>
+            <w:hideMark/>
+          </w:tcPr>
+          <w:p>
+            <w:pPr>
+              <w:cnfStyle w:val="000000000000" w:firstRow="0" w:lastRow="0" w:firstColumn="0" w:lastColumn="0" w:oddVBand="0" w:evenVBand="0" w:oddHBand="0" w:evenHBand="0" w:firstRowFirstColumn="0" w:firstRowLastColumn="0" w:lastRowFirstColumn="0" w:lastRowLastColumn="0"/>
+            </w:pPr>
+            <w:r>
+              <w:t>Yes</w:t>
+            </w:r>
+          </w:p>
+        </w:tc>
+      </w:tr>
+      <w:tr>
+        <w:trPr>
+          <w:cnfStyle w:val="000000100000" w:firstRow="0" w:lastRow="0" w:firstColumn="0" w:lastColumn="0" w:oddVBand="0" w:evenVBand="0" w:oddHBand="1" w:evenHBand="0" w:firstRowFirstColumn="0" w:firstRowLastColumn="0" w:lastRowFirstColumn="0" w:lastRowLastColumn="0"/>
+        </w:trPr>
+        <w:tc>
+          <w:tcPr>
+            <w:cnfStyle w:val="001000000000" w:firstRow="0" w:lastRow="0" w:firstColumn="1" w:lastColumn="0" w:oddVBand="0" w:evenVBand="0" w:oddHBand="0" w:evenHBand="0" w:firstRowFirstColumn="0" w:firstRowLastColumn="0" w:lastRowFirstColumn="0" w:lastRowLastColumn="0"/>
+            <w:tcW w:w="0" w:type="auto"/>
+            <w:vAlign w:val="center"/>
+            <w:hideMark/>
+          </w:tcPr>
+          <w:p>
+            <w:pPr>
+              <w:rPr>
+                <w:b w:val="0"/>
+                <w:bCs w:val="0"/>
+              </w:rPr>
+            </w:pPr>
+            <w:r>
+              <w:rPr>
+                <w:b w:val="0"/>
+                <w:bCs w:val="0"/>
+              </w:rPr>
+              <w:t>/api/v1/integrations/maps/nearby-branches</w:t>
+            </w:r>
+          </w:p>
+        </w:tc>
+        <w:tc>
+          <w:tcPr>
+            <w:tcW w:w="0" w:type="auto"/>
+            <w:vAlign w:val="center"/>
+            <w:hideMark/>
+          </w:tcPr>
+          <w:p>
+            <w:pPr>
+              <w:cnfStyle w:val="000000100000" w:firstRow="0" w:lastRow="0" w:firstColumn="0" w:lastColumn="0" w:oddVBand="0" w:evenVBand="0" w:oddHBand="1" w:evenHBand="0" w:firstRowFirstColumn="0" w:firstRowLastColumn="0" w:lastRowFirstColumn="0" w:lastRowLastColumn="0"/>
+            </w:pPr>
+            <w:r>
+              <w:t>GET</w:t>
+            </w:r>
+          </w:p>
+        </w:tc>
+        <w:tc>
+          <w:tcPr>
+            <w:tcW w:w="0" w:type="auto"/>
+            <w:vAlign w:val="center"/>
+            <w:hideMark/>
+          </w:tcPr>
+          <w:p>
+            <w:pPr>
+              <w:cnfStyle w:val="000000100000" w:firstRow="0" w:lastRow="0" w:firstColumn="0" w:lastColumn="0" w:oddVBand="0" w:evenVBand="0" w:oddHBand="1" w:evenHBand="0" w:firstRowFirstColumn="0" w:firstRowLastColumn="0" w:lastRowFirstColumn="0" w:lastRowLastColumn="0"/>
+            </w:pPr>
+            <w:r>
+              <w:t>Retrieve nearby rental branches</w:t>
+            </w:r>
+          </w:p>
+        </w:tc>
+        <w:tc>
+          <w:tcPr>
+            <w:tcW w:w="0" w:type="auto"/>
+            <w:vAlign w:val="center"/>
+            <w:hideMark/>
+          </w:tcPr>
+          <w:p>
+            <w:pPr>
+              <w:cnfStyle w:val="000000100000" w:firstRow="0" w:lastRow="0" w:firstColumn="0" w:lastColumn="0" w:oddVBand="0" w:evenVBand="0" w:oddHBand="1" w:evenHBand="0" w:firstRowFirstColumn="0" w:firstRowLastColumn="0" w:lastRowFirstColumn="0" w:lastRowLastColumn="0"/>
+            </w:pPr>
+            <w:r>
+              <w:t>Yes</w:t>
+            </w:r>
+          </w:p>
+        </w:tc>
+      </w:tr>
+      <w:tr>
+        <w:tc>
+          <w:tcPr>
+            <w:cnfStyle w:val="001000000000" w:firstRow="0" w:lastRow="0" w:firstColumn="1" w:lastColumn="0" w:oddVBand="0" w:evenVBand="0" w:oddHBand="0" w:evenHBand="0" w:firstRowFirstColumn="0" w:firstRowLastColumn="0" w:lastRowFirstColumn="0" w:lastRowLastColumn="0"/>
+            <w:tcW w:w="0" w:type="auto"/>
+            <w:vAlign w:val="center"/>
+            <w:hideMark/>
+          </w:tcPr>
+          <w:p>
+            <w:pPr>
+              <w:rPr>
+                <w:b w:val="0"/>
+                <w:bCs w:val="0"/>
+              </w:rPr>
+            </w:pPr>
+            <w:r>
+              <w:rPr>
+                <w:b w:val="0"/>
+                <w:bCs w:val="0"/>
+              </w:rPr>
+              <w:t>/api/v1/integrations/maps/directions</w:t>
+            </w:r>
+          </w:p>
+        </w:tc>
+        <w:tc>
+          <w:tcPr>
+            <w:tcW w:w="0" w:type="auto"/>
+            <w:vAlign w:val="center"/>
+            <w:hideMark/>
+          </w:tcPr>
+          <w:p>
+            <w:pPr>
+              <w:cnfStyle w:val="000000000000" w:firstRow="0" w:lastRow="0" w:firstColumn="0" w:lastColumn="0" w:oddVBand="0" w:evenVBand="0" w:oddHBand="0" w:evenHBand="0" w:firstRowFirstColumn="0" w:firstRowLastColumn="0" w:lastRowFirstColumn="0" w:lastRowLastColumn="0"/>
+            </w:pPr>
+            <w:r>
+              <w:t>GET</w:t>
+            </w:r>
+          </w:p>
+        </w:tc>
+        <w:tc>
+          <w:tcPr>
+            <w:tcW w:w="0" w:type="auto"/>
+            <w:vAlign w:val="center"/>
+            <w:hideMark/>
+          </w:tcPr>
+          <w:p>
+            <w:pPr>
+              <w:cnfStyle w:val="000000000000" w:firstRow="0" w:lastRow="0" w:firstColumn="0" w:lastColumn="0" w:oddVBand="0" w:evenVBand="0" w:oddHBand="0" w:evenHBand="0" w:firstRowFirstColumn="0" w:firstRowLastColumn="0" w:lastRowFirstColumn="0" w:lastRowLastColumn="0"/>
+            </w:pPr>
+            <w:r>
+              <w:t>Calculate routes between two locations</w:t>
+            </w:r>
+          </w:p>
+        </w:tc>
+        <w:tc>
+          <w:tcPr>
+            <w:tcW w:w="0" w:type="auto"/>
+            <w:vAlign w:val="center"/>
+            <w:hideMark/>
+          </w:tcPr>
+          <w:p>
+            <w:pPr>
+              <w:cnfStyle w:val="000000000000" w:firstRow="0" w:lastRow="0" w:firstColumn="0" w:lastColumn="0" w:oddVBand="0" w:evenVBand="0" w:oddHBand="0" w:evenHBand="0" w:firstRowFirstColumn="0" w:firstRowLastColumn="0" w:lastRowFirstColumn="0" w:lastRowLastColumn="0"/>
+            </w:pPr>
+            <w:r>
+              <w:t>Yes</w:t>
+            </w:r>
+          </w:p>
+        </w:tc>
+      </w:tr>
+      <w:tr>
+        <w:trPr>
+          <w:cnfStyle w:val="000000100000" w:firstRow="0" w:lastRow="0" w:firstColumn="0" w:lastColumn="0" w:oddVBand="0" w:evenVBand="0" w:oddHBand="1" w:evenHBand="0" w:firstRowFirstColumn="0" w:firstRowLastColumn="0" w:lastRowFirstColumn="0" w:lastRowLastColumn="0"/>
+        </w:trPr>
+        <w:tc>
+          <w:tcPr>
+            <w:cnfStyle w:val="001000000000" w:firstRow="0" w:lastRow="0" w:firstColumn="1" w:lastColumn="0" w:oddVBand="0" w:evenVBand="0" w:oddHBand="0" w:evenHBand="0" w:firstRowFirstColumn="0" w:firstRowLastColumn="0" w:lastRowFirstColumn="0" w:lastRowLastColumn="0"/>
+            <w:tcW w:w="0" w:type="auto"/>
+            <w:vAlign w:val="center"/>
+            <w:hideMark/>
+          </w:tcPr>
+          <w:p>
+            <w:pPr>
+              <w:rPr>
+                <w:b w:val="0"/>
+                <w:bCs w:val="0"/>
+              </w:rPr>
+            </w:pPr>
+            <w:r>
+              <w:rPr>
+                <w:b w:val="0"/>
+                <w:bCs w:val="0"/>
+              </w:rPr>
+              <w:t>/api/v1/integrations/maps/distance</w:t>
+            </w:r>
+          </w:p>
+        </w:tc>
+        <w:tc>
+          <w:tcPr>
+            <w:tcW w:w="0" w:type="auto"/>
+            <w:vAlign w:val="center"/>
+            <w:hideMark/>
+          </w:tcPr>
+          <w:p>
+            <w:pPr>
+              <w:cnfStyle w:val="000000100000" w:firstRow="0" w:lastRow="0" w:firstColumn="0" w:lastColumn="0" w:oddVBand="0" w:evenVBand="0" w:oddHBand="1" w:evenHBand="0" w:firstRowFirstColumn="0" w:firstRowLastColumn="0" w:lastRowFirstColumn="0" w:lastRowLastColumn="0"/>
+            </w:pPr>
+            <w:r>
+              <w:t>GET</w:t>
+            </w:r>
+          </w:p>
+        </w:tc>
+        <w:tc>
+          <w:tcPr>
+            <w:tcW w:w="0" w:type="auto"/>
+            <w:vAlign w:val="center"/>
+            <w:hideMark/>
+          </w:tcPr>
+          <w:p>
+            <w:pPr>
+              <w:cnfStyle w:val="000000100000" w:firstRow="0" w:lastRow="0" w:firstColumn="0" w:lastColumn="0" w:oddVBand="0" w:evenVBand="0" w:oddHBand="1" w:evenHBand="0" w:firstRowFirstColumn="0" w:firstRowLastColumn="0" w:lastRowFirstColumn="0" w:lastRowLastColumn="0"/>
+            </w:pPr>
+            <w:r>
+              <w:t>Calculate travel distance and estimated duration</w:t>
+            </w:r>
+          </w:p>
+        </w:tc>
+        <w:tc>
+          <w:tcPr>
+            <w:tcW w:w="0" w:type="auto"/>
+            <w:vAlign w:val="center"/>
+            <w:hideMark/>
+          </w:tcPr>
+          <w:p>
+            <w:pPr>
+              <w:cnfStyle w:val="000000100000" w:firstRow="0" w:lastRow="0" w:firstColumn="0" w:lastColumn="0" w:oddVBand="0" w:evenVBand="0" w:oddHBand="1" w:evenHBand="0" w:firstRowFirstColumn="0" w:firstRowLastColumn="0" w:lastRowFirstColumn="0" w:lastRowLastColumn="0"/>
+            </w:pPr>
+            <w:r>
+              <w:t>Yes</w:t>
+            </w:r>
+          </w:p>
+        </w:tc>
+      </w:tr>
+      <w:tr>
+        <w:tc>
+          <w:tcPr>
+            <w:cnfStyle w:val="001000000000" w:firstRow="0" w:lastRow="0" w:firstColumn="1" w:lastColumn="0" w:oddVBand="0" w:evenVBand="0" w:oddHBand="0" w:evenHBand="0" w:firstRowFirstColumn="0" w:firstRowLastColumn="0" w:lastRowFirstColumn="0" w:lastRowLastColumn="0"/>
+            <w:tcW w:w="0" w:type="auto"/>
+            <w:vAlign w:val="center"/>
+            <w:hideMark/>
+          </w:tcPr>
+          <w:p>
+            <w:pPr>
+              <w:rPr>
+                <w:b w:val="0"/>
+                <w:bCs w:val="0"/>
+              </w:rPr>
+            </w:pPr>
+            <w:r>
+              <w:rPr>
+                <w:b w:val="0"/>
+                <w:bCs w:val="0"/>
+              </w:rPr>
+              <w:t>/api/v1/integrations/maps/place-search</w:t>
+            </w:r>
+          </w:p>
+        </w:tc>
+        <w:tc>
+          <w:tcPr>
+            <w:tcW w:w="0" w:type="auto"/>
+            <w:vAlign w:val="center"/>
+            <w:hideMark/>
+          </w:tcPr>
+          <w:p>
+            <w:pPr>
+              <w:cnfStyle w:val="000000000000" w:firstRow="0" w:lastRow="0" w:firstColumn="0" w:lastColumn="0" w:oddVBand="0" w:evenVBand="0" w:oddHBand="0" w:evenHBand="0" w:firstRowFirstColumn="0" w:firstRowLastColumn="0" w:lastRowFirstColumn="0" w:lastRowLastColumn="0"/>
+            </w:pPr>
+            <w:r>
+              <w:t>GET</w:t>
+            </w:r>
+          </w:p>
+        </w:tc>
+        <w:tc>
+          <w:tcPr>
+            <w:tcW w:w="0" w:type="auto"/>
+            <w:vAlign w:val="center"/>
+            <w:hideMark/>
+          </w:tcPr>
+          <w:p>
+            <w:pPr>
+              <w:cnfStyle w:val="000000000000" w:firstRow="0" w:lastRow="0" w:firstColumn="0" w:lastColumn="0" w:oddVBand="0" w:evenVBand="0" w:oddHBand="0" w:evenHBand="0" w:firstRowFirstColumn="0" w:firstRowLastColumn="0" w:lastRowFirstColumn="0" w:lastRowLastColumn="0"/>
+            </w:pPr>
+            <w:r>
+              <w:t>Search for locations and places</w:t>
+            </w:r>
+          </w:p>
+        </w:tc>
+        <w:tc>
+          <w:tcPr>
+            <w:tcW w:w="0" w:type="auto"/>
+            <w:vAlign w:val="center"/>
+            <w:hideMark/>
+          </w:tcPr>
+          <w:p>
+            <w:pPr>
+              <w:cnfStyle w:val="000000000000" w:firstRow="0" w:lastRow="0" w:firstColumn="0" w:lastColumn="0" w:oddVBand="0" w:evenVBand="0" w:oddHBand="0" w:evenHBand="0" w:firstRowFirstColumn="0" w:firstRowLastColumn="0" w:lastRowFirstColumn="0" w:lastRowLastColumn="0"/>
+            </w:pPr>
+            <w:r>
+              <w:t>Yes</w:t>
+            </w:r>
+          </w:p>
+        </w:tc>
+      </w:tr>
+      <w:tr>
+        <w:trPr>
+          <w:cnfStyle w:val="000000100000" w:firstRow="0" w:lastRow="0" w:firstColumn="0" w:lastColumn="0" w:oddVBand="0" w:evenVBand="0" w:oddHBand="1" w:evenHBand="0" w:firstRowFirstColumn="0" w:firstRowLastColumn="0" w:lastRowFirstColumn="0" w:lastRowLastColumn="0"/>
+        </w:trPr>
+        <w:tc>
+          <w:tcPr>
+            <w:cnfStyle w:val="001000000000" w:firstRow="0" w:lastRow="0" w:firstColumn="1" w:lastColumn="0" w:oddVBand="0" w:evenVBand="0" w:oddHBand="0" w:evenHBand="0" w:firstRowFirstColumn="0" w:firstRowLastColumn="0" w:lastRowFirstColumn="0" w:lastRowLastColumn="0"/>
+            <w:tcW w:w="0" w:type="auto"/>
+            <w:vAlign w:val="center"/>
+            <w:hideMark/>
+          </w:tcPr>
+          <w:p>
+            <w:pPr>
+              <w:rPr>
+                <w:b w:val="0"/>
+                <w:bCs w:val="0"/>
+              </w:rPr>
+            </w:pPr>
+            <w:r>
+              <w:rPr>
+                <w:b w:val="0"/>
+                <w:bCs w:val="0"/>
+              </w:rPr>
+              <w:t>/api/v1/integrations/maps/autocomplete</w:t>
+            </w:r>
+          </w:p>
+        </w:tc>
+        <w:tc>
+          <w:tcPr>
+            <w:tcW w:w="0" w:type="auto"/>
+            <w:vAlign w:val="center"/>
+            <w:hideMark/>
+          </w:tcPr>
+          <w:p>
+            <w:pPr>
+              <w:cnfStyle w:val="000000100000" w:firstRow="0" w:lastRow="0" w:firstColumn="0" w:lastColumn="0" w:oddVBand="0" w:evenVBand="0" w:oddHBand="1" w:evenHBand="0" w:firstRowFirstColumn="0" w:firstRowLastColumn="0" w:lastRowFirstColumn="0" w:lastRowLastColumn="0"/>
+            </w:pPr>
+            <w:r>
+              <w:t>GET</w:t>
+            </w:r>
+          </w:p>
+        </w:tc>
+        <w:tc>
+          <w:tcPr>
+            <w:tcW w:w="0" w:type="auto"/>
+            <w:vAlign w:val="center"/>
+            <w:hideMark/>
+          </w:tcPr>
+          <w:p>
+            <w:pPr>
+              <w:cnfStyle w:val="000000100000" w:firstRow="0" w:lastRow="0" w:firstColumn="0" w:lastColumn="0" w:oddVBand="0" w:evenVBand="0" w:oddHBand="1" w:evenHBand="0" w:firstRowFirstColumn="0" w:firstRowLastColumn="0" w:lastRowFirstColumn="0" w:lastRowLastColumn="0"/>
+            </w:pPr>
+            <w:r>
+              <w:t>Retrieve address autocomplete suggestions</w:t>
+            </w:r>
+          </w:p>
+        </w:tc>
+        <w:tc>
+          <w:tcPr>
+            <w:tcW w:w="0" w:type="auto"/>
+            <w:vAlign w:val="center"/>
+            <w:hideMark/>
+          </w:tcPr>
+          <w:p>
+            <w:pPr>
+              <w:cnfStyle w:val="000000100000" w:firstRow="0" w:lastRow="0" w:firstColumn="0" w:lastColumn="0" w:oddVBand="0" w:evenVBand="0" w:oddHBand="1" w:evenHBand="0" w:firstRowFirstColumn="0" w:firstRowLastColumn="0" w:lastRowFirstColumn="0" w:lastRowLastColumn="0"/>
+            </w:pPr>
+            <w:r>
+              <w:t>Yes</w:t>
+            </w:r>
+          </w:p>
+        </w:tc>
+      </w:tr>
+      <w:tr>
+        <w:tc>
+          <w:tcPr>
+            <w:cnfStyle w:val="001000000000" w:firstRow="0" w:lastRow="0" w:firstColumn="1" w:lastColumn="0" w:oddVBand="0" w:evenVBand="0" w:oddHBand="0" w:evenHBand="0" w:firstRowFirstColumn="0" w:firstRowLastColumn="0" w:lastRowFirstColumn="0" w:lastRowLastColumn="0"/>
+            <w:tcW w:w="0" w:type="auto"/>
+            <w:vAlign w:val="center"/>
+            <w:hideMark/>
+          </w:tcPr>
+          <w:p>
+            <w:pPr>
+              <w:rPr>
+                <w:b w:val="0"/>
+                <w:bCs w:val="0"/>
+              </w:rPr>
+            </w:pPr>
+            <w:r>
+              <w:rPr>
+                <w:b w:val="0"/>
+                <w:bCs w:val="0"/>
+              </w:rPr>
+              <w:lastRenderedPageBreak/>
+              <w:t>/api/v1/integrations/maps/static-map</w:t>
+            </w:r>
+          </w:p>
+        </w:tc>
+        <w:tc>
+          <w:tcPr>
+            <w:tcW w:w="0" w:type="auto"/>
+            <w:vAlign w:val="center"/>
+            <w:hideMark/>
+          </w:tcPr>
+          <w:p>
+            <w:pPr>
+              <w:cnfStyle w:val="000000000000" w:firstRow="0" w:lastRow="0" w:firstColumn="0" w:lastColumn="0" w:oddVBand="0" w:evenVBand="0" w:oddHBand="0" w:evenHBand="0" w:firstRowFirstColumn="0" w:firstRowLastColumn="0" w:lastRowFirstColumn="0" w:lastRowLastColumn="0"/>
+            </w:pPr>
+            <w:r>
+              <w:t>GET</w:t>
+            </w:r>
+          </w:p>
+        </w:tc>
+        <w:tc>
+          <w:tcPr>
+            <w:tcW w:w="0" w:type="auto"/>
+            <w:vAlign w:val="center"/>
+            <w:hideMark/>
+          </w:tcPr>
+          <w:p>
+            <w:pPr>
+              <w:cnfStyle w:val="000000000000" w:firstRow="0" w:lastRow="0" w:firstColumn="0" w:lastColumn="0" w:oddVBand="0" w:evenVBand="0" w:oddHBand="0" w:evenHBand="0" w:firstRowFirstColumn="0" w:firstRowLastColumn="0" w:lastRowFirstColumn="0" w:lastRowLastColumn="0"/>
+            </w:pPr>
+            <w:r>
+              <w:t>Generate a static map for a specified location</w:t>
+            </w:r>
+          </w:p>
+        </w:tc>
+        <w:tc>
+          <w:tcPr>
+            <w:tcW w:w="0" w:type="auto"/>
+            <w:vAlign w:val="center"/>
+            <w:hideMark/>
+          </w:tcPr>
+          <w:p>
+            <w:pPr>
+              <w:cnfStyle w:val="000000000000" w:firstRow="0" w:lastRow="0" w:firstColumn="0" w:lastColumn="0" w:oddVBand="0" w:evenVBand="0" w:oddHBand="0" w:evenHBand="0" w:firstRowFirstColumn="0" w:firstRowLastColumn="0" w:lastRowFirstColumn="0" w:lastRowLastColumn="0"/>
+            </w:pPr>
+            <w:r>
+              <w:t>Yes</w:t>
+            </w:r>
+          </w:p>
+        </w:tc>
+      </w:tr>
+    </w:tbl>
+    <w:p/>
+    <w:p>
+      <w:pPr>
+        <w:pStyle w:val="Title"/>
+      </w:pPr>
+      <w:r>
+        <w:t>API Design Considerations</w:t>
+      </w:r>
+    </w:p>
+    <w:p>
+      <w:r>
+        <w:t>The Maps Service APIs follow the below guidelines:</w:t>
+      </w:r>
+    </w:p>
+    <w:p>
+      <w:pPr>
+        <w:pStyle w:val="ListParagraph"/>
+        <w:numPr>
+          <w:ilvl w:val="1"/>
+          <w:numId w:val="179"/>
+        </w:numPr>
+      </w:pPr>
+      <w:r>
+        <w:t>RESTful Communication: The mapping services are accessible through REST endpoints using JSON data format.</w:t>
+      </w:r>
+    </w:p>
+    <w:p>
+      <w:pPr>
+        <w:pStyle w:val="ListParagraph"/>
+        <w:numPr>
+          <w:ilvl w:val="1"/>
+          <w:numId w:val="179"/>
+        </w:numPr>
+      </w:pPr>
+      <w:r>
+        <w:t>Secure Communication: All communications are carried out using HTTPS and TLS.</w:t>
+      </w:r>
+    </w:p>
+    <w:p>
+      <w:pPr>
+        <w:pStyle w:val="ListParagraph"/>
+        <w:numPr>
+          <w:ilvl w:val="1"/>
+          <w:numId w:val="179"/>
+        </w:numPr>
+      </w:pPr>
+      <w:r>
+        <w:t>JWT Authentication: Access to protected mapping services is granted using JWT tokens for authenticated users.</w:t>
+      </w:r>
+    </w:p>
+    <w:p>
+      <w:pPr>
+        <w:pStyle w:val="ListParagraph"/>
+        <w:numPr>
+          <w:ilvl w:val="1"/>
+          <w:numId w:val="179"/>
+        </w:numPr>
+      </w:pPr>
+      <w:r>
+        <w:t>Provider Authentication: Access to external mapping providers is secured using API keys.</w:t>
+      </w:r>
+    </w:p>
+    <w:p>
+      <w:pPr>
+        <w:pStyle w:val="ListParagraph"/>
+        <w:numPr>
+          <w:ilvl w:val="1"/>
+          <w:numId w:val="179"/>
+        </w:numPr>
+      </w:pPr>
+      <w:r>
+        <w:t>Data Protection: Only necessary location data is sent for each request.</w:t>
+      </w:r>
+    </w:p>
+    <w:p>
+      <w:pPr>
+        <w:pStyle w:val="ListParagraph"/>
+        <w:numPr>
+          <w:ilvl w:val="1"/>
+          <w:numId w:val="179"/>
+        </w:numPr>
+      </w:pPr>
+      <w:r>
+        <w:t>Location Verification: Responses to geocoding and routing requests are validated before being provided to users.</w:t>
+      </w:r>
+    </w:p>
+    <w:p>
+      <w:pPr>
+        <w:pStyle w:val="ListParagraph"/>
+        <w:numPr>
+          <w:ilvl w:val="1"/>
+          <w:numId w:val="179"/>
+        </w:numPr>
+      </w:pPr>
+      <w:r>
+        <w:t>Scalable Implementation: Mapping providers can be changed and/or extended without having to modify internal business services.</w:t>
+      </w:r>
+    </w:p>
+    <w:p>
+      <w:pPr>
+        <w:pStyle w:val="ListParagraph"/>
+        <w:numPr>
+          <w:ilvl w:val="1"/>
+          <w:numId w:val="179"/>
+        </w:numPr>
+      </w:pPr>
+      <w:r>
+        <w:t>Error Handling: Requests containing invalid addresses, non-existent locations, and errors from providers are handled through standard error messages.</w:t>
+      </w:r>
+    </w:p>
+    <w:p>
+      <w:pPr>
+        <w:pStyle w:val="Title"/>
+      </w:pPr>
+      <w:r>
+        <w:t>Maps Service Workflow</w:t>
+      </w:r>
+    </w:p>
+    <w:p>
+      <w:r>
+        <w:t>The maps service process involves the following activities in order:</w:t>
+      </w:r>
+    </w:p>
+    <w:p>
+      <w:pPr>
+        <w:pStyle w:val="ListParagraph"/>
+        <w:numPr>
+          <w:ilvl w:val="0"/>
+          <w:numId w:val="182"/>
+        </w:numPr>
+      </w:pPr>
+      <w:r>
+        <w:t>A client makes a location-related request, for instance, searching for branches near the client’s location or getting navigation directions.</w:t>
+      </w:r>
+    </w:p>
+    <w:p>
+      <w:pPr>
+        <w:pStyle w:val="ListParagraph"/>
+        <w:numPr>
+          <w:ilvl w:val="0"/>
+          <w:numId w:val="182"/>
+        </w:numPr>
+      </w:pPr>
+      <w:r>
+        <w:t>Either the Vehicle Search Service or Customer Service verifies the request and forwards it to the Maps Service.</w:t>
+      </w:r>
+    </w:p>
+    <w:p>
+      <w:pPr>
+        <w:pStyle w:val="ListParagraph"/>
+        <w:numPr>
+          <w:ilvl w:val="0"/>
+          <w:numId w:val="182"/>
+        </w:numPr>
+      </w:pPr>
+      <w:r>
+        <w:t>The Maps Service connects with the external mapping provider in a secure way.</w:t>
+      </w:r>
+    </w:p>
+    <w:p>
+      <w:pPr>
+        <w:pStyle w:val="ListParagraph"/>
+        <w:numPr>
+          <w:ilvl w:val="0"/>
+          <w:numId w:val="182"/>
+        </w:numPr>
+      </w:pPr>
+      <w:r>
+        <w:t>The mapping provider receives the request and responds with geolocation, routing, or distance details.</w:t>
+      </w:r>
+    </w:p>
+    <w:p>
+      <w:pPr>
+        <w:pStyle w:val="ListParagraph"/>
+        <w:numPr>
+          <w:ilvl w:val="0"/>
+          <w:numId w:val="182"/>
+        </w:numPr>
+      </w:pPr>
+      <w:r>
+        <w:t>The response from the mapping provider is validated and formatted by the Maps Service.</w:t>
+      </w:r>
+    </w:p>
+    <w:p>
+      <w:pPr>
+        <w:pStyle w:val="ListParagraph"/>
+        <w:numPr>
+          <w:ilvl w:val="0"/>
+          <w:numId w:val="182"/>
+        </w:numPr>
+      </w:pPr>
+      <w:r>
+        <w:t>Geographic information is passed back to the requesting service of the platform.</w:t>
+      </w:r>
+    </w:p>
+    <w:p>
+      <w:pPr>
+        <w:pStyle w:val="ListParagraph"/>
+        <w:numPr>
+          <w:ilvl w:val="0"/>
+          <w:numId w:val="182"/>
+        </w:numPr>
+      </w:pPr>
+      <w:r>
+        <w:rPr>
+          <w:noProof/>
+        </w:rPr>
+        <mc:AlternateContent>
+          <mc:Choice Requires="wps">
+            <w:drawing>
+              <wp:anchor distT="0" distB="0" distL="114300" distR="114300" simplePos="0" relativeHeight="251697152" behindDoc="0" locked="0" layoutInCell="1" allowOverlap="1" wp14:anchorId="730F275B" wp14:editId="79EF8184">
+                <wp:simplePos x="0" y="0"/>
+                <wp:positionH relativeFrom="column">
+                  <wp:posOffset>3175</wp:posOffset>
+                </wp:positionH>
+                <wp:positionV relativeFrom="paragraph">
+                  <wp:posOffset>1652905</wp:posOffset>
+                </wp:positionV>
+                <wp:extent cx="5941695" cy="635"/>
+                <wp:effectExtent l="0" t="0" r="0" b="0"/>
+                <wp:wrapSquare wrapText="bothSides"/>
+                <wp:docPr id="186393463" name="Text Box 1"/>
+                <wp:cNvGraphicFramePr/>
+                <a:graphic xmlns:a="http://schemas.openxmlformats.org/drawingml/2006/main">
+                  <a:graphicData uri="http://schemas.microsoft.com/office/word/2010/wordprocessingShape">
+                    <wps:wsp>
+                      <wps:cNvSpPr txBox="1"/>
+                      <wps:spPr>
+                        <a:xfrm>
+                          <a:off x="0" y="0"/>
+                          <a:ext cx="5941695" cy="635"/>
+                        </a:xfrm>
+                        <a:prstGeom prst="rect">
+                          <a:avLst/>
+                        </a:prstGeom>
+                        <a:solidFill>
+                          <a:prstClr val="white"/>
+                        </a:solidFill>
+                        <a:ln>
+                          <a:noFill/>
+                        </a:ln>
+                      </wps:spPr>
+                      <wps:txbx>
+                        <w:txbxContent>
+                          <w:p>
+                            <w:pPr>
+                              <w:pStyle w:val="Caption"/>
+                              <w:jc w:val="center"/>
+                            </w:pPr>
+                            <w:r>
+                              <w:t xml:space="preserve">Figure </w:t>
+                            </w:r>
+                            <w:r>
+                              <w:fldChar w:fldCharType="begin"/>
+                            </w:r>
+                            <w:r>
+                              <w:instrText xml:space="preserve"> SEQ Figure \* ARABIC </w:instrText>
+                            </w:r>
+                            <w:r>
+                              <w:fldChar w:fldCharType="separate"/>
+                            </w:r>
+                            <w:r>
+                              <w:rPr>
+                                <w:noProof/>
+                              </w:rPr>
+                              <w:t>13</w:t>
+                            </w:r>
+                            <w:r>
+                              <w:fldChar w:fldCharType="end"/>
+                            </w:r>
+                            <w:r>
+                              <w:t xml:space="preserve"> - </w:t>
+                            </w:r>
+                            <w:r>
+                              <w:t>Maps Service Workflow</w:t>
+                            </w:r>
+                          </w:p>
+                        </w:txbxContent>
+                      </wps:txbx>
+                      <wps:bodyPr rot="0" spcFirstLastPara="0" vertOverflow="overflow" horzOverflow="overflow" vert="horz" wrap="square" lIns="0" tIns="0" rIns="0" bIns="0" numCol="1" spcCol="0" rtlCol="0" fromWordArt="0" anchor="t" anchorCtr="0" forceAA="0" compatLnSpc="1">
+                        <a:prstTxWarp prst="textNoShape">
+                          <a:avLst/>
+                        </a:prstTxWarp>
+                        <a:spAutoFit/>
+                      </wps:bodyPr>
+                    </wps:wsp>
+                  </a:graphicData>
+                </a:graphic>
+              </wp:anchor>
+            </w:drawing>
+          </mc:Choice>
+          <mc:Fallback>
+            <w:pict>
+              <v:shape w14:anchorId="730F275B" id="_x0000_s1038" type="#_x0000_t202" style="position:absolute;left:0;text-align:left;margin-left:.25pt;margin-top:130.15pt;width:467.85pt;height:.05pt;z-index:251697152;visibility:visible;mso-wrap-style:square;mso-wrap-distance-left:9pt;mso-wrap-distance-top:0;mso-wrap-distance-right:9pt;mso-wrap-distance-bottom:0;mso-position-horizontal:absolute;mso-position-horizontal-relative:text;mso-position-vertical:absolute;mso-position-vertical-relative:text;v-text-anchor:top" o:gfxdata="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" stroked="f">
+                <v:textbox style="mso-fit-shape-to-text:t" inset="0,0,0,0">
+                  <w:txbxContent>
+                    <w:p>
+                      <w:pPr>
+                        <w:pStyle w:val="Caption"/>
+                        <w:jc w:val="center"/>
+                      </w:pPr>
+                      <w:r>
+                        <w:t xml:space="preserve">Figure </w:t>
+                      </w:r>
+                      <w:r>
+                        <w:fldChar w:fldCharType="begin"/>
+                      </w:r>
+                      <w:r>
+                        <w:instrText xml:space="preserve"> SEQ Figure \* ARABIC </w:instrText>
+                      </w:r>
+                      <w:r>
+                        <w:fldChar w:fldCharType="separate"/>
+                      </w:r>
+                      <w:r>
+                        <w:rPr>
+                          <w:noProof/>
+                        </w:rPr>
+                        <w:t>13</w:t>
+                      </w:r>
+                      <w:r>
+                        <w:fldChar w:fldCharType="end"/>
+                      </w:r>
+                      <w:r>
+                        <w:t xml:space="preserve"> - </w:t>
+                      </w:r>
+                      <w:r>
+                        <w:t>Maps Service Workflow</w:t>
+                      </w:r>
+                    </w:p>
+                  </w:txbxContent>
+                </v:textbox>
+                <w10:wrap type="square"/>
+              </v:shape>
+            </w:pict>
+          </mc:Fallback>
+        </mc:AlternateContent>
+      </w:r>
+      <w:r>
+        <w:drawing>
+          <wp:anchor distT="0" distB="0" distL="114300" distR="114300" simplePos="0" relativeHeight="251695104" behindDoc="0" locked="0" layoutInCell="1" allowOverlap="1" wp14:anchorId="09483860" wp14:editId="412262D8">
+            <wp:simplePos x="0" y="0"/>
+            <wp:positionH relativeFrom="column">
+              <wp:posOffset>3175</wp:posOffset>
+            </wp:positionH>
+            <wp:positionV relativeFrom="paragraph">
+              <wp:posOffset>487045</wp:posOffset>
+            </wp:positionV>
+            <wp:extent cx="5941695" cy="1108710"/>
+            <wp:effectExtent l="0" t="0" r="1905" b="0"/>
+            <wp:wrapSquare wrapText="bothSides"/>
+            <wp:docPr id="94161171" name="Picture 1"/>
+            <wp:cNvGraphicFramePr>
+              <a:graphicFrameLocks xmlns:a="http://schemas.openxmlformats.org/drawingml/2006/main" noChangeAspect="1"/>
+            </wp:cNvGraphicFramePr>
+            <a:graphic xmlns:a="http://schemas.openxmlformats.org/drawingml/2006/main">
+              <a:graphicData uri="http://schemas.openxmlformats.org/drawingml/2006/picture">
+                <pic:pic xmlns:pic="http://schemas.openxmlformats.org/drawingml/2006/picture">
+                  <pic:nvPicPr>
+                    <pic:cNvPr id="94161171" name=""/>
+                    <pic:cNvPicPr/>
+                  </pic:nvPicPr>
+                  <pic:blipFill>
+                    <a:blip r:embed="rId20">
+                      <a:extLst>
+                        <a:ext uri="{28A0092B-C50C-407E-A947-70E740481C1C}">
+                          <a14:useLocalDpi xmlns:a14="http://schemas.microsoft.com/office/drawing/2010/main" val="0"/>
+                        </a:ext>
+                      </a:extLst>
+                    </a:blip>
+                    <a:stretch>
+                      <a:fillRect/>
+                    </a:stretch>
+                  </pic:blipFill>
+                  <pic:spPr>
+                    <a:xfrm>
+                      <a:off x="0" y="0"/>
+                      <a:ext cx="5941695" cy="1108710"/>
+                    </a:xfrm>
+                    <a:prstGeom prst="rect">
+                      <a:avLst/>
+                    </a:prstGeom>
+                  </pic:spPr>
+                </pic:pic>
+              </a:graphicData>
+            </a:graphic>
+          </wp:anchor>
+        </w:drawing>
+      </w:r>
+      <w:r>
+        <w:t>The client application displays branch locations, navigation directions, travel distances, or suggestions of addresses to the customer.</w:t>
+      </w:r>
+    </w:p>
+    <w:p/>
+    <w:p>
+      <w:pPr>
+        <w:spacing w:line="278" w:lineRule="auto"/>
+      </w:pPr>
+      <w:r>
+        <w:br w:type="page"/>
+      </w:r>
+    </w:p>
+    <w:p/>
     <w:sectPr>
-      <w:headerReference w:type="default" r:id="rId20"/>
-      <w:footerReference w:type="default" r:id="rId21"/>
+      <w:headerReference w:type="default" r:id="rId21"/>
+      <w:footerReference w:type="default" r:id="rId22"/>
       <w:pgSz w:w="11906" w:h="16838" w:code="9"/>
       <w:pgMar w:top="1411" w:right="850" w:bottom="1411" w:left="1699" w:header="720" w:footer="288" w:gutter="0"/>
       <w:pgNumType w:start="1"/>
@@ -30796,6 +31891,92 @@
     </w:lvl>
   </w:abstractNum>
   <w:abstractNum w:abstractNumId="101" w15:restartNumberingAfterBreak="0">
+    <w:nsid w:val="44856EAF"/>
+    <w:multiLevelType w:val="hybridMultilevel"/>
+    <w:tmpl w:val="1F3A5F58"/>
+    <w:lvl w:ilvl="0" w:tplc="0409000F">
+      <w:start w:val="1"/>
+      <w:numFmt w:val="decimal"/>
+      <w:lvlText w:val="%1."/>
+      <w:lvlJc w:val="left"/>
+      <w:pPr>
+        <w:ind w:left="720" w:hanging="360"/>
+      </w:pPr>
+    </w:lvl>
+    <w:lvl w:ilvl="1" w:tplc="04090019" w:tentative="1">
+      <w:start w:val="1"/>
+      <w:numFmt w:val="lowerLetter"/>
+      <w:lvlText w:val="%2."/>
+      <w:lvlJc w:val="left"/>
+      <w:pPr>
+        <w:ind w:left="1440" w:hanging="360"/>
+      </w:pPr>
+    </w:lvl>
+    <w:lvl w:ilvl="2" w:tplc="0409001B" w:tentative="1">
+      <w:start w:val="1"/>
+      <w:numFmt w:val="lowerRoman"/>
+      <w:lvlText w:val="%3."/>
+      <w:lvlJc w:val="right"/>
+      <w:pPr>
+        <w:ind w:left="2160" w:hanging="180"/>
+      </w:pPr>
+    </w:lvl>
+    <w:lvl w:ilvl="3" w:tplc="0409000F" w:tentative="1">
+      <w:start w:val="1"/>
+      <w:numFmt w:val="decimal"/>
+      <w:lvlText w:val="%4."/>
+      <w:lvlJc w:val="left"/>
+      <w:pPr>
+        <w:ind w:left="2880" w:hanging="360"/>
+      </w:pPr>
+    </w:lvl>
+    <w:lvl w:ilvl="4" w:tplc="04090019" w:tentative="1">
+      <w:start w:val="1"/>
+      <w:numFmt w:val="lowerLetter"/>
+      <w:lvlText w:val="%5."/>
+      <w:lvlJc w:val="left"/>
+      <w:pPr>
+        <w:ind w:left="3600" w:hanging="360"/>
+      </w:pPr>
+    </w:lvl>
+    <w:lvl w:ilvl="5" w:tplc="0409001B" w:tentative="1">
+      <w:start w:val="1"/>
+      <w:numFmt w:val="lowerRoman"/>
+      <w:lvlText w:val="%6."/>
+      <w:lvlJc w:val="right"/>
+      <w:pPr>
+        <w:ind w:left="4320" w:hanging="180"/>
+      </w:pPr>
+    </w:lvl>
+    <w:lvl w:ilvl="6" w:tplc="0409000F" w:tentative="1">
+      <w:start w:val="1"/>
+      <w:numFmt w:val="decimal"/>
+      <w:lvlText w:val="%7."/>
+      <w:lvlJc w:val="left"/>
+      <w:pPr>
+        <w:ind w:left="5040" w:hanging="360"/>
+      </w:pPr>
+    </w:lvl>
+    <w:lvl w:ilvl="7" w:tplc="04090019" w:tentative="1">
+      <w:start w:val="1"/>
+      <w:numFmt w:val="lowerLetter"/>
+      <w:lvlText w:val="%8."/>
+      <w:lvlJc w:val="left"/>
+      <w:pPr>
+        <w:ind w:left="5760" w:hanging="360"/>
+      </w:pPr>
+    </w:lvl>
+    <w:lvl w:ilvl="8" w:tplc="0409001B" w:tentative="1">
+      <w:start w:val="1"/>
+      <w:numFmt w:val="lowerRoman"/>
+      <w:lvlText w:val="%9."/>
+      <w:lvlJc w:val="right"/>
+      <w:pPr>
+        <w:ind w:left="6480" w:hanging="180"/>
+      </w:pPr>
+    </w:lvl>
+  </w:abstractNum>
+  <w:abstractNum w:abstractNumId="102" w15:restartNumberingAfterBreak="0">
     <w:nsid w:val="45336EC4"/>
     <w:multiLevelType w:val="hybridMultilevel"/>
     <w:tmpl w:val="5D74BC2A"/>
@@ -30908,7 +32089,7 @@
       </w:rPr>
     </w:lvl>
   </w:abstractNum>
-  <w:abstractNum w:abstractNumId="102" w15:restartNumberingAfterBreak="0">
+  <w:abstractNum w:abstractNumId="103" w15:restartNumberingAfterBreak="0">
     <w:nsid w:val="49005094"/>
     <w:multiLevelType w:val="hybridMultilevel"/>
     <w:tmpl w:val="14848CBE"/>
@@ -31020,7 +32201,7 @@
       </w:rPr>
     </w:lvl>
   </w:abstractNum>
-  <w:abstractNum w:abstractNumId="103" w15:restartNumberingAfterBreak="0">
+  <w:abstractNum w:abstractNumId="104" w15:restartNumberingAfterBreak="0">
     <w:nsid w:val="49243794"/>
     <w:multiLevelType w:val="multilevel"/>
     <w:tmpl w:val="E7681528"/>
@@ -31169,7 +32350,120 @@
       </w:rPr>
     </w:lvl>
   </w:abstractNum>
-  <w:abstractNum w:abstractNumId="104" w15:restartNumberingAfterBreak="0">
+  <w:abstractNum w:abstractNumId="105" w15:restartNumberingAfterBreak="0">
+    <w:nsid w:val="49673507"/>
+    <w:multiLevelType w:val="hybridMultilevel"/>
+    <w:tmpl w:val="03EA6632"/>
+    <w:lvl w:ilvl="0" w:tplc="FFFFFFFF">
+      <w:start w:val="1"/>
+      <w:numFmt w:val="bullet"/>
+      <w:lvlText w:val=""/>
+      <w:lvlJc w:val="left"/>
+      <w:pPr>
+        <w:ind w:left="720" w:hanging="360"/>
+      </w:pPr>
+      <w:rPr>
+        <w:rFonts w:ascii="Wingdings" w:hAnsi="Wingdings" w:hint="default"/>
+      </w:rPr>
+    </w:lvl>
+    <w:lvl w:ilvl="1" w:tplc="04090005">
+      <w:start w:val="1"/>
+      <w:numFmt w:val="bullet"/>
+      <w:lvlText w:val=""/>
+      <w:lvlJc w:val="left"/>
+      <w:pPr>
+        <w:ind w:left="720" w:hanging="360"/>
+      </w:pPr>
+      <w:rPr>
+        <w:rFonts w:ascii="Wingdings" w:hAnsi="Wingdings" w:hint="default"/>
+      </w:rPr>
+    </w:lvl>
+    <w:lvl w:ilvl="2" w:tplc="FFFFFFFF" w:tentative="1">
+      <w:start w:val="1"/>
+      <w:numFmt w:val="bullet"/>
+      <w:lvlText w:val=""/>
+      <w:lvlJc w:val="left"/>
+      <w:pPr>
+        <w:ind w:left="2160" w:hanging="360"/>
+      </w:pPr>
+      <w:rPr>
+        <w:rFonts w:ascii="Wingdings" w:hAnsi="Wingdings" w:hint="default"/>
+      </w:rPr>
+    </w:lvl>
+    <w:lvl w:ilvl="3" w:tplc="FFFFFFFF" w:tentative="1">
+      <w:start w:val="1"/>
+      <w:numFmt w:val="bullet"/>
+      <w:lvlText w:val=""/>
+      <w:lvlJc w:val="left"/>
+      <w:pPr>
+        <w:ind w:left="2880" w:hanging="360"/>
+      </w:pPr>
+      <w:rPr>
+        <w:rFonts w:ascii="Symbol" w:hAnsi="Symbol" w:hint="default"/>
+      </w:rPr>
+    </w:lvl>
+    <w:lvl w:ilvl="4" w:tplc="FFFFFFFF" w:tentative="1">
+      <w:start w:val="1"/>
+      <w:numFmt w:val="bullet"/>
+      <w:lvlText w:val="o"/>
+      <w:lvlJc w:val="left"/>
+      <w:pPr>
+        <w:ind w:left="3600" w:hanging="360"/>
+      </w:pPr>
+      <w:rPr>
+        <w:rFonts w:ascii="Courier New" w:hAnsi="Courier New" w:cs="Courier New" w:hint="default"/>
+      </w:rPr>
+    </w:lvl>
+    <w:lvl w:ilvl="5" w:tplc="FFFFFFFF" w:tentative="1">
+      <w:start w:val="1"/>
+      <w:numFmt w:val="bullet"/>
+      <w:lvlText w:val=""/>
+      <w:lvlJc w:val="left"/>
+      <w:pPr>
+        <w:ind w:left="4320" w:hanging="360"/>
+      </w:pPr>
+      <w:rPr>
+        <w:rFonts w:ascii="Wingdings" w:hAnsi="Wingdings" w:hint="default"/>
+      </w:rPr>
+    </w:lvl>
+    <w:lvl w:ilvl="6" w:tplc="FFFFFFFF" w:tentative="1">
+      <w:start w:val="1"/>
+      <w:numFmt w:val="bullet"/>
+      <w:lvlText w:val=""/>
+      <w:lvlJc w:val="left"/>
+      <w:pPr>
+        <w:ind w:left="5040" w:hanging="360"/>
+      </w:pPr>
+      <w:rPr>
+        <w:rFonts w:ascii="Symbol" w:hAnsi="Symbol" w:hint="default"/>
+      </w:rPr>
+    </w:lvl>
+    <w:lvl w:ilvl="7" w:tplc="FFFFFFFF" w:tentative="1">
+      <w:start w:val="1"/>
+      <w:numFmt w:val="bullet"/>
+      <w:lvlText w:val="o"/>
+      <w:lvlJc w:val="left"/>
+      <w:pPr>
+        <w:ind w:left="5760" w:hanging="360"/>
+      </w:pPr>
+      <w:rPr>
+        <w:rFonts w:ascii="Courier New" w:hAnsi="Courier New" w:cs="Courier New" w:hint="default"/>
+      </w:rPr>
+    </w:lvl>
+    <w:lvl w:ilvl="8" w:tplc="FFFFFFFF" w:tentative="1">
+      <w:start w:val="1"/>
+      <w:numFmt w:val="bullet"/>
+      <w:lvlText w:val=""/>
+      <w:lvlJc w:val="left"/>
+      <w:pPr>
+        <w:ind w:left="6480" w:hanging="360"/>
+      </w:pPr>
+      <w:rPr>
+        <w:rFonts w:ascii="Wingdings" w:hAnsi="Wingdings" w:hint="default"/>
+      </w:rPr>
+    </w:lvl>
+  </w:abstractNum>
+  <w:abstractNum w:abstractNumId="106" w15:restartNumberingAfterBreak="0">
     <w:nsid w:val="49DE12C1"/>
     <w:multiLevelType w:val="hybridMultilevel"/>
     <w:tmpl w:val="4CF0F30E"/>
@@ -31255,7 +32549,7 @@
       </w:pPr>
     </w:lvl>
   </w:abstractNum>
-  <w:abstractNum w:abstractNumId="105" w15:restartNumberingAfterBreak="0">
+  <w:abstractNum w:abstractNumId="107" w15:restartNumberingAfterBreak="0">
     <w:nsid w:val="4A880990"/>
     <w:multiLevelType w:val="hybridMultilevel"/>
     <w:tmpl w:val="F17E12C2"/>
@@ -31367,7 +32661,7 @@
       </w:rPr>
     </w:lvl>
   </w:abstractNum>
-  <w:abstractNum w:abstractNumId="106" w15:restartNumberingAfterBreak="0">
+  <w:abstractNum w:abstractNumId="108" w15:restartNumberingAfterBreak="0">
     <w:nsid w:val="4B182B12"/>
     <w:multiLevelType w:val="hybridMultilevel"/>
     <w:tmpl w:val="31C486B4"/>
@@ -31479,7 +32773,7 @@
       </w:rPr>
     </w:lvl>
   </w:abstractNum>
-  <w:abstractNum w:abstractNumId="107" w15:restartNumberingAfterBreak="0">
+  <w:abstractNum w:abstractNumId="109" w15:restartNumberingAfterBreak="0">
     <w:nsid w:val="4BA13766"/>
     <w:multiLevelType w:val="multilevel"/>
     <w:tmpl w:val="63F4E6F0"/>
@@ -31628,7 +32922,96 @@
       </w:rPr>
     </w:lvl>
   </w:abstractNum>
-  <w:abstractNum w:abstractNumId="108" w15:restartNumberingAfterBreak="0">
+  <w:abstractNum w:abstractNumId="110" w15:restartNumberingAfterBreak="0">
+    <w:nsid w:val="4C855C93"/>
+    <w:multiLevelType w:val="hybridMultilevel"/>
+    <w:tmpl w:val="6F5E0B6E"/>
+    <w:lvl w:ilvl="0" w:tplc="0409000F">
+      <w:start w:val="1"/>
+      <w:numFmt w:val="decimal"/>
+      <w:lvlText w:val="%1."/>
+      <w:lvlJc w:val="left"/>
+      <w:pPr>
+        <w:ind w:left="720" w:hanging="360"/>
+      </w:pPr>
+      <w:rPr>
+        <w:rFonts w:hint="default"/>
+      </w:rPr>
+    </w:lvl>
+    <w:lvl w:ilvl="1" w:tplc="04090019" w:tentative="1">
+      <w:start w:val="1"/>
+      <w:numFmt w:val="lowerLetter"/>
+      <w:lvlText w:val="%2."/>
+      <w:lvlJc w:val="left"/>
+      <w:pPr>
+        <w:ind w:left="1440" w:hanging="360"/>
+      </w:pPr>
+    </w:lvl>
+    <w:lvl w:ilvl="2" w:tplc="0409001B" w:tentative="1">
+      <w:start w:val="1"/>
+      <w:numFmt w:val="lowerRoman"/>
+      <w:lvlText w:val="%3."/>
+      <w:lvlJc w:val="right"/>
+      <w:pPr>
+        <w:ind w:left="2160" w:hanging="180"/>
+      </w:pPr>
+    </w:lvl>
+    <w:lvl w:ilvl="3" w:tplc="0409000F" w:tentative="1">
+      <w:start w:val="1"/>
+      <w:numFmt w:val="decimal"/>
+      <w:lvlText w:val="%4."/>
+      <w:lvlJc w:val="left"/>
+      <w:pPr>
+        <w:ind w:left="2880" w:hanging="360"/>
+      </w:pPr>
+    </w:lvl>
+    <w:lvl w:ilvl="4" w:tplc="04090019" w:tentative="1">
+      <w:start w:val="1"/>
+      <w:numFmt w:val="lowerLetter"/>
+      <w:lvlText w:val="%5."/>
+      <w:lvlJc w:val="left"/>
+      <w:pPr>
+        <w:ind w:left="3600" w:hanging="360"/>
+      </w:pPr>
+    </w:lvl>
+    <w:lvl w:ilvl="5" w:tplc="0409001B" w:tentative="1">
+      <w:start w:val="1"/>
+      <w:numFmt w:val="lowerRoman"/>
+      <w:lvlText w:val="%6."/>
+      <w:lvlJc w:val="right"/>
+      <w:pPr>
+        <w:ind w:left="4320" w:hanging="180"/>
+      </w:pPr>
+    </w:lvl>
+    <w:lvl w:ilvl="6" w:tplc="0409000F" w:tentative="1">
+      <w:start w:val="1"/>
+      <w:numFmt w:val="decimal"/>
+      <w:lvlText w:val="%7."/>
+      <w:lvlJc w:val="left"/>
+      <w:pPr>
+        <w:ind w:left="5040" w:hanging="360"/>
+      </w:pPr>
+    </w:lvl>
+    <w:lvl w:ilvl="7" w:tplc="04090019" w:tentative="1">
+      <w:start w:val="1"/>
+      <w:numFmt w:val="lowerLetter"/>
+      <w:lvlText w:val="%8."/>
+      <w:lvlJc w:val="left"/>
+      <w:pPr>
+        <w:ind w:left="5760" w:hanging="360"/>
+      </w:pPr>
+    </w:lvl>
+    <w:lvl w:ilvl="8" w:tplc="0409001B" w:tentative="1">
+      <w:start w:val="1"/>
+      <w:numFmt w:val="lowerRoman"/>
+      <w:lvlText w:val="%9."/>
+      <w:lvlJc w:val="right"/>
+      <w:pPr>
+        <w:ind w:left="6480" w:hanging="180"/>
+      </w:pPr>
+    </w:lvl>
+  </w:abstractNum>
+  <w:abstractNum w:abstractNumId="111" w15:restartNumberingAfterBreak="0">
     <w:nsid w:val="4E65371E"/>
     <w:multiLevelType w:val="hybridMultilevel"/>
     <w:tmpl w:val="53EE4538"/>
@@ -31740,7 +33123,7 @@
       </w:rPr>
     </w:lvl>
   </w:abstractNum>
-  <w:abstractNum w:abstractNumId="109" w15:restartNumberingAfterBreak="0">
+  <w:abstractNum w:abstractNumId="112" w15:restartNumberingAfterBreak="0">
     <w:nsid w:val="4E9A3F16"/>
     <w:multiLevelType w:val="multilevel"/>
     <w:tmpl w:val="63F4E6F0"/>
@@ -31889,7 +33272,7 @@
       </w:rPr>
     </w:lvl>
   </w:abstractNum>
-  <w:abstractNum w:abstractNumId="110" w15:restartNumberingAfterBreak="0">
+  <w:abstractNum w:abstractNumId="113" w15:restartNumberingAfterBreak="0">
     <w:nsid w:val="500B790D"/>
     <w:multiLevelType w:val="multilevel"/>
     <w:tmpl w:val="63F4E6F0"/>
@@ -32038,7 +33421,7 @@
       </w:rPr>
     </w:lvl>
   </w:abstractNum>
-  <w:abstractNum w:abstractNumId="111" w15:restartNumberingAfterBreak="0">
+  <w:abstractNum w:abstractNumId="114" w15:restartNumberingAfterBreak="0">
     <w:nsid w:val="526538B7"/>
     <w:multiLevelType w:val="hybridMultilevel"/>
     <w:tmpl w:val="E6A017F2"/>
@@ -32151,7 +33534,7 @@
       </w:rPr>
     </w:lvl>
   </w:abstractNum>
-  <w:abstractNum w:abstractNumId="112" w15:restartNumberingAfterBreak="0">
+  <w:abstractNum w:abstractNumId="115" w15:restartNumberingAfterBreak="0">
     <w:nsid w:val="537E56D9"/>
     <w:multiLevelType w:val="multilevel"/>
     <w:tmpl w:val="1B6E8B6A"/>
@@ -32300,7 +33683,7 @@
       </w:rPr>
     </w:lvl>
   </w:abstractNum>
-  <w:abstractNum w:abstractNumId="113" w15:restartNumberingAfterBreak="0">
+  <w:abstractNum w:abstractNumId="116" w15:restartNumberingAfterBreak="0">
     <w:nsid w:val="53E6601E"/>
     <w:multiLevelType w:val="hybridMultilevel"/>
     <w:tmpl w:val="66F0666A"/>
@@ -32413,7 +33796,7 @@
       </w:rPr>
     </w:lvl>
   </w:abstractNum>
-  <w:abstractNum w:abstractNumId="114" w15:restartNumberingAfterBreak="0">
+  <w:abstractNum w:abstractNumId="117" w15:restartNumberingAfterBreak="0">
     <w:nsid w:val="551D6F91"/>
     <w:multiLevelType w:val="hybridMultilevel"/>
     <w:tmpl w:val="9522B3C6"/>
@@ -32525,7 +33908,7 @@
       </w:rPr>
     </w:lvl>
   </w:abstractNum>
-  <w:abstractNum w:abstractNumId="115" w15:restartNumberingAfterBreak="0">
+  <w:abstractNum w:abstractNumId="118" w15:restartNumberingAfterBreak="0">
     <w:nsid w:val="555451DA"/>
     <w:multiLevelType w:val="hybridMultilevel"/>
     <w:tmpl w:val="CAB2A550"/>
@@ -32638,7 +34021,7 @@
       </w:rPr>
     </w:lvl>
   </w:abstractNum>
-  <w:abstractNum w:abstractNumId="116" w15:restartNumberingAfterBreak="0">
+  <w:abstractNum w:abstractNumId="119" w15:restartNumberingAfterBreak="0">
     <w:nsid w:val="55655B93"/>
     <w:multiLevelType w:val="multilevel"/>
     <w:tmpl w:val="9C88A4A8"/>
@@ -32787,7 +34170,7 @@
       </w:rPr>
     </w:lvl>
   </w:abstractNum>
-  <w:abstractNum w:abstractNumId="117" w15:restartNumberingAfterBreak="0">
+  <w:abstractNum w:abstractNumId="120" w15:restartNumberingAfterBreak="0">
     <w:nsid w:val="55B95BED"/>
     <w:multiLevelType w:val="hybridMultilevel"/>
     <w:tmpl w:val="A9B866FC"/>
@@ -32900,7 +34283,7 @@
       </w:rPr>
     </w:lvl>
   </w:abstractNum>
-  <w:abstractNum w:abstractNumId="118" w15:restartNumberingAfterBreak="0">
+  <w:abstractNum w:abstractNumId="121" w15:restartNumberingAfterBreak="0">
     <w:nsid w:val="562D4F1F"/>
     <w:multiLevelType w:val="hybridMultilevel"/>
     <w:tmpl w:val="1FF8D31C"/>
@@ -33012,7 +34395,7 @@
       </w:rPr>
     </w:lvl>
   </w:abstractNum>
-  <w:abstractNum w:abstractNumId="119" w15:restartNumberingAfterBreak="0">
+  <w:abstractNum w:abstractNumId="122" w15:restartNumberingAfterBreak="0">
     <w:nsid w:val="565A0C8B"/>
     <w:multiLevelType w:val="multilevel"/>
     <w:tmpl w:val="AB24FF2E"/>
@@ -33161,7 +34544,7 @@
       </w:rPr>
     </w:lvl>
   </w:abstractNum>
-  <w:abstractNum w:abstractNumId="120" w15:restartNumberingAfterBreak="0">
+  <w:abstractNum w:abstractNumId="123" w15:restartNumberingAfterBreak="0">
     <w:nsid w:val="566E7C65"/>
     <w:multiLevelType w:val="multilevel"/>
     <w:tmpl w:val="28803B4C"/>
@@ -33310,7 +34693,7 @@
       </w:rPr>
     </w:lvl>
   </w:abstractNum>
-  <w:abstractNum w:abstractNumId="121" w15:restartNumberingAfterBreak="0">
+  <w:abstractNum w:abstractNumId="124" w15:restartNumberingAfterBreak="0">
     <w:nsid w:val="57407594"/>
     <w:multiLevelType w:val="multilevel"/>
     <w:tmpl w:val="E6E2F8AE"/>
@@ -33459,7 +34842,7 @@
       </w:rPr>
     </w:lvl>
   </w:abstractNum>
-  <w:abstractNum w:abstractNumId="122" w15:restartNumberingAfterBreak="0">
+  <w:abstractNum w:abstractNumId="125" w15:restartNumberingAfterBreak="0">
     <w:nsid w:val="577F771B"/>
     <w:multiLevelType w:val="hybridMultilevel"/>
     <w:tmpl w:val="0F2C5914"/>
@@ -33571,7 +34954,7 @@
       </w:rPr>
     </w:lvl>
   </w:abstractNum>
-  <w:abstractNum w:abstractNumId="123" w15:restartNumberingAfterBreak="0">
+  <w:abstractNum w:abstractNumId="126" w15:restartNumberingAfterBreak="0">
     <w:nsid w:val="57C43CDD"/>
     <w:multiLevelType w:val="hybridMultilevel"/>
     <w:tmpl w:val="6C94FB5E"/>
@@ -33684,7 +35067,7 @@
       </w:rPr>
     </w:lvl>
   </w:abstractNum>
-  <w:abstractNum w:abstractNumId="124" w15:restartNumberingAfterBreak="0">
+  <w:abstractNum w:abstractNumId="127" w15:restartNumberingAfterBreak="0">
     <w:nsid w:val="58393977"/>
     <w:multiLevelType w:val="hybridMultilevel"/>
     <w:tmpl w:val="985A5484"/>
@@ -33797,7 +35180,7 @@
       </w:rPr>
     </w:lvl>
   </w:abstractNum>
-  <w:abstractNum w:abstractNumId="125" w15:restartNumberingAfterBreak="0">
+  <w:abstractNum w:abstractNumId="128" w15:restartNumberingAfterBreak="0">
     <w:nsid w:val="58993A3F"/>
     <w:multiLevelType w:val="hybridMultilevel"/>
     <w:tmpl w:val="5344B292"/>
@@ -33886,7 +35269,7 @@
       </w:pPr>
     </w:lvl>
   </w:abstractNum>
-  <w:abstractNum w:abstractNumId="126" w15:restartNumberingAfterBreak="0">
+  <w:abstractNum w:abstractNumId="129" w15:restartNumberingAfterBreak="0">
     <w:nsid w:val="59EB4CE4"/>
     <w:multiLevelType w:val="multilevel"/>
     <w:tmpl w:val="63F4E6F0"/>
@@ -34035,7 +35418,7 @@
       </w:rPr>
     </w:lvl>
   </w:abstractNum>
-  <w:abstractNum w:abstractNumId="127" w15:restartNumberingAfterBreak="0">
+  <w:abstractNum w:abstractNumId="130" w15:restartNumberingAfterBreak="0">
     <w:nsid w:val="5A067370"/>
     <w:multiLevelType w:val="hybridMultilevel"/>
     <w:tmpl w:val="9CB8C76C"/>
@@ -34148,7 +35531,7 @@
       </w:rPr>
     </w:lvl>
   </w:abstractNum>
-  <w:abstractNum w:abstractNumId="128" w15:restartNumberingAfterBreak="0">
+  <w:abstractNum w:abstractNumId="131" w15:restartNumberingAfterBreak="0">
     <w:nsid w:val="5BD11962"/>
     <w:multiLevelType w:val="hybridMultilevel"/>
     <w:tmpl w:val="89A4B834"/>
@@ -34237,7 +35620,7 @@
       </w:pPr>
     </w:lvl>
   </w:abstractNum>
-  <w:abstractNum w:abstractNumId="129" w15:restartNumberingAfterBreak="0">
+  <w:abstractNum w:abstractNumId="132" w15:restartNumberingAfterBreak="0">
     <w:nsid w:val="5C950DBA"/>
     <w:multiLevelType w:val="hybridMultilevel"/>
     <w:tmpl w:val="7D78F950"/>
@@ -34349,7 +35732,7 @@
       </w:rPr>
     </w:lvl>
   </w:abstractNum>
-  <w:abstractNum w:abstractNumId="130" w15:restartNumberingAfterBreak="0">
+  <w:abstractNum w:abstractNumId="133" w15:restartNumberingAfterBreak="0">
     <w:nsid w:val="5D2A5D3B"/>
     <w:multiLevelType w:val="hybridMultilevel"/>
     <w:tmpl w:val="3AF89EA6"/>
@@ -34440,7 +35823,7 @@
       </w:pPr>
     </w:lvl>
   </w:abstractNum>
-  <w:abstractNum w:abstractNumId="131" w15:restartNumberingAfterBreak="0">
+  <w:abstractNum w:abstractNumId="134" w15:restartNumberingAfterBreak="0">
     <w:nsid w:val="5D9E49FD"/>
     <w:multiLevelType w:val="hybridMultilevel"/>
     <w:tmpl w:val="4EE40BB4"/>
@@ -34552,7 +35935,7 @@
       </w:rPr>
     </w:lvl>
   </w:abstractNum>
-  <w:abstractNum w:abstractNumId="132" w15:restartNumberingAfterBreak="0">
+  <w:abstractNum w:abstractNumId="135" w15:restartNumberingAfterBreak="0">
     <w:nsid w:val="5DB7107D"/>
     <w:multiLevelType w:val="multilevel"/>
     <w:tmpl w:val="6520107A"/>
@@ -34701,7 +36084,7 @@
       </w:rPr>
     </w:lvl>
   </w:abstractNum>
-  <w:abstractNum w:abstractNumId="133" w15:restartNumberingAfterBreak="0">
+  <w:abstractNum w:abstractNumId="136" w15:restartNumberingAfterBreak="0">
     <w:nsid w:val="5E9370A7"/>
     <w:multiLevelType w:val="hybridMultilevel"/>
     <w:tmpl w:val="13480456"/>
@@ -34787,7 +36170,7 @@
       </w:pPr>
     </w:lvl>
   </w:abstractNum>
-  <w:abstractNum w:abstractNumId="134" w15:restartNumberingAfterBreak="0">
+  <w:abstractNum w:abstractNumId="137" w15:restartNumberingAfterBreak="0">
     <w:nsid w:val="60421322"/>
     <w:multiLevelType w:val="hybridMultilevel"/>
     <w:tmpl w:val="447CDBDC"/>
@@ -34899,7 +36282,7 @@
       </w:rPr>
     </w:lvl>
   </w:abstractNum>
-  <w:abstractNum w:abstractNumId="135" w15:restartNumberingAfterBreak="0">
+  <w:abstractNum w:abstractNumId="138" w15:restartNumberingAfterBreak="0">
     <w:nsid w:val="61926C31"/>
     <w:multiLevelType w:val="hybridMultilevel"/>
     <w:tmpl w:val="AFD27E5C"/>
@@ -35012,7 +36395,7 @@
       </w:rPr>
     </w:lvl>
   </w:abstractNum>
-  <w:abstractNum w:abstractNumId="136" w15:restartNumberingAfterBreak="0">
+  <w:abstractNum w:abstractNumId="139" w15:restartNumberingAfterBreak="0">
     <w:nsid w:val="622F5FC7"/>
     <w:multiLevelType w:val="hybridMultilevel"/>
     <w:tmpl w:val="49A6C2A6"/>
@@ -35125,7 +36508,7 @@
       </w:rPr>
     </w:lvl>
   </w:abstractNum>
-  <w:abstractNum w:abstractNumId="137" w15:restartNumberingAfterBreak="0">
+  <w:abstractNum w:abstractNumId="140" w15:restartNumberingAfterBreak="0">
     <w:nsid w:val="62AC33B4"/>
     <w:multiLevelType w:val="multilevel"/>
     <w:tmpl w:val="A074F3CA"/>
@@ -35274,7 +36657,7 @@
       </w:rPr>
     </w:lvl>
   </w:abstractNum>
-  <w:abstractNum w:abstractNumId="138" w15:restartNumberingAfterBreak="0">
+  <w:abstractNum w:abstractNumId="141" w15:restartNumberingAfterBreak="0">
     <w:nsid w:val="63B44674"/>
     <w:multiLevelType w:val="multilevel"/>
     <w:tmpl w:val="08F4FA9A"/>
@@ -35423,7 +36806,7 @@
       </w:rPr>
     </w:lvl>
   </w:abstractNum>
-  <w:abstractNum w:abstractNumId="139" w15:restartNumberingAfterBreak="0">
+  <w:abstractNum w:abstractNumId="142" w15:restartNumberingAfterBreak="0">
     <w:nsid w:val="63C245D4"/>
     <w:multiLevelType w:val="hybridMultilevel"/>
     <w:tmpl w:val="E1563A56"/>
@@ -35535,7 +36918,7 @@
       </w:rPr>
     </w:lvl>
   </w:abstractNum>
-  <w:abstractNum w:abstractNumId="140" w15:restartNumberingAfterBreak="0">
+  <w:abstractNum w:abstractNumId="143" w15:restartNumberingAfterBreak="0">
     <w:nsid w:val="64F30198"/>
     <w:multiLevelType w:val="multilevel"/>
     <w:tmpl w:val="63F4E6F0"/>
@@ -35684,7 +37067,7 @@
       </w:rPr>
     </w:lvl>
   </w:abstractNum>
-  <w:abstractNum w:abstractNumId="141" w15:restartNumberingAfterBreak="0">
+  <w:abstractNum w:abstractNumId="144" w15:restartNumberingAfterBreak="0">
     <w:nsid w:val="65AF2502"/>
     <w:multiLevelType w:val="hybridMultilevel"/>
     <w:tmpl w:val="FB2A44D8"/>
@@ -35797,7 +37180,120 @@
       </w:rPr>
     </w:lvl>
   </w:abstractNum>
-  <w:abstractNum w:abstractNumId="142" w15:restartNumberingAfterBreak="0">
+  <w:abstractNum w:abstractNumId="145" w15:restartNumberingAfterBreak="0">
+    <w:nsid w:val="66E768BB"/>
+    <w:multiLevelType w:val="hybridMultilevel"/>
+    <w:tmpl w:val="43A43606"/>
+    <w:lvl w:ilvl="0" w:tplc="04090005">
+      <w:start w:val="1"/>
+      <w:numFmt w:val="bullet"/>
+      <w:lvlText w:val=""/>
+      <w:lvlJc w:val="left"/>
+      <w:pPr>
+        <w:ind w:left="720" w:hanging="360"/>
+      </w:pPr>
+      <w:rPr>
+        <w:rFonts w:ascii="Wingdings" w:hAnsi="Wingdings" w:hint="default"/>
+      </w:rPr>
+    </w:lvl>
+    <w:lvl w:ilvl="1" w:tplc="04090003">
+      <w:start w:val="1"/>
+      <w:numFmt w:val="bullet"/>
+      <w:lvlText w:val="o"/>
+      <w:lvlJc w:val="left"/>
+      <w:pPr>
+        <w:ind w:left="1440" w:hanging="360"/>
+      </w:pPr>
+      <w:rPr>
+        <w:rFonts w:ascii="Courier New" w:hAnsi="Courier New" w:cs="Courier New" w:hint="default"/>
+      </w:rPr>
+    </w:lvl>
+    <w:lvl w:ilvl="2" w:tplc="04090005" w:tentative="1">
+      <w:start w:val="1"/>
+      <w:numFmt w:val="bullet"/>
+      <w:lvlText w:val=""/>
+      <w:lvlJc w:val="left"/>
+      <w:pPr>
+        <w:ind w:left="2160" w:hanging="360"/>
+      </w:pPr>
+      <w:rPr>
+        <w:rFonts w:ascii="Wingdings" w:hAnsi="Wingdings" w:hint="default"/>
+      </w:rPr>
+    </w:lvl>
+    <w:lvl w:ilvl="3" w:tplc="04090001" w:tentative="1">
+      <w:start w:val="1"/>
+      <w:numFmt w:val="bullet"/>
+      <w:lvlText w:val=""/>
+      <w:lvlJc w:val="left"/>
+      <w:pPr>
+        <w:ind w:left="2880" w:hanging="360"/>
+      </w:pPr>
+      <w:rPr>
+        <w:rFonts w:ascii="Symbol" w:hAnsi="Symbol" w:hint="default"/>
+      </w:rPr>
+    </w:lvl>
+    <w:lvl w:ilvl="4" w:tplc="04090003" w:tentative="1">
+      <w:start w:val="1"/>
+      <w:numFmt w:val="bullet"/>
+      <w:lvlText w:val="o"/>
+      <w:lvlJc w:val="left"/>
+      <w:pPr>
+        <w:ind w:left="3600" w:hanging="360"/>
+      </w:pPr>
+      <w:rPr>
+        <w:rFonts w:ascii="Courier New" w:hAnsi="Courier New" w:cs="Courier New" w:hint="default"/>
+      </w:rPr>
+    </w:lvl>
+    <w:lvl w:ilvl="5" w:tplc="04090005" w:tentative="1">
+      <w:start w:val="1"/>
+      <w:numFmt w:val="bullet"/>
+      <w:lvlText w:val=""/>
+      <w:lvlJc w:val="left"/>
+      <w:pPr>
+        <w:ind w:left="4320" w:hanging="360"/>
+      </w:pPr>
+      <w:rPr>
+        <w:rFonts w:ascii="Wingdings" w:hAnsi="Wingdings" w:hint="default"/>
+      </w:rPr>
+    </w:lvl>
+    <w:lvl w:ilvl="6" w:tplc="04090001" w:tentative="1">
+      <w:start w:val="1"/>
+      <w:numFmt w:val="bullet"/>
+      <w:lvlText w:val=""/>
+      <w:lvlJc w:val="left"/>
+      <w:pPr>
+        <w:ind w:left="5040" w:hanging="360"/>
+      </w:pPr>
+      <w:rPr>
+        <w:rFonts w:ascii="Symbol" w:hAnsi="Symbol" w:hint="default"/>
+      </w:rPr>
+    </w:lvl>
+    <w:lvl w:ilvl="7" w:tplc="04090003" w:tentative="1">
+      <w:start w:val="1"/>
+      <w:numFmt w:val="bullet"/>
+      <w:lvlText w:val="o"/>
+      <w:lvlJc w:val="left"/>
+      <w:pPr>
+        <w:ind w:left="5760" w:hanging="360"/>
+      </w:pPr>
+      <w:rPr>
+        <w:rFonts w:ascii="Courier New" w:hAnsi="Courier New" w:cs="Courier New" w:hint="default"/>
+      </w:rPr>
+    </w:lvl>
+    <w:lvl w:ilvl="8" w:tplc="04090005" w:tentative="1">
+      <w:start w:val="1"/>
+      <w:numFmt w:val="bullet"/>
+      <w:lvlText w:val=""/>
+      <w:lvlJc w:val="left"/>
+      <w:pPr>
+        <w:ind w:left="6480" w:hanging="360"/>
+      </w:pPr>
+      <w:rPr>
+        <w:rFonts w:ascii="Wingdings" w:hAnsi="Wingdings" w:hint="default"/>
+      </w:rPr>
+    </w:lvl>
+  </w:abstractNum>
+  <w:abstractNum w:abstractNumId="146" w15:restartNumberingAfterBreak="0">
     <w:nsid w:val="671614F0"/>
     <w:multiLevelType w:val="multilevel"/>
     <w:tmpl w:val="63F4E6F0"/>
@@ -35946,7 +37442,7 @@
       </w:rPr>
     </w:lvl>
   </w:abstractNum>
-  <w:abstractNum w:abstractNumId="143" w15:restartNumberingAfterBreak="0">
+  <w:abstractNum w:abstractNumId="147" w15:restartNumberingAfterBreak="0">
     <w:nsid w:val="6859691D"/>
     <w:multiLevelType w:val="multilevel"/>
     <w:tmpl w:val="826A9D48"/>
@@ -36095,7 +37591,7 @@
       </w:rPr>
     </w:lvl>
   </w:abstractNum>
-  <w:abstractNum w:abstractNumId="144" w15:restartNumberingAfterBreak="0">
+  <w:abstractNum w:abstractNumId="148" w15:restartNumberingAfterBreak="0">
     <w:nsid w:val="68817757"/>
     <w:multiLevelType w:val="multilevel"/>
     <w:tmpl w:val="34EE1968"/>
@@ -36244,7 +37740,7 @@
       </w:rPr>
     </w:lvl>
   </w:abstractNum>
-  <w:abstractNum w:abstractNumId="145" w15:restartNumberingAfterBreak="0">
+  <w:abstractNum w:abstractNumId="149" w15:restartNumberingAfterBreak="0">
     <w:nsid w:val="68AE31AF"/>
     <w:multiLevelType w:val="hybridMultilevel"/>
     <w:tmpl w:val="9EB648FC"/>
@@ -36357,7 +37853,7 @@
       </w:rPr>
     </w:lvl>
   </w:abstractNum>
-  <w:abstractNum w:abstractNumId="146" w15:restartNumberingAfterBreak="0">
+  <w:abstractNum w:abstractNumId="150" w15:restartNumberingAfterBreak="0">
     <w:nsid w:val="68BE10E8"/>
     <w:multiLevelType w:val="hybridMultilevel"/>
     <w:tmpl w:val="326CD592"/>
@@ -36470,7 +37966,7 @@
       </w:rPr>
     </w:lvl>
   </w:abstractNum>
-  <w:abstractNum w:abstractNumId="147" w15:restartNumberingAfterBreak="0">
+  <w:abstractNum w:abstractNumId="151" w15:restartNumberingAfterBreak="0">
     <w:nsid w:val="68E86299"/>
     <w:multiLevelType w:val="hybridMultilevel"/>
     <w:tmpl w:val="9B5CBEE8"/>
@@ -36556,7 +38052,7 @@
       </w:pPr>
     </w:lvl>
   </w:abstractNum>
-  <w:abstractNum w:abstractNumId="148" w15:restartNumberingAfterBreak="0">
+  <w:abstractNum w:abstractNumId="152" w15:restartNumberingAfterBreak="0">
     <w:nsid w:val="69996D9A"/>
     <w:multiLevelType w:val="multilevel"/>
     <w:tmpl w:val="1780FC38"/>
@@ -36705,7 +38201,7 @@
       </w:rPr>
     </w:lvl>
   </w:abstractNum>
-  <w:abstractNum w:abstractNumId="149" w15:restartNumberingAfterBreak="0">
+  <w:abstractNum w:abstractNumId="153" w15:restartNumberingAfterBreak="0">
     <w:nsid w:val="6A6609CC"/>
     <w:multiLevelType w:val="hybridMultilevel"/>
     <w:tmpl w:val="BF8CCE7C"/>
@@ -36794,7 +38290,7 @@
       </w:pPr>
     </w:lvl>
   </w:abstractNum>
-  <w:abstractNum w:abstractNumId="150" w15:restartNumberingAfterBreak="0">
+  <w:abstractNum w:abstractNumId="154" w15:restartNumberingAfterBreak="0">
     <w:nsid w:val="6B3C30B9"/>
     <w:multiLevelType w:val="hybridMultilevel"/>
     <w:tmpl w:val="C938F8DE"/>
@@ -36906,7 +38402,7 @@
       </w:rPr>
     </w:lvl>
   </w:abstractNum>
-  <w:abstractNum w:abstractNumId="151" w15:restartNumberingAfterBreak="0">
+  <w:abstractNum w:abstractNumId="155" w15:restartNumberingAfterBreak="0">
     <w:nsid w:val="6C9272BF"/>
     <w:multiLevelType w:val="hybridMultilevel"/>
     <w:tmpl w:val="AE021BFA"/>
@@ -37019,7 +38515,7 @@
       </w:rPr>
     </w:lvl>
   </w:abstractNum>
-  <w:abstractNum w:abstractNumId="152" w15:restartNumberingAfterBreak="0">
+  <w:abstractNum w:abstractNumId="156" w15:restartNumberingAfterBreak="0">
     <w:nsid w:val="6D1511A0"/>
     <w:multiLevelType w:val="hybridMultilevel"/>
     <w:tmpl w:val="AAD8B9B4"/>
@@ -37131,7 +38627,7 @@
       </w:rPr>
     </w:lvl>
   </w:abstractNum>
-  <w:abstractNum w:abstractNumId="153" w15:restartNumberingAfterBreak="0">
+  <w:abstractNum w:abstractNumId="157" w15:restartNumberingAfterBreak="0">
     <w:nsid w:val="6DD255F1"/>
     <w:multiLevelType w:val="hybridMultilevel"/>
     <w:tmpl w:val="ACBC1404"/>
@@ -37244,7 +38740,7 @@
       </w:rPr>
     </w:lvl>
   </w:abstractNum>
-  <w:abstractNum w:abstractNumId="154" w15:restartNumberingAfterBreak="0">
+  <w:abstractNum w:abstractNumId="158" w15:restartNumberingAfterBreak="0">
     <w:nsid w:val="6DDB4404"/>
     <w:multiLevelType w:val="hybridMultilevel"/>
     <w:tmpl w:val="06428E32"/>
@@ -37357,7 +38853,7 @@
       </w:rPr>
     </w:lvl>
   </w:abstractNum>
-  <w:abstractNum w:abstractNumId="155" w15:restartNumberingAfterBreak="0">
+  <w:abstractNum w:abstractNumId="159" w15:restartNumberingAfterBreak="0">
     <w:nsid w:val="6F014B3B"/>
     <w:multiLevelType w:val="hybridMultilevel"/>
     <w:tmpl w:val="C89A39BE"/>
@@ -37469,7 +38965,7 @@
       </w:rPr>
     </w:lvl>
   </w:abstractNum>
-  <w:abstractNum w:abstractNumId="156" w15:restartNumberingAfterBreak="0">
+  <w:abstractNum w:abstractNumId="160" w15:restartNumberingAfterBreak="0">
     <w:nsid w:val="6F171273"/>
     <w:multiLevelType w:val="multilevel"/>
     <w:tmpl w:val="0240C564"/>
@@ -37618,7 +39114,7 @@
       </w:rPr>
     </w:lvl>
   </w:abstractNum>
-  <w:abstractNum w:abstractNumId="157" w15:restartNumberingAfterBreak="0">
+  <w:abstractNum w:abstractNumId="161" w15:restartNumberingAfterBreak="0">
     <w:nsid w:val="6FB82AAA"/>
     <w:multiLevelType w:val="multilevel"/>
     <w:tmpl w:val="FC46C7C0"/>
@@ -37767,7 +39263,7 @@
       </w:rPr>
     </w:lvl>
   </w:abstractNum>
-  <w:abstractNum w:abstractNumId="158" w15:restartNumberingAfterBreak="0">
+  <w:abstractNum w:abstractNumId="162" w15:restartNumberingAfterBreak="0">
     <w:nsid w:val="6FD46DCF"/>
     <w:multiLevelType w:val="hybridMultilevel"/>
     <w:tmpl w:val="EF5E6EC6"/>
@@ -37880,7 +39376,7 @@
       </w:rPr>
     </w:lvl>
   </w:abstractNum>
-  <w:abstractNum w:abstractNumId="159" w15:restartNumberingAfterBreak="0">
+  <w:abstractNum w:abstractNumId="163" w15:restartNumberingAfterBreak="0">
     <w:nsid w:val="70484E38"/>
     <w:multiLevelType w:val="multilevel"/>
     <w:tmpl w:val="22B26DD2"/>
@@ -38029,7 +39525,7 @@
       </w:rPr>
     </w:lvl>
   </w:abstractNum>
-  <w:abstractNum w:abstractNumId="160" w15:restartNumberingAfterBreak="0">
+  <w:abstractNum w:abstractNumId="164" w15:restartNumberingAfterBreak="0">
     <w:nsid w:val="70CB723E"/>
     <w:multiLevelType w:val="multilevel"/>
     <w:tmpl w:val="63F4E6F0"/>
@@ -38178,7 +39674,7 @@
       </w:rPr>
     </w:lvl>
   </w:abstractNum>
-  <w:abstractNum w:abstractNumId="161" w15:restartNumberingAfterBreak="0">
+  <w:abstractNum w:abstractNumId="165" w15:restartNumberingAfterBreak="0">
     <w:nsid w:val="71DB3F58"/>
     <w:multiLevelType w:val="multilevel"/>
     <w:tmpl w:val="63F4E6F0"/>
@@ -38327,7 +39823,93 @@
       </w:rPr>
     </w:lvl>
   </w:abstractNum>
-  <w:abstractNum w:abstractNumId="162" w15:restartNumberingAfterBreak="0">
+  <w:abstractNum w:abstractNumId="166" w15:restartNumberingAfterBreak="0">
+    <w:nsid w:val="72882C15"/>
+    <w:multiLevelType w:val="hybridMultilevel"/>
+    <w:tmpl w:val="DD3837E6"/>
+    <w:lvl w:ilvl="0" w:tplc="0409000F">
+      <w:start w:val="1"/>
+      <w:numFmt w:val="decimal"/>
+      <w:lvlText w:val="%1."/>
+      <w:lvlJc w:val="left"/>
+      <w:pPr>
+        <w:ind w:left="720" w:hanging="360"/>
+      </w:pPr>
+    </w:lvl>
+    <w:lvl w:ilvl="1" w:tplc="04090019" w:tentative="1">
+      <w:start w:val="1"/>
+      <w:numFmt w:val="lowerLetter"/>
+      <w:lvlText w:val="%2."/>
+      <w:lvlJc w:val="left"/>
+      <w:pPr>
+        <w:ind w:left="1440" w:hanging="360"/>
+      </w:pPr>
+    </w:lvl>
+    <w:lvl w:ilvl="2" w:tplc="0409001B" w:tentative="1">
+      <w:start w:val="1"/>
+      <w:numFmt w:val="lowerRoman"/>
+      <w:lvlText w:val="%3."/>
+      <w:lvlJc w:val="right"/>
+      <w:pPr>
+        <w:ind w:left="2160" w:hanging="180"/>
+      </w:pPr>
+    </w:lvl>
+    <w:lvl w:ilvl="3" w:tplc="0409000F" w:tentative="1">
+      <w:start w:val="1"/>
+      <w:numFmt w:val="decimal"/>
+      <w:lvlText w:val="%4."/>
+      <w:lvlJc w:val="left"/>
+      <w:pPr>
+        <w:ind w:left="2880" w:hanging="360"/>
+      </w:pPr>
+    </w:lvl>
+    <w:lvl w:ilvl="4" w:tplc="04090019" w:tentative="1">
+      <w:start w:val="1"/>
+      <w:numFmt w:val="lowerLetter"/>
+      <w:lvlText w:val="%5."/>
+      <w:lvlJc w:val="left"/>
+      <w:pPr>
+        <w:ind w:left="3600" w:hanging="360"/>
+      </w:pPr>
+    </w:lvl>
+    <w:lvl w:ilvl="5" w:tplc="0409001B" w:tentative="1">
+      <w:start w:val="1"/>
+      <w:numFmt w:val="lowerRoman"/>
+      <w:lvlText w:val="%6."/>
+      <w:lvlJc w:val="right"/>
+      <w:pPr>
+        <w:ind w:left="4320" w:hanging="180"/>
+      </w:pPr>
+    </w:lvl>
+    <w:lvl w:ilvl="6" w:tplc="0409000F" w:tentative="1">
+      <w:start w:val="1"/>
+      <w:numFmt w:val="decimal"/>
+      <w:lvlText w:val="%7."/>
+      <w:lvlJc w:val="left"/>
+      <w:pPr>
+        <w:ind w:left="5040" w:hanging="360"/>
+      </w:pPr>
+    </w:lvl>
+    <w:lvl w:ilvl="7" w:tplc="04090019" w:tentative="1">
+      <w:start w:val="1"/>
+      <w:numFmt w:val="lowerLetter"/>
+      <w:lvlText w:val="%8."/>
+      <w:lvlJc w:val="left"/>
+      <w:pPr>
+        <w:ind w:left="5760" w:hanging="360"/>
+      </w:pPr>
+    </w:lvl>
+    <w:lvl w:ilvl="8" w:tplc="0409001B" w:tentative="1">
+      <w:start w:val="1"/>
+      <w:numFmt w:val="lowerRoman"/>
+      <w:lvlText w:val="%9."/>
+      <w:lvlJc w:val="right"/>
+      <w:pPr>
+        <w:ind w:left="6480" w:hanging="180"/>
+      </w:pPr>
+    </w:lvl>
+  </w:abstractNum>
+  <w:abstractNum w:abstractNumId="167" w15:restartNumberingAfterBreak="0">
     <w:nsid w:val="72F31FF2"/>
     <w:multiLevelType w:val="hybridMultilevel"/>
     <w:tmpl w:val="5C2693A0"/>
@@ -38439,7 +40021,7 @@
       </w:rPr>
     </w:lvl>
   </w:abstractNum>
-  <w:abstractNum w:abstractNumId="163" w15:restartNumberingAfterBreak="0">
+  <w:abstractNum w:abstractNumId="168" w15:restartNumberingAfterBreak="0">
     <w:nsid w:val="75B45140"/>
     <w:multiLevelType w:val="hybridMultilevel"/>
     <w:tmpl w:val="93F8F3C4"/>
@@ -38552,7 +40134,7 @@
       </w:rPr>
     </w:lvl>
   </w:abstractNum>
-  <w:abstractNum w:abstractNumId="164" w15:restartNumberingAfterBreak="0">
+  <w:abstractNum w:abstractNumId="169" w15:restartNumberingAfterBreak="0">
     <w:nsid w:val="76F60FFE"/>
     <w:multiLevelType w:val="multilevel"/>
     <w:tmpl w:val="63F4E6F0"/>
@@ -38701,7 +40283,7 @@
       </w:rPr>
     </w:lvl>
   </w:abstractNum>
-  <w:abstractNum w:abstractNumId="165" w15:restartNumberingAfterBreak="0">
+  <w:abstractNum w:abstractNumId="170" w15:restartNumberingAfterBreak="0">
     <w:nsid w:val="772A45B4"/>
     <w:multiLevelType w:val="hybridMultilevel"/>
     <w:tmpl w:val="B00AFD58"/>
@@ -38814,7 +40396,7 @@
       </w:rPr>
     </w:lvl>
   </w:abstractNum>
-  <w:abstractNum w:abstractNumId="166" w15:restartNumberingAfterBreak="0">
+  <w:abstractNum w:abstractNumId="171" w15:restartNumberingAfterBreak="0">
     <w:nsid w:val="77572323"/>
     <w:multiLevelType w:val="multilevel"/>
     <w:tmpl w:val="63F4E6F0"/>
@@ -38963,7 +40545,7 @@
       </w:rPr>
     </w:lvl>
   </w:abstractNum>
-  <w:abstractNum w:abstractNumId="167" w15:restartNumberingAfterBreak="0">
+  <w:abstractNum w:abstractNumId="172" w15:restartNumberingAfterBreak="0">
     <w:nsid w:val="77B8201F"/>
     <w:multiLevelType w:val="hybridMultilevel"/>
     <w:tmpl w:val="D7160708"/>
@@ -39075,7 +40657,7 @@
       </w:rPr>
     </w:lvl>
   </w:abstractNum>
-  <w:abstractNum w:abstractNumId="168" w15:restartNumberingAfterBreak="0">
+  <w:abstractNum w:abstractNumId="173" w15:restartNumberingAfterBreak="0">
     <w:nsid w:val="79796FF9"/>
     <w:multiLevelType w:val="hybridMultilevel"/>
     <w:tmpl w:val="CFA8EF82"/>
@@ -39187,7 +40769,7 @@
       </w:rPr>
     </w:lvl>
   </w:abstractNum>
-  <w:abstractNum w:abstractNumId="169" w15:restartNumberingAfterBreak="0">
+  <w:abstractNum w:abstractNumId="174" w15:restartNumberingAfterBreak="0">
     <w:nsid w:val="79910410"/>
     <w:multiLevelType w:val="hybridMultilevel"/>
     <w:tmpl w:val="FC923542"/>
@@ -39299,7 +40881,7 @@
       </w:rPr>
     </w:lvl>
   </w:abstractNum>
-  <w:abstractNum w:abstractNumId="170" w15:restartNumberingAfterBreak="0">
+  <w:abstractNum w:abstractNumId="175" w15:restartNumberingAfterBreak="0">
     <w:nsid w:val="79BF6B53"/>
     <w:multiLevelType w:val="hybridMultilevel"/>
     <w:tmpl w:val="4E2EA1E0"/>
@@ -39385,7 +40967,7 @@
       </w:pPr>
     </w:lvl>
   </w:abstractNum>
-  <w:abstractNum w:abstractNumId="171" w15:restartNumberingAfterBreak="0">
+  <w:abstractNum w:abstractNumId="176" w15:restartNumberingAfterBreak="0">
     <w:nsid w:val="7AFF575A"/>
     <w:multiLevelType w:val="hybridMultilevel"/>
     <w:tmpl w:val="A6323D3E"/>
@@ -39497,7 +41079,7 @@
       </w:rPr>
     </w:lvl>
   </w:abstractNum>
-  <w:abstractNum w:abstractNumId="172" w15:restartNumberingAfterBreak="0">
+  <w:abstractNum w:abstractNumId="177" w15:restartNumberingAfterBreak="0">
     <w:nsid w:val="7B4018BF"/>
     <w:multiLevelType w:val="multilevel"/>
     <w:tmpl w:val="63F4E6F0"/>
@@ -39646,7 +41228,7 @@
       </w:rPr>
     </w:lvl>
   </w:abstractNum>
-  <w:abstractNum w:abstractNumId="173" w15:restartNumberingAfterBreak="0">
+  <w:abstractNum w:abstractNumId="178" w15:restartNumberingAfterBreak="0">
     <w:nsid w:val="7B4D1B33"/>
     <w:multiLevelType w:val="hybridMultilevel"/>
     <w:tmpl w:val="5EAC717E"/>
@@ -39758,7 +41340,7 @@
       </w:rPr>
     </w:lvl>
   </w:abstractNum>
-  <w:abstractNum w:abstractNumId="174" w15:restartNumberingAfterBreak="0">
+  <w:abstractNum w:abstractNumId="179" w15:restartNumberingAfterBreak="0">
     <w:nsid w:val="7CAC27CD"/>
     <w:multiLevelType w:val="multilevel"/>
     <w:tmpl w:val="3BC20E58"/>
@@ -39907,7 +41489,7 @@
       </w:rPr>
     </w:lvl>
   </w:abstractNum>
-  <w:abstractNum w:abstractNumId="175" w15:restartNumberingAfterBreak="0">
+  <w:abstractNum w:abstractNumId="180" w15:restartNumberingAfterBreak="0">
     <w:nsid w:val="7E5978EA"/>
     <w:multiLevelType w:val="hybridMultilevel"/>
     <w:tmpl w:val="D74C0DB0"/>
@@ -40019,7 +41601,7 @@
       </w:rPr>
     </w:lvl>
   </w:abstractNum>
-  <w:abstractNum w:abstractNumId="176" w15:restartNumberingAfterBreak="0">
+  <w:abstractNum w:abstractNumId="181" w15:restartNumberingAfterBreak="0">
     <w:nsid w:val="7F106A5D"/>
     <w:multiLevelType w:val="hybridMultilevel"/>
     <w:tmpl w:val="A1CA4816"/>
@@ -40132,7 +41714,7 @@
     </w:lvl>
   </w:abstractNum>
   <w:num w:numId="1" w16cid:durableId="1882476756">
-    <w:abstractNumId w:val="103"/>
+    <w:abstractNumId w:val="104"/>
   </w:num>
   <w:num w:numId="2" w16cid:durableId="871453468">
     <w:abstractNumId w:val="30"/>
@@ -40144,22 +41726,22 @@
     <w:abstractNumId w:val="85"/>
   </w:num>
   <w:num w:numId="5" w16cid:durableId="769932622">
-    <w:abstractNumId w:val="120"/>
+    <w:abstractNumId w:val="123"/>
   </w:num>
   <w:num w:numId="6" w16cid:durableId="575944109">
     <w:abstractNumId w:val="50"/>
   </w:num>
   <w:num w:numId="7" w16cid:durableId="877661689">
-    <w:abstractNumId w:val="159"/>
+    <w:abstractNumId w:val="163"/>
   </w:num>
   <w:num w:numId="8" w16cid:durableId="1390107422">
     <w:abstractNumId w:val="91"/>
   </w:num>
   <w:num w:numId="9" w16cid:durableId="881866424">
-    <w:abstractNumId w:val="116"/>
+    <w:abstractNumId w:val="119"/>
   </w:num>
   <w:num w:numId="10" w16cid:durableId="1037244995">
-    <w:abstractNumId w:val="148"/>
+    <w:abstractNumId w:val="152"/>
   </w:num>
   <w:num w:numId="11" w16cid:durableId="1575554597">
     <w:abstractNumId w:val="73"/>
@@ -40168,7 +41750,7 @@
     <w:abstractNumId w:val="98"/>
   </w:num>
   <w:num w:numId="13" w16cid:durableId="1386294114">
-    <w:abstractNumId w:val="138"/>
+    <w:abstractNumId w:val="141"/>
   </w:num>
   <w:num w:numId="14" w16cid:durableId="1071851223">
     <w:abstractNumId w:val="31"/>
@@ -40177,7 +41759,7 @@
     <w:abstractNumId w:val="87"/>
   </w:num>
   <w:num w:numId="16" w16cid:durableId="1102919547">
-    <w:abstractNumId w:val="174"/>
+    <w:abstractNumId w:val="179"/>
   </w:num>
   <w:num w:numId="17" w16cid:durableId="294526838">
     <w:abstractNumId w:val="62"/>
@@ -40186,7 +41768,7 @@
     <w:abstractNumId w:val="71"/>
   </w:num>
   <w:num w:numId="19" w16cid:durableId="2119449470">
-    <w:abstractNumId w:val="112"/>
+    <w:abstractNumId w:val="115"/>
   </w:num>
   <w:num w:numId="20" w16cid:durableId="1365054799">
     <w:abstractNumId w:val="19"/>
@@ -40195,19 +41777,19 @@
     <w:abstractNumId w:val="72"/>
   </w:num>
   <w:num w:numId="22" w16cid:durableId="1080098953">
-    <w:abstractNumId w:val="143"/>
+    <w:abstractNumId w:val="147"/>
   </w:num>
   <w:num w:numId="23" w16cid:durableId="1635717296">
     <w:abstractNumId w:val="78"/>
   </w:num>
   <w:num w:numId="24" w16cid:durableId="544873123">
-    <w:abstractNumId w:val="137"/>
+    <w:abstractNumId w:val="140"/>
   </w:num>
   <w:num w:numId="25" w16cid:durableId="1128352778">
     <w:abstractNumId w:val="18"/>
   </w:num>
   <w:num w:numId="26" w16cid:durableId="1732537407">
-    <w:abstractNumId w:val="154"/>
+    <w:abstractNumId w:val="158"/>
   </w:num>
   <w:num w:numId="27" w16cid:durableId="945502064">
     <w:abstractNumId w:val="8"/>
@@ -40234,43 +41816,43 @@
     <w:abstractNumId w:val="57"/>
   </w:num>
   <w:num w:numId="35" w16cid:durableId="356852923">
-    <w:abstractNumId w:val="111"/>
+    <w:abstractNumId w:val="114"/>
   </w:num>
   <w:num w:numId="36" w16cid:durableId="430662559">
     <w:abstractNumId w:val="26"/>
   </w:num>
   <w:num w:numId="37" w16cid:durableId="247080868">
-    <w:abstractNumId w:val="163"/>
+    <w:abstractNumId w:val="168"/>
   </w:num>
   <w:num w:numId="38" w16cid:durableId="158887408">
-    <w:abstractNumId w:val="135"/>
+    <w:abstractNumId w:val="138"/>
   </w:num>
   <w:num w:numId="39" w16cid:durableId="1681347932">
-    <w:abstractNumId w:val="158"/>
+    <w:abstractNumId w:val="162"/>
   </w:num>
   <w:num w:numId="40" w16cid:durableId="2101440158">
     <w:abstractNumId w:val="90"/>
   </w:num>
   <w:num w:numId="41" w16cid:durableId="1250391122">
-    <w:abstractNumId w:val="130"/>
+    <w:abstractNumId w:val="133"/>
   </w:num>
   <w:num w:numId="42" w16cid:durableId="479083359">
-    <w:abstractNumId w:val="162"/>
+    <w:abstractNumId w:val="167"/>
   </w:num>
   <w:num w:numId="43" w16cid:durableId="1557860317">
-    <w:abstractNumId w:val="113"/>
+    <w:abstractNumId w:val="116"/>
   </w:num>
   <w:num w:numId="44" w16cid:durableId="2142183763">
     <w:abstractNumId w:val="11"/>
   </w:num>
   <w:num w:numId="45" w16cid:durableId="1357736349">
-    <w:abstractNumId w:val="169"/>
+    <w:abstractNumId w:val="174"/>
   </w:num>
   <w:num w:numId="46" w16cid:durableId="1519656040">
-    <w:abstractNumId w:val="168"/>
+    <w:abstractNumId w:val="173"/>
   </w:num>
   <w:num w:numId="47" w16cid:durableId="1078596852">
-    <w:abstractNumId w:val="176"/>
+    <w:abstractNumId w:val="181"/>
   </w:num>
   <w:num w:numId="48" w16cid:durableId="1027950100">
     <w:abstractNumId w:val="42"/>
@@ -40282,19 +41864,19 @@
     <w:abstractNumId w:val="79"/>
   </w:num>
   <w:num w:numId="51" w16cid:durableId="1128354320">
-    <w:abstractNumId w:val="152"/>
+    <w:abstractNumId w:val="156"/>
   </w:num>
   <w:num w:numId="52" w16cid:durableId="248543928">
     <w:abstractNumId w:val="89"/>
   </w:num>
   <w:num w:numId="53" w16cid:durableId="965889214">
-    <w:abstractNumId w:val="118"/>
+    <w:abstractNumId w:val="121"/>
   </w:num>
   <w:num w:numId="54" w16cid:durableId="1827503240">
-    <w:abstractNumId w:val="128"/>
+    <w:abstractNumId w:val="131"/>
   </w:num>
   <w:num w:numId="55" w16cid:durableId="505748256">
-    <w:abstractNumId w:val="108"/>
+    <w:abstractNumId w:val="111"/>
   </w:num>
   <w:num w:numId="56" w16cid:durableId="2120370925">
     <w:abstractNumId w:val="39"/>
@@ -40303,22 +41885,22 @@
     <w:abstractNumId w:val="22"/>
   </w:num>
   <w:num w:numId="58" w16cid:durableId="1000235123">
-    <w:abstractNumId w:val="114"/>
+    <w:abstractNumId w:val="117"/>
   </w:num>
   <w:num w:numId="59" w16cid:durableId="628516409">
-    <w:abstractNumId w:val="150"/>
+    <w:abstractNumId w:val="154"/>
   </w:num>
   <w:num w:numId="60" w16cid:durableId="2028865444">
-    <w:abstractNumId w:val="106"/>
+    <w:abstractNumId w:val="108"/>
   </w:num>
   <w:num w:numId="61" w16cid:durableId="943926811">
-    <w:abstractNumId w:val="173"/>
+    <w:abstractNumId w:val="178"/>
   </w:num>
   <w:num w:numId="62" w16cid:durableId="1841193257">
     <w:abstractNumId w:val="82"/>
   </w:num>
   <w:num w:numId="63" w16cid:durableId="682322850">
-    <w:abstractNumId w:val="155"/>
+    <w:abstractNumId w:val="159"/>
   </w:num>
   <w:num w:numId="64" w16cid:durableId="2043705333">
     <w:abstractNumId w:val="83"/>
@@ -40333,22 +41915,22 @@
     <w:abstractNumId w:val="67"/>
   </w:num>
   <w:num w:numId="68" w16cid:durableId="2064014330">
-    <w:abstractNumId w:val="122"/>
+    <w:abstractNumId w:val="125"/>
   </w:num>
   <w:num w:numId="69" w16cid:durableId="452797354">
-    <w:abstractNumId w:val="129"/>
+    <w:abstractNumId w:val="132"/>
   </w:num>
   <w:num w:numId="70" w16cid:durableId="1196650037">
     <w:abstractNumId w:val="55"/>
   </w:num>
   <w:num w:numId="71" w16cid:durableId="940071828">
-    <w:abstractNumId w:val="167"/>
+    <w:abstractNumId w:val="172"/>
   </w:num>
   <w:num w:numId="72" w16cid:durableId="1608273926">
     <w:abstractNumId w:val="84"/>
   </w:num>
   <w:num w:numId="73" w16cid:durableId="2009864772">
-    <w:abstractNumId w:val="102"/>
+    <w:abstractNumId w:val="103"/>
   </w:num>
   <w:num w:numId="74" w16cid:durableId="712267004">
     <w:abstractNumId w:val="41"/>
@@ -40357,7 +41939,7 @@
     <w:abstractNumId w:val="37"/>
   </w:num>
   <w:num w:numId="76" w16cid:durableId="286202349">
-    <w:abstractNumId w:val="134"/>
+    <w:abstractNumId w:val="137"/>
   </w:num>
   <w:num w:numId="77" w16cid:durableId="156460757">
     <w:abstractNumId w:val="74"/>
@@ -40381,7 +41963,7 @@
     <w:abstractNumId w:val="28"/>
   </w:num>
   <w:num w:numId="84" w16cid:durableId="366876741">
-    <w:abstractNumId w:val="105"/>
+    <w:abstractNumId w:val="107"/>
   </w:num>
   <w:num w:numId="85" w16cid:durableId="15274915">
     <w:abstractNumId w:val="44"/>
@@ -40390,16 +41972,16 @@
     <w:abstractNumId w:val="13"/>
   </w:num>
   <w:num w:numId="87" w16cid:durableId="591351385">
-    <w:abstractNumId w:val="119"/>
+    <w:abstractNumId w:val="122"/>
   </w:num>
   <w:num w:numId="88" w16cid:durableId="1361005725">
-    <w:abstractNumId w:val="171"/>
+    <w:abstractNumId w:val="176"/>
   </w:num>
   <w:num w:numId="89" w16cid:durableId="219681743">
     <w:abstractNumId w:val="14"/>
   </w:num>
   <w:num w:numId="90" w16cid:durableId="194386594">
-    <w:abstractNumId w:val="131"/>
+    <w:abstractNumId w:val="134"/>
   </w:num>
   <w:num w:numId="91" w16cid:durableId="777793346">
     <w:abstractNumId w:val="93"/>
@@ -40426,28 +42008,28 @@
     <w:abstractNumId w:val="29"/>
   </w:num>
   <w:num w:numId="99" w16cid:durableId="1706099794">
-    <w:abstractNumId w:val="157"/>
+    <w:abstractNumId w:val="161"/>
   </w:num>
   <w:num w:numId="100" w16cid:durableId="256404901">
-    <w:abstractNumId w:val="156"/>
+    <w:abstractNumId w:val="160"/>
   </w:num>
   <w:num w:numId="101" w16cid:durableId="924923012">
     <w:abstractNumId w:val="34"/>
   </w:num>
   <w:num w:numId="102" w16cid:durableId="536550966">
-    <w:abstractNumId w:val="172"/>
+    <w:abstractNumId w:val="177"/>
   </w:num>
   <w:num w:numId="103" w16cid:durableId="425157302">
     <w:abstractNumId w:val="76"/>
   </w:num>
   <w:num w:numId="104" w16cid:durableId="967664612">
-    <w:abstractNumId w:val="140"/>
+    <w:abstractNumId w:val="143"/>
   </w:num>
   <w:num w:numId="105" w16cid:durableId="361631616">
-    <w:abstractNumId w:val="107"/>
+    <w:abstractNumId w:val="109"/>
   </w:num>
   <w:num w:numId="106" w16cid:durableId="443623616">
-    <w:abstractNumId w:val="144"/>
+    <w:abstractNumId w:val="148"/>
   </w:num>
   <w:num w:numId="107" w16cid:durableId="150101619">
     <w:abstractNumId w:val="16"/>
@@ -40459,28 +42041,28 @@
     <w:abstractNumId w:val="0"/>
   </w:num>
   <w:num w:numId="110" w16cid:durableId="712924661">
-    <w:abstractNumId w:val="126"/>
+    <w:abstractNumId w:val="129"/>
   </w:num>
   <w:num w:numId="111" w16cid:durableId="1917784113">
-    <w:abstractNumId w:val="121"/>
+    <w:abstractNumId w:val="124"/>
   </w:num>
   <w:num w:numId="112" w16cid:durableId="896237065">
-    <w:abstractNumId w:val="132"/>
+    <w:abstractNumId w:val="135"/>
   </w:num>
   <w:num w:numId="113" w16cid:durableId="1171681430">
-    <w:abstractNumId w:val="160"/>
+    <w:abstractNumId w:val="164"/>
   </w:num>
   <w:num w:numId="114" w16cid:durableId="1552573199">
-    <w:abstractNumId w:val="161"/>
+    <w:abstractNumId w:val="165"/>
   </w:num>
   <w:num w:numId="115" w16cid:durableId="1920869674">
-    <w:abstractNumId w:val="142"/>
+    <w:abstractNumId w:val="146"/>
   </w:num>
   <w:num w:numId="116" w16cid:durableId="476724716">
-    <w:abstractNumId w:val="110"/>
+    <w:abstractNumId w:val="113"/>
   </w:num>
   <w:num w:numId="117" w16cid:durableId="658919541">
-    <w:abstractNumId w:val="109"/>
+    <w:abstractNumId w:val="112"/>
   </w:num>
   <w:num w:numId="118" w16cid:durableId="1622418131">
     <w:abstractNumId w:val="52"/>
@@ -40489,7 +42071,7 @@
     <w:abstractNumId w:val="3"/>
   </w:num>
   <w:num w:numId="120" w16cid:durableId="396828229">
-    <w:abstractNumId w:val="166"/>
+    <w:abstractNumId w:val="171"/>
   </w:num>
   <w:num w:numId="121" w16cid:durableId="986058889">
     <w:abstractNumId w:val="24"/>
@@ -40501,7 +42083,7 @@
     <w:abstractNumId w:val="92"/>
   </w:num>
   <w:num w:numId="124" w16cid:durableId="114181197">
-    <w:abstractNumId w:val="164"/>
+    <w:abstractNumId w:val="169"/>
   </w:num>
   <w:num w:numId="125" w16cid:durableId="772671624">
     <w:abstractNumId w:val="5"/>
@@ -40519,16 +42101,16 @@
     <w:abstractNumId w:val="68"/>
   </w:num>
   <w:num w:numId="130" w16cid:durableId="1168907903">
-    <w:abstractNumId w:val="146"/>
+    <w:abstractNumId w:val="150"/>
   </w:num>
   <w:num w:numId="131" w16cid:durableId="430206235">
-    <w:abstractNumId w:val="136"/>
+    <w:abstractNumId w:val="139"/>
   </w:num>
   <w:num w:numId="132" w16cid:durableId="1207327089">
     <w:abstractNumId w:val="33"/>
   </w:num>
   <w:num w:numId="133" w16cid:durableId="596404292">
-    <w:abstractNumId w:val="123"/>
+    <w:abstractNumId w:val="126"/>
   </w:num>
   <w:num w:numId="134" w16cid:durableId="2070372549">
     <w:abstractNumId w:val="49"/>
@@ -40546,22 +42128,22 @@
     <w:abstractNumId w:val="88"/>
   </w:num>
   <w:num w:numId="139" w16cid:durableId="967976864">
-    <w:abstractNumId w:val="124"/>
+    <w:abstractNumId w:val="127"/>
   </w:num>
   <w:num w:numId="140" w16cid:durableId="650643288">
-    <w:abstractNumId w:val="141"/>
+    <w:abstractNumId w:val="144"/>
   </w:num>
   <w:num w:numId="141" w16cid:durableId="219370247">
-    <w:abstractNumId w:val="139"/>
+    <w:abstractNumId w:val="142"/>
   </w:num>
   <w:num w:numId="142" w16cid:durableId="323239876">
-    <w:abstractNumId w:val="175"/>
+    <w:abstractNumId w:val="180"/>
   </w:num>
   <w:num w:numId="143" w16cid:durableId="1619793156">
     <w:abstractNumId w:val="38"/>
   </w:num>
   <w:num w:numId="144" w16cid:durableId="1186332867">
-    <w:abstractNumId w:val="153"/>
+    <w:abstractNumId w:val="157"/>
   </w:num>
   <w:num w:numId="145" w16cid:durableId="89937035">
     <w:abstractNumId w:val="60"/>
@@ -40570,10 +42152,10 @@
     <w:abstractNumId w:val="1"/>
   </w:num>
   <w:num w:numId="147" w16cid:durableId="1760910030">
-    <w:abstractNumId w:val="115"/>
+    <w:abstractNumId w:val="118"/>
   </w:num>
   <w:num w:numId="148" w16cid:durableId="349307706">
-    <w:abstractNumId w:val="147"/>
+    <w:abstractNumId w:val="151"/>
   </w:num>
   <w:num w:numId="149" w16cid:durableId="1600336622">
     <w:abstractNumId w:val="36"/>
@@ -40585,10 +42167,10 @@
     <w:abstractNumId w:val="17"/>
   </w:num>
   <w:num w:numId="152" w16cid:durableId="1483890789">
-    <w:abstractNumId w:val="117"/>
+    <w:abstractNumId w:val="120"/>
   </w:num>
   <w:num w:numId="153" w16cid:durableId="2104719660">
-    <w:abstractNumId w:val="133"/>
+    <w:abstractNumId w:val="136"/>
   </w:num>
   <w:num w:numId="154" w16cid:durableId="2030252929">
     <w:abstractNumId w:val="56"/>
@@ -40603,13 +42185,13 @@
     <w:abstractNumId w:val="2"/>
   </w:num>
   <w:num w:numId="158" w16cid:durableId="1034845685">
-    <w:abstractNumId w:val="165"/>
+    <w:abstractNumId w:val="170"/>
   </w:num>
   <w:num w:numId="159" w16cid:durableId="1262639594">
     <w:abstractNumId w:val="66"/>
   </w:num>
   <w:num w:numId="160" w16cid:durableId="1640988115">
-    <w:abstractNumId w:val="127"/>
+    <w:abstractNumId w:val="130"/>
   </w:num>
   <w:num w:numId="161" w16cid:durableId="1536966176">
     <w:abstractNumId w:val="32"/>
@@ -40618,7 +42200,7 @@
     <w:abstractNumId w:val="64"/>
   </w:num>
   <w:num w:numId="163" w16cid:durableId="1025402036">
-    <w:abstractNumId w:val="125"/>
+    <w:abstractNumId w:val="128"/>
   </w:num>
   <w:num w:numId="164" w16cid:durableId="703671323">
     <w:abstractNumId w:val="86"/>
@@ -40633,19 +42215,19 @@
     <w:abstractNumId w:val="12"/>
   </w:num>
   <w:num w:numId="168" w16cid:durableId="1639455099">
-    <w:abstractNumId w:val="101"/>
+    <w:abstractNumId w:val="102"/>
   </w:num>
   <w:num w:numId="169" w16cid:durableId="1382096019">
-    <w:abstractNumId w:val="170"/>
+    <w:abstractNumId w:val="175"/>
   </w:num>
   <w:num w:numId="170" w16cid:durableId="2092239844">
-    <w:abstractNumId w:val="145"/>
+    <w:abstractNumId w:val="149"/>
   </w:num>
   <w:num w:numId="171" w16cid:durableId="2061635092">
-    <w:abstractNumId w:val="104"/>
+    <w:abstractNumId w:val="106"/>
   </w:num>
   <w:num w:numId="172" w16cid:durableId="1761901452">
-    <w:abstractNumId w:val="151"/>
+    <w:abstractNumId w:val="155"/>
   </w:num>
   <w:num w:numId="173" w16cid:durableId="1674142607">
     <w:abstractNumId w:val="81"/>
@@ -40654,13 +42236,28 @@
     <w:abstractNumId w:val="94"/>
   </w:num>
   <w:num w:numId="175" w16cid:durableId="941303595">
-    <w:abstractNumId w:val="149"/>
+    <w:abstractNumId w:val="153"/>
   </w:num>
   <w:num w:numId="176" w16cid:durableId="484014249">
     <w:abstractNumId w:val="77"/>
   </w:num>
   <w:num w:numId="177" w16cid:durableId="1905486750">
     <w:abstractNumId w:val="7"/>
+  </w:num>
+  <w:num w:numId="178" w16cid:durableId="1679194629">
+    <w:abstractNumId w:val="145"/>
+  </w:num>
+  <w:num w:numId="179" w16cid:durableId="252010165">
+    <w:abstractNumId w:val="105"/>
+  </w:num>
+  <w:num w:numId="180" w16cid:durableId="783306328">
+    <w:abstractNumId w:val="101"/>
+  </w:num>
+  <w:num w:numId="181" w16cid:durableId="612056874">
+    <w:abstractNumId w:val="166"/>
+  </w:num>
+  <w:num w:numId="182" w16cid:durableId="573711022">
+    <w:abstractNumId w:val="110"/>
   </w:num>
 </w:numbering>
 </file>

</xml_diff>

<commit_message>
Integration API Design (#399)
</commit_message>
<xml_diff>
--- a/API Design.docx
+++ b/API Design.docx
@@ -20630,6 +20630,19 @@
         <w:br w:type="page"/>
       </w:r>
     </w:p>
+    <w:p>
+      <w:pPr>
+        <w:pStyle w:val="Heading2"/>
+      </w:pPr>
+      <w:r>
+        <w:lastRenderedPageBreak/>
+        <w:t xml:space="preserve">API Security </w:t>
+      </w:r>
+      <w:r>
+        <w:t>Specification</w:t>
+      </w:r>
+    </w:p>
+    <w:p/>
     <w:p>
       <w:pPr>
         <w:tabs>

</xml_diff>

<commit_message>
API Security Design (#404) Authentication Standards (#405) Authorization Rules (#406) Security Validation (#407)
</commit_message>
<xml_diff>
--- a/API Design.docx
+++ b/API Design.docx
@@ -20642,15 +20642,936 @@
         <w:t>Specification</w:t>
       </w:r>
     </w:p>
+    <w:p>
+      <w:r>
+        <w:t>The API Security Specification identifies the security measures implemented for the protection of the KriGo system from security risks and threats. Considering that the platform has a variety of RESTful APIs exposed to customers, rental agencies, administrators, and integration services, the guaranteeing of the data's confidentiality, integrity, and availability is an essential architectural consideration. The security model used here involves a number of measures that ensure the protection of application resources and user data, such as authentication, authorization, encryption of data, validation of requests, and other procedures.</w:t>
+      </w:r>
+    </w:p>
+    <w:p>
+      <w:r>
+        <w:t>All APIs are accessible through HTTPS with TLS, which ensures the encryption of data sent from clients to servers and protects the data from interception. The process of authentication involves the use of JWT, and the authorization involves the application of Role-Based Access Control (RBAC). Also, there are a number of validation processes designed to prevent the common security issues, such as the attacks on the API using injections, accessing of the API by unauthentic users, and sending of incorrect requests.</w:t>
+      </w:r>
+    </w:p>
+    <w:p>
+      <w:r>
+        <w:t>The API Security Specification is structured into three primary elements:</w:t>
+      </w:r>
+    </w:p>
+    <w:p>
+      <w:pPr>
+        <w:pStyle w:val="ListParagraph"/>
+        <w:numPr>
+          <w:ilvl w:val="0"/>
+          <w:numId w:val="188"/>
+        </w:numPr>
+      </w:pPr>
+      <w:r>
+        <w:t>Authentication Standards – which provide guidelines on the authentication of the user, handling of JWT tokens, and secure session management.</w:t>
+      </w:r>
+    </w:p>
+    <w:p>
+      <w:pPr>
+        <w:pStyle w:val="ListParagraph"/>
+        <w:numPr>
+          <w:ilvl w:val="0"/>
+          <w:numId w:val="188"/>
+        </w:numPr>
+      </w:pPr>
+      <w:r>
+        <w:t>Authorization Standards – which state role-based authorization rules for accessing restricted information.</w:t>
+      </w:r>
+    </w:p>
+    <w:p>
+      <w:pPr>
+        <w:pStyle w:val="ListParagraph"/>
+        <w:numPr>
+          <w:ilvl w:val="0"/>
+          <w:numId w:val="188"/>
+        </w:numPr>
+      </w:pPr>
+      <w:r>
+        <w:t>Security Validation – which provides an explanation on how validation is carried out on API calls, the input data, and the communication channels.</w:t>
+      </w:r>
+    </w:p>
+    <w:p>
+      <w:r>
+        <w:t>All these security standards combined form a comprehensive protection system that enables secure communication, access control, compliance with regulations, and reliability of the entire KriGo system.</w:t>
+      </w:r>
+    </w:p>
+    <w:p>
+      <w:pPr>
+        <w:spacing w:line="278" w:lineRule="auto"/>
+      </w:pPr>
+      <w:r>
+        <w:br w:type="page"/>
+      </w:r>
+    </w:p>
+    <w:p>
+      <w:pPr>
+        <w:pStyle w:val="Heading3"/>
+      </w:pPr>
+      <w:r>
+        <w:lastRenderedPageBreak/>
+        <w:t>Authentication Standards</w:t>
+      </w:r>
+    </w:p>
+    <w:p>
+      <w:r>
+        <w:t>Authentication is the first step of security within the KriGo platform, which verifies the identity of the users before allowing access to the protected resources. The authentication process uses a stateless architecture based on JSON Web Tokens (JWT) that allows for secure and scalable communication between clients and backend services. After successful authentication, the users are granted access tokens required for every further request to protected API endpoints.</w:t>
+      </w:r>
+    </w:p>
+    <w:p>
+      <w:r>
+        <w:t>JWT-based authentication does not require the usage of server-side sessions, providing the possibility of horizontal scalability and allows storing the tokens that contain the information about the authenticated users’ identity, roles, and expiration time of the tokens. Every request to protected resources is checked before performing the business logic operations, providing access only to authenticated users.</w:t>
+      </w:r>
+    </w:p>
+    <w:p>
+      <w:pPr>
+        <w:pStyle w:val="Heading4"/>
+      </w:pPr>
+      <w:r>
+        <w:t>Authentication Standards</w:t>
+      </w:r>
+    </w:p>
+    <w:p>
+      <w:r>
+        <w:t>The authentication process uses the following standards:</w:t>
+      </w:r>
+    </w:p>
+    <w:p>
+      <w:pPr>
+        <w:pStyle w:val="ListParagraph"/>
+        <w:numPr>
+          <w:ilvl w:val="1"/>
+          <w:numId w:val="190"/>
+        </w:numPr>
+        <w:spacing w:line="276" w:lineRule="auto"/>
+      </w:pPr>
+      <w:r>
+        <w:t>JWT-Based Authentication: Digital signature of the JSON Web Tokens is used for user identification.</w:t>
+      </w:r>
+    </w:p>
+    <w:p>
+      <w:pPr>
+        <w:pStyle w:val="ListParagraph"/>
+        <w:numPr>
+          <w:ilvl w:val="1"/>
+          <w:numId w:val="190"/>
+        </w:numPr>
+        <w:spacing w:line="276" w:lineRule="auto"/>
+      </w:pPr>
+      <w:r>
+        <w:t>Secure Password Storage: The passwords are stored in a hashed form by BCrypt hashing.</w:t>
+      </w:r>
+    </w:p>
+    <w:p>
+      <w:pPr>
+        <w:pStyle w:val="ListParagraph"/>
+        <w:numPr>
+          <w:ilvl w:val="1"/>
+          <w:numId w:val="190"/>
+        </w:numPr>
+        <w:spacing w:line="276" w:lineRule="auto"/>
+      </w:pPr>
+      <w:r>
+        <w:t>HTTPS Communication: All requests from the user are performed using HTTPS protocol.</w:t>
+      </w:r>
+    </w:p>
+    <w:p>
+      <w:pPr>
+        <w:pStyle w:val="ListParagraph"/>
+        <w:numPr>
+          <w:ilvl w:val="1"/>
+          <w:numId w:val="190"/>
+        </w:numPr>
+        <w:spacing w:line="276" w:lineRule="auto"/>
+      </w:pPr>
+      <w:r>
+        <w:t>Token Expiration: The access tokens have predefined expiration times to reduce the security risks.</w:t>
+      </w:r>
+    </w:p>
+    <w:p>
+      <w:pPr>
+        <w:pStyle w:val="ListParagraph"/>
+        <w:numPr>
+          <w:ilvl w:val="1"/>
+          <w:numId w:val="190"/>
+        </w:numPr>
+        <w:spacing w:line="276" w:lineRule="auto"/>
+      </w:pPr>
+      <w:r>
+        <w:t>Refresh Tokens: Long-term refresh tokens are used for secure generation of the access tokens.</w:t>
+      </w:r>
+    </w:p>
+    <w:p>
+      <w:pPr>
+        <w:pStyle w:val="ListParagraph"/>
+        <w:numPr>
+          <w:ilvl w:val="1"/>
+          <w:numId w:val="190"/>
+        </w:numPr>
+        <w:spacing w:line="276" w:lineRule="auto"/>
+      </w:pPr>
+      <w:r>
+        <w:t>Password Policies: Complex passwords are required.</w:t>
+      </w:r>
+    </w:p>
+    <w:p>
+      <w:pPr>
+        <w:pStyle w:val="ListParagraph"/>
+        <w:numPr>
+          <w:ilvl w:val="1"/>
+          <w:numId w:val="190"/>
+        </w:numPr>
+        <w:spacing w:line="276" w:lineRule="auto"/>
+      </w:pPr>
+      <w:r>
+        <w:t>Account Verification: Users have to verify their email before activating the account.</w:t>
+      </w:r>
+    </w:p>
+    <w:p>
+      <w:pPr>
+        <w:pStyle w:val="ListParagraph"/>
+        <w:numPr>
+          <w:ilvl w:val="1"/>
+          <w:numId w:val="190"/>
+        </w:numPr>
+        <w:spacing w:line="276" w:lineRule="auto"/>
+      </w:pPr>
+      <w:r>
+        <w:t>Multi-Factor Authentication (future enhancement): Support of MFA integration in the architecture.</w:t>
+      </w:r>
+    </w:p>
+    <w:p>
+      <w:pPr>
+        <w:pStyle w:val="Heading4"/>
+      </w:pPr>
+      <w:r>
+        <w:t>Authentication Process</w:t>
+      </w:r>
+    </w:p>
+    <w:p>
+      <w:pPr>
+        <w:pStyle w:val="ListParagraph"/>
+        <w:numPr>
+          <w:ilvl w:val="1"/>
+          <w:numId w:val="192"/>
+        </w:numPr>
+        <w:spacing w:line="360" w:lineRule="auto"/>
+      </w:pPr>
+      <w:r>
+        <w:t>User sends his login credentials.</w:t>
+      </w:r>
+    </w:p>
+    <w:p>
+      <w:pPr>
+        <w:pStyle w:val="ListParagraph"/>
+        <w:numPr>
+          <w:ilvl w:val="1"/>
+          <w:numId w:val="192"/>
+        </w:numPr>
+        <w:spacing w:line="360" w:lineRule="auto"/>
+      </w:pPr>
+      <w:r>
+        <w:t>Authentication service checks the credentials of the user.</w:t>
+      </w:r>
+    </w:p>
+    <w:p>
+      <w:pPr>
+        <w:pStyle w:val="ListParagraph"/>
+        <w:numPr>
+          <w:ilvl w:val="1"/>
+          <w:numId w:val="192"/>
+        </w:numPr>
+        <w:spacing w:line="360" w:lineRule="auto"/>
+      </w:pPr>
+      <w:r>
+        <w:t>Access and refresh tokens are created.</w:t>
+      </w:r>
+    </w:p>
+    <w:p>
+      <w:pPr>
+        <w:pStyle w:val="ListParagraph"/>
+        <w:numPr>
+          <w:ilvl w:val="1"/>
+          <w:numId w:val="192"/>
+        </w:numPr>
+        <w:spacing w:line="360" w:lineRule="auto"/>
+      </w:pPr>
+      <w:r>
+        <w:t>Access token is securely stored by the client.</w:t>
+      </w:r>
+    </w:p>
+    <w:p>
+      <w:pPr>
+        <w:pStyle w:val="ListParagraph"/>
+        <w:numPr>
+          <w:ilvl w:val="1"/>
+          <w:numId w:val="192"/>
+        </w:numPr>
+        <w:spacing w:line="360" w:lineRule="auto"/>
+      </w:pPr>
+      <w:r>
+        <w:t>Request to the protected API includes Authorization header.</w:t>
+      </w:r>
+    </w:p>
+    <w:p>
+      <w:pPr>
+        <w:pStyle w:val="ListParagraph"/>
+        <w:numPr>
+          <w:ilvl w:val="1"/>
+          <w:numId w:val="192"/>
+        </w:numPr>
+        <w:spacing w:line="360" w:lineRule="auto"/>
+      </w:pPr>
+      <w:r>
+        <w:t>API Gateway checks JWT signature and expiration time.</w:t>
+      </w:r>
+    </w:p>
+    <w:p>
+      <w:pPr>
+        <w:pStyle w:val="ListParagraph"/>
+        <w:numPr>
+          <w:ilvl w:val="1"/>
+          <w:numId w:val="192"/>
+        </w:numPr>
+        <w:spacing w:line="360" w:lineRule="auto"/>
+      </w:pPr>
+      <w:r>
+        <w:t>Validated request is sent to the required service.</w:t>
+      </w:r>
+    </w:p>
+    <w:p>
+      <w:pPr>
+        <w:spacing w:line="278" w:lineRule="auto"/>
+      </w:pPr>
+      <w:r>
+        <w:br w:type="page"/>
+      </w:r>
+    </w:p>
+    <w:p>
+      <w:pPr>
+        <w:pStyle w:val="Heading3"/>
+      </w:pPr>
+      <w:r>
+        <w:lastRenderedPageBreak/>
+        <w:t>Authorization Rules</w:t>
+      </w:r>
+    </w:p>
+    <w:p>
+      <w:r>
+        <w:t>Authorization specifies the collection of operations that an authenticated user will be able to access after the user is validated. The KriGo framework utilizes Role-Based Access Control (RBAC) mechanism for limiting access to the operations based on user roles. Every API end point states which roles are permitted to execute a particular operation, thus ensuring that only relevant resources will be accessed by users.</w:t>
+      </w:r>
+    </w:p>
+    <w:p>
+      <w:r>
+        <w:t>The authorization rules are consistently implemented throughout the entire set of platform services.</w:t>
+      </w:r>
+    </w:p>
+    <w:p>
+      <w:pPr>
+        <w:pStyle w:val="Heading4"/>
+      </w:pPr>
+      <w:r>
+        <w:t>Supported Roles</w:t>
+      </w:r>
+    </w:p>
+    <w:p>
+      <w:pPr>
+        <w:pStyle w:val="Caption"/>
+        <w:keepNext/>
+      </w:pPr>
+      <w:r>
+        <w:t xml:space="preserve">Table </w:t>
+      </w:r>
+      <w:r>
+        <w:fldChar w:fldCharType="begin"/>
+      </w:r>
+      <w:r>
+        <w:instrText xml:space="preserve"> SEQ Table \* ARABIC </w:instrText>
+      </w:r>
+      <w:r>
+        <w:fldChar w:fldCharType="separate"/>
+      </w:r>
+      <w:r>
+        <w:rPr>
+          <w:noProof/>
+        </w:rPr>
+        <w:t>19</w:t>
+      </w:r>
+      <w:r>
+        <w:fldChar w:fldCharType="end"/>
+      </w:r>
+      <w:r>
+        <w:t xml:space="preserve"> - </w:t>
+      </w:r>
+      <w:r>
+        <w:t>Supported Roles</w:t>
+      </w:r>
+    </w:p>
+    <w:tbl>
+      <w:tblPr>
+        <w:tblStyle w:val="PlainTable1"/>
+        <w:tblW w:w="0" w:type="auto"/>
+        <w:tblCellMar>
+          <w:top w:w="72" w:type="dxa"/>
+          <w:bottom w:w="72" w:type="dxa"/>
+        </w:tblCellMar>
+        <w:tblLook w:val="04A0" w:firstRow="1" w:lastRow="0" w:firstColumn="1" w:lastColumn="0" w:noHBand="0" w:noVBand="1"/>
+      </w:tblPr>
+      <w:tblGrid>
+        <w:gridCol w:w="2109"/>
+        <w:gridCol w:w="7238"/>
+      </w:tblGrid>
+      <w:tr>
+        <w:trPr>
+          <w:cnfStyle w:val="100000000000" w:firstRow="1" w:lastRow="0" w:firstColumn="0" w:lastColumn="0" w:oddVBand="0" w:evenVBand="0" w:oddHBand="0" w:evenHBand="0" w:firstRowFirstColumn="0" w:firstRowLastColumn="0" w:lastRowFirstColumn="0" w:lastRowLastColumn="0"/>
+        </w:trPr>
+        <w:tc>
+          <w:tcPr>
+            <w:cnfStyle w:val="001000000000" w:firstRow="0" w:lastRow="0" w:firstColumn="1" w:lastColumn="0" w:oddVBand="0" w:evenVBand="0" w:oddHBand="0" w:evenHBand="0" w:firstRowFirstColumn="0" w:firstRowLastColumn="0" w:lastRowFirstColumn="0" w:lastRowLastColumn="0"/>
+            <w:tcW w:w="0" w:type="auto"/>
+            <w:vAlign w:val="center"/>
+            <w:hideMark/>
+          </w:tcPr>
+          <w:p>
+            <w:r>
+              <w:t>Role</w:t>
+            </w:r>
+          </w:p>
+        </w:tc>
+        <w:tc>
+          <w:tcPr>
+            <w:tcW w:w="0" w:type="auto"/>
+            <w:vAlign w:val="center"/>
+            <w:hideMark/>
+          </w:tcPr>
+          <w:p>
+            <w:pPr>
+              <w:cnfStyle w:val="100000000000" w:firstRow="1" w:lastRow="0" w:firstColumn="0" w:lastColumn="0" w:oddVBand="0" w:evenVBand="0" w:oddHBand="0" w:evenHBand="0" w:firstRowFirstColumn="0" w:firstRowLastColumn="0" w:lastRowFirstColumn="0" w:lastRowLastColumn="0"/>
+            </w:pPr>
+            <w:r>
+              <w:t>Permissions</w:t>
+            </w:r>
+          </w:p>
+        </w:tc>
+      </w:tr>
+      <w:tr>
+        <w:trPr>
+          <w:cnfStyle w:val="000000100000" w:firstRow="0" w:lastRow="0" w:firstColumn="0" w:lastColumn="0" w:oddVBand="0" w:evenVBand="0" w:oddHBand="1" w:evenHBand="0" w:firstRowFirstColumn="0" w:firstRowLastColumn="0" w:lastRowFirstColumn="0" w:lastRowLastColumn="0"/>
+        </w:trPr>
+        <w:tc>
+          <w:tcPr>
+            <w:cnfStyle w:val="001000000000" w:firstRow="0" w:lastRow="0" w:firstColumn="1" w:lastColumn="0" w:oddVBand="0" w:evenVBand="0" w:oddHBand="0" w:evenHBand="0" w:firstRowFirstColumn="0" w:firstRowLastColumn="0" w:lastRowFirstColumn="0" w:lastRowLastColumn="0"/>
+            <w:tcW w:w="0" w:type="auto"/>
+            <w:vAlign w:val="center"/>
+            <w:hideMark/>
+          </w:tcPr>
+          <w:p>
+            <w:pPr>
+              <w:rPr>
+                <w:b w:val="0"/>
+                <w:bCs w:val="0"/>
+              </w:rPr>
+            </w:pPr>
+            <w:r>
+              <w:rPr>
+                <w:b w:val="0"/>
+                <w:bCs w:val="0"/>
+              </w:rPr>
+              <w:t>Customer</w:t>
+            </w:r>
+          </w:p>
+        </w:tc>
+        <w:tc>
+          <w:tcPr>
+            <w:tcW w:w="0" w:type="auto"/>
+            <w:vAlign w:val="center"/>
+            <w:hideMark/>
+          </w:tcPr>
+          <w:p>
+            <w:pPr>
+              <w:cnfStyle w:val="000000100000" w:firstRow="0" w:lastRow="0" w:firstColumn="0" w:lastColumn="0" w:oddVBand="0" w:evenVBand="0" w:oddHBand="1" w:evenHBand="0" w:firstRowFirstColumn="0" w:firstRowLastColumn="0" w:lastRowFirstColumn="0" w:lastRowLastColumn="0"/>
+            </w:pPr>
+            <w:r>
+              <w:t>Search vehicles, create reservations, manage personal profile, submit reviews and disputes</w:t>
+            </w:r>
+          </w:p>
+        </w:tc>
+      </w:tr>
+      <w:tr>
+        <w:tc>
+          <w:tcPr>
+            <w:cnfStyle w:val="001000000000" w:firstRow="0" w:lastRow="0" w:firstColumn="1" w:lastColumn="0" w:oddVBand="0" w:evenVBand="0" w:oddHBand="0" w:evenHBand="0" w:firstRowFirstColumn="0" w:firstRowLastColumn="0" w:lastRowFirstColumn="0" w:lastRowLastColumn="0"/>
+            <w:tcW w:w="0" w:type="auto"/>
+            <w:vAlign w:val="center"/>
+            <w:hideMark/>
+          </w:tcPr>
+          <w:p>
+            <w:pPr>
+              <w:rPr>
+                <w:b w:val="0"/>
+                <w:bCs w:val="0"/>
+              </w:rPr>
+            </w:pPr>
+            <w:r>
+              <w:rPr>
+                <w:b w:val="0"/>
+                <w:bCs w:val="0"/>
+              </w:rPr>
+              <w:t>Agency Employee</w:t>
+            </w:r>
+          </w:p>
+        </w:tc>
+        <w:tc>
+          <w:tcPr>
+            <w:tcW w:w="0" w:type="auto"/>
+            <w:vAlign w:val="center"/>
+            <w:hideMark/>
+          </w:tcPr>
+          <w:p>
+            <w:pPr>
+              <w:cnfStyle w:val="000000000000" w:firstRow="0" w:lastRow="0" w:firstColumn="0" w:lastColumn="0" w:oddVBand="0" w:evenVBand="0" w:oddHBand="0" w:evenHBand="0" w:firstRowFirstColumn="0" w:firstRowLastColumn="0" w:lastRowFirstColumn="0" w:lastRowLastColumn="0"/>
+            </w:pPr>
+            <w:r>
+              <w:t>Manage vehicles, reservations, branches, and customers within the assigned agency</w:t>
+            </w:r>
+          </w:p>
+        </w:tc>
+      </w:tr>
+      <w:tr>
+        <w:trPr>
+          <w:cnfStyle w:val="000000100000" w:firstRow="0" w:lastRow="0" w:firstColumn="0" w:lastColumn="0" w:oddVBand="0" w:evenVBand="0" w:oddHBand="1" w:evenHBand="0" w:firstRowFirstColumn="0" w:firstRowLastColumn="0" w:lastRowFirstColumn="0" w:lastRowLastColumn="0"/>
+        </w:trPr>
+        <w:tc>
+          <w:tcPr>
+            <w:cnfStyle w:val="001000000000" w:firstRow="0" w:lastRow="0" w:firstColumn="1" w:lastColumn="0" w:oddVBand="0" w:evenVBand="0" w:oddHBand="0" w:evenHBand="0" w:firstRowFirstColumn="0" w:firstRowLastColumn="0" w:lastRowFirstColumn="0" w:lastRowLastColumn="0"/>
+            <w:tcW w:w="0" w:type="auto"/>
+            <w:vAlign w:val="center"/>
+            <w:hideMark/>
+          </w:tcPr>
+          <w:p>
+            <w:pPr>
+              <w:rPr>
+                <w:b w:val="0"/>
+                <w:bCs w:val="0"/>
+              </w:rPr>
+            </w:pPr>
+            <w:r>
+              <w:rPr>
+                <w:b w:val="0"/>
+                <w:bCs w:val="0"/>
+              </w:rPr>
+              <w:t>Agency Administrator</w:t>
+            </w:r>
+          </w:p>
+        </w:tc>
+        <w:tc>
+          <w:tcPr>
+            <w:tcW w:w="0" w:type="auto"/>
+            <w:vAlign w:val="center"/>
+            <w:hideMark/>
+          </w:tcPr>
+          <w:p>
+            <w:pPr>
+              <w:cnfStyle w:val="000000100000" w:firstRow="0" w:lastRow="0" w:firstColumn="0" w:lastColumn="0" w:oddVBand="0" w:evenVBand="0" w:oddHBand="1" w:evenHBand="0" w:firstRowFirstColumn="0" w:firstRowLastColumn="0" w:lastRowFirstColumn="0" w:lastRowLastColumn="0"/>
+            </w:pPr>
+            <w:r>
+              <w:t>Full management of agency resources, employees, reports, and operations</w:t>
+            </w:r>
+          </w:p>
+        </w:tc>
+      </w:tr>
+      <w:tr>
+        <w:tc>
+          <w:tcPr>
+            <w:cnfStyle w:val="001000000000" w:firstRow="0" w:lastRow="0" w:firstColumn="1" w:lastColumn="0" w:oddVBand="0" w:evenVBand="0" w:oddHBand="0" w:evenHBand="0" w:firstRowFirstColumn="0" w:firstRowLastColumn="0" w:lastRowFirstColumn="0" w:lastRowLastColumn="0"/>
+            <w:tcW w:w="0" w:type="auto"/>
+            <w:vAlign w:val="center"/>
+            <w:hideMark/>
+          </w:tcPr>
+          <w:p>
+            <w:pPr>
+              <w:rPr>
+                <w:b w:val="0"/>
+                <w:bCs w:val="0"/>
+              </w:rPr>
+            </w:pPr>
+            <w:r>
+              <w:rPr>
+                <w:b w:val="0"/>
+                <w:bCs w:val="0"/>
+              </w:rPr>
+              <w:t>Platform Administrator</w:t>
+            </w:r>
+          </w:p>
+        </w:tc>
+        <w:tc>
+          <w:tcPr>
+            <w:tcW w:w="0" w:type="auto"/>
+            <w:vAlign w:val="center"/>
+            <w:hideMark/>
+          </w:tcPr>
+          <w:p>
+            <w:pPr>
+              <w:cnfStyle w:val="000000000000" w:firstRow="0" w:lastRow="0" w:firstColumn="0" w:lastColumn="0" w:oddVBand="0" w:evenVBand="0" w:oddHBand="0" w:evenHBand="0" w:firstRowFirstColumn="0" w:firstRowLastColumn="0" w:lastRowFirstColumn="0" w:lastRowLastColumn="0"/>
+            </w:pPr>
+            <w:r>
+              <w:t>Full platform management, user administration, verification, moderation, reporting, and system configuration</w:t>
+            </w:r>
+          </w:p>
+        </w:tc>
+      </w:tr>
+    </w:tbl>
     <w:p/>
     <w:p>
       <w:pPr>
-        <w:tabs>
-          <w:tab w:val="left" w:pos="3852"/>
-        </w:tabs>
-      </w:pPr>
+        <w:pStyle w:val="Heading4"/>
+      </w:pPr>
+      <w:r>
+        <w:t>Authorization Rules</w:t>
+      </w:r>
+    </w:p>
+    <w:p>
+      <w:r>
+        <w:t>All secured end points must have a valid JSON Web Token (JWT). Roles of the users are determined by the JWT claims. Access permissions are checked before the business logic is executed. Resource ownership is confirmed for operations related to customers and agencies. Administrative API access is restricted to platform administrators only. Agency resources are segregated based on different rental agencies. Any unauthorized access returns an HTTP 403 Forbidden response. Invalid or expired tokens result in HTTP 401 Unauthorized response.</w:t>
+      </w:r>
     </w:p>
     <w:p/>
+    <w:p>
+      <w:pPr>
+        <w:pStyle w:val="Heading4"/>
+      </w:pPr>
+      <w:r>
+        <w:t>Authorization Process</w:t>
+      </w:r>
+    </w:p>
+    <w:p>
+      <w:r>
+        <w:t>The token is validated. Role of the user is fetched from the token. Permission to access the resource is checked. Ownership of the resource is confirmed if necessary. Access can either be allowed or denied based on the permission and other factors. Authorization details are logged in the security log file.</w:t>
+      </w:r>
+    </w:p>
+    <w:p>
+      <w:pPr>
+        <w:spacing w:line="278" w:lineRule="auto"/>
+      </w:pPr>
+      <w:r>
+        <w:br w:type="page"/>
+      </w:r>
+    </w:p>
+    <w:p>
+      <w:pPr>
+        <w:pStyle w:val="Heading3"/>
+      </w:pPr>
+      <w:r>
+        <w:lastRenderedPageBreak/>
+        <w:t>Security Validation</w:t>
+      </w:r>
+    </w:p>
+    <w:p>
+      <w:r>
+        <w:t xml:space="preserve">Security validation forms another layer of protection in ensuring that all API requests meet the required security standards before being processed. This ensures that there </w:t>
+      </w:r>
+      <w:proofErr w:type="gramStart"/>
+      <w:r>
+        <w:t>is</w:t>
+      </w:r>
+      <w:proofErr w:type="gramEnd"/>
+      <w:r>
+        <w:t xml:space="preserve"> no malicious input and manipulation of resources as well as reducing the common vulnerabilities of web applications while keeping the system available and intact.</w:t>
+      </w:r>
+    </w:p>
+    <w:p>
+      <w:r>
+        <w:t>There exist security validation procedures in different layers of the architectural design such as API Gateway, application services, and database access layer.</w:t>
+      </w:r>
+    </w:p>
+    <w:p>
+      <w:pPr>
+        <w:pStyle w:val="Heading4"/>
+      </w:pPr>
+      <w:r>
+        <w:t>Security Validation Measures</w:t>
+      </w:r>
+    </w:p>
+    <w:p>
+      <w:pPr>
+        <w:pStyle w:val="ListParagraph"/>
+        <w:numPr>
+          <w:ilvl w:val="1"/>
+          <w:numId w:val="194"/>
+        </w:numPr>
+        <w:spacing w:line="276" w:lineRule="auto"/>
+      </w:pPr>
+      <w:r>
+        <w:t>Input Validation: Validating request parameters, headers, and body of the request.</w:t>
+      </w:r>
+    </w:p>
+    <w:p>
+      <w:pPr>
+        <w:pStyle w:val="ListParagraph"/>
+        <w:numPr>
+          <w:ilvl w:val="1"/>
+          <w:numId w:val="194"/>
+        </w:numPr>
+        <w:spacing w:line="276" w:lineRule="auto"/>
+      </w:pPr>
+      <w:r>
+        <w:t>Schema Validation: Ensuring that JSON payloads match required schema.</w:t>
+      </w:r>
+    </w:p>
+    <w:p>
+      <w:pPr>
+        <w:pStyle w:val="ListParagraph"/>
+        <w:numPr>
+          <w:ilvl w:val="1"/>
+          <w:numId w:val="194"/>
+        </w:numPr>
+        <w:spacing w:line="276" w:lineRule="auto"/>
+      </w:pPr>
+      <w:r>
+        <w:t>HTTPS Enforce: Blocking unencrypted HTTP requests.</w:t>
+      </w:r>
+    </w:p>
+    <w:p>
+      <w:pPr>
+        <w:pStyle w:val="ListParagraph"/>
+        <w:numPr>
+          <w:ilvl w:val="1"/>
+          <w:numId w:val="194"/>
+        </w:numPr>
+        <w:spacing w:line="276" w:lineRule="auto"/>
+      </w:pPr>
+      <w:r>
+        <w:t xml:space="preserve">Rate limiting: Blocking excessive requests as a protection against </w:t>
+      </w:r>
+      <w:proofErr w:type="gramStart"/>
+      <w:r>
+        <w:t>Denial of Service</w:t>
+      </w:r>
+      <w:proofErr w:type="gramEnd"/>
+      <w:r>
+        <w:t xml:space="preserve"> attacks.</w:t>
+      </w:r>
+    </w:p>
+    <w:p>
+      <w:pPr>
+        <w:pStyle w:val="ListParagraph"/>
+        <w:numPr>
+          <w:ilvl w:val="1"/>
+          <w:numId w:val="194"/>
+        </w:numPr>
+        <w:spacing w:line="276" w:lineRule="auto"/>
+      </w:pPr>
+      <w:r>
+        <w:t>Request Size Validation: Blocking oversized payloads attacks.</w:t>
+      </w:r>
+    </w:p>
+    <w:p>
+      <w:pPr>
+        <w:pStyle w:val="ListParagraph"/>
+        <w:numPr>
+          <w:ilvl w:val="1"/>
+          <w:numId w:val="194"/>
+        </w:numPr>
+        <w:spacing w:line="276" w:lineRule="auto"/>
+      </w:pPr>
+      <w:r>
+        <w:t>SQL Injection: Using parameterized database queries through ORM.</w:t>
+      </w:r>
+    </w:p>
+    <w:p>
+      <w:pPr>
+        <w:pStyle w:val="ListParagraph"/>
+        <w:numPr>
+          <w:ilvl w:val="1"/>
+          <w:numId w:val="194"/>
+        </w:numPr>
+        <w:spacing w:line="276" w:lineRule="auto"/>
+      </w:pPr>
+      <w:r>
+        <w:t>XSS prevention: Sanitizing user generated content before saving or displaying it.</w:t>
+      </w:r>
+    </w:p>
+    <w:p>
+      <w:pPr>
+        <w:pStyle w:val="ListParagraph"/>
+        <w:numPr>
+          <w:ilvl w:val="1"/>
+          <w:numId w:val="194"/>
+        </w:numPr>
+        <w:spacing w:line="276" w:lineRule="auto"/>
+      </w:pPr>
+      <w:r>
+        <w:t>CSRF: If using cookies, implement CSRF.</w:t>
+      </w:r>
+    </w:p>
+    <w:p>
+      <w:pPr>
+        <w:pStyle w:val="ListParagraph"/>
+        <w:numPr>
+          <w:ilvl w:val="1"/>
+          <w:numId w:val="194"/>
+        </w:numPr>
+        <w:spacing w:line="276" w:lineRule="auto"/>
+      </w:pPr>
+      <w:r>
+        <w:t>CORS policy enforcement: Blocking cross origin requests that do not come from client applications.</w:t>
+      </w:r>
+    </w:p>
+    <w:p>
+      <w:pPr>
+        <w:pStyle w:val="ListParagraph"/>
+        <w:numPr>
+          <w:ilvl w:val="1"/>
+          <w:numId w:val="194"/>
+        </w:numPr>
+        <w:spacing w:line="276" w:lineRule="auto"/>
+      </w:pPr>
+      <w:r>
+        <w:t>Audit logging: Recording authentications attempts, authorizations failures, and administrative activities.</w:t>
+      </w:r>
+    </w:p>
+    <w:p>
+      <w:pPr>
+        <w:pStyle w:val="ListParagraph"/>
+        <w:numPr>
+          <w:ilvl w:val="1"/>
+          <w:numId w:val="194"/>
+        </w:numPr>
+        <w:spacing w:line="276" w:lineRule="auto"/>
+      </w:pPr>
+      <w:r>
+        <w:t>Security headers: Adding CSP, X-Content-Type-Options, Strict-Transport-Security (HSTS).</w:t>
+      </w:r>
+    </w:p>
+    <w:p>
+      <w:pPr>
+        <w:pStyle w:val="ListParagraph"/>
+        <w:spacing w:line="276" w:lineRule="auto"/>
+        <w:ind w:firstLine="0"/>
+      </w:pPr>
+    </w:p>
+    <w:p>
+      <w:pPr>
+        <w:pStyle w:val="Heading4"/>
+      </w:pPr>
+      <w:r>
+        <w:t>The validation process flow</w:t>
+      </w:r>
+    </w:p>
+    <w:p>
+      <w:pPr>
+        <w:pStyle w:val="ListParagraph"/>
+        <w:numPr>
+          <w:ilvl w:val="1"/>
+          <w:numId w:val="196"/>
+        </w:numPr>
+        <w:spacing w:line="360" w:lineRule="auto"/>
+      </w:pPr>
+      <w:r>
+        <w:t>The client sends API request.</w:t>
+      </w:r>
+    </w:p>
+    <w:p>
+      <w:pPr>
+        <w:pStyle w:val="ListParagraph"/>
+        <w:numPr>
+          <w:ilvl w:val="1"/>
+          <w:numId w:val="196"/>
+        </w:numPr>
+        <w:spacing w:line="360" w:lineRule="auto"/>
+      </w:pPr>
+      <w:r>
+        <w:t>The API Gateway checks HTTPS, header, and request size.</w:t>
+      </w:r>
+    </w:p>
+    <w:p>
+      <w:pPr>
+        <w:pStyle w:val="ListParagraph"/>
+        <w:numPr>
+          <w:ilvl w:val="1"/>
+          <w:numId w:val="196"/>
+        </w:numPr>
+        <w:spacing w:line="360" w:lineRule="auto"/>
+      </w:pPr>
+      <w:r>
+        <w:t>JWT authentication is checked.</w:t>
+      </w:r>
+    </w:p>
+    <w:p>
+      <w:pPr>
+        <w:pStyle w:val="ListParagraph"/>
+        <w:numPr>
+          <w:ilvl w:val="1"/>
+          <w:numId w:val="196"/>
+        </w:numPr>
+        <w:spacing w:line="360" w:lineRule="auto"/>
+      </w:pPr>
+      <w:r>
+        <w:t>Authorizations are checked.</w:t>
+      </w:r>
+    </w:p>
+    <w:p>
+      <w:pPr>
+        <w:pStyle w:val="ListParagraph"/>
+        <w:numPr>
+          <w:ilvl w:val="1"/>
+          <w:numId w:val="196"/>
+        </w:numPr>
+        <w:spacing w:line="360" w:lineRule="auto"/>
+      </w:pPr>
+      <w:r>
+        <w:t>The request payload is checked for schema and input validation.</w:t>
+      </w:r>
+    </w:p>
+    <w:p>
+      <w:pPr>
+        <w:pStyle w:val="ListParagraph"/>
+        <w:numPr>
+          <w:ilvl w:val="1"/>
+          <w:numId w:val="196"/>
+        </w:numPr>
+        <w:spacing w:line="360" w:lineRule="auto"/>
+      </w:pPr>
+      <w:r>
+        <w:t>The business rules are checked.</w:t>
+      </w:r>
+    </w:p>
+    <w:p>
+      <w:pPr>
+        <w:pStyle w:val="ListParagraph"/>
+        <w:numPr>
+          <w:ilvl w:val="1"/>
+          <w:numId w:val="196"/>
+        </w:numPr>
+        <w:spacing w:line="360" w:lineRule="auto"/>
+      </w:pPr>
+      <w:r>
+        <w:t>The sanitized data is then sent to the application service.</w:t>
+      </w:r>
+    </w:p>
+    <w:p>
+      <w:pPr>
+        <w:pStyle w:val="ListParagraph"/>
+        <w:numPr>
+          <w:ilvl w:val="1"/>
+          <w:numId w:val="196"/>
+        </w:numPr>
+        <w:spacing w:line="360" w:lineRule="auto"/>
+      </w:pPr>
+      <w:r>
+        <w:t>Security logs are created.</w:t>
+      </w:r>
+    </w:p>
+    <w:p>
+      <w:pPr>
+        <w:spacing w:line="278" w:lineRule="auto"/>
+      </w:pPr>
+      <w:r>
+        <w:br w:type="page"/>
+      </w:r>
+    </w:p>
     <w:p/>
     <w:p/>
     <w:p/>
@@ -26390,6 +27311,119 @@
     </w:lvl>
   </w:abstractNum>
   <w:abstractNum w:abstractNumId="46" w15:restartNumberingAfterBreak="0">
+    <w:nsid w:val="24353209"/>
+    <w:multiLevelType w:val="hybridMultilevel"/>
+    <w:tmpl w:val="600063C2"/>
+    <w:lvl w:ilvl="0" w:tplc="FFFFFFFF">
+      <w:start w:val="1"/>
+      <w:numFmt w:val="bullet"/>
+      <w:lvlText w:val=""/>
+      <w:lvlJc w:val="left"/>
+      <w:pPr>
+        <w:ind w:left="720" w:hanging="360"/>
+      </w:pPr>
+      <w:rPr>
+        <w:rFonts w:ascii="Wingdings" w:hAnsi="Wingdings" w:hint="default"/>
+      </w:rPr>
+    </w:lvl>
+    <w:lvl w:ilvl="1" w:tplc="04090005">
+      <w:start w:val="1"/>
+      <w:numFmt w:val="bullet"/>
+      <w:lvlText w:val=""/>
+      <w:lvlJc w:val="left"/>
+      <w:pPr>
+        <w:ind w:left="720" w:hanging="360"/>
+      </w:pPr>
+      <w:rPr>
+        <w:rFonts w:ascii="Wingdings" w:hAnsi="Wingdings" w:hint="default"/>
+      </w:rPr>
+    </w:lvl>
+    <w:lvl w:ilvl="2" w:tplc="FFFFFFFF" w:tentative="1">
+      <w:start w:val="1"/>
+      <w:numFmt w:val="bullet"/>
+      <w:lvlText w:val=""/>
+      <w:lvlJc w:val="left"/>
+      <w:pPr>
+        <w:ind w:left="2160" w:hanging="360"/>
+      </w:pPr>
+      <w:rPr>
+        <w:rFonts w:ascii="Wingdings" w:hAnsi="Wingdings" w:hint="default"/>
+      </w:rPr>
+    </w:lvl>
+    <w:lvl w:ilvl="3" w:tplc="FFFFFFFF" w:tentative="1">
+      <w:start w:val="1"/>
+      <w:numFmt w:val="bullet"/>
+      <w:lvlText w:val=""/>
+      <w:lvlJc w:val="left"/>
+      <w:pPr>
+        <w:ind w:left="2880" w:hanging="360"/>
+      </w:pPr>
+      <w:rPr>
+        <w:rFonts w:ascii="Symbol" w:hAnsi="Symbol" w:hint="default"/>
+      </w:rPr>
+    </w:lvl>
+    <w:lvl w:ilvl="4" w:tplc="FFFFFFFF" w:tentative="1">
+      <w:start w:val="1"/>
+      <w:numFmt w:val="bullet"/>
+      <w:lvlText w:val="o"/>
+      <w:lvlJc w:val="left"/>
+      <w:pPr>
+        <w:ind w:left="3600" w:hanging="360"/>
+      </w:pPr>
+      <w:rPr>
+        <w:rFonts w:ascii="Courier New" w:hAnsi="Courier New" w:cs="Courier New" w:hint="default"/>
+      </w:rPr>
+    </w:lvl>
+    <w:lvl w:ilvl="5" w:tplc="FFFFFFFF" w:tentative="1">
+      <w:start w:val="1"/>
+      <w:numFmt w:val="bullet"/>
+      <w:lvlText w:val=""/>
+      <w:lvlJc w:val="left"/>
+      <w:pPr>
+        <w:ind w:left="4320" w:hanging="360"/>
+      </w:pPr>
+      <w:rPr>
+        <w:rFonts w:ascii="Wingdings" w:hAnsi="Wingdings" w:hint="default"/>
+      </w:rPr>
+    </w:lvl>
+    <w:lvl w:ilvl="6" w:tplc="FFFFFFFF" w:tentative="1">
+      <w:start w:val="1"/>
+      <w:numFmt w:val="bullet"/>
+      <w:lvlText w:val=""/>
+      <w:lvlJc w:val="left"/>
+      <w:pPr>
+        <w:ind w:left="5040" w:hanging="360"/>
+      </w:pPr>
+      <w:rPr>
+        <w:rFonts w:ascii="Symbol" w:hAnsi="Symbol" w:hint="default"/>
+      </w:rPr>
+    </w:lvl>
+    <w:lvl w:ilvl="7" w:tplc="FFFFFFFF" w:tentative="1">
+      <w:start w:val="1"/>
+      <w:numFmt w:val="bullet"/>
+      <w:lvlText w:val="o"/>
+      <w:lvlJc w:val="left"/>
+      <w:pPr>
+        <w:ind w:left="5760" w:hanging="360"/>
+      </w:pPr>
+      <w:rPr>
+        <w:rFonts w:ascii="Courier New" w:hAnsi="Courier New" w:cs="Courier New" w:hint="default"/>
+      </w:rPr>
+    </w:lvl>
+    <w:lvl w:ilvl="8" w:tplc="FFFFFFFF" w:tentative="1">
+      <w:start w:val="1"/>
+      <w:numFmt w:val="bullet"/>
+      <w:lvlText w:val=""/>
+      <w:lvlJc w:val="left"/>
+      <w:pPr>
+        <w:ind w:left="6480" w:hanging="360"/>
+      </w:pPr>
+      <w:rPr>
+        <w:rFonts w:ascii="Wingdings" w:hAnsi="Wingdings" w:hint="default"/>
+      </w:rPr>
+    </w:lvl>
+  </w:abstractNum>
+  <w:abstractNum w:abstractNumId="47" w15:restartNumberingAfterBreak="0">
     <w:nsid w:val="243D731E"/>
     <w:multiLevelType w:val="multilevel"/>
     <w:tmpl w:val="51303158"/>
@@ -26538,7 +27572,7 @@
       </w:rPr>
     </w:lvl>
   </w:abstractNum>
-  <w:abstractNum w:abstractNumId="47" w15:restartNumberingAfterBreak="0">
+  <w:abstractNum w:abstractNumId="48" w15:restartNumberingAfterBreak="0">
     <w:nsid w:val="253A4FEB"/>
     <w:multiLevelType w:val="hybridMultilevel"/>
     <w:tmpl w:val="5628BED4"/>
@@ -26651,7 +27685,7 @@
       </w:rPr>
     </w:lvl>
   </w:abstractNum>
-  <w:abstractNum w:abstractNumId="48" w15:restartNumberingAfterBreak="0">
+  <w:abstractNum w:abstractNumId="49" w15:restartNumberingAfterBreak="0">
     <w:nsid w:val="26BA6D3C"/>
     <w:multiLevelType w:val="hybridMultilevel"/>
     <w:tmpl w:val="F03CC954"/>
@@ -26763,7 +27797,7 @@
       </w:rPr>
     </w:lvl>
   </w:abstractNum>
-  <w:abstractNum w:abstractNumId="49" w15:restartNumberingAfterBreak="0">
+  <w:abstractNum w:abstractNumId="50" w15:restartNumberingAfterBreak="0">
     <w:nsid w:val="28765EA3"/>
     <w:multiLevelType w:val="hybridMultilevel"/>
     <w:tmpl w:val="1CFAEB30"/>
@@ -26876,7 +27910,7 @@
       </w:rPr>
     </w:lvl>
   </w:abstractNum>
-  <w:abstractNum w:abstractNumId="50" w15:restartNumberingAfterBreak="0">
+  <w:abstractNum w:abstractNumId="51" w15:restartNumberingAfterBreak="0">
     <w:nsid w:val="28940045"/>
     <w:multiLevelType w:val="multilevel"/>
     <w:tmpl w:val="23DE4804"/>
@@ -27025,7 +28059,7 @@
       </w:rPr>
     </w:lvl>
   </w:abstractNum>
-  <w:abstractNum w:abstractNumId="51" w15:restartNumberingAfterBreak="0">
+  <w:abstractNum w:abstractNumId="52" w15:restartNumberingAfterBreak="0">
     <w:nsid w:val="289938CC"/>
     <w:multiLevelType w:val="multilevel"/>
     <w:tmpl w:val="57745EE2"/>
@@ -27174,7 +28208,7 @@
       </w:rPr>
     </w:lvl>
   </w:abstractNum>
-  <w:abstractNum w:abstractNumId="52" w15:restartNumberingAfterBreak="0">
+  <w:abstractNum w:abstractNumId="53" w15:restartNumberingAfterBreak="0">
     <w:nsid w:val="292C31F9"/>
     <w:multiLevelType w:val="hybridMultilevel"/>
     <w:tmpl w:val="D47AD9FC"/>
@@ -27287,7 +28321,7 @@
       </w:rPr>
     </w:lvl>
   </w:abstractNum>
-  <w:abstractNum w:abstractNumId="53" w15:restartNumberingAfterBreak="0">
+  <w:abstractNum w:abstractNumId="54" w15:restartNumberingAfterBreak="0">
     <w:nsid w:val="2ADE3401"/>
     <w:multiLevelType w:val="multilevel"/>
     <w:tmpl w:val="63F4E6F0"/>
@@ -27436,7 +28470,7 @@
       </w:rPr>
     </w:lvl>
   </w:abstractNum>
-  <w:abstractNum w:abstractNumId="54" w15:restartNumberingAfterBreak="0">
+  <w:abstractNum w:abstractNumId="55" w15:restartNumberingAfterBreak="0">
     <w:nsid w:val="2B592B9C"/>
     <w:multiLevelType w:val="hybridMultilevel"/>
     <w:tmpl w:val="99D4C34E"/>
@@ -27549,7 +28583,120 @@
       </w:rPr>
     </w:lvl>
   </w:abstractNum>
-  <w:abstractNum w:abstractNumId="55" w15:restartNumberingAfterBreak="0">
+  <w:abstractNum w:abstractNumId="56" w15:restartNumberingAfterBreak="0">
+    <w:nsid w:val="2B825A4E"/>
+    <w:multiLevelType w:val="hybridMultilevel"/>
+    <w:tmpl w:val="14E26954"/>
+    <w:lvl w:ilvl="0" w:tplc="FFFFFFFF">
+      <w:start w:val="1"/>
+      <w:numFmt w:val="bullet"/>
+      <w:lvlText w:val=""/>
+      <w:lvlJc w:val="left"/>
+      <w:pPr>
+        <w:ind w:left="720" w:hanging="360"/>
+      </w:pPr>
+      <w:rPr>
+        <w:rFonts w:ascii="Wingdings" w:hAnsi="Wingdings" w:hint="default"/>
+      </w:rPr>
+    </w:lvl>
+    <w:lvl w:ilvl="1" w:tplc="04090005">
+      <w:start w:val="1"/>
+      <w:numFmt w:val="bullet"/>
+      <w:lvlText w:val=""/>
+      <w:lvlJc w:val="left"/>
+      <w:pPr>
+        <w:ind w:left="720" w:hanging="360"/>
+      </w:pPr>
+      <w:rPr>
+        <w:rFonts w:ascii="Wingdings" w:hAnsi="Wingdings" w:hint="default"/>
+      </w:rPr>
+    </w:lvl>
+    <w:lvl w:ilvl="2" w:tplc="FFFFFFFF" w:tentative="1">
+      <w:start w:val="1"/>
+      <w:numFmt w:val="bullet"/>
+      <w:lvlText w:val=""/>
+      <w:lvlJc w:val="left"/>
+      <w:pPr>
+        <w:ind w:left="2160" w:hanging="360"/>
+      </w:pPr>
+      <w:rPr>
+        <w:rFonts w:ascii="Wingdings" w:hAnsi="Wingdings" w:hint="default"/>
+      </w:rPr>
+    </w:lvl>
+    <w:lvl w:ilvl="3" w:tplc="FFFFFFFF" w:tentative="1">
+      <w:start w:val="1"/>
+      <w:numFmt w:val="bullet"/>
+      <w:lvlText w:val=""/>
+      <w:lvlJc w:val="left"/>
+      <w:pPr>
+        <w:ind w:left="2880" w:hanging="360"/>
+      </w:pPr>
+      <w:rPr>
+        <w:rFonts w:ascii="Symbol" w:hAnsi="Symbol" w:hint="default"/>
+      </w:rPr>
+    </w:lvl>
+    <w:lvl w:ilvl="4" w:tplc="FFFFFFFF" w:tentative="1">
+      <w:start w:val="1"/>
+      <w:numFmt w:val="bullet"/>
+      <w:lvlText w:val="o"/>
+      <w:lvlJc w:val="left"/>
+      <w:pPr>
+        <w:ind w:left="3600" w:hanging="360"/>
+      </w:pPr>
+      <w:rPr>
+        <w:rFonts w:ascii="Courier New" w:hAnsi="Courier New" w:cs="Courier New" w:hint="default"/>
+      </w:rPr>
+    </w:lvl>
+    <w:lvl w:ilvl="5" w:tplc="FFFFFFFF" w:tentative="1">
+      <w:start w:val="1"/>
+      <w:numFmt w:val="bullet"/>
+      <w:lvlText w:val=""/>
+      <w:lvlJc w:val="left"/>
+      <w:pPr>
+        <w:ind w:left="4320" w:hanging="360"/>
+      </w:pPr>
+      <w:rPr>
+        <w:rFonts w:ascii="Wingdings" w:hAnsi="Wingdings" w:hint="default"/>
+      </w:rPr>
+    </w:lvl>
+    <w:lvl w:ilvl="6" w:tplc="FFFFFFFF" w:tentative="1">
+      <w:start w:val="1"/>
+      <w:numFmt w:val="bullet"/>
+      <w:lvlText w:val=""/>
+      <w:lvlJc w:val="left"/>
+      <w:pPr>
+        <w:ind w:left="5040" w:hanging="360"/>
+      </w:pPr>
+      <w:rPr>
+        <w:rFonts w:ascii="Symbol" w:hAnsi="Symbol" w:hint="default"/>
+      </w:rPr>
+    </w:lvl>
+    <w:lvl w:ilvl="7" w:tplc="FFFFFFFF" w:tentative="1">
+      <w:start w:val="1"/>
+      <w:numFmt w:val="bullet"/>
+      <w:lvlText w:val="o"/>
+      <w:lvlJc w:val="left"/>
+      <w:pPr>
+        <w:ind w:left="5760" w:hanging="360"/>
+      </w:pPr>
+      <w:rPr>
+        <w:rFonts w:ascii="Courier New" w:hAnsi="Courier New" w:cs="Courier New" w:hint="default"/>
+      </w:rPr>
+    </w:lvl>
+    <w:lvl w:ilvl="8" w:tplc="FFFFFFFF" w:tentative="1">
+      <w:start w:val="1"/>
+      <w:numFmt w:val="bullet"/>
+      <w:lvlText w:val=""/>
+      <w:lvlJc w:val="left"/>
+      <w:pPr>
+        <w:ind w:left="6480" w:hanging="360"/>
+      </w:pPr>
+      <w:rPr>
+        <w:rFonts w:ascii="Wingdings" w:hAnsi="Wingdings" w:hint="default"/>
+      </w:rPr>
+    </w:lvl>
+  </w:abstractNum>
+  <w:abstractNum w:abstractNumId="57" w15:restartNumberingAfterBreak="0">
     <w:nsid w:val="2B9413C9"/>
     <w:multiLevelType w:val="hybridMultilevel"/>
     <w:tmpl w:val="4F7A7546"/>
@@ -27661,7 +28808,7 @@
       </w:rPr>
     </w:lvl>
   </w:abstractNum>
-  <w:abstractNum w:abstractNumId="56" w15:restartNumberingAfterBreak="0">
+  <w:abstractNum w:abstractNumId="58" w15:restartNumberingAfterBreak="0">
     <w:nsid w:val="2B9539E3"/>
     <w:multiLevelType w:val="hybridMultilevel"/>
     <w:tmpl w:val="E6B8BBB6"/>
@@ -27773,7 +28920,7 @@
       </w:rPr>
     </w:lvl>
   </w:abstractNum>
-  <w:abstractNum w:abstractNumId="57" w15:restartNumberingAfterBreak="0">
+  <w:abstractNum w:abstractNumId="59" w15:restartNumberingAfterBreak="0">
     <w:nsid w:val="2C0B4D57"/>
     <w:multiLevelType w:val="hybridMultilevel"/>
     <w:tmpl w:val="7DDCD954"/>
@@ -27886,7 +29033,7 @@
       </w:rPr>
     </w:lvl>
   </w:abstractNum>
-  <w:abstractNum w:abstractNumId="58" w15:restartNumberingAfterBreak="0">
+  <w:abstractNum w:abstractNumId="60" w15:restartNumberingAfterBreak="0">
     <w:nsid w:val="2E164C9A"/>
     <w:multiLevelType w:val="hybridMultilevel"/>
     <w:tmpl w:val="C6BA489A"/>
@@ -27999,7 +29146,7 @@
       </w:rPr>
     </w:lvl>
   </w:abstractNum>
-  <w:abstractNum w:abstractNumId="59" w15:restartNumberingAfterBreak="0">
+  <w:abstractNum w:abstractNumId="61" w15:restartNumberingAfterBreak="0">
     <w:nsid w:val="2E34438D"/>
     <w:multiLevelType w:val="multilevel"/>
     <w:tmpl w:val="63F4E6F0"/>
@@ -28148,7 +29295,7 @@
       </w:rPr>
     </w:lvl>
   </w:abstractNum>
-  <w:abstractNum w:abstractNumId="60" w15:restartNumberingAfterBreak="0">
+  <w:abstractNum w:abstractNumId="62" w15:restartNumberingAfterBreak="0">
     <w:nsid w:val="2E5D6D2A"/>
     <w:multiLevelType w:val="hybridMultilevel"/>
     <w:tmpl w:val="5D5ADC98"/>
@@ -28261,7 +29408,7 @@
       </w:rPr>
     </w:lvl>
   </w:abstractNum>
-  <w:abstractNum w:abstractNumId="61" w15:restartNumberingAfterBreak="0">
+  <w:abstractNum w:abstractNumId="63" w15:restartNumberingAfterBreak="0">
     <w:nsid w:val="2E716C12"/>
     <w:multiLevelType w:val="hybridMultilevel"/>
     <w:tmpl w:val="6D90C552"/>
@@ -28374,7 +29521,7 @@
       </w:rPr>
     </w:lvl>
   </w:abstractNum>
-  <w:abstractNum w:abstractNumId="62" w15:restartNumberingAfterBreak="0">
+  <w:abstractNum w:abstractNumId="64" w15:restartNumberingAfterBreak="0">
     <w:nsid w:val="2F162517"/>
     <w:multiLevelType w:val="hybridMultilevel"/>
     <w:tmpl w:val="4E3CAB7C"/>
@@ -28486,7 +29633,7 @@
       </w:rPr>
     </w:lvl>
   </w:abstractNum>
-  <w:abstractNum w:abstractNumId="63" w15:restartNumberingAfterBreak="0">
+  <w:abstractNum w:abstractNumId="65" w15:restartNumberingAfterBreak="0">
     <w:nsid w:val="2F1F6483"/>
     <w:multiLevelType w:val="multilevel"/>
     <w:tmpl w:val="993E874E"/>
@@ -28635,7 +29782,7 @@
       </w:rPr>
     </w:lvl>
   </w:abstractNum>
-  <w:abstractNum w:abstractNumId="64" w15:restartNumberingAfterBreak="0">
+  <w:abstractNum w:abstractNumId="66" w15:restartNumberingAfterBreak="0">
     <w:nsid w:val="2F2B2F8E"/>
     <w:multiLevelType w:val="multilevel"/>
     <w:tmpl w:val="547EDCFE"/>
@@ -28784,7 +29931,96 @@
       </w:rPr>
     </w:lvl>
   </w:abstractNum>
-  <w:abstractNum w:abstractNumId="65" w15:restartNumberingAfterBreak="0">
+  <w:abstractNum w:abstractNumId="67" w15:restartNumberingAfterBreak="0">
+    <w:nsid w:val="2F5100F0"/>
+    <w:multiLevelType w:val="hybridMultilevel"/>
+    <w:tmpl w:val="75D86E48"/>
+    <w:lvl w:ilvl="0" w:tplc="0409000F">
+      <w:start w:val="1"/>
+      <w:numFmt w:val="decimal"/>
+      <w:lvlText w:val="%1."/>
+      <w:lvlJc w:val="left"/>
+      <w:pPr>
+        <w:ind w:left="720" w:hanging="360"/>
+      </w:pPr>
+      <w:rPr>
+        <w:rFonts w:hint="default"/>
+      </w:rPr>
+    </w:lvl>
+    <w:lvl w:ilvl="1" w:tplc="04090019" w:tentative="1">
+      <w:start w:val="1"/>
+      <w:numFmt w:val="lowerLetter"/>
+      <w:lvlText w:val="%2."/>
+      <w:lvlJc w:val="left"/>
+      <w:pPr>
+        <w:ind w:left="1440" w:hanging="360"/>
+      </w:pPr>
+    </w:lvl>
+    <w:lvl w:ilvl="2" w:tplc="0409001B" w:tentative="1">
+      <w:start w:val="1"/>
+      <w:numFmt w:val="lowerRoman"/>
+      <w:lvlText w:val="%3."/>
+      <w:lvlJc w:val="right"/>
+      <w:pPr>
+        <w:ind w:left="2160" w:hanging="180"/>
+      </w:pPr>
+    </w:lvl>
+    <w:lvl w:ilvl="3" w:tplc="0409000F" w:tentative="1">
+      <w:start w:val="1"/>
+      <w:numFmt w:val="decimal"/>
+      <w:lvlText w:val="%4."/>
+      <w:lvlJc w:val="left"/>
+      <w:pPr>
+        <w:ind w:left="2880" w:hanging="360"/>
+      </w:pPr>
+    </w:lvl>
+    <w:lvl w:ilvl="4" w:tplc="04090019" w:tentative="1">
+      <w:start w:val="1"/>
+      <w:numFmt w:val="lowerLetter"/>
+      <w:lvlText w:val="%5."/>
+      <w:lvlJc w:val="left"/>
+      <w:pPr>
+        <w:ind w:left="3600" w:hanging="360"/>
+      </w:pPr>
+    </w:lvl>
+    <w:lvl w:ilvl="5" w:tplc="0409001B" w:tentative="1">
+      <w:start w:val="1"/>
+      <w:numFmt w:val="lowerRoman"/>
+      <w:lvlText w:val="%6."/>
+      <w:lvlJc w:val="right"/>
+      <w:pPr>
+        <w:ind w:left="4320" w:hanging="180"/>
+      </w:pPr>
+    </w:lvl>
+    <w:lvl w:ilvl="6" w:tplc="0409000F" w:tentative="1">
+      <w:start w:val="1"/>
+      <w:numFmt w:val="decimal"/>
+      <w:lvlText w:val="%7."/>
+      <w:lvlJc w:val="left"/>
+      <w:pPr>
+        <w:ind w:left="5040" w:hanging="360"/>
+      </w:pPr>
+    </w:lvl>
+    <w:lvl w:ilvl="7" w:tplc="04090019" w:tentative="1">
+      <w:start w:val="1"/>
+      <w:numFmt w:val="lowerLetter"/>
+      <w:lvlText w:val="%8."/>
+      <w:lvlJc w:val="left"/>
+      <w:pPr>
+        <w:ind w:left="5760" w:hanging="360"/>
+      </w:pPr>
+    </w:lvl>
+    <w:lvl w:ilvl="8" w:tplc="0409001B" w:tentative="1">
+      <w:start w:val="1"/>
+      <w:numFmt w:val="lowerRoman"/>
+      <w:lvlText w:val="%9."/>
+      <w:lvlJc w:val="right"/>
+      <w:pPr>
+        <w:ind w:left="6480" w:hanging="180"/>
+      </w:pPr>
+    </w:lvl>
+  </w:abstractNum>
+  <w:abstractNum w:abstractNumId="68" w15:restartNumberingAfterBreak="0">
     <w:nsid w:val="2FD06CBE"/>
     <w:multiLevelType w:val="hybridMultilevel"/>
     <w:tmpl w:val="95C8AABC"/>
@@ -28873,7 +30109,7 @@
       </w:pPr>
     </w:lvl>
   </w:abstractNum>
-  <w:abstractNum w:abstractNumId="66" w15:restartNumberingAfterBreak="0">
+  <w:abstractNum w:abstractNumId="69" w15:restartNumberingAfterBreak="0">
     <w:nsid w:val="2FF161E6"/>
     <w:multiLevelType w:val="hybridMultilevel"/>
     <w:tmpl w:val="ED6AA478"/>
@@ -28985,7 +30221,7 @@
       </w:rPr>
     </w:lvl>
   </w:abstractNum>
-  <w:abstractNum w:abstractNumId="67" w15:restartNumberingAfterBreak="0">
+  <w:abstractNum w:abstractNumId="70" w15:restartNumberingAfterBreak="0">
     <w:nsid w:val="303363CB"/>
     <w:multiLevelType w:val="hybridMultilevel"/>
     <w:tmpl w:val="61682AE0"/>
@@ -29071,7 +30307,7 @@
       </w:pPr>
     </w:lvl>
   </w:abstractNum>
-  <w:abstractNum w:abstractNumId="68" w15:restartNumberingAfterBreak="0">
+  <w:abstractNum w:abstractNumId="71" w15:restartNumberingAfterBreak="0">
     <w:nsid w:val="30CD5DF3"/>
     <w:multiLevelType w:val="hybridMultilevel"/>
     <w:tmpl w:val="127EBD02"/>
@@ -29183,7 +30419,7 @@
       </w:rPr>
     </w:lvl>
   </w:abstractNum>
-  <w:abstractNum w:abstractNumId="69" w15:restartNumberingAfterBreak="0">
+  <w:abstractNum w:abstractNumId="72" w15:restartNumberingAfterBreak="0">
     <w:nsid w:val="31A24DDF"/>
     <w:multiLevelType w:val="multilevel"/>
     <w:tmpl w:val="63F4E6F0"/>
@@ -29332,7 +30568,7 @@
       </w:rPr>
     </w:lvl>
   </w:abstractNum>
-  <w:abstractNum w:abstractNumId="70" w15:restartNumberingAfterBreak="0">
+  <w:abstractNum w:abstractNumId="73" w15:restartNumberingAfterBreak="0">
     <w:nsid w:val="321E65E6"/>
     <w:multiLevelType w:val="multilevel"/>
     <w:tmpl w:val="63F4E6F0"/>
@@ -29481,7 +30717,7 @@
       </w:rPr>
     </w:lvl>
   </w:abstractNum>
-  <w:abstractNum w:abstractNumId="71" w15:restartNumberingAfterBreak="0">
+  <w:abstractNum w:abstractNumId="74" w15:restartNumberingAfterBreak="0">
     <w:nsid w:val="332E29E8"/>
     <w:multiLevelType w:val="multilevel"/>
     <w:tmpl w:val="BF082128"/>
@@ -29630,7 +30866,120 @@
       </w:rPr>
     </w:lvl>
   </w:abstractNum>
-  <w:abstractNum w:abstractNumId="72" w15:restartNumberingAfterBreak="0">
+  <w:abstractNum w:abstractNumId="75" w15:restartNumberingAfterBreak="0">
+    <w:nsid w:val="33853DFA"/>
+    <w:multiLevelType w:val="hybridMultilevel"/>
+    <w:tmpl w:val="A32A0E42"/>
+    <w:lvl w:ilvl="0" w:tplc="04090005">
+      <w:start w:val="1"/>
+      <w:numFmt w:val="bullet"/>
+      <w:lvlText w:val=""/>
+      <w:lvlJc w:val="left"/>
+      <w:pPr>
+        <w:ind w:left="720" w:hanging="360"/>
+      </w:pPr>
+      <w:rPr>
+        <w:rFonts w:ascii="Wingdings" w:hAnsi="Wingdings" w:hint="default"/>
+      </w:rPr>
+    </w:lvl>
+    <w:lvl w:ilvl="1" w:tplc="04090003">
+      <w:start w:val="1"/>
+      <w:numFmt w:val="bullet"/>
+      <w:lvlText w:val="o"/>
+      <w:lvlJc w:val="left"/>
+      <w:pPr>
+        <w:ind w:left="1440" w:hanging="360"/>
+      </w:pPr>
+      <w:rPr>
+        <w:rFonts w:ascii="Courier New" w:hAnsi="Courier New" w:cs="Courier New" w:hint="default"/>
+      </w:rPr>
+    </w:lvl>
+    <w:lvl w:ilvl="2" w:tplc="04090005" w:tentative="1">
+      <w:start w:val="1"/>
+      <w:numFmt w:val="bullet"/>
+      <w:lvlText w:val=""/>
+      <w:lvlJc w:val="left"/>
+      <w:pPr>
+        <w:ind w:left="2160" w:hanging="360"/>
+      </w:pPr>
+      <w:rPr>
+        <w:rFonts w:ascii="Wingdings" w:hAnsi="Wingdings" w:hint="default"/>
+      </w:rPr>
+    </w:lvl>
+    <w:lvl w:ilvl="3" w:tplc="04090001" w:tentative="1">
+      <w:start w:val="1"/>
+      <w:numFmt w:val="bullet"/>
+      <w:lvlText w:val=""/>
+      <w:lvlJc w:val="left"/>
+      <w:pPr>
+        <w:ind w:left="2880" w:hanging="360"/>
+      </w:pPr>
+      <w:rPr>
+        <w:rFonts w:ascii="Symbol" w:hAnsi="Symbol" w:hint="default"/>
+      </w:rPr>
+    </w:lvl>
+    <w:lvl w:ilvl="4" w:tplc="04090003" w:tentative="1">
+      <w:start w:val="1"/>
+      <w:numFmt w:val="bullet"/>
+      <w:lvlText w:val="o"/>
+      <w:lvlJc w:val="left"/>
+      <w:pPr>
+        <w:ind w:left="3600" w:hanging="360"/>
+      </w:pPr>
+      <w:rPr>
+        <w:rFonts w:ascii="Courier New" w:hAnsi="Courier New" w:cs="Courier New" w:hint="default"/>
+      </w:rPr>
+    </w:lvl>
+    <w:lvl w:ilvl="5" w:tplc="04090005" w:tentative="1">
+      <w:start w:val="1"/>
+      <w:numFmt w:val="bullet"/>
+      <w:lvlText w:val=""/>
+      <w:lvlJc w:val="left"/>
+      <w:pPr>
+        <w:ind w:left="4320" w:hanging="360"/>
+      </w:pPr>
+      <w:rPr>
+        <w:rFonts w:ascii="Wingdings" w:hAnsi="Wingdings" w:hint="default"/>
+      </w:rPr>
+    </w:lvl>
+    <w:lvl w:ilvl="6" w:tplc="04090001" w:tentative="1">
+      <w:start w:val="1"/>
+      <w:numFmt w:val="bullet"/>
+      <w:lvlText w:val=""/>
+      <w:lvlJc w:val="left"/>
+      <w:pPr>
+        <w:ind w:left="5040" w:hanging="360"/>
+      </w:pPr>
+      <w:rPr>
+        <w:rFonts w:ascii="Symbol" w:hAnsi="Symbol" w:hint="default"/>
+      </w:rPr>
+    </w:lvl>
+    <w:lvl w:ilvl="7" w:tplc="04090003" w:tentative="1">
+      <w:start w:val="1"/>
+      <w:numFmt w:val="bullet"/>
+      <w:lvlText w:val="o"/>
+      <w:lvlJc w:val="left"/>
+      <w:pPr>
+        <w:ind w:left="5760" w:hanging="360"/>
+      </w:pPr>
+      <w:rPr>
+        <w:rFonts w:ascii="Courier New" w:hAnsi="Courier New" w:cs="Courier New" w:hint="default"/>
+      </w:rPr>
+    </w:lvl>
+    <w:lvl w:ilvl="8" w:tplc="04090005" w:tentative="1">
+      <w:start w:val="1"/>
+      <w:numFmt w:val="bullet"/>
+      <w:lvlText w:val=""/>
+      <w:lvlJc w:val="left"/>
+      <w:pPr>
+        <w:ind w:left="6480" w:hanging="360"/>
+      </w:pPr>
+      <w:rPr>
+        <w:rFonts w:ascii="Wingdings" w:hAnsi="Wingdings" w:hint="default"/>
+      </w:rPr>
+    </w:lvl>
+  </w:abstractNum>
+  <w:abstractNum w:abstractNumId="76" w15:restartNumberingAfterBreak="0">
     <w:nsid w:val="34044AA9"/>
     <w:multiLevelType w:val="hybridMultilevel"/>
     <w:tmpl w:val="E47ADD78"/>
@@ -29716,7 +31065,7 @@
       </w:pPr>
     </w:lvl>
   </w:abstractNum>
-  <w:abstractNum w:abstractNumId="73" w15:restartNumberingAfterBreak="0">
+  <w:abstractNum w:abstractNumId="77" w15:restartNumberingAfterBreak="0">
     <w:nsid w:val="34251C5D"/>
     <w:multiLevelType w:val="multilevel"/>
     <w:tmpl w:val="C31CBCE0"/>
@@ -29865,7 +31214,7 @@
       </w:rPr>
     </w:lvl>
   </w:abstractNum>
-  <w:abstractNum w:abstractNumId="74" w15:restartNumberingAfterBreak="0">
+  <w:abstractNum w:abstractNumId="78" w15:restartNumberingAfterBreak="0">
     <w:nsid w:val="342A6150"/>
     <w:multiLevelType w:val="multilevel"/>
     <w:tmpl w:val="29E0BE1C"/>
@@ -30014,7 +31363,7 @@
       </w:rPr>
     </w:lvl>
   </w:abstractNum>
-  <w:abstractNum w:abstractNumId="75" w15:restartNumberingAfterBreak="0">
+  <w:abstractNum w:abstractNumId="79" w15:restartNumberingAfterBreak="0">
     <w:nsid w:val="356F220A"/>
     <w:multiLevelType w:val="multilevel"/>
     <w:tmpl w:val="0FFA5254"/>
@@ -30163,7 +31512,7 @@
       </w:rPr>
     </w:lvl>
   </w:abstractNum>
-  <w:abstractNum w:abstractNumId="76" w15:restartNumberingAfterBreak="0">
+  <w:abstractNum w:abstractNumId="80" w15:restartNumberingAfterBreak="0">
     <w:nsid w:val="357B7363"/>
     <w:multiLevelType w:val="hybridMultilevel"/>
     <w:tmpl w:val="00D411EC"/>
@@ -30275,7 +31624,7 @@
       </w:rPr>
     </w:lvl>
   </w:abstractNum>
-  <w:abstractNum w:abstractNumId="77" w15:restartNumberingAfterBreak="0">
+  <w:abstractNum w:abstractNumId="81" w15:restartNumberingAfterBreak="0">
     <w:nsid w:val="3583100F"/>
     <w:multiLevelType w:val="hybridMultilevel"/>
     <w:tmpl w:val="848ECFAA"/>
@@ -30388,7 +31737,7 @@
       </w:rPr>
     </w:lvl>
   </w:abstractNum>
-  <w:abstractNum w:abstractNumId="78" w15:restartNumberingAfterBreak="0">
+  <w:abstractNum w:abstractNumId="82" w15:restartNumberingAfterBreak="0">
     <w:nsid w:val="3623194A"/>
     <w:multiLevelType w:val="multilevel"/>
     <w:tmpl w:val="63F4E6F0"/>
@@ -30537,7 +31886,7 @@
       </w:rPr>
     </w:lvl>
   </w:abstractNum>
-  <w:abstractNum w:abstractNumId="79" w15:restartNumberingAfterBreak="0">
+  <w:abstractNum w:abstractNumId="83" w15:restartNumberingAfterBreak="0">
     <w:nsid w:val="363D1214"/>
     <w:multiLevelType w:val="hybridMultilevel"/>
     <w:tmpl w:val="6032DE12"/>
@@ -30650,7 +31999,7 @@
       </w:rPr>
     </w:lvl>
   </w:abstractNum>
-  <w:abstractNum w:abstractNumId="80" w15:restartNumberingAfterBreak="0">
+  <w:abstractNum w:abstractNumId="84" w15:restartNumberingAfterBreak="0">
     <w:nsid w:val="36AD3FB0"/>
     <w:multiLevelType w:val="multilevel"/>
     <w:tmpl w:val="0644AEEA"/>
@@ -30799,7 +32148,7 @@
       </w:rPr>
     </w:lvl>
   </w:abstractNum>
-  <w:abstractNum w:abstractNumId="81" w15:restartNumberingAfterBreak="0">
+  <w:abstractNum w:abstractNumId="85" w15:restartNumberingAfterBreak="0">
     <w:nsid w:val="371A2CDE"/>
     <w:multiLevelType w:val="hybridMultilevel"/>
     <w:tmpl w:val="EA9C00CC"/>
@@ -30911,7 +32260,7 @@
       </w:rPr>
     </w:lvl>
   </w:abstractNum>
-  <w:abstractNum w:abstractNumId="82" w15:restartNumberingAfterBreak="0">
+  <w:abstractNum w:abstractNumId="86" w15:restartNumberingAfterBreak="0">
     <w:nsid w:val="373D5E48"/>
     <w:multiLevelType w:val="hybridMultilevel"/>
     <w:tmpl w:val="8A6E38C0"/>
@@ -31024,7 +32373,7 @@
       </w:rPr>
     </w:lvl>
   </w:abstractNum>
-  <w:abstractNum w:abstractNumId="83" w15:restartNumberingAfterBreak="0">
+  <w:abstractNum w:abstractNumId="87" w15:restartNumberingAfterBreak="0">
     <w:nsid w:val="37864C4E"/>
     <w:multiLevelType w:val="hybridMultilevel"/>
     <w:tmpl w:val="02EEC1AA"/>
@@ -31110,7 +32459,7 @@
       </w:pPr>
     </w:lvl>
   </w:abstractNum>
-  <w:abstractNum w:abstractNumId="84" w15:restartNumberingAfterBreak="0">
+  <w:abstractNum w:abstractNumId="88" w15:restartNumberingAfterBreak="0">
     <w:nsid w:val="3B446B2D"/>
     <w:multiLevelType w:val="hybridMultilevel"/>
     <w:tmpl w:val="B638176E"/>
@@ -31222,7 +32571,7 @@
       </w:rPr>
     </w:lvl>
   </w:abstractNum>
-  <w:abstractNum w:abstractNumId="85" w15:restartNumberingAfterBreak="0">
+  <w:abstractNum w:abstractNumId="89" w15:restartNumberingAfterBreak="0">
     <w:nsid w:val="3B6B41F5"/>
     <w:multiLevelType w:val="hybridMultilevel"/>
     <w:tmpl w:val="10A26168"/>
@@ -31334,7 +32683,7 @@
       </w:rPr>
     </w:lvl>
   </w:abstractNum>
-  <w:abstractNum w:abstractNumId="86" w15:restartNumberingAfterBreak="0">
+  <w:abstractNum w:abstractNumId="90" w15:restartNumberingAfterBreak="0">
     <w:nsid w:val="3C5546BA"/>
     <w:multiLevelType w:val="hybridMultilevel"/>
     <w:tmpl w:val="3434F5E4"/>
@@ -31446,7 +32795,7 @@
       </w:rPr>
     </w:lvl>
   </w:abstractNum>
-  <w:abstractNum w:abstractNumId="87" w15:restartNumberingAfterBreak="0">
+  <w:abstractNum w:abstractNumId="91" w15:restartNumberingAfterBreak="0">
     <w:nsid w:val="3C623C55"/>
     <w:multiLevelType w:val="multilevel"/>
     <w:tmpl w:val="A0B0E8F4"/>
@@ -31595,7 +32944,7 @@
       </w:rPr>
     </w:lvl>
   </w:abstractNum>
-  <w:abstractNum w:abstractNumId="88" w15:restartNumberingAfterBreak="0">
+  <w:abstractNum w:abstractNumId="92" w15:restartNumberingAfterBreak="0">
     <w:nsid w:val="3CB359E6"/>
     <w:multiLevelType w:val="hybridMultilevel"/>
     <w:tmpl w:val="368E6E8E"/>
@@ -31708,7 +33057,7 @@
       </w:rPr>
     </w:lvl>
   </w:abstractNum>
-  <w:abstractNum w:abstractNumId="89" w15:restartNumberingAfterBreak="0">
+  <w:abstractNum w:abstractNumId="93" w15:restartNumberingAfterBreak="0">
     <w:nsid w:val="3CD27F78"/>
     <w:multiLevelType w:val="multilevel"/>
     <w:tmpl w:val="FCDE767A"/>
@@ -31857,7 +33206,7 @@
       </w:rPr>
     </w:lvl>
   </w:abstractNum>
-  <w:abstractNum w:abstractNumId="90" w15:restartNumberingAfterBreak="0">
+  <w:abstractNum w:abstractNumId="94" w15:restartNumberingAfterBreak="0">
     <w:nsid w:val="3CD74B18"/>
     <w:multiLevelType w:val="hybridMultilevel"/>
     <w:tmpl w:val="2FF42220"/>
@@ -31970,7 +33319,7 @@
       </w:rPr>
     </w:lvl>
   </w:abstractNum>
-  <w:abstractNum w:abstractNumId="91" w15:restartNumberingAfterBreak="0">
+  <w:abstractNum w:abstractNumId="95" w15:restartNumberingAfterBreak="0">
     <w:nsid w:val="3D2F7E79"/>
     <w:multiLevelType w:val="hybridMultilevel"/>
     <w:tmpl w:val="6ED674BE"/>
@@ -32082,7 +33431,7 @@
       </w:rPr>
     </w:lvl>
   </w:abstractNum>
-  <w:abstractNum w:abstractNumId="92" w15:restartNumberingAfterBreak="0">
+  <w:abstractNum w:abstractNumId="96" w15:restartNumberingAfterBreak="0">
     <w:nsid w:val="3D397287"/>
     <w:multiLevelType w:val="hybridMultilevel"/>
     <w:tmpl w:val="F4503122"/>
@@ -32194,7 +33543,7 @@
       </w:rPr>
     </w:lvl>
   </w:abstractNum>
-  <w:abstractNum w:abstractNumId="93" w15:restartNumberingAfterBreak="0">
+  <w:abstractNum w:abstractNumId="97" w15:restartNumberingAfterBreak="0">
     <w:nsid w:val="3E685FF3"/>
     <w:multiLevelType w:val="multilevel"/>
     <w:tmpl w:val="7D20B538"/>
@@ -32343,7 +33692,7 @@
       </w:rPr>
     </w:lvl>
   </w:abstractNum>
-  <w:abstractNum w:abstractNumId="94" w15:restartNumberingAfterBreak="0">
+  <w:abstractNum w:abstractNumId="98" w15:restartNumberingAfterBreak="0">
     <w:nsid w:val="3F346C2C"/>
     <w:multiLevelType w:val="multilevel"/>
     <w:tmpl w:val="63F4E6F0"/>
@@ -32492,7 +33841,7 @@
       </w:rPr>
     </w:lvl>
   </w:abstractNum>
-  <w:abstractNum w:abstractNumId="95" w15:restartNumberingAfterBreak="0">
+  <w:abstractNum w:abstractNumId="99" w15:restartNumberingAfterBreak="0">
     <w:nsid w:val="3FCB1322"/>
     <w:multiLevelType w:val="hybridMultilevel"/>
     <w:tmpl w:val="55C012B2"/>
@@ -32604,7 +33953,7 @@
       </w:rPr>
     </w:lvl>
   </w:abstractNum>
-  <w:abstractNum w:abstractNumId="96" w15:restartNumberingAfterBreak="0">
+  <w:abstractNum w:abstractNumId="100" w15:restartNumberingAfterBreak="0">
     <w:nsid w:val="40F6710A"/>
     <w:multiLevelType w:val="hybridMultilevel"/>
     <w:tmpl w:val="C734A186"/>
@@ -32690,7 +34039,7 @@
       </w:pPr>
     </w:lvl>
   </w:abstractNum>
-  <w:abstractNum w:abstractNumId="97" w15:restartNumberingAfterBreak="0">
+  <w:abstractNum w:abstractNumId="101" w15:restartNumberingAfterBreak="0">
     <w:nsid w:val="41A9344F"/>
     <w:multiLevelType w:val="hybridMultilevel"/>
     <w:tmpl w:val="0FB60038"/>
@@ -32803,7 +34152,7 @@
       </w:rPr>
     </w:lvl>
   </w:abstractNum>
-  <w:abstractNum w:abstractNumId="98" w15:restartNumberingAfterBreak="0">
+  <w:abstractNum w:abstractNumId="102" w15:restartNumberingAfterBreak="0">
     <w:nsid w:val="42004E1F"/>
     <w:multiLevelType w:val="hybridMultilevel"/>
     <w:tmpl w:val="770C8314"/>
@@ -32915,7 +34264,7 @@
       </w:rPr>
     </w:lvl>
   </w:abstractNum>
-  <w:abstractNum w:abstractNumId="99" w15:restartNumberingAfterBreak="0">
+  <w:abstractNum w:abstractNumId="103" w15:restartNumberingAfterBreak="0">
     <w:nsid w:val="439F7169"/>
     <w:multiLevelType w:val="hybridMultilevel"/>
     <w:tmpl w:val="1884EDCA"/>
@@ -33028,7 +34377,7 @@
       </w:rPr>
     </w:lvl>
   </w:abstractNum>
-  <w:abstractNum w:abstractNumId="100" w15:restartNumberingAfterBreak="0">
+  <w:abstractNum w:abstractNumId="104" w15:restartNumberingAfterBreak="0">
     <w:nsid w:val="43EA1D69"/>
     <w:multiLevelType w:val="multilevel"/>
     <w:tmpl w:val="DFEC23EC"/>
@@ -33177,7 +34526,7 @@
       </w:rPr>
     </w:lvl>
   </w:abstractNum>
-  <w:abstractNum w:abstractNumId="101" w15:restartNumberingAfterBreak="0">
+  <w:abstractNum w:abstractNumId="105" w15:restartNumberingAfterBreak="0">
     <w:nsid w:val="44320084"/>
     <w:multiLevelType w:val="hybridMultilevel"/>
     <w:tmpl w:val="CE5076D4"/>
@@ -33289,7 +34638,7 @@
       </w:rPr>
     </w:lvl>
   </w:abstractNum>
-  <w:abstractNum w:abstractNumId="102" w15:restartNumberingAfterBreak="0">
+  <w:abstractNum w:abstractNumId="106" w15:restartNumberingAfterBreak="0">
     <w:nsid w:val="44554567"/>
     <w:multiLevelType w:val="hybridMultilevel"/>
     <w:tmpl w:val="78748252"/>
@@ -33401,7 +34750,7 @@
       </w:rPr>
     </w:lvl>
   </w:abstractNum>
-  <w:abstractNum w:abstractNumId="103" w15:restartNumberingAfterBreak="0">
+  <w:abstractNum w:abstractNumId="107" w15:restartNumberingAfterBreak="0">
     <w:nsid w:val="44856EAF"/>
     <w:multiLevelType w:val="hybridMultilevel"/>
     <w:tmpl w:val="1F3A5F58"/>
@@ -33487,7 +34836,7 @@
       </w:pPr>
     </w:lvl>
   </w:abstractNum>
-  <w:abstractNum w:abstractNumId="104" w15:restartNumberingAfterBreak="0">
+  <w:abstractNum w:abstractNumId="108" w15:restartNumberingAfterBreak="0">
     <w:nsid w:val="45336EC4"/>
     <w:multiLevelType w:val="hybridMultilevel"/>
     <w:tmpl w:val="5D74BC2A"/>
@@ -33600,7 +34949,120 @@
       </w:rPr>
     </w:lvl>
   </w:abstractNum>
-  <w:abstractNum w:abstractNumId="105" w15:restartNumberingAfterBreak="0">
+  <w:abstractNum w:abstractNumId="109" w15:restartNumberingAfterBreak="0">
+    <w:nsid w:val="47F67698"/>
+    <w:multiLevelType w:val="hybridMultilevel"/>
+    <w:tmpl w:val="C80CE92A"/>
+    <w:lvl w:ilvl="0" w:tplc="FFFFFFFF">
+      <w:start w:val="1"/>
+      <w:numFmt w:val="bullet"/>
+      <w:lvlText w:val=""/>
+      <w:lvlJc w:val="left"/>
+      <w:pPr>
+        <w:ind w:left="720" w:hanging="360"/>
+      </w:pPr>
+      <w:rPr>
+        <w:rFonts w:ascii="Wingdings" w:hAnsi="Wingdings" w:hint="default"/>
+      </w:rPr>
+    </w:lvl>
+    <w:lvl w:ilvl="1" w:tplc="04090005">
+      <w:start w:val="1"/>
+      <w:numFmt w:val="bullet"/>
+      <w:lvlText w:val=""/>
+      <w:lvlJc w:val="left"/>
+      <w:pPr>
+        <w:ind w:left="720" w:hanging="360"/>
+      </w:pPr>
+      <w:rPr>
+        <w:rFonts w:ascii="Wingdings" w:hAnsi="Wingdings" w:hint="default"/>
+      </w:rPr>
+    </w:lvl>
+    <w:lvl w:ilvl="2" w:tplc="FFFFFFFF" w:tentative="1">
+      <w:start w:val="1"/>
+      <w:numFmt w:val="bullet"/>
+      <w:lvlText w:val=""/>
+      <w:lvlJc w:val="left"/>
+      <w:pPr>
+        <w:ind w:left="2160" w:hanging="360"/>
+      </w:pPr>
+      <w:rPr>
+        <w:rFonts w:ascii="Wingdings" w:hAnsi="Wingdings" w:hint="default"/>
+      </w:rPr>
+    </w:lvl>
+    <w:lvl w:ilvl="3" w:tplc="FFFFFFFF" w:tentative="1">
+      <w:start w:val="1"/>
+      <w:numFmt w:val="bullet"/>
+      <w:lvlText w:val=""/>
+      <w:lvlJc w:val="left"/>
+      <w:pPr>
+        <w:ind w:left="2880" w:hanging="360"/>
+      </w:pPr>
+      <w:rPr>
+        <w:rFonts w:ascii="Symbol" w:hAnsi="Symbol" w:hint="default"/>
+      </w:rPr>
+    </w:lvl>
+    <w:lvl w:ilvl="4" w:tplc="FFFFFFFF" w:tentative="1">
+      <w:start w:val="1"/>
+      <w:numFmt w:val="bullet"/>
+      <w:lvlText w:val="o"/>
+      <w:lvlJc w:val="left"/>
+      <w:pPr>
+        <w:ind w:left="3600" w:hanging="360"/>
+      </w:pPr>
+      <w:rPr>
+        <w:rFonts w:ascii="Courier New" w:hAnsi="Courier New" w:cs="Courier New" w:hint="default"/>
+      </w:rPr>
+    </w:lvl>
+    <w:lvl w:ilvl="5" w:tplc="FFFFFFFF" w:tentative="1">
+      <w:start w:val="1"/>
+      <w:numFmt w:val="bullet"/>
+      <w:lvlText w:val=""/>
+      <w:lvlJc w:val="left"/>
+      <w:pPr>
+        <w:ind w:left="4320" w:hanging="360"/>
+      </w:pPr>
+      <w:rPr>
+        <w:rFonts w:ascii="Wingdings" w:hAnsi="Wingdings" w:hint="default"/>
+      </w:rPr>
+    </w:lvl>
+    <w:lvl w:ilvl="6" w:tplc="FFFFFFFF" w:tentative="1">
+      <w:start w:val="1"/>
+      <w:numFmt w:val="bullet"/>
+      <w:lvlText w:val=""/>
+      <w:lvlJc w:val="left"/>
+      <w:pPr>
+        <w:ind w:left="5040" w:hanging="360"/>
+      </w:pPr>
+      <w:rPr>
+        <w:rFonts w:ascii="Symbol" w:hAnsi="Symbol" w:hint="default"/>
+      </w:rPr>
+    </w:lvl>
+    <w:lvl w:ilvl="7" w:tplc="FFFFFFFF" w:tentative="1">
+      <w:start w:val="1"/>
+      <w:numFmt w:val="bullet"/>
+      <w:lvlText w:val="o"/>
+      <w:lvlJc w:val="left"/>
+      <w:pPr>
+        <w:ind w:left="5760" w:hanging="360"/>
+      </w:pPr>
+      <w:rPr>
+        <w:rFonts w:ascii="Courier New" w:hAnsi="Courier New" w:cs="Courier New" w:hint="default"/>
+      </w:rPr>
+    </w:lvl>
+    <w:lvl w:ilvl="8" w:tplc="FFFFFFFF" w:tentative="1">
+      <w:start w:val="1"/>
+      <w:numFmt w:val="bullet"/>
+      <w:lvlText w:val=""/>
+      <w:lvlJc w:val="left"/>
+      <w:pPr>
+        <w:ind w:left="6480" w:hanging="360"/>
+      </w:pPr>
+      <w:rPr>
+        <w:rFonts w:ascii="Wingdings" w:hAnsi="Wingdings" w:hint="default"/>
+      </w:rPr>
+    </w:lvl>
+  </w:abstractNum>
+  <w:abstractNum w:abstractNumId="110" w15:restartNumberingAfterBreak="0">
     <w:nsid w:val="49005094"/>
     <w:multiLevelType w:val="hybridMultilevel"/>
     <w:tmpl w:val="14848CBE"/>
@@ -33712,7 +35174,7 @@
       </w:rPr>
     </w:lvl>
   </w:abstractNum>
-  <w:abstractNum w:abstractNumId="106" w15:restartNumberingAfterBreak="0">
+  <w:abstractNum w:abstractNumId="111" w15:restartNumberingAfterBreak="0">
     <w:nsid w:val="49243794"/>
     <w:multiLevelType w:val="multilevel"/>
     <w:tmpl w:val="E7681528"/>
@@ -33861,7 +35323,7 @@
       </w:rPr>
     </w:lvl>
   </w:abstractNum>
-  <w:abstractNum w:abstractNumId="107" w15:restartNumberingAfterBreak="0">
+  <w:abstractNum w:abstractNumId="112" w15:restartNumberingAfterBreak="0">
     <w:nsid w:val="49673507"/>
     <w:multiLevelType w:val="hybridMultilevel"/>
     <w:tmpl w:val="03EA6632"/>
@@ -33974,7 +35436,7 @@
       </w:rPr>
     </w:lvl>
   </w:abstractNum>
-  <w:abstractNum w:abstractNumId="108" w15:restartNumberingAfterBreak="0">
+  <w:abstractNum w:abstractNumId="113" w15:restartNumberingAfterBreak="0">
     <w:nsid w:val="49DE12C1"/>
     <w:multiLevelType w:val="hybridMultilevel"/>
     <w:tmpl w:val="4CF0F30E"/>
@@ -34060,7 +35522,7 @@
       </w:pPr>
     </w:lvl>
   </w:abstractNum>
-  <w:abstractNum w:abstractNumId="109" w15:restartNumberingAfterBreak="0">
+  <w:abstractNum w:abstractNumId="114" w15:restartNumberingAfterBreak="0">
     <w:nsid w:val="4A880990"/>
     <w:multiLevelType w:val="hybridMultilevel"/>
     <w:tmpl w:val="F17E12C2"/>
@@ -34172,7 +35634,93 @@
       </w:rPr>
     </w:lvl>
   </w:abstractNum>
-  <w:abstractNum w:abstractNumId="110" w15:restartNumberingAfterBreak="0">
+  <w:abstractNum w:abstractNumId="115" w15:restartNumberingAfterBreak="0">
+    <w:nsid w:val="4ACE090E"/>
+    <w:multiLevelType w:val="hybridMultilevel"/>
+    <w:tmpl w:val="44EED61C"/>
+    <w:lvl w:ilvl="0" w:tplc="FFFFFFFF">
+      <w:start w:val="1"/>
+      <w:numFmt w:val="decimal"/>
+      <w:lvlText w:val="%1."/>
+      <w:lvlJc w:val="left"/>
+      <w:pPr>
+        <w:ind w:left="720" w:hanging="360"/>
+      </w:pPr>
+    </w:lvl>
+    <w:lvl w:ilvl="1" w:tplc="0409000F">
+      <w:start w:val="1"/>
+      <w:numFmt w:val="decimal"/>
+      <w:lvlText w:val="%2."/>
+      <w:lvlJc w:val="left"/>
+      <w:pPr>
+        <w:ind w:left="720" w:hanging="360"/>
+      </w:pPr>
+    </w:lvl>
+    <w:lvl w:ilvl="2" w:tplc="FFFFFFFF" w:tentative="1">
+      <w:start w:val="1"/>
+      <w:numFmt w:val="lowerRoman"/>
+      <w:lvlText w:val="%3."/>
+      <w:lvlJc w:val="right"/>
+      <w:pPr>
+        <w:ind w:left="2160" w:hanging="180"/>
+      </w:pPr>
+    </w:lvl>
+    <w:lvl w:ilvl="3" w:tplc="FFFFFFFF" w:tentative="1">
+      <w:start w:val="1"/>
+      <w:numFmt w:val="decimal"/>
+      <w:lvlText w:val="%4."/>
+      <w:lvlJc w:val="left"/>
+      <w:pPr>
+        <w:ind w:left="2880" w:hanging="360"/>
+      </w:pPr>
+    </w:lvl>
+    <w:lvl w:ilvl="4" w:tplc="FFFFFFFF" w:tentative="1">
+      <w:start w:val="1"/>
+      <w:numFmt w:val="lowerLetter"/>
+      <w:lvlText w:val="%5."/>
+      <w:lvlJc w:val="left"/>
+      <w:pPr>
+        <w:ind w:left="3600" w:hanging="360"/>
+      </w:pPr>
+    </w:lvl>
+    <w:lvl w:ilvl="5" w:tplc="FFFFFFFF" w:tentative="1">
+      <w:start w:val="1"/>
+      <w:numFmt w:val="lowerRoman"/>
+      <w:lvlText w:val="%6."/>
+      <w:lvlJc w:val="right"/>
+      <w:pPr>
+        <w:ind w:left="4320" w:hanging="180"/>
+      </w:pPr>
+    </w:lvl>
+    <w:lvl w:ilvl="6" w:tplc="FFFFFFFF" w:tentative="1">
+      <w:start w:val="1"/>
+      <w:numFmt w:val="decimal"/>
+      <w:lvlText w:val="%7."/>
+      <w:lvlJc w:val="left"/>
+      <w:pPr>
+        <w:ind w:left="5040" w:hanging="360"/>
+      </w:pPr>
+    </w:lvl>
+    <w:lvl w:ilvl="7" w:tplc="FFFFFFFF" w:tentative="1">
+      <w:start w:val="1"/>
+      <w:numFmt w:val="lowerLetter"/>
+      <w:lvlText w:val="%8."/>
+      <w:lvlJc w:val="left"/>
+      <w:pPr>
+        <w:ind w:left="5760" w:hanging="360"/>
+      </w:pPr>
+    </w:lvl>
+    <w:lvl w:ilvl="8" w:tplc="FFFFFFFF" w:tentative="1">
+      <w:start w:val="1"/>
+      <w:numFmt w:val="lowerRoman"/>
+      <w:lvlText w:val="%9."/>
+      <w:lvlJc w:val="right"/>
+      <w:pPr>
+        <w:ind w:left="6480" w:hanging="180"/>
+      </w:pPr>
+    </w:lvl>
+  </w:abstractNum>
+  <w:abstractNum w:abstractNumId="116" w15:restartNumberingAfterBreak="0">
     <w:nsid w:val="4B182B12"/>
     <w:multiLevelType w:val="hybridMultilevel"/>
     <w:tmpl w:val="31C486B4"/>
@@ -34284,7 +35832,7 @@
       </w:rPr>
     </w:lvl>
   </w:abstractNum>
-  <w:abstractNum w:abstractNumId="111" w15:restartNumberingAfterBreak="0">
+  <w:abstractNum w:abstractNumId="117" w15:restartNumberingAfterBreak="0">
     <w:nsid w:val="4BA13766"/>
     <w:multiLevelType w:val="multilevel"/>
     <w:tmpl w:val="63F4E6F0"/>
@@ -34433,7 +35981,7 @@
       </w:rPr>
     </w:lvl>
   </w:abstractNum>
-  <w:abstractNum w:abstractNumId="112" w15:restartNumberingAfterBreak="0">
+  <w:abstractNum w:abstractNumId="118" w15:restartNumberingAfterBreak="0">
     <w:nsid w:val="4C855C93"/>
     <w:multiLevelType w:val="hybridMultilevel"/>
     <w:tmpl w:val="6F5E0B6E"/>
@@ -34522,7 +36070,7 @@
       </w:pPr>
     </w:lvl>
   </w:abstractNum>
-  <w:abstractNum w:abstractNumId="113" w15:restartNumberingAfterBreak="0">
+  <w:abstractNum w:abstractNumId="119" w15:restartNumberingAfterBreak="0">
     <w:nsid w:val="4E65371E"/>
     <w:multiLevelType w:val="hybridMultilevel"/>
     <w:tmpl w:val="53EE4538"/>
@@ -34634,7 +36182,7 @@
       </w:rPr>
     </w:lvl>
   </w:abstractNum>
-  <w:abstractNum w:abstractNumId="114" w15:restartNumberingAfterBreak="0">
+  <w:abstractNum w:abstractNumId="120" w15:restartNumberingAfterBreak="0">
     <w:nsid w:val="4E9A3F16"/>
     <w:multiLevelType w:val="multilevel"/>
     <w:tmpl w:val="63F4E6F0"/>
@@ -34783,7 +36331,7 @@
       </w:rPr>
     </w:lvl>
   </w:abstractNum>
-  <w:abstractNum w:abstractNumId="115" w15:restartNumberingAfterBreak="0">
+  <w:abstractNum w:abstractNumId="121" w15:restartNumberingAfterBreak="0">
     <w:nsid w:val="500B790D"/>
     <w:multiLevelType w:val="multilevel"/>
     <w:tmpl w:val="63F4E6F0"/>
@@ -34932,7 +36480,7 @@
       </w:rPr>
     </w:lvl>
   </w:abstractNum>
-  <w:abstractNum w:abstractNumId="116" w15:restartNumberingAfterBreak="0">
+  <w:abstractNum w:abstractNumId="122" w15:restartNumberingAfterBreak="0">
     <w:nsid w:val="526538B7"/>
     <w:multiLevelType w:val="hybridMultilevel"/>
     <w:tmpl w:val="E6A017F2"/>
@@ -35045,7 +36593,7 @@
       </w:rPr>
     </w:lvl>
   </w:abstractNum>
-  <w:abstractNum w:abstractNumId="117" w15:restartNumberingAfterBreak="0">
+  <w:abstractNum w:abstractNumId="123" w15:restartNumberingAfterBreak="0">
     <w:nsid w:val="537E56D9"/>
     <w:multiLevelType w:val="multilevel"/>
     <w:tmpl w:val="1B6E8B6A"/>
@@ -35194,7 +36742,7 @@
       </w:rPr>
     </w:lvl>
   </w:abstractNum>
-  <w:abstractNum w:abstractNumId="118" w15:restartNumberingAfterBreak="0">
+  <w:abstractNum w:abstractNumId="124" w15:restartNumberingAfterBreak="0">
     <w:nsid w:val="53E6601E"/>
     <w:multiLevelType w:val="hybridMultilevel"/>
     <w:tmpl w:val="66F0666A"/>
@@ -35307,7 +36855,7 @@
       </w:rPr>
     </w:lvl>
   </w:abstractNum>
-  <w:abstractNum w:abstractNumId="119" w15:restartNumberingAfterBreak="0">
+  <w:abstractNum w:abstractNumId="125" w15:restartNumberingAfterBreak="0">
     <w:nsid w:val="551D6F91"/>
     <w:multiLevelType w:val="hybridMultilevel"/>
     <w:tmpl w:val="9522B3C6"/>
@@ -35419,7 +36967,7 @@
       </w:rPr>
     </w:lvl>
   </w:abstractNum>
-  <w:abstractNum w:abstractNumId="120" w15:restartNumberingAfterBreak="0">
+  <w:abstractNum w:abstractNumId="126" w15:restartNumberingAfterBreak="0">
     <w:nsid w:val="555451DA"/>
     <w:multiLevelType w:val="hybridMultilevel"/>
     <w:tmpl w:val="CAB2A550"/>
@@ -35532,7 +37080,7 @@
       </w:rPr>
     </w:lvl>
   </w:abstractNum>
-  <w:abstractNum w:abstractNumId="121" w15:restartNumberingAfterBreak="0">
+  <w:abstractNum w:abstractNumId="127" w15:restartNumberingAfterBreak="0">
     <w:nsid w:val="55655B93"/>
     <w:multiLevelType w:val="multilevel"/>
     <w:tmpl w:val="9C88A4A8"/>
@@ -35681,7 +37229,7 @@
       </w:rPr>
     </w:lvl>
   </w:abstractNum>
-  <w:abstractNum w:abstractNumId="122" w15:restartNumberingAfterBreak="0">
+  <w:abstractNum w:abstractNumId="128" w15:restartNumberingAfterBreak="0">
     <w:nsid w:val="55B95BED"/>
     <w:multiLevelType w:val="hybridMultilevel"/>
     <w:tmpl w:val="A9B866FC"/>
@@ -35794,7 +37342,7 @@
       </w:rPr>
     </w:lvl>
   </w:abstractNum>
-  <w:abstractNum w:abstractNumId="123" w15:restartNumberingAfterBreak="0">
+  <w:abstractNum w:abstractNumId="129" w15:restartNumberingAfterBreak="0">
     <w:nsid w:val="562D4F1F"/>
     <w:multiLevelType w:val="hybridMultilevel"/>
     <w:tmpl w:val="1FF8D31C"/>
@@ -35906,7 +37454,7 @@
       </w:rPr>
     </w:lvl>
   </w:abstractNum>
-  <w:abstractNum w:abstractNumId="124" w15:restartNumberingAfterBreak="0">
+  <w:abstractNum w:abstractNumId="130" w15:restartNumberingAfterBreak="0">
     <w:nsid w:val="565A0C8B"/>
     <w:multiLevelType w:val="multilevel"/>
     <w:tmpl w:val="AB24FF2E"/>
@@ -36055,7 +37603,7 @@
       </w:rPr>
     </w:lvl>
   </w:abstractNum>
-  <w:abstractNum w:abstractNumId="125" w15:restartNumberingAfterBreak="0">
+  <w:abstractNum w:abstractNumId="131" w15:restartNumberingAfterBreak="0">
     <w:nsid w:val="566E7C65"/>
     <w:multiLevelType w:val="multilevel"/>
     <w:tmpl w:val="28803B4C"/>
@@ -36204,7 +37752,7 @@
       </w:rPr>
     </w:lvl>
   </w:abstractNum>
-  <w:abstractNum w:abstractNumId="126" w15:restartNumberingAfterBreak="0">
+  <w:abstractNum w:abstractNumId="132" w15:restartNumberingAfterBreak="0">
     <w:nsid w:val="57407594"/>
     <w:multiLevelType w:val="multilevel"/>
     <w:tmpl w:val="E6E2F8AE"/>
@@ -36353,7 +37901,7 @@
       </w:rPr>
     </w:lvl>
   </w:abstractNum>
-  <w:abstractNum w:abstractNumId="127" w15:restartNumberingAfterBreak="0">
+  <w:abstractNum w:abstractNumId="133" w15:restartNumberingAfterBreak="0">
     <w:nsid w:val="577F771B"/>
     <w:multiLevelType w:val="hybridMultilevel"/>
     <w:tmpl w:val="0F2C5914"/>
@@ -36465,7 +38013,7 @@
       </w:rPr>
     </w:lvl>
   </w:abstractNum>
-  <w:abstractNum w:abstractNumId="128" w15:restartNumberingAfterBreak="0">
+  <w:abstractNum w:abstractNumId="134" w15:restartNumberingAfterBreak="0">
     <w:nsid w:val="57C43CDD"/>
     <w:multiLevelType w:val="hybridMultilevel"/>
     <w:tmpl w:val="6C94FB5E"/>
@@ -36578,7 +38126,93 @@
       </w:rPr>
     </w:lvl>
   </w:abstractNum>
-  <w:abstractNum w:abstractNumId="129" w15:restartNumberingAfterBreak="0">
+  <w:abstractNum w:abstractNumId="135" w15:restartNumberingAfterBreak="0">
+    <w:nsid w:val="57D25136"/>
+    <w:multiLevelType w:val="hybridMultilevel"/>
+    <w:tmpl w:val="A1501F4A"/>
+    <w:lvl w:ilvl="0" w:tplc="0409000F">
+      <w:start w:val="1"/>
+      <w:numFmt w:val="decimal"/>
+      <w:lvlText w:val="%1."/>
+      <w:lvlJc w:val="left"/>
+      <w:pPr>
+        <w:ind w:left="720" w:hanging="360"/>
+      </w:pPr>
+    </w:lvl>
+    <w:lvl w:ilvl="1" w:tplc="04090019">
+      <w:start w:val="1"/>
+      <w:numFmt w:val="lowerLetter"/>
+      <w:lvlText w:val="%2."/>
+      <w:lvlJc w:val="left"/>
+      <w:pPr>
+        <w:ind w:left="1440" w:hanging="360"/>
+      </w:pPr>
+    </w:lvl>
+    <w:lvl w:ilvl="2" w:tplc="0409001B" w:tentative="1">
+      <w:start w:val="1"/>
+      <w:numFmt w:val="lowerRoman"/>
+      <w:lvlText w:val="%3."/>
+      <w:lvlJc w:val="right"/>
+      <w:pPr>
+        <w:ind w:left="2160" w:hanging="180"/>
+      </w:pPr>
+    </w:lvl>
+    <w:lvl w:ilvl="3" w:tplc="0409000F" w:tentative="1">
+      <w:start w:val="1"/>
+      <w:numFmt w:val="decimal"/>
+      <w:lvlText w:val="%4."/>
+      <w:lvlJc w:val="left"/>
+      <w:pPr>
+        <w:ind w:left="2880" w:hanging="360"/>
+      </w:pPr>
+    </w:lvl>
+    <w:lvl w:ilvl="4" w:tplc="04090019" w:tentative="1">
+      <w:start w:val="1"/>
+      <w:numFmt w:val="lowerLetter"/>
+      <w:lvlText w:val="%5."/>
+      <w:lvlJc w:val="left"/>
+      <w:pPr>
+        <w:ind w:left="3600" w:hanging="360"/>
+      </w:pPr>
+    </w:lvl>
+    <w:lvl w:ilvl="5" w:tplc="0409001B" w:tentative="1">
+      <w:start w:val="1"/>
+      <w:numFmt w:val="lowerRoman"/>
+      <w:lvlText w:val="%6."/>
+      <w:lvlJc w:val="right"/>
+      <w:pPr>
+        <w:ind w:left="4320" w:hanging="180"/>
+      </w:pPr>
+    </w:lvl>
+    <w:lvl w:ilvl="6" w:tplc="0409000F" w:tentative="1">
+      <w:start w:val="1"/>
+      <w:numFmt w:val="decimal"/>
+      <w:lvlText w:val="%7."/>
+      <w:lvlJc w:val="left"/>
+      <w:pPr>
+        <w:ind w:left="5040" w:hanging="360"/>
+      </w:pPr>
+    </w:lvl>
+    <w:lvl w:ilvl="7" w:tplc="04090019" w:tentative="1">
+      <w:start w:val="1"/>
+      <w:numFmt w:val="lowerLetter"/>
+      <w:lvlText w:val="%8."/>
+      <w:lvlJc w:val="left"/>
+      <w:pPr>
+        <w:ind w:left="5760" w:hanging="360"/>
+      </w:pPr>
+    </w:lvl>
+    <w:lvl w:ilvl="8" w:tplc="0409001B" w:tentative="1">
+      <w:start w:val="1"/>
+      <w:numFmt w:val="lowerRoman"/>
+      <w:lvlText w:val="%9."/>
+      <w:lvlJc w:val="right"/>
+      <w:pPr>
+        <w:ind w:left="6480" w:hanging="180"/>
+      </w:pPr>
+    </w:lvl>
+  </w:abstractNum>
+  <w:abstractNum w:abstractNumId="136" w15:restartNumberingAfterBreak="0">
     <w:nsid w:val="58393977"/>
     <w:multiLevelType w:val="hybridMultilevel"/>
     <w:tmpl w:val="985A5484"/>
@@ -36691,7 +38325,7 @@
       </w:rPr>
     </w:lvl>
   </w:abstractNum>
-  <w:abstractNum w:abstractNumId="130" w15:restartNumberingAfterBreak="0">
+  <w:abstractNum w:abstractNumId="137" w15:restartNumberingAfterBreak="0">
     <w:nsid w:val="58993A3F"/>
     <w:multiLevelType w:val="hybridMultilevel"/>
     <w:tmpl w:val="5344B292"/>
@@ -36780,7 +38414,93 @@
       </w:pPr>
     </w:lvl>
   </w:abstractNum>
-  <w:abstractNum w:abstractNumId="131" w15:restartNumberingAfterBreak="0">
+  <w:abstractNum w:abstractNumId="138" w15:restartNumberingAfterBreak="0">
+    <w:nsid w:val="58ED4BC1"/>
+    <w:multiLevelType w:val="hybridMultilevel"/>
+    <w:tmpl w:val="E9D8B88C"/>
+    <w:lvl w:ilvl="0" w:tplc="0409000F">
+      <w:start w:val="1"/>
+      <w:numFmt w:val="decimal"/>
+      <w:lvlText w:val="%1."/>
+      <w:lvlJc w:val="left"/>
+      <w:pPr>
+        <w:ind w:left="720" w:hanging="360"/>
+      </w:pPr>
+    </w:lvl>
+    <w:lvl w:ilvl="1" w:tplc="04090019" w:tentative="1">
+      <w:start w:val="1"/>
+      <w:numFmt w:val="lowerLetter"/>
+      <w:lvlText w:val="%2."/>
+      <w:lvlJc w:val="left"/>
+      <w:pPr>
+        <w:ind w:left="1440" w:hanging="360"/>
+      </w:pPr>
+    </w:lvl>
+    <w:lvl w:ilvl="2" w:tplc="0409001B" w:tentative="1">
+      <w:start w:val="1"/>
+      <w:numFmt w:val="lowerRoman"/>
+      <w:lvlText w:val="%3."/>
+      <w:lvlJc w:val="right"/>
+      <w:pPr>
+        <w:ind w:left="2160" w:hanging="180"/>
+      </w:pPr>
+    </w:lvl>
+    <w:lvl w:ilvl="3" w:tplc="0409000F" w:tentative="1">
+      <w:start w:val="1"/>
+      <w:numFmt w:val="decimal"/>
+      <w:lvlText w:val="%4."/>
+      <w:lvlJc w:val="left"/>
+      <w:pPr>
+        <w:ind w:left="2880" w:hanging="360"/>
+      </w:pPr>
+    </w:lvl>
+    <w:lvl w:ilvl="4" w:tplc="04090019" w:tentative="1">
+      <w:start w:val="1"/>
+      <w:numFmt w:val="lowerLetter"/>
+      <w:lvlText w:val="%5."/>
+      <w:lvlJc w:val="left"/>
+      <w:pPr>
+        <w:ind w:left="3600" w:hanging="360"/>
+      </w:pPr>
+    </w:lvl>
+    <w:lvl w:ilvl="5" w:tplc="0409001B" w:tentative="1">
+      <w:start w:val="1"/>
+      <w:numFmt w:val="lowerRoman"/>
+      <w:lvlText w:val="%6."/>
+      <w:lvlJc w:val="right"/>
+      <w:pPr>
+        <w:ind w:left="4320" w:hanging="180"/>
+      </w:pPr>
+    </w:lvl>
+    <w:lvl w:ilvl="6" w:tplc="0409000F" w:tentative="1">
+      <w:start w:val="1"/>
+      <w:numFmt w:val="decimal"/>
+      <w:lvlText w:val="%7."/>
+      <w:lvlJc w:val="left"/>
+      <w:pPr>
+        <w:ind w:left="5040" w:hanging="360"/>
+      </w:pPr>
+    </w:lvl>
+    <w:lvl w:ilvl="7" w:tplc="04090019" w:tentative="1">
+      <w:start w:val="1"/>
+      <w:numFmt w:val="lowerLetter"/>
+      <w:lvlText w:val="%8."/>
+      <w:lvlJc w:val="left"/>
+      <w:pPr>
+        <w:ind w:left="5760" w:hanging="360"/>
+      </w:pPr>
+    </w:lvl>
+    <w:lvl w:ilvl="8" w:tplc="0409001B" w:tentative="1">
+      <w:start w:val="1"/>
+      <w:numFmt w:val="lowerRoman"/>
+      <w:lvlText w:val="%9."/>
+      <w:lvlJc w:val="right"/>
+      <w:pPr>
+        <w:ind w:left="6480" w:hanging="180"/>
+      </w:pPr>
+    </w:lvl>
+  </w:abstractNum>
+  <w:abstractNum w:abstractNumId="139" w15:restartNumberingAfterBreak="0">
     <w:nsid w:val="59EB4CE4"/>
     <w:multiLevelType w:val="multilevel"/>
     <w:tmpl w:val="63F4E6F0"/>
@@ -36929,7 +38649,7 @@
       </w:rPr>
     </w:lvl>
   </w:abstractNum>
-  <w:abstractNum w:abstractNumId="132" w15:restartNumberingAfterBreak="0">
+  <w:abstractNum w:abstractNumId="140" w15:restartNumberingAfterBreak="0">
     <w:nsid w:val="5A067370"/>
     <w:multiLevelType w:val="hybridMultilevel"/>
     <w:tmpl w:val="9CB8C76C"/>
@@ -37042,7 +38762,7 @@
       </w:rPr>
     </w:lvl>
   </w:abstractNum>
-  <w:abstractNum w:abstractNumId="133" w15:restartNumberingAfterBreak="0">
+  <w:abstractNum w:abstractNumId="141" w15:restartNumberingAfterBreak="0">
     <w:nsid w:val="5BD11962"/>
     <w:multiLevelType w:val="hybridMultilevel"/>
     <w:tmpl w:val="89A4B834"/>
@@ -37131,7 +38851,7 @@
       </w:pPr>
     </w:lvl>
   </w:abstractNum>
-  <w:abstractNum w:abstractNumId="134" w15:restartNumberingAfterBreak="0">
+  <w:abstractNum w:abstractNumId="142" w15:restartNumberingAfterBreak="0">
     <w:nsid w:val="5C950DBA"/>
     <w:multiLevelType w:val="hybridMultilevel"/>
     <w:tmpl w:val="7D78F950"/>
@@ -37243,7 +38963,7 @@
       </w:rPr>
     </w:lvl>
   </w:abstractNum>
-  <w:abstractNum w:abstractNumId="135" w15:restartNumberingAfterBreak="0">
+  <w:abstractNum w:abstractNumId="143" w15:restartNumberingAfterBreak="0">
     <w:nsid w:val="5D2A5D3B"/>
     <w:multiLevelType w:val="hybridMultilevel"/>
     <w:tmpl w:val="3AF89EA6"/>
@@ -37334,7 +39054,7 @@
       </w:pPr>
     </w:lvl>
   </w:abstractNum>
-  <w:abstractNum w:abstractNumId="136" w15:restartNumberingAfterBreak="0">
+  <w:abstractNum w:abstractNumId="144" w15:restartNumberingAfterBreak="0">
     <w:nsid w:val="5D9E49FD"/>
     <w:multiLevelType w:val="hybridMultilevel"/>
     <w:tmpl w:val="4EE40BB4"/>
@@ -37446,7 +39166,7 @@
       </w:rPr>
     </w:lvl>
   </w:abstractNum>
-  <w:abstractNum w:abstractNumId="137" w15:restartNumberingAfterBreak="0">
+  <w:abstractNum w:abstractNumId="145" w15:restartNumberingAfterBreak="0">
     <w:nsid w:val="5DB7107D"/>
     <w:multiLevelType w:val="multilevel"/>
     <w:tmpl w:val="6520107A"/>
@@ -37595,7 +39315,7 @@
       </w:rPr>
     </w:lvl>
   </w:abstractNum>
-  <w:abstractNum w:abstractNumId="138" w15:restartNumberingAfterBreak="0">
+  <w:abstractNum w:abstractNumId="146" w15:restartNumberingAfterBreak="0">
     <w:nsid w:val="5E9370A7"/>
     <w:multiLevelType w:val="hybridMultilevel"/>
     <w:tmpl w:val="13480456"/>
@@ -37681,7 +39401,7 @@
       </w:pPr>
     </w:lvl>
   </w:abstractNum>
-  <w:abstractNum w:abstractNumId="139" w15:restartNumberingAfterBreak="0">
+  <w:abstractNum w:abstractNumId="147" w15:restartNumberingAfterBreak="0">
     <w:nsid w:val="60421322"/>
     <w:multiLevelType w:val="hybridMultilevel"/>
     <w:tmpl w:val="447CDBDC"/>
@@ -37793,7 +39513,7 @@
       </w:rPr>
     </w:lvl>
   </w:abstractNum>
-  <w:abstractNum w:abstractNumId="140" w15:restartNumberingAfterBreak="0">
+  <w:abstractNum w:abstractNumId="148" w15:restartNumberingAfterBreak="0">
     <w:nsid w:val="61926C31"/>
     <w:multiLevelType w:val="hybridMultilevel"/>
     <w:tmpl w:val="AFD27E5C"/>
@@ -37906,7 +39626,7 @@
       </w:rPr>
     </w:lvl>
   </w:abstractNum>
-  <w:abstractNum w:abstractNumId="141" w15:restartNumberingAfterBreak="0">
+  <w:abstractNum w:abstractNumId="149" w15:restartNumberingAfterBreak="0">
     <w:nsid w:val="622F5FC7"/>
     <w:multiLevelType w:val="hybridMultilevel"/>
     <w:tmpl w:val="49A6C2A6"/>
@@ -38019,7 +39739,7 @@
       </w:rPr>
     </w:lvl>
   </w:abstractNum>
-  <w:abstractNum w:abstractNumId="142" w15:restartNumberingAfterBreak="0">
+  <w:abstractNum w:abstractNumId="150" w15:restartNumberingAfterBreak="0">
     <w:nsid w:val="62AC33B4"/>
     <w:multiLevelType w:val="multilevel"/>
     <w:tmpl w:val="A074F3CA"/>
@@ -38168,7 +39888,7 @@
       </w:rPr>
     </w:lvl>
   </w:abstractNum>
-  <w:abstractNum w:abstractNumId="143" w15:restartNumberingAfterBreak="0">
+  <w:abstractNum w:abstractNumId="151" w15:restartNumberingAfterBreak="0">
     <w:nsid w:val="63B44674"/>
     <w:multiLevelType w:val="multilevel"/>
     <w:tmpl w:val="08F4FA9A"/>
@@ -38317,7 +40037,7 @@
       </w:rPr>
     </w:lvl>
   </w:abstractNum>
-  <w:abstractNum w:abstractNumId="144" w15:restartNumberingAfterBreak="0">
+  <w:abstractNum w:abstractNumId="152" w15:restartNumberingAfterBreak="0">
     <w:nsid w:val="63C245D4"/>
     <w:multiLevelType w:val="hybridMultilevel"/>
     <w:tmpl w:val="E1563A56"/>
@@ -38429,7 +40149,7 @@
       </w:rPr>
     </w:lvl>
   </w:abstractNum>
-  <w:abstractNum w:abstractNumId="145" w15:restartNumberingAfterBreak="0">
+  <w:abstractNum w:abstractNumId="153" w15:restartNumberingAfterBreak="0">
     <w:nsid w:val="64F30198"/>
     <w:multiLevelType w:val="multilevel"/>
     <w:tmpl w:val="63F4E6F0"/>
@@ -38578,7 +40298,7 @@
       </w:rPr>
     </w:lvl>
   </w:abstractNum>
-  <w:abstractNum w:abstractNumId="146" w15:restartNumberingAfterBreak="0">
+  <w:abstractNum w:abstractNumId="154" w15:restartNumberingAfterBreak="0">
     <w:nsid w:val="65AF2502"/>
     <w:multiLevelType w:val="hybridMultilevel"/>
     <w:tmpl w:val="FB2A44D8"/>
@@ -38691,7 +40411,7 @@
       </w:rPr>
     </w:lvl>
   </w:abstractNum>
-  <w:abstractNum w:abstractNumId="147" w15:restartNumberingAfterBreak="0">
+  <w:abstractNum w:abstractNumId="155" w15:restartNumberingAfterBreak="0">
     <w:nsid w:val="66E768BB"/>
     <w:multiLevelType w:val="hybridMultilevel"/>
     <w:tmpl w:val="43A43606"/>
@@ -38804,7 +40524,7 @@
       </w:rPr>
     </w:lvl>
   </w:abstractNum>
-  <w:abstractNum w:abstractNumId="148" w15:restartNumberingAfterBreak="0">
+  <w:abstractNum w:abstractNumId="156" w15:restartNumberingAfterBreak="0">
     <w:nsid w:val="671614F0"/>
     <w:multiLevelType w:val="multilevel"/>
     <w:tmpl w:val="63F4E6F0"/>
@@ -38953,7 +40673,7 @@
       </w:rPr>
     </w:lvl>
   </w:abstractNum>
-  <w:abstractNum w:abstractNumId="149" w15:restartNumberingAfterBreak="0">
+  <w:abstractNum w:abstractNumId="157" w15:restartNumberingAfterBreak="0">
     <w:nsid w:val="6859691D"/>
     <w:multiLevelType w:val="multilevel"/>
     <w:tmpl w:val="826A9D48"/>
@@ -39102,7 +40822,7 @@
       </w:rPr>
     </w:lvl>
   </w:abstractNum>
-  <w:abstractNum w:abstractNumId="150" w15:restartNumberingAfterBreak="0">
+  <w:abstractNum w:abstractNumId="158" w15:restartNumberingAfterBreak="0">
     <w:nsid w:val="68817757"/>
     <w:multiLevelType w:val="multilevel"/>
     <w:tmpl w:val="34EE1968"/>
@@ -39251,7 +40971,7 @@
       </w:rPr>
     </w:lvl>
   </w:abstractNum>
-  <w:abstractNum w:abstractNumId="151" w15:restartNumberingAfterBreak="0">
+  <w:abstractNum w:abstractNumId="159" w15:restartNumberingAfterBreak="0">
     <w:nsid w:val="68AE31AF"/>
     <w:multiLevelType w:val="hybridMultilevel"/>
     <w:tmpl w:val="9EB648FC"/>
@@ -39364,7 +41084,7 @@
       </w:rPr>
     </w:lvl>
   </w:abstractNum>
-  <w:abstractNum w:abstractNumId="152" w15:restartNumberingAfterBreak="0">
+  <w:abstractNum w:abstractNumId="160" w15:restartNumberingAfterBreak="0">
     <w:nsid w:val="68BE10E8"/>
     <w:multiLevelType w:val="hybridMultilevel"/>
     <w:tmpl w:val="326CD592"/>
@@ -39477,7 +41197,7 @@
       </w:rPr>
     </w:lvl>
   </w:abstractNum>
-  <w:abstractNum w:abstractNumId="153" w15:restartNumberingAfterBreak="0">
+  <w:abstractNum w:abstractNumId="161" w15:restartNumberingAfterBreak="0">
     <w:nsid w:val="68E86299"/>
     <w:multiLevelType w:val="hybridMultilevel"/>
     <w:tmpl w:val="9B5CBEE8"/>
@@ -39563,7 +41283,7 @@
       </w:pPr>
     </w:lvl>
   </w:abstractNum>
-  <w:abstractNum w:abstractNumId="154" w15:restartNumberingAfterBreak="0">
+  <w:abstractNum w:abstractNumId="162" w15:restartNumberingAfterBreak="0">
     <w:nsid w:val="69996D9A"/>
     <w:multiLevelType w:val="multilevel"/>
     <w:tmpl w:val="1780FC38"/>
@@ -39712,7 +41432,7 @@
       </w:rPr>
     </w:lvl>
   </w:abstractNum>
-  <w:abstractNum w:abstractNumId="155" w15:restartNumberingAfterBreak="0">
+  <w:abstractNum w:abstractNumId="163" w15:restartNumberingAfterBreak="0">
     <w:nsid w:val="6A6609CC"/>
     <w:multiLevelType w:val="hybridMultilevel"/>
     <w:tmpl w:val="BF8CCE7C"/>
@@ -39801,7 +41521,7 @@
       </w:pPr>
     </w:lvl>
   </w:abstractNum>
-  <w:abstractNum w:abstractNumId="156" w15:restartNumberingAfterBreak="0">
+  <w:abstractNum w:abstractNumId="164" w15:restartNumberingAfterBreak="0">
     <w:nsid w:val="6B3C30B9"/>
     <w:multiLevelType w:val="hybridMultilevel"/>
     <w:tmpl w:val="C938F8DE"/>
@@ -39913,7 +41633,7 @@
       </w:rPr>
     </w:lvl>
   </w:abstractNum>
-  <w:abstractNum w:abstractNumId="157" w15:restartNumberingAfterBreak="0">
+  <w:abstractNum w:abstractNumId="165" w15:restartNumberingAfterBreak="0">
     <w:nsid w:val="6C9272BF"/>
     <w:multiLevelType w:val="hybridMultilevel"/>
     <w:tmpl w:val="AE021BFA"/>
@@ -40026,7 +41746,7 @@
       </w:rPr>
     </w:lvl>
   </w:abstractNum>
-  <w:abstractNum w:abstractNumId="158" w15:restartNumberingAfterBreak="0">
+  <w:abstractNum w:abstractNumId="166" w15:restartNumberingAfterBreak="0">
     <w:nsid w:val="6D1511A0"/>
     <w:multiLevelType w:val="hybridMultilevel"/>
     <w:tmpl w:val="AAD8B9B4"/>
@@ -40138,7 +41858,7 @@
       </w:rPr>
     </w:lvl>
   </w:abstractNum>
-  <w:abstractNum w:abstractNumId="159" w15:restartNumberingAfterBreak="0">
+  <w:abstractNum w:abstractNumId="167" w15:restartNumberingAfterBreak="0">
     <w:nsid w:val="6DD255F1"/>
     <w:multiLevelType w:val="hybridMultilevel"/>
     <w:tmpl w:val="ACBC1404"/>
@@ -40251,7 +41971,7 @@
       </w:rPr>
     </w:lvl>
   </w:abstractNum>
-  <w:abstractNum w:abstractNumId="160" w15:restartNumberingAfterBreak="0">
+  <w:abstractNum w:abstractNumId="168" w15:restartNumberingAfterBreak="0">
     <w:nsid w:val="6DDB4404"/>
     <w:multiLevelType w:val="hybridMultilevel"/>
     <w:tmpl w:val="06428E32"/>
@@ -40364,7 +42084,7 @@
       </w:rPr>
     </w:lvl>
   </w:abstractNum>
-  <w:abstractNum w:abstractNumId="161" w15:restartNumberingAfterBreak="0">
+  <w:abstractNum w:abstractNumId="169" w15:restartNumberingAfterBreak="0">
     <w:nsid w:val="6E0F754C"/>
     <w:multiLevelType w:val="hybridMultilevel"/>
     <w:tmpl w:val="44BEB490"/>
@@ -40450,7 +42170,7 @@
       </w:pPr>
     </w:lvl>
   </w:abstractNum>
-  <w:abstractNum w:abstractNumId="162" w15:restartNumberingAfterBreak="0">
+  <w:abstractNum w:abstractNumId="170" w15:restartNumberingAfterBreak="0">
     <w:nsid w:val="6F014B3B"/>
     <w:multiLevelType w:val="hybridMultilevel"/>
     <w:tmpl w:val="C89A39BE"/>
@@ -40562,7 +42282,7 @@
       </w:rPr>
     </w:lvl>
   </w:abstractNum>
-  <w:abstractNum w:abstractNumId="163" w15:restartNumberingAfterBreak="0">
+  <w:abstractNum w:abstractNumId="171" w15:restartNumberingAfterBreak="0">
     <w:nsid w:val="6F171273"/>
     <w:multiLevelType w:val="multilevel"/>
     <w:tmpl w:val="0240C564"/>
@@ -40711,7 +42431,7 @@
       </w:rPr>
     </w:lvl>
   </w:abstractNum>
-  <w:abstractNum w:abstractNumId="164" w15:restartNumberingAfterBreak="0">
+  <w:abstractNum w:abstractNumId="172" w15:restartNumberingAfterBreak="0">
     <w:nsid w:val="6FB82AAA"/>
     <w:multiLevelType w:val="multilevel"/>
     <w:tmpl w:val="FC46C7C0"/>
@@ -40860,7 +42580,7 @@
       </w:rPr>
     </w:lvl>
   </w:abstractNum>
-  <w:abstractNum w:abstractNumId="165" w15:restartNumberingAfterBreak="0">
+  <w:abstractNum w:abstractNumId="173" w15:restartNumberingAfterBreak="0">
     <w:nsid w:val="6FD46DCF"/>
     <w:multiLevelType w:val="hybridMultilevel"/>
     <w:tmpl w:val="EF5E6EC6"/>
@@ -40973,7 +42693,7 @@
       </w:rPr>
     </w:lvl>
   </w:abstractNum>
-  <w:abstractNum w:abstractNumId="166" w15:restartNumberingAfterBreak="0">
+  <w:abstractNum w:abstractNumId="174" w15:restartNumberingAfterBreak="0">
     <w:nsid w:val="70484E38"/>
     <w:multiLevelType w:val="multilevel"/>
     <w:tmpl w:val="22B26DD2"/>
@@ -41122,7 +42842,7 @@
       </w:rPr>
     </w:lvl>
   </w:abstractNum>
-  <w:abstractNum w:abstractNumId="167" w15:restartNumberingAfterBreak="0">
+  <w:abstractNum w:abstractNumId="175" w15:restartNumberingAfterBreak="0">
     <w:nsid w:val="70CB723E"/>
     <w:multiLevelType w:val="multilevel"/>
     <w:tmpl w:val="63F4E6F0"/>
@@ -41271,7 +42991,7 @@
       </w:rPr>
     </w:lvl>
   </w:abstractNum>
-  <w:abstractNum w:abstractNumId="168" w15:restartNumberingAfterBreak="0">
+  <w:abstractNum w:abstractNumId="176" w15:restartNumberingAfterBreak="0">
     <w:nsid w:val="71DB3F58"/>
     <w:multiLevelType w:val="multilevel"/>
     <w:tmpl w:val="63F4E6F0"/>
@@ -41420,7 +43140,7 @@
       </w:rPr>
     </w:lvl>
   </w:abstractNum>
-  <w:abstractNum w:abstractNumId="169" w15:restartNumberingAfterBreak="0">
+  <w:abstractNum w:abstractNumId="177" w15:restartNumberingAfterBreak="0">
     <w:nsid w:val="72882C15"/>
     <w:multiLevelType w:val="hybridMultilevel"/>
     <w:tmpl w:val="DD3837E6"/>
@@ -41506,7 +43226,7 @@
       </w:pPr>
     </w:lvl>
   </w:abstractNum>
-  <w:abstractNum w:abstractNumId="170" w15:restartNumberingAfterBreak="0">
+  <w:abstractNum w:abstractNumId="178" w15:restartNumberingAfterBreak="0">
     <w:nsid w:val="72F31FF2"/>
     <w:multiLevelType w:val="hybridMultilevel"/>
     <w:tmpl w:val="5C2693A0"/>
@@ -41618,7 +43338,120 @@
       </w:rPr>
     </w:lvl>
   </w:abstractNum>
-  <w:abstractNum w:abstractNumId="171" w15:restartNumberingAfterBreak="0">
+  <w:abstractNum w:abstractNumId="179" w15:restartNumberingAfterBreak="0">
+    <w:nsid w:val="75727275"/>
+    <w:multiLevelType w:val="hybridMultilevel"/>
+    <w:tmpl w:val="7C2ACC3E"/>
+    <w:lvl w:ilvl="0" w:tplc="CDE8CF4A">
+      <w:start w:val="7"/>
+      <w:numFmt w:val="bullet"/>
+      <w:lvlText w:val="-"/>
+      <w:lvlJc w:val="left"/>
+      <w:pPr>
+        <w:ind w:left="1440" w:hanging="360"/>
+      </w:pPr>
+      <w:rPr>
+        <w:rFonts w:ascii="Times New Roman" w:eastAsiaTheme="minorHAnsi" w:hAnsi="Times New Roman" w:cs="Times New Roman" w:hint="default"/>
+      </w:rPr>
+    </w:lvl>
+    <w:lvl w:ilvl="1" w:tplc="04090003" w:tentative="1">
+      <w:start w:val="1"/>
+      <w:numFmt w:val="bullet"/>
+      <w:lvlText w:val="o"/>
+      <w:lvlJc w:val="left"/>
+      <w:pPr>
+        <w:ind w:left="1440" w:hanging="360"/>
+      </w:pPr>
+      <w:rPr>
+        <w:rFonts w:ascii="Courier New" w:hAnsi="Courier New" w:cs="Courier New" w:hint="default"/>
+      </w:rPr>
+    </w:lvl>
+    <w:lvl w:ilvl="2" w:tplc="04090005" w:tentative="1">
+      <w:start w:val="1"/>
+      <w:numFmt w:val="bullet"/>
+      <w:lvlText w:val=""/>
+      <w:lvlJc w:val="left"/>
+      <w:pPr>
+        <w:ind w:left="2160" w:hanging="360"/>
+      </w:pPr>
+      <w:rPr>
+        <w:rFonts w:ascii="Wingdings" w:hAnsi="Wingdings" w:hint="default"/>
+      </w:rPr>
+    </w:lvl>
+    <w:lvl w:ilvl="3" w:tplc="04090001" w:tentative="1">
+      <w:start w:val="1"/>
+      <w:numFmt w:val="bullet"/>
+      <w:lvlText w:val=""/>
+      <w:lvlJc w:val="left"/>
+      <w:pPr>
+        <w:ind w:left="2880" w:hanging="360"/>
+      </w:pPr>
+      <w:rPr>
+        <w:rFonts w:ascii="Symbol" w:hAnsi="Symbol" w:hint="default"/>
+      </w:rPr>
+    </w:lvl>
+    <w:lvl w:ilvl="4" w:tplc="04090003" w:tentative="1">
+      <w:start w:val="1"/>
+      <w:numFmt w:val="bullet"/>
+      <w:lvlText w:val="o"/>
+      <w:lvlJc w:val="left"/>
+      <w:pPr>
+        <w:ind w:left="3600" w:hanging="360"/>
+      </w:pPr>
+      <w:rPr>
+        <w:rFonts w:ascii="Courier New" w:hAnsi="Courier New" w:cs="Courier New" w:hint="default"/>
+      </w:rPr>
+    </w:lvl>
+    <w:lvl w:ilvl="5" w:tplc="04090005" w:tentative="1">
+      <w:start w:val="1"/>
+      <w:numFmt w:val="bullet"/>
+      <w:lvlText w:val=""/>
+      <w:lvlJc w:val="left"/>
+      <w:pPr>
+        <w:ind w:left="4320" w:hanging="360"/>
+      </w:pPr>
+      <w:rPr>
+        <w:rFonts w:ascii="Wingdings" w:hAnsi="Wingdings" w:hint="default"/>
+      </w:rPr>
+    </w:lvl>
+    <w:lvl w:ilvl="6" w:tplc="04090001" w:tentative="1">
+      <w:start w:val="1"/>
+      <w:numFmt w:val="bullet"/>
+      <w:lvlText w:val=""/>
+      <w:lvlJc w:val="left"/>
+      <w:pPr>
+        <w:ind w:left="5040" w:hanging="360"/>
+      </w:pPr>
+      <w:rPr>
+        <w:rFonts w:ascii="Symbol" w:hAnsi="Symbol" w:hint="default"/>
+      </w:rPr>
+    </w:lvl>
+    <w:lvl w:ilvl="7" w:tplc="04090003" w:tentative="1">
+      <w:start w:val="1"/>
+      <w:numFmt w:val="bullet"/>
+      <w:lvlText w:val="o"/>
+      <w:lvlJc w:val="left"/>
+      <w:pPr>
+        <w:ind w:left="5760" w:hanging="360"/>
+      </w:pPr>
+      <w:rPr>
+        <w:rFonts w:ascii="Courier New" w:hAnsi="Courier New" w:cs="Courier New" w:hint="default"/>
+      </w:rPr>
+    </w:lvl>
+    <w:lvl w:ilvl="8" w:tplc="04090005" w:tentative="1">
+      <w:start w:val="1"/>
+      <w:numFmt w:val="bullet"/>
+      <w:lvlText w:val=""/>
+      <w:lvlJc w:val="left"/>
+      <w:pPr>
+        <w:ind w:left="6480" w:hanging="360"/>
+      </w:pPr>
+      <w:rPr>
+        <w:rFonts w:ascii="Wingdings" w:hAnsi="Wingdings" w:hint="default"/>
+      </w:rPr>
+    </w:lvl>
+  </w:abstractNum>
+  <w:abstractNum w:abstractNumId="180" w15:restartNumberingAfterBreak="0">
     <w:nsid w:val="75B45140"/>
     <w:multiLevelType w:val="hybridMultilevel"/>
     <w:tmpl w:val="93F8F3C4"/>
@@ -41731,7 +43564,7 @@
       </w:rPr>
     </w:lvl>
   </w:abstractNum>
-  <w:abstractNum w:abstractNumId="172" w15:restartNumberingAfterBreak="0">
+  <w:abstractNum w:abstractNumId="181" w15:restartNumberingAfterBreak="0">
     <w:nsid w:val="75D9584F"/>
     <w:multiLevelType w:val="hybridMultilevel"/>
     <w:tmpl w:val="B76E8894"/>
@@ -41844,7 +43677,120 @@
       </w:rPr>
     </w:lvl>
   </w:abstractNum>
-  <w:abstractNum w:abstractNumId="173" w15:restartNumberingAfterBreak="0">
+  <w:abstractNum w:abstractNumId="182" w15:restartNumberingAfterBreak="0">
+    <w:nsid w:val="76F43236"/>
+    <w:multiLevelType w:val="hybridMultilevel"/>
+    <w:tmpl w:val="DAFEF39E"/>
+    <w:lvl w:ilvl="0" w:tplc="04090005">
+      <w:start w:val="1"/>
+      <w:numFmt w:val="bullet"/>
+      <w:lvlText w:val=""/>
+      <w:lvlJc w:val="left"/>
+      <w:pPr>
+        <w:ind w:left="720" w:hanging="360"/>
+      </w:pPr>
+      <w:rPr>
+        <w:rFonts w:ascii="Wingdings" w:hAnsi="Wingdings" w:hint="default"/>
+      </w:rPr>
+    </w:lvl>
+    <w:lvl w:ilvl="1" w:tplc="04090003" w:tentative="1">
+      <w:start w:val="1"/>
+      <w:numFmt w:val="bullet"/>
+      <w:lvlText w:val="o"/>
+      <w:lvlJc w:val="left"/>
+      <w:pPr>
+        <w:ind w:left="1440" w:hanging="360"/>
+      </w:pPr>
+      <w:rPr>
+        <w:rFonts w:ascii="Courier New" w:hAnsi="Courier New" w:cs="Courier New" w:hint="default"/>
+      </w:rPr>
+    </w:lvl>
+    <w:lvl w:ilvl="2" w:tplc="04090005" w:tentative="1">
+      <w:start w:val="1"/>
+      <w:numFmt w:val="bullet"/>
+      <w:lvlText w:val=""/>
+      <w:lvlJc w:val="left"/>
+      <w:pPr>
+        <w:ind w:left="2160" w:hanging="360"/>
+      </w:pPr>
+      <w:rPr>
+        <w:rFonts w:ascii="Wingdings" w:hAnsi="Wingdings" w:hint="default"/>
+      </w:rPr>
+    </w:lvl>
+    <w:lvl w:ilvl="3" w:tplc="04090001" w:tentative="1">
+      <w:start w:val="1"/>
+      <w:numFmt w:val="bullet"/>
+      <w:lvlText w:val=""/>
+      <w:lvlJc w:val="left"/>
+      <w:pPr>
+        <w:ind w:left="2880" w:hanging="360"/>
+      </w:pPr>
+      <w:rPr>
+        <w:rFonts w:ascii="Symbol" w:hAnsi="Symbol" w:hint="default"/>
+      </w:rPr>
+    </w:lvl>
+    <w:lvl w:ilvl="4" w:tplc="04090003" w:tentative="1">
+      <w:start w:val="1"/>
+      <w:numFmt w:val="bullet"/>
+      <w:lvlText w:val="o"/>
+      <w:lvlJc w:val="left"/>
+      <w:pPr>
+        <w:ind w:left="3600" w:hanging="360"/>
+      </w:pPr>
+      <w:rPr>
+        <w:rFonts w:ascii="Courier New" w:hAnsi="Courier New" w:cs="Courier New" w:hint="default"/>
+      </w:rPr>
+    </w:lvl>
+    <w:lvl w:ilvl="5" w:tplc="04090005" w:tentative="1">
+      <w:start w:val="1"/>
+      <w:numFmt w:val="bullet"/>
+      <w:lvlText w:val=""/>
+      <w:lvlJc w:val="left"/>
+      <w:pPr>
+        <w:ind w:left="4320" w:hanging="360"/>
+      </w:pPr>
+      <w:rPr>
+        <w:rFonts w:ascii="Wingdings" w:hAnsi="Wingdings" w:hint="default"/>
+      </w:rPr>
+    </w:lvl>
+    <w:lvl w:ilvl="6" w:tplc="04090001" w:tentative="1">
+      <w:start w:val="1"/>
+      <w:numFmt w:val="bullet"/>
+      <w:lvlText w:val=""/>
+      <w:lvlJc w:val="left"/>
+      <w:pPr>
+        <w:ind w:left="5040" w:hanging="360"/>
+      </w:pPr>
+      <w:rPr>
+        <w:rFonts w:ascii="Symbol" w:hAnsi="Symbol" w:hint="default"/>
+      </w:rPr>
+    </w:lvl>
+    <w:lvl w:ilvl="7" w:tplc="04090003" w:tentative="1">
+      <w:start w:val="1"/>
+      <w:numFmt w:val="bullet"/>
+      <w:lvlText w:val="o"/>
+      <w:lvlJc w:val="left"/>
+      <w:pPr>
+        <w:ind w:left="5760" w:hanging="360"/>
+      </w:pPr>
+      <w:rPr>
+        <w:rFonts w:ascii="Courier New" w:hAnsi="Courier New" w:cs="Courier New" w:hint="default"/>
+      </w:rPr>
+    </w:lvl>
+    <w:lvl w:ilvl="8" w:tplc="04090005" w:tentative="1">
+      <w:start w:val="1"/>
+      <w:numFmt w:val="bullet"/>
+      <w:lvlText w:val=""/>
+      <w:lvlJc w:val="left"/>
+      <w:pPr>
+        <w:ind w:left="6480" w:hanging="360"/>
+      </w:pPr>
+      <w:rPr>
+        <w:rFonts w:ascii="Wingdings" w:hAnsi="Wingdings" w:hint="default"/>
+      </w:rPr>
+    </w:lvl>
+  </w:abstractNum>
+  <w:abstractNum w:abstractNumId="183" w15:restartNumberingAfterBreak="0">
     <w:nsid w:val="76F60FFE"/>
     <w:multiLevelType w:val="multilevel"/>
     <w:tmpl w:val="63F4E6F0"/>
@@ -41993,7 +43939,7 @@
       </w:rPr>
     </w:lvl>
   </w:abstractNum>
-  <w:abstractNum w:abstractNumId="174" w15:restartNumberingAfterBreak="0">
+  <w:abstractNum w:abstractNumId="184" w15:restartNumberingAfterBreak="0">
     <w:nsid w:val="772A45B4"/>
     <w:multiLevelType w:val="hybridMultilevel"/>
     <w:tmpl w:val="B00AFD58"/>
@@ -42106,7 +44052,7 @@
       </w:rPr>
     </w:lvl>
   </w:abstractNum>
-  <w:abstractNum w:abstractNumId="175" w15:restartNumberingAfterBreak="0">
+  <w:abstractNum w:abstractNumId="185" w15:restartNumberingAfterBreak="0">
     <w:nsid w:val="77572323"/>
     <w:multiLevelType w:val="multilevel"/>
     <w:tmpl w:val="63F4E6F0"/>
@@ -42255,7 +44201,7 @@
       </w:rPr>
     </w:lvl>
   </w:abstractNum>
-  <w:abstractNum w:abstractNumId="176" w15:restartNumberingAfterBreak="0">
+  <w:abstractNum w:abstractNumId="186" w15:restartNumberingAfterBreak="0">
     <w:nsid w:val="77B8201F"/>
     <w:multiLevelType w:val="hybridMultilevel"/>
     <w:tmpl w:val="D7160708"/>
@@ -42367,7 +44313,7 @@
       </w:rPr>
     </w:lvl>
   </w:abstractNum>
-  <w:abstractNum w:abstractNumId="177" w15:restartNumberingAfterBreak="0">
+  <w:abstractNum w:abstractNumId="187" w15:restartNumberingAfterBreak="0">
     <w:nsid w:val="79796FF9"/>
     <w:multiLevelType w:val="hybridMultilevel"/>
     <w:tmpl w:val="CFA8EF82"/>
@@ -42479,7 +44425,7 @@
       </w:rPr>
     </w:lvl>
   </w:abstractNum>
-  <w:abstractNum w:abstractNumId="178" w15:restartNumberingAfterBreak="0">
+  <w:abstractNum w:abstractNumId="188" w15:restartNumberingAfterBreak="0">
     <w:nsid w:val="79910410"/>
     <w:multiLevelType w:val="hybridMultilevel"/>
     <w:tmpl w:val="FC923542"/>
@@ -42591,7 +44537,7 @@
       </w:rPr>
     </w:lvl>
   </w:abstractNum>
-  <w:abstractNum w:abstractNumId="179" w15:restartNumberingAfterBreak="0">
+  <w:abstractNum w:abstractNumId="189" w15:restartNumberingAfterBreak="0">
     <w:nsid w:val="79BF6B53"/>
     <w:multiLevelType w:val="hybridMultilevel"/>
     <w:tmpl w:val="4E2EA1E0"/>
@@ -42677,7 +44623,7 @@
       </w:pPr>
     </w:lvl>
   </w:abstractNum>
-  <w:abstractNum w:abstractNumId="180" w15:restartNumberingAfterBreak="0">
+  <w:abstractNum w:abstractNumId="190" w15:restartNumberingAfterBreak="0">
     <w:nsid w:val="7AFF575A"/>
     <w:multiLevelType w:val="hybridMultilevel"/>
     <w:tmpl w:val="A6323D3E"/>
@@ -42789,7 +44735,7 @@
       </w:rPr>
     </w:lvl>
   </w:abstractNum>
-  <w:abstractNum w:abstractNumId="181" w15:restartNumberingAfterBreak="0">
+  <w:abstractNum w:abstractNumId="191" w15:restartNumberingAfterBreak="0">
     <w:nsid w:val="7B4018BF"/>
     <w:multiLevelType w:val="multilevel"/>
     <w:tmpl w:val="63F4E6F0"/>
@@ -42938,7 +44884,7 @@
       </w:rPr>
     </w:lvl>
   </w:abstractNum>
-  <w:abstractNum w:abstractNumId="182" w15:restartNumberingAfterBreak="0">
+  <w:abstractNum w:abstractNumId="192" w15:restartNumberingAfterBreak="0">
     <w:nsid w:val="7B4D1B33"/>
     <w:multiLevelType w:val="hybridMultilevel"/>
     <w:tmpl w:val="5EAC717E"/>
@@ -43050,7 +44996,7 @@
       </w:rPr>
     </w:lvl>
   </w:abstractNum>
-  <w:abstractNum w:abstractNumId="183" w15:restartNumberingAfterBreak="0">
+  <w:abstractNum w:abstractNumId="193" w15:restartNumberingAfterBreak="0">
     <w:nsid w:val="7CAC27CD"/>
     <w:multiLevelType w:val="multilevel"/>
     <w:tmpl w:val="3BC20E58"/>
@@ -43199,7 +45145,7 @@
       </w:rPr>
     </w:lvl>
   </w:abstractNum>
-  <w:abstractNum w:abstractNumId="184" w15:restartNumberingAfterBreak="0">
+  <w:abstractNum w:abstractNumId="194" w15:restartNumberingAfterBreak="0">
     <w:nsid w:val="7E5978EA"/>
     <w:multiLevelType w:val="hybridMultilevel"/>
     <w:tmpl w:val="D74C0DB0"/>
@@ -43311,7 +45257,7 @@
       </w:rPr>
     </w:lvl>
   </w:abstractNum>
-  <w:abstractNum w:abstractNumId="185" w15:restartNumberingAfterBreak="0">
+  <w:abstractNum w:abstractNumId="195" w15:restartNumberingAfterBreak="0">
     <w:nsid w:val="7F106A5D"/>
     <w:multiLevelType w:val="hybridMultilevel"/>
     <w:tmpl w:val="A1CA4816"/>
@@ -43424,82 +45370,82 @@
     </w:lvl>
   </w:abstractNum>
   <w:num w:numId="1" w16cid:durableId="1882476756">
-    <w:abstractNumId w:val="106"/>
+    <w:abstractNumId w:val="111"/>
   </w:num>
   <w:num w:numId="2" w16cid:durableId="871453468">
     <w:abstractNumId w:val="30"/>
   </w:num>
   <w:num w:numId="3" w16cid:durableId="698706805">
-    <w:abstractNumId w:val="46"/>
+    <w:abstractNumId w:val="47"/>
   </w:num>
   <w:num w:numId="4" w16cid:durableId="1105467722">
-    <w:abstractNumId w:val="87"/>
+    <w:abstractNumId w:val="91"/>
   </w:num>
   <w:num w:numId="5" w16cid:durableId="769932622">
-    <w:abstractNumId w:val="125"/>
+    <w:abstractNumId w:val="131"/>
   </w:num>
   <w:num w:numId="6" w16cid:durableId="575944109">
-    <w:abstractNumId w:val="50"/>
+    <w:abstractNumId w:val="51"/>
   </w:num>
   <w:num w:numId="7" w16cid:durableId="877661689">
-    <w:abstractNumId w:val="166"/>
+    <w:abstractNumId w:val="174"/>
   </w:num>
   <w:num w:numId="8" w16cid:durableId="1390107422">
-    <w:abstractNumId w:val="93"/>
+    <w:abstractNumId w:val="97"/>
   </w:num>
   <w:num w:numId="9" w16cid:durableId="881866424">
-    <w:abstractNumId w:val="121"/>
+    <w:abstractNumId w:val="127"/>
   </w:num>
   <w:num w:numId="10" w16cid:durableId="1037244995">
-    <w:abstractNumId w:val="154"/>
+    <w:abstractNumId w:val="162"/>
   </w:num>
   <w:num w:numId="11" w16cid:durableId="1575554597">
-    <w:abstractNumId w:val="75"/>
+    <w:abstractNumId w:val="79"/>
   </w:num>
   <w:num w:numId="12" w16cid:durableId="915364478">
-    <w:abstractNumId w:val="100"/>
+    <w:abstractNumId w:val="104"/>
   </w:num>
   <w:num w:numId="13" w16cid:durableId="1386294114">
-    <w:abstractNumId w:val="143"/>
+    <w:abstractNumId w:val="151"/>
   </w:num>
   <w:num w:numId="14" w16cid:durableId="1071851223">
     <w:abstractNumId w:val="31"/>
   </w:num>
   <w:num w:numId="15" w16cid:durableId="1545557520">
-    <w:abstractNumId w:val="89"/>
+    <w:abstractNumId w:val="93"/>
   </w:num>
   <w:num w:numId="16" w16cid:durableId="1102919547">
-    <w:abstractNumId w:val="183"/>
+    <w:abstractNumId w:val="193"/>
   </w:num>
   <w:num w:numId="17" w16cid:durableId="294526838">
-    <w:abstractNumId w:val="63"/>
+    <w:abstractNumId w:val="65"/>
   </w:num>
   <w:num w:numId="18" w16cid:durableId="679889896">
-    <w:abstractNumId w:val="73"/>
+    <w:abstractNumId w:val="77"/>
   </w:num>
   <w:num w:numId="19" w16cid:durableId="2119449470">
-    <w:abstractNumId w:val="117"/>
+    <w:abstractNumId w:val="123"/>
   </w:num>
   <w:num w:numId="20" w16cid:durableId="1365054799">
     <w:abstractNumId w:val="19"/>
   </w:num>
   <w:num w:numId="21" w16cid:durableId="1683512738">
-    <w:abstractNumId w:val="74"/>
+    <w:abstractNumId w:val="78"/>
   </w:num>
   <w:num w:numId="22" w16cid:durableId="1080098953">
-    <w:abstractNumId w:val="149"/>
+    <w:abstractNumId w:val="157"/>
   </w:num>
   <w:num w:numId="23" w16cid:durableId="1635717296">
-    <w:abstractNumId w:val="80"/>
+    <w:abstractNumId w:val="84"/>
   </w:num>
   <w:num w:numId="24" w16cid:durableId="544873123">
-    <w:abstractNumId w:val="142"/>
+    <w:abstractNumId w:val="150"/>
   </w:num>
   <w:num w:numId="25" w16cid:durableId="1128352778">
     <w:abstractNumId w:val="18"/>
   </w:num>
   <w:num w:numId="26" w16cid:durableId="1732537407">
-    <w:abstractNumId w:val="160"/>
+    <w:abstractNumId w:val="168"/>
   </w:num>
   <w:num w:numId="27" w16cid:durableId="945502064">
     <w:abstractNumId w:val="8"/>
@@ -43508,61 +45454,61 @@
     <w:abstractNumId w:val="4"/>
   </w:num>
   <w:num w:numId="29" w16cid:durableId="815955639">
-    <w:abstractNumId w:val="71"/>
+    <w:abstractNumId w:val="74"/>
   </w:num>
   <w:num w:numId="30" w16cid:durableId="1500659483">
-    <w:abstractNumId w:val="97"/>
+    <w:abstractNumId w:val="101"/>
   </w:num>
   <w:num w:numId="31" w16cid:durableId="118301211">
     <w:abstractNumId w:val="20"/>
   </w:num>
   <w:num w:numId="32" w16cid:durableId="732387979">
-    <w:abstractNumId w:val="51"/>
+    <w:abstractNumId w:val="52"/>
   </w:num>
   <w:num w:numId="33" w16cid:durableId="2129276417">
     <w:abstractNumId w:val="23"/>
   </w:num>
   <w:num w:numId="34" w16cid:durableId="1470708820">
-    <w:abstractNumId w:val="58"/>
+    <w:abstractNumId w:val="60"/>
   </w:num>
   <w:num w:numId="35" w16cid:durableId="356852923">
-    <w:abstractNumId w:val="116"/>
+    <w:abstractNumId w:val="122"/>
   </w:num>
   <w:num w:numId="36" w16cid:durableId="430662559">
     <w:abstractNumId w:val="26"/>
   </w:num>
   <w:num w:numId="37" w16cid:durableId="247080868">
-    <w:abstractNumId w:val="171"/>
+    <w:abstractNumId w:val="180"/>
   </w:num>
   <w:num w:numId="38" w16cid:durableId="158887408">
-    <w:abstractNumId w:val="140"/>
+    <w:abstractNumId w:val="148"/>
   </w:num>
   <w:num w:numId="39" w16cid:durableId="1681347932">
-    <w:abstractNumId w:val="165"/>
+    <w:abstractNumId w:val="173"/>
   </w:num>
   <w:num w:numId="40" w16cid:durableId="2101440158">
-    <w:abstractNumId w:val="92"/>
+    <w:abstractNumId w:val="96"/>
   </w:num>
   <w:num w:numId="41" w16cid:durableId="1250391122">
-    <w:abstractNumId w:val="135"/>
+    <w:abstractNumId w:val="143"/>
   </w:num>
   <w:num w:numId="42" w16cid:durableId="479083359">
-    <w:abstractNumId w:val="170"/>
+    <w:abstractNumId w:val="178"/>
   </w:num>
   <w:num w:numId="43" w16cid:durableId="1557860317">
-    <w:abstractNumId w:val="118"/>
+    <w:abstractNumId w:val="124"/>
   </w:num>
   <w:num w:numId="44" w16cid:durableId="2142183763">
     <w:abstractNumId w:val="11"/>
   </w:num>
   <w:num w:numId="45" w16cid:durableId="1357736349">
-    <w:abstractNumId w:val="178"/>
+    <w:abstractNumId w:val="188"/>
   </w:num>
   <w:num w:numId="46" w16cid:durableId="1519656040">
-    <w:abstractNumId w:val="177"/>
+    <w:abstractNumId w:val="187"/>
   </w:num>
   <w:num w:numId="47" w16cid:durableId="1078596852">
-    <w:abstractNumId w:val="185"/>
+    <w:abstractNumId w:val="195"/>
   </w:num>
   <w:num w:numId="48" w16cid:durableId="1027950100">
     <w:abstractNumId w:val="42"/>
@@ -43571,22 +45517,22 @@
     <w:abstractNumId w:val="25"/>
   </w:num>
   <w:num w:numId="50" w16cid:durableId="363404927">
-    <w:abstractNumId w:val="81"/>
+    <w:abstractNumId w:val="85"/>
   </w:num>
   <w:num w:numId="51" w16cid:durableId="1128354320">
-    <w:abstractNumId w:val="158"/>
+    <w:abstractNumId w:val="166"/>
   </w:num>
   <w:num w:numId="52" w16cid:durableId="248543928">
-    <w:abstractNumId w:val="91"/>
+    <w:abstractNumId w:val="95"/>
   </w:num>
   <w:num w:numId="53" w16cid:durableId="965889214">
-    <w:abstractNumId w:val="123"/>
+    <w:abstractNumId w:val="129"/>
   </w:num>
   <w:num w:numId="54" w16cid:durableId="1827503240">
-    <w:abstractNumId w:val="133"/>
+    <w:abstractNumId w:val="141"/>
   </w:num>
   <w:num w:numId="55" w16cid:durableId="505748256">
-    <w:abstractNumId w:val="113"/>
+    <w:abstractNumId w:val="119"/>
   </w:num>
   <w:num w:numId="56" w16cid:durableId="2120370925">
     <w:abstractNumId w:val="39"/>
@@ -43595,52 +45541,52 @@
     <w:abstractNumId w:val="22"/>
   </w:num>
   <w:num w:numId="58" w16cid:durableId="1000235123">
-    <w:abstractNumId w:val="119"/>
+    <w:abstractNumId w:val="125"/>
   </w:num>
   <w:num w:numId="59" w16cid:durableId="628516409">
-    <w:abstractNumId w:val="156"/>
+    <w:abstractNumId w:val="164"/>
   </w:num>
   <w:num w:numId="60" w16cid:durableId="2028865444">
-    <w:abstractNumId w:val="110"/>
+    <w:abstractNumId w:val="116"/>
   </w:num>
   <w:num w:numId="61" w16cid:durableId="943926811">
-    <w:abstractNumId w:val="182"/>
+    <w:abstractNumId w:val="192"/>
   </w:num>
   <w:num w:numId="62" w16cid:durableId="1841193257">
-    <w:abstractNumId w:val="84"/>
+    <w:abstractNumId w:val="88"/>
   </w:num>
   <w:num w:numId="63" w16cid:durableId="682322850">
-    <w:abstractNumId w:val="162"/>
+    <w:abstractNumId w:val="170"/>
   </w:num>
   <w:num w:numId="64" w16cid:durableId="2043705333">
-    <w:abstractNumId w:val="85"/>
+    <w:abstractNumId w:val="89"/>
   </w:num>
   <w:num w:numId="65" w16cid:durableId="1164854761">
-    <w:abstractNumId w:val="62"/>
+    <w:abstractNumId w:val="64"/>
   </w:num>
   <w:num w:numId="66" w16cid:durableId="1919972541">
-    <w:abstractNumId w:val="102"/>
+    <w:abstractNumId w:val="106"/>
   </w:num>
   <w:num w:numId="67" w16cid:durableId="463617329">
-    <w:abstractNumId w:val="68"/>
+    <w:abstractNumId w:val="71"/>
   </w:num>
   <w:num w:numId="68" w16cid:durableId="2064014330">
-    <w:abstractNumId w:val="127"/>
+    <w:abstractNumId w:val="133"/>
   </w:num>
   <w:num w:numId="69" w16cid:durableId="452797354">
-    <w:abstractNumId w:val="134"/>
+    <w:abstractNumId w:val="142"/>
   </w:num>
   <w:num w:numId="70" w16cid:durableId="1196650037">
-    <w:abstractNumId w:val="56"/>
+    <w:abstractNumId w:val="58"/>
   </w:num>
   <w:num w:numId="71" w16cid:durableId="940071828">
-    <w:abstractNumId w:val="176"/>
+    <w:abstractNumId w:val="186"/>
   </w:num>
   <w:num w:numId="72" w16cid:durableId="1608273926">
-    <w:abstractNumId w:val="86"/>
+    <w:abstractNumId w:val="90"/>
   </w:num>
   <w:num w:numId="73" w16cid:durableId="2009864772">
-    <w:abstractNumId w:val="105"/>
+    <w:abstractNumId w:val="110"/>
   </w:num>
   <w:num w:numId="74" w16cid:durableId="712267004">
     <w:abstractNumId w:val="41"/>
@@ -43649,31 +45595,31 @@
     <w:abstractNumId w:val="37"/>
   </w:num>
   <w:num w:numId="76" w16cid:durableId="286202349">
-    <w:abstractNumId w:val="139"/>
+    <w:abstractNumId w:val="147"/>
   </w:num>
   <w:num w:numId="77" w16cid:durableId="156460757">
-    <w:abstractNumId w:val="76"/>
+    <w:abstractNumId w:val="80"/>
   </w:num>
   <w:num w:numId="78" w16cid:durableId="1230077056">
     <w:abstractNumId w:val="6"/>
   </w:num>
   <w:num w:numId="79" w16cid:durableId="1837106927">
-    <w:abstractNumId w:val="55"/>
+    <w:abstractNumId w:val="57"/>
   </w:num>
   <w:num w:numId="80" w16cid:durableId="287929152">
     <w:abstractNumId w:val="40"/>
   </w:num>
   <w:num w:numId="81" w16cid:durableId="1672175260">
-    <w:abstractNumId w:val="98"/>
+    <w:abstractNumId w:val="102"/>
   </w:num>
   <w:num w:numId="82" w16cid:durableId="1954820163">
-    <w:abstractNumId w:val="66"/>
+    <w:abstractNumId w:val="69"/>
   </w:num>
   <w:num w:numId="83" w16cid:durableId="1990016594">
     <w:abstractNumId w:val="28"/>
   </w:num>
   <w:num w:numId="84" w16cid:durableId="366876741">
-    <w:abstractNumId w:val="109"/>
+    <w:abstractNumId w:val="114"/>
   </w:num>
   <w:num w:numId="85" w16cid:durableId="15274915">
     <w:abstractNumId w:val="44"/>
@@ -43682,22 +45628,22 @@
     <w:abstractNumId w:val="13"/>
   </w:num>
   <w:num w:numId="87" w16cid:durableId="591351385">
-    <w:abstractNumId w:val="124"/>
+    <w:abstractNumId w:val="130"/>
   </w:num>
   <w:num w:numId="88" w16cid:durableId="1361005725">
-    <w:abstractNumId w:val="180"/>
+    <w:abstractNumId w:val="190"/>
   </w:num>
   <w:num w:numId="89" w16cid:durableId="219681743">
     <w:abstractNumId w:val="14"/>
   </w:num>
   <w:num w:numId="90" w16cid:durableId="194386594">
-    <w:abstractNumId w:val="136"/>
+    <w:abstractNumId w:val="144"/>
   </w:num>
   <w:num w:numId="91" w16cid:durableId="777793346">
-    <w:abstractNumId w:val="95"/>
+    <w:abstractNumId w:val="99"/>
   </w:num>
   <w:num w:numId="92" w16cid:durableId="173346871">
-    <w:abstractNumId w:val="101"/>
+    <w:abstractNumId w:val="105"/>
   </w:num>
   <w:num w:numId="93" w16cid:durableId="948700467">
     <w:abstractNumId w:val="45"/>
@@ -43706,94 +45652,94 @@
     <w:abstractNumId w:val="27"/>
   </w:num>
   <w:num w:numId="95" w16cid:durableId="541676570">
-    <w:abstractNumId w:val="77"/>
+    <w:abstractNumId w:val="81"/>
   </w:num>
   <w:num w:numId="96" w16cid:durableId="694119229">
-    <w:abstractNumId w:val="99"/>
+    <w:abstractNumId w:val="103"/>
   </w:num>
   <w:num w:numId="97" w16cid:durableId="704327987">
-    <w:abstractNumId w:val="60"/>
+    <w:abstractNumId w:val="62"/>
   </w:num>
   <w:num w:numId="98" w16cid:durableId="1157303613">
     <w:abstractNumId w:val="29"/>
   </w:num>
   <w:num w:numId="99" w16cid:durableId="1706099794">
-    <w:abstractNumId w:val="164"/>
+    <w:abstractNumId w:val="172"/>
   </w:num>
   <w:num w:numId="100" w16cid:durableId="256404901">
-    <w:abstractNumId w:val="163"/>
+    <w:abstractNumId w:val="171"/>
   </w:num>
   <w:num w:numId="101" w16cid:durableId="924923012">
     <w:abstractNumId w:val="34"/>
   </w:num>
   <w:num w:numId="102" w16cid:durableId="536550966">
-    <w:abstractNumId w:val="181"/>
+    <w:abstractNumId w:val="191"/>
   </w:num>
   <w:num w:numId="103" w16cid:durableId="425157302">
-    <w:abstractNumId w:val="78"/>
+    <w:abstractNumId w:val="82"/>
   </w:num>
   <w:num w:numId="104" w16cid:durableId="967664612">
-    <w:abstractNumId w:val="145"/>
+    <w:abstractNumId w:val="153"/>
   </w:num>
   <w:num w:numId="105" w16cid:durableId="361631616">
-    <w:abstractNumId w:val="111"/>
+    <w:abstractNumId w:val="117"/>
   </w:num>
   <w:num w:numId="106" w16cid:durableId="443623616">
-    <w:abstractNumId w:val="150"/>
+    <w:abstractNumId w:val="158"/>
   </w:num>
   <w:num w:numId="107" w16cid:durableId="150101619">
     <w:abstractNumId w:val="16"/>
   </w:num>
   <w:num w:numId="108" w16cid:durableId="1431658174">
-    <w:abstractNumId w:val="64"/>
+    <w:abstractNumId w:val="66"/>
   </w:num>
   <w:num w:numId="109" w16cid:durableId="1050495440">
     <w:abstractNumId w:val="0"/>
   </w:num>
   <w:num w:numId="110" w16cid:durableId="712924661">
-    <w:abstractNumId w:val="131"/>
+    <w:abstractNumId w:val="139"/>
   </w:num>
   <w:num w:numId="111" w16cid:durableId="1917784113">
-    <w:abstractNumId w:val="126"/>
+    <w:abstractNumId w:val="132"/>
   </w:num>
   <w:num w:numId="112" w16cid:durableId="896237065">
-    <w:abstractNumId w:val="137"/>
+    <w:abstractNumId w:val="145"/>
   </w:num>
   <w:num w:numId="113" w16cid:durableId="1171681430">
-    <w:abstractNumId w:val="167"/>
+    <w:abstractNumId w:val="175"/>
   </w:num>
   <w:num w:numId="114" w16cid:durableId="1552573199">
-    <w:abstractNumId w:val="168"/>
+    <w:abstractNumId w:val="176"/>
   </w:num>
   <w:num w:numId="115" w16cid:durableId="1920869674">
-    <w:abstractNumId w:val="148"/>
+    <w:abstractNumId w:val="156"/>
   </w:num>
   <w:num w:numId="116" w16cid:durableId="476724716">
-    <w:abstractNumId w:val="115"/>
+    <w:abstractNumId w:val="121"/>
   </w:num>
   <w:num w:numId="117" w16cid:durableId="658919541">
-    <w:abstractNumId w:val="114"/>
+    <w:abstractNumId w:val="120"/>
   </w:num>
   <w:num w:numId="118" w16cid:durableId="1622418131">
-    <w:abstractNumId w:val="53"/>
+    <w:abstractNumId w:val="54"/>
   </w:num>
   <w:num w:numId="119" w16cid:durableId="1693994672">
     <w:abstractNumId w:val="3"/>
   </w:num>
   <w:num w:numId="120" w16cid:durableId="396828229">
-    <w:abstractNumId w:val="175"/>
+    <w:abstractNumId w:val="185"/>
   </w:num>
   <w:num w:numId="121" w16cid:durableId="986058889">
     <w:abstractNumId w:val="24"/>
   </w:num>
   <w:num w:numId="122" w16cid:durableId="1224410703">
-    <w:abstractNumId w:val="70"/>
+    <w:abstractNumId w:val="73"/>
   </w:num>
   <w:num w:numId="123" w16cid:durableId="1804040304">
-    <w:abstractNumId w:val="94"/>
+    <w:abstractNumId w:val="98"/>
   </w:num>
   <w:num w:numId="124" w16cid:durableId="114181197">
-    <w:abstractNumId w:val="173"/>
+    <w:abstractNumId w:val="183"/>
   </w:num>
   <w:num w:numId="125" w16cid:durableId="772671624">
     <w:abstractNumId w:val="5"/>
@@ -43802,88 +45748,88 @@
     <w:abstractNumId w:val="9"/>
   </w:num>
   <w:num w:numId="127" w16cid:durableId="1818105337">
-    <w:abstractNumId w:val="59"/>
+    <w:abstractNumId w:val="61"/>
   </w:num>
   <w:num w:numId="128" w16cid:durableId="384987847">
     <w:abstractNumId w:val="35"/>
   </w:num>
   <w:num w:numId="129" w16cid:durableId="659895420">
-    <w:abstractNumId w:val="69"/>
+    <w:abstractNumId w:val="72"/>
   </w:num>
   <w:num w:numId="130" w16cid:durableId="1168907903">
-    <w:abstractNumId w:val="152"/>
+    <w:abstractNumId w:val="160"/>
   </w:num>
   <w:num w:numId="131" w16cid:durableId="430206235">
-    <w:abstractNumId w:val="141"/>
+    <w:abstractNumId w:val="149"/>
   </w:num>
   <w:num w:numId="132" w16cid:durableId="1207327089">
     <w:abstractNumId w:val="33"/>
   </w:num>
   <w:num w:numId="133" w16cid:durableId="596404292">
-    <w:abstractNumId w:val="128"/>
+    <w:abstractNumId w:val="134"/>
   </w:num>
   <w:num w:numId="134" w16cid:durableId="2070372549">
+    <w:abstractNumId w:val="50"/>
+  </w:num>
+  <w:num w:numId="135" w16cid:durableId="1841265039">
+    <w:abstractNumId w:val="55"/>
+  </w:num>
+  <w:num w:numId="136" w16cid:durableId="1988632595">
     <w:abstractNumId w:val="49"/>
   </w:num>
-  <w:num w:numId="135" w16cid:durableId="1841265039">
-    <w:abstractNumId w:val="54"/>
-  </w:num>
-  <w:num w:numId="136" w16cid:durableId="1988632595">
-    <w:abstractNumId w:val="48"/>
-  </w:num>
   <w:num w:numId="137" w16cid:durableId="1218275126">
-    <w:abstractNumId w:val="82"/>
+    <w:abstractNumId w:val="86"/>
   </w:num>
   <w:num w:numId="138" w16cid:durableId="568660900">
-    <w:abstractNumId w:val="90"/>
+    <w:abstractNumId w:val="94"/>
   </w:num>
   <w:num w:numId="139" w16cid:durableId="967976864">
-    <w:abstractNumId w:val="129"/>
+    <w:abstractNumId w:val="136"/>
   </w:num>
   <w:num w:numId="140" w16cid:durableId="650643288">
-    <w:abstractNumId w:val="146"/>
+    <w:abstractNumId w:val="154"/>
   </w:num>
   <w:num w:numId="141" w16cid:durableId="219370247">
-    <w:abstractNumId w:val="144"/>
+    <w:abstractNumId w:val="152"/>
   </w:num>
   <w:num w:numId="142" w16cid:durableId="323239876">
-    <w:abstractNumId w:val="184"/>
+    <w:abstractNumId w:val="194"/>
   </w:num>
   <w:num w:numId="143" w16cid:durableId="1619793156">
     <w:abstractNumId w:val="38"/>
   </w:num>
   <w:num w:numId="144" w16cid:durableId="1186332867">
-    <w:abstractNumId w:val="159"/>
+    <w:abstractNumId w:val="167"/>
   </w:num>
   <w:num w:numId="145" w16cid:durableId="89937035">
-    <w:abstractNumId w:val="61"/>
+    <w:abstractNumId w:val="63"/>
   </w:num>
   <w:num w:numId="146" w16cid:durableId="1975022609">
     <w:abstractNumId w:val="1"/>
   </w:num>
   <w:num w:numId="147" w16cid:durableId="1760910030">
-    <w:abstractNumId w:val="120"/>
+    <w:abstractNumId w:val="126"/>
   </w:num>
   <w:num w:numId="148" w16cid:durableId="349307706">
-    <w:abstractNumId w:val="153"/>
+    <w:abstractNumId w:val="161"/>
   </w:num>
   <w:num w:numId="149" w16cid:durableId="1600336622">
     <w:abstractNumId w:val="36"/>
   </w:num>
   <w:num w:numId="150" w16cid:durableId="789783474">
-    <w:abstractNumId w:val="47"/>
+    <w:abstractNumId w:val="48"/>
   </w:num>
   <w:num w:numId="151" w16cid:durableId="1236017784">
     <w:abstractNumId w:val="17"/>
   </w:num>
   <w:num w:numId="152" w16cid:durableId="1483890789">
-    <w:abstractNumId w:val="122"/>
+    <w:abstractNumId w:val="128"/>
   </w:num>
   <w:num w:numId="153" w16cid:durableId="2104719660">
-    <w:abstractNumId w:val="138"/>
+    <w:abstractNumId w:val="146"/>
   </w:num>
   <w:num w:numId="154" w16cid:durableId="2030252929">
-    <w:abstractNumId w:val="57"/>
+    <w:abstractNumId w:val="59"/>
   </w:num>
   <w:num w:numId="155" w16cid:durableId="1356731706">
     <w:abstractNumId w:val="21"/>
@@ -43895,25 +45841,25 @@
     <w:abstractNumId w:val="2"/>
   </w:num>
   <w:num w:numId="158" w16cid:durableId="1034845685">
-    <w:abstractNumId w:val="174"/>
+    <w:abstractNumId w:val="184"/>
   </w:num>
   <w:num w:numId="159" w16cid:durableId="1262639594">
-    <w:abstractNumId w:val="67"/>
+    <w:abstractNumId w:val="70"/>
   </w:num>
   <w:num w:numId="160" w16cid:durableId="1640988115">
-    <w:abstractNumId w:val="132"/>
+    <w:abstractNumId w:val="140"/>
   </w:num>
   <w:num w:numId="161" w16cid:durableId="1536966176">
     <w:abstractNumId w:val="32"/>
   </w:num>
   <w:num w:numId="162" w16cid:durableId="549609606">
-    <w:abstractNumId w:val="65"/>
+    <w:abstractNumId w:val="68"/>
   </w:num>
   <w:num w:numId="163" w16cid:durableId="1025402036">
-    <w:abstractNumId w:val="130"/>
+    <w:abstractNumId w:val="137"/>
   </w:num>
   <w:num w:numId="164" w16cid:durableId="703671323">
-    <w:abstractNumId w:val="88"/>
+    <w:abstractNumId w:val="92"/>
   </w:num>
   <w:num w:numId="165" w16cid:durableId="410156013">
     <w:abstractNumId w:val="10"/>
@@ -43925,61 +45871,91 @@
     <w:abstractNumId w:val="12"/>
   </w:num>
   <w:num w:numId="168" w16cid:durableId="1639455099">
-    <w:abstractNumId w:val="104"/>
+    <w:abstractNumId w:val="108"/>
   </w:num>
   <w:num w:numId="169" w16cid:durableId="1382096019">
-    <w:abstractNumId w:val="179"/>
+    <w:abstractNumId w:val="189"/>
   </w:num>
   <w:num w:numId="170" w16cid:durableId="2092239844">
-    <w:abstractNumId w:val="151"/>
+    <w:abstractNumId w:val="159"/>
   </w:num>
   <w:num w:numId="171" w16cid:durableId="2061635092">
-    <w:abstractNumId w:val="108"/>
+    <w:abstractNumId w:val="113"/>
   </w:num>
   <w:num w:numId="172" w16cid:durableId="1761901452">
-    <w:abstractNumId w:val="157"/>
+    <w:abstractNumId w:val="165"/>
   </w:num>
   <w:num w:numId="173" w16cid:durableId="1674142607">
-    <w:abstractNumId w:val="83"/>
+    <w:abstractNumId w:val="87"/>
   </w:num>
   <w:num w:numId="174" w16cid:durableId="1133985193">
-    <w:abstractNumId w:val="96"/>
+    <w:abstractNumId w:val="100"/>
   </w:num>
   <w:num w:numId="175" w16cid:durableId="941303595">
-    <w:abstractNumId w:val="155"/>
+    <w:abstractNumId w:val="163"/>
   </w:num>
   <w:num w:numId="176" w16cid:durableId="484014249">
-    <w:abstractNumId w:val="79"/>
+    <w:abstractNumId w:val="83"/>
   </w:num>
   <w:num w:numId="177" w16cid:durableId="1905486750">
     <w:abstractNumId w:val="7"/>
   </w:num>
   <w:num w:numId="178" w16cid:durableId="1679194629">
-    <w:abstractNumId w:val="147"/>
+    <w:abstractNumId w:val="155"/>
   </w:num>
   <w:num w:numId="179" w16cid:durableId="252010165">
+    <w:abstractNumId w:val="112"/>
+  </w:num>
+  <w:num w:numId="180" w16cid:durableId="783306328">
     <w:abstractNumId w:val="107"/>
   </w:num>
-  <w:num w:numId="180" w16cid:durableId="783306328">
-    <w:abstractNumId w:val="103"/>
+  <w:num w:numId="181" w16cid:durableId="612056874">
+    <w:abstractNumId w:val="177"/>
   </w:num>
-  <w:num w:numId="181" w16cid:durableId="612056874">
+  <w:num w:numId="182" w16cid:durableId="573711022">
+    <w:abstractNumId w:val="118"/>
+  </w:num>
+  <w:num w:numId="183" w16cid:durableId="2071928137">
+    <w:abstractNumId w:val="53"/>
+  </w:num>
+  <w:num w:numId="184" w16cid:durableId="494612485">
+    <w:abstractNumId w:val="181"/>
+  </w:num>
+  <w:num w:numId="185" w16cid:durableId="435251978">
+    <w:abstractNumId w:val="76"/>
+  </w:num>
+  <w:num w:numId="186" w16cid:durableId="725836323">
     <w:abstractNumId w:val="169"/>
   </w:num>
-  <w:num w:numId="182" w16cid:durableId="573711022">
-    <w:abstractNumId w:val="112"/>
+  <w:num w:numId="187" w16cid:durableId="2071802244">
+    <w:abstractNumId w:val="138"/>
   </w:num>
-  <w:num w:numId="183" w16cid:durableId="2071928137">
-    <w:abstractNumId w:val="52"/>
+  <w:num w:numId="188" w16cid:durableId="1149902107">
+    <w:abstractNumId w:val="67"/>
   </w:num>
-  <w:num w:numId="184" w16cid:durableId="494612485">
-    <w:abstractNumId w:val="172"/>
+  <w:num w:numId="189" w16cid:durableId="246774061">
+    <w:abstractNumId w:val="179"/>
   </w:num>
-  <w:num w:numId="185" w16cid:durableId="435251978">
-    <w:abstractNumId w:val="72"/>
+  <w:num w:numId="190" w16cid:durableId="1396589509">
+    <w:abstractNumId w:val="46"/>
   </w:num>
-  <w:num w:numId="186" w16cid:durableId="725836323">
-    <w:abstractNumId w:val="161"/>
+  <w:num w:numId="191" w16cid:durableId="223109604">
+    <w:abstractNumId w:val="75"/>
+  </w:num>
+  <w:num w:numId="192" w16cid:durableId="2105564285">
+    <w:abstractNumId w:val="109"/>
+  </w:num>
+  <w:num w:numId="193" w16cid:durableId="896210784">
+    <w:abstractNumId w:val="182"/>
+  </w:num>
+  <w:num w:numId="194" w16cid:durableId="518273808">
+    <w:abstractNumId w:val="56"/>
+  </w:num>
+  <w:num w:numId="195" w16cid:durableId="879394169">
+    <w:abstractNumId w:val="135"/>
+  </w:num>
+  <w:num w:numId="196" w16cid:durableId="455410891">
+    <w:abstractNumId w:val="115"/>
   </w:num>
 </w:numbering>
 </file>

</xml_diff>

<commit_message>
API Documentation Development (#408)
</commit_message>
<xml_diff>
--- a/API Design.docx
+++ b/API Design.docx
@@ -47,7 +47,15 @@
     </w:p>
     <w:p>
       <w:r>
-        <w:t>Before detailing the endpoints of the API it is critical to perform an analysis of API requirements in order to make sure that the provided services accurately correspond to the platform's business needs. Such analysis transforms the functional requirements specified in the Product Requirements Document (PRD) and use-case model into the set of well-designed service interfaces. Moreover, this step identifies clearly the owner of the business functionality assigning an appropriate backend service to each API as a result of implementation of the separation of concern principle in the proposed architecture.</w:t>
+        <w:t xml:space="preserve">Before detailing the endpoints of the </w:t>
+      </w:r>
+      <w:proofErr w:type="gramStart"/>
+      <w:r>
+        <w:t>API</w:t>
+      </w:r>
+      <w:proofErr w:type="gramEnd"/>
+      <w:r>
+        <w:t xml:space="preserve"> it is critical to perform an analysis of API requirements in order to make sure that the provided services accurately correspond to the platform's business needs. Such analysis transforms the functional requirements specified in the Product Requirements Document (PRD) and use-case model into the set of well-designed service interfaces. Moreover, this step identifies clearly the owner of the business functionality assigning an appropriate backend service to each API as a result of implementation of the separation of concern principle in the proposed architecture.</w:t>
       </w:r>
     </w:p>
     <w:p>
@@ -6186,7 +6194,15 @@
     </w:p>
     <w:p>
       <w:r>
-        <w:t>The above mentioned workflow makes sure of the consistency of processing and synchronization of vehicle availability, payment, and customer notifications.</w:t>
+        <w:t xml:space="preserve">The </w:t>
+      </w:r>
+      <w:proofErr w:type="gramStart"/>
+      <w:r>
+        <w:t>above mentioned</w:t>
+      </w:r>
+      <w:proofErr w:type="gramEnd"/>
+      <w:r>
+        <w:t xml:space="preserve"> workflow makes sure of the consistency of processing and synchronization of vehicle availability, payment, and customer notifications.</w:t>
       </w:r>
     </w:p>
     <w:p>
@@ -15902,7 +15918,15 @@
     </w:p>
     <w:p>
       <w:r>
-        <w:t>The Payment Integration APIs contain all the functionalities necessary to process secure payments via the KriGo platform. They establish connections between the platform and third party payment gateways. With their help, clients can pay for the reservation, get a refund, and check the transaction status.</w:t>
+        <w:t xml:space="preserve">The Payment Integration APIs contain all the functionalities necessary to process secure payments via the KriGo platform. They establish connections between the platform and </w:t>
+      </w:r>
+      <w:proofErr w:type="gramStart"/>
+      <w:r>
+        <w:t>third party</w:t>
+      </w:r>
+      <w:proofErr w:type="gramEnd"/>
+      <w:r>
+        <w:t xml:space="preserve"> payment gateways. With their help, clients can pay for the reservation, get a refund, and check the transaction status.</w:t>
       </w:r>
     </w:p>
     <w:p>
@@ -21246,7 +21270,15 @@
     </w:p>
     <w:p>
       <w:r>
-        <w:t>Security validation forms another layer of protection in ensuring that all API requests meet the required security standards before being processed. This ensures that there is no malicious input and manipulation of resources as well as reducing the common vulnerabilities of web applications while keeping the system available and intact.</w:t>
+        <w:t xml:space="preserve">Security validation forms another layer of protection in ensuring that all API requests meet the required security standards before being processed. This ensures that there </w:t>
+      </w:r>
+      <w:proofErr w:type="gramStart"/>
+      <w:r>
+        <w:t>is</w:t>
+      </w:r>
+      <w:proofErr w:type="gramEnd"/>
+      <w:r>
+        <w:t xml:space="preserve"> no malicious input and manipulation of resources as well as reducing the common vulnerabilities of web applications while keeping the system available and intact.</w:t>
       </w:r>
     </w:p>
     <w:p>
@@ -21311,7 +21343,15 @@
         <w:spacing w:line="276" w:lineRule="auto"/>
       </w:pPr>
       <w:r>
-        <w:t>Rate limiting: Blocking excessive requests as a protection against Denial of Service attacks.</w:t>
+        <w:t xml:space="preserve">Rate limiting: Blocking excessive requests as a protection against </w:t>
+      </w:r>
+      <w:proofErr w:type="gramStart"/>
+      <w:r>
+        <w:t>Denial of Service</w:t>
+      </w:r>
+      <w:proofErr w:type="gramEnd"/>
+      <w:r>
+        <w:t xml:space="preserve"> attacks.</w:t>
       </w:r>
     </w:p>
     <w:p>
@@ -22766,6 +22806,34 @@
     <w:p>
       <w:r>
         <w:t>API Usage Guidelines provide a standard approach to interacting with REST APIs of the KriGo platform. With proper request and response formatting, error handling, versioning of APIs, and following the performance-related best practices, developers can develop robust client applications. This document extends the API Security Specification and provides a valuable addition to the overall platform reliability and scalability.</w:t>
+      </w:r>
+    </w:p>
+    <w:p>
+      <w:pPr>
+        <w:pStyle w:val="Title"/>
+      </w:pPr>
+      <w:r>
+        <w:t>Conclusion</w:t>
+      </w:r>
+    </w:p>
+    <w:p>
+      <w:r>
+        <w:t>The KriGo API Documentation provides an enterprise-grade foundation for developing and running the KriGo car rental application, including all functionalities covered by the documentation, such as customer services, vehicle search, reservation, payments, agencies, administration, reports, integrations, and security governance.</w:t>
+      </w:r>
+    </w:p>
+    <w:p>
+      <w:r>
+        <w:t>RESTful design pattern, JWT-based authentication, Role Based Access Control (RBAC), standard request/response format, as well as strict validation techniques, enable reliable communication within the API ecosystem.</w:t>
+      </w:r>
+    </w:p>
+    <w:p>
+      <w:r>
+        <w:t>Furthermore, the fact that the KriGo API Documentation includes detailed description of endpoints, authentication and authorization techniques, API usage guidelines, integration details, and administrative flows allows developers and other stakeholders of the platform to have a comprehensive documentation to use for implementation, testing, deployment, and future platform improvements. Also, modular structure and versioning technique applied to APIs make sure that the system will be scalable and compatible in the future.</w:t>
+      </w:r>
+    </w:p>
+    <w:p>
+      <w:r>
+        <w:t>In conclusion, the KriGo API Documentation offers a solid framework for efficient software development, integrations with third-party services, security governance, and enhanced developer experience. The described APIs are implementable and provide the technical basis for effective development and future development of the platform.</w:t>
       </w:r>
     </w:p>
     <w:p>

</xml_diff>